<commit_message>
Workbook: polish cover + week styling
- Redesigned cover: gold motif, larger Georgia title, tracked-caps
  PARTICIPANT WORKBOOK line, dual teal/gold rules, added Start date row.
- Rewrote the How-to-Use copy to reflect the Google-Docs auto-saving
  private-copy model and to clearly ask people to write only in the boxes
  (Google Docs cannot truly lock the rest of the page).
- Added a gold hairline accent beneath each week's teal banner.
- Per-week one-page fit preserved (59 pages).

Co-Authored-By: Claude Opus 4.8 (1M context) <noreply@anthropic.com>
</commit_message>
<xml_diff>
--- a/.local-workbook/The Compassion Course 2026-2027 Workbook.docx
+++ b/.local-workbook/The Compassion Course 2026-2027 Workbook.docx
@@ -4,10 +4,25 @@
   <w:body>
     <w:p>
       <w:pPr>
+        <w:spacing w:after="30" w:before="220"/>
+        <w:jc w:val="center"/>
+      </w:pPr>
+      <w:r>
+        <w:rPr>
+          <w:rFonts w:ascii="Georgia" w:cs="Georgia" w:eastAsia="Georgia" w:hAnsi="Georgia"/>
+          <w:color w:val="B8860B"/>
+          <w:sz w:val="30"/>
+          <w:szCs w:val="30"/>
+        </w:rPr>
+        <w:t xml:space="preserve">❖</w:t>
+      </w:r>
+    </w:p>
+    <w:p>
+      <w:pPr>
         <w:pBdr>
-          <w:bottom w:val="single" w:color="2A7A6E" w:sz="4" w:space="1"/>
+          <w:bottom w:val="single" w:color="2A7A6E" w:sz="8" w:space="1"/>
         </w:pBdr>
-        <w:spacing w:after="60" w:before="200"/>
+        <w:spacing w:after="70" w:before="0"/>
         <w:jc w:val="center"/>
       </w:pPr>
       <w:r>
@@ -20,7 +35,7 @@
     </w:p>
     <w:p>
       <w:pPr>
-        <w:spacing w:after="0" w:before="60"/>
+        <w:spacing w:after="0" w:before="90"/>
         <w:jc w:val="center"/>
       </w:pPr>
       <w:r>
@@ -29,30 +44,49 @@
           <w:b/>
           <w:bCs/>
           <w:color w:val="2A7A6E"/>
-          <w:sz w:val="48"/>
-          <w:szCs w:val="48"/>
+          <w:sz w:val="54"/>
+          <w:szCs w:val="54"/>
         </w:rPr>
         <w:t xml:space="preserve">The Compassion Course</w:t>
       </w:r>
     </w:p>
     <w:p>
       <w:pPr>
-        <w:spacing w:after="0" w:before="70"/>
+        <w:spacing w:after="0" w:before="110"/>
         <w:jc w:val="center"/>
       </w:pPr>
       <w:r>
         <w:rPr>
           <w:rFonts w:ascii="Georgia" w:cs="Georgia" w:eastAsia="Georgia" w:hAnsi="Georgia"/>
           <w:color w:val="B8860B"/>
-          <w:sz w:val="24"/>
-          <w:szCs w:val="24"/>
-        </w:rPr>
-        <w:t xml:space="preserve">2026 – 2027  ·  Participant Workbook</w:t>
-      </w:r>
-    </w:p>
-    <w:p>
-      <w:pPr>
-        <w:spacing w:after="70" w:before="60"/>
+          <w:spacing w:val="80"/>
+          <w:sz w:val="30"/>
+          <w:szCs w:val="30"/>
+        </w:rPr>
+        <w:t xml:space="preserve">2026 – 2027</w:t>
+      </w:r>
+    </w:p>
+    <w:p>
+      <w:pPr>
+        <w:spacing w:after="0" w:before="40"/>
+        <w:jc w:val="center"/>
+      </w:pPr>
+      <w:r>
+        <w:rPr>
+          <w:rFonts w:ascii="Georgia" w:cs="Georgia" w:eastAsia="Georgia" w:hAnsi="Georgia"/>
+          <w:b/>
+          <w:bCs/>
+          <w:color w:val="1E5C53"/>
+          <w:spacing w:val="130"/>
+          <w:sz w:val="19"/>
+          <w:szCs w:val="19"/>
+        </w:rPr>
+        <w:t xml:space="preserve">PARTICIPANT WORKBOOK</w:t>
+      </w:r>
+    </w:p>
+    <w:p>
+      <w:pPr>
+        <w:spacing w:after="80" w:before="110"/>
         <w:jc w:val="center"/>
       </w:pPr>
       <w:r>
@@ -61,8 +95,8 @@
           <w:i/>
           <w:iCs/>
           <w:color w:val="6B6B6B"/>
-          <w:sz w:val="20"/>
-          <w:szCs w:val="20"/>
+          <w:sz w:val="21"/>
+          <w:szCs w:val="21"/>
         </w:rPr>
         <w:t xml:space="preserve">A year of practicing compassion, one week at a time.</w:t>
       </w:r>
@@ -70,9 +104,9 @@
     <w:p>
       <w:pPr>
         <w:pBdr>
-          <w:bottom w:val="single" w:color="B8860B" w:sz="4" w:space="1"/>
+          <w:bottom w:val="single" w:color="B8860B" w:sz="8" w:space="1"/>
         </w:pBdr>
-        <w:spacing w:after="200" w:before="0"/>
+        <w:spacing w:after="230" w:before="0"/>
         <w:jc w:val="center"/>
       </w:pPr>
       <w:r>
@@ -85,7 +119,7 @@
     </w:p>
     <w:p>
       <w:pPr>
-        <w:spacing w:after="60" w:before="0"/>
+        <w:spacing w:after="80" w:before="0"/>
         <w:jc w:val="center"/>
       </w:pPr>
       <w:r>
@@ -93,7 +127,7 @@
           <w:b/>
           <w:bCs/>
           <w:color w:val="1E5C53"/>
-          <w:spacing w:val="40"/>
+          <w:spacing w:val="60"/>
           <w:sz w:val="17"/>
           <w:szCs w:val="17"/>
         </w:rPr>
@@ -102,7 +136,7 @@
     </w:p>
     <w:tbl>
       <w:tblPr>
-        <w:tblW w:type="dxa" w:w="6600"/>
+        <w:tblW w:type="dxa" w:w="6800"/>
         <w:jc w:val="center"/>
         <w:tblBorders>
           <w:top w:val="single" w:color="auto" w:sz="4"/>
@@ -114,16 +148,16 @@
         </w:tblBorders>
       </w:tblPr>
       <w:tblGrid>
-        <w:gridCol w:w="1500"/>
+        <w:gridCol w:w="1700"/>
         <w:gridCol w:w="5100"/>
       </w:tblGrid>
       <w:tr>
         <w:trPr>
-          <w:trHeight w:val="460" w:hRule="atLeast"/>
-        </w:trPr>
-        <w:tc>
-          <w:tcPr>
-            <w:tcW w:type="dxa" w:w="1500"/>
+          <w:trHeight w:val="480" w:hRule="atLeast"/>
+        </w:trPr>
+        <w:tc>
+          <w:tcPr>
+            <w:tcW w:type="dxa" w:w="1700"/>
             <w:tcBorders>
               <w:top w:val="single" w:color="CFE3DF" w:sz="4"/>
               <w:left w:val="single" w:color="CFE3DF" w:sz="4"/>
@@ -133,7 +167,7 @@
             <w:shd w:fill="E9F2F0" w:val="clear"/>
             <w:tcMar>
               <w:top w:type="dxa" w:w="40"/>
-              <w:left w:type="dxa" w:w="130"/>
+              <w:left w:type="dxa" w:w="150"/>
               <w:bottom w:type="dxa" w:w="40"/>
               <w:right w:type="dxa" w:w="110"/>
             </w:tcMar>
@@ -189,11 +223,11 @@
       </w:tr>
       <w:tr>
         <w:trPr>
-          <w:trHeight w:val="460" w:hRule="atLeast"/>
-        </w:trPr>
-        <w:tc>
-          <w:tcPr>
-            <w:tcW w:type="dxa" w:w="1500"/>
+          <w:trHeight w:val="480" w:hRule="atLeast"/>
+        </w:trPr>
+        <w:tc>
+          <w:tcPr>
+            <w:tcW w:type="dxa" w:w="1700"/>
             <w:tcBorders>
               <w:top w:val="single" w:color="CFE3DF" w:sz="4"/>
               <w:left w:val="single" w:color="CFE3DF" w:sz="4"/>
@@ -203,7 +237,7 @@
             <w:shd w:fill="E9F2F0" w:val="clear"/>
             <w:tcMar>
               <w:top w:type="dxa" w:w="40"/>
-              <w:left w:type="dxa" w:w="130"/>
+              <w:left w:type="dxa" w:w="150"/>
               <w:bottom w:type="dxa" w:w="40"/>
               <w:right w:type="dxa" w:w="110"/>
             </w:tcMar>
@@ -257,11 +291,81 @@
           </w:p>
         </w:tc>
       </w:tr>
+      <w:tr>
+        <w:trPr>
+          <w:trHeight w:val="480" w:hRule="atLeast"/>
+        </w:trPr>
+        <w:tc>
+          <w:tcPr>
+            <w:tcW w:type="dxa" w:w="1700"/>
+            <w:tcBorders>
+              <w:top w:val="single" w:color="CFE3DF" w:sz="4"/>
+              <w:left w:val="single" w:color="CFE3DF" w:sz="4"/>
+              <w:bottom w:val="single" w:color="CFE3DF" w:sz="4"/>
+              <w:right w:val="single" w:color="CFE3DF" w:sz="4"/>
+            </w:tcBorders>
+            <w:shd w:fill="E9F2F0" w:val="clear"/>
+            <w:tcMar>
+              <w:top w:type="dxa" w:w="40"/>
+              <w:left w:type="dxa" w:w="150"/>
+              <w:bottom w:type="dxa" w:w="40"/>
+              <w:right w:type="dxa" w:w="110"/>
+            </w:tcMar>
+            <w:vAlign w:val="center"/>
+          </w:tcPr>
+          <w:p>
+            <w:pPr>
+              <w:spacing w:after="0" w:before="0"/>
+            </w:pPr>
+            <w:r>
+              <w:rPr>
+                <w:b/>
+                <w:bCs/>
+                <w:color w:val="1E5C53"/>
+                <w:sz w:val="21"/>
+                <w:szCs w:val="21"/>
+              </w:rPr>
+              <w:t xml:space="preserve">Start date</w:t>
+            </w:r>
+          </w:p>
+        </w:tc>
+        <w:tc>
+          <w:tcPr>
+            <w:tcW w:type="dxa" w:w="5100"/>
+            <w:tcBorders>
+              <w:top w:val="single" w:color="CFE3DF" w:sz="4"/>
+              <w:left w:val="single" w:color="CFE3DF" w:sz="4"/>
+              <w:bottom w:val="single" w:color="CFE3DF" w:sz="4"/>
+              <w:right w:val="single" w:color="CFE3DF" w:sz="4"/>
+            </w:tcBorders>
+            <w:shd w:fill="FCFBF7" w:val="clear"/>
+            <w:tcMar>
+              <w:top w:type="dxa" w:w="40"/>
+              <w:left w:type="dxa" w:w="110"/>
+              <w:bottom w:type="dxa" w:w="40"/>
+              <w:right w:type="dxa" w:w="110"/>
+            </w:tcMar>
+            <w:vAlign w:val="center"/>
+          </w:tcPr>
+          <w:p>
+            <w:pPr>
+              <w:spacing w:after="0" w:before="0"/>
+            </w:pPr>
+            <w:r>
+              <w:rPr>
+                <w:sz w:val="21"/>
+                <w:szCs w:val="21"/>
+              </w:rPr>
+              <w:t xml:space="preserve"/>
+            </w:r>
+          </w:p>
+        </w:tc>
+      </w:tr>
     </w:tbl>
     <w:p>
       <w:pPr>
         <w:pStyle w:val="Heading2"/>
-        <w:spacing w:after="60" w:before="320"/>
+        <w:spacing w:after="60" w:before="340"/>
       </w:pPr>
       <w:r>
         <w:t xml:space="preserve">How to Use This Workbook</w:t>
@@ -280,7 +384,23 @@
           <w:sz w:val="20"/>
           <w:szCs w:val="20"/>
         </w:rPr>
-        <w:t xml:space="preserve">This is your personal copy of The Compassion Course workbook — one private copy for each participant, opened from the link we send you. There is nothing to download, install, or back up. Just open your link and type your responses in the shaded boxes; your writing saves automatically and the boxes grow as you type. Please write only inside the boxes so your entries stay easy to find and review.</w:t>
+        <w:t xml:space="preserve">This is your own private copy of The Compassion Course workbook, opened from the personal link we send you — there is nothing to download, install, or back up. Your writing saves automatically as you go, and every shaded box grows to fit whatever you type.</w:t>
+      </w:r>
+    </w:p>
+    <w:p>
+      <w:pPr>
+        <w:keepLines/>
+        <w:spacing w:after="60" w:before="0" w:line="276" w:lineRule="auto"/>
+      </w:pPr>
+      <w:r>
+        <w:rPr>
+          <w:i w:val="false"/>
+          <w:iCs w:val="false"/>
+          <w:color w:val="2D2D2D"/>
+          <w:sz w:val="20"/>
+          <w:szCs w:val="20"/>
+        </w:rPr>
+        <w:t xml:space="preserve">Please write only inside the cream-colored boxes. Everything else on the page is the course’s material; keeping your responses in the boxes is what lets us find and confirm your work at the end of the year.</w:t>
       </w:r>
     </w:p>
     <w:p>
@@ -33985,6 +34105,9 @@
     <w:qFormat/>
     <w:pPr>
       <w:keepNext/>
+      <w:pBdr>
+        <w:bottom w:val="single" w:color="B8860B" w:sz="12" w:space="1"/>
+      </w:pBdr>
       <w:shd w:fill="2A7A6E" w:val="clear"/>
       <w:spacing w:after="130" w:before="120" w:line="320" w:lineRule="auto"/>
       <w:ind w:left="140"/>

</xml_diff>

<commit_message>
Workbook: replace cover diamond motif with heart-globe logo
Embed public/logo_heart.png centered above the title instead of the gold
diamond glyph.

Co-Authored-By: Claude Opus 4.8 (1M context) <noreply@anthropic.com>
</commit_message>
<xml_diff>
--- a/.local-workbook/The Compassion Course 2026-2027 Workbook.docx
+++ b/.local-workbook/The Compassion Course 2026-2027 Workbook.docx
@@ -4,17 +4,48 @@
   <w:body>
     <w:p>
       <w:pPr>
-        <w:spacing w:after="30" w:before="220"/>
+        <w:spacing w:after="40" w:before="180"/>
         <w:jc w:val="center"/>
       </w:pPr>
       <w:r>
-        <w:rPr>
-          <w:rFonts w:ascii="Georgia" w:cs="Georgia" w:eastAsia="Georgia" w:hAnsi="Georgia"/>
-          <w:color w:val="B8860B"/>
-          <w:sz w:val="30"/>
-          <w:szCs w:val="30"/>
-        </w:rPr>
-        <w:t xml:space="preserve">❖</w:t>
+        <w:drawing>
+          <wp:inline distT="0" distB="0" distL="0" distR="0">
+            <wp:extent cx="1257300" cy="1028700"/>
+            <wp:effectExtent t="0" r="0" b="0" l="0"/>
+            <wp:docPr id="1" name="" descr="" title=""/>
+            <wp:cNvGraphicFramePr>
+              <a:graphicFrameLocks xmlns:a="http://schemas.openxmlformats.org/drawingml/2006/main" noChangeAspect="1"/>
+            </wp:cNvGraphicFramePr>
+            <a:graphic xmlns:a="http://schemas.openxmlformats.org/drawingml/2006/main">
+              <a:graphicData uri="http://schemas.openxmlformats.org/drawingml/2006/picture">
+                <pic:pic xmlns:pic="http://schemas.openxmlformats.org/drawingml/2006/picture">
+                  <pic:nvPicPr>
+                    <pic:cNvPr id="0" name="" descr=""/>
+                    <pic:cNvPicPr>
+                      <a:picLocks noChangeAspect="1" noChangeArrowheads="1"/>
+                    </pic:cNvPicPr>
+                  </pic:nvPicPr>
+                  <pic:blipFill>
+                    <a:blip r:embed="rId8" cstate="none"/>
+                    <a:srcRect/>
+                    <a:stretch>
+                      <a:fillRect/>
+                    </a:stretch>
+                  </pic:blipFill>
+                  <pic:spPr bwMode="auto">
+                    <a:xfrm>
+                      <a:off x="0" y="0"/>
+                      <a:ext cx="1257300" cy="1028700"/>
+                    </a:xfrm>
+                    <a:prstGeom prst="rect">
+                      <a:avLst/>
+                    </a:prstGeom>
+                  </pic:spPr>
+                </pic:pic>
+              </a:graphicData>
+            </a:graphic>
+          </wp:inline>
+        </w:drawing>
       </w:r>
     </w:p>
     <w:p>

</xml_diff>

<commit_message>
Fix stale 2024 year refs -> 2026 (Week 4 forum, Week 52 closing) + workbook
- Week 4: 'CCO 2024 Participant Forum' -> 'CCO 2026 Participant Forum'
- Week 52: 'the 2024 Compassion Course' -> 'the 2026 Compassion Course'
- Mirrored both in the workbook content.json and rebuilt the .docx.

Co-Authored-By: Claude Opus 4.8 (1M context) <noreply@anthropic.com>
</commit_message>
<xml_diff>
--- a/.local-workbook/The Compassion Course 2026-2027 Workbook.docx
+++ b/.local-workbook/The Compassion Course 2026-2027 Workbook.docx
@@ -2894,7 +2894,7 @@
           <w:sz w:val="20"/>
           <w:szCs w:val="20"/>
         </w:rPr>
-        <w:t xml:space="preserve">Think of someone that you think is preventing you from getting a need(s) met. Write down the need(s) from the needs list. Then, think of 3 ways you could get them/it met without that person. It helps to use your imagination a bit here too. It might also be fun and inspiring to share your results on our CCO 2024 Participant Forum or in the Weekly Messages Chat Room, on the GCN</w:t>
+        <w:t xml:space="preserve">Think of someone that you think is preventing you from getting a need(s) met. Write down the need(s) from the needs list. Then, think of 3 ways you could get them/it met without that person. It helps to use your imagination a bit here too. It might also be fun and inspiring to share your results on our CCO 2026 Participant Forum or in the Weekly Messages Chat Room, on the GCN</w:t>
       </w:r>
     </w:p>
     <w:tbl>
@@ -33140,7 +33140,7 @@
           <w:sz w:val="20"/>
           <w:szCs w:val="20"/>
         </w:rPr>
-        <w:t xml:space="preserve">I invite you to share another year of learning and practicing compassion. As you are reading this, we are in the midst of thousands of folks from around the world signing up for the 2024 Compassion Course. I can only imagine they will benefit from your support and companionship. I can only imagine you will too. (To register, CLICK HERE).</w:t>
+        <w:t xml:space="preserve">I invite you to share another year of learning and practicing compassion. As you are reading this, we are in the midst of thousands of folks from around the world signing up for the 2026 Compassion Course. I can only imagine they will benefit from your support and companionship. I can only imagine you will too. (To register, CLICK HERE).</w:t>
       </w:r>
     </w:p>
     <w:tbl>

</xml_diff>

<commit_message>
Workbook: navy lesson titles + fill-in templates as input boxes
- Lesson title now navy (tied to the week banner, distinct from the teal
  practice headings) and larger, so it no longer blends in.
- Fill-in-the-blank model phrases (the ones with ____ blanks) are split
  out into designated cream input boxes with a pencil cue, so participants
  complete them in a clear field instead of editing the instructions. The
  lead-in instruction stays as body text. Length/page-fit unchanged (59pp).

Co-Authored-By: Claude Opus 4.8 (1M context) <noreply@anthropic.com>
</commit_message>
<xml_diff>
--- a/.local-workbook/The Compassion Course 2026-2027 Workbook.docx
+++ b/.local-workbook/The Compassion Course 2026-2027 Workbook.docx
@@ -536,16 +536,16 @@
     <w:p>
       <w:pPr>
         <w:keepNext/>
-        <w:spacing w:after="150"/>
+        <w:spacing w:after="170" w:before="60"/>
       </w:pPr>
       <w:r>
         <w:rPr>
           <w:rFonts w:ascii="Georgia" w:cs="Georgia" w:eastAsia="Georgia" w:hAnsi="Georgia"/>
           <w:i/>
           <w:iCs/>
-          <w:color w:val="1E5C53"/>
-          <w:sz w:val="24"/>
-          <w:szCs w:val="24"/>
+          <w:color w:val="0F3760"/>
+          <w:sz w:val="28"/>
+          <w:szCs w:val="28"/>
         </w:rPr>
         <w:t xml:space="preserve">Everything We Do, We Do to Meet a Need</w:t>
       </w:r>
@@ -1299,16 +1299,16 @@
     <w:p>
       <w:pPr>
         <w:keepNext/>
-        <w:spacing w:after="150"/>
+        <w:spacing w:after="170" w:before="60"/>
       </w:pPr>
       <w:r>
         <w:rPr>
           <w:rFonts w:ascii="Georgia" w:cs="Georgia" w:eastAsia="Georgia" w:hAnsi="Georgia"/>
           <w:i/>
           <w:iCs/>
-          <w:color w:val="1E5C53"/>
-          <w:sz w:val="24"/>
-          <w:szCs w:val="24"/>
+          <w:color w:val="0F3760"/>
+          <w:sz w:val="28"/>
+          <w:szCs w:val="28"/>
         </w:rPr>
         <w:t xml:space="preserve">Most Of Us Were Taught Something Else</w:t>
       </w:r>
@@ -1912,16 +1912,16 @@
     <w:p>
       <w:pPr>
         <w:keepNext/>
-        <w:spacing w:after="150"/>
+        <w:spacing w:after="170" w:before="60"/>
       </w:pPr>
       <w:r>
         <w:rPr>
           <w:rFonts w:ascii="Georgia" w:cs="Georgia" w:eastAsia="Georgia" w:hAnsi="Georgia"/>
           <w:i/>
           <w:iCs/>
-          <w:color w:val="1E5C53"/>
-          <w:sz w:val="24"/>
-          <w:szCs w:val="24"/>
+          <w:color w:val="0F3760"/>
+          <w:sz w:val="28"/>
+          <w:szCs w:val="28"/>
         </w:rPr>
         <w:t xml:space="preserve">We Are All Equipped with Onboard Need Radar</w:t>
       </w:r>
@@ -2527,16 +2527,16 @@
     <w:p>
       <w:pPr>
         <w:keepNext/>
-        <w:spacing w:after="150"/>
+        <w:spacing w:after="170" w:before="60"/>
       </w:pPr>
       <w:r>
         <w:rPr>
           <w:rFonts w:ascii="Georgia" w:cs="Georgia" w:eastAsia="Georgia" w:hAnsi="Georgia"/>
           <w:i/>
           <w:iCs/>
-          <w:color w:val="1E5C53"/>
-          <w:sz w:val="24"/>
-          <w:szCs w:val="24"/>
+          <w:color w:val="0F3760"/>
+          <w:sz w:val="28"/>
+          <w:szCs w:val="28"/>
         </w:rPr>
         <w:t xml:space="preserve">What's the Big Deal with Needs?</w:t>
       </w:r>
@@ -3274,16 +3274,16 @@
     <w:p>
       <w:pPr>
         <w:keepNext/>
-        <w:spacing w:after="150"/>
+        <w:spacing w:after="170" w:before="60"/>
       </w:pPr>
       <w:r>
         <w:rPr>
           <w:rFonts w:ascii="Georgia" w:cs="Georgia" w:eastAsia="Georgia" w:hAnsi="Georgia"/>
           <w:i/>
           <w:iCs/>
-          <w:color w:val="1E5C53"/>
-          <w:sz w:val="24"/>
-          <w:szCs w:val="24"/>
+          <w:color w:val="0F3760"/>
+          <w:sz w:val="28"/>
+          <w:szCs w:val="28"/>
         </w:rPr>
         <w:t xml:space="preserve">Empathy, the Breath of Compassion</w:t>
       </w:r>
@@ -3913,16 +3913,16 @@
     <w:p>
       <w:pPr>
         <w:keepNext/>
-        <w:spacing w:after="150"/>
+        <w:spacing w:after="170" w:before="60"/>
       </w:pPr>
       <w:r>
         <w:rPr>
           <w:rFonts w:ascii="Georgia" w:cs="Georgia" w:eastAsia="Georgia" w:hAnsi="Georgia"/>
           <w:i/>
           <w:iCs/>
-          <w:color w:val="1E5C53"/>
-          <w:sz w:val="24"/>
-          <w:szCs w:val="24"/>
+          <w:color w:val="0F3760"/>
+          <w:sz w:val="28"/>
+          <w:szCs w:val="28"/>
         </w:rPr>
         <w:t xml:space="preserve">Hidden Judgments</w:t>
       </w:r>
@@ -3940,37 +3940,96 @@
     <w:p>
       <w:pPr>
         <w:keepLines/>
-        <w:spacing w:after="60" w:before="0" w:line="276" w:lineRule="auto"/>
-      </w:pPr>
-      <w:r>
-        <w:rPr>
-          <w:i w:val="false"/>
-          <w:iCs w:val="false"/>
-          <w:color w:val="2D2D2D"/>
-          <w:sz w:val="20"/>
-          <w:szCs w:val="20"/>
-        </w:rPr>
-        <w:t xml:space="preserve">Continue working with this exercise (www.theexercise.org). This time, start using observations in addition to quotes, such as actions. You can also work with your own judgment thoughts by writing the words </w:t>
-      </w:r>
-      <w:r>
-        <w:rPr>
-          <w:i/>
-          <w:iCs/>
-          <w:color w:val="2D2D2D"/>
-          <w:sz w:val="20"/>
-          <w:szCs w:val="20"/>
-        </w:rPr>
-        <w:t xml:space="preserve">“I'm telling myself ____”</w:t>
-      </w:r>
-      <w:r>
-        <w:rPr>
-          <w:i w:val="false"/>
-          <w:iCs w:val="false"/>
-          <w:color w:val="2D2D2D"/>
-          <w:sz w:val="20"/>
-          <w:szCs w:val="20"/>
-        </w:rPr>
-        <w:t xml:space="preserve">. For example </w:t>
+        <w:spacing w:after="80" w:before="0" w:line="276" w:lineRule="auto"/>
+      </w:pPr>
+      <w:r>
+        <w:rPr>
+          <w:i w:val="false"/>
+          <w:iCs w:val="false"/>
+          <w:color w:val="2D2D2D"/>
+          <w:sz w:val="20"/>
+          <w:szCs w:val="20"/>
+        </w:rPr>
+        <w:t xml:space="preserve">Continue working with this exercise (www.theexercise.org). This time, start using observations in addition to quotes, such as actions. You can also work with your own judgment thoughts by writing the words</w:t>
+      </w:r>
+    </w:p>
+    <w:tbl>
+      <w:tblPr>
+        <w:tblW w:type="dxa" w:w="9360"/>
+        <w:tblBorders>
+          <w:top w:val="single" w:color="auto" w:sz="4"/>
+          <w:left w:val="single" w:color="auto" w:sz="4"/>
+          <w:bottom w:val="single" w:color="auto" w:sz="4"/>
+          <w:right w:val="single" w:color="auto" w:sz="4"/>
+          <w:insideH w:val="single" w:color="auto" w:sz="4"/>
+          <w:insideV w:val="single" w:color="auto" w:sz="4"/>
+        </w:tblBorders>
+      </w:tblPr>
+      <w:tblGrid>
+        <w:gridCol w:w="9360"/>
+      </w:tblGrid>
+      <w:tr>
+        <w:trPr>
+          <w:cantSplit/>
+        </w:trPr>
+        <w:tc>
+          <w:tcPr>
+            <w:tcW w:type="dxa" w:w="9360"/>
+            <w:tcBorders>
+              <w:top w:val="single" w:color="CFE3DF" w:sz="4"/>
+              <w:left w:val="single" w:color="CFE3DF" w:sz="4"/>
+              <w:bottom w:val="single" w:color="CFE3DF" w:sz="4"/>
+              <w:right w:val="single" w:color="CFE3DF" w:sz="4"/>
+            </w:tcBorders>
+            <w:shd w:fill="FCFBF7" w:val="clear"/>
+            <w:tcMar>
+              <w:top w:type="dxa" w:w="90"/>
+              <w:left w:type="dxa" w:w="130"/>
+              <w:bottom w:type="dxa" w:w="90"/>
+              <w:right w:type="dxa" w:w="130"/>
+            </w:tcMar>
+            <w:vAlign w:val="top"/>
+          </w:tcPr>
+          <w:p>
+            <w:pPr>
+              <w:spacing w:after="0" w:before="0" w:line="276" w:lineRule="auto"/>
+            </w:pPr>
+            <w:r>
+              <w:rPr>
+                <w:color w:val="2A7A6E"/>
+                <w:sz w:val="18"/>
+                <w:szCs w:val="18"/>
+              </w:rPr>
+              <w:t xml:space="preserve">✎  </w:t>
+            </w:r>
+            <w:r>
+              <w:rPr>
+                <w:i/>
+                <w:iCs/>
+                <w:color w:val="2D2D2D"/>
+                <w:sz w:val="20"/>
+                <w:szCs w:val="20"/>
+              </w:rPr>
+              <w:t xml:space="preserve">“I'm telling myself ____”</w:t>
+            </w:r>
+          </w:p>
+        </w:tc>
+      </w:tr>
+    </w:tbl>
+    <w:p>
+      <w:pPr>
+        <w:keepLines/>
+        <w:spacing w:after="60" w:before="80" w:line="276" w:lineRule="auto"/>
+      </w:pPr>
+      <w:r>
+        <w:rPr>
+          <w:i w:val="false"/>
+          <w:iCs w:val="false"/>
+          <w:color w:val="2D2D2D"/>
+          <w:sz w:val="20"/>
+          <w:szCs w:val="20"/>
+        </w:rPr>
+        <w:t xml:space="preserve">For example </w:t>
       </w:r>
       <w:r>
         <w:rPr>
@@ -5004,16 +5063,16 @@
     <w:p>
       <w:pPr>
         <w:keepNext/>
-        <w:spacing w:after="150"/>
+        <w:spacing w:after="170" w:before="60"/>
       </w:pPr>
       <w:r>
         <w:rPr>
           <w:rFonts w:ascii="Georgia" w:cs="Georgia" w:eastAsia="Georgia" w:hAnsi="Georgia"/>
           <w:i/>
           <w:iCs/>
-          <w:color w:val="1E5C53"/>
-          <w:sz w:val="24"/>
-          <w:szCs w:val="24"/>
+          <w:color w:val="0F3760"/>
+          <w:sz w:val="28"/>
+          <w:szCs w:val="28"/>
         </w:rPr>
         <w:t xml:space="preserve">More About Feelings</w:t>
       </w:r>
@@ -5619,16 +5678,16 @@
     <w:p>
       <w:pPr>
         <w:keepNext/>
-        <w:spacing w:after="150"/>
+        <w:spacing w:after="170" w:before="60"/>
       </w:pPr>
       <w:r>
         <w:rPr>
           <w:rFonts w:ascii="Georgia" w:cs="Georgia" w:eastAsia="Georgia" w:hAnsi="Georgia"/>
           <w:i/>
           <w:iCs/>
-          <w:color w:val="1E5C53"/>
-          <w:sz w:val="24"/>
-          <w:szCs w:val="24"/>
+          <w:color w:val="0F3760"/>
+          <w:sz w:val="28"/>
+          <w:szCs w:val="28"/>
         </w:rPr>
         <w:t xml:space="preserve">The Wisdom Inside the Judgment</w:t>
       </w:r>
@@ -6108,16 +6167,16 @@
     <w:p>
       <w:pPr>
         <w:keepNext/>
-        <w:spacing w:after="150"/>
+        <w:spacing w:after="170" w:before="60"/>
       </w:pPr>
       <w:r>
         <w:rPr>
           <w:rFonts w:ascii="Georgia" w:cs="Georgia" w:eastAsia="Georgia" w:hAnsi="Georgia"/>
           <w:i/>
           <w:iCs/>
-          <w:color w:val="1E5C53"/>
-          <w:sz w:val="24"/>
-          <w:szCs w:val="24"/>
+          <w:color w:val="0F3760"/>
+          <w:sz w:val="28"/>
+          <w:szCs w:val="28"/>
         </w:rPr>
         <w:t xml:space="preserve">My Being and My Robot</w:t>
       </w:r>
@@ -6811,16 +6870,16 @@
     <w:p>
       <w:pPr>
         <w:keepNext/>
-        <w:spacing w:after="150"/>
+        <w:spacing w:after="170" w:before="60"/>
       </w:pPr>
       <w:r>
         <w:rPr>
           <w:rFonts w:ascii="Georgia" w:cs="Georgia" w:eastAsia="Georgia" w:hAnsi="Georgia"/>
           <w:i/>
           <w:iCs/>
-          <w:color w:val="1E5C53"/>
-          <w:sz w:val="24"/>
-          <w:szCs w:val="24"/>
+          <w:color w:val="0F3760"/>
+          <w:sz w:val="28"/>
+          <w:szCs w:val="28"/>
         </w:rPr>
         <w:t xml:space="preserve">What Empathy Is... and What It's Not</w:t>
       </w:r>
@@ -7216,29 +7275,82 @@
     <w:p>
       <w:pPr>
         <w:keepLines/>
-        <w:spacing w:after="60" w:before="0" w:line="276" w:lineRule="auto"/>
-      </w:pPr>
-      <w:r>
-        <w:rPr>
-          <w:i w:val="false"/>
-          <w:iCs w:val="false"/>
-          <w:color w:val="2D2D2D"/>
-          <w:sz w:val="20"/>
-          <w:szCs w:val="20"/>
-        </w:rPr>
-        <w:t xml:space="preserve">For this practice, it may be easier to start out with the simplest form of empathy: </w:t>
-      </w:r>
-      <w:r>
-        <w:rPr>
-          <w:i/>
-          <w:iCs/>
-          <w:color w:val="2D2D2D"/>
-          <w:sz w:val="20"/>
-          <w:szCs w:val="20"/>
-        </w:rPr>
-        <w:t xml:space="preserve">“Are you feeling ______ (feeling from the feelings list) because you need more ______ (need from the needs list).”</w:t>
-      </w:r>
-    </w:p>
+        <w:spacing w:after="80" w:before="0" w:line="276" w:lineRule="auto"/>
+      </w:pPr>
+      <w:r>
+        <w:rPr>
+          <w:i w:val="false"/>
+          <w:iCs w:val="false"/>
+          <w:color w:val="2D2D2D"/>
+          <w:sz w:val="20"/>
+          <w:szCs w:val="20"/>
+        </w:rPr>
+        <w:t xml:space="preserve">For this practice, it may be easier to start out with the simplest form of empathy:</w:t>
+      </w:r>
+    </w:p>
+    <w:tbl>
+      <w:tblPr>
+        <w:tblW w:type="dxa" w:w="9360"/>
+        <w:tblBorders>
+          <w:top w:val="single" w:color="auto" w:sz="4"/>
+          <w:left w:val="single" w:color="auto" w:sz="4"/>
+          <w:bottom w:val="single" w:color="auto" w:sz="4"/>
+          <w:right w:val="single" w:color="auto" w:sz="4"/>
+          <w:insideH w:val="single" w:color="auto" w:sz="4"/>
+          <w:insideV w:val="single" w:color="auto" w:sz="4"/>
+        </w:tblBorders>
+      </w:tblPr>
+      <w:tblGrid>
+        <w:gridCol w:w="9360"/>
+      </w:tblGrid>
+      <w:tr>
+        <w:trPr>
+          <w:cantSplit/>
+        </w:trPr>
+        <w:tc>
+          <w:tcPr>
+            <w:tcW w:type="dxa" w:w="9360"/>
+            <w:tcBorders>
+              <w:top w:val="single" w:color="CFE3DF" w:sz="4"/>
+              <w:left w:val="single" w:color="CFE3DF" w:sz="4"/>
+              <w:bottom w:val="single" w:color="CFE3DF" w:sz="4"/>
+              <w:right w:val="single" w:color="CFE3DF" w:sz="4"/>
+            </w:tcBorders>
+            <w:shd w:fill="FCFBF7" w:val="clear"/>
+            <w:tcMar>
+              <w:top w:type="dxa" w:w="90"/>
+              <w:left w:type="dxa" w:w="130"/>
+              <w:bottom w:type="dxa" w:w="90"/>
+              <w:right w:type="dxa" w:w="130"/>
+            </w:tcMar>
+            <w:vAlign w:val="top"/>
+          </w:tcPr>
+          <w:p>
+            <w:pPr>
+              <w:spacing w:after="0" w:before="0" w:line="276" w:lineRule="auto"/>
+            </w:pPr>
+            <w:r>
+              <w:rPr>
+                <w:color w:val="2A7A6E"/>
+                <w:sz w:val="18"/>
+                <w:szCs w:val="18"/>
+              </w:rPr>
+              <w:t xml:space="preserve">✎  </w:t>
+            </w:r>
+            <w:r>
+              <w:rPr>
+                <w:i/>
+                <w:iCs/>
+                <w:color w:val="2D2D2D"/>
+                <w:sz w:val="20"/>
+                <w:szCs w:val="20"/>
+              </w:rPr>
+              <w:t xml:space="preserve">“Are you feeling ______ (feeling from the feelings list) because you need more ______ (need from the needs list).”</w:t>
+            </w:r>
+          </w:p>
+        </w:tc>
+      </w:tr>
+    </w:tbl>
     <w:tbl>
       <w:tblPr>
         <w:tblW w:type="dxa" w:w="9360"/>
@@ -7576,16 +7688,16 @@
     <w:p>
       <w:pPr>
         <w:keepNext/>
-        <w:spacing w:after="150"/>
+        <w:spacing w:after="170" w:before="60"/>
       </w:pPr>
       <w:r>
         <w:rPr>
           <w:rFonts w:ascii="Georgia" w:cs="Georgia" w:eastAsia="Georgia" w:hAnsi="Georgia"/>
           <w:i/>
           <w:iCs/>
-          <w:color w:val="1E5C53"/>
-          <w:sz w:val="24"/>
-          <w:szCs w:val="24"/>
+          <w:color w:val="0F3760"/>
+          <w:sz w:val="28"/>
+          <w:szCs w:val="28"/>
         </w:rPr>
         <w:t xml:space="preserve">Creating Your Life of Compassion</w:t>
       </w:r>
@@ -8317,16 +8429,16 @@
     <w:p>
       <w:pPr>
         <w:keepNext/>
-        <w:spacing w:after="150"/>
+        <w:spacing w:after="170" w:before="60"/>
       </w:pPr>
       <w:r>
         <w:rPr>
           <w:rFonts w:ascii="Georgia" w:cs="Georgia" w:eastAsia="Georgia" w:hAnsi="Georgia"/>
           <w:i/>
           <w:iCs/>
-          <w:color w:val="1E5C53"/>
-          <w:sz w:val="24"/>
-          <w:szCs w:val="24"/>
+          <w:color w:val="0F3760"/>
+          <w:sz w:val="28"/>
+          <w:szCs w:val="28"/>
         </w:rPr>
         <w:t xml:space="preserve">Slowing Down</w:t>
       </w:r>
@@ -9132,16 +9244,16 @@
     <w:p>
       <w:pPr>
         <w:keepNext/>
-        <w:spacing w:after="150"/>
+        <w:spacing w:after="170" w:before="60"/>
       </w:pPr>
       <w:r>
         <w:rPr>
           <w:rFonts w:ascii="Georgia" w:cs="Georgia" w:eastAsia="Georgia" w:hAnsi="Georgia"/>
           <w:i/>
           <w:iCs/>
-          <w:color w:val="1E5C53"/>
-          <w:sz w:val="24"/>
-          <w:szCs w:val="24"/>
+          <w:color w:val="0F3760"/>
+          <w:sz w:val="28"/>
+          <w:szCs w:val="28"/>
         </w:rPr>
         <w:t xml:space="preserve">Requests</w:t>
       </w:r>
@@ -9877,16 +9989,16 @@
     <w:p>
       <w:pPr>
         <w:keepNext/>
-        <w:spacing w:after="150"/>
+        <w:spacing w:after="170" w:before="60"/>
       </w:pPr>
       <w:r>
         <w:rPr>
           <w:rFonts w:ascii="Georgia" w:cs="Georgia" w:eastAsia="Georgia" w:hAnsi="Georgia"/>
           <w:i/>
           <w:iCs/>
-          <w:color w:val="1E5C53"/>
-          <w:sz w:val="24"/>
-          <w:szCs w:val="24"/>
+          <w:color w:val="0F3760"/>
+          <w:sz w:val="28"/>
+          <w:szCs w:val="28"/>
         </w:rPr>
         <w:t xml:space="preserve">More about Self-Empathy</w:t>
       </w:r>
@@ -10830,16 +10942,16 @@
     <w:p>
       <w:pPr>
         <w:keepNext/>
-        <w:spacing w:after="150"/>
+        <w:spacing w:after="170" w:before="60"/>
       </w:pPr>
       <w:r>
         <w:rPr>
           <w:rFonts w:ascii="Georgia" w:cs="Georgia" w:eastAsia="Georgia" w:hAnsi="Georgia"/>
           <w:i/>
           <w:iCs/>
-          <w:color w:val="1E5C53"/>
-          <w:sz w:val="24"/>
-          <w:szCs w:val="24"/>
+          <w:color w:val="0F3760"/>
+          <w:sz w:val="28"/>
+          <w:szCs w:val="28"/>
         </w:rPr>
         <w:t xml:space="preserve">Connection Requests</w:t>
       </w:r>
@@ -11731,16 +11843,16 @@
     <w:p>
       <w:pPr>
         <w:keepNext/>
-        <w:spacing w:after="150"/>
+        <w:spacing w:after="170" w:before="60"/>
       </w:pPr>
       <w:r>
         <w:rPr>
           <w:rFonts w:ascii="Georgia" w:cs="Georgia" w:eastAsia="Georgia" w:hAnsi="Georgia"/>
           <w:i/>
           <w:iCs/>
-          <w:color w:val="1E5C53"/>
-          <w:sz w:val="24"/>
-          <w:szCs w:val="24"/>
+          <w:color w:val="0F3760"/>
+          <w:sz w:val="28"/>
+          <w:szCs w:val="28"/>
         </w:rPr>
         <w:t xml:space="preserve">Saying 'No' with Compassion - Boundaries</w:t>
       </w:r>
@@ -12496,16 +12608,16 @@
     <w:p>
       <w:pPr>
         <w:keepNext/>
-        <w:spacing w:after="150"/>
+        <w:spacing w:after="170" w:before="60"/>
       </w:pPr>
       <w:r>
         <w:rPr>
           <w:rFonts w:ascii="Georgia" w:cs="Georgia" w:eastAsia="Georgia" w:hAnsi="Georgia"/>
           <w:i/>
           <w:iCs/>
-          <w:color w:val="1E5C53"/>
-          <w:sz w:val="24"/>
-          <w:szCs w:val="24"/>
+          <w:color w:val="0F3760"/>
+          <w:sz w:val="28"/>
+          <w:szCs w:val="28"/>
         </w:rPr>
         <w:t xml:space="preserve">Compassionate Use of Force</w:t>
       </w:r>
@@ -13031,16 +13143,16 @@
     <w:p>
       <w:pPr>
         <w:keepNext/>
-        <w:spacing w:after="150"/>
+        <w:spacing w:after="170" w:before="60"/>
       </w:pPr>
       <w:r>
         <w:rPr>
           <w:rFonts w:ascii="Georgia" w:cs="Georgia" w:eastAsia="Georgia" w:hAnsi="Georgia"/>
           <w:i/>
           <w:iCs/>
-          <w:color w:val="1E5C53"/>
-          <w:sz w:val="24"/>
-          <w:szCs w:val="24"/>
+          <w:color w:val="0F3760"/>
+          <w:sz w:val="28"/>
+          <w:szCs w:val="28"/>
         </w:rPr>
         <w:t xml:space="preserve">Beliefs and Needs</w:t>
       </w:r>
@@ -13558,16 +13670,16 @@
     <w:p>
       <w:pPr>
         <w:keepNext/>
-        <w:spacing w:after="150"/>
+        <w:spacing w:after="170" w:before="60"/>
       </w:pPr>
       <w:r>
         <w:rPr>
           <w:rFonts w:ascii="Georgia" w:cs="Georgia" w:eastAsia="Georgia" w:hAnsi="Georgia"/>
           <w:i/>
           <w:iCs/>
-          <w:color w:val="1E5C53"/>
-          <w:sz w:val="24"/>
-          <w:szCs w:val="24"/>
+          <w:color w:val="0F3760"/>
+          <w:sz w:val="28"/>
+          <w:szCs w:val="28"/>
         </w:rPr>
         <w:t xml:space="preserve">The Art of Observation</w:t>
       </w:r>
@@ -14125,16 +14237,16 @@
     <w:p>
       <w:pPr>
         <w:keepNext/>
-        <w:spacing w:after="150"/>
+        <w:spacing w:after="170" w:before="60"/>
       </w:pPr>
       <w:r>
         <w:rPr>
           <w:rFonts w:ascii="Georgia" w:cs="Georgia" w:eastAsia="Georgia" w:hAnsi="Georgia"/>
           <w:i/>
           <w:iCs/>
-          <w:color w:val="1E5C53"/>
-          <w:sz w:val="24"/>
-          <w:szCs w:val="24"/>
+          <w:color w:val="0F3760"/>
+          <w:sz w:val="28"/>
+          <w:szCs w:val="28"/>
         </w:rPr>
         <w:t xml:space="preserve">Scary Honesty</w:t>
       </w:r>
@@ -14534,16 +14646,16 @@
     <w:p>
       <w:pPr>
         <w:keepNext/>
-        <w:spacing w:after="150"/>
+        <w:spacing w:after="170" w:before="60"/>
       </w:pPr>
       <w:r>
         <w:rPr>
           <w:rFonts w:ascii="Georgia" w:cs="Georgia" w:eastAsia="Georgia" w:hAnsi="Georgia"/>
           <w:i/>
           <w:iCs/>
-          <w:color w:val="1E5C53"/>
-          <w:sz w:val="24"/>
-          <w:szCs w:val="24"/>
+          <w:color w:val="0F3760"/>
+          <w:sz w:val="28"/>
+          <w:szCs w:val="28"/>
         </w:rPr>
         <w:t xml:space="preserve">Appreciation from the Heart</w:t>
       </w:r>
@@ -15113,16 +15225,16 @@
     <w:p>
       <w:pPr>
         <w:keepNext/>
-        <w:spacing w:after="150"/>
+        <w:spacing w:after="170" w:before="60"/>
       </w:pPr>
       <w:r>
         <w:rPr>
           <w:rFonts w:ascii="Georgia" w:cs="Georgia" w:eastAsia="Georgia" w:hAnsi="Georgia"/>
           <w:i/>
           <w:iCs/>
-          <w:color w:val="1E5C53"/>
-          <w:sz w:val="24"/>
-          <w:szCs w:val="24"/>
+          <w:color w:val="0F3760"/>
+          <w:sz w:val="28"/>
+          <w:szCs w:val="28"/>
         </w:rPr>
         <w:t xml:space="preserve">The Power of Thanks — More About Appreciation</w:t>
       </w:r>
@@ -15800,16 +15912,16 @@
     <w:p>
       <w:pPr>
         <w:keepNext/>
-        <w:spacing w:after="150"/>
+        <w:spacing w:after="170" w:before="60"/>
       </w:pPr>
       <w:r>
         <w:rPr>
           <w:rFonts w:ascii="Georgia" w:cs="Georgia" w:eastAsia="Georgia" w:hAnsi="Georgia"/>
           <w:i/>
           <w:iCs/>
-          <w:color w:val="1E5C53"/>
-          <w:sz w:val="24"/>
-          <w:szCs w:val="24"/>
+          <w:color w:val="0F3760"/>
+          <w:sz w:val="28"/>
+          <w:szCs w:val="28"/>
         </w:rPr>
         <w:t xml:space="preserve">Apologies Versus Restoration</w:t>
       </w:r>
@@ -16043,19 +16155,82 @@
     <w:p>
       <w:pPr>
         <w:keepLines/>
-        <w:spacing w:after="60" w:before="0" w:line="276" w:lineRule="auto"/>
-      </w:pPr>
-      <w:r>
-        <w:rPr>
-          <w:i w:val="false"/>
-          <w:iCs w:val="false"/>
-          <w:color w:val="2D2D2D"/>
-          <w:sz w:val="20"/>
-          <w:szCs w:val="20"/>
-        </w:rPr>
-        <w:t xml:space="preserve">5. Write down your what you might say. It might be, "When I (did, said etc.), I would have loved to have shown more __________ (ex. care, consideration, etc.) - I know that had an impact on you and so it's really important to me. Now that I understand this, I would like to deal with that differently in the future, in a way that is more in alignment with my values and creates more__________.</w:t>
-      </w:r>
-    </w:p>
+        <w:spacing w:after="80" w:before="0" w:line="276" w:lineRule="auto"/>
+      </w:pPr>
+      <w:r>
+        <w:rPr>
+          <w:i w:val="false"/>
+          <w:iCs w:val="false"/>
+          <w:color w:val="2D2D2D"/>
+          <w:sz w:val="20"/>
+          <w:szCs w:val="20"/>
+        </w:rPr>
+        <w:t xml:space="preserve">5. Write down your what you might say. It might be,</w:t>
+      </w:r>
+    </w:p>
+    <w:tbl>
+      <w:tblPr>
+        <w:tblW w:type="dxa" w:w="9360"/>
+        <w:tblBorders>
+          <w:top w:val="single" w:color="auto" w:sz="4"/>
+          <w:left w:val="single" w:color="auto" w:sz="4"/>
+          <w:bottom w:val="single" w:color="auto" w:sz="4"/>
+          <w:right w:val="single" w:color="auto" w:sz="4"/>
+          <w:insideH w:val="single" w:color="auto" w:sz="4"/>
+          <w:insideV w:val="single" w:color="auto" w:sz="4"/>
+        </w:tblBorders>
+      </w:tblPr>
+      <w:tblGrid>
+        <w:gridCol w:w="9360"/>
+      </w:tblGrid>
+      <w:tr>
+        <w:trPr>
+          <w:cantSplit/>
+        </w:trPr>
+        <w:tc>
+          <w:tcPr>
+            <w:tcW w:type="dxa" w:w="9360"/>
+            <w:tcBorders>
+              <w:top w:val="single" w:color="CFE3DF" w:sz="4"/>
+              <w:left w:val="single" w:color="CFE3DF" w:sz="4"/>
+              <w:bottom w:val="single" w:color="CFE3DF" w:sz="4"/>
+              <w:right w:val="single" w:color="CFE3DF" w:sz="4"/>
+            </w:tcBorders>
+            <w:shd w:fill="FCFBF7" w:val="clear"/>
+            <w:tcMar>
+              <w:top w:type="dxa" w:w="90"/>
+              <w:left w:type="dxa" w:w="130"/>
+              <w:bottom w:type="dxa" w:w="90"/>
+              <w:right w:type="dxa" w:w="130"/>
+            </w:tcMar>
+            <w:vAlign w:val="top"/>
+          </w:tcPr>
+          <w:p>
+            <w:pPr>
+              <w:spacing w:after="0" w:before="0" w:line="276" w:lineRule="auto"/>
+            </w:pPr>
+            <w:r>
+              <w:rPr>
+                <w:color w:val="2A7A6E"/>
+                <w:sz w:val="18"/>
+                <w:szCs w:val="18"/>
+              </w:rPr>
+              <w:t xml:space="preserve">✎  </w:t>
+            </w:r>
+            <w:r>
+              <w:rPr>
+                <w:i/>
+                <w:iCs/>
+                <w:color w:val="2D2D2D"/>
+                <w:sz w:val="20"/>
+                <w:szCs w:val="20"/>
+              </w:rPr>
+              <w:t xml:space="preserve">“When I (did, said etc.), I would have loved to have shown more __________ (ex. care, consideration, etc.) - I know that had an impact on you and so it's really important to me. Now that I understand this, I would like to deal with that differently in the future, in a way that is more in alignment with my values and creates more__________.”</w:t>
+            </w:r>
+          </w:p>
+        </w:tc>
+      </w:tr>
+    </w:tbl>
     <w:p>
       <w:pPr>
         <w:keepLines/>
@@ -16607,16 +16782,16 @@
     <w:p>
       <w:pPr>
         <w:keepNext/>
-        <w:spacing w:after="150"/>
+        <w:spacing w:after="170" w:before="60"/>
       </w:pPr>
       <w:r>
         <w:rPr>
           <w:rFonts w:ascii="Georgia" w:cs="Georgia" w:eastAsia="Georgia" w:hAnsi="Georgia"/>
           <w:i/>
           <w:iCs/>
-          <w:color w:val="1E5C53"/>
-          <w:sz w:val="24"/>
-          <w:szCs w:val="24"/>
+          <w:color w:val="0F3760"/>
+          <w:sz w:val="28"/>
+          <w:szCs w:val="28"/>
         </w:rPr>
         <w:t xml:space="preserve">Hearing 'NO' with Compassion</w:t>
       </w:r>
@@ -17756,16 +17931,16 @@
     <w:p>
       <w:pPr>
         <w:keepNext/>
-        <w:spacing w:after="150"/>
+        <w:spacing w:after="170" w:before="60"/>
       </w:pPr>
       <w:r>
         <w:rPr>
           <w:rFonts w:ascii="Georgia" w:cs="Georgia" w:eastAsia="Georgia" w:hAnsi="Georgia"/>
           <w:i/>
           <w:iCs/>
-          <w:color w:val="1E5C53"/>
-          <w:sz w:val="24"/>
-          <w:szCs w:val="24"/>
+          <w:color w:val="0F3760"/>
+          <w:sz w:val="28"/>
+          <w:szCs w:val="28"/>
         </w:rPr>
         <w:t xml:space="preserve">Living a Life of Compassion</w:t>
       </w:r>
@@ -18347,16 +18522,16 @@
     <w:p>
       <w:pPr>
         <w:keepNext/>
-        <w:spacing w:after="150"/>
+        <w:spacing w:after="170" w:before="60"/>
       </w:pPr>
       <w:r>
         <w:rPr>
           <w:rFonts w:ascii="Georgia" w:cs="Georgia" w:eastAsia="Georgia" w:hAnsi="Georgia"/>
           <w:i/>
           <w:iCs/>
-          <w:color w:val="1E5C53"/>
-          <w:sz w:val="24"/>
-          <w:szCs w:val="24"/>
+          <w:color w:val="0F3760"/>
+          <w:sz w:val="28"/>
+          <w:szCs w:val="28"/>
         </w:rPr>
         <w:t xml:space="preserve">Clarity About Judgments</w:t>
       </w:r>
@@ -19056,16 +19231,16 @@
     <w:p>
       <w:pPr>
         <w:keepNext/>
-        <w:spacing w:after="150"/>
+        <w:spacing w:after="170" w:before="60"/>
       </w:pPr>
       <w:r>
         <w:rPr>
           <w:rFonts w:ascii="Georgia" w:cs="Georgia" w:eastAsia="Georgia" w:hAnsi="Georgia"/>
           <w:i/>
           <w:iCs/>
-          <w:color w:val="1E5C53"/>
-          <w:sz w:val="24"/>
-          <w:szCs w:val="24"/>
+          <w:color w:val="0F3760"/>
+          <w:sz w:val="28"/>
+          <w:szCs w:val="28"/>
         </w:rPr>
         <w:t xml:space="preserve">Connecting to Life Energy</w:t>
       </w:r>
@@ -19873,16 +20048,16 @@
     <w:p>
       <w:pPr>
         <w:keepNext/>
-        <w:spacing w:after="150"/>
+        <w:spacing w:after="170" w:before="60"/>
       </w:pPr>
       <w:r>
         <w:rPr>
           <w:rFonts w:ascii="Georgia" w:cs="Georgia" w:eastAsia="Georgia" w:hAnsi="Georgia"/>
           <w:i/>
           <w:iCs/>
-          <w:color w:val="1E5C53"/>
-          <w:sz w:val="24"/>
-          <w:szCs w:val="24"/>
+          <w:color w:val="0F3760"/>
+          <w:sz w:val="28"/>
+          <w:szCs w:val="28"/>
         </w:rPr>
         <w:t xml:space="preserve">The Layering of Needs</w:t>
       </w:r>
@@ -20584,16 +20759,16 @@
     <w:p>
       <w:pPr>
         <w:keepNext/>
-        <w:spacing w:after="150"/>
+        <w:spacing w:after="170" w:before="60"/>
       </w:pPr>
       <w:r>
         <w:rPr>
           <w:rFonts w:ascii="Georgia" w:cs="Georgia" w:eastAsia="Georgia" w:hAnsi="Georgia"/>
           <w:i/>
           <w:iCs/>
-          <w:color w:val="1E5C53"/>
-          <w:sz w:val="24"/>
-          <w:szCs w:val="24"/>
+          <w:color w:val="0F3760"/>
+          <w:sz w:val="28"/>
+          <w:szCs w:val="28"/>
         </w:rPr>
         <w:t xml:space="preserve">Self-Connection</w:t>
       </w:r>
@@ -21441,16 +21616,16 @@
     <w:p>
       <w:pPr>
         <w:keepNext/>
-        <w:spacing w:after="150"/>
+        <w:spacing w:after="170" w:before="60"/>
       </w:pPr>
       <w:r>
         <w:rPr>
           <w:rFonts w:ascii="Georgia" w:cs="Georgia" w:eastAsia="Georgia" w:hAnsi="Georgia"/>
           <w:i/>
           <w:iCs/>
-          <w:color w:val="1E5C53"/>
-          <w:sz w:val="24"/>
-          <w:szCs w:val="24"/>
+          <w:color w:val="0F3760"/>
+          <w:sz w:val="28"/>
+          <w:szCs w:val="28"/>
         </w:rPr>
         <w:t xml:space="preserve">Enjoying Pain</w:t>
       </w:r>
@@ -22052,16 +22227,16 @@
     <w:p>
       <w:pPr>
         <w:keepNext/>
-        <w:spacing w:after="150"/>
+        <w:spacing w:after="170" w:before="60"/>
       </w:pPr>
       <w:r>
         <w:rPr>
           <w:rFonts w:ascii="Georgia" w:cs="Georgia" w:eastAsia="Georgia" w:hAnsi="Georgia"/>
           <w:i/>
           <w:iCs/>
-          <w:color w:val="1E5C53"/>
-          <w:sz w:val="24"/>
-          <w:szCs w:val="24"/>
+          <w:color w:val="0F3760"/>
+          <w:sz w:val="28"/>
+          <w:szCs w:val="28"/>
         </w:rPr>
         <w:t xml:space="preserve">Shift versus Compromise</w:t>
       </w:r>
@@ -22739,16 +22914,16 @@
     <w:p>
       <w:pPr>
         <w:keepNext/>
-        <w:spacing w:after="150"/>
+        <w:spacing w:after="170" w:before="60"/>
       </w:pPr>
       <w:r>
         <w:rPr>
           <w:rFonts w:ascii="Georgia" w:cs="Georgia" w:eastAsia="Georgia" w:hAnsi="Georgia"/>
           <w:i/>
           <w:iCs/>
-          <w:color w:val="1E5C53"/>
-          <w:sz w:val="24"/>
-          <w:szCs w:val="24"/>
+          <w:color w:val="0F3760"/>
+          <w:sz w:val="28"/>
+          <w:szCs w:val="28"/>
         </w:rPr>
         <w:t xml:space="preserve">Stimulus versus Cause</w:t>
       </w:r>
@@ -23338,16 +23513,16 @@
     <w:p>
       <w:pPr>
         <w:keepNext/>
-        <w:spacing w:after="150"/>
+        <w:spacing w:after="170" w:before="60"/>
       </w:pPr>
       <w:r>
         <w:rPr>
           <w:rFonts w:ascii="Georgia" w:cs="Georgia" w:eastAsia="Georgia" w:hAnsi="Georgia"/>
           <w:i/>
           <w:iCs/>
-          <w:color w:val="1E5C53"/>
-          <w:sz w:val="24"/>
-          <w:szCs w:val="24"/>
+          <w:color w:val="0F3760"/>
+          <w:sz w:val="28"/>
+          <w:szCs w:val="28"/>
         </w:rPr>
         <w:t xml:space="preserve">Understanding Anger</w:t>
       </w:r>
@@ -24057,16 +24232,16 @@
     <w:p>
       <w:pPr>
         <w:keepNext/>
-        <w:spacing w:after="150"/>
+        <w:spacing w:after="170" w:before="60"/>
       </w:pPr>
       <w:r>
         <w:rPr>
           <w:rFonts w:ascii="Georgia" w:cs="Georgia" w:eastAsia="Georgia" w:hAnsi="Georgia"/>
           <w:i/>
           <w:iCs/>
-          <w:color w:val="1E5C53"/>
-          <w:sz w:val="24"/>
-          <w:szCs w:val="24"/>
+          <w:color w:val="0F3760"/>
+          <w:sz w:val="28"/>
+          <w:szCs w:val="28"/>
         </w:rPr>
         <w:t xml:space="preserve">Being Responsive versus Being Responsible</w:t>
       </w:r>
@@ -24586,16 +24761,16 @@
     <w:p>
       <w:pPr>
         <w:keepNext/>
-        <w:spacing w:after="150"/>
+        <w:spacing w:after="170" w:before="60"/>
       </w:pPr>
       <w:r>
         <w:rPr>
           <w:rFonts w:ascii="Georgia" w:cs="Georgia" w:eastAsia="Georgia" w:hAnsi="Georgia"/>
           <w:i/>
           <w:iCs/>
-          <w:color w:val="1E5C53"/>
-          <w:sz w:val="24"/>
-          <w:szCs w:val="24"/>
+          <w:color w:val="0F3760"/>
+          <w:sz w:val="28"/>
+          <w:szCs w:val="28"/>
         </w:rPr>
         <w:t xml:space="preserve">Acting Angry versus Being Angry versus Consciously Feeling Anger</w:t>
       </w:r>
@@ -25299,16 +25474,16 @@
     <w:p>
       <w:pPr>
         <w:keepNext/>
-        <w:spacing w:after="150"/>
+        <w:spacing w:after="170" w:before="60"/>
       </w:pPr>
       <w:r>
         <w:rPr>
           <w:rFonts w:ascii="Georgia" w:cs="Georgia" w:eastAsia="Georgia" w:hAnsi="Georgia"/>
           <w:i/>
           <w:iCs/>
-          <w:color w:val="1E5C53"/>
-          <w:sz w:val="24"/>
-          <w:szCs w:val="24"/>
+          <w:color w:val="0F3760"/>
+          <w:sz w:val="28"/>
+          <w:szCs w:val="28"/>
         </w:rPr>
         <w:t xml:space="preserve">Surfing Intensity</w:t>
       </w:r>
@@ -26002,16 +26177,16 @@
     <w:p>
       <w:pPr>
         <w:keepNext/>
-        <w:spacing w:after="150"/>
+        <w:spacing w:after="170" w:before="60"/>
       </w:pPr>
       <w:r>
         <w:rPr>
           <w:rFonts w:ascii="Georgia" w:cs="Georgia" w:eastAsia="Georgia" w:hAnsi="Georgia"/>
           <w:i/>
           <w:iCs/>
-          <w:color w:val="1E5C53"/>
-          <w:sz w:val="24"/>
-          <w:szCs w:val="24"/>
+          <w:color w:val="0F3760"/>
+          <w:sz w:val="28"/>
+          <w:szCs w:val="28"/>
         </w:rPr>
         <w:t xml:space="preserve">Compassionate Intensity</w:t>
       </w:r>
@@ -26697,16 +26872,16 @@
     <w:p>
       <w:pPr>
         <w:keepNext/>
-        <w:spacing w:after="150"/>
+        <w:spacing w:after="170" w:before="60"/>
       </w:pPr>
       <w:r>
         <w:rPr>
           <w:rFonts w:ascii="Georgia" w:cs="Georgia" w:eastAsia="Georgia" w:hAnsi="Georgia"/>
           <w:i/>
           <w:iCs/>
-          <w:color w:val="1E5C53"/>
-          <w:sz w:val="24"/>
-          <w:szCs w:val="24"/>
+          <w:color w:val="0F3760"/>
+          <w:sz w:val="28"/>
+          <w:szCs w:val="28"/>
         </w:rPr>
         <w:t xml:space="preserve">Words and Thoughts That Fuel Anger and Deny Choice</w:t>
       </w:r>
@@ -27230,16 +27405,16 @@
     <w:p>
       <w:pPr>
         <w:keepNext/>
-        <w:spacing w:after="150"/>
+        <w:spacing w:after="170" w:before="60"/>
       </w:pPr>
       <w:r>
         <w:rPr>
           <w:rFonts w:ascii="Georgia" w:cs="Georgia" w:eastAsia="Georgia" w:hAnsi="Georgia"/>
           <w:i/>
           <w:iCs/>
-          <w:color w:val="1E5C53"/>
-          <w:sz w:val="24"/>
-          <w:szCs w:val="24"/>
+          <w:color w:val="0F3760"/>
+          <w:sz w:val="28"/>
+          <w:szCs w:val="28"/>
         </w:rPr>
         <w:t xml:space="preserve">Agreements versus Rules</w:t>
       </w:r>
@@ -27885,16 +28060,16 @@
     <w:p>
       <w:pPr>
         <w:keepNext/>
-        <w:spacing w:after="150"/>
+        <w:spacing w:after="170" w:before="60"/>
       </w:pPr>
       <w:r>
         <w:rPr>
           <w:rFonts w:ascii="Georgia" w:cs="Georgia" w:eastAsia="Georgia" w:hAnsi="Georgia"/>
           <w:i/>
           <w:iCs/>
-          <w:color w:val="1E5C53"/>
-          <w:sz w:val="24"/>
-          <w:szCs w:val="24"/>
+          <w:color w:val="0F3760"/>
+          <w:sz w:val="28"/>
+          <w:szCs w:val="28"/>
         </w:rPr>
         <w:t xml:space="preserve">The Art of Mourning</w:t>
       </w:r>
@@ -28664,16 +28839,16 @@
     <w:p>
       <w:pPr>
         <w:keepNext/>
-        <w:spacing w:after="150"/>
+        <w:spacing w:after="170" w:before="60"/>
       </w:pPr>
       <w:r>
         <w:rPr>
           <w:rFonts w:ascii="Georgia" w:cs="Georgia" w:eastAsia="Georgia" w:hAnsi="Georgia"/>
           <w:i/>
           <w:iCs/>
-          <w:color w:val="1E5C53"/>
-          <w:sz w:val="24"/>
-          <w:szCs w:val="24"/>
+          <w:color w:val="0F3760"/>
+          <w:sz w:val="28"/>
+          <w:szCs w:val="28"/>
         </w:rPr>
         <w:t xml:space="preserve">Enemy Images</w:t>
       </w:r>
@@ -29481,16 +29656,16 @@
     <w:p>
       <w:pPr>
         <w:keepNext/>
-        <w:spacing w:after="150"/>
+        <w:spacing w:after="170" w:before="60"/>
       </w:pPr>
       <w:r>
         <w:rPr>
           <w:rFonts w:ascii="Georgia" w:cs="Georgia" w:eastAsia="Georgia" w:hAnsi="Georgia"/>
           <w:i/>
           <w:iCs/>
-          <w:color w:val="1E5C53"/>
-          <w:sz w:val="24"/>
-          <w:szCs w:val="24"/>
+          <w:color w:val="0F3760"/>
+          <w:sz w:val="28"/>
+          <w:szCs w:val="28"/>
         </w:rPr>
         <w:t xml:space="preserve">Power With versus Power Over</w:t>
       </w:r>
@@ -30104,16 +30279,16 @@
     <w:p>
       <w:pPr>
         <w:keepNext/>
-        <w:spacing w:after="150"/>
+        <w:spacing w:after="170" w:before="60"/>
       </w:pPr>
       <w:r>
         <w:rPr>
           <w:rFonts w:ascii="Georgia" w:cs="Georgia" w:eastAsia="Georgia" w:hAnsi="Georgia"/>
           <w:i/>
           <w:iCs/>
-          <w:color w:val="1E5C53"/>
-          <w:sz w:val="24"/>
-          <w:szCs w:val="24"/>
+          <w:color w:val="0F3760"/>
+          <w:sz w:val="28"/>
+          <w:szCs w:val="28"/>
         </w:rPr>
         <w:t xml:space="preserve">Compassionate Self-Discipline</w:t>
       </w:r>
@@ -30685,16 +30860,16 @@
     <w:p>
       <w:pPr>
         <w:keepNext/>
-        <w:spacing w:after="150"/>
+        <w:spacing w:after="170" w:before="60"/>
       </w:pPr>
       <w:r>
         <w:rPr>
           <w:rFonts w:ascii="Georgia" w:cs="Georgia" w:eastAsia="Georgia" w:hAnsi="Georgia"/>
           <w:i/>
           <w:iCs/>
-          <w:color w:val="1E5C53"/>
-          <w:sz w:val="24"/>
-          <w:szCs w:val="24"/>
+          <w:color w:val="0F3760"/>
+          <w:sz w:val="28"/>
+          <w:szCs w:val="28"/>
         </w:rPr>
         <w:t xml:space="preserve">Habitual Authority versus Life-Connected Authority</w:t>
       </w:r>
@@ -31334,16 +31509,16 @@
     <w:p>
       <w:pPr>
         <w:keepNext/>
-        <w:spacing w:after="150"/>
+        <w:spacing w:after="170" w:before="60"/>
       </w:pPr>
       <w:r>
         <w:rPr>
           <w:rFonts w:ascii="Georgia" w:cs="Georgia" w:eastAsia="Georgia" w:hAnsi="Georgia"/>
           <w:i/>
           <w:iCs/>
-          <w:color w:val="1E5C53"/>
-          <w:sz w:val="24"/>
-          <w:szCs w:val="24"/>
+          <w:color w:val="0F3760"/>
+          <w:sz w:val="28"/>
+          <w:szCs w:val="28"/>
         </w:rPr>
         <w:t xml:space="preserve">Compassion and Vulnerability</w:t>
       </w:r>
@@ -31686,22 +31861,69 @@
         <w:t xml:space="preserve">4. Self-Compassion: Ask yourself what needs you were trying to meet in the action or words you chose to say or do. Give yourself the gift of compassionate understanding. Write a message to yourself like:</w:t>
       </w:r>
     </w:p>
-    <w:p>
-      <w:pPr>
-        <w:keepLines/>
-        <w:spacing w:after="60" w:before="0" w:line="276" w:lineRule="auto"/>
-      </w:pPr>
-      <w:r>
-        <w:rPr>
-          <w:i w:val="false"/>
-          <w:iCs w:val="false"/>
-          <w:color w:val="2D2D2D"/>
-          <w:sz w:val="20"/>
-          <w:szCs w:val="20"/>
-        </w:rPr>
-        <w:t xml:space="preserve">"I understand why I did that. I was trying to meet my needs for ______, _____ and _____. And even though I understand that, I would love to meet those needs in a way that is more in alignment with my other needs for ______, _____ and _______.</w:t>
-      </w:r>
-    </w:p>
+    <w:tbl>
+      <w:tblPr>
+        <w:tblW w:type="dxa" w:w="9360"/>
+        <w:tblBorders>
+          <w:top w:val="single" w:color="auto" w:sz="4"/>
+          <w:left w:val="single" w:color="auto" w:sz="4"/>
+          <w:bottom w:val="single" w:color="auto" w:sz="4"/>
+          <w:right w:val="single" w:color="auto" w:sz="4"/>
+          <w:insideH w:val="single" w:color="auto" w:sz="4"/>
+          <w:insideV w:val="single" w:color="auto" w:sz="4"/>
+        </w:tblBorders>
+      </w:tblPr>
+      <w:tblGrid>
+        <w:gridCol w:w="9360"/>
+      </w:tblGrid>
+      <w:tr>
+        <w:trPr>
+          <w:cantSplit/>
+        </w:trPr>
+        <w:tc>
+          <w:tcPr>
+            <w:tcW w:type="dxa" w:w="9360"/>
+            <w:tcBorders>
+              <w:top w:val="single" w:color="CFE3DF" w:sz="4"/>
+              <w:left w:val="single" w:color="CFE3DF" w:sz="4"/>
+              <w:bottom w:val="single" w:color="CFE3DF" w:sz="4"/>
+              <w:right w:val="single" w:color="CFE3DF" w:sz="4"/>
+            </w:tcBorders>
+            <w:shd w:fill="FCFBF7" w:val="clear"/>
+            <w:tcMar>
+              <w:top w:type="dxa" w:w="90"/>
+              <w:left w:type="dxa" w:w="130"/>
+              <w:bottom w:type="dxa" w:w="90"/>
+              <w:right w:type="dxa" w:w="130"/>
+            </w:tcMar>
+            <w:vAlign w:val="top"/>
+          </w:tcPr>
+          <w:p>
+            <w:pPr>
+              <w:spacing w:after="0" w:before="0" w:line="276" w:lineRule="auto"/>
+            </w:pPr>
+            <w:r>
+              <w:rPr>
+                <w:color w:val="2A7A6E"/>
+                <w:sz w:val="18"/>
+                <w:szCs w:val="18"/>
+              </w:rPr>
+              <w:t xml:space="preserve">✎  </w:t>
+            </w:r>
+            <w:r>
+              <w:rPr>
+                <w:i/>
+                <w:iCs/>
+                <w:color w:val="2D2D2D"/>
+                <w:sz w:val="20"/>
+                <w:szCs w:val="20"/>
+              </w:rPr>
+              <w:t xml:space="preserve">“I understand why I did that. I was trying to meet my needs for ______, _____ and _____. And even though I understand that, I would love to meet those needs in a way that is more in alignment with my other needs for ______, _____ and _______.”</w:t>
+            </w:r>
+          </w:p>
+        </w:tc>
+      </w:tr>
+    </w:tbl>
     <w:p>
       <w:pPr>
         <w:keepLines/>
@@ -31737,29 +31959,82 @@
     <w:p>
       <w:pPr>
         <w:keepLines/>
-        <w:spacing w:after="60" w:before="0" w:line="276" w:lineRule="auto"/>
-      </w:pPr>
-      <w:r>
-        <w:rPr>
-          <w:i w:val="false"/>
-          <w:iCs w:val="false"/>
-          <w:color w:val="2D2D2D"/>
-          <w:sz w:val="20"/>
-          <w:szCs w:val="20"/>
-        </w:rPr>
-        <w:t xml:space="preserve">It might sound like, </w:t>
-      </w:r>
-      <w:r>
-        <w:rPr>
-          <w:i/>
-          <w:iCs/>
-          <w:color w:val="2D2D2D"/>
-          <w:sz w:val="20"/>
-          <w:szCs w:val="20"/>
-        </w:rPr>
-        <w:t xml:space="preserve">“I'm feeling a bit scared sharing this with you because I'm afraid of being judged, but I really want to reconnect. When I (did, said etc.), I didn't meet my need for __________ (ex. care, consideration, ...), and that is really important to me because I know it had an impact on you. Now that I realize this, I would like to deal with that differently, in a way that is more in alignment with my values and creates more __________. I'm wondering what goes on for you hearing this?”</w:t>
-      </w:r>
-    </w:p>
+        <w:spacing w:after="80" w:before="0" w:line="276" w:lineRule="auto"/>
+      </w:pPr>
+      <w:r>
+        <w:rPr>
+          <w:i w:val="false"/>
+          <w:iCs w:val="false"/>
+          <w:color w:val="2D2D2D"/>
+          <w:sz w:val="20"/>
+          <w:szCs w:val="20"/>
+        </w:rPr>
+        <w:t xml:space="preserve">It might sound like,</w:t>
+      </w:r>
+    </w:p>
+    <w:tbl>
+      <w:tblPr>
+        <w:tblW w:type="dxa" w:w="9360"/>
+        <w:tblBorders>
+          <w:top w:val="single" w:color="auto" w:sz="4"/>
+          <w:left w:val="single" w:color="auto" w:sz="4"/>
+          <w:bottom w:val="single" w:color="auto" w:sz="4"/>
+          <w:right w:val="single" w:color="auto" w:sz="4"/>
+          <w:insideH w:val="single" w:color="auto" w:sz="4"/>
+          <w:insideV w:val="single" w:color="auto" w:sz="4"/>
+        </w:tblBorders>
+      </w:tblPr>
+      <w:tblGrid>
+        <w:gridCol w:w="9360"/>
+      </w:tblGrid>
+      <w:tr>
+        <w:trPr>
+          <w:cantSplit/>
+        </w:trPr>
+        <w:tc>
+          <w:tcPr>
+            <w:tcW w:type="dxa" w:w="9360"/>
+            <w:tcBorders>
+              <w:top w:val="single" w:color="CFE3DF" w:sz="4"/>
+              <w:left w:val="single" w:color="CFE3DF" w:sz="4"/>
+              <w:bottom w:val="single" w:color="CFE3DF" w:sz="4"/>
+              <w:right w:val="single" w:color="CFE3DF" w:sz="4"/>
+            </w:tcBorders>
+            <w:shd w:fill="FCFBF7" w:val="clear"/>
+            <w:tcMar>
+              <w:top w:type="dxa" w:w="90"/>
+              <w:left w:type="dxa" w:w="130"/>
+              <w:bottom w:type="dxa" w:w="90"/>
+              <w:right w:type="dxa" w:w="130"/>
+            </w:tcMar>
+            <w:vAlign w:val="top"/>
+          </w:tcPr>
+          <w:p>
+            <w:pPr>
+              <w:spacing w:after="0" w:before="0" w:line="276" w:lineRule="auto"/>
+            </w:pPr>
+            <w:r>
+              <w:rPr>
+                <w:color w:val="2A7A6E"/>
+                <w:sz w:val="18"/>
+                <w:szCs w:val="18"/>
+              </w:rPr>
+              <w:t xml:space="preserve">✎  </w:t>
+            </w:r>
+            <w:r>
+              <w:rPr>
+                <w:i/>
+                <w:iCs/>
+                <w:color w:val="2D2D2D"/>
+                <w:sz w:val="20"/>
+                <w:szCs w:val="20"/>
+              </w:rPr>
+              <w:t xml:space="preserve">“I'm feeling a bit scared sharing this with you because I'm afraid of being judged, but I really want to reconnect. When I (did, said etc.), I didn't meet my need for __________ (ex. care, consideration, ...), and that is really important to me because I know it had an impact on you. Now that I realize this, I would like to deal with that differently, in a way that is more in alignment with my values and creates more __________. I'm wondering what goes on for you hearing this?”</w:t>
+            </w:r>
+          </w:p>
+        </w:tc>
+      </w:tr>
+    </w:tbl>
     <w:p>
       <w:pPr>
         <w:keepLines/>
@@ -32165,16 +32440,16 @@
     <w:p>
       <w:pPr>
         <w:keepNext/>
-        <w:spacing w:after="150"/>
+        <w:spacing w:after="170" w:before="60"/>
       </w:pPr>
       <w:r>
         <w:rPr>
           <w:rFonts w:ascii="Georgia" w:cs="Georgia" w:eastAsia="Georgia" w:hAnsi="Georgia"/>
           <w:i/>
           <w:iCs/>
-          <w:color w:val="1E5C53"/>
-          <w:sz w:val="24"/>
-          <w:szCs w:val="24"/>
+          <w:color w:val="0F3760"/>
+          <w:sz w:val="28"/>
+          <w:szCs w:val="28"/>
         </w:rPr>
         <w:t xml:space="preserve">Demanding versus Persevering</w:t>
       </w:r>
@@ -32856,16 +33131,16 @@
     <w:p>
       <w:pPr>
         <w:keepNext/>
-        <w:spacing w:after="150"/>
+        <w:spacing w:after="170" w:before="60"/>
       </w:pPr>
       <w:r>
         <w:rPr>
           <w:rFonts w:ascii="Georgia" w:cs="Georgia" w:eastAsia="Georgia" w:hAnsi="Georgia"/>
           <w:i/>
           <w:iCs/>
-          <w:color w:val="1E5C53"/>
-          <w:sz w:val="24"/>
-          <w:szCs w:val="24"/>
+          <w:color w:val="0F3760"/>
+          <w:sz w:val="28"/>
+          <w:szCs w:val="28"/>
         </w:rPr>
         <w:t xml:space="preserve">A Compassionate View of Triggers</w:t>
       </w:r>
@@ -33627,16 +33902,16 @@
     <w:p>
       <w:pPr>
         <w:keepNext/>
-        <w:spacing w:after="150"/>
+        <w:spacing w:after="170" w:before="60"/>
       </w:pPr>
       <w:r>
         <w:rPr>
           <w:rFonts w:ascii="Georgia" w:cs="Georgia" w:eastAsia="Georgia" w:hAnsi="Georgia"/>
           <w:i/>
           <w:iCs/>
-          <w:color w:val="1E5C53"/>
-          <w:sz w:val="24"/>
-          <w:szCs w:val="24"/>
+          <w:color w:val="0F3760"/>
+          <w:sz w:val="28"/>
+          <w:szCs w:val="28"/>
         </w:rPr>
         <w:t xml:space="preserve">Pervasive Feelings</w:t>
       </w:r>
@@ -34302,16 +34577,16 @@
     <w:p>
       <w:pPr>
         <w:keepNext/>
-        <w:spacing w:after="150"/>
+        <w:spacing w:after="170" w:before="60"/>
       </w:pPr>
       <w:r>
         <w:rPr>
           <w:rFonts w:ascii="Georgia" w:cs="Georgia" w:eastAsia="Georgia" w:hAnsi="Georgia"/>
           <w:i/>
           <w:iCs/>
-          <w:color w:val="1E5C53"/>
-          <w:sz w:val="24"/>
-          <w:szCs w:val="24"/>
+          <w:color w:val="0F3760"/>
+          <w:sz w:val="28"/>
+          <w:szCs w:val="28"/>
         </w:rPr>
         <w:t xml:space="preserve">Campaigns</w:t>
       </w:r>
@@ -34937,16 +35212,16 @@
     <w:p>
       <w:pPr>
         <w:keepNext/>
-        <w:spacing w:after="150"/>
+        <w:spacing w:after="170" w:before="60"/>
       </w:pPr>
       <w:r>
         <w:rPr>
           <w:rFonts w:ascii="Georgia" w:cs="Georgia" w:eastAsia="Georgia" w:hAnsi="Georgia"/>
           <w:i/>
           <w:iCs/>
-          <w:color w:val="1E5C53"/>
-          <w:sz w:val="24"/>
-          <w:szCs w:val="24"/>
+          <w:color w:val="0F3760"/>
+          <w:sz w:val="28"/>
+          <w:szCs w:val="28"/>
         </w:rPr>
         <w:t xml:space="preserve">Speaking Your Compassion</w:t>
       </w:r>
@@ -35846,16 +36121,16 @@
     <w:p>
       <w:pPr>
         <w:keepNext/>
-        <w:spacing w:after="150"/>
+        <w:spacing w:after="170" w:before="60"/>
       </w:pPr>
       <w:r>
         <w:rPr>
           <w:rFonts w:ascii="Georgia" w:cs="Georgia" w:eastAsia="Georgia" w:hAnsi="Georgia"/>
           <w:i/>
           <w:iCs/>
-          <w:color w:val="1E5C53"/>
-          <w:sz w:val="24"/>
-          <w:szCs w:val="24"/>
+          <w:color w:val="0F3760"/>
+          <w:sz w:val="28"/>
+          <w:szCs w:val="28"/>
         </w:rPr>
         <w:t xml:space="preserve">Compassion As a Spiritual Practice</w:t>
       </w:r>
@@ -36493,16 +36768,16 @@
     <w:p>
       <w:pPr>
         <w:keepNext/>
-        <w:spacing w:after="150"/>
+        <w:spacing w:after="170" w:before="60"/>
       </w:pPr>
       <w:r>
         <w:rPr>
           <w:rFonts w:ascii="Georgia" w:cs="Georgia" w:eastAsia="Georgia" w:hAnsi="Georgia"/>
           <w:i/>
           <w:iCs/>
-          <w:color w:val="1E5C53"/>
-          <w:sz w:val="24"/>
-          <w:szCs w:val="24"/>
+          <w:color w:val="0F3760"/>
+          <w:sz w:val="28"/>
+          <w:szCs w:val="28"/>
         </w:rPr>
         <w:t xml:space="preserve">Living With Compassion</w:t>
       </w:r>

</xml_diff>

<commit_message>
Workbook: per-week theme colors + underlined fill-in blanks
- Each week's banner, lesson title and answer-box headers now use that
  week's theme color, mirrored from the website lessons (--wk-primary,
  cycled by week mod 8) so a workbook week matches its website page.
  Protected weeks inherit the same cycle slot. Practice headings switched
  to neutral charcoal + gold bar so the colored title always stands apart
  (incl. on teal weeks).
- Fill-in-the-blank templates: render blanks as underline-formatted spaces
  instead of underscore characters, so typed text inherits the underline
  and sits ON the line (and the line grows with it) rather than landing
  beside stray underscores.
- Still 59 pages; per-week one-page fit preserved.

Co-Authored-By: Claude Opus 4.8 (1M context) <noreply@anthropic.com>
</commit_message>
<xml_diff>
--- a/.local-workbook/The Compassion Course 2026-2027 Workbook.docx
+++ b/.local-workbook/The Compassion Course 2026-2027 Workbook.docx
@@ -527,6 +527,7 @@
       <w:pPr>
         <w:pStyle w:val="Heading1"/>
         <w:pageBreakBefore/>
+        <w:shd w:fill="1F5C52" w:val="clear"/>
         <w:spacing w:after="40" w:before="0"/>
       </w:pPr>
       <w:r>
@@ -543,7 +544,7 @@
           <w:rFonts w:ascii="Georgia" w:cs="Georgia" w:eastAsia="Georgia" w:hAnsi="Georgia"/>
           <w:i/>
           <w:iCs/>
-          <w:color w:val="0F3760"/>
+          <w:color w:val="1F5C52"/>
           <w:sz w:val="28"/>
           <w:szCs w:val="28"/>
         </w:rPr>
@@ -605,7 +606,7 @@
               <w:bottom w:val="single" w:color="CFE3DF" w:sz="4"/>
               <w:right w:val="single" w:color="CFE3DF" w:sz="4"/>
             </w:tcBorders>
-            <w:shd w:fill="2A7A6E" w:val="clear"/>
+            <w:shd w:fill="1F5C52" w:val="clear"/>
             <w:tcMar>
               <w:top w:type="dxa" w:w="40"/>
               <w:left w:type="dxa" w:w="110"/>
@@ -723,7 +724,7 @@
               <w:bottom w:val="single" w:color="CFE3DF" w:sz="4"/>
               <w:right w:val="single" w:color="CFE3DF" w:sz="4"/>
             </w:tcBorders>
-            <w:shd w:fill="2A7A6E" w:val="clear"/>
+            <w:shd w:fill="1F5C52" w:val="clear"/>
             <w:tcMar>
               <w:top w:type="dxa" w:w="40"/>
               <w:left w:type="dxa" w:w="110"/>
@@ -857,7 +858,7 @@
               <w:bottom w:val="single" w:color="CFE3DF" w:sz="4"/>
               <w:right w:val="single" w:color="CFE3DF" w:sz="4"/>
             </w:tcBorders>
-            <w:shd w:fill="2A7A6E" w:val="clear"/>
+            <w:shd w:fill="1F5C52" w:val="clear"/>
             <w:tcMar>
               <w:top w:type="dxa" w:w="40"/>
               <w:left w:type="dxa" w:w="110"/>
@@ -991,7 +992,7 @@
               <w:bottom w:val="single" w:color="CFE3DF" w:sz="4"/>
               <w:right w:val="single" w:color="CFE3DF" w:sz="4"/>
             </w:tcBorders>
-            <w:shd w:fill="2A7A6E" w:val="clear"/>
+            <w:shd w:fill="1F5C52" w:val="clear"/>
             <w:tcMar>
               <w:top w:type="dxa" w:w="40"/>
               <w:left w:type="dxa" w:w="110"/>
@@ -1095,7 +1096,7 @@
               <w:bottom w:val="single" w:color="CFE3DF" w:sz="4"/>
               <w:right w:val="single" w:color="CFE3DF" w:sz="4"/>
             </w:tcBorders>
-            <w:shd w:fill="2A7A6E" w:val="clear"/>
+            <w:shd w:fill="1F5C52" w:val="clear"/>
             <w:tcMar>
               <w:top w:type="dxa" w:w="40"/>
               <w:left w:type="dxa" w:w="110"/>
@@ -1128,7 +1129,7 @@
               <w:bottom w:val="single" w:color="CFE3DF" w:sz="4"/>
               <w:right w:val="single" w:color="CFE3DF" w:sz="4"/>
             </w:tcBorders>
-            <w:shd w:fill="2A7A6E" w:val="clear"/>
+            <w:shd w:fill="1F5C52" w:val="clear"/>
             <w:tcMar>
               <w:top w:type="dxa" w:w="40"/>
               <w:left w:type="dxa" w:w="110"/>
@@ -1161,7 +1162,7 @@
               <w:bottom w:val="single" w:color="CFE3DF" w:sz="4"/>
               <w:right w:val="single" w:color="CFE3DF" w:sz="4"/>
             </w:tcBorders>
-            <w:shd w:fill="2A7A6E" w:val="clear"/>
+            <w:shd w:fill="1F5C52" w:val="clear"/>
             <w:tcMar>
               <w:top w:type="dxa" w:w="40"/>
               <w:left w:type="dxa" w:w="110"/>
@@ -1290,6 +1291,7 @@
       <w:pPr>
         <w:pStyle w:val="Heading1"/>
         <w:pageBreakBefore/>
+        <w:shd w:fill="7A4F1D" w:val="clear"/>
         <w:spacing w:after="40" w:before="0"/>
       </w:pPr>
       <w:r>
@@ -1306,7 +1308,7 @@
           <w:rFonts w:ascii="Georgia" w:cs="Georgia" w:eastAsia="Georgia" w:hAnsi="Georgia"/>
           <w:i/>
           <w:iCs/>
-          <w:color w:val="0F3760"/>
+          <w:color w:val="7A4F1D"/>
           <w:sz w:val="28"/>
           <w:szCs w:val="28"/>
         </w:rPr>
@@ -1368,7 +1370,7 @@
               <w:bottom w:val="single" w:color="CFE3DF" w:sz="4"/>
               <w:right w:val="single" w:color="CFE3DF" w:sz="4"/>
             </w:tcBorders>
-            <w:shd w:fill="2A7A6E" w:val="clear"/>
+            <w:shd w:fill="7A4F1D" w:val="clear"/>
             <w:tcMar>
               <w:top w:type="dxa" w:w="40"/>
               <w:left w:type="dxa" w:w="110"/>
@@ -1486,7 +1488,7 @@
               <w:bottom w:val="single" w:color="CFE3DF" w:sz="4"/>
               <w:right w:val="single" w:color="CFE3DF" w:sz="4"/>
             </w:tcBorders>
-            <w:shd w:fill="2A7A6E" w:val="clear"/>
+            <w:shd w:fill="7A4F1D" w:val="clear"/>
             <w:tcMar>
               <w:top w:type="dxa" w:w="40"/>
               <w:left w:type="dxa" w:w="110"/>
@@ -1604,7 +1606,7 @@
               <w:bottom w:val="single" w:color="CFE3DF" w:sz="4"/>
               <w:right w:val="single" w:color="CFE3DF" w:sz="4"/>
             </w:tcBorders>
-            <w:shd w:fill="2A7A6E" w:val="clear"/>
+            <w:shd w:fill="7A4F1D" w:val="clear"/>
             <w:tcMar>
               <w:top w:type="dxa" w:w="40"/>
               <w:left w:type="dxa" w:w="110"/>
@@ -1708,7 +1710,7 @@
               <w:bottom w:val="single" w:color="CFE3DF" w:sz="4"/>
               <w:right w:val="single" w:color="CFE3DF" w:sz="4"/>
             </w:tcBorders>
-            <w:shd w:fill="2A7A6E" w:val="clear"/>
+            <w:shd w:fill="7A4F1D" w:val="clear"/>
             <w:tcMar>
               <w:top w:type="dxa" w:w="40"/>
               <w:left w:type="dxa" w:w="110"/>
@@ -1741,7 +1743,7 @@
               <w:bottom w:val="single" w:color="CFE3DF" w:sz="4"/>
               <w:right w:val="single" w:color="CFE3DF" w:sz="4"/>
             </w:tcBorders>
-            <w:shd w:fill="2A7A6E" w:val="clear"/>
+            <w:shd w:fill="7A4F1D" w:val="clear"/>
             <w:tcMar>
               <w:top w:type="dxa" w:w="40"/>
               <w:left w:type="dxa" w:w="110"/>
@@ -1774,7 +1776,7 @@
               <w:bottom w:val="single" w:color="CFE3DF" w:sz="4"/>
               <w:right w:val="single" w:color="CFE3DF" w:sz="4"/>
             </w:tcBorders>
-            <w:shd w:fill="2A7A6E" w:val="clear"/>
+            <w:shd w:fill="7A4F1D" w:val="clear"/>
             <w:tcMar>
               <w:top w:type="dxa" w:w="40"/>
               <w:left w:type="dxa" w:w="110"/>
@@ -1903,6 +1905,7 @@
       <w:pPr>
         <w:pStyle w:val="Heading1"/>
         <w:pageBreakBefore/>
+        <w:shd w:fill="324D61" w:val="clear"/>
         <w:spacing w:after="40" w:before="0"/>
       </w:pPr>
       <w:r>
@@ -1919,7 +1922,7 @@
           <w:rFonts w:ascii="Georgia" w:cs="Georgia" w:eastAsia="Georgia" w:hAnsi="Georgia"/>
           <w:i/>
           <w:iCs/>
-          <w:color w:val="0F3760"/>
+          <w:color w:val="324D61"/>
           <w:sz w:val="28"/>
           <w:szCs w:val="28"/>
         </w:rPr>
@@ -2049,7 +2052,7 @@
               <w:bottom w:val="single" w:color="CFE3DF" w:sz="4"/>
               <w:right w:val="single" w:color="CFE3DF" w:sz="4"/>
             </w:tcBorders>
-            <w:shd w:fill="2A7A6E" w:val="clear"/>
+            <w:shd w:fill="324D61" w:val="clear"/>
             <w:tcMar>
               <w:top w:type="dxa" w:w="40"/>
               <w:left w:type="dxa" w:w="110"/>
@@ -2219,7 +2222,7 @@
               <w:bottom w:val="single" w:color="CFE3DF" w:sz="4"/>
               <w:right w:val="single" w:color="CFE3DF" w:sz="4"/>
             </w:tcBorders>
-            <w:shd w:fill="2A7A6E" w:val="clear"/>
+            <w:shd w:fill="324D61" w:val="clear"/>
             <w:tcMar>
               <w:top w:type="dxa" w:w="40"/>
               <w:left w:type="dxa" w:w="110"/>
@@ -2323,7 +2326,7 @@
               <w:bottom w:val="single" w:color="CFE3DF" w:sz="4"/>
               <w:right w:val="single" w:color="CFE3DF" w:sz="4"/>
             </w:tcBorders>
-            <w:shd w:fill="2A7A6E" w:val="clear"/>
+            <w:shd w:fill="324D61" w:val="clear"/>
             <w:tcMar>
               <w:top w:type="dxa" w:w="40"/>
               <w:left w:type="dxa" w:w="110"/>
@@ -2356,7 +2359,7 @@
               <w:bottom w:val="single" w:color="CFE3DF" w:sz="4"/>
               <w:right w:val="single" w:color="CFE3DF" w:sz="4"/>
             </w:tcBorders>
-            <w:shd w:fill="2A7A6E" w:val="clear"/>
+            <w:shd w:fill="324D61" w:val="clear"/>
             <w:tcMar>
               <w:top w:type="dxa" w:w="40"/>
               <w:left w:type="dxa" w:w="110"/>
@@ -2389,7 +2392,7 @@
               <w:bottom w:val="single" w:color="CFE3DF" w:sz="4"/>
               <w:right w:val="single" w:color="CFE3DF" w:sz="4"/>
             </w:tcBorders>
-            <w:shd w:fill="2A7A6E" w:val="clear"/>
+            <w:shd w:fill="324D61" w:val="clear"/>
             <w:tcMar>
               <w:top w:type="dxa" w:w="40"/>
               <w:left w:type="dxa" w:w="110"/>
@@ -2518,6 +2521,7 @@
       <w:pPr>
         <w:pStyle w:val="Heading1"/>
         <w:pageBreakBefore/>
+        <w:shd w:fill="7A474D" w:val="clear"/>
         <w:spacing w:after="40" w:before="0"/>
       </w:pPr>
       <w:r>
@@ -2534,7 +2538,7 @@
           <w:rFonts w:ascii="Georgia" w:cs="Georgia" w:eastAsia="Georgia" w:hAnsi="Georgia"/>
           <w:i/>
           <w:iCs/>
-          <w:color w:val="0F3760"/>
+          <w:color w:val="7A474D"/>
           <w:sz w:val="28"/>
           <w:szCs w:val="28"/>
         </w:rPr>
@@ -2596,7 +2600,7 @@
               <w:bottom w:val="single" w:color="CFE3DF" w:sz="4"/>
               <w:right w:val="single" w:color="CFE3DF" w:sz="4"/>
             </w:tcBorders>
-            <w:shd w:fill="2A7A6E" w:val="clear"/>
+            <w:shd w:fill="7A474D" w:val="clear"/>
             <w:tcMar>
               <w:top w:type="dxa" w:w="40"/>
               <w:left w:type="dxa" w:w="110"/>
@@ -2730,7 +2734,7 @@
               <w:bottom w:val="single" w:color="CFE3DF" w:sz="4"/>
               <w:right w:val="single" w:color="CFE3DF" w:sz="4"/>
             </w:tcBorders>
-            <w:shd w:fill="2A7A6E" w:val="clear"/>
+            <w:shd w:fill="7A474D" w:val="clear"/>
             <w:tcMar>
               <w:top w:type="dxa" w:w="40"/>
               <w:left w:type="dxa" w:w="110"/>
@@ -2848,7 +2852,7 @@
               <w:bottom w:val="single" w:color="CFE3DF" w:sz="4"/>
               <w:right w:val="single" w:color="CFE3DF" w:sz="4"/>
             </w:tcBorders>
-            <w:shd w:fill="2A7A6E" w:val="clear"/>
+            <w:shd w:fill="7A474D" w:val="clear"/>
             <w:tcMar>
               <w:top w:type="dxa" w:w="40"/>
               <w:left w:type="dxa" w:w="110"/>
@@ -2966,7 +2970,7 @@
               <w:bottom w:val="single" w:color="CFE3DF" w:sz="4"/>
               <w:right w:val="single" w:color="CFE3DF" w:sz="4"/>
             </w:tcBorders>
-            <w:shd w:fill="2A7A6E" w:val="clear"/>
+            <w:shd w:fill="7A474D" w:val="clear"/>
             <w:tcMar>
               <w:top w:type="dxa" w:w="40"/>
               <w:left w:type="dxa" w:w="110"/>
@@ -3070,7 +3074,7 @@
               <w:bottom w:val="single" w:color="CFE3DF" w:sz="4"/>
               <w:right w:val="single" w:color="CFE3DF" w:sz="4"/>
             </w:tcBorders>
-            <w:shd w:fill="2A7A6E" w:val="clear"/>
+            <w:shd w:fill="7A474D" w:val="clear"/>
             <w:tcMar>
               <w:top w:type="dxa" w:w="40"/>
               <w:left w:type="dxa" w:w="110"/>
@@ -3103,7 +3107,7 @@
               <w:bottom w:val="single" w:color="CFE3DF" w:sz="4"/>
               <w:right w:val="single" w:color="CFE3DF" w:sz="4"/>
             </w:tcBorders>
-            <w:shd w:fill="2A7A6E" w:val="clear"/>
+            <w:shd w:fill="7A474D" w:val="clear"/>
             <w:tcMar>
               <w:top w:type="dxa" w:w="40"/>
               <w:left w:type="dxa" w:w="110"/>
@@ -3136,7 +3140,7 @@
               <w:bottom w:val="single" w:color="CFE3DF" w:sz="4"/>
               <w:right w:val="single" w:color="CFE3DF" w:sz="4"/>
             </w:tcBorders>
-            <w:shd w:fill="2A7A6E" w:val="clear"/>
+            <w:shd w:fill="7A474D" w:val="clear"/>
             <w:tcMar>
               <w:top w:type="dxa" w:w="40"/>
               <w:left w:type="dxa" w:w="110"/>
@@ -3265,6 +3269,7 @@
       <w:pPr>
         <w:pStyle w:val="Heading1"/>
         <w:pageBreakBefore/>
+        <w:shd w:fill="2C4D35" w:val="clear"/>
         <w:spacing w:after="40" w:before="0"/>
       </w:pPr>
       <w:r>
@@ -3281,7 +3286,7 @@
           <w:rFonts w:ascii="Georgia" w:cs="Georgia" w:eastAsia="Georgia" w:hAnsi="Georgia"/>
           <w:i/>
           <w:iCs/>
-          <w:color w:val="0F3760"/>
+          <w:color w:val="2C4D35"/>
           <w:sz w:val="28"/>
           <w:szCs w:val="28"/>
         </w:rPr>
@@ -3343,7 +3348,7 @@
               <w:bottom w:val="single" w:color="CFE3DF" w:sz="4"/>
               <w:right w:val="single" w:color="CFE3DF" w:sz="4"/>
             </w:tcBorders>
-            <w:shd w:fill="2A7A6E" w:val="clear"/>
+            <w:shd w:fill="2C4D35" w:val="clear"/>
             <w:tcMar>
               <w:top w:type="dxa" w:w="40"/>
               <w:left w:type="dxa" w:w="110"/>
@@ -3605,7 +3610,7 @@
               <w:bottom w:val="single" w:color="CFE3DF" w:sz="4"/>
               <w:right w:val="single" w:color="CFE3DF" w:sz="4"/>
             </w:tcBorders>
-            <w:shd w:fill="2A7A6E" w:val="clear"/>
+            <w:shd w:fill="2C4D35" w:val="clear"/>
             <w:tcMar>
               <w:top w:type="dxa" w:w="40"/>
               <w:left w:type="dxa" w:w="110"/>
@@ -3709,7 +3714,7 @@
               <w:bottom w:val="single" w:color="CFE3DF" w:sz="4"/>
               <w:right w:val="single" w:color="CFE3DF" w:sz="4"/>
             </w:tcBorders>
-            <w:shd w:fill="2A7A6E" w:val="clear"/>
+            <w:shd w:fill="2C4D35" w:val="clear"/>
             <w:tcMar>
               <w:top w:type="dxa" w:w="40"/>
               <w:left w:type="dxa" w:w="110"/>
@@ -3742,7 +3747,7 @@
               <w:bottom w:val="single" w:color="CFE3DF" w:sz="4"/>
               <w:right w:val="single" w:color="CFE3DF" w:sz="4"/>
             </w:tcBorders>
-            <w:shd w:fill="2A7A6E" w:val="clear"/>
+            <w:shd w:fill="2C4D35" w:val="clear"/>
             <w:tcMar>
               <w:top w:type="dxa" w:w="40"/>
               <w:left w:type="dxa" w:w="110"/>
@@ -3775,7 +3780,7 @@
               <w:bottom w:val="single" w:color="CFE3DF" w:sz="4"/>
               <w:right w:val="single" w:color="CFE3DF" w:sz="4"/>
             </w:tcBorders>
-            <w:shd w:fill="2A7A6E" w:val="clear"/>
+            <w:shd w:fill="2C4D35" w:val="clear"/>
             <w:tcMar>
               <w:top w:type="dxa" w:w="40"/>
               <w:left w:type="dxa" w:w="110"/>
@@ -3904,6 +3909,7 @@
       <w:pPr>
         <w:pStyle w:val="Heading1"/>
         <w:pageBreakBefore/>
+        <w:shd w:fill="724026" w:val="clear"/>
         <w:spacing w:after="40" w:before="0"/>
       </w:pPr>
       <w:r>
@@ -3920,7 +3926,7 @@
           <w:rFonts w:ascii="Georgia" w:cs="Georgia" w:eastAsia="Georgia" w:hAnsi="Georgia"/>
           <w:i/>
           <w:iCs/>
-          <w:color w:val="0F3760"/>
+          <w:color w:val="724026"/>
           <w:sz w:val="28"/>
           <w:szCs w:val="28"/>
         </w:rPr>
@@ -3996,7 +4002,7 @@
             </w:pPr>
             <w:r>
               <w:rPr>
-                <w:color w:val="2A7A6E"/>
+                <w:color w:val="724026"/>
                 <w:sz w:val="18"/>
                 <w:szCs w:val="18"/>
               </w:rPr>
@@ -4010,7 +4016,36 @@
                 <w:sz w:val="20"/>
                 <w:szCs w:val="20"/>
               </w:rPr>
-              <w:t xml:space="preserve">“I'm telling myself ____”</w:t>
+              <w:t xml:space="preserve">“</w:t>
+            </w:r>
+            <w:r>
+              <w:rPr>
+                <w:i/>
+                <w:iCs/>
+                <w:color w:val="2D2D2D"/>
+                <w:sz w:val="20"/>
+                <w:szCs w:val="20"/>
+              </w:rPr>
+              <w:t xml:space="preserve">I'm telling myself </w:t>
+            </w:r>
+            <w:r>
+              <w:rPr>
+                <w:color w:val="2D2D2D"/>
+                <w:sz w:val="20"/>
+                <w:szCs w:val="20"/>
+                <w:u w:val="single"/>
+              </w:rPr>
+              <w:t xml:space="preserve">              </w:t>
+            </w:r>
+            <w:r>
+              <w:rPr>
+                <w:i/>
+                <w:iCs/>
+                <w:color w:val="2D2D2D"/>
+                <w:sz w:val="20"/>
+                <w:szCs w:val="20"/>
+              </w:rPr>
+              <w:t xml:space="preserve">”</w:t>
             </w:r>
           </w:p>
         </w:tc>
@@ -4081,7 +4116,7 @@
               <w:bottom w:val="single" w:color="CFE3DF" w:sz="4"/>
               <w:right w:val="single" w:color="CFE3DF" w:sz="4"/>
             </w:tcBorders>
-            <w:shd w:fill="2A7A6E" w:val="clear"/>
+            <w:shd w:fill="724026" w:val="clear"/>
             <w:tcMar>
               <w:top w:type="dxa" w:w="40"/>
               <w:left w:type="dxa" w:w="110"/>
@@ -4259,7 +4294,7 @@
               <w:bottom w:val="single" w:color="CFE3DF" w:sz="4"/>
               <w:right w:val="single" w:color="CFE3DF" w:sz="4"/>
             </w:tcBorders>
-            <w:shd w:fill="2A7A6E" w:val="clear"/>
+            <w:shd w:fill="724026" w:val="clear"/>
             <w:tcMar>
               <w:top w:type="dxa" w:w="40"/>
               <w:left w:type="dxa" w:w="110"/>
@@ -4437,7 +4472,7 @@
               <w:bottom w:val="single" w:color="CFE3DF" w:sz="4"/>
               <w:right w:val="single" w:color="CFE3DF" w:sz="4"/>
             </w:tcBorders>
-            <w:shd w:fill="2A7A6E" w:val="clear"/>
+            <w:shd w:fill="724026" w:val="clear"/>
             <w:tcMar>
               <w:top w:type="dxa" w:w="40"/>
               <w:left w:type="dxa" w:w="110"/>
@@ -4755,7 +4790,7 @@
               <w:bottom w:val="single" w:color="CFE3DF" w:sz="4"/>
               <w:right w:val="single" w:color="CFE3DF" w:sz="4"/>
             </w:tcBorders>
-            <w:shd w:fill="2A7A6E" w:val="clear"/>
+            <w:shd w:fill="724026" w:val="clear"/>
             <w:tcMar>
               <w:top w:type="dxa" w:w="40"/>
               <w:left w:type="dxa" w:w="110"/>
@@ -4859,7 +4894,7 @@
               <w:bottom w:val="single" w:color="CFE3DF" w:sz="4"/>
               <w:right w:val="single" w:color="CFE3DF" w:sz="4"/>
             </w:tcBorders>
-            <w:shd w:fill="2A7A6E" w:val="clear"/>
+            <w:shd w:fill="724026" w:val="clear"/>
             <w:tcMar>
               <w:top w:type="dxa" w:w="40"/>
               <w:left w:type="dxa" w:w="110"/>
@@ -4892,7 +4927,7 @@
               <w:bottom w:val="single" w:color="CFE3DF" w:sz="4"/>
               <w:right w:val="single" w:color="CFE3DF" w:sz="4"/>
             </w:tcBorders>
-            <w:shd w:fill="2A7A6E" w:val="clear"/>
+            <w:shd w:fill="724026" w:val="clear"/>
             <w:tcMar>
               <w:top w:type="dxa" w:w="40"/>
               <w:left w:type="dxa" w:w="110"/>
@@ -4925,7 +4960,7 @@
               <w:bottom w:val="single" w:color="CFE3DF" w:sz="4"/>
               <w:right w:val="single" w:color="CFE3DF" w:sz="4"/>
             </w:tcBorders>
-            <w:shd w:fill="2A7A6E" w:val="clear"/>
+            <w:shd w:fill="724026" w:val="clear"/>
             <w:tcMar>
               <w:top w:type="dxa" w:w="40"/>
               <w:left w:type="dxa" w:w="110"/>
@@ -5054,6 +5089,7 @@
       <w:pPr>
         <w:pStyle w:val="Heading1"/>
         <w:pageBreakBefore/>
+        <w:shd w:fill="7A5F2C" w:val="clear"/>
         <w:spacing w:after="40" w:before="0"/>
       </w:pPr>
       <w:r>
@@ -5070,7 +5106,7 @@
           <w:rFonts w:ascii="Georgia" w:cs="Georgia" w:eastAsia="Georgia" w:hAnsi="Georgia"/>
           <w:i/>
           <w:iCs/>
-          <w:color w:val="0F3760"/>
+          <w:color w:val="7A5F2C"/>
           <w:sz w:val="28"/>
           <w:szCs w:val="28"/>
         </w:rPr>
@@ -5164,7 +5200,7 @@
               <w:bottom w:val="single" w:color="CFE3DF" w:sz="4"/>
               <w:right w:val="single" w:color="CFE3DF" w:sz="4"/>
             </w:tcBorders>
-            <w:shd w:fill="2A7A6E" w:val="clear"/>
+            <w:shd w:fill="7A5F2C" w:val="clear"/>
             <w:tcMar>
               <w:top w:type="dxa" w:w="40"/>
               <w:left w:type="dxa" w:w="110"/>
@@ -5370,7 +5406,7 @@
               <w:bottom w:val="single" w:color="CFE3DF" w:sz="4"/>
               <w:right w:val="single" w:color="CFE3DF" w:sz="4"/>
             </w:tcBorders>
-            <w:shd w:fill="2A7A6E" w:val="clear"/>
+            <w:shd w:fill="7A5F2C" w:val="clear"/>
             <w:tcMar>
               <w:top w:type="dxa" w:w="40"/>
               <w:left w:type="dxa" w:w="110"/>
@@ -5474,7 +5510,7 @@
               <w:bottom w:val="single" w:color="CFE3DF" w:sz="4"/>
               <w:right w:val="single" w:color="CFE3DF" w:sz="4"/>
             </w:tcBorders>
-            <w:shd w:fill="2A7A6E" w:val="clear"/>
+            <w:shd w:fill="7A5F2C" w:val="clear"/>
             <w:tcMar>
               <w:top w:type="dxa" w:w="40"/>
               <w:left w:type="dxa" w:w="110"/>
@@ -5507,7 +5543,7 @@
               <w:bottom w:val="single" w:color="CFE3DF" w:sz="4"/>
               <w:right w:val="single" w:color="CFE3DF" w:sz="4"/>
             </w:tcBorders>
-            <w:shd w:fill="2A7A6E" w:val="clear"/>
+            <w:shd w:fill="7A5F2C" w:val="clear"/>
             <w:tcMar>
               <w:top w:type="dxa" w:w="40"/>
               <w:left w:type="dxa" w:w="110"/>
@@ -5540,7 +5576,7 @@
               <w:bottom w:val="single" w:color="CFE3DF" w:sz="4"/>
               <w:right w:val="single" w:color="CFE3DF" w:sz="4"/>
             </w:tcBorders>
-            <w:shd w:fill="2A7A6E" w:val="clear"/>
+            <w:shd w:fill="7A5F2C" w:val="clear"/>
             <w:tcMar>
               <w:top w:type="dxa" w:w="40"/>
               <w:left w:type="dxa" w:w="110"/>
@@ -5669,6 +5705,7 @@
       <w:pPr>
         <w:pStyle w:val="Heading1"/>
         <w:pageBreakBefore/>
+        <w:shd w:fill="4F3252" w:val="clear"/>
         <w:spacing w:after="40" w:before="0"/>
       </w:pPr>
       <w:r>
@@ -5685,7 +5722,7 @@
           <w:rFonts w:ascii="Georgia" w:cs="Georgia" w:eastAsia="Georgia" w:hAnsi="Georgia"/>
           <w:i/>
           <w:iCs/>
-          <w:color w:val="0F3760"/>
+          <w:color w:val="4F3252"/>
           <w:sz w:val="28"/>
           <w:szCs w:val="28"/>
         </w:rPr>
@@ -5859,7 +5896,7 @@
               <w:bottom w:val="single" w:color="CFE3DF" w:sz="4"/>
               <w:right w:val="single" w:color="CFE3DF" w:sz="4"/>
             </w:tcBorders>
-            <w:shd w:fill="2A7A6E" w:val="clear"/>
+            <w:shd w:fill="4F3252" w:val="clear"/>
             <w:tcMar>
               <w:top w:type="dxa" w:w="40"/>
               <w:left w:type="dxa" w:w="110"/>
@@ -5963,7 +6000,7 @@
               <w:bottom w:val="single" w:color="CFE3DF" w:sz="4"/>
               <w:right w:val="single" w:color="CFE3DF" w:sz="4"/>
             </w:tcBorders>
-            <w:shd w:fill="2A7A6E" w:val="clear"/>
+            <w:shd w:fill="4F3252" w:val="clear"/>
             <w:tcMar>
               <w:top w:type="dxa" w:w="40"/>
               <w:left w:type="dxa" w:w="110"/>
@@ -5996,7 +6033,7 @@
               <w:bottom w:val="single" w:color="CFE3DF" w:sz="4"/>
               <w:right w:val="single" w:color="CFE3DF" w:sz="4"/>
             </w:tcBorders>
-            <w:shd w:fill="2A7A6E" w:val="clear"/>
+            <w:shd w:fill="4F3252" w:val="clear"/>
             <w:tcMar>
               <w:top w:type="dxa" w:w="40"/>
               <w:left w:type="dxa" w:w="110"/>
@@ -6029,7 +6066,7 @@
               <w:bottom w:val="single" w:color="CFE3DF" w:sz="4"/>
               <w:right w:val="single" w:color="CFE3DF" w:sz="4"/>
             </w:tcBorders>
-            <w:shd w:fill="2A7A6E" w:val="clear"/>
+            <w:shd w:fill="4F3252" w:val="clear"/>
             <w:tcMar>
               <w:top w:type="dxa" w:w="40"/>
               <w:left w:type="dxa" w:w="110"/>
@@ -6158,6 +6195,7 @@
       <w:pPr>
         <w:pStyle w:val="Heading1"/>
         <w:pageBreakBefore/>
+        <w:shd w:fill="1F5C52" w:val="clear"/>
         <w:spacing w:after="40" w:before="0"/>
       </w:pPr>
       <w:r>
@@ -6174,7 +6212,7 @@
           <w:rFonts w:ascii="Georgia" w:cs="Georgia" w:eastAsia="Georgia" w:hAnsi="Georgia"/>
           <w:i/>
           <w:iCs/>
-          <w:color w:val="0F3760"/>
+          <w:color w:val="1F5C52"/>
           <w:sz w:val="28"/>
           <w:szCs w:val="28"/>
         </w:rPr>
@@ -6412,7 +6450,7 @@
               <w:bottom w:val="single" w:color="CFE3DF" w:sz="4"/>
               <w:right w:val="single" w:color="CFE3DF" w:sz="4"/>
             </w:tcBorders>
-            <w:shd w:fill="2A7A6E" w:val="clear"/>
+            <w:shd w:fill="1F5C52" w:val="clear"/>
             <w:tcMar>
               <w:top w:type="dxa" w:w="40"/>
               <w:left w:type="dxa" w:w="110"/>
@@ -6562,7 +6600,7 @@
               <w:bottom w:val="single" w:color="CFE3DF" w:sz="4"/>
               <w:right w:val="single" w:color="CFE3DF" w:sz="4"/>
             </w:tcBorders>
-            <w:shd w:fill="2A7A6E" w:val="clear"/>
+            <w:shd w:fill="1F5C52" w:val="clear"/>
             <w:tcMar>
               <w:top w:type="dxa" w:w="40"/>
               <w:left w:type="dxa" w:w="110"/>
@@ -6666,7 +6704,7 @@
               <w:bottom w:val="single" w:color="CFE3DF" w:sz="4"/>
               <w:right w:val="single" w:color="CFE3DF" w:sz="4"/>
             </w:tcBorders>
-            <w:shd w:fill="2A7A6E" w:val="clear"/>
+            <w:shd w:fill="1F5C52" w:val="clear"/>
             <w:tcMar>
               <w:top w:type="dxa" w:w="40"/>
               <w:left w:type="dxa" w:w="110"/>
@@ -6699,7 +6737,7 @@
               <w:bottom w:val="single" w:color="CFE3DF" w:sz="4"/>
               <w:right w:val="single" w:color="CFE3DF" w:sz="4"/>
             </w:tcBorders>
-            <w:shd w:fill="2A7A6E" w:val="clear"/>
+            <w:shd w:fill="1F5C52" w:val="clear"/>
             <w:tcMar>
               <w:top w:type="dxa" w:w="40"/>
               <w:left w:type="dxa" w:w="110"/>
@@ -6732,7 +6770,7 @@
               <w:bottom w:val="single" w:color="CFE3DF" w:sz="4"/>
               <w:right w:val="single" w:color="CFE3DF" w:sz="4"/>
             </w:tcBorders>
-            <w:shd w:fill="2A7A6E" w:val="clear"/>
+            <w:shd w:fill="1F5C52" w:val="clear"/>
             <w:tcMar>
               <w:top w:type="dxa" w:w="40"/>
               <w:left w:type="dxa" w:w="110"/>
@@ -6861,6 +6899,7 @@
       <w:pPr>
         <w:pStyle w:val="Heading1"/>
         <w:pageBreakBefore/>
+        <w:shd w:fill="7A4F1D" w:val="clear"/>
         <w:spacing w:after="40" w:before="0"/>
       </w:pPr>
       <w:r>
@@ -6877,7 +6916,7 @@
           <w:rFonts w:ascii="Georgia" w:cs="Georgia" w:eastAsia="Georgia" w:hAnsi="Georgia"/>
           <w:i/>
           <w:iCs/>
-          <w:color w:val="0F3760"/>
+          <w:color w:val="7A4F1D"/>
           <w:sz w:val="28"/>
           <w:szCs w:val="28"/>
         </w:rPr>
@@ -6979,7 +7018,7 @@
               <w:bottom w:val="single" w:color="CFE3DF" w:sz="4"/>
               <w:right w:val="single" w:color="CFE3DF" w:sz="4"/>
             </w:tcBorders>
-            <w:shd w:fill="2A7A6E" w:val="clear"/>
+            <w:shd w:fill="7A4F1D" w:val="clear"/>
             <w:tcMar>
               <w:top w:type="dxa" w:w="40"/>
               <w:left w:type="dxa" w:w="110"/>
@@ -7331,7 +7370,7 @@
             </w:pPr>
             <w:r>
               <w:rPr>
-                <w:color w:val="2A7A6E"/>
+                <w:color w:val="7A4F1D"/>
                 <w:sz w:val="18"/>
                 <w:szCs w:val="18"/>
               </w:rPr>
@@ -7345,7 +7384,65 @@
                 <w:sz w:val="20"/>
                 <w:szCs w:val="20"/>
               </w:rPr>
-              <w:t xml:space="preserve">“Are you feeling ______ (feeling from the feelings list) because you need more ______ (need from the needs list).”</w:t>
+              <w:t xml:space="preserve">“</w:t>
+            </w:r>
+            <w:r>
+              <w:rPr>
+                <w:i/>
+                <w:iCs/>
+                <w:color w:val="2D2D2D"/>
+                <w:sz w:val="20"/>
+                <w:szCs w:val="20"/>
+              </w:rPr>
+              <w:t xml:space="preserve">Are you feeling </w:t>
+            </w:r>
+            <w:r>
+              <w:rPr>
+                <w:color w:val="2D2D2D"/>
+                <w:sz w:val="20"/>
+                <w:szCs w:val="20"/>
+                <w:u w:val="single"/>
+              </w:rPr>
+              <w:t xml:space="preserve">              </w:t>
+            </w:r>
+            <w:r>
+              <w:rPr>
+                <w:i/>
+                <w:iCs/>
+                <w:color w:val="2D2D2D"/>
+                <w:sz w:val="20"/>
+                <w:szCs w:val="20"/>
+              </w:rPr>
+              <w:t xml:space="preserve"> (feeling from the feelings list) because you need more </w:t>
+            </w:r>
+            <w:r>
+              <w:rPr>
+                <w:color w:val="2D2D2D"/>
+                <w:sz w:val="20"/>
+                <w:szCs w:val="20"/>
+                <w:u w:val="single"/>
+              </w:rPr>
+              <w:t xml:space="preserve">              </w:t>
+            </w:r>
+            <w:r>
+              <w:rPr>
+                <w:i/>
+                <w:iCs/>
+                <w:color w:val="2D2D2D"/>
+                <w:sz w:val="20"/>
+                <w:szCs w:val="20"/>
+              </w:rPr>
+              <w:t xml:space="preserve"> (need from the needs list).</w:t>
+            </w:r>
+            <w:r>
+              <w:rPr>
+                <w:i/>
+                <w:iCs/>
+                <w:color w:val="2D2D2D"/>
+                <w:sz w:val="20"/>
+                <w:szCs w:val="20"/>
+              </w:rPr>
+              <w:t xml:space="preserve">”</w:t>
             </w:r>
           </w:p>
         </w:tc>
@@ -7380,7 +7477,7 @@
               <w:bottom w:val="single" w:color="CFE3DF" w:sz="4"/>
               <w:right w:val="single" w:color="CFE3DF" w:sz="4"/>
             </w:tcBorders>
-            <w:shd w:fill="2A7A6E" w:val="clear"/>
+            <w:shd w:fill="7A4F1D" w:val="clear"/>
             <w:tcMar>
               <w:top w:type="dxa" w:w="40"/>
               <w:left w:type="dxa" w:w="110"/>
@@ -7484,7 +7581,7 @@
               <w:bottom w:val="single" w:color="CFE3DF" w:sz="4"/>
               <w:right w:val="single" w:color="CFE3DF" w:sz="4"/>
             </w:tcBorders>
-            <w:shd w:fill="2A7A6E" w:val="clear"/>
+            <w:shd w:fill="7A4F1D" w:val="clear"/>
             <w:tcMar>
               <w:top w:type="dxa" w:w="40"/>
               <w:left w:type="dxa" w:w="110"/>
@@ -7517,7 +7614,7 @@
               <w:bottom w:val="single" w:color="CFE3DF" w:sz="4"/>
               <w:right w:val="single" w:color="CFE3DF" w:sz="4"/>
             </w:tcBorders>
-            <w:shd w:fill="2A7A6E" w:val="clear"/>
+            <w:shd w:fill="7A4F1D" w:val="clear"/>
             <w:tcMar>
               <w:top w:type="dxa" w:w="40"/>
               <w:left w:type="dxa" w:w="110"/>
@@ -7550,7 +7647,7 @@
               <w:bottom w:val="single" w:color="CFE3DF" w:sz="4"/>
               <w:right w:val="single" w:color="CFE3DF" w:sz="4"/>
             </w:tcBorders>
-            <w:shd w:fill="2A7A6E" w:val="clear"/>
+            <w:shd w:fill="7A4F1D" w:val="clear"/>
             <w:tcMar>
               <w:top w:type="dxa" w:w="40"/>
               <w:left w:type="dxa" w:w="110"/>
@@ -7679,6 +7776,7 @@
       <w:pPr>
         <w:pStyle w:val="Heading1"/>
         <w:pageBreakBefore/>
+        <w:shd w:fill="324D61" w:val="clear"/>
         <w:spacing w:after="40" w:before="0"/>
       </w:pPr>
       <w:r>
@@ -7695,7 +7793,7 @@
           <w:rFonts w:ascii="Georgia" w:cs="Georgia" w:eastAsia="Georgia" w:hAnsi="Georgia"/>
           <w:i/>
           <w:iCs/>
-          <w:color w:val="0F3760"/>
+          <w:color w:val="324D61"/>
           <w:sz w:val="28"/>
           <w:szCs w:val="28"/>
         </w:rPr>
@@ -7757,7 +7855,7 @@
               <w:bottom w:val="single" w:color="CFE3DF" w:sz="4"/>
               <w:right w:val="single" w:color="CFE3DF" w:sz="4"/>
             </w:tcBorders>
-            <w:shd w:fill="2A7A6E" w:val="clear"/>
+            <w:shd w:fill="324D61" w:val="clear"/>
             <w:tcMar>
               <w:top w:type="dxa" w:w="40"/>
               <w:left w:type="dxa" w:w="110"/>
@@ -7875,7 +7973,7 @@
               <w:bottom w:val="single" w:color="CFE3DF" w:sz="4"/>
               <w:right w:val="single" w:color="CFE3DF" w:sz="4"/>
             </w:tcBorders>
-            <w:shd w:fill="2A7A6E" w:val="clear"/>
+            <w:shd w:fill="324D61" w:val="clear"/>
             <w:tcMar>
               <w:top w:type="dxa" w:w="40"/>
               <w:left w:type="dxa" w:w="110"/>
@@ -7993,7 +8091,7 @@
               <w:bottom w:val="single" w:color="CFE3DF" w:sz="4"/>
               <w:right w:val="single" w:color="CFE3DF" w:sz="4"/>
             </w:tcBorders>
-            <w:shd w:fill="2A7A6E" w:val="clear"/>
+            <w:shd w:fill="324D61" w:val="clear"/>
             <w:tcMar>
               <w:top w:type="dxa" w:w="40"/>
               <w:left w:type="dxa" w:w="110"/>
@@ -8121,7 +8219,7 @@
               <w:bottom w:val="single" w:color="CFE3DF" w:sz="4"/>
               <w:right w:val="single" w:color="CFE3DF" w:sz="4"/>
             </w:tcBorders>
-            <w:shd w:fill="2A7A6E" w:val="clear"/>
+            <w:shd w:fill="324D61" w:val="clear"/>
             <w:tcMar>
               <w:top w:type="dxa" w:w="40"/>
               <w:left w:type="dxa" w:w="110"/>
@@ -8225,7 +8323,7 @@
               <w:bottom w:val="single" w:color="CFE3DF" w:sz="4"/>
               <w:right w:val="single" w:color="CFE3DF" w:sz="4"/>
             </w:tcBorders>
-            <w:shd w:fill="2A7A6E" w:val="clear"/>
+            <w:shd w:fill="324D61" w:val="clear"/>
             <w:tcMar>
               <w:top w:type="dxa" w:w="40"/>
               <w:left w:type="dxa" w:w="110"/>
@@ -8258,7 +8356,7 @@
               <w:bottom w:val="single" w:color="CFE3DF" w:sz="4"/>
               <w:right w:val="single" w:color="CFE3DF" w:sz="4"/>
             </w:tcBorders>
-            <w:shd w:fill="2A7A6E" w:val="clear"/>
+            <w:shd w:fill="324D61" w:val="clear"/>
             <w:tcMar>
               <w:top w:type="dxa" w:w="40"/>
               <w:left w:type="dxa" w:w="110"/>
@@ -8291,7 +8389,7 @@
               <w:bottom w:val="single" w:color="CFE3DF" w:sz="4"/>
               <w:right w:val="single" w:color="CFE3DF" w:sz="4"/>
             </w:tcBorders>
-            <w:shd w:fill="2A7A6E" w:val="clear"/>
+            <w:shd w:fill="324D61" w:val="clear"/>
             <w:tcMar>
               <w:top w:type="dxa" w:w="40"/>
               <w:left w:type="dxa" w:w="110"/>
@@ -8420,6 +8518,7 @@
       <w:pPr>
         <w:pStyle w:val="Heading1"/>
         <w:pageBreakBefore/>
+        <w:shd w:fill="7A474D" w:val="clear"/>
         <w:spacing w:after="40" w:before="0"/>
       </w:pPr>
       <w:r>
@@ -8436,7 +8535,7 @@
           <w:rFonts w:ascii="Georgia" w:cs="Georgia" w:eastAsia="Georgia" w:hAnsi="Georgia"/>
           <w:i/>
           <w:iCs/>
-          <w:color w:val="0F3760"/>
+          <w:color w:val="7A474D"/>
           <w:sz w:val="28"/>
           <w:szCs w:val="28"/>
         </w:rPr>
@@ -8650,7 +8749,7 @@
               <w:bottom w:val="single" w:color="CFE3DF" w:sz="4"/>
               <w:right w:val="single" w:color="CFE3DF" w:sz="4"/>
             </w:tcBorders>
-            <w:shd w:fill="2A7A6E" w:val="clear"/>
+            <w:shd w:fill="7A474D" w:val="clear"/>
             <w:tcMar>
               <w:top w:type="dxa" w:w="40"/>
               <w:left w:type="dxa" w:w="110"/>
@@ -8936,7 +9035,7 @@
               <w:bottom w:val="single" w:color="CFE3DF" w:sz="4"/>
               <w:right w:val="single" w:color="CFE3DF" w:sz="4"/>
             </w:tcBorders>
-            <w:shd w:fill="2A7A6E" w:val="clear"/>
+            <w:shd w:fill="7A474D" w:val="clear"/>
             <w:tcMar>
               <w:top w:type="dxa" w:w="40"/>
               <w:left w:type="dxa" w:w="110"/>
@@ -9040,7 +9139,7 @@
               <w:bottom w:val="single" w:color="CFE3DF" w:sz="4"/>
               <w:right w:val="single" w:color="CFE3DF" w:sz="4"/>
             </w:tcBorders>
-            <w:shd w:fill="2A7A6E" w:val="clear"/>
+            <w:shd w:fill="7A474D" w:val="clear"/>
             <w:tcMar>
               <w:top w:type="dxa" w:w="40"/>
               <w:left w:type="dxa" w:w="110"/>
@@ -9073,7 +9172,7 @@
               <w:bottom w:val="single" w:color="CFE3DF" w:sz="4"/>
               <w:right w:val="single" w:color="CFE3DF" w:sz="4"/>
             </w:tcBorders>
-            <w:shd w:fill="2A7A6E" w:val="clear"/>
+            <w:shd w:fill="7A474D" w:val="clear"/>
             <w:tcMar>
               <w:top w:type="dxa" w:w="40"/>
               <w:left w:type="dxa" w:w="110"/>
@@ -9106,7 +9205,7 @@
               <w:bottom w:val="single" w:color="CFE3DF" w:sz="4"/>
               <w:right w:val="single" w:color="CFE3DF" w:sz="4"/>
             </w:tcBorders>
-            <w:shd w:fill="2A7A6E" w:val="clear"/>
+            <w:shd w:fill="7A474D" w:val="clear"/>
             <w:tcMar>
               <w:top w:type="dxa" w:w="40"/>
               <w:left w:type="dxa" w:w="110"/>
@@ -9235,6 +9334,7 @@
       <w:pPr>
         <w:pStyle w:val="Heading1"/>
         <w:pageBreakBefore/>
+        <w:shd w:fill="2C4D35" w:val="clear"/>
         <w:spacing w:after="40" w:before="0"/>
       </w:pPr>
       <w:r>
@@ -9251,7 +9351,7 @@
           <w:rFonts w:ascii="Georgia" w:cs="Georgia" w:eastAsia="Georgia" w:hAnsi="Georgia"/>
           <w:i/>
           <w:iCs/>
-          <w:color w:val="0F3760"/>
+          <w:color w:val="2C4D35"/>
           <w:sz w:val="28"/>
           <w:szCs w:val="28"/>
         </w:rPr>
@@ -9313,7 +9413,7 @@
               <w:bottom w:val="single" w:color="CFE3DF" w:sz="4"/>
               <w:right w:val="single" w:color="CFE3DF" w:sz="4"/>
             </w:tcBorders>
-            <w:shd w:fill="2A7A6E" w:val="clear"/>
+            <w:shd w:fill="2C4D35" w:val="clear"/>
             <w:tcMar>
               <w:top w:type="dxa" w:w="40"/>
               <w:left w:type="dxa" w:w="110"/>
@@ -9523,7 +9623,7 @@
               <w:bottom w:val="single" w:color="CFE3DF" w:sz="4"/>
               <w:right w:val="single" w:color="CFE3DF" w:sz="4"/>
             </w:tcBorders>
-            <w:shd w:fill="2A7A6E" w:val="clear"/>
+            <w:shd w:fill="2C4D35" w:val="clear"/>
             <w:tcMar>
               <w:top w:type="dxa" w:w="40"/>
               <w:left w:type="dxa" w:w="110"/>
@@ -9681,7 +9781,7 @@
               <w:bottom w:val="single" w:color="CFE3DF" w:sz="4"/>
               <w:right w:val="single" w:color="CFE3DF" w:sz="4"/>
             </w:tcBorders>
-            <w:shd w:fill="2A7A6E" w:val="clear"/>
+            <w:shd w:fill="2C4D35" w:val="clear"/>
             <w:tcMar>
               <w:top w:type="dxa" w:w="40"/>
               <w:left w:type="dxa" w:w="110"/>
@@ -9785,7 +9885,7 @@
               <w:bottom w:val="single" w:color="CFE3DF" w:sz="4"/>
               <w:right w:val="single" w:color="CFE3DF" w:sz="4"/>
             </w:tcBorders>
-            <w:shd w:fill="2A7A6E" w:val="clear"/>
+            <w:shd w:fill="2C4D35" w:val="clear"/>
             <w:tcMar>
               <w:top w:type="dxa" w:w="40"/>
               <w:left w:type="dxa" w:w="110"/>
@@ -9818,7 +9918,7 @@
               <w:bottom w:val="single" w:color="CFE3DF" w:sz="4"/>
               <w:right w:val="single" w:color="CFE3DF" w:sz="4"/>
             </w:tcBorders>
-            <w:shd w:fill="2A7A6E" w:val="clear"/>
+            <w:shd w:fill="2C4D35" w:val="clear"/>
             <w:tcMar>
               <w:top w:type="dxa" w:w="40"/>
               <w:left w:type="dxa" w:w="110"/>
@@ -9851,7 +9951,7 @@
               <w:bottom w:val="single" w:color="CFE3DF" w:sz="4"/>
               <w:right w:val="single" w:color="CFE3DF" w:sz="4"/>
             </w:tcBorders>
-            <w:shd w:fill="2A7A6E" w:val="clear"/>
+            <w:shd w:fill="2C4D35" w:val="clear"/>
             <w:tcMar>
               <w:top w:type="dxa" w:w="40"/>
               <w:left w:type="dxa" w:w="110"/>
@@ -9980,6 +10080,7 @@
       <w:pPr>
         <w:pStyle w:val="Heading1"/>
         <w:pageBreakBefore/>
+        <w:shd w:fill="724026" w:val="clear"/>
         <w:spacing w:after="40" w:before="0"/>
       </w:pPr>
       <w:r>
@@ -9996,7 +10097,7 @@
           <w:rFonts w:ascii="Georgia" w:cs="Georgia" w:eastAsia="Georgia" w:hAnsi="Georgia"/>
           <w:i/>
           <w:iCs/>
-          <w:color w:val="0F3760"/>
+          <w:color w:val="724026"/>
           <w:sz w:val="28"/>
           <w:szCs w:val="28"/>
         </w:rPr>
@@ -10058,7 +10159,7 @@
               <w:bottom w:val="single" w:color="CFE3DF" w:sz="4"/>
               <w:right w:val="single" w:color="CFE3DF" w:sz="4"/>
             </w:tcBorders>
-            <w:shd w:fill="2A7A6E" w:val="clear"/>
+            <w:shd w:fill="724026" w:val="clear"/>
             <w:tcMar>
               <w:top w:type="dxa" w:w="40"/>
               <w:left w:type="dxa" w:w="110"/>
@@ -10276,7 +10377,7 @@
               <w:bottom w:val="single" w:color="CFE3DF" w:sz="4"/>
               <w:right w:val="single" w:color="CFE3DF" w:sz="4"/>
             </w:tcBorders>
-            <w:shd w:fill="2A7A6E" w:val="clear"/>
+            <w:shd w:fill="724026" w:val="clear"/>
             <w:tcMar>
               <w:top w:type="dxa" w:w="40"/>
               <w:left w:type="dxa" w:w="110"/>
@@ -10634,7 +10735,7 @@
               <w:bottom w:val="single" w:color="CFE3DF" w:sz="4"/>
               <w:right w:val="single" w:color="CFE3DF" w:sz="4"/>
             </w:tcBorders>
-            <w:shd w:fill="2A7A6E" w:val="clear"/>
+            <w:shd w:fill="724026" w:val="clear"/>
             <w:tcMar>
               <w:top w:type="dxa" w:w="40"/>
               <w:left w:type="dxa" w:w="110"/>
@@ -10738,7 +10839,7 @@
               <w:bottom w:val="single" w:color="CFE3DF" w:sz="4"/>
               <w:right w:val="single" w:color="CFE3DF" w:sz="4"/>
             </w:tcBorders>
-            <w:shd w:fill="2A7A6E" w:val="clear"/>
+            <w:shd w:fill="724026" w:val="clear"/>
             <w:tcMar>
               <w:top w:type="dxa" w:w="40"/>
               <w:left w:type="dxa" w:w="110"/>
@@ -10771,7 +10872,7 @@
               <w:bottom w:val="single" w:color="CFE3DF" w:sz="4"/>
               <w:right w:val="single" w:color="CFE3DF" w:sz="4"/>
             </w:tcBorders>
-            <w:shd w:fill="2A7A6E" w:val="clear"/>
+            <w:shd w:fill="724026" w:val="clear"/>
             <w:tcMar>
               <w:top w:type="dxa" w:w="40"/>
               <w:left w:type="dxa" w:w="110"/>
@@ -10804,7 +10905,7 @@
               <w:bottom w:val="single" w:color="CFE3DF" w:sz="4"/>
               <w:right w:val="single" w:color="CFE3DF" w:sz="4"/>
             </w:tcBorders>
-            <w:shd w:fill="2A7A6E" w:val="clear"/>
+            <w:shd w:fill="724026" w:val="clear"/>
             <w:tcMar>
               <w:top w:type="dxa" w:w="40"/>
               <w:left w:type="dxa" w:w="110"/>
@@ -10933,6 +11034,7 @@
       <w:pPr>
         <w:pStyle w:val="Heading1"/>
         <w:pageBreakBefore/>
+        <w:shd w:fill="7A5F2C" w:val="clear"/>
         <w:spacing w:after="40" w:before="0"/>
       </w:pPr>
       <w:r>
@@ -10949,7 +11051,7 @@
           <w:rFonts w:ascii="Georgia" w:cs="Georgia" w:eastAsia="Georgia" w:hAnsi="Georgia"/>
           <w:i/>
           <w:iCs/>
-          <w:color w:val="0F3760"/>
+          <w:color w:val="7A5F2C"/>
           <w:sz w:val="28"/>
           <w:szCs w:val="28"/>
         </w:rPr>
@@ -11259,7 +11361,7 @@
               <w:bottom w:val="single" w:color="CFE3DF" w:sz="4"/>
               <w:right w:val="single" w:color="CFE3DF" w:sz="4"/>
             </w:tcBorders>
-            <w:shd w:fill="2A7A6E" w:val="clear"/>
+            <w:shd w:fill="7A5F2C" w:val="clear"/>
             <w:tcMar>
               <w:top w:type="dxa" w:w="40"/>
               <w:left w:type="dxa" w:w="110"/>
@@ -11377,7 +11479,7 @@
               <w:bottom w:val="single" w:color="CFE3DF" w:sz="4"/>
               <w:right w:val="single" w:color="CFE3DF" w:sz="4"/>
             </w:tcBorders>
-            <w:shd w:fill="2A7A6E" w:val="clear"/>
+            <w:shd w:fill="7A5F2C" w:val="clear"/>
             <w:tcMar>
               <w:top w:type="dxa" w:w="40"/>
               <w:left w:type="dxa" w:w="110"/>
@@ -11535,7 +11637,7 @@
               <w:bottom w:val="single" w:color="CFE3DF" w:sz="4"/>
               <w:right w:val="single" w:color="CFE3DF" w:sz="4"/>
             </w:tcBorders>
-            <w:shd w:fill="2A7A6E" w:val="clear"/>
+            <w:shd w:fill="7A5F2C" w:val="clear"/>
             <w:tcMar>
               <w:top w:type="dxa" w:w="40"/>
               <w:left w:type="dxa" w:w="110"/>
@@ -11639,7 +11741,7 @@
               <w:bottom w:val="single" w:color="CFE3DF" w:sz="4"/>
               <w:right w:val="single" w:color="CFE3DF" w:sz="4"/>
             </w:tcBorders>
-            <w:shd w:fill="2A7A6E" w:val="clear"/>
+            <w:shd w:fill="7A5F2C" w:val="clear"/>
             <w:tcMar>
               <w:top w:type="dxa" w:w="40"/>
               <w:left w:type="dxa" w:w="110"/>
@@ -11672,7 +11774,7 @@
               <w:bottom w:val="single" w:color="CFE3DF" w:sz="4"/>
               <w:right w:val="single" w:color="CFE3DF" w:sz="4"/>
             </w:tcBorders>
-            <w:shd w:fill="2A7A6E" w:val="clear"/>
+            <w:shd w:fill="7A5F2C" w:val="clear"/>
             <w:tcMar>
               <w:top w:type="dxa" w:w="40"/>
               <w:left w:type="dxa" w:w="110"/>
@@ -11705,7 +11807,7 @@
               <w:bottom w:val="single" w:color="CFE3DF" w:sz="4"/>
               <w:right w:val="single" w:color="CFE3DF" w:sz="4"/>
             </w:tcBorders>
-            <w:shd w:fill="2A7A6E" w:val="clear"/>
+            <w:shd w:fill="7A5F2C" w:val="clear"/>
             <w:tcMar>
               <w:top w:type="dxa" w:w="40"/>
               <w:left w:type="dxa" w:w="110"/>
@@ -11834,6 +11936,7 @@
       <w:pPr>
         <w:pStyle w:val="Heading1"/>
         <w:pageBreakBefore/>
+        <w:shd w:fill="4F3252" w:val="clear"/>
         <w:spacing w:after="40" w:before="0"/>
       </w:pPr>
       <w:r>
@@ -11850,7 +11953,7 @@
           <w:rFonts w:ascii="Georgia" w:cs="Georgia" w:eastAsia="Georgia" w:hAnsi="Georgia"/>
           <w:i/>
           <w:iCs/>
-          <w:color w:val="0F3760"/>
+          <w:color w:val="4F3252"/>
           <w:sz w:val="28"/>
           <w:szCs w:val="28"/>
         </w:rPr>
@@ -12004,7 +12107,7 @@
               <w:bottom w:val="single" w:color="CFE3DF" w:sz="4"/>
               <w:right w:val="single" w:color="CFE3DF" w:sz="4"/>
             </w:tcBorders>
-            <w:shd w:fill="2A7A6E" w:val="clear"/>
+            <w:shd w:fill="4F3252" w:val="clear"/>
             <w:tcMar>
               <w:top w:type="dxa" w:w="40"/>
               <w:left w:type="dxa" w:w="110"/>
@@ -12182,7 +12285,7 @@
               <w:bottom w:val="single" w:color="CFE3DF" w:sz="4"/>
               <w:right w:val="single" w:color="CFE3DF" w:sz="4"/>
             </w:tcBorders>
-            <w:shd w:fill="2A7A6E" w:val="clear"/>
+            <w:shd w:fill="4F3252" w:val="clear"/>
             <w:tcMar>
               <w:top w:type="dxa" w:w="40"/>
               <w:left w:type="dxa" w:w="110"/>
@@ -12300,7 +12403,7 @@
               <w:bottom w:val="single" w:color="CFE3DF" w:sz="4"/>
               <w:right w:val="single" w:color="CFE3DF" w:sz="4"/>
             </w:tcBorders>
-            <w:shd w:fill="2A7A6E" w:val="clear"/>
+            <w:shd w:fill="4F3252" w:val="clear"/>
             <w:tcMar>
               <w:top w:type="dxa" w:w="40"/>
               <w:left w:type="dxa" w:w="110"/>
@@ -12404,7 +12507,7 @@
               <w:bottom w:val="single" w:color="CFE3DF" w:sz="4"/>
               <w:right w:val="single" w:color="CFE3DF" w:sz="4"/>
             </w:tcBorders>
-            <w:shd w:fill="2A7A6E" w:val="clear"/>
+            <w:shd w:fill="4F3252" w:val="clear"/>
             <w:tcMar>
               <w:top w:type="dxa" w:w="40"/>
               <w:left w:type="dxa" w:w="110"/>
@@ -12437,7 +12540,7 @@
               <w:bottom w:val="single" w:color="CFE3DF" w:sz="4"/>
               <w:right w:val="single" w:color="CFE3DF" w:sz="4"/>
             </w:tcBorders>
-            <w:shd w:fill="2A7A6E" w:val="clear"/>
+            <w:shd w:fill="4F3252" w:val="clear"/>
             <w:tcMar>
               <w:top w:type="dxa" w:w="40"/>
               <w:left w:type="dxa" w:w="110"/>
@@ -12470,7 +12573,7 @@
               <w:bottom w:val="single" w:color="CFE3DF" w:sz="4"/>
               <w:right w:val="single" w:color="CFE3DF" w:sz="4"/>
             </w:tcBorders>
-            <w:shd w:fill="2A7A6E" w:val="clear"/>
+            <w:shd w:fill="4F3252" w:val="clear"/>
             <w:tcMar>
               <w:top w:type="dxa" w:w="40"/>
               <w:left w:type="dxa" w:w="110"/>
@@ -12599,6 +12702,7 @@
       <w:pPr>
         <w:pStyle w:val="Heading1"/>
         <w:pageBreakBefore/>
+        <w:shd w:fill="1F5C52" w:val="clear"/>
         <w:spacing w:after="40" w:before="0"/>
       </w:pPr>
       <w:r>
@@ -12615,7 +12719,7 @@
           <w:rFonts w:ascii="Georgia" w:cs="Georgia" w:eastAsia="Georgia" w:hAnsi="Georgia"/>
           <w:i/>
           <w:iCs/>
-          <w:color w:val="0F3760"/>
+          <w:color w:val="1F5C52"/>
           <w:sz w:val="28"/>
           <w:szCs w:val="28"/>
         </w:rPr>
@@ -12697,7 +12801,7 @@
               <w:bottom w:val="single" w:color="CFE3DF" w:sz="4"/>
               <w:right w:val="single" w:color="CFE3DF" w:sz="4"/>
             </w:tcBorders>
-            <w:shd w:fill="2A7A6E" w:val="clear"/>
+            <w:shd w:fill="1F5C52" w:val="clear"/>
             <w:tcMar>
               <w:top w:type="dxa" w:w="40"/>
               <w:left w:type="dxa" w:w="110"/>
@@ -12835,7 +12939,7 @@
               <w:bottom w:val="single" w:color="CFE3DF" w:sz="4"/>
               <w:right w:val="single" w:color="CFE3DF" w:sz="4"/>
             </w:tcBorders>
-            <w:shd w:fill="2A7A6E" w:val="clear"/>
+            <w:shd w:fill="1F5C52" w:val="clear"/>
             <w:tcMar>
               <w:top w:type="dxa" w:w="40"/>
               <w:left w:type="dxa" w:w="110"/>
@@ -12939,7 +13043,7 @@
               <w:bottom w:val="single" w:color="CFE3DF" w:sz="4"/>
               <w:right w:val="single" w:color="CFE3DF" w:sz="4"/>
             </w:tcBorders>
-            <w:shd w:fill="2A7A6E" w:val="clear"/>
+            <w:shd w:fill="1F5C52" w:val="clear"/>
             <w:tcMar>
               <w:top w:type="dxa" w:w="40"/>
               <w:left w:type="dxa" w:w="110"/>
@@ -12972,7 +13076,7 @@
               <w:bottom w:val="single" w:color="CFE3DF" w:sz="4"/>
               <w:right w:val="single" w:color="CFE3DF" w:sz="4"/>
             </w:tcBorders>
-            <w:shd w:fill="2A7A6E" w:val="clear"/>
+            <w:shd w:fill="1F5C52" w:val="clear"/>
             <w:tcMar>
               <w:top w:type="dxa" w:w="40"/>
               <w:left w:type="dxa" w:w="110"/>
@@ -13005,7 +13109,7 @@
               <w:bottom w:val="single" w:color="CFE3DF" w:sz="4"/>
               <w:right w:val="single" w:color="CFE3DF" w:sz="4"/>
             </w:tcBorders>
-            <w:shd w:fill="2A7A6E" w:val="clear"/>
+            <w:shd w:fill="1F5C52" w:val="clear"/>
             <w:tcMar>
               <w:top w:type="dxa" w:w="40"/>
               <w:left w:type="dxa" w:w="110"/>
@@ -13134,6 +13238,7 @@
       <w:pPr>
         <w:pStyle w:val="Heading1"/>
         <w:pageBreakBefore/>
+        <w:shd w:fill="7A4F1D" w:val="clear"/>
         <w:spacing w:after="40" w:before="0"/>
       </w:pPr>
       <w:r>
@@ -13150,7 +13255,7 @@
           <w:rFonts w:ascii="Georgia" w:cs="Georgia" w:eastAsia="Georgia" w:hAnsi="Georgia"/>
           <w:i/>
           <w:iCs/>
-          <w:color w:val="0F3760"/>
+          <w:color w:val="7A4F1D"/>
           <w:sz w:val="28"/>
           <w:szCs w:val="28"/>
         </w:rPr>
@@ -13228,7 +13333,7 @@
               <w:bottom w:val="single" w:color="CFE3DF" w:sz="4"/>
               <w:right w:val="single" w:color="CFE3DF" w:sz="4"/>
             </w:tcBorders>
-            <w:shd w:fill="2A7A6E" w:val="clear"/>
+            <w:shd w:fill="7A4F1D" w:val="clear"/>
             <w:tcMar>
               <w:top w:type="dxa" w:w="40"/>
               <w:left w:type="dxa" w:w="110"/>
@@ -13362,7 +13467,7 @@
               <w:bottom w:val="single" w:color="CFE3DF" w:sz="4"/>
               <w:right w:val="single" w:color="CFE3DF" w:sz="4"/>
             </w:tcBorders>
-            <w:shd w:fill="2A7A6E" w:val="clear"/>
+            <w:shd w:fill="7A4F1D" w:val="clear"/>
             <w:tcMar>
               <w:top w:type="dxa" w:w="40"/>
               <w:left w:type="dxa" w:w="110"/>
@@ -13466,7 +13571,7 @@
               <w:bottom w:val="single" w:color="CFE3DF" w:sz="4"/>
               <w:right w:val="single" w:color="CFE3DF" w:sz="4"/>
             </w:tcBorders>
-            <w:shd w:fill="2A7A6E" w:val="clear"/>
+            <w:shd w:fill="7A4F1D" w:val="clear"/>
             <w:tcMar>
               <w:top w:type="dxa" w:w="40"/>
               <w:left w:type="dxa" w:w="110"/>
@@ -13499,7 +13604,7 @@
               <w:bottom w:val="single" w:color="CFE3DF" w:sz="4"/>
               <w:right w:val="single" w:color="CFE3DF" w:sz="4"/>
             </w:tcBorders>
-            <w:shd w:fill="2A7A6E" w:val="clear"/>
+            <w:shd w:fill="7A4F1D" w:val="clear"/>
             <w:tcMar>
               <w:top w:type="dxa" w:w="40"/>
               <w:left w:type="dxa" w:w="110"/>
@@ -13532,7 +13637,7 @@
               <w:bottom w:val="single" w:color="CFE3DF" w:sz="4"/>
               <w:right w:val="single" w:color="CFE3DF" w:sz="4"/>
             </w:tcBorders>
-            <w:shd w:fill="2A7A6E" w:val="clear"/>
+            <w:shd w:fill="7A4F1D" w:val="clear"/>
             <w:tcMar>
               <w:top w:type="dxa" w:w="40"/>
               <w:left w:type="dxa" w:w="110"/>
@@ -13661,6 +13766,7 @@
       <w:pPr>
         <w:pStyle w:val="Heading1"/>
         <w:pageBreakBefore/>
+        <w:shd w:fill="324D61" w:val="clear"/>
         <w:spacing w:after="40" w:before="0"/>
       </w:pPr>
       <w:r>
@@ -13677,7 +13783,7 @@
           <w:rFonts w:ascii="Georgia" w:cs="Georgia" w:eastAsia="Georgia" w:hAnsi="Georgia"/>
           <w:i/>
           <w:iCs/>
-          <w:color w:val="0F3760"/>
+          <w:color w:val="324D61"/>
           <w:sz w:val="28"/>
           <w:szCs w:val="28"/>
         </w:rPr>
@@ -13739,7 +13845,7 @@
               <w:bottom w:val="single" w:color="CFE3DF" w:sz="4"/>
               <w:right w:val="single" w:color="CFE3DF" w:sz="4"/>
             </w:tcBorders>
-            <w:shd w:fill="2A7A6E" w:val="clear"/>
+            <w:shd w:fill="324D61" w:val="clear"/>
             <w:tcMar>
               <w:top w:type="dxa" w:w="40"/>
               <w:left w:type="dxa" w:w="110"/>
@@ -13929,7 +14035,7 @@
               <w:bottom w:val="single" w:color="CFE3DF" w:sz="4"/>
               <w:right w:val="single" w:color="CFE3DF" w:sz="4"/>
             </w:tcBorders>
-            <w:shd w:fill="2A7A6E" w:val="clear"/>
+            <w:shd w:fill="324D61" w:val="clear"/>
             <w:tcMar>
               <w:top w:type="dxa" w:w="40"/>
               <w:left w:type="dxa" w:w="110"/>
@@ -14033,7 +14139,7 @@
               <w:bottom w:val="single" w:color="CFE3DF" w:sz="4"/>
               <w:right w:val="single" w:color="CFE3DF" w:sz="4"/>
             </w:tcBorders>
-            <w:shd w:fill="2A7A6E" w:val="clear"/>
+            <w:shd w:fill="324D61" w:val="clear"/>
             <w:tcMar>
               <w:top w:type="dxa" w:w="40"/>
               <w:left w:type="dxa" w:w="110"/>
@@ -14066,7 +14172,7 @@
               <w:bottom w:val="single" w:color="CFE3DF" w:sz="4"/>
               <w:right w:val="single" w:color="CFE3DF" w:sz="4"/>
             </w:tcBorders>
-            <w:shd w:fill="2A7A6E" w:val="clear"/>
+            <w:shd w:fill="324D61" w:val="clear"/>
             <w:tcMar>
               <w:top w:type="dxa" w:w="40"/>
               <w:left w:type="dxa" w:w="110"/>
@@ -14099,7 +14205,7 @@
               <w:bottom w:val="single" w:color="CFE3DF" w:sz="4"/>
               <w:right w:val="single" w:color="CFE3DF" w:sz="4"/>
             </w:tcBorders>
-            <w:shd w:fill="2A7A6E" w:val="clear"/>
+            <w:shd w:fill="324D61" w:val="clear"/>
             <w:tcMar>
               <w:top w:type="dxa" w:w="40"/>
               <w:left w:type="dxa" w:w="110"/>
@@ -14228,6 +14334,7 @@
       <w:pPr>
         <w:pStyle w:val="Heading1"/>
         <w:pageBreakBefore/>
+        <w:shd w:fill="7A474D" w:val="clear"/>
         <w:spacing w:after="40" w:before="0"/>
       </w:pPr>
       <w:r>
@@ -14244,7 +14351,7 @@
           <w:rFonts w:ascii="Georgia" w:cs="Georgia" w:eastAsia="Georgia" w:hAnsi="Georgia"/>
           <w:i/>
           <w:iCs/>
-          <w:color w:val="0F3760"/>
+          <w:color w:val="7A474D"/>
           <w:sz w:val="28"/>
           <w:szCs w:val="28"/>
         </w:rPr>
@@ -14338,7 +14445,7 @@
               <w:bottom w:val="single" w:color="CFE3DF" w:sz="4"/>
               <w:right w:val="single" w:color="CFE3DF" w:sz="4"/>
             </w:tcBorders>
-            <w:shd w:fill="2A7A6E" w:val="clear"/>
+            <w:shd w:fill="7A474D" w:val="clear"/>
             <w:tcMar>
               <w:top w:type="dxa" w:w="40"/>
               <w:left w:type="dxa" w:w="110"/>
@@ -14442,7 +14549,7 @@
               <w:bottom w:val="single" w:color="CFE3DF" w:sz="4"/>
               <w:right w:val="single" w:color="CFE3DF" w:sz="4"/>
             </w:tcBorders>
-            <w:shd w:fill="2A7A6E" w:val="clear"/>
+            <w:shd w:fill="7A474D" w:val="clear"/>
             <w:tcMar>
               <w:top w:type="dxa" w:w="40"/>
               <w:left w:type="dxa" w:w="110"/>
@@ -14475,7 +14582,7 @@
               <w:bottom w:val="single" w:color="CFE3DF" w:sz="4"/>
               <w:right w:val="single" w:color="CFE3DF" w:sz="4"/>
             </w:tcBorders>
-            <w:shd w:fill="2A7A6E" w:val="clear"/>
+            <w:shd w:fill="7A474D" w:val="clear"/>
             <w:tcMar>
               <w:top w:type="dxa" w:w="40"/>
               <w:left w:type="dxa" w:w="110"/>
@@ -14508,7 +14615,7 @@
               <w:bottom w:val="single" w:color="CFE3DF" w:sz="4"/>
               <w:right w:val="single" w:color="CFE3DF" w:sz="4"/>
             </w:tcBorders>
-            <w:shd w:fill="2A7A6E" w:val="clear"/>
+            <w:shd w:fill="7A474D" w:val="clear"/>
             <w:tcMar>
               <w:top w:type="dxa" w:w="40"/>
               <w:left w:type="dxa" w:w="110"/>
@@ -14637,6 +14744,7 @@
       <w:pPr>
         <w:pStyle w:val="Heading1"/>
         <w:pageBreakBefore/>
+        <w:shd w:fill="2C4D35" w:val="clear"/>
         <w:spacing w:after="40" w:before="0"/>
       </w:pPr>
       <w:r>
@@ -14653,7 +14761,7 @@
           <w:rFonts w:ascii="Georgia" w:cs="Georgia" w:eastAsia="Georgia" w:hAnsi="Georgia"/>
           <w:i/>
           <w:iCs/>
-          <w:color w:val="0F3760"/>
+          <w:color w:val="2C4D35"/>
           <w:sz w:val="28"/>
           <w:szCs w:val="28"/>
         </w:rPr>
@@ -14731,7 +14839,7 @@
               <w:bottom w:val="single" w:color="CFE3DF" w:sz="4"/>
               <w:right w:val="single" w:color="CFE3DF" w:sz="4"/>
             </w:tcBorders>
-            <w:shd w:fill="2A7A6E" w:val="clear"/>
+            <w:shd w:fill="2C4D35" w:val="clear"/>
             <w:tcMar>
               <w:top w:type="dxa" w:w="40"/>
               <w:left w:type="dxa" w:w="110"/>
@@ -14917,7 +15025,7 @@
               <w:bottom w:val="single" w:color="CFE3DF" w:sz="4"/>
               <w:right w:val="single" w:color="CFE3DF" w:sz="4"/>
             </w:tcBorders>
-            <w:shd w:fill="2A7A6E" w:val="clear"/>
+            <w:shd w:fill="2C4D35" w:val="clear"/>
             <w:tcMar>
               <w:top w:type="dxa" w:w="40"/>
               <w:left w:type="dxa" w:w="110"/>
@@ -15021,7 +15129,7 @@
               <w:bottom w:val="single" w:color="CFE3DF" w:sz="4"/>
               <w:right w:val="single" w:color="CFE3DF" w:sz="4"/>
             </w:tcBorders>
-            <w:shd w:fill="2A7A6E" w:val="clear"/>
+            <w:shd w:fill="2C4D35" w:val="clear"/>
             <w:tcMar>
               <w:top w:type="dxa" w:w="40"/>
               <w:left w:type="dxa" w:w="110"/>
@@ -15054,7 +15162,7 @@
               <w:bottom w:val="single" w:color="CFE3DF" w:sz="4"/>
               <w:right w:val="single" w:color="CFE3DF" w:sz="4"/>
             </w:tcBorders>
-            <w:shd w:fill="2A7A6E" w:val="clear"/>
+            <w:shd w:fill="2C4D35" w:val="clear"/>
             <w:tcMar>
               <w:top w:type="dxa" w:w="40"/>
               <w:left w:type="dxa" w:w="110"/>
@@ -15087,7 +15195,7 @@
               <w:bottom w:val="single" w:color="CFE3DF" w:sz="4"/>
               <w:right w:val="single" w:color="CFE3DF" w:sz="4"/>
             </w:tcBorders>
-            <w:shd w:fill="2A7A6E" w:val="clear"/>
+            <w:shd w:fill="2C4D35" w:val="clear"/>
             <w:tcMar>
               <w:top w:type="dxa" w:w="40"/>
               <w:left w:type="dxa" w:w="110"/>
@@ -15216,6 +15324,7 @@
       <w:pPr>
         <w:pStyle w:val="Heading1"/>
         <w:pageBreakBefore/>
+        <w:shd w:fill="724026" w:val="clear"/>
         <w:spacing w:after="40" w:before="0"/>
       </w:pPr>
       <w:r>
@@ -15232,7 +15341,7 @@
           <w:rFonts w:ascii="Georgia" w:cs="Georgia" w:eastAsia="Georgia" w:hAnsi="Georgia"/>
           <w:i/>
           <w:iCs/>
-          <w:color w:val="0F3760"/>
+          <w:color w:val="724026"/>
           <w:sz w:val="28"/>
           <w:szCs w:val="28"/>
         </w:rPr>
@@ -15294,7 +15403,7 @@
               <w:bottom w:val="single" w:color="CFE3DF" w:sz="4"/>
               <w:right w:val="single" w:color="CFE3DF" w:sz="4"/>
             </w:tcBorders>
-            <w:shd w:fill="2A7A6E" w:val="clear"/>
+            <w:shd w:fill="724026" w:val="clear"/>
             <w:tcMar>
               <w:top w:type="dxa" w:w="40"/>
               <w:left w:type="dxa" w:w="110"/>
@@ -15438,7 +15547,7 @@
               <w:bottom w:val="single" w:color="CFE3DF" w:sz="4"/>
               <w:right w:val="single" w:color="CFE3DF" w:sz="4"/>
             </w:tcBorders>
-            <w:shd w:fill="2A7A6E" w:val="clear"/>
+            <w:shd w:fill="724026" w:val="clear"/>
             <w:tcMar>
               <w:top w:type="dxa" w:w="40"/>
               <w:left w:type="dxa" w:w="110"/>
@@ -15604,7 +15713,7 @@
               <w:bottom w:val="single" w:color="CFE3DF" w:sz="4"/>
               <w:right w:val="single" w:color="CFE3DF" w:sz="4"/>
             </w:tcBorders>
-            <w:shd w:fill="2A7A6E" w:val="clear"/>
+            <w:shd w:fill="724026" w:val="clear"/>
             <w:tcMar>
               <w:top w:type="dxa" w:w="40"/>
               <w:left w:type="dxa" w:w="110"/>
@@ -15708,7 +15817,7 @@
               <w:bottom w:val="single" w:color="CFE3DF" w:sz="4"/>
               <w:right w:val="single" w:color="CFE3DF" w:sz="4"/>
             </w:tcBorders>
-            <w:shd w:fill="2A7A6E" w:val="clear"/>
+            <w:shd w:fill="724026" w:val="clear"/>
             <w:tcMar>
               <w:top w:type="dxa" w:w="40"/>
               <w:left w:type="dxa" w:w="110"/>
@@ -15741,7 +15850,7 @@
               <w:bottom w:val="single" w:color="CFE3DF" w:sz="4"/>
               <w:right w:val="single" w:color="CFE3DF" w:sz="4"/>
             </w:tcBorders>
-            <w:shd w:fill="2A7A6E" w:val="clear"/>
+            <w:shd w:fill="724026" w:val="clear"/>
             <w:tcMar>
               <w:top w:type="dxa" w:w="40"/>
               <w:left w:type="dxa" w:w="110"/>
@@ -15774,7 +15883,7 @@
               <w:bottom w:val="single" w:color="CFE3DF" w:sz="4"/>
               <w:right w:val="single" w:color="CFE3DF" w:sz="4"/>
             </w:tcBorders>
-            <w:shd w:fill="2A7A6E" w:val="clear"/>
+            <w:shd w:fill="724026" w:val="clear"/>
             <w:tcMar>
               <w:top w:type="dxa" w:w="40"/>
               <w:left w:type="dxa" w:w="110"/>
@@ -15903,6 +16012,7 @@
       <w:pPr>
         <w:pStyle w:val="Heading1"/>
         <w:pageBreakBefore/>
+        <w:shd w:fill="7A5F2C" w:val="clear"/>
         <w:spacing w:after="40" w:before="0"/>
       </w:pPr>
       <w:r>
@@ -15919,7 +16029,7 @@
           <w:rFonts w:ascii="Georgia" w:cs="Georgia" w:eastAsia="Georgia" w:hAnsi="Georgia"/>
           <w:i/>
           <w:iCs/>
-          <w:color w:val="0F3760"/>
+          <w:color w:val="7A5F2C"/>
           <w:sz w:val="28"/>
           <w:szCs w:val="28"/>
         </w:rPr>
@@ -16211,7 +16321,7 @@
             </w:pPr>
             <w:r>
               <w:rPr>
-                <w:color w:val="2A7A6E"/>
+                <w:color w:val="7A5F2C"/>
                 <w:sz w:val="18"/>
                 <w:szCs w:val="18"/>
               </w:rPr>
@@ -16225,7 +16335,65 @@
                 <w:sz w:val="20"/>
                 <w:szCs w:val="20"/>
               </w:rPr>
-              <w:t xml:space="preserve">“When I (did, said etc.), I would have loved to have shown more __________ (ex. care, consideration, etc.) - I know that had an impact on you and so it's really important to me. Now that I understand this, I would like to deal with that differently in the future, in a way that is more in alignment with my values and creates more__________.”</w:t>
+              <w:t xml:space="preserve">“</w:t>
+            </w:r>
+            <w:r>
+              <w:rPr>
+                <w:i/>
+                <w:iCs/>
+                <w:color w:val="2D2D2D"/>
+                <w:sz w:val="20"/>
+                <w:szCs w:val="20"/>
+              </w:rPr>
+              <w:t xml:space="preserve">When I (did, said etc.), I would have loved to have shown more </w:t>
+            </w:r>
+            <w:r>
+              <w:rPr>
+                <w:color w:val="2D2D2D"/>
+                <w:sz w:val="20"/>
+                <w:szCs w:val="20"/>
+                <w:u w:val="single"/>
+              </w:rPr>
+              <w:t xml:space="preserve">              </w:t>
+            </w:r>
+            <w:r>
+              <w:rPr>
+                <w:i/>
+                <w:iCs/>
+                <w:color w:val="2D2D2D"/>
+                <w:sz w:val="20"/>
+                <w:szCs w:val="20"/>
+              </w:rPr>
+              <w:t xml:space="preserve"> (ex. care, consideration, etc.) - I know that had an impact on you and so it's really important to me. Now that I understand this, I would like to deal with that differently in the future, in a way that is more in alignment with my values and creates more</w:t>
+            </w:r>
+            <w:r>
+              <w:rPr>
+                <w:color w:val="2D2D2D"/>
+                <w:sz w:val="20"/>
+                <w:szCs w:val="20"/>
+                <w:u w:val="single"/>
+              </w:rPr>
+              <w:t xml:space="preserve">              </w:t>
+            </w:r>
+            <w:r>
+              <w:rPr>
+                <w:i/>
+                <w:iCs/>
+                <w:color w:val="2D2D2D"/>
+                <w:sz w:val="20"/>
+                <w:szCs w:val="20"/>
+              </w:rPr>
+              <w:t xml:space="preserve">.</w:t>
+            </w:r>
+            <w:r>
+              <w:rPr>
+                <w:i/>
+                <w:iCs/>
+                <w:color w:val="2D2D2D"/>
+                <w:sz w:val="20"/>
+                <w:szCs w:val="20"/>
+              </w:rPr>
+              <w:t xml:space="preserve">”</w:t>
             </w:r>
           </w:p>
         </w:tc>
@@ -16276,7 +16444,7 @@
               <w:bottom w:val="single" w:color="CFE3DF" w:sz="4"/>
               <w:right w:val="single" w:color="CFE3DF" w:sz="4"/>
             </w:tcBorders>
-            <w:shd w:fill="2A7A6E" w:val="clear"/>
+            <w:shd w:fill="7A5F2C" w:val="clear"/>
             <w:tcMar>
               <w:top w:type="dxa" w:w="40"/>
               <w:left w:type="dxa" w:w="110"/>
@@ -16474,7 +16642,7 @@
               <w:bottom w:val="single" w:color="CFE3DF" w:sz="4"/>
               <w:right w:val="single" w:color="CFE3DF" w:sz="4"/>
             </w:tcBorders>
-            <w:shd w:fill="2A7A6E" w:val="clear"/>
+            <w:shd w:fill="7A5F2C" w:val="clear"/>
             <w:tcMar>
               <w:top w:type="dxa" w:w="40"/>
               <w:left w:type="dxa" w:w="110"/>
@@ -16578,7 +16746,7 @@
               <w:bottom w:val="single" w:color="CFE3DF" w:sz="4"/>
               <w:right w:val="single" w:color="CFE3DF" w:sz="4"/>
             </w:tcBorders>
-            <w:shd w:fill="2A7A6E" w:val="clear"/>
+            <w:shd w:fill="7A5F2C" w:val="clear"/>
             <w:tcMar>
               <w:top w:type="dxa" w:w="40"/>
               <w:left w:type="dxa" w:w="110"/>
@@ -16611,7 +16779,7 @@
               <w:bottom w:val="single" w:color="CFE3DF" w:sz="4"/>
               <w:right w:val="single" w:color="CFE3DF" w:sz="4"/>
             </w:tcBorders>
-            <w:shd w:fill="2A7A6E" w:val="clear"/>
+            <w:shd w:fill="7A5F2C" w:val="clear"/>
             <w:tcMar>
               <w:top w:type="dxa" w:w="40"/>
               <w:left w:type="dxa" w:w="110"/>
@@ -16644,7 +16812,7 @@
               <w:bottom w:val="single" w:color="CFE3DF" w:sz="4"/>
               <w:right w:val="single" w:color="CFE3DF" w:sz="4"/>
             </w:tcBorders>
-            <w:shd w:fill="2A7A6E" w:val="clear"/>
+            <w:shd w:fill="7A5F2C" w:val="clear"/>
             <w:tcMar>
               <w:top w:type="dxa" w:w="40"/>
               <w:left w:type="dxa" w:w="110"/>
@@ -16773,6 +16941,7 @@
       <w:pPr>
         <w:pStyle w:val="Heading1"/>
         <w:pageBreakBefore/>
+        <w:shd w:fill="4F3252" w:val="clear"/>
         <w:spacing w:after="40" w:before="0"/>
       </w:pPr>
       <w:r>
@@ -16789,7 +16958,7 @@
           <w:rFonts w:ascii="Georgia" w:cs="Georgia" w:eastAsia="Georgia" w:hAnsi="Georgia"/>
           <w:i/>
           <w:iCs/>
-          <w:color w:val="0F3760"/>
+          <w:color w:val="4F3252"/>
           <w:sz w:val="28"/>
           <w:szCs w:val="28"/>
         </w:rPr>
@@ -17043,7 +17212,7 @@
               <w:bottom w:val="single" w:color="CFE3DF" w:sz="4"/>
               <w:right w:val="single" w:color="CFE3DF" w:sz="4"/>
             </w:tcBorders>
-            <w:shd w:fill="2A7A6E" w:val="clear"/>
+            <w:shd w:fill="4F3252" w:val="clear"/>
             <w:tcMar>
               <w:top w:type="dxa" w:w="40"/>
               <w:left w:type="dxa" w:w="110"/>
@@ -17213,7 +17382,7 @@
               <w:bottom w:val="single" w:color="CFE3DF" w:sz="4"/>
               <w:right w:val="single" w:color="CFE3DF" w:sz="4"/>
             </w:tcBorders>
-            <w:shd w:fill="2A7A6E" w:val="clear"/>
+            <w:shd w:fill="4F3252" w:val="clear"/>
             <w:tcMar>
               <w:top w:type="dxa" w:w="40"/>
               <w:left w:type="dxa" w:w="110"/>
@@ -17371,7 +17540,7 @@
               <w:bottom w:val="single" w:color="CFE3DF" w:sz="4"/>
               <w:right w:val="single" w:color="CFE3DF" w:sz="4"/>
             </w:tcBorders>
-            <w:shd w:fill="2A7A6E" w:val="clear"/>
+            <w:shd w:fill="4F3252" w:val="clear"/>
             <w:tcMar>
               <w:top w:type="dxa" w:w="40"/>
               <w:left w:type="dxa" w:w="110"/>
@@ -17623,7 +17792,7 @@
               <w:bottom w:val="single" w:color="CFE3DF" w:sz="4"/>
               <w:right w:val="single" w:color="CFE3DF" w:sz="4"/>
             </w:tcBorders>
-            <w:shd w:fill="2A7A6E" w:val="clear"/>
+            <w:shd w:fill="4F3252" w:val="clear"/>
             <w:tcMar>
               <w:top w:type="dxa" w:w="40"/>
               <w:left w:type="dxa" w:w="110"/>
@@ -17727,7 +17896,7 @@
               <w:bottom w:val="single" w:color="CFE3DF" w:sz="4"/>
               <w:right w:val="single" w:color="CFE3DF" w:sz="4"/>
             </w:tcBorders>
-            <w:shd w:fill="2A7A6E" w:val="clear"/>
+            <w:shd w:fill="4F3252" w:val="clear"/>
             <w:tcMar>
               <w:top w:type="dxa" w:w="40"/>
               <w:left w:type="dxa" w:w="110"/>
@@ -17760,7 +17929,7 @@
               <w:bottom w:val="single" w:color="CFE3DF" w:sz="4"/>
               <w:right w:val="single" w:color="CFE3DF" w:sz="4"/>
             </w:tcBorders>
-            <w:shd w:fill="2A7A6E" w:val="clear"/>
+            <w:shd w:fill="4F3252" w:val="clear"/>
             <w:tcMar>
               <w:top w:type="dxa" w:w="40"/>
               <w:left w:type="dxa" w:w="110"/>
@@ -17793,7 +17962,7 @@
               <w:bottom w:val="single" w:color="CFE3DF" w:sz="4"/>
               <w:right w:val="single" w:color="CFE3DF" w:sz="4"/>
             </w:tcBorders>
-            <w:shd w:fill="2A7A6E" w:val="clear"/>
+            <w:shd w:fill="4F3252" w:val="clear"/>
             <w:tcMar>
               <w:top w:type="dxa" w:w="40"/>
               <w:left w:type="dxa" w:w="110"/>
@@ -17922,6 +18091,7 @@
       <w:pPr>
         <w:pStyle w:val="Heading1"/>
         <w:pageBreakBefore/>
+        <w:shd w:fill="1F5C52" w:val="clear"/>
         <w:spacing w:after="40" w:before="0"/>
       </w:pPr>
       <w:r>
@@ -17938,7 +18108,7 @@
           <w:rFonts w:ascii="Georgia" w:cs="Georgia" w:eastAsia="Georgia" w:hAnsi="Georgia"/>
           <w:i/>
           <w:iCs/>
-          <w:color w:val="0F3760"/>
+          <w:color w:val="1F5C52"/>
           <w:sz w:val="28"/>
           <w:szCs w:val="28"/>
         </w:rPr>
@@ -18064,7 +18234,7 @@
               <w:bottom w:val="single" w:color="CFE3DF" w:sz="4"/>
               <w:right w:val="single" w:color="CFE3DF" w:sz="4"/>
             </w:tcBorders>
-            <w:shd w:fill="2A7A6E" w:val="clear"/>
+            <w:shd w:fill="1F5C52" w:val="clear"/>
             <w:tcMar>
               <w:top w:type="dxa" w:w="40"/>
               <w:left w:type="dxa" w:w="110"/>
@@ -18214,7 +18384,7 @@
               <w:bottom w:val="single" w:color="CFE3DF" w:sz="4"/>
               <w:right w:val="single" w:color="CFE3DF" w:sz="4"/>
             </w:tcBorders>
-            <w:shd w:fill="2A7A6E" w:val="clear"/>
+            <w:shd w:fill="1F5C52" w:val="clear"/>
             <w:tcMar>
               <w:top w:type="dxa" w:w="40"/>
               <w:left w:type="dxa" w:w="110"/>
@@ -18318,7 +18488,7 @@
               <w:bottom w:val="single" w:color="CFE3DF" w:sz="4"/>
               <w:right w:val="single" w:color="CFE3DF" w:sz="4"/>
             </w:tcBorders>
-            <w:shd w:fill="2A7A6E" w:val="clear"/>
+            <w:shd w:fill="1F5C52" w:val="clear"/>
             <w:tcMar>
               <w:top w:type="dxa" w:w="40"/>
               <w:left w:type="dxa" w:w="110"/>
@@ -18351,7 +18521,7 @@
               <w:bottom w:val="single" w:color="CFE3DF" w:sz="4"/>
               <w:right w:val="single" w:color="CFE3DF" w:sz="4"/>
             </w:tcBorders>
-            <w:shd w:fill="2A7A6E" w:val="clear"/>
+            <w:shd w:fill="1F5C52" w:val="clear"/>
             <w:tcMar>
               <w:top w:type="dxa" w:w="40"/>
               <w:left w:type="dxa" w:w="110"/>
@@ -18384,7 +18554,7 @@
               <w:bottom w:val="single" w:color="CFE3DF" w:sz="4"/>
               <w:right w:val="single" w:color="CFE3DF" w:sz="4"/>
             </w:tcBorders>
-            <w:shd w:fill="2A7A6E" w:val="clear"/>
+            <w:shd w:fill="1F5C52" w:val="clear"/>
             <w:tcMar>
               <w:top w:type="dxa" w:w="40"/>
               <w:left w:type="dxa" w:w="110"/>
@@ -18513,6 +18683,7 @@
       <w:pPr>
         <w:pStyle w:val="Heading1"/>
         <w:pageBreakBefore/>
+        <w:shd w:fill="7A4F1D" w:val="clear"/>
         <w:spacing w:after="40" w:before="0"/>
       </w:pPr>
       <w:r>
@@ -18529,7 +18700,7 @@
           <w:rFonts w:ascii="Georgia" w:cs="Georgia" w:eastAsia="Georgia" w:hAnsi="Georgia"/>
           <w:i/>
           <w:iCs/>
-          <w:color w:val="0F3760"/>
+          <w:color w:val="7A4F1D"/>
           <w:sz w:val="28"/>
           <w:szCs w:val="28"/>
         </w:rPr>
@@ -18591,7 +18762,7 @@
               <w:bottom w:val="single" w:color="CFE3DF" w:sz="4"/>
               <w:right w:val="single" w:color="CFE3DF" w:sz="4"/>
             </w:tcBorders>
-            <w:shd w:fill="2A7A6E" w:val="clear"/>
+            <w:shd w:fill="7A4F1D" w:val="clear"/>
             <w:tcMar>
               <w:top w:type="dxa" w:w="40"/>
               <w:left w:type="dxa" w:w="110"/>
@@ -18757,7 +18928,7 @@
               <w:bottom w:val="single" w:color="CFE3DF" w:sz="4"/>
               <w:right w:val="single" w:color="CFE3DF" w:sz="4"/>
             </w:tcBorders>
-            <w:shd w:fill="2A7A6E" w:val="clear"/>
+            <w:shd w:fill="7A4F1D" w:val="clear"/>
             <w:tcMar>
               <w:top w:type="dxa" w:w="40"/>
               <w:left w:type="dxa" w:w="110"/>
@@ -18923,7 +19094,7 @@
               <w:bottom w:val="single" w:color="CFE3DF" w:sz="4"/>
               <w:right w:val="single" w:color="CFE3DF" w:sz="4"/>
             </w:tcBorders>
-            <w:shd w:fill="2A7A6E" w:val="clear"/>
+            <w:shd w:fill="7A4F1D" w:val="clear"/>
             <w:tcMar>
               <w:top w:type="dxa" w:w="40"/>
               <w:left w:type="dxa" w:w="110"/>
@@ -19027,7 +19198,7 @@
               <w:bottom w:val="single" w:color="CFE3DF" w:sz="4"/>
               <w:right w:val="single" w:color="CFE3DF" w:sz="4"/>
             </w:tcBorders>
-            <w:shd w:fill="2A7A6E" w:val="clear"/>
+            <w:shd w:fill="7A4F1D" w:val="clear"/>
             <w:tcMar>
               <w:top w:type="dxa" w:w="40"/>
               <w:left w:type="dxa" w:w="110"/>
@@ -19060,7 +19231,7 @@
               <w:bottom w:val="single" w:color="CFE3DF" w:sz="4"/>
               <w:right w:val="single" w:color="CFE3DF" w:sz="4"/>
             </w:tcBorders>
-            <w:shd w:fill="2A7A6E" w:val="clear"/>
+            <w:shd w:fill="7A4F1D" w:val="clear"/>
             <w:tcMar>
               <w:top w:type="dxa" w:w="40"/>
               <w:left w:type="dxa" w:w="110"/>
@@ -19093,7 +19264,7 @@
               <w:bottom w:val="single" w:color="CFE3DF" w:sz="4"/>
               <w:right w:val="single" w:color="CFE3DF" w:sz="4"/>
             </w:tcBorders>
-            <w:shd w:fill="2A7A6E" w:val="clear"/>
+            <w:shd w:fill="7A4F1D" w:val="clear"/>
             <w:tcMar>
               <w:top w:type="dxa" w:w="40"/>
               <w:left w:type="dxa" w:w="110"/>
@@ -19222,6 +19393,7 @@
       <w:pPr>
         <w:pStyle w:val="Heading1"/>
         <w:pageBreakBefore/>
+        <w:shd w:fill="324D61" w:val="clear"/>
         <w:spacing w:after="40" w:before="0"/>
       </w:pPr>
       <w:r>
@@ -19238,7 +19410,7 @@
           <w:rFonts w:ascii="Georgia" w:cs="Georgia" w:eastAsia="Georgia" w:hAnsi="Georgia"/>
           <w:i/>
           <w:iCs/>
-          <w:color w:val="0F3760"/>
+          <w:color w:val="324D61"/>
           <w:sz w:val="28"/>
           <w:szCs w:val="28"/>
         </w:rPr>
@@ -19300,7 +19472,7 @@
               <w:bottom w:val="single" w:color="CFE3DF" w:sz="4"/>
               <w:right w:val="single" w:color="CFE3DF" w:sz="4"/>
             </w:tcBorders>
-            <w:shd w:fill="2A7A6E" w:val="clear"/>
+            <w:shd w:fill="324D61" w:val="clear"/>
             <w:tcMar>
               <w:top w:type="dxa" w:w="40"/>
               <w:left w:type="dxa" w:w="110"/>
@@ -19450,7 +19622,7 @@
               <w:bottom w:val="single" w:color="CFE3DF" w:sz="4"/>
               <w:right w:val="single" w:color="CFE3DF" w:sz="4"/>
             </w:tcBorders>
-            <w:shd w:fill="2A7A6E" w:val="clear"/>
+            <w:shd w:fill="324D61" w:val="clear"/>
             <w:tcMar>
               <w:top w:type="dxa" w:w="40"/>
               <w:left w:type="dxa" w:w="110"/>
@@ -19740,7 +19912,7 @@
               <w:bottom w:val="single" w:color="CFE3DF" w:sz="4"/>
               <w:right w:val="single" w:color="CFE3DF" w:sz="4"/>
             </w:tcBorders>
-            <w:shd w:fill="2A7A6E" w:val="clear"/>
+            <w:shd w:fill="324D61" w:val="clear"/>
             <w:tcMar>
               <w:top w:type="dxa" w:w="40"/>
               <w:left w:type="dxa" w:w="110"/>
@@ -19844,7 +20016,7 @@
               <w:bottom w:val="single" w:color="CFE3DF" w:sz="4"/>
               <w:right w:val="single" w:color="CFE3DF" w:sz="4"/>
             </w:tcBorders>
-            <w:shd w:fill="2A7A6E" w:val="clear"/>
+            <w:shd w:fill="324D61" w:val="clear"/>
             <w:tcMar>
               <w:top w:type="dxa" w:w="40"/>
               <w:left w:type="dxa" w:w="110"/>
@@ -19877,7 +20049,7 @@
               <w:bottom w:val="single" w:color="CFE3DF" w:sz="4"/>
               <w:right w:val="single" w:color="CFE3DF" w:sz="4"/>
             </w:tcBorders>
-            <w:shd w:fill="2A7A6E" w:val="clear"/>
+            <w:shd w:fill="324D61" w:val="clear"/>
             <w:tcMar>
               <w:top w:type="dxa" w:w="40"/>
               <w:left w:type="dxa" w:w="110"/>
@@ -19910,7 +20082,7 @@
               <w:bottom w:val="single" w:color="CFE3DF" w:sz="4"/>
               <w:right w:val="single" w:color="CFE3DF" w:sz="4"/>
             </w:tcBorders>
-            <w:shd w:fill="2A7A6E" w:val="clear"/>
+            <w:shd w:fill="324D61" w:val="clear"/>
             <w:tcMar>
               <w:top w:type="dxa" w:w="40"/>
               <w:left w:type="dxa" w:w="110"/>
@@ -20039,6 +20211,7 @@
       <w:pPr>
         <w:pStyle w:val="Heading1"/>
         <w:pageBreakBefore/>
+        <w:shd w:fill="7A474D" w:val="clear"/>
         <w:spacing w:after="40" w:before="0"/>
       </w:pPr>
       <w:r>
@@ -20055,7 +20228,7 @@
           <w:rFonts w:ascii="Georgia" w:cs="Georgia" w:eastAsia="Georgia" w:hAnsi="Georgia"/>
           <w:i/>
           <w:iCs/>
-          <w:color w:val="0F3760"/>
+          <w:color w:val="7A474D"/>
           <w:sz w:val="28"/>
           <w:szCs w:val="28"/>
         </w:rPr>
@@ -20301,7 +20474,7 @@
               <w:bottom w:val="single" w:color="CFE3DF" w:sz="4"/>
               <w:right w:val="single" w:color="CFE3DF" w:sz="4"/>
             </w:tcBorders>
-            <w:shd w:fill="2A7A6E" w:val="clear"/>
+            <w:shd w:fill="7A474D" w:val="clear"/>
             <w:tcMar>
               <w:top w:type="dxa" w:w="40"/>
               <w:left w:type="dxa" w:w="110"/>
@@ -20451,7 +20624,7 @@
               <w:bottom w:val="single" w:color="CFE3DF" w:sz="4"/>
               <w:right w:val="single" w:color="CFE3DF" w:sz="4"/>
             </w:tcBorders>
-            <w:shd w:fill="2A7A6E" w:val="clear"/>
+            <w:shd w:fill="7A474D" w:val="clear"/>
             <w:tcMar>
               <w:top w:type="dxa" w:w="40"/>
               <w:left w:type="dxa" w:w="110"/>
@@ -20555,7 +20728,7 @@
               <w:bottom w:val="single" w:color="CFE3DF" w:sz="4"/>
               <w:right w:val="single" w:color="CFE3DF" w:sz="4"/>
             </w:tcBorders>
-            <w:shd w:fill="2A7A6E" w:val="clear"/>
+            <w:shd w:fill="7A474D" w:val="clear"/>
             <w:tcMar>
               <w:top w:type="dxa" w:w="40"/>
               <w:left w:type="dxa" w:w="110"/>
@@ -20588,7 +20761,7 @@
               <w:bottom w:val="single" w:color="CFE3DF" w:sz="4"/>
               <w:right w:val="single" w:color="CFE3DF" w:sz="4"/>
             </w:tcBorders>
-            <w:shd w:fill="2A7A6E" w:val="clear"/>
+            <w:shd w:fill="7A474D" w:val="clear"/>
             <w:tcMar>
               <w:top w:type="dxa" w:w="40"/>
               <w:left w:type="dxa" w:w="110"/>
@@ -20621,7 +20794,7 @@
               <w:bottom w:val="single" w:color="CFE3DF" w:sz="4"/>
               <w:right w:val="single" w:color="CFE3DF" w:sz="4"/>
             </w:tcBorders>
-            <w:shd w:fill="2A7A6E" w:val="clear"/>
+            <w:shd w:fill="7A474D" w:val="clear"/>
             <w:tcMar>
               <w:top w:type="dxa" w:w="40"/>
               <w:left w:type="dxa" w:w="110"/>
@@ -20750,6 +20923,7 @@
       <w:pPr>
         <w:pStyle w:val="Heading1"/>
         <w:pageBreakBefore/>
+        <w:shd w:fill="2C4D35" w:val="clear"/>
         <w:spacing w:after="40" w:before="0"/>
       </w:pPr>
       <w:r>
@@ -20766,7 +20940,7 @@
           <w:rFonts w:ascii="Georgia" w:cs="Georgia" w:eastAsia="Georgia" w:hAnsi="Georgia"/>
           <w:i/>
           <w:iCs/>
-          <w:color w:val="0F3760"/>
+          <w:color w:val="2C4D35"/>
           <w:sz w:val="28"/>
           <w:szCs w:val="28"/>
         </w:rPr>
@@ -20944,7 +21118,7 @@
               <w:bottom w:val="single" w:color="CFE3DF" w:sz="4"/>
               <w:right w:val="single" w:color="CFE3DF" w:sz="4"/>
             </w:tcBorders>
-            <w:shd w:fill="2A7A6E" w:val="clear"/>
+            <w:shd w:fill="2C4D35" w:val="clear"/>
             <w:tcMar>
               <w:top w:type="dxa" w:w="40"/>
               <w:left w:type="dxa" w:w="110"/>
@@ -21078,7 +21252,7 @@
               <w:bottom w:val="single" w:color="CFE3DF" w:sz="4"/>
               <w:right w:val="single" w:color="CFE3DF" w:sz="4"/>
             </w:tcBorders>
-            <w:shd w:fill="2A7A6E" w:val="clear"/>
+            <w:shd w:fill="2C4D35" w:val="clear"/>
             <w:tcMar>
               <w:top w:type="dxa" w:w="40"/>
               <w:left w:type="dxa" w:w="110"/>
@@ -21308,7 +21482,7 @@
               <w:bottom w:val="single" w:color="CFE3DF" w:sz="4"/>
               <w:right w:val="single" w:color="CFE3DF" w:sz="4"/>
             </w:tcBorders>
-            <w:shd w:fill="2A7A6E" w:val="clear"/>
+            <w:shd w:fill="2C4D35" w:val="clear"/>
             <w:tcMar>
               <w:top w:type="dxa" w:w="40"/>
               <w:left w:type="dxa" w:w="110"/>
@@ -21412,7 +21586,7 @@
               <w:bottom w:val="single" w:color="CFE3DF" w:sz="4"/>
               <w:right w:val="single" w:color="CFE3DF" w:sz="4"/>
             </w:tcBorders>
-            <w:shd w:fill="2A7A6E" w:val="clear"/>
+            <w:shd w:fill="2C4D35" w:val="clear"/>
             <w:tcMar>
               <w:top w:type="dxa" w:w="40"/>
               <w:left w:type="dxa" w:w="110"/>
@@ -21445,7 +21619,7 @@
               <w:bottom w:val="single" w:color="CFE3DF" w:sz="4"/>
               <w:right w:val="single" w:color="CFE3DF" w:sz="4"/>
             </w:tcBorders>
-            <w:shd w:fill="2A7A6E" w:val="clear"/>
+            <w:shd w:fill="2C4D35" w:val="clear"/>
             <w:tcMar>
               <w:top w:type="dxa" w:w="40"/>
               <w:left w:type="dxa" w:w="110"/>
@@ -21478,7 +21652,7 @@
               <w:bottom w:val="single" w:color="CFE3DF" w:sz="4"/>
               <w:right w:val="single" w:color="CFE3DF" w:sz="4"/>
             </w:tcBorders>
-            <w:shd w:fill="2A7A6E" w:val="clear"/>
+            <w:shd w:fill="2C4D35" w:val="clear"/>
             <w:tcMar>
               <w:top w:type="dxa" w:w="40"/>
               <w:left w:type="dxa" w:w="110"/>
@@ -21607,6 +21781,7 @@
       <w:pPr>
         <w:pStyle w:val="Heading1"/>
         <w:pageBreakBefore/>
+        <w:shd w:fill="724026" w:val="clear"/>
         <w:spacing w:after="40" w:before="0"/>
       </w:pPr>
       <w:r>
@@ -21623,7 +21798,7 @@
           <w:rFonts w:ascii="Georgia" w:cs="Georgia" w:eastAsia="Georgia" w:hAnsi="Georgia"/>
           <w:i/>
           <w:iCs/>
-          <w:color w:val="0F3760"/>
+          <w:color w:val="724026"/>
           <w:sz w:val="28"/>
           <w:szCs w:val="28"/>
         </w:rPr>
@@ -21769,7 +21944,7 @@
               <w:bottom w:val="single" w:color="CFE3DF" w:sz="4"/>
               <w:right w:val="single" w:color="CFE3DF" w:sz="4"/>
             </w:tcBorders>
-            <w:shd w:fill="2A7A6E" w:val="clear"/>
+            <w:shd w:fill="724026" w:val="clear"/>
             <w:tcMar>
               <w:top w:type="dxa" w:w="40"/>
               <w:left w:type="dxa" w:w="110"/>
@@ -21919,7 +22094,7 @@
               <w:bottom w:val="single" w:color="CFE3DF" w:sz="4"/>
               <w:right w:val="single" w:color="CFE3DF" w:sz="4"/>
             </w:tcBorders>
-            <w:shd w:fill="2A7A6E" w:val="clear"/>
+            <w:shd w:fill="724026" w:val="clear"/>
             <w:tcMar>
               <w:top w:type="dxa" w:w="40"/>
               <w:left w:type="dxa" w:w="110"/>
@@ -22023,7 +22198,7 @@
               <w:bottom w:val="single" w:color="CFE3DF" w:sz="4"/>
               <w:right w:val="single" w:color="CFE3DF" w:sz="4"/>
             </w:tcBorders>
-            <w:shd w:fill="2A7A6E" w:val="clear"/>
+            <w:shd w:fill="724026" w:val="clear"/>
             <w:tcMar>
               <w:top w:type="dxa" w:w="40"/>
               <w:left w:type="dxa" w:w="110"/>
@@ -22056,7 +22231,7 @@
               <w:bottom w:val="single" w:color="CFE3DF" w:sz="4"/>
               <w:right w:val="single" w:color="CFE3DF" w:sz="4"/>
             </w:tcBorders>
-            <w:shd w:fill="2A7A6E" w:val="clear"/>
+            <w:shd w:fill="724026" w:val="clear"/>
             <w:tcMar>
               <w:top w:type="dxa" w:w="40"/>
               <w:left w:type="dxa" w:w="110"/>
@@ -22089,7 +22264,7 @@
               <w:bottom w:val="single" w:color="CFE3DF" w:sz="4"/>
               <w:right w:val="single" w:color="CFE3DF" w:sz="4"/>
             </w:tcBorders>
-            <w:shd w:fill="2A7A6E" w:val="clear"/>
+            <w:shd w:fill="724026" w:val="clear"/>
             <w:tcMar>
               <w:top w:type="dxa" w:w="40"/>
               <w:left w:type="dxa" w:w="110"/>
@@ -22218,6 +22393,7 @@
       <w:pPr>
         <w:pStyle w:val="Heading1"/>
         <w:pageBreakBefore/>
+        <w:shd w:fill="7A5F2C" w:val="clear"/>
         <w:spacing w:after="40" w:before="0"/>
       </w:pPr>
       <w:r>
@@ -22234,7 +22410,7 @@
           <w:rFonts w:ascii="Georgia" w:cs="Georgia" w:eastAsia="Georgia" w:hAnsi="Georgia"/>
           <w:i/>
           <w:iCs/>
-          <w:color w:val="0F3760"/>
+          <w:color w:val="7A5F2C"/>
           <w:sz w:val="28"/>
           <w:szCs w:val="28"/>
         </w:rPr>
@@ -22388,7 +22564,7 @@
               <w:bottom w:val="single" w:color="CFE3DF" w:sz="4"/>
               <w:right w:val="single" w:color="CFE3DF" w:sz="4"/>
             </w:tcBorders>
-            <w:shd w:fill="2A7A6E" w:val="clear"/>
+            <w:shd w:fill="7A5F2C" w:val="clear"/>
             <w:tcMar>
               <w:top w:type="dxa" w:w="40"/>
               <w:left w:type="dxa" w:w="110"/>
@@ -22606,7 +22782,7 @@
               <w:bottom w:val="single" w:color="CFE3DF" w:sz="4"/>
               <w:right w:val="single" w:color="CFE3DF" w:sz="4"/>
             </w:tcBorders>
-            <w:shd w:fill="2A7A6E" w:val="clear"/>
+            <w:shd w:fill="7A5F2C" w:val="clear"/>
             <w:tcMar>
               <w:top w:type="dxa" w:w="40"/>
               <w:left w:type="dxa" w:w="110"/>
@@ -22710,7 +22886,7 @@
               <w:bottom w:val="single" w:color="CFE3DF" w:sz="4"/>
               <w:right w:val="single" w:color="CFE3DF" w:sz="4"/>
             </w:tcBorders>
-            <w:shd w:fill="2A7A6E" w:val="clear"/>
+            <w:shd w:fill="7A5F2C" w:val="clear"/>
             <w:tcMar>
               <w:top w:type="dxa" w:w="40"/>
               <w:left w:type="dxa" w:w="110"/>
@@ -22743,7 +22919,7 @@
               <w:bottom w:val="single" w:color="CFE3DF" w:sz="4"/>
               <w:right w:val="single" w:color="CFE3DF" w:sz="4"/>
             </w:tcBorders>
-            <w:shd w:fill="2A7A6E" w:val="clear"/>
+            <w:shd w:fill="7A5F2C" w:val="clear"/>
             <w:tcMar>
               <w:top w:type="dxa" w:w="40"/>
               <w:left w:type="dxa" w:w="110"/>
@@ -22776,7 +22952,7 @@
               <w:bottom w:val="single" w:color="CFE3DF" w:sz="4"/>
               <w:right w:val="single" w:color="CFE3DF" w:sz="4"/>
             </w:tcBorders>
-            <w:shd w:fill="2A7A6E" w:val="clear"/>
+            <w:shd w:fill="7A5F2C" w:val="clear"/>
             <w:tcMar>
               <w:top w:type="dxa" w:w="40"/>
               <w:left w:type="dxa" w:w="110"/>
@@ -22905,6 +23081,7 @@
       <w:pPr>
         <w:pStyle w:val="Heading1"/>
         <w:pageBreakBefore/>
+        <w:shd w:fill="4F3252" w:val="clear"/>
         <w:spacing w:after="40" w:before="0"/>
       </w:pPr>
       <w:r>
@@ -22921,7 +23098,7 @@
           <w:rFonts w:ascii="Georgia" w:cs="Georgia" w:eastAsia="Georgia" w:hAnsi="Georgia"/>
           <w:i/>
           <w:iCs/>
-          <w:color w:val="0F3760"/>
+          <w:color w:val="4F3252"/>
           <w:sz w:val="28"/>
           <w:szCs w:val="28"/>
         </w:rPr>
@@ -23019,7 +23196,7 @@
               <w:bottom w:val="single" w:color="CFE3DF" w:sz="4"/>
               <w:right w:val="single" w:color="CFE3DF" w:sz="4"/>
             </w:tcBorders>
-            <w:shd w:fill="2A7A6E" w:val="clear"/>
+            <w:shd w:fill="4F3252" w:val="clear"/>
             <w:tcMar>
               <w:top w:type="dxa" w:w="40"/>
               <w:left w:type="dxa" w:w="110"/>
@@ -23205,7 +23382,7 @@
               <w:bottom w:val="single" w:color="CFE3DF" w:sz="4"/>
               <w:right w:val="single" w:color="CFE3DF" w:sz="4"/>
             </w:tcBorders>
-            <w:shd w:fill="2A7A6E" w:val="clear"/>
+            <w:shd w:fill="4F3252" w:val="clear"/>
             <w:tcMar>
               <w:top w:type="dxa" w:w="40"/>
               <w:left w:type="dxa" w:w="110"/>
@@ -23309,7 +23486,7 @@
               <w:bottom w:val="single" w:color="CFE3DF" w:sz="4"/>
               <w:right w:val="single" w:color="CFE3DF" w:sz="4"/>
             </w:tcBorders>
-            <w:shd w:fill="2A7A6E" w:val="clear"/>
+            <w:shd w:fill="4F3252" w:val="clear"/>
             <w:tcMar>
               <w:top w:type="dxa" w:w="40"/>
               <w:left w:type="dxa" w:w="110"/>
@@ -23342,7 +23519,7 @@
               <w:bottom w:val="single" w:color="CFE3DF" w:sz="4"/>
               <w:right w:val="single" w:color="CFE3DF" w:sz="4"/>
             </w:tcBorders>
-            <w:shd w:fill="2A7A6E" w:val="clear"/>
+            <w:shd w:fill="4F3252" w:val="clear"/>
             <w:tcMar>
               <w:top w:type="dxa" w:w="40"/>
               <w:left w:type="dxa" w:w="110"/>
@@ -23375,7 +23552,7 @@
               <w:bottom w:val="single" w:color="CFE3DF" w:sz="4"/>
               <w:right w:val="single" w:color="CFE3DF" w:sz="4"/>
             </w:tcBorders>
-            <w:shd w:fill="2A7A6E" w:val="clear"/>
+            <w:shd w:fill="4F3252" w:val="clear"/>
             <w:tcMar>
               <w:top w:type="dxa" w:w="40"/>
               <w:left w:type="dxa" w:w="110"/>
@@ -23504,6 +23681,7 @@
       <w:pPr>
         <w:pStyle w:val="Heading1"/>
         <w:pageBreakBefore/>
+        <w:shd w:fill="1F5C52" w:val="clear"/>
         <w:spacing w:after="40" w:before="0"/>
       </w:pPr>
       <w:r>
@@ -23520,7 +23698,7 @@
           <w:rFonts w:ascii="Georgia" w:cs="Georgia" w:eastAsia="Georgia" w:hAnsi="Georgia"/>
           <w:i/>
           <w:iCs/>
-          <w:color w:val="0F3760"/>
+          <w:color w:val="1F5C52"/>
           <w:sz w:val="28"/>
           <w:szCs w:val="28"/>
         </w:rPr>
@@ -23682,7 +23860,7 @@
               <w:bottom w:val="single" w:color="CFE3DF" w:sz="4"/>
               <w:right w:val="single" w:color="CFE3DF" w:sz="4"/>
             </w:tcBorders>
-            <w:shd w:fill="2A7A6E" w:val="clear"/>
+            <w:shd w:fill="1F5C52" w:val="clear"/>
             <w:tcMar>
               <w:top w:type="dxa" w:w="40"/>
               <w:left w:type="dxa" w:w="110"/>
@@ -23924,7 +24102,7 @@
               <w:bottom w:val="single" w:color="CFE3DF" w:sz="4"/>
               <w:right w:val="single" w:color="CFE3DF" w:sz="4"/>
             </w:tcBorders>
-            <w:shd w:fill="2A7A6E" w:val="clear"/>
+            <w:shd w:fill="1F5C52" w:val="clear"/>
             <w:tcMar>
               <w:top w:type="dxa" w:w="40"/>
               <w:left w:type="dxa" w:w="110"/>
@@ -24028,7 +24206,7 @@
               <w:bottom w:val="single" w:color="CFE3DF" w:sz="4"/>
               <w:right w:val="single" w:color="CFE3DF" w:sz="4"/>
             </w:tcBorders>
-            <w:shd w:fill="2A7A6E" w:val="clear"/>
+            <w:shd w:fill="1F5C52" w:val="clear"/>
             <w:tcMar>
               <w:top w:type="dxa" w:w="40"/>
               <w:left w:type="dxa" w:w="110"/>
@@ -24061,7 +24239,7 @@
               <w:bottom w:val="single" w:color="CFE3DF" w:sz="4"/>
               <w:right w:val="single" w:color="CFE3DF" w:sz="4"/>
             </w:tcBorders>
-            <w:shd w:fill="2A7A6E" w:val="clear"/>
+            <w:shd w:fill="1F5C52" w:val="clear"/>
             <w:tcMar>
               <w:top w:type="dxa" w:w="40"/>
               <w:left w:type="dxa" w:w="110"/>
@@ -24094,7 +24272,7 @@
               <w:bottom w:val="single" w:color="CFE3DF" w:sz="4"/>
               <w:right w:val="single" w:color="CFE3DF" w:sz="4"/>
             </w:tcBorders>
-            <w:shd w:fill="2A7A6E" w:val="clear"/>
+            <w:shd w:fill="1F5C52" w:val="clear"/>
             <w:tcMar>
               <w:top w:type="dxa" w:w="40"/>
               <w:left w:type="dxa" w:w="110"/>
@@ -24223,6 +24401,7 @@
       <w:pPr>
         <w:pStyle w:val="Heading1"/>
         <w:pageBreakBefore/>
+        <w:shd w:fill="7A4F1D" w:val="clear"/>
         <w:spacing w:after="40" w:before="0"/>
       </w:pPr>
       <w:r>
@@ -24239,7 +24418,7 @@
           <w:rFonts w:ascii="Georgia" w:cs="Georgia" w:eastAsia="Georgia" w:hAnsi="Georgia"/>
           <w:i/>
           <w:iCs/>
-          <w:color w:val="0F3760"/>
+          <w:color w:val="7A4F1D"/>
           <w:sz w:val="28"/>
           <w:szCs w:val="28"/>
         </w:rPr>
@@ -24453,7 +24632,7 @@
               <w:bottom w:val="single" w:color="CFE3DF" w:sz="4"/>
               <w:right w:val="single" w:color="CFE3DF" w:sz="4"/>
             </w:tcBorders>
-            <w:shd w:fill="2A7A6E" w:val="clear"/>
+            <w:shd w:fill="7A4F1D" w:val="clear"/>
             <w:tcMar>
               <w:top w:type="dxa" w:w="40"/>
               <w:left w:type="dxa" w:w="110"/>
@@ -24557,7 +24736,7 @@
               <w:bottom w:val="single" w:color="CFE3DF" w:sz="4"/>
               <w:right w:val="single" w:color="CFE3DF" w:sz="4"/>
             </w:tcBorders>
-            <w:shd w:fill="2A7A6E" w:val="clear"/>
+            <w:shd w:fill="7A4F1D" w:val="clear"/>
             <w:tcMar>
               <w:top w:type="dxa" w:w="40"/>
               <w:left w:type="dxa" w:w="110"/>
@@ -24590,7 +24769,7 @@
               <w:bottom w:val="single" w:color="CFE3DF" w:sz="4"/>
               <w:right w:val="single" w:color="CFE3DF" w:sz="4"/>
             </w:tcBorders>
-            <w:shd w:fill="2A7A6E" w:val="clear"/>
+            <w:shd w:fill="7A4F1D" w:val="clear"/>
             <w:tcMar>
               <w:top w:type="dxa" w:w="40"/>
               <w:left w:type="dxa" w:w="110"/>
@@ -24623,7 +24802,7 @@
               <w:bottom w:val="single" w:color="CFE3DF" w:sz="4"/>
               <w:right w:val="single" w:color="CFE3DF" w:sz="4"/>
             </w:tcBorders>
-            <w:shd w:fill="2A7A6E" w:val="clear"/>
+            <w:shd w:fill="7A4F1D" w:val="clear"/>
             <w:tcMar>
               <w:top w:type="dxa" w:w="40"/>
               <w:left w:type="dxa" w:w="110"/>
@@ -24752,6 +24931,7 @@
       <w:pPr>
         <w:pStyle w:val="Heading1"/>
         <w:pageBreakBefore/>
+        <w:shd w:fill="324D61" w:val="clear"/>
         <w:spacing w:after="40" w:before="0"/>
       </w:pPr>
       <w:r>
@@ -24768,7 +24948,7 @@
           <w:rFonts w:ascii="Georgia" w:cs="Georgia" w:eastAsia="Georgia" w:hAnsi="Georgia"/>
           <w:i/>
           <w:iCs/>
-          <w:color w:val="0F3760"/>
+          <w:color w:val="324D61"/>
           <w:sz w:val="28"/>
           <w:szCs w:val="28"/>
         </w:rPr>
@@ -24850,7 +25030,7 @@
               <w:bottom w:val="single" w:color="CFE3DF" w:sz="4"/>
               <w:right w:val="single" w:color="CFE3DF" w:sz="4"/>
             </w:tcBorders>
-            <w:shd w:fill="2A7A6E" w:val="clear"/>
+            <w:shd w:fill="324D61" w:val="clear"/>
             <w:tcMar>
               <w:top w:type="dxa" w:w="40"/>
               <w:left w:type="dxa" w:w="110"/>
@@ -25016,7 +25196,7 @@
               <w:bottom w:val="single" w:color="CFE3DF" w:sz="4"/>
               <w:right w:val="single" w:color="CFE3DF" w:sz="4"/>
             </w:tcBorders>
-            <w:shd w:fill="2A7A6E" w:val="clear"/>
+            <w:shd w:fill="324D61" w:val="clear"/>
             <w:tcMar>
               <w:top w:type="dxa" w:w="40"/>
               <w:left w:type="dxa" w:w="110"/>
@@ -25166,7 +25346,7 @@
               <w:bottom w:val="single" w:color="CFE3DF" w:sz="4"/>
               <w:right w:val="single" w:color="CFE3DF" w:sz="4"/>
             </w:tcBorders>
-            <w:shd w:fill="2A7A6E" w:val="clear"/>
+            <w:shd w:fill="324D61" w:val="clear"/>
             <w:tcMar>
               <w:top w:type="dxa" w:w="40"/>
               <w:left w:type="dxa" w:w="110"/>
@@ -25270,7 +25450,7 @@
               <w:bottom w:val="single" w:color="CFE3DF" w:sz="4"/>
               <w:right w:val="single" w:color="CFE3DF" w:sz="4"/>
             </w:tcBorders>
-            <w:shd w:fill="2A7A6E" w:val="clear"/>
+            <w:shd w:fill="324D61" w:val="clear"/>
             <w:tcMar>
               <w:top w:type="dxa" w:w="40"/>
               <w:left w:type="dxa" w:w="110"/>
@@ -25303,7 +25483,7 @@
               <w:bottom w:val="single" w:color="CFE3DF" w:sz="4"/>
               <w:right w:val="single" w:color="CFE3DF" w:sz="4"/>
             </w:tcBorders>
-            <w:shd w:fill="2A7A6E" w:val="clear"/>
+            <w:shd w:fill="324D61" w:val="clear"/>
             <w:tcMar>
               <w:top w:type="dxa" w:w="40"/>
               <w:left w:type="dxa" w:w="110"/>
@@ -25336,7 +25516,7 @@
               <w:bottom w:val="single" w:color="CFE3DF" w:sz="4"/>
               <w:right w:val="single" w:color="CFE3DF" w:sz="4"/>
             </w:tcBorders>
-            <w:shd w:fill="2A7A6E" w:val="clear"/>
+            <w:shd w:fill="324D61" w:val="clear"/>
             <w:tcMar>
               <w:top w:type="dxa" w:w="40"/>
               <w:left w:type="dxa" w:w="110"/>
@@ -25465,6 +25645,7 @@
       <w:pPr>
         <w:pStyle w:val="Heading1"/>
         <w:pageBreakBefore/>
+        <w:shd w:fill="7A474D" w:val="clear"/>
         <w:spacing w:after="40" w:before="0"/>
       </w:pPr>
       <w:r>
@@ -25481,7 +25662,7 @@
           <w:rFonts w:ascii="Georgia" w:cs="Georgia" w:eastAsia="Georgia" w:hAnsi="Georgia"/>
           <w:i/>
           <w:iCs/>
-          <w:color w:val="0F3760"/>
+          <w:color w:val="7A474D"/>
           <w:sz w:val="28"/>
           <w:szCs w:val="28"/>
         </w:rPr>
@@ -25623,7 +25804,7 @@
               <w:bottom w:val="single" w:color="CFE3DF" w:sz="4"/>
               <w:right w:val="single" w:color="CFE3DF" w:sz="4"/>
             </w:tcBorders>
-            <w:shd w:fill="2A7A6E" w:val="clear"/>
+            <w:shd w:fill="7A474D" w:val="clear"/>
             <w:tcMar>
               <w:top w:type="dxa" w:w="40"/>
               <w:left w:type="dxa" w:w="110"/>
@@ -25869,7 +26050,7 @@
               <w:bottom w:val="single" w:color="CFE3DF" w:sz="4"/>
               <w:right w:val="single" w:color="CFE3DF" w:sz="4"/>
             </w:tcBorders>
-            <w:shd w:fill="2A7A6E" w:val="clear"/>
+            <w:shd w:fill="7A474D" w:val="clear"/>
             <w:tcMar>
               <w:top w:type="dxa" w:w="40"/>
               <w:left w:type="dxa" w:w="110"/>
@@ -25973,7 +26154,7 @@
               <w:bottom w:val="single" w:color="CFE3DF" w:sz="4"/>
               <w:right w:val="single" w:color="CFE3DF" w:sz="4"/>
             </w:tcBorders>
-            <w:shd w:fill="2A7A6E" w:val="clear"/>
+            <w:shd w:fill="7A474D" w:val="clear"/>
             <w:tcMar>
               <w:top w:type="dxa" w:w="40"/>
               <w:left w:type="dxa" w:w="110"/>
@@ -26006,7 +26187,7 @@
               <w:bottom w:val="single" w:color="CFE3DF" w:sz="4"/>
               <w:right w:val="single" w:color="CFE3DF" w:sz="4"/>
             </w:tcBorders>
-            <w:shd w:fill="2A7A6E" w:val="clear"/>
+            <w:shd w:fill="7A474D" w:val="clear"/>
             <w:tcMar>
               <w:top w:type="dxa" w:w="40"/>
               <w:left w:type="dxa" w:w="110"/>
@@ -26039,7 +26220,7 @@
               <w:bottom w:val="single" w:color="CFE3DF" w:sz="4"/>
               <w:right w:val="single" w:color="CFE3DF" w:sz="4"/>
             </w:tcBorders>
-            <w:shd w:fill="2A7A6E" w:val="clear"/>
+            <w:shd w:fill="7A474D" w:val="clear"/>
             <w:tcMar>
               <w:top w:type="dxa" w:w="40"/>
               <w:left w:type="dxa" w:w="110"/>
@@ -26168,6 +26349,7 @@
       <w:pPr>
         <w:pStyle w:val="Heading1"/>
         <w:pageBreakBefore/>
+        <w:shd w:fill="2C4D35" w:val="clear"/>
         <w:spacing w:after="40" w:before="0"/>
       </w:pPr>
       <w:r>
@@ -26184,7 +26366,7 @@
           <w:rFonts w:ascii="Georgia" w:cs="Georgia" w:eastAsia="Georgia" w:hAnsi="Georgia"/>
           <w:i/>
           <w:iCs/>
-          <w:color w:val="0F3760"/>
+          <w:color w:val="2C4D35"/>
           <w:sz w:val="28"/>
           <w:szCs w:val="28"/>
         </w:rPr>
@@ -26378,7 +26560,7 @@
               <w:bottom w:val="single" w:color="CFE3DF" w:sz="4"/>
               <w:right w:val="single" w:color="CFE3DF" w:sz="4"/>
             </w:tcBorders>
-            <w:shd w:fill="2A7A6E" w:val="clear"/>
+            <w:shd w:fill="2C4D35" w:val="clear"/>
             <w:tcMar>
               <w:top w:type="dxa" w:w="40"/>
               <w:left w:type="dxa" w:w="110"/>
@@ -26564,7 +26746,7 @@
               <w:bottom w:val="single" w:color="CFE3DF" w:sz="4"/>
               <w:right w:val="single" w:color="CFE3DF" w:sz="4"/>
             </w:tcBorders>
-            <w:shd w:fill="2A7A6E" w:val="clear"/>
+            <w:shd w:fill="2C4D35" w:val="clear"/>
             <w:tcMar>
               <w:top w:type="dxa" w:w="40"/>
               <w:left w:type="dxa" w:w="110"/>
@@ -26668,7 +26850,7 @@
               <w:bottom w:val="single" w:color="CFE3DF" w:sz="4"/>
               <w:right w:val="single" w:color="CFE3DF" w:sz="4"/>
             </w:tcBorders>
-            <w:shd w:fill="2A7A6E" w:val="clear"/>
+            <w:shd w:fill="2C4D35" w:val="clear"/>
             <w:tcMar>
               <w:top w:type="dxa" w:w="40"/>
               <w:left w:type="dxa" w:w="110"/>
@@ -26701,7 +26883,7 @@
               <w:bottom w:val="single" w:color="CFE3DF" w:sz="4"/>
               <w:right w:val="single" w:color="CFE3DF" w:sz="4"/>
             </w:tcBorders>
-            <w:shd w:fill="2A7A6E" w:val="clear"/>
+            <w:shd w:fill="2C4D35" w:val="clear"/>
             <w:tcMar>
               <w:top w:type="dxa" w:w="40"/>
               <w:left w:type="dxa" w:w="110"/>
@@ -26734,7 +26916,7 @@
               <w:bottom w:val="single" w:color="CFE3DF" w:sz="4"/>
               <w:right w:val="single" w:color="CFE3DF" w:sz="4"/>
             </w:tcBorders>
-            <w:shd w:fill="2A7A6E" w:val="clear"/>
+            <w:shd w:fill="2C4D35" w:val="clear"/>
             <w:tcMar>
               <w:top w:type="dxa" w:w="40"/>
               <w:left w:type="dxa" w:w="110"/>
@@ -26863,6 +27045,7 @@
       <w:pPr>
         <w:pStyle w:val="Heading1"/>
         <w:pageBreakBefore/>
+        <w:shd w:fill="724026" w:val="clear"/>
         <w:spacing w:after="40" w:before="0"/>
       </w:pPr>
       <w:r>
@@ -26879,7 +27062,7 @@
           <w:rFonts w:ascii="Georgia" w:cs="Georgia" w:eastAsia="Georgia" w:hAnsi="Georgia"/>
           <w:i/>
           <w:iCs/>
-          <w:color w:val="0F3760"/>
+          <w:color w:val="724026"/>
           <w:sz w:val="28"/>
           <w:szCs w:val="28"/>
         </w:rPr>
@@ -27097,7 +27280,7 @@
               <w:bottom w:val="single" w:color="CFE3DF" w:sz="4"/>
               <w:right w:val="single" w:color="CFE3DF" w:sz="4"/>
             </w:tcBorders>
-            <w:shd w:fill="2A7A6E" w:val="clear"/>
+            <w:shd w:fill="724026" w:val="clear"/>
             <w:tcMar>
               <w:top w:type="dxa" w:w="40"/>
               <w:left w:type="dxa" w:w="110"/>
@@ -27201,7 +27384,7 @@
               <w:bottom w:val="single" w:color="CFE3DF" w:sz="4"/>
               <w:right w:val="single" w:color="CFE3DF" w:sz="4"/>
             </w:tcBorders>
-            <w:shd w:fill="2A7A6E" w:val="clear"/>
+            <w:shd w:fill="724026" w:val="clear"/>
             <w:tcMar>
               <w:top w:type="dxa" w:w="40"/>
               <w:left w:type="dxa" w:w="110"/>
@@ -27234,7 +27417,7 @@
               <w:bottom w:val="single" w:color="CFE3DF" w:sz="4"/>
               <w:right w:val="single" w:color="CFE3DF" w:sz="4"/>
             </w:tcBorders>
-            <w:shd w:fill="2A7A6E" w:val="clear"/>
+            <w:shd w:fill="724026" w:val="clear"/>
             <w:tcMar>
               <w:top w:type="dxa" w:w="40"/>
               <w:left w:type="dxa" w:w="110"/>
@@ -27267,7 +27450,7 @@
               <w:bottom w:val="single" w:color="CFE3DF" w:sz="4"/>
               <w:right w:val="single" w:color="CFE3DF" w:sz="4"/>
             </w:tcBorders>
-            <w:shd w:fill="2A7A6E" w:val="clear"/>
+            <w:shd w:fill="724026" w:val="clear"/>
             <w:tcMar>
               <w:top w:type="dxa" w:w="40"/>
               <w:left w:type="dxa" w:w="110"/>
@@ -27396,6 +27579,7 @@
       <w:pPr>
         <w:pStyle w:val="Heading1"/>
         <w:pageBreakBefore/>
+        <w:shd w:fill="7A5F2C" w:val="clear"/>
         <w:spacing w:after="40" w:before="0"/>
       </w:pPr>
       <w:r>
@@ -27412,7 +27596,7 @@
           <w:rFonts w:ascii="Georgia" w:cs="Georgia" w:eastAsia="Georgia" w:hAnsi="Georgia"/>
           <w:i/>
           <w:iCs/>
-          <w:color w:val="0F3760"/>
+          <w:color w:val="7A5F2C"/>
           <w:sz w:val="28"/>
           <w:szCs w:val="28"/>
         </w:rPr>
@@ -27522,7 +27706,7 @@
               <w:bottom w:val="single" w:color="CFE3DF" w:sz="4"/>
               <w:right w:val="single" w:color="CFE3DF" w:sz="4"/>
             </w:tcBorders>
-            <w:shd w:fill="2A7A6E" w:val="clear"/>
+            <w:shd w:fill="7A5F2C" w:val="clear"/>
             <w:tcMar>
               <w:top w:type="dxa" w:w="40"/>
               <w:left w:type="dxa" w:w="110"/>
@@ -27752,7 +27936,7 @@
               <w:bottom w:val="single" w:color="CFE3DF" w:sz="4"/>
               <w:right w:val="single" w:color="CFE3DF" w:sz="4"/>
             </w:tcBorders>
-            <w:shd w:fill="2A7A6E" w:val="clear"/>
+            <w:shd w:fill="7A5F2C" w:val="clear"/>
             <w:tcMar>
               <w:top w:type="dxa" w:w="40"/>
               <w:left w:type="dxa" w:w="110"/>
@@ -27856,7 +28040,7 @@
               <w:bottom w:val="single" w:color="CFE3DF" w:sz="4"/>
               <w:right w:val="single" w:color="CFE3DF" w:sz="4"/>
             </w:tcBorders>
-            <w:shd w:fill="2A7A6E" w:val="clear"/>
+            <w:shd w:fill="7A5F2C" w:val="clear"/>
             <w:tcMar>
               <w:top w:type="dxa" w:w="40"/>
               <w:left w:type="dxa" w:w="110"/>
@@ -27889,7 +28073,7 @@
               <w:bottom w:val="single" w:color="CFE3DF" w:sz="4"/>
               <w:right w:val="single" w:color="CFE3DF" w:sz="4"/>
             </w:tcBorders>
-            <w:shd w:fill="2A7A6E" w:val="clear"/>
+            <w:shd w:fill="7A5F2C" w:val="clear"/>
             <w:tcMar>
               <w:top w:type="dxa" w:w="40"/>
               <w:left w:type="dxa" w:w="110"/>
@@ -27922,7 +28106,7 @@
               <w:bottom w:val="single" w:color="CFE3DF" w:sz="4"/>
               <w:right w:val="single" w:color="CFE3DF" w:sz="4"/>
             </w:tcBorders>
-            <w:shd w:fill="2A7A6E" w:val="clear"/>
+            <w:shd w:fill="7A5F2C" w:val="clear"/>
             <w:tcMar>
               <w:top w:type="dxa" w:w="40"/>
               <w:left w:type="dxa" w:w="110"/>
@@ -28051,6 +28235,7 @@
       <w:pPr>
         <w:pStyle w:val="Heading1"/>
         <w:pageBreakBefore/>
+        <w:shd w:fill="4F3252" w:val="clear"/>
         <w:spacing w:after="40" w:before="0"/>
       </w:pPr>
       <w:r>
@@ -28067,7 +28252,7 @@
           <w:rFonts w:ascii="Georgia" w:cs="Georgia" w:eastAsia="Georgia" w:hAnsi="Georgia"/>
           <w:i/>
           <w:iCs/>
-          <w:color w:val="0F3760"/>
+          <w:color w:val="4F3252"/>
           <w:sz w:val="28"/>
           <w:szCs w:val="28"/>
         </w:rPr>
@@ -28193,7 +28378,7 @@
               <w:bottom w:val="single" w:color="CFE3DF" w:sz="4"/>
               <w:right w:val="single" w:color="CFE3DF" w:sz="4"/>
             </w:tcBorders>
-            <w:shd w:fill="2A7A6E" w:val="clear"/>
+            <w:shd w:fill="4F3252" w:val="clear"/>
             <w:tcMar>
               <w:top w:type="dxa" w:w="40"/>
               <w:left w:type="dxa" w:w="110"/>
@@ -28531,7 +28716,7 @@
               <w:bottom w:val="single" w:color="CFE3DF" w:sz="4"/>
               <w:right w:val="single" w:color="CFE3DF" w:sz="4"/>
             </w:tcBorders>
-            <w:shd w:fill="2A7A6E" w:val="clear"/>
+            <w:shd w:fill="4F3252" w:val="clear"/>
             <w:tcMar>
               <w:top w:type="dxa" w:w="40"/>
               <w:left w:type="dxa" w:w="110"/>
@@ -28635,7 +28820,7 @@
               <w:bottom w:val="single" w:color="CFE3DF" w:sz="4"/>
               <w:right w:val="single" w:color="CFE3DF" w:sz="4"/>
             </w:tcBorders>
-            <w:shd w:fill="2A7A6E" w:val="clear"/>
+            <w:shd w:fill="4F3252" w:val="clear"/>
             <w:tcMar>
               <w:top w:type="dxa" w:w="40"/>
               <w:left w:type="dxa" w:w="110"/>
@@ -28668,7 +28853,7 @@
               <w:bottom w:val="single" w:color="CFE3DF" w:sz="4"/>
               <w:right w:val="single" w:color="CFE3DF" w:sz="4"/>
             </w:tcBorders>
-            <w:shd w:fill="2A7A6E" w:val="clear"/>
+            <w:shd w:fill="4F3252" w:val="clear"/>
             <w:tcMar>
               <w:top w:type="dxa" w:w="40"/>
               <w:left w:type="dxa" w:w="110"/>
@@ -28701,7 +28886,7 @@
               <w:bottom w:val="single" w:color="CFE3DF" w:sz="4"/>
               <w:right w:val="single" w:color="CFE3DF" w:sz="4"/>
             </w:tcBorders>
-            <w:shd w:fill="2A7A6E" w:val="clear"/>
+            <w:shd w:fill="4F3252" w:val="clear"/>
             <w:tcMar>
               <w:top w:type="dxa" w:w="40"/>
               <w:left w:type="dxa" w:w="110"/>
@@ -28830,6 +29015,7 @@
       <w:pPr>
         <w:pStyle w:val="Heading1"/>
         <w:pageBreakBefore/>
+        <w:shd w:fill="1F5C52" w:val="clear"/>
         <w:spacing w:after="40" w:before="0"/>
       </w:pPr>
       <w:r>
@@ -28846,7 +29032,7 @@
           <w:rFonts w:ascii="Georgia" w:cs="Georgia" w:eastAsia="Georgia" w:hAnsi="Georgia"/>
           <w:i/>
           <w:iCs/>
-          <w:color w:val="0F3760"/>
+          <w:color w:val="1F5C52"/>
           <w:sz w:val="28"/>
           <w:szCs w:val="28"/>
         </w:rPr>
@@ -28924,7 +29110,7 @@
               <w:bottom w:val="single" w:color="CFE3DF" w:sz="4"/>
               <w:right w:val="single" w:color="CFE3DF" w:sz="4"/>
             </w:tcBorders>
-            <w:shd w:fill="2A7A6E" w:val="clear"/>
+            <w:shd w:fill="1F5C52" w:val="clear"/>
             <w:tcMar>
               <w:top w:type="dxa" w:w="40"/>
               <w:left w:type="dxa" w:w="110"/>
@@ -29198,7 +29384,7 @@
               <w:bottom w:val="single" w:color="CFE3DF" w:sz="4"/>
               <w:right w:val="single" w:color="CFE3DF" w:sz="4"/>
             </w:tcBorders>
-            <w:shd w:fill="2A7A6E" w:val="clear"/>
+            <w:shd w:fill="1F5C52" w:val="clear"/>
             <w:tcMar>
               <w:top w:type="dxa" w:w="40"/>
               <w:left w:type="dxa" w:w="110"/>
@@ -29348,7 +29534,7 @@
               <w:bottom w:val="single" w:color="CFE3DF" w:sz="4"/>
               <w:right w:val="single" w:color="CFE3DF" w:sz="4"/>
             </w:tcBorders>
-            <w:shd w:fill="2A7A6E" w:val="clear"/>
+            <w:shd w:fill="1F5C52" w:val="clear"/>
             <w:tcMar>
               <w:top w:type="dxa" w:w="40"/>
               <w:left w:type="dxa" w:w="110"/>
@@ -29452,7 +29638,7 @@
               <w:bottom w:val="single" w:color="CFE3DF" w:sz="4"/>
               <w:right w:val="single" w:color="CFE3DF" w:sz="4"/>
             </w:tcBorders>
-            <w:shd w:fill="2A7A6E" w:val="clear"/>
+            <w:shd w:fill="1F5C52" w:val="clear"/>
             <w:tcMar>
               <w:top w:type="dxa" w:w="40"/>
               <w:left w:type="dxa" w:w="110"/>
@@ -29485,7 +29671,7 @@
               <w:bottom w:val="single" w:color="CFE3DF" w:sz="4"/>
               <w:right w:val="single" w:color="CFE3DF" w:sz="4"/>
             </w:tcBorders>
-            <w:shd w:fill="2A7A6E" w:val="clear"/>
+            <w:shd w:fill="1F5C52" w:val="clear"/>
             <w:tcMar>
               <w:top w:type="dxa" w:w="40"/>
               <w:left w:type="dxa" w:w="110"/>
@@ -29518,7 +29704,7 @@
               <w:bottom w:val="single" w:color="CFE3DF" w:sz="4"/>
               <w:right w:val="single" w:color="CFE3DF" w:sz="4"/>
             </w:tcBorders>
-            <w:shd w:fill="2A7A6E" w:val="clear"/>
+            <w:shd w:fill="1F5C52" w:val="clear"/>
             <w:tcMar>
               <w:top w:type="dxa" w:w="40"/>
               <w:left w:type="dxa" w:w="110"/>
@@ -29647,6 +29833,7 @@
       <w:pPr>
         <w:pStyle w:val="Heading1"/>
         <w:pageBreakBefore/>
+        <w:shd w:fill="7A4F1D" w:val="clear"/>
         <w:spacing w:after="40" w:before="0"/>
       </w:pPr>
       <w:r>
@@ -29663,7 +29850,7 @@
           <w:rFonts w:ascii="Georgia" w:cs="Georgia" w:eastAsia="Georgia" w:hAnsi="Georgia"/>
           <w:i/>
           <w:iCs/>
-          <w:color w:val="0F3760"/>
+          <w:color w:val="7A4F1D"/>
           <w:sz w:val="28"/>
           <w:szCs w:val="28"/>
         </w:rPr>
@@ -29773,7 +29960,7 @@
               <w:bottom w:val="single" w:color="CFE3DF" w:sz="4"/>
               <w:right w:val="single" w:color="CFE3DF" w:sz="4"/>
             </w:tcBorders>
-            <w:shd w:fill="2A7A6E" w:val="clear"/>
+            <w:shd w:fill="7A4F1D" w:val="clear"/>
             <w:tcMar>
               <w:top w:type="dxa" w:w="40"/>
               <w:left w:type="dxa" w:w="110"/>
@@ -29971,7 +30158,7 @@
               <w:bottom w:val="single" w:color="CFE3DF" w:sz="4"/>
               <w:right w:val="single" w:color="CFE3DF" w:sz="4"/>
             </w:tcBorders>
-            <w:shd w:fill="2A7A6E" w:val="clear"/>
+            <w:shd w:fill="7A4F1D" w:val="clear"/>
             <w:tcMar>
               <w:top w:type="dxa" w:w="40"/>
               <w:left w:type="dxa" w:w="110"/>
@@ -30075,7 +30262,7 @@
               <w:bottom w:val="single" w:color="CFE3DF" w:sz="4"/>
               <w:right w:val="single" w:color="CFE3DF" w:sz="4"/>
             </w:tcBorders>
-            <w:shd w:fill="2A7A6E" w:val="clear"/>
+            <w:shd w:fill="7A4F1D" w:val="clear"/>
             <w:tcMar>
               <w:top w:type="dxa" w:w="40"/>
               <w:left w:type="dxa" w:w="110"/>
@@ -30108,7 +30295,7 @@
               <w:bottom w:val="single" w:color="CFE3DF" w:sz="4"/>
               <w:right w:val="single" w:color="CFE3DF" w:sz="4"/>
             </w:tcBorders>
-            <w:shd w:fill="2A7A6E" w:val="clear"/>
+            <w:shd w:fill="7A4F1D" w:val="clear"/>
             <w:tcMar>
               <w:top w:type="dxa" w:w="40"/>
               <w:left w:type="dxa" w:w="110"/>
@@ -30141,7 +30328,7 @@
               <w:bottom w:val="single" w:color="CFE3DF" w:sz="4"/>
               <w:right w:val="single" w:color="CFE3DF" w:sz="4"/>
             </w:tcBorders>
-            <w:shd w:fill="2A7A6E" w:val="clear"/>
+            <w:shd w:fill="7A4F1D" w:val="clear"/>
             <w:tcMar>
               <w:top w:type="dxa" w:w="40"/>
               <w:left w:type="dxa" w:w="110"/>
@@ -30270,6 +30457,7 @@
       <w:pPr>
         <w:pStyle w:val="Heading1"/>
         <w:pageBreakBefore/>
+        <w:shd w:fill="324D61" w:val="clear"/>
         <w:spacing w:after="40" w:before="0"/>
       </w:pPr>
       <w:r>
@@ -30286,7 +30474,7 @@
           <w:rFonts w:ascii="Georgia" w:cs="Georgia" w:eastAsia="Georgia" w:hAnsi="Georgia"/>
           <w:i/>
           <w:iCs/>
-          <w:color w:val="0F3760"/>
+          <w:color w:val="324D61"/>
           <w:sz w:val="28"/>
           <w:szCs w:val="28"/>
         </w:rPr>
@@ -30552,7 +30740,7 @@
               <w:bottom w:val="single" w:color="CFE3DF" w:sz="4"/>
               <w:right w:val="single" w:color="CFE3DF" w:sz="4"/>
             </w:tcBorders>
-            <w:shd w:fill="2A7A6E" w:val="clear"/>
+            <w:shd w:fill="324D61" w:val="clear"/>
             <w:tcMar>
               <w:top w:type="dxa" w:w="40"/>
               <w:left w:type="dxa" w:w="110"/>
@@ -30656,7 +30844,7 @@
               <w:bottom w:val="single" w:color="CFE3DF" w:sz="4"/>
               <w:right w:val="single" w:color="CFE3DF" w:sz="4"/>
             </w:tcBorders>
-            <w:shd w:fill="2A7A6E" w:val="clear"/>
+            <w:shd w:fill="324D61" w:val="clear"/>
             <w:tcMar>
               <w:top w:type="dxa" w:w="40"/>
               <w:left w:type="dxa" w:w="110"/>
@@ -30689,7 +30877,7 @@
               <w:bottom w:val="single" w:color="CFE3DF" w:sz="4"/>
               <w:right w:val="single" w:color="CFE3DF" w:sz="4"/>
             </w:tcBorders>
-            <w:shd w:fill="2A7A6E" w:val="clear"/>
+            <w:shd w:fill="324D61" w:val="clear"/>
             <w:tcMar>
               <w:top w:type="dxa" w:w="40"/>
               <w:left w:type="dxa" w:w="110"/>
@@ -30722,7 +30910,7 @@
               <w:bottom w:val="single" w:color="CFE3DF" w:sz="4"/>
               <w:right w:val="single" w:color="CFE3DF" w:sz="4"/>
             </w:tcBorders>
-            <w:shd w:fill="2A7A6E" w:val="clear"/>
+            <w:shd w:fill="324D61" w:val="clear"/>
             <w:tcMar>
               <w:top w:type="dxa" w:w="40"/>
               <w:left w:type="dxa" w:w="110"/>
@@ -30851,6 +31039,7 @@
       <w:pPr>
         <w:pStyle w:val="Heading1"/>
         <w:pageBreakBefore/>
+        <w:shd w:fill="7A474D" w:val="clear"/>
         <w:spacing w:after="40" w:before="0"/>
       </w:pPr>
       <w:r>
@@ -30867,7 +31056,7 @@
           <w:rFonts w:ascii="Georgia" w:cs="Georgia" w:eastAsia="Georgia" w:hAnsi="Georgia"/>
           <w:i/>
           <w:iCs/>
-          <w:color w:val="0F3760"/>
+          <w:color w:val="7A474D"/>
           <w:sz w:val="28"/>
           <w:szCs w:val="28"/>
         </w:rPr>
@@ -31201,7 +31390,7 @@
               <w:bottom w:val="single" w:color="CFE3DF" w:sz="4"/>
               <w:right w:val="single" w:color="CFE3DF" w:sz="4"/>
             </w:tcBorders>
-            <w:shd w:fill="2A7A6E" w:val="clear"/>
+            <w:shd w:fill="7A474D" w:val="clear"/>
             <w:tcMar>
               <w:top w:type="dxa" w:w="40"/>
               <w:left w:type="dxa" w:w="110"/>
@@ -31305,7 +31494,7 @@
               <w:bottom w:val="single" w:color="CFE3DF" w:sz="4"/>
               <w:right w:val="single" w:color="CFE3DF" w:sz="4"/>
             </w:tcBorders>
-            <w:shd w:fill="2A7A6E" w:val="clear"/>
+            <w:shd w:fill="7A474D" w:val="clear"/>
             <w:tcMar>
               <w:top w:type="dxa" w:w="40"/>
               <w:left w:type="dxa" w:w="110"/>
@@ -31338,7 +31527,7 @@
               <w:bottom w:val="single" w:color="CFE3DF" w:sz="4"/>
               <w:right w:val="single" w:color="CFE3DF" w:sz="4"/>
             </w:tcBorders>
-            <w:shd w:fill="2A7A6E" w:val="clear"/>
+            <w:shd w:fill="7A474D" w:val="clear"/>
             <w:tcMar>
               <w:top w:type="dxa" w:w="40"/>
               <w:left w:type="dxa" w:w="110"/>
@@ -31371,7 +31560,7 @@
               <w:bottom w:val="single" w:color="CFE3DF" w:sz="4"/>
               <w:right w:val="single" w:color="CFE3DF" w:sz="4"/>
             </w:tcBorders>
-            <w:shd w:fill="2A7A6E" w:val="clear"/>
+            <w:shd w:fill="7A474D" w:val="clear"/>
             <w:tcMar>
               <w:top w:type="dxa" w:w="40"/>
               <w:left w:type="dxa" w:w="110"/>
@@ -31500,6 +31689,7 @@
       <w:pPr>
         <w:pStyle w:val="Heading1"/>
         <w:pageBreakBefore/>
+        <w:shd w:fill="2C4D35" w:val="clear"/>
         <w:spacing w:after="40" w:before="0"/>
       </w:pPr>
       <w:r>
@@ -31516,7 +31706,7 @@
           <w:rFonts w:ascii="Georgia" w:cs="Georgia" w:eastAsia="Georgia" w:hAnsi="Georgia"/>
           <w:i/>
           <w:iCs/>
-          <w:color w:val="0F3760"/>
+          <w:color w:val="2C4D35"/>
           <w:sz w:val="28"/>
           <w:szCs w:val="28"/>
         </w:rPr>
@@ -31904,7 +32094,7 @@
             </w:pPr>
             <w:r>
               <w:rPr>
-                <w:color w:val="2A7A6E"/>
+                <w:color w:val="2C4D35"/>
                 <w:sz w:val="18"/>
                 <w:szCs w:val="18"/>
               </w:rPr>
@@ -31918,7 +32108,141 @@
                 <w:sz w:val="20"/>
                 <w:szCs w:val="20"/>
               </w:rPr>
-              <w:t xml:space="preserve">“I understand why I did that. I was trying to meet my needs for ______, _____ and _____. And even though I understand that, I would love to meet those needs in a way that is more in alignment with my other needs for ______, _____ and _______.”</w:t>
+              <w:t xml:space="preserve">“</w:t>
+            </w:r>
+            <w:r>
+              <w:rPr>
+                <w:i/>
+                <w:iCs/>
+                <w:color w:val="2D2D2D"/>
+                <w:sz w:val="20"/>
+                <w:szCs w:val="20"/>
+              </w:rPr>
+              <w:t xml:space="preserve">I understand why I did that. I was trying to meet my needs for </w:t>
+            </w:r>
+            <w:r>
+              <w:rPr>
+                <w:color w:val="2D2D2D"/>
+                <w:sz w:val="20"/>
+                <w:szCs w:val="20"/>
+                <w:u w:val="single"/>
+              </w:rPr>
+              <w:t xml:space="preserve">              </w:t>
+            </w:r>
+            <w:r>
+              <w:rPr>
+                <w:i/>
+                <w:iCs/>
+                <w:color w:val="2D2D2D"/>
+                <w:sz w:val="20"/>
+                <w:szCs w:val="20"/>
+              </w:rPr>
+              <w:t xml:space="preserve">, </w:t>
+            </w:r>
+            <w:r>
+              <w:rPr>
+                <w:color w:val="2D2D2D"/>
+                <w:sz w:val="20"/>
+                <w:szCs w:val="20"/>
+                <w:u w:val="single"/>
+              </w:rPr>
+              <w:t xml:space="preserve">              </w:t>
+            </w:r>
+            <w:r>
+              <w:rPr>
+                <w:i/>
+                <w:iCs/>
+                <w:color w:val="2D2D2D"/>
+                <w:sz w:val="20"/>
+                <w:szCs w:val="20"/>
+              </w:rPr>
+              <w:t xml:space="preserve"> and </w:t>
+            </w:r>
+            <w:r>
+              <w:rPr>
+                <w:color w:val="2D2D2D"/>
+                <w:sz w:val="20"/>
+                <w:szCs w:val="20"/>
+                <w:u w:val="single"/>
+              </w:rPr>
+              <w:t xml:space="preserve">              </w:t>
+            </w:r>
+            <w:r>
+              <w:rPr>
+                <w:i/>
+                <w:iCs/>
+                <w:color w:val="2D2D2D"/>
+                <w:sz w:val="20"/>
+                <w:szCs w:val="20"/>
+              </w:rPr>
+              <w:t xml:space="preserve">. And even though I understand that, I would love to meet those needs in a way that is more in alignment with my other needs for </w:t>
+            </w:r>
+            <w:r>
+              <w:rPr>
+                <w:color w:val="2D2D2D"/>
+                <w:sz w:val="20"/>
+                <w:szCs w:val="20"/>
+                <w:u w:val="single"/>
+              </w:rPr>
+              <w:t xml:space="preserve">              </w:t>
+            </w:r>
+            <w:r>
+              <w:rPr>
+                <w:i/>
+                <w:iCs/>
+                <w:color w:val="2D2D2D"/>
+                <w:sz w:val="20"/>
+                <w:szCs w:val="20"/>
+              </w:rPr>
+              <w:t xml:space="preserve">, </w:t>
+            </w:r>
+            <w:r>
+              <w:rPr>
+                <w:color w:val="2D2D2D"/>
+                <w:sz w:val="20"/>
+                <w:szCs w:val="20"/>
+                <w:u w:val="single"/>
+              </w:rPr>
+              <w:t xml:space="preserve">              </w:t>
+            </w:r>
+            <w:r>
+              <w:rPr>
+                <w:i/>
+                <w:iCs/>
+                <w:color w:val="2D2D2D"/>
+                <w:sz w:val="20"/>
+                <w:szCs w:val="20"/>
+              </w:rPr>
+              <w:t xml:space="preserve"> and </w:t>
+            </w:r>
+            <w:r>
+              <w:rPr>
+                <w:color w:val="2D2D2D"/>
+                <w:sz w:val="20"/>
+                <w:szCs w:val="20"/>
+                <w:u w:val="single"/>
+              </w:rPr>
+              <w:t xml:space="preserve">              </w:t>
+            </w:r>
+            <w:r>
+              <w:rPr>
+                <w:i/>
+                <w:iCs/>
+                <w:color w:val="2D2D2D"/>
+                <w:sz w:val="20"/>
+                <w:szCs w:val="20"/>
+              </w:rPr>
+              <w:t xml:space="preserve">.</w:t>
+            </w:r>
+            <w:r>
+              <w:rPr>
+                <w:i/>
+                <w:iCs/>
+                <w:color w:val="2D2D2D"/>
+                <w:sz w:val="20"/>
+                <w:szCs w:val="20"/>
+              </w:rPr>
+              <w:t xml:space="preserve">”</w:t>
             </w:r>
           </w:p>
         </w:tc>
@@ -32015,7 +32339,7 @@
             </w:pPr>
             <w:r>
               <w:rPr>
-                <w:color w:val="2A7A6E"/>
+                <w:color w:val="2C4D35"/>
                 <w:sz w:val="18"/>
                 <w:szCs w:val="18"/>
               </w:rPr>
@@ -32029,7 +32353,65 @@
                 <w:sz w:val="20"/>
                 <w:szCs w:val="20"/>
               </w:rPr>
-              <w:t xml:space="preserve">“I'm feeling a bit scared sharing this with you because I'm afraid of being judged, but I really want to reconnect. When I (did, said etc.), I didn't meet my need for __________ (ex. care, consideration, ...), and that is really important to me because I know it had an impact on you. Now that I realize this, I would like to deal with that differently, in a way that is more in alignment with my values and creates more __________. I'm wondering what goes on for you hearing this?”</w:t>
+              <w:t xml:space="preserve">“</w:t>
+            </w:r>
+            <w:r>
+              <w:rPr>
+                <w:i/>
+                <w:iCs/>
+                <w:color w:val="2D2D2D"/>
+                <w:sz w:val="20"/>
+                <w:szCs w:val="20"/>
+              </w:rPr>
+              <w:t xml:space="preserve">I'm feeling a bit scared sharing this with you because I'm afraid of being judged, but I really want to reconnect. When I (did, said etc.), I didn't meet my need for </w:t>
+            </w:r>
+            <w:r>
+              <w:rPr>
+                <w:color w:val="2D2D2D"/>
+                <w:sz w:val="20"/>
+                <w:szCs w:val="20"/>
+                <w:u w:val="single"/>
+              </w:rPr>
+              <w:t xml:space="preserve">              </w:t>
+            </w:r>
+            <w:r>
+              <w:rPr>
+                <w:i/>
+                <w:iCs/>
+                <w:color w:val="2D2D2D"/>
+                <w:sz w:val="20"/>
+                <w:szCs w:val="20"/>
+              </w:rPr>
+              <w:t xml:space="preserve"> (ex. care, consideration, ...), and that is really important to me because I know it had an impact on you. Now that I realize this, I would like to deal with that differently, in a way that is more in alignment with my values and creates more </w:t>
+            </w:r>
+            <w:r>
+              <w:rPr>
+                <w:color w:val="2D2D2D"/>
+                <w:sz w:val="20"/>
+                <w:szCs w:val="20"/>
+                <w:u w:val="single"/>
+              </w:rPr>
+              <w:t xml:space="preserve">              </w:t>
+            </w:r>
+            <w:r>
+              <w:rPr>
+                <w:i/>
+                <w:iCs/>
+                <w:color w:val="2D2D2D"/>
+                <w:sz w:val="20"/>
+                <w:szCs w:val="20"/>
+              </w:rPr>
+              <w:t xml:space="preserve">. I'm wondering what goes on for you hearing this?</w:t>
+            </w:r>
+            <w:r>
+              <w:rPr>
+                <w:i/>
+                <w:iCs/>
+                <w:color w:val="2D2D2D"/>
+                <w:sz w:val="20"/>
+                <w:szCs w:val="20"/>
+              </w:rPr>
+              <w:t xml:space="preserve">”</w:t>
             </w:r>
           </w:p>
         </w:tc>
@@ -32132,7 +32514,7 @@
               <w:bottom w:val="single" w:color="CFE3DF" w:sz="4"/>
               <w:right w:val="single" w:color="CFE3DF" w:sz="4"/>
             </w:tcBorders>
-            <w:shd w:fill="2A7A6E" w:val="clear"/>
+            <w:shd w:fill="2C4D35" w:val="clear"/>
             <w:tcMar>
               <w:top w:type="dxa" w:w="40"/>
               <w:left w:type="dxa" w:w="110"/>
@@ -32236,7 +32618,7 @@
               <w:bottom w:val="single" w:color="CFE3DF" w:sz="4"/>
               <w:right w:val="single" w:color="CFE3DF" w:sz="4"/>
             </w:tcBorders>
-            <w:shd w:fill="2A7A6E" w:val="clear"/>
+            <w:shd w:fill="2C4D35" w:val="clear"/>
             <w:tcMar>
               <w:top w:type="dxa" w:w="40"/>
               <w:left w:type="dxa" w:w="110"/>
@@ -32269,7 +32651,7 @@
               <w:bottom w:val="single" w:color="CFE3DF" w:sz="4"/>
               <w:right w:val="single" w:color="CFE3DF" w:sz="4"/>
             </w:tcBorders>
-            <w:shd w:fill="2A7A6E" w:val="clear"/>
+            <w:shd w:fill="2C4D35" w:val="clear"/>
             <w:tcMar>
               <w:top w:type="dxa" w:w="40"/>
               <w:left w:type="dxa" w:w="110"/>
@@ -32302,7 +32684,7 @@
               <w:bottom w:val="single" w:color="CFE3DF" w:sz="4"/>
               <w:right w:val="single" w:color="CFE3DF" w:sz="4"/>
             </w:tcBorders>
-            <w:shd w:fill="2A7A6E" w:val="clear"/>
+            <w:shd w:fill="2C4D35" w:val="clear"/>
             <w:tcMar>
               <w:top w:type="dxa" w:w="40"/>
               <w:left w:type="dxa" w:w="110"/>
@@ -32431,6 +32813,7 @@
       <w:pPr>
         <w:pStyle w:val="Heading1"/>
         <w:pageBreakBefore/>
+        <w:shd w:fill="724026" w:val="clear"/>
         <w:spacing w:after="40" w:before="0"/>
       </w:pPr>
       <w:r>
@@ -32447,7 +32830,7 @@
           <w:rFonts w:ascii="Georgia" w:cs="Georgia" w:eastAsia="Georgia" w:hAnsi="Georgia"/>
           <w:i/>
           <w:iCs/>
-          <w:color w:val="0F3760"/>
+          <w:color w:val="724026"/>
           <w:sz w:val="28"/>
           <w:szCs w:val="28"/>
         </w:rPr>
@@ -32601,7 +32984,7 @@
               <w:bottom w:val="single" w:color="CFE3DF" w:sz="4"/>
               <w:right w:val="single" w:color="CFE3DF" w:sz="4"/>
             </w:tcBorders>
-            <w:shd w:fill="2A7A6E" w:val="clear"/>
+            <w:shd w:fill="724026" w:val="clear"/>
             <w:tcMar>
               <w:top w:type="dxa" w:w="40"/>
               <w:left w:type="dxa" w:w="110"/>
@@ -32823,7 +33206,7 @@
               <w:bottom w:val="single" w:color="CFE3DF" w:sz="4"/>
               <w:right w:val="single" w:color="CFE3DF" w:sz="4"/>
             </w:tcBorders>
-            <w:shd w:fill="2A7A6E" w:val="clear"/>
+            <w:shd w:fill="724026" w:val="clear"/>
             <w:tcMar>
               <w:top w:type="dxa" w:w="40"/>
               <w:left w:type="dxa" w:w="110"/>
@@ -32927,7 +33310,7 @@
               <w:bottom w:val="single" w:color="CFE3DF" w:sz="4"/>
               <w:right w:val="single" w:color="CFE3DF" w:sz="4"/>
             </w:tcBorders>
-            <w:shd w:fill="2A7A6E" w:val="clear"/>
+            <w:shd w:fill="724026" w:val="clear"/>
             <w:tcMar>
               <w:top w:type="dxa" w:w="40"/>
               <w:left w:type="dxa" w:w="110"/>
@@ -32960,7 +33343,7 @@
               <w:bottom w:val="single" w:color="CFE3DF" w:sz="4"/>
               <w:right w:val="single" w:color="CFE3DF" w:sz="4"/>
             </w:tcBorders>
-            <w:shd w:fill="2A7A6E" w:val="clear"/>
+            <w:shd w:fill="724026" w:val="clear"/>
             <w:tcMar>
               <w:top w:type="dxa" w:w="40"/>
               <w:left w:type="dxa" w:w="110"/>
@@ -32993,7 +33376,7 @@
               <w:bottom w:val="single" w:color="CFE3DF" w:sz="4"/>
               <w:right w:val="single" w:color="CFE3DF" w:sz="4"/>
             </w:tcBorders>
-            <w:shd w:fill="2A7A6E" w:val="clear"/>
+            <w:shd w:fill="724026" w:val="clear"/>
             <w:tcMar>
               <w:top w:type="dxa" w:w="40"/>
               <w:left w:type="dxa" w:w="110"/>
@@ -33122,6 +33505,7 @@
       <w:pPr>
         <w:pStyle w:val="Heading1"/>
         <w:pageBreakBefore/>
+        <w:shd w:fill="7A5F2C" w:val="clear"/>
         <w:spacing w:after="40" w:before="0"/>
       </w:pPr>
       <w:r>
@@ -33138,7 +33522,7 @@
           <w:rFonts w:ascii="Georgia" w:cs="Georgia" w:eastAsia="Georgia" w:hAnsi="Georgia"/>
           <w:i/>
           <w:iCs/>
-          <w:color w:val="0F3760"/>
+          <w:color w:val="7A5F2C"/>
           <w:sz w:val="28"/>
           <w:szCs w:val="28"/>
         </w:rPr>
@@ -33280,7 +33664,7 @@
               <w:bottom w:val="single" w:color="CFE3DF" w:sz="4"/>
               <w:right w:val="single" w:color="CFE3DF" w:sz="4"/>
             </w:tcBorders>
-            <w:shd w:fill="2A7A6E" w:val="clear"/>
+            <w:shd w:fill="7A5F2C" w:val="clear"/>
             <w:tcMar>
               <w:top w:type="dxa" w:w="40"/>
               <w:left w:type="dxa" w:w="110"/>
@@ -33594,7 +33978,7 @@
               <w:bottom w:val="single" w:color="CFE3DF" w:sz="4"/>
               <w:right w:val="single" w:color="CFE3DF" w:sz="4"/>
             </w:tcBorders>
-            <w:shd w:fill="2A7A6E" w:val="clear"/>
+            <w:shd w:fill="7A5F2C" w:val="clear"/>
             <w:tcMar>
               <w:top w:type="dxa" w:w="40"/>
               <w:left w:type="dxa" w:w="110"/>
@@ -33698,7 +34082,7 @@
               <w:bottom w:val="single" w:color="CFE3DF" w:sz="4"/>
               <w:right w:val="single" w:color="CFE3DF" w:sz="4"/>
             </w:tcBorders>
-            <w:shd w:fill="2A7A6E" w:val="clear"/>
+            <w:shd w:fill="7A5F2C" w:val="clear"/>
             <w:tcMar>
               <w:top w:type="dxa" w:w="40"/>
               <w:left w:type="dxa" w:w="110"/>
@@ -33731,7 +34115,7 @@
               <w:bottom w:val="single" w:color="CFE3DF" w:sz="4"/>
               <w:right w:val="single" w:color="CFE3DF" w:sz="4"/>
             </w:tcBorders>
-            <w:shd w:fill="2A7A6E" w:val="clear"/>
+            <w:shd w:fill="7A5F2C" w:val="clear"/>
             <w:tcMar>
               <w:top w:type="dxa" w:w="40"/>
               <w:left w:type="dxa" w:w="110"/>
@@ -33764,7 +34148,7 @@
               <w:bottom w:val="single" w:color="CFE3DF" w:sz="4"/>
               <w:right w:val="single" w:color="CFE3DF" w:sz="4"/>
             </w:tcBorders>
-            <w:shd w:fill="2A7A6E" w:val="clear"/>
+            <w:shd w:fill="7A5F2C" w:val="clear"/>
             <w:tcMar>
               <w:top w:type="dxa" w:w="40"/>
               <w:left w:type="dxa" w:w="110"/>
@@ -33893,6 +34277,7 @@
       <w:pPr>
         <w:pStyle w:val="Heading1"/>
         <w:pageBreakBefore/>
+        <w:shd w:fill="4F3252" w:val="clear"/>
         <w:spacing w:after="40" w:before="0"/>
       </w:pPr>
       <w:r>
@@ -33909,7 +34294,7 @@
           <w:rFonts w:ascii="Georgia" w:cs="Georgia" w:eastAsia="Georgia" w:hAnsi="Georgia"/>
           <w:i/>
           <w:iCs/>
-          <w:color w:val="0F3760"/>
+          <w:color w:val="4F3252"/>
           <w:sz w:val="28"/>
           <w:szCs w:val="28"/>
         </w:rPr>
@@ -34087,7 +34472,7 @@
               <w:bottom w:val="single" w:color="CFE3DF" w:sz="4"/>
               <w:right w:val="single" w:color="CFE3DF" w:sz="4"/>
             </w:tcBorders>
-            <w:shd w:fill="2A7A6E" w:val="clear"/>
+            <w:shd w:fill="4F3252" w:val="clear"/>
             <w:tcMar>
               <w:top w:type="dxa" w:w="40"/>
               <w:left w:type="dxa" w:w="110"/>
@@ -34269,7 +34654,7 @@
               <w:bottom w:val="single" w:color="CFE3DF" w:sz="4"/>
               <w:right w:val="single" w:color="CFE3DF" w:sz="4"/>
             </w:tcBorders>
-            <w:shd w:fill="2A7A6E" w:val="clear"/>
+            <w:shd w:fill="4F3252" w:val="clear"/>
             <w:tcMar>
               <w:top w:type="dxa" w:w="40"/>
               <w:left w:type="dxa" w:w="110"/>
@@ -34373,7 +34758,7 @@
               <w:bottom w:val="single" w:color="CFE3DF" w:sz="4"/>
               <w:right w:val="single" w:color="CFE3DF" w:sz="4"/>
             </w:tcBorders>
-            <w:shd w:fill="2A7A6E" w:val="clear"/>
+            <w:shd w:fill="4F3252" w:val="clear"/>
             <w:tcMar>
               <w:top w:type="dxa" w:w="40"/>
               <w:left w:type="dxa" w:w="110"/>
@@ -34406,7 +34791,7 @@
               <w:bottom w:val="single" w:color="CFE3DF" w:sz="4"/>
               <w:right w:val="single" w:color="CFE3DF" w:sz="4"/>
             </w:tcBorders>
-            <w:shd w:fill="2A7A6E" w:val="clear"/>
+            <w:shd w:fill="4F3252" w:val="clear"/>
             <w:tcMar>
               <w:top w:type="dxa" w:w="40"/>
               <w:left w:type="dxa" w:w="110"/>
@@ -34439,7 +34824,7 @@
               <w:bottom w:val="single" w:color="CFE3DF" w:sz="4"/>
               <w:right w:val="single" w:color="CFE3DF" w:sz="4"/>
             </w:tcBorders>
-            <w:shd w:fill="2A7A6E" w:val="clear"/>
+            <w:shd w:fill="4F3252" w:val="clear"/>
             <w:tcMar>
               <w:top w:type="dxa" w:w="40"/>
               <w:left w:type="dxa" w:w="110"/>
@@ -34568,6 +34953,7 @@
       <w:pPr>
         <w:pStyle w:val="Heading1"/>
         <w:pageBreakBefore/>
+        <w:shd w:fill="1F5C52" w:val="clear"/>
         <w:spacing w:after="40" w:before="0"/>
       </w:pPr>
       <w:r>
@@ -34584,7 +34970,7 @@
           <w:rFonts w:ascii="Georgia" w:cs="Georgia" w:eastAsia="Georgia" w:hAnsi="Georgia"/>
           <w:i/>
           <w:iCs/>
-          <w:color w:val="0F3760"/>
+          <w:color w:val="1F5C52"/>
           <w:sz w:val="28"/>
           <w:szCs w:val="28"/>
         </w:rPr>
@@ -34738,7 +35124,7 @@
               <w:bottom w:val="single" w:color="CFE3DF" w:sz="4"/>
               <w:right w:val="single" w:color="CFE3DF" w:sz="4"/>
             </w:tcBorders>
-            <w:shd w:fill="2A7A6E" w:val="clear"/>
+            <w:shd w:fill="1F5C52" w:val="clear"/>
             <w:tcMar>
               <w:top w:type="dxa" w:w="40"/>
               <w:left w:type="dxa" w:w="110"/>
@@ -34904,7 +35290,7 @@
               <w:bottom w:val="single" w:color="CFE3DF" w:sz="4"/>
               <w:right w:val="single" w:color="CFE3DF" w:sz="4"/>
             </w:tcBorders>
-            <w:shd w:fill="2A7A6E" w:val="clear"/>
+            <w:shd w:fill="1F5C52" w:val="clear"/>
             <w:tcMar>
               <w:top w:type="dxa" w:w="40"/>
               <w:left w:type="dxa" w:w="110"/>
@@ -35008,7 +35394,7 @@
               <w:bottom w:val="single" w:color="CFE3DF" w:sz="4"/>
               <w:right w:val="single" w:color="CFE3DF" w:sz="4"/>
             </w:tcBorders>
-            <w:shd w:fill="2A7A6E" w:val="clear"/>
+            <w:shd w:fill="1F5C52" w:val="clear"/>
             <w:tcMar>
               <w:top w:type="dxa" w:w="40"/>
               <w:left w:type="dxa" w:w="110"/>
@@ -35041,7 +35427,7 @@
               <w:bottom w:val="single" w:color="CFE3DF" w:sz="4"/>
               <w:right w:val="single" w:color="CFE3DF" w:sz="4"/>
             </w:tcBorders>
-            <w:shd w:fill="2A7A6E" w:val="clear"/>
+            <w:shd w:fill="1F5C52" w:val="clear"/>
             <w:tcMar>
               <w:top w:type="dxa" w:w="40"/>
               <w:left w:type="dxa" w:w="110"/>
@@ -35074,7 +35460,7 @@
               <w:bottom w:val="single" w:color="CFE3DF" w:sz="4"/>
               <w:right w:val="single" w:color="CFE3DF" w:sz="4"/>
             </w:tcBorders>
-            <w:shd w:fill="2A7A6E" w:val="clear"/>
+            <w:shd w:fill="1F5C52" w:val="clear"/>
             <w:tcMar>
               <w:top w:type="dxa" w:w="40"/>
               <w:left w:type="dxa" w:w="110"/>
@@ -35203,6 +35589,7 @@
       <w:pPr>
         <w:pStyle w:val="Heading1"/>
         <w:pageBreakBefore/>
+        <w:shd w:fill="7A4F1D" w:val="clear"/>
         <w:spacing w:after="40" w:before="0"/>
       </w:pPr>
       <w:r>
@@ -35219,7 +35606,7 @@
           <w:rFonts w:ascii="Georgia" w:cs="Georgia" w:eastAsia="Georgia" w:hAnsi="Georgia"/>
           <w:i/>
           <w:iCs/>
-          <w:color w:val="0F3760"/>
+          <w:color w:val="7A4F1D"/>
           <w:sz w:val="28"/>
           <w:szCs w:val="28"/>
         </w:rPr>
@@ -35369,7 +35756,7 @@
               <w:bottom w:val="single" w:color="CFE3DF" w:sz="4"/>
               <w:right w:val="single" w:color="CFE3DF" w:sz="4"/>
             </w:tcBorders>
-            <w:shd w:fill="2A7A6E" w:val="clear"/>
+            <w:shd w:fill="7A4F1D" w:val="clear"/>
             <w:tcMar>
               <w:top w:type="dxa" w:w="40"/>
               <w:left w:type="dxa" w:w="110"/>
@@ -35611,7 +35998,7 @@
               <w:bottom w:val="single" w:color="CFE3DF" w:sz="4"/>
               <w:right w:val="single" w:color="CFE3DF" w:sz="4"/>
             </w:tcBorders>
-            <w:shd w:fill="2A7A6E" w:val="clear"/>
+            <w:shd w:fill="7A4F1D" w:val="clear"/>
             <w:tcMar>
               <w:top w:type="dxa" w:w="40"/>
               <w:left w:type="dxa" w:w="110"/>
@@ -35813,7 +36200,7 @@
               <w:bottom w:val="single" w:color="CFE3DF" w:sz="4"/>
               <w:right w:val="single" w:color="CFE3DF" w:sz="4"/>
             </w:tcBorders>
-            <w:shd w:fill="2A7A6E" w:val="clear"/>
+            <w:shd w:fill="7A4F1D" w:val="clear"/>
             <w:tcMar>
               <w:top w:type="dxa" w:w="40"/>
               <w:left w:type="dxa" w:w="110"/>
@@ -35917,7 +36304,7 @@
               <w:bottom w:val="single" w:color="CFE3DF" w:sz="4"/>
               <w:right w:val="single" w:color="CFE3DF" w:sz="4"/>
             </w:tcBorders>
-            <w:shd w:fill="2A7A6E" w:val="clear"/>
+            <w:shd w:fill="7A4F1D" w:val="clear"/>
             <w:tcMar>
               <w:top w:type="dxa" w:w="40"/>
               <w:left w:type="dxa" w:w="110"/>
@@ -35950,7 +36337,7 @@
               <w:bottom w:val="single" w:color="CFE3DF" w:sz="4"/>
               <w:right w:val="single" w:color="CFE3DF" w:sz="4"/>
             </w:tcBorders>
-            <w:shd w:fill="2A7A6E" w:val="clear"/>
+            <w:shd w:fill="7A4F1D" w:val="clear"/>
             <w:tcMar>
               <w:top w:type="dxa" w:w="40"/>
               <w:left w:type="dxa" w:w="110"/>
@@ -35983,7 +36370,7 @@
               <w:bottom w:val="single" w:color="CFE3DF" w:sz="4"/>
               <w:right w:val="single" w:color="CFE3DF" w:sz="4"/>
             </w:tcBorders>
-            <w:shd w:fill="2A7A6E" w:val="clear"/>
+            <w:shd w:fill="7A4F1D" w:val="clear"/>
             <w:tcMar>
               <w:top w:type="dxa" w:w="40"/>
               <w:left w:type="dxa" w:w="110"/>
@@ -36112,6 +36499,7 @@
       <w:pPr>
         <w:pStyle w:val="Heading1"/>
         <w:pageBreakBefore/>
+        <w:shd w:fill="324D61" w:val="clear"/>
         <w:spacing w:after="40" w:before="0"/>
       </w:pPr>
       <w:r>
@@ -36128,7 +36516,7 @@
           <w:rFonts w:ascii="Georgia" w:cs="Georgia" w:eastAsia="Georgia" w:hAnsi="Georgia"/>
           <w:i/>
           <w:iCs/>
-          <w:color w:val="0F3760"/>
+          <w:color w:val="324D61"/>
           <w:sz w:val="28"/>
           <w:szCs w:val="28"/>
         </w:rPr>
@@ -36258,7 +36646,7 @@
               <w:bottom w:val="single" w:color="CFE3DF" w:sz="4"/>
               <w:right w:val="single" w:color="CFE3DF" w:sz="4"/>
             </w:tcBorders>
-            <w:shd w:fill="2A7A6E" w:val="clear"/>
+            <w:shd w:fill="324D61" w:val="clear"/>
             <w:tcMar>
               <w:top w:type="dxa" w:w="40"/>
               <w:left w:type="dxa" w:w="110"/>
@@ -36460,7 +36848,7 @@
               <w:bottom w:val="single" w:color="CFE3DF" w:sz="4"/>
               <w:right w:val="single" w:color="CFE3DF" w:sz="4"/>
             </w:tcBorders>
-            <w:shd w:fill="2A7A6E" w:val="clear"/>
+            <w:shd w:fill="324D61" w:val="clear"/>
             <w:tcMar>
               <w:top w:type="dxa" w:w="40"/>
               <w:left w:type="dxa" w:w="110"/>
@@ -36564,7 +36952,7 @@
               <w:bottom w:val="single" w:color="CFE3DF" w:sz="4"/>
               <w:right w:val="single" w:color="CFE3DF" w:sz="4"/>
             </w:tcBorders>
-            <w:shd w:fill="2A7A6E" w:val="clear"/>
+            <w:shd w:fill="324D61" w:val="clear"/>
             <w:tcMar>
               <w:top w:type="dxa" w:w="40"/>
               <w:left w:type="dxa" w:w="110"/>
@@ -36597,7 +36985,7 @@
               <w:bottom w:val="single" w:color="CFE3DF" w:sz="4"/>
               <w:right w:val="single" w:color="CFE3DF" w:sz="4"/>
             </w:tcBorders>
-            <w:shd w:fill="2A7A6E" w:val="clear"/>
+            <w:shd w:fill="324D61" w:val="clear"/>
             <w:tcMar>
               <w:top w:type="dxa" w:w="40"/>
               <w:left w:type="dxa" w:w="110"/>
@@ -36630,7 +37018,7 @@
               <w:bottom w:val="single" w:color="CFE3DF" w:sz="4"/>
               <w:right w:val="single" w:color="CFE3DF" w:sz="4"/>
             </w:tcBorders>
-            <w:shd w:fill="2A7A6E" w:val="clear"/>
+            <w:shd w:fill="324D61" w:val="clear"/>
             <w:tcMar>
               <w:top w:type="dxa" w:w="40"/>
               <w:left w:type="dxa" w:w="110"/>
@@ -36759,6 +37147,7 @@
       <w:pPr>
         <w:pStyle w:val="Heading1"/>
         <w:pageBreakBefore/>
+        <w:shd w:fill="7A474D" w:val="clear"/>
         <w:spacing w:after="40" w:before="0"/>
       </w:pPr>
       <w:r>
@@ -36775,7 +37164,7 @@
           <w:rFonts w:ascii="Georgia" w:cs="Georgia" w:eastAsia="Georgia" w:hAnsi="Georgia"/>
           <w:i/>
           <w:iCs/>
-          <w:color w:val="0F3760"/>
+          <w:color w:val="7A474D"/>
           <w:sz w:val="28"/>
           <w:szCs w:val="28"/>
         </w:rPr>
@@ -36837,7 +37226,7 @@
               <w:bottom w:val="single" w:color="CFE3DF" w:sz="4"/>
               <w:right w:val="single" w:color="CFE3DF" w:sz="4"/>
             </w:tcBorders>
-            <w:shd w:fill="2A7A6E" w:val="clear"/>
+            <w:shd w:fill="7A474D" w:val="clear"/>
             <w:tcMar>
               <w:top w:type="dxa" w:w="40"/>
               <w:left w:type="dxa" w:w="110"/>
@@ -36955,7 +37344,7 @@
               <w:bottom w:val="single" w:color="CFE3DF" w:sz="4"/>
               <w:right w:val="single" w:color="CFE3DF" w:sz="4"/>
             </w:tcBorders>
-            <w:shd w:fill="2A7A6E" w:val="clear"/>
+            <w:shd w:fill="7A474D" w:val="clear"/>
             <w:tcMar>
               <w:top w:type="dxa" w:w="40"/>
               <w:left w:type="dxa" w:w="110"/>
@@ -37089,7 +37478,7 @@
               <w:bottom w:val="single" w:color="CFE3DF" w:sz="4"/>
               <w:right w:val="single" w:color="CFE3DF" w:sz="4"/>
             </w:tcBorders>
-            <w:shd w:fill="2A7A6E" w:val="clear"/>
+            <w:shd w:fill="7A474D" w:val="clear"/>
             <w:tcMar>
               <w:top w:type="dxa" w:w="40"/>
               <w:left w:type="dxa" w:w="110"/>
@@ -37193,7 +37582,7 @@
               <w:bottom w:val="single" w:color="CFE3DF" w:sz="4"/>
               <w:right w:val="single" w:color="CFE3DF" w:sz="4"/>
             </w:tcBorders>
-            <w:shd w:fill="2A7A6E" w:val="clear"/>
+            <w:shd w:fill="7A474D" w:val="clear"/>
             <w:tcMar>
               <w:top w:type="dxa" w:w="40"/>
               <w:left w:type="dxa" w:w="110"/>
@@ -37226,7 +37615,7 @@
               <w:bottom w:val="single" w:color="CFE3DF" w:sz="4"/>
               <w:right w:val="single" w:color="CFE3DF" w:sz="4"/>
             </w:tcBorders>
-            <w:shd w:fill="2A7A6E" w:val="clear"/>
+            <w:shd w:fill="7A474D" w:val="clear"/>
             <w:tcMar>
               <w:top w:type="dxa" w:w="40"/>
               <w:left w:type="dxa" w:w="110"/>
@@ -37259,7 +37648,7 @@
               <w:bottom w:val="single" w:color="CFE3DF" w:sz="4"/>
               <w:right w:val="single" w:color="CFE3DF" w:sz="4"/>
             </w:tcBorders>
-            <w:shd w:fill="2A7A6E" w:val="clear"/>
+            <w:shd w:fill="7A474D" w:val="clear"/>
             <w:tcMar>
               <w:top w:type="dxa" w:w="40"/>
               <w:left w:type="dxa" w:w="110"/>
@@ -37836,7 +38225,7 @@
       <w:rFonts w:ascii="Arial" w:cs="Arial" w:eastAsia="Arial" w:hAnsi="Arial"/>
       <w:b/>
       <w:bCs/>
-      <w:color w:val="1E5C53"/>
+      <w:color w:val="2D2D2D"/>
       <w:sz w:val="23"/>
       <w:szCs w:val="23"/>
     </w:rPr>

</xml_diff>

<commit_message>
Workbook: give every week its own distinct color
Replace the website-mirrored 8-theme cycle with a generated per-week color:
hue stepped by the golden angle (~137.5 deg) so consecutive weeks land far
apart on the wheel (never a near-duplicate close in time), muted saturation,
and lightness auto-darkened until white text clears 4.5:1 contrast. The same
deep tone fills each week's banner + box headers and colors its lesson title.
All 52 weeks are now visually distinct. (Note: this no longer matches the
website's 8 lesson colors -- 8 colors can't make 52 weeks distinct.)

Co-Authored-By: Claude Opus 4.8 (1M context) <noreply@anthropic.com>
</commit_message>
<xml_diff>
--- a/.local-workbook/The Compassion Course 2026-2027 Workbook.docx
+++ b/.local-workbook/The Compassion Course 2026-2027 Workbook.docx
@@ -527,7 +527,7 @@
       <w:pPr>
         <w:pStyle w:val="Heading1"/>
         <w:pageBreakBefore/>
-        <w:shd w:fill="1F5C52" w:val="clear"/>
+        <w:shd w:fill="35827B" w:val="clear"/>
         <w:spacing w:after="40" w:before="0"/>
       </w:pPr>
       <w:r>
@@ -544,7 +544,7 @@
           <w:rFonts w:ascii="Georgia" w:cs="Georgia" w:eastAsia="Georgia" w:hAnsi="Georgia"/>
           <w:i/>
           <w:iCs/>
-          <w:color w:val="1F5C52"/>
+          <w:color w:val="35827B"/>
           <w:sz w:val="28"/>
           <w:szCs w:val="28"/>
         </w:rPr>
@@ -606,7 +606,7 @@
               <w:bottom w:val="single" w:color="CFE3DF" w:sz="4"/>
               <w:right w:val="single" w:color="CFE3DF" w:sz="4"/>
             </w:tcBorders>
-            <w:shd w:fill="1F5C52" w:val="clear"/>
+            <w:shd w:fill="35827B" w:val="clear"/>
             <w:tcMar>
               <w:top w:type="dxa" w:w="40"/>
               <w:left w:type="dxa" w:w="110"/>
@@ -724,7 +724,7 @@
               <w:bottom w:val="single" w:color="CFE3DF" w:sz="4"/>
               <w:right w:val="single" w:color="CFE3DF" w:sz="4"/>
             </w:tcBorders>
-            <w:shd w:fill="1F5C52" w:val="clear"/>
+            <w:shd w:fill="35827B" w:val="clear"/>
             <w:tcMar>
               <w:top w:type="dxa" w:w="40"/>
               <w:left w:type="dxa" w:w="110"/>
@@ -858,7 +858,7 @@
               <w:bottom w:val="single" w:color="CFE3DF" w:sz="4"/>
               <w:right w:val="single" w:color="CFE3DF" w:sz="4"/>
             </w:tcBorders>
-            <w:shd w:fill="1F5C52" w:val="clear"/>
+            <w:shd w:fill="35827B" w:val="clear"/>
             <w:tcMar>
               <w:top w:type="dxa" w:w="40"/>
               <w:left w:type="dxa" w:w="110"/>
@@ -992,7 +992,7 @@
               <w:bottom w:val="single" w:color="CFE3DF" w:sz="4"/>
               <w:right w:val="single" w:color="CFE3DF" w:sz="4"/>
             </w:tcBorders>
-            <w:shd w:fill="1F5C52" w:val="clear"/>
+            <w:shd w:fill="35827B" w:val="clear"/>
             <w:tcMar>
               <w:top w:type="dxa" w:w="40"/>
               <w:left w:type="dxa" w:w="110"/>
@@ -1096,7 +1096,7 @@
               <w:bottom w:val="single" w:color="CFE3DF" w:sz="4"/>
               <w:right w:val="single" w:color="CFE3DF" w:sz="4"/>
             </w:tcBorders>
-            <w:shd w:fill="1F5C52" w:val="clear"/>
+            <w:shd w:fill="35827B" w:val="clear"/>
             <w:tcMar>
               <w:top w:type="dxa" w:w="40"/>
               <w:left w:type="dxa" w:w="110"/>
@@ -1129,7 +1129,7 @@
               <w:bottom w:val="single" w:color="CFE3DF" w:sz="4"/>
               <w:right w:val="single" w:color="CFE3DF" w:sz="4"/>
             </w:tcBorders>
-            <w:shd w:fill="1F5C52" w:val="clear"/>
+            <w:shd w:fill="35827B" w:val="clear"/>
             <w:tcMar>
               <w:top w:type="dxa" w:w="40"/>
               <w:left w:type="dxa" w:w="110"/>
@@ -1162,7 +1162,7 @@
               <w:bottom w:val="single" w:color="CFE3DF" w:sz="4"/>
               <w:right w:val="single" w:color="CFE3DF" w:sz="4"/>
             </w:tcBorders>
-            <w:shd w:fill="1F5C52" w:val="clear"/>
+            <w:shd w:fill="35827B" w:val="clear"/>
             <w:tcMar>
               <w:top w:type="dxa" w:w="40"/>
               <w:left w:type="dxa" w:w="110"/>
@@ -1291,7 +1291,7 @@
       <w:pPr>
         <w:pStyle w:val="Heading1"/>
         <w:pageBreakBefore/>
-        <w:shd w:fill="7A4F1D" w:val="clear"/>
+        <w:shd w:fill="913B80" w:val="clear"/>
         <w:spacing w:after="40" w:before="0"/>
       </w:pPr>
       <w:r>
@@ -1308,7 +1308,7 @@
           <w:rFonts w:ascii="Georgia" w:cs="Georgia" w:eastAsia="Georgia" w:hAnsi="Georgia"/>
           <w:i/>
           <w:iCs/>
-          <w:color w:val="7A4F1D"/>
+          <w:color w:val="913B80"/>
           <w:sz w:val="28"/>
           <w:szCs w:val="28"/>
         </w:rPr>
@@ -1370,7 +1370,7 @@
               <w:bottom w:val="single" w:color="CFE3DF" w:sz="4"/>
               <w:right w:val="single" w:color="CFE3DF" w:sz="4"/>
             </w:tcBorders>
-            <w:shd w:fill="7A4F1D" w:val="clear"/>
+            <w:shd w:fill="913B80" w:val="clear"/>
             <w:tcMar>
               <w:top w:type="dxa" w:w="40"/>
               <w:left w:type="dxa" w:w="110"/>
@@ -1488,7 +1488,7 @@
               <w:bottom w:val="single" w:color="CFE3DF" w:sz="4"/>
               <w:right w:val="single" w:color="CFE3DF" w:sz="4"/>
             </w:tcBorders>
-            <w:shd w:fill="7A4F1D" w:val="clear"/>
+            <w:shd w:fill="913B80" w:val="clear"/>
             <w:tcMar>
               <w:top w:type="dxa" w:w="40"/>
               <w:left w:type="dxa" w:w="110"/>
@@ -1606,7 +1606,7 @@
               <w:bottom w:val="single" w:color="CFE3DF" w:sz="4"/>
               <w:right w:val="single" w:color="CFE3DF" w:sz="4"/>
             </w:tcBorders>
-            <w:shd w:fill="7A4F1D" w:val="clear"/>
+            <w:shd w:fill="913B80" w:val="clear"/>
             <w:tcMar>
               <w:top w:type="dxa" w:w="40"/>
               <w:left w:type="dxa" w:w="110"/>
@@ -1710,7 +1710,7 @@
               <w:bottom w:val="single" w:color="CFE3DF" w:sz="4"/>
               <w:right w:val="single" w:color="CFE3DF" w:sz="4"/>
             </w:tcBorders>
-            <w:shd w:fill="7A4F1D" w:val="clear"/>
+            <w:shd w:fill="913B80" w:val="clear"/>
             <w:tcMar>
               <w:top w:type="dxa" w:w="40"/>
               <w:left w:type="dxa" w:w="110"/>
@@ -1743,7 +1743,7 @@
               <w:bottom w:val="single" w:color="CFE3DF" w:sz="4"/>
               <w:right w:val="single" w:color="CFE3DF" w:sz="4"/>
             </w:tcBorders>
-            <w:shd w:fill="7A4F1D" w:val="clear"/>
+            <w:shd w:fill="913B80" w:val="clear"/>
             <w:tcMar>
               <w:top w:type="dxa" w:w="40"/>
               <w:left w:type="dxa" w:w="110"/>
@@ -1776,7 +1776,7 @@
               <w:bottom w:val="single" w:color="CFE3DF" w:sz="4"/>
               <w:right w:val="single" w:color="CFE3DF" w:sz="4"/>
             </w:tcBorders>
-            <w:shd w:fill="7A4F1D" w:val="clear"/>
+            <w:shd w:fill="913B80" w:val="clear"/>
             <w:tcMar>
               <w:top w:type="dxa" w:w="40"/>
               <w:left w:type="dxa" w:w="110"/>
@@ -1905,7 +1905,7 @@
       <w:pPr>
         <w:pStyle w:val="Heading1"/>
         <w:pageBreakBefore/>
-        <w:shd w:fill="324D61" w:val="clear"/>
+        <w:shd w:fill="587B32" w:val="clear"/>
         <w:spacing w:after="40" w:before="0"/>
       </w:pPr>
       <w:r>
@@ -1922,7 +1922,7 @@
           <w:rFonts w:ascii="Georgia" w:cs="Georgia" w:eastAsia="Georgia" w:hAnsi="Georgia"/>
           <w:i/>
           <w:iCs/>
-          <w:color w:val="324D61"/>
+          <w:color w:val="587B32"/>
           <w:sz w:val="28"/>
           <w:szCs w:val="28"/>
         </w:rPr>
@@ -2052,7 +2052,7 @@
               <w:bottom w:val="single" w:color="CFE3DF" w:sz="4"/>
               <w:right w:val="single" w:color="CFE3DF" w:sz="4"/>
             </w:tcBorders>
-            <w:shd w:fill="324D61" w:val="clear"/>
+            <w:shd w:fill="587B32" w:val="clear"/>
             <w:tcMar>
               <w:top w:type="dxa" w:w="40"/>
               <w:left w:type="dxa" w:w="110"/>
@@ -2222,7 +2222,7 @@
               <w:bottom w:val="single" w:color="CFE3DF" w:sz="4"/>
               <w:right w:val="single" w:color="CFE3DF" w:sz="4"/>
             </w:tcBorders>
-            <w:shd w:fill="324D61" w:val="clear"/>
+            <w:shd w:fill="587B32" w:val="clear"/>
             <w:tcMar>
               <w:top w:type="dxa" w:w="40"/>
               <w:left w:type="dxa" w:w="110"/>
@@ -2326,7 +2326,7 @@
               <w:bottom w:val="single" w:color="CFE3DF" w:sz="4"/>
               <w:right w:val="single" w:color="CFE3DF" w:sz="4"/>
             </w:tcBorders>
-            <w:shd w:fill="324D61" w:val="clear"/>
+            <w:shd w:fill="587B32" w:val="clear"/>
             <w:tcMar>
               <w:top w:type="dxa" w:w="40"/>
               <w:left w:type="dxa" w:w="110"/>
@@ -2359,7 +2359,7 @@
               <w:bottom w:val="single" w:color="CFE3DF" w:sz="4"/>
               <w:right w:val="single" w:color="CFE3DF" w:sz="4"/>
             </w:tcBorders>
-            <w:shd w:fill="324D61" w:val="clear"/>
+            <w:shd w:fill="587B32" w:val="clear"/>
             <w:tcMar>
               <w:top w:type="dxa" w:w="40"/>
               <w:left w:type="dxa" w:w="110"/>
@@ -2392,7 +2392,7 @@
               <w:bottom w:val="single" w:color="CFE3DF" w:sz="4"/>
               <w:right w:val="single" w:color="CFE3DF" w:sz="4"/>
             </w:tcBorders>
-            <w:shd w:fill="324D61" w:val="clear"/>
+            <w:shd w:fill="587B32" w:val="clear"/>
             <w:tcMar>
               <w:top w:type="dxa" w:w="40"/>
               <w:left w:type="dxa" w:w="110"/>
@@ -2521,7 +2521,7 @@
       <w:pPr>
         <w:pStyle w:val="Heading1"/>
         <w:pageBreakBefore/>
-        <w:shd w:fill="7A474D" w:val="clear"/>
+        <w:shd w:fill="3B4E91" w:val="clear"/>
         <w:spacing w:after="40" w:before="0"/>
       </w:pPr>
       <w:r>
@@ -2538,7 +2538,7 @@
           <w:rFonts w:ascii="Georgia" w:cs="Georgia" w:eastAsia="Georgia" w:hAnsi="Georgia"/>
           <w:i/>
           <w:iCs/>
-          <w:color w:val="7A474D"/>
+          <w:color w:val="3B4E91"/>
           <w:sz w:val="28"/>
           <w:szCs w:val="28"/>
         </w:rPr>
@@ -2600,7 +2600,7 @@
               <w:bottom w:val="single" w:color="CFE3DF" w:sz="4"/>
               <w:right w:val="single" w:color="CFE3DF" w:sz="4"/>
             </w:tcBorders>
-            <w:shd w:fill="7A474D" w:val="clear"/>
+            <w:shd w:fill="3B4E91" w:val="clear"/>
             <w:tcMar>
               <w:top w:type="dxa" w:w="40"/>
               <w:left w:type="dxa" w:w="110"/>
@@ -2734,7 +2734,7 @@
               <w:bottom w:val="single" w:color="CFE3DF" w:sz="4"/>
               <w:right w:val="single" w:color="CFE3DF" w:sz="4"/>
             </w:tcBorders>
-            <w:shd w:fill="7A474D" w:val="clear"/>
+            <w:shd w:fill="3B4E91" w:val="clear"/>
             <w:tcMar>
               <w:top w:type="dxa" w:w="40"/>
               <w:left w:type="dxa" w:w="110"/>
@@ -2852,7 +2852,7 @@
               <w:bottom w:val="single" w:color="CFE3DF" w:sz="4"/>
               <w:right w:val="single" w:color="CFE3DF" w:sz="4"/>
             </w:tcBorders>
-            <w:shd w:fill="7A474D" w:val="clear"/>
+            <w:shd w:fill="3B4E91" w:val="clear"/>
             <w:tcMar>
               <w:top w:type="dxa" w:w="40"/>
               <w:left w:type="dxa" w:w="110"/>
@@ -2970,7 +2970,7 @@
               <w:bottom w:val="single" w:color="CFE3DF" w:sz="4"/>
               <w:right w:val="single" w:color="CFE3DF" w:sz="4"/>
             </w:tcBorders>
-            <w:shd w:fill="7A474D" w:val="clear"/>
+            <w:shd w:fill="3B4E91" w:val="clear"/>
             <w:tcMar>
               <w:top w:type="dxa" w:w="40"/>
               <w:left w:type="dxa" w:w="110"/>
@@ -3074,7 +3074,7 @@
               <w:bottom w:val="single" w:color="CFE3DF" w:sz="4"/>
               <w:right w:val="single" w:color="CFE3DF" w:sz="4"/>
             </w:tcBorders>
-            <w:shd w:fill="7A474D" w:val="clear"/>
+            <w:shd w:fill="3B4E91" w:val="clear"/>
             <w:tcMar>
               <w:top w:type="dxa" w:w="40"/>
               <w:left w:type="dxa" w:w="110"/>
@@ -3107,7 +3107,7 @@
               <w:bottom w:val="single" w:color="CFE3DF" w:sz="4"/>
               <w:right w:val="single" w:color="CFE3DF" w:sz="4"/>
             </w:tcBorders>
-            <w:shd w:fill="7A474D" w:val="clear"/>
+            <w:shd w:fill="3B4E91" w:val="clear"/>
             <w:tcMar>
               <w:top w:type="dxa" w:w="40"/>
               <w:left w:type="dxa" w:w="110"/>
@@ -3140,7 +3140,7 @@
               <w:bottom w:val="single" w:color="CFE3DF" w:sz="4"/>
               <w:right w:val="single" w:color="CFE3DF" w:sz="4"/>
             </w:tcBorders>
-            <w:shd w:fill="7A474D" w:val="clear"/>
+            <w:shd w:fill="3B4E91" w:val="clear"/>
             <w:tcMar>
               <w:top w:type="dxa" w:w="40"/>
               <w:left w:type="dxa" w:w="110"/>
@@ -3269,7 +3269,7 @@
       <w:pPr>
         <w:pStyle w:val="Heading1"/>
         <w:pageBreakBefore/>
-        <w:shd w:fill="2C4D35" w:val="clear"/>
+        <w:shd w:fill="91413B" w:val="clear"/>
         <w:spacing w:after="40" w:before="0"/>
       </w:pPr>
       <w:r>
@@ -3286,7 +3286,7 @@
           <w:rFonts w:ascii="Georgia" w:cs="Georgia" w:eastAsia="Georgia" w:hAnsi="Georgia"/>
           <w:i/>
           <w:iCs/>
-          <w:color w:val="2C4D35"/>
+          <w:color w:val="91413B"/>
           <w:sz w:val="28"/>
           <w:szCs w:val="28"/>
         </w:rPr>
@@ -3348,7 +3348,7 @@
               <w:bottom w:val="single" w:color="CFE3DF" w:sz="4"/>
               <w:right w:val="single" w:color="CFE3DF" w:sz="4"/>
             </w:tcBorders>
-            <w:shd w:fill="2C4D35" w:val="clear"/>
+            <w:shd w:fill="91413B" w:val="clear"/>
             <w:tcMar>
               <w:top w:type="dxa" w:w="40"/>
               <w:left w:type="dxa" w:w="110"/>
@@ -3610,7 +3610,7 @@
               <w:bottom w:val="single" w:color="CFE3DF" w:sz="4"/>
               <w:right w:val="single" w:color="CFE3DF" w:sz="4"/>
             </w:tcBorders>
-            <w:shd w:fill="2C4D35" w:val="clear"/>
+            <w:shd w:fill="91413B" w:val="clear"/>
             <w:tcMar>
               <w:top w:type="dxa" w:w="40"/>
               <w:left w:type="dxa" w:w="110"/>
@@ -3714,7 +3714,7 @@
               <w:bottom w:val="single" w:color="CFE3DF" w:sz="4"/>
               <w:right w:val="single" w:color="CFE3DF" w:sz="4"/>
             </w:tcBorders>
-            <w:shd w:fill="2C4D35" w:val="clear"/>
+            <w:shd w:fill="91413B" w:val="clear"/>
             <w:tcMar>
               <w:top w:type="dxa" w:w="40"/>
               <w:left w:type="dxa" w:w="110"/>
@@ -3747,7 +3747,7 @@
               <w:bottom w:val="single" w:color="CFE3DF" w:sz="4"/>
               <w:right w:val="single" w:color="CFE3DF" w:sz="4"/>
             </w:tcBorders>
-            <w:shd w:fill="2C4D35" w:val="clear"/>
+            <w:shd w:fill="91413B" w:val="clear"/>
             <w:tcMar>
               <w:top w:type="dxa" w:w="40"/>
               <w:left w:type="dxa" w:w="110"/>
@@ -3780,7 +3780,7 @@
               <w:bottom w:val="single" w:color="CFE3DF" w:sz="4"/>
               <w:right w:val="single" w:color="CFE3DF" w:sz="4"/>
             </w:tcBorders>
-            <w:shd w:fill="2C4D35" w:val="clear"/>
+            <w:shd w:fill="91413B" w:val="clear"/>
             <w:tcMar>
               <w:top w:type="dxa" w:w="40"/>
               <w:left w:type="dxa" w:w="110"/>
@@ -3909,7 +3909,7 @@
       <w:pPr>
         <w:pStyle w:val="Heading1"/>
         <w:pageBreakBefore/>
-        <w:shd w:fill="724026" w:val="clear"/>
+        <w:shd w:fill="358251" w:val="clear"/>
         <w:spacing w:after="40" w:before="0"/>
       </w:pPr>
       <w:r>
@@ -3926,7 +3926,7 @@
           <w:rFonts w:ascii="Georgia" w:cs="Georgia" w:eastAsia="Georgia" w:hAnsi="Georgia"/>
           <w:i/>
           <w:iCs/>
-          <w:color w:val="724026"/>
+          <w:color w:val="358251"/>
           <w:sz w:val="28"/>
           <w:szCs w:val="28"/>
         </w:rPr>
@@ -4002,7 +4002,7 @@
             </w:pPr>
             <w:r>
               <w:rPr>
-                <w:color w:val="724026"/>
+                <w:color w:val="358251"/>
                 <w:sz w:val="18"/>
                 <w:szCs w:val="18"/>
               </w:rPr>
@@ -4116,7 +4116,7 @@
               <w:bottom w:val="single" w:color="CFE3DF" w:sz="4"/>
               <w:right w:val="single" w:color="CFE3DF" w:sz="4"/>
             </w:tcBorders>
-            <w:shd w:fill="724026" w:val="clear"/>
+            <w:shd w:fill="358251" w:val="clear"/>
             <w:tcMar>
               <w:top w:type="dxa" w:w="40"/>
               <w:left w:type="dxa" w:w="110"/>
@@ -4294,7 +4294,7 @@
               <w:bottom w:val="single" w:color="CFE3DF" w:sz="4"/>
               <w:right w:val="single" w:color="CFE3DF" w:sz="4"/>
             </w:tcBorders>
-            <w:shd w:fill="724026" w:val="clear"/>
+            <w:shd w:fill="358251" w:val="clear"/>
             <w:tcMar>
               <w:top w:type="dxa" w:w="40"/>
               <w:left w:type="dxa" w:w="110"/>
@@ -4472,7 +4472,7 @@
               <w:bottom w:val="single" w:color="CFE3DF" w:sz="4"/>
               <w:right w:val="single" w:color="CFE3DF" w:sz="4"/>
             </w:tcBorders>
-            <w:shd w:fill="724026" w:val="clear"/>
+            <w:shd w:fill="358251" w:val="clear"/>
             <w:tcMar>
               <w:top w:type="dxa" w:w="40"/>
               <w:left w:type="dxa" w:w="110"/>
@@ -4790,7 +4790,7 @@
               <w:bottom w:val="single" w:color="CFE3DF" w:sz="4"/>
               <w:right w:val="single" w:color="CFE3DF" w:sz="4"/>
             </w:tcBorders>
-            <w:shd w:fill="724026" w:val="clear"/>
+            <w:shd w:fill="358251" w:val="clear"/>
             <w:tcMar>
               <w:top w:type="dxa" w:w="40"/>
               <w:left w:type="dxa" w:w="110"/>
@@ -4894,7 +4894,7 @@
               <w:bottom w:val="single" w:color="CFE3DF" w:sz="4"/>
               <w:right w:val="single" w:color="CFE3DF" w:sz="4"/>
             </w:tcBorders>
-            <w:shd w:fill="724026" w:val="clear"/>
+            <w:shd w:fill="358251" w:val="clear"/>
             <w:tcMar>
               <w:top w:type="dxa" w:w="40"/>
               <w:left w:type="dxa" w:w="110"/>
@@ -4927,7 +4927,7 @@
               <w:bottom w:val="single" w:color="CFE3DF" w:sz="4"/>
               <w:right w:val="single" w:color="CFE3DF" w:sz="4"/>
             </w:tcBorders>
-            <w:shd w:fill="724026" w:val="clear"/>
+            <w:shd w:fill="358251" w:val="clear"/>
             <w:tcMar>
               <w:top w:type="dxa" w:w="40"/>
               <w:left w:type="dxa" w:w="110"/>
@@ -4960,7 +4960,7 @@
               <w:bottom w:val="single" w:color="CFE3DF" w:sz="4"/>
               <w:right w:val="single" w:color="CFE3DF" w:sz="4"/>
             </w:tcBorders>
-            <w:shd w:fill="724026" w:val="clear"/>
+            <w:shd w:fill="358251" w:val="clear"/>
             <w:tcMar>
               <w:top w:type="dxa" w:w="40"/>
               <w:left w:type="dxa" w:w="110"/>
@@ -5089,7 +5089,7 @@
       <w:pPr>
         <w:pStyle w:val="Heading1"/>
         <w:pageBreakBefore/>
-        <w:shd w:fill="7A5F2C" w:val="clear"/>
+        <w:shd w:fill="733B91" w:val="clear"/>
         <w:spacing w:after="40" w:before="0"/>
       </w:pPr>
       <w:r>
@@ -5106,7 +5106,7 @@
           <w:rFonts w:ascii="Georgia" w:cs="Georgia" w:eastAsia="Georgia" w:hAnsi="Georgia"/>
           <w:i/>
           <w:iCs/>
-          <w:color w:val="7A5F2C"/>
+          <w:color w:val="733B91"/>
           <w:sz w:val="28"/>
           <w:szCs w:val="28"/>
         </w:rPr>
@@ -5200,7 +5200,7 @@
               <w:bottom w:val="single" w:color="CFE3DF" w:sz="4"/>
               <w:right w:val="single" w:color="CFE3DF" w:sz="4"/>
             </w:tcBorders>
-            <w:shd w:fill="7A5F2C" w:val="clear"/>
+            <w:shd w:fill="733B91" w:val="clear"/>
             <w:tcMar>
               <w:top w:type="dxa" w:w="40"/>
               <w:left w:type="dxa" w:w="110"/>
@@ -5406,7 +5406,7 @@
               <w:bottom w:val="single" w:color="CFE3DF" w:sz="4"/>
               <w:right w:val="single" w:color="CFE3DF" w:sz="4"/>
             </w:tcBorders>
-            <w:shd w:fill="7A5F2C" w:val="clear"/>
+            <w:shd w:fill="733B91" w:val="clear"/>
             <w:tcMar>
               <w:top w:type="dxa" w:w="40"/>
               <w:left w:type="dxa" w:w="110"/>
@@ -5510,7 +5510,7 @@
               <w:bottom w:val="single" w:color="CFE3DF" w:sz="4"/>
               <w:right w:val="single" w:color="CFE3DF" w:sz="4"/>
             </w:tcBorders>
-            <w:shd w:fill="7A5F2C" w:val="clear"/>
+            <w:shd w:fill="733B91" w:val="clear"/>
             <w:tcMar>
               <w:top w:type="dxa" w:w="40"/>
               <w:left w:type="dxa" w:w="110"/>
@@ -5543,7 +5543,7 @@
               <w:bottom w:val="single" w:color="CFE3DF" w:sz="4"/>
               <w:right w:val="single" w:color="CFE3DF" w:sz="4"/>
             </w:tcBorders>
-            <w:shd w:fill="7A5F2C" w:val="clear"/>
+            <w:shd w:fill="733B91" w:val="clear"/>
             <w:tcMar>
               <w:top w:type="dxa" w:w="40"/>
               <w:left w:type="dxa" w:w="110"/>
@@ -5576,7 +5576,7 @@
               <w:bottom w:val="single" w:color="CFE3DF" w:sz="4"/>
               <w:right w:val="single" w:color="CFE3DF" w:sz="4"/>
             </w:tcBorders>
-            <w:shd w:fill="7A5F2C" w:val="clear"/>
+            <w:shd w:fill="733B91" w:val="clear"/>
             <w:tcMar>
               <w:top w:type="dxa" w:w="40"/>
               <w:left w:type="dxa" w:w="110"/>
@@ -5705,7 +5705,7 @@
       <w:pPr>
         <w:pStyle w:val="Heading1"/>
         <w:pageBreakBefore/>
-        <w:shd w:fill="4F3252" w:val="clear"/>
+        <w:shd w:fill="7B7732" w:val="clear"/>
         <w:spacing w:after="40" w:before="0"/>
       </w:pPr>
       <w:r>
@@ -5722,7 +5722,7 @@
           <w:rFonts w:ascii="Georgia" w:cs="Georgia" w:eastAsia="Georgia" w:hAnsi="Georgia"/>
           <w:i/>
           <w:iCs/>
-          <w:color w:val="4F3252"/>
+          <w:color w:val="7B7732"/>
           <w:sz w:val="28"/>
           <w:szCs w:val="28"/>
         </w:rPr>
@@ -5896,7 +5896,7 @@
               <w:bottom w:val="single" w:color="CFE3DF" w:sz="4"/>
               <w:right w:val="single" w:color="CFE3DF" w:sz="4"/>
             </w:tcBorders>
-            <w:shd w:fill="4F3252" w:val="clear"/>
+            <w:shd w:fill="7B7732" w:val="clear"/>
             <w:tcMar>
               <w:top w:type="dxa" w:w="40"/>
               <w:left w:type="dxa" w:w="110"/>
@@ -6000,7 +6000,7 @@
               <w:bottom w:val="single" w:color="CFE3DF" w:sz="4"/>
               <w:right w:val="single" w:color="CFE3DF" w:sz="4"/>
             </w:tcBorders>
-            <w:shd w:fill="4F3252" w:val="clear"/>
+            <w:shd w:fill="7B7732" w:val="clear"/>
             <w:tcMar>
               <w:top w:type="dxa" w:w="40"/>
               <w:left w:type="dxa" w:w="110"/>
@@ -6033,7 +6033,7 @@
               <w:bottom w:val="single" w:color="CFE3DF" w:sz="4"/>
               <w:right w:val="single" w:color="CFE3DF" w:sz="4"/>
             </w:tcBorders>
-            <w:shd w:fill="4F3252" w:val="clear"/>
+            <w:shd w:fill="7B7732" w:val="clear"/>
             <w:tcMar>
               <w:top w:type="dxa" w:w="40"/>
               <w:left w:type="dxa" w:w="110"/>
@@ -6066,7 +6066,7 @@
               <w:bottom w:val="single" w:color="CFE3DF" w:sz="4"/>
               <w:right w:val="single" w:color="CFE3DF" w:sz="4"/>
             </w:tcBorders>
-            <w:shd w:fill="4F3252" w:val="clear"/>
+            <w:shd w:fill="7B7732" w:val="clear"/>
             <w:tcMar>
               <w:top w:type="dxa" w:w="40"/>
               <w:left w:type="dxa" w:w="110"/>
@@ -6195,7 +6195,7 @@
       <w:pPr>
         <w:pStyle w:val="Heading1"/>
         <w:pageBreakBefore/>
-        <w:shd w:fill="1F5C52" w:val="clear"/>
+        <w:shd w:fill="3B7D91" w:val="clear"/>
         <w:spacing w:after="40" w:before="0"/>
       </w:pPr>
       <w:r>
@@ -6212,7 +6212,7 @@
           <w:rFonts w:ascii="Georgia" w:cs="Georgia" w:eastAsia="Georgia" w:hAnsi="Georgia"/>
           <w:i/>
           <w:iCs/>
-          <w:color w:val="1F5C52"/>
+          <w:color w:val="3B7D91"/>
           <w:sz w:val="28"/>
           <w:szCs w:val="28"/>
         </w:rPr>
@@ -6450,7 +6450,7 @@
               <w:bottom w:val="single" w:color="CFE3DF" w:sz="4"/>
               <w:right w:val="single" w:color="CFE3DF" w:sz="4"/>
             </w:tcBorders>
-            <w:shd w:fill="1F5C52" w:val="clear"/>
+            <w:shd w:fill="3B7D91" w:val="clear"/>
             <w:tcMar>
               <w:top w:type="dxa" w:w="40"/>
               <w:left w:type="dxa" w:w="110"/>
@@ -6600,7 +6600,7 @@
               <w:bottom w:val="single" w:color="CFE3DF" w:sz="4"/>
               <w:right w:val="single" w:color="CFE3DF" w:sz="4"/>
             </w:tcBorders>
-            <w:shd w:fill="1F5C52" w:val="clear"/>
+            <w:shd w:fill="3B7D91" w:val="clear"/>
             <w:tcMar>
               <w:top w:type="dxa" w:w="40"/>
               <w:left w:type="dxa" w:w="110"/>
@@ -6704,7 +6704,7 @@
               <w:bottom w:val="single" w:color="CFE3DF" w:sz="4"/>
               <w:right w:val="single" w:color="CFE3DF" w:sz="4"/>
             </w:tcBorders>
-            <w:shd w:fill="1F5C52" w:val="clear"/>
+            <w:shd w:fill="3B7D91" w:val="clear"/>
             <w:tcMar>
               <w:top w:type="dxa" w:w="40"/>
               <w:left w:type="dxa" w:w="110"/>
@@ -6737,7 +6737,7 @@
               <w:bottom w:val="single" w:color="CFE3DF" w:sz="4"/>
               <w:right w:val="single" w:color="CFE3DF" w:sz="4"/>
             </w:tcBorders>
-            <w:shd w:fill="1F5C52" w:val="clear"/>
+            <w:shd w:fill="3B7D91" w:val="clear"/>
             <w:tcMar>
               <w:top w:type="dxa" w:w="40"/>
               <w:left w:type="dxa" w:w="110"/>
@@ -6770,7 +6770,7 @@
               <w:bottom w:val="single" w:color="CFE3DF" w:sz="4"/>
               <w:right w:val="single" w:color="CFE3DF" w:sz="4"/>
             </w:tcBorders>
-            <w:shd w:fill="1F5C52" w:val="clear"/>
+            <w:shd w:fill="3B7D91" w:val="clear"/>
             <w:tcMar>
               <w:top w:type="dxa" w:w="40"/>
               <w:left w:type="dxa" w:w="110"/>
@@ -6899,7 +6899,7 @@
       <w:pPr>
         <w:pStyle w:val="Heading1"/>
         <w:pageBreakBefore/>
-        <w:shd w:fill="7A4F1D" w:val="clear"/>
+        <w:shd w:fill="913B64" w:val="clear"/>
         <w:spacing w:after="40" w:before="0"/>
       </w:pPr>
       <w:r>
@@ -6916,7 +6916,7 @@
           <w:rFonts w:ascii="Georgia" w:cs="Georgia" w:eastAsia="Georgia" w:hAnsi="Georgia"/>
           <w:i/>
           <w:iCs/>
-          <w:color w:val="7A4F1D"/>
+          <w:color w:val="913B64"/>
           <w:sz w:val="28"/>
           <w:szCs w:val="28"/>
         </w:rPr>
@@ -7018,7 +7018,7 @@
               <w:bottom w:val="single" w:color="CFE3DF" w:sz="4"/>
               <w:right w:val="single" w:color="CFE3DF" w:sz="4"/>
             </w:tcBorders>
-            <w:shd w:fill="7A4F1D" w:val="clear"/>
+            <w:shd w:fill="913B64" w:val="clear"/>
             <w:tcMar>
               <w:top w:type="dxa" w:w="40"/>
               <w:left w:type="dxa" w:w="110"/>
@@ -7370,7 +7370,7 @@
             </w:pPr>
             <w:r>
               <w:rPr>
-                <w:color w:val="7A4F1D"/>
+                <w:color w:val="913B64"/>
                 <w:sz w:val="18"/>
                 <w:szCs w:val="18"/>
               </w:rPr>
@@ -7477,7 +7477,7 @@
               <w:bottom w:val="single" w:color="CFE3DF" w:sz="4"/>
               <w:right w:val="single" w:color="CFE3DF" w:sz="4"/>
             </w:tcBorders>
-            <w:shd w:fill="7A4F1D" w:val="clear"/>
+            <w:shd w:fill="913B64" w:val="clear"/>
             <w:tcMar>
               <w:top w:type="dxa" w:w="40"/>
               <w:left w:type="dxa" w:w="110"/>
@@ -7581,7 +7581,7 @@
               <w:bottom w:val="single" w:color="CFE3DF" w:sz="4"/>
               <w:right w:val="single" w:color="CFE3DF" w:sz="4"/>
             </w:tcBorders>
-            <w:shd w:fill="7A4F1D" w:val="clear"/>
+            <w:shd w:fill="913B64" w:val="clear"/>
             <w:tcMar>
               <w:top w:type="dxa" w:w="40"/>
               <w:left w:type="dxa" w:w="110"/>
@@ -7614,7 +7614,7 @@
               <w:bottom w:val="single" w:color="CFE3DF" w:sz="4"/>
               <w:right w:val="single" w:color="CFE3DF" w:sz="4"/>
             </w:tcBorders>
-            <w:shd w:fill="7A4F1D" w:val="clear"/>
+            <w:shd w:fill="913B64" w:val="clear"/>
             <w:tcMar>
               <w:top w:type="dxa" w:w="40"/>
               <w:left w:type="dxa" w:w="110"/>
@@ -7647,7 +7647,7 @@
               <w:bottom w:val="single" w:color="CFE3DF" w:sz="4"/>
               <w:right w:val="single" w:color="CFE3DF" w:sz="4"/>
             </w:tcBorders>
-            <w:shd w:fill="7A4F1D" w:val="clear"/>
+            <w:shd w:fill="913B64" w:val="clear"/>
             <w:tcMar>
               <w:top w:type="dxa" w:w="40"/>
               <w:left w:type="dxa" w:w="110"/>
@@ -7776,7 +7776,7 @@
       <w:pPr>
         <w:pStyle w:val="Heading1"/>
         <w:pageBreakBefore/>
-        <w:shd w:fill="324D61" w:val="clear"/>
+        <w:shd w:fill="438235" w:val="clear"/>
         <w:spacing w:after="40" w:before="0"/>
       </w:pPr>
       <w:r>
@@ -7793,7 +7793,7 @@
           <w:rFonts w:ascii="Georgia" w:cs="Georgia" w:eastAsia="Georgia" w:hAnsi="Georgia"/>
           <w:i/>
           <w:iCs/>
-          <w:color w:val="324D61"/>
+          <w:color w:val="438235"/>
           <w:sz w:val="28"/>
           <w:szCs w:val="28"/>
         </w:rPr>
@@ -7855,7 +7855,7 @@
               <w:bottom w:val="single" w:color="CFE3DF" w:sz="4"/>
               <w:right w:val="single" w:color="CFE3DF" w:sz="4"/>
             </w:tcBorders>
-            <w:shd w:fill="324D61" w:val="clear"/>
+            <w:shd w:fill="438235" w:val="clear"/>
             <w:tcMar>
               <w:top w:type="dxa" w:w="40"/>
               <w:left w:type="dxa" w:w="110"/>
@@ -7973,7 +7973,7 @@
               <w:bottom w:val="single" w:color="CFE3DF" w:sz="4"/>
               <w:right w:val="single" w:color="CFE3DF" w:sz="4"/>
             </w:tcBorders>
-            <w:shd w:fill="324D61" w:val="clear"/>
+            <w:shd w:fill="438235" w:val="clear"/>
             <w:tcMar>
               <w:top w:type="dxa" w:w="40"/>
               <w:left w:type="dxa" w:w="110"/>
@@ -8091,7 +8091,7 @@
               <w:bottom w:val="single" w:color="CFE3DF" w:sz="4"/>
               <w:right w:val="single" w:color="CFE3DF" w:sz="4"/>
             </w:tcBorders>
-            <w:shd w:fill="324D61" w:val="clear"/>
+            <w:shd w:fill="438235" w:val="clear"/>
             <w:tcMar>
               <w:top w:type="dxa" w:w="40"/>
               <w:left w:type="dxa" w:w="110"/>
@@ -8219,7 +8219,7 @@
               <w:bottom w:val="single" w:color="CFE3DF" w:sz="4"/>
               <w:right w:val="single" w:color="CFE3DF" w:sz="4"/>
             </w:tcBorders>
-            <w:shd w:fill="324D61" w:val="clear"/>
+            <w:shd w:fill="438235" w:val="clear"/>
             <w:tcMar>
               <w:top w:type="dxa" w:w="40"/>
               <w:left w:type="dxa" w:w="110"/>
@@ -8323,7 +8323,7 @@
               <w:bottom w:val="single" w:color="CFE3DF" w:sz="4"/>
               <w:right w:val="single" w:color="CFE3DF" w:sz="4"/>
             </w:tcBorders>
-            <w:shd w:fill="324D61" w:val="clear"/>
+            <w:shd w:fill="438235" w:val="clear"/>
             <w:tcMar>
               <w:top w:type="dxa" w:w="40"/>
               <w:left w:type="dxa" w:w="110"/>
@@ -8356,7 +8356,7 @@
               <w:bottom w:val="single" w:color="CFE3DF" w:sz="4"/>
               <w:right w:val="single" w:color="CFE3DF" w:sz="4"/>
             </w:tcBorders>
-            <w:shd w:fill="324D61" w:val="clear"/>
+            <w:shd w:fill="438235" w:val="clear"/>
             <w:tcMar>
               <w:top w:type="dxa" w:w="40"/>
               <w:left w:type="dxa" w:w="110"/>
@@ -8389,7 +8389,7 @@
               <w:bottom w:val="single" w:color="CFE3DF" w:sz="4"/>
               <w:right w:val="single" w:color="CFE3DF" w:sz="4"/>
             </w:tcBorders>
-            <w:shd w:fill="324D61" w:val="clear"/>
+            <w:shd w:fill="438235" w:val="clear"/>
             <w:tcMar>
               <w:top w:type="dxa" w:w="40"/>
               <w:left w:type="dxa" w:w="110"/>
@@ -8518,7 +8518,7 @@
       <w:pPr>
         <w:pStyle w:val="Heading1"/>
         <w:pageBreakBefore/>
-        <w:shd w:fill="7A474D" w:val="clear"/>
+        <w:shd w:fill="453B91" w:val="clear"/>
         <w:spacing w:after="40" w:before="0"/>
       </w:pPr>
       <w:r>
@@ -8535,7 +8535,7 @@
           <w:rFonts w:ascii="Georgia" w:cs="Georgia" w:eastAsia="Georgia" w:hAnsi="Georgia"/>
           <w:i/>
           <w:iCs/>
-          <w:color w:val="7A474D"/>
+          <w:color w:val="453B91"/>
           <w:sz w:val="28"/>
           <w:szCs w:val="28"/>
         </w:rPr>
@@ -8749,7 +8749,7 @@
               <w:bottom w:val="single" w:color="CFE3DF" w:sz="4"/>
               <w:right w:val="single" w:color="CFE3DF" w:sz="4"/>
             </w:tcBorders>
-            <w:shd w:fill="7A474D" w:val="clear"/>
+            <w:shd w:fill="453B91" w:val="clear"/>
             <w:tcMar>
               <w:top w:type="dxa" w:w="40"/>
               <w:left w:type="dxa" w:w="110"/>
@@ -9035,7 +9035,7 @@
               <w:bottom w:val="single" w:color="CFE3DF" w:sz="4"/>
               <w:right w:val="single" w:color="CFE3DF" w:sz="4"/>
             </w:tcBorders>
-            <w:shd w:fill="7A474D" w:val="clear"/>
+            <w:shd w:fill="453B91" w:val="clear"/>
             <w:tcMar>
               <w:top w:type="dxa" w:w="40"/>
               <w:left w:type="dxa" w:w="110"/>
@@ -9139,7 +9139,7 @@
               <w:bottom w:val="single" w:color="CFE3DF" w:sz="4"/>
               <w:right w:val="single" w:color="CFE3DF" w:sz="4"/>
             </w:tcBorders>
-            <w:shd w:fill="7A474D" w:val="clear"/>
+            <w:shd w:fill="453B91" w:val="clear"/>
             <w:tcMar>
               <w:top w:type="dxa" w:w="40"/>
               <w:left w:type="dxa" w:w="110"/>
@@ -9172,7 +9172,7 @@
               <w:bottom w:val="single" w:color="CFE3DF" w:sz="4"/>
               <w:right w:val="single" w:color="CFE3DF" w:sz="4"/>
             </w:tcBorders>
-            <w:shd w:fill="7A474D" w:val="clear"/>
+            <w:shd w:fill="453B91" w:val="clear"/>
             <w:tcMar>
               <w:top w:type="dxa" w:w="40"/>
               <w:left w:type="dxa" w:w="110"/>
@@ -9205,7 +9205,7 @@
               <w:bottom w:val="single" w:color="CFE3DF" w:sz="4"/>
               <w:right w:val="single" w:color="CFE3DF" w:sz="4"/>
             </w:tcBorders>
-            <w:shd w:fill="7A474D" w:val="clear"/>
+            <w:shd w:fill="453B91" w:val="clear"/>
             <w:tcMar>
               <w:top w:type="dxa" w:w="40"/>
               <w:left w:type="dxa" w:w="110"/>
@@ -9334,7 +9334,7 @@
       <w:pPr>
         <w:pStyle w:val="Heading1"/>
         <w:pageBreakBefore/>
-        <w:shd w:fill="2C4D35" w:val="clear"/>
+        <w:shd w:fill="915E3B" w:val="clear"/>
         <w:spacing w:after="40" w:before="0"/>
       </w:pPr>
       <w:r>
@@ -9351,7 +9351,7 @@
           <w:rFonts w:ascii="Georgia" w:cs="Georgia" w:eastAsia="Georgia" w:hAnsi="Georgia"/>
           <w:i/>
           <w:iCs/>
-          <w:color w:val="2C4D35"/>
+          <w:color w:val="915E3B"/>
           <w:sz w:val="28"/>
           <w:szCs w:val="28"/>
         </w:rPr>
@@ -9413,7 +9413,7 @@
               <w:bottom w:val="single" w:color="CFE3DF" w:sz="4"/>
               <w:right w:val="single" w:color="CFE3DF" w:sz="4"/>
             </w:tcBorders>
-            <w:shd w:fill="2C4D35" w:val="clear"/>
+            <w:shd w:fill="915E3B" w:val="clear"/>
             <w:tcMar>
               <w:top w:type="dxa" w:w="40"/>
               <w:left w:type="dxa" w:w="110"/>
@@ -9623,7 +9623,7 @@
               <w:bottom w:val="single" w:color="CFE3DF" w:sz="4"/>
               <w:right w:val="single" w:color="CFE3DF" w:sz="4"/>
             </w:tcBorders>
-            <w:shd w:fill="2C4D35" w:val="clear"/>
+            <w:shd w:fill="915E3B" w:val="clear"/>
             <w:tcMar>
               <w:top w:type="dxa" w:w="40"/>
               <w:left w:type="dxa" w:w="110"/>
@@ -9781,7 +9781,7 @@
               <w:bottom w:val="single" w:color="CFE3DF" w:sz="4"/>
               <w:right w:val="single" w:color="CFE3DF" w:sz="4"/>
             </w:tcBorders>
-            <w:shd w:fill="2C4D35" w:val="clear"/>
+            <w:shd w:fill="915E3B" w:val="clear"/>
             <w:tcMar>
               <w:top w:type="dxa" w:w="40"/>
               <w:left w:type="dxa" w:w="110"/>
@@ -9885,7 +9885,7 @@
               <w:bottom w:val="single" w:color="CFE3DF" w:sz="4"/>
               <w:right w:val="single" w:color="CFE3DF" w:sz="4"/>
             </w:tcBorders>
-            <w:shd w:fill="2C4D35" w:val="clear"/>
+            <w:shd w:fill="915E3B" w:val="clear"/>
             <w:tcMar>
               <w:top w:type="dxa" w:w="40"/>
               <w:left w:type="dxa" w:w="110"/>
@@ -9918,7 +9918,7 @@
               <w:bottom w:val="single" w:color="CFE3DF" w:sz="4"/>
               <w:right w:val="single" w:color="CFE3DF" w:sz="4"/>
             </w:tcBorders>
-            <w:shd w:fill="2C4D35" w:val="clear"/>
+            <w:shd w:fill="915E3B" w:val="clear"/>
             <w:tcMar>
               <w:top w:type="dxa" w:w="40"/>
               <w:left w:type="dxa" w:w="110"/>
@@ -9951,7 +9951,7 @@
               <w:bottom w:val="single" w:color="CFE3DF" w:sz="4"/>
               <w:right w:val="single" w:color="CFE3DF" w:sz="4"/>
             </w:tcBorders>
-            <w:shd w:fill="2C4D35" w:val="clear"/>
+            <w:shd w:fill="915E3B" w:val="clear"/>
             <w:tcMar>
               <w:top w:type="dxa" w:w="40"/>
               <w:left w:type="dxa" w:w="110"/>
@@ -10080,7 +10080,7 @@
       <w:pPr>
         <w:pStyle w:val="Heading1"/>
         <w:pageBreakBefore/>
-        <w:shd w:fill="724026" w:val="clear"/>
+        <w:shd w:fill="35826B" w:val="clear"/>
         <w:spacing w:after="40" w:before="0"/>
       </w:pPr>
       <w:r>
@@ -10097,7 +10097,7 @@
           <w:rFonts w:ascii="Georgia" w:cs="Georgia" w:eastAsia="Georgia" w:hAnsi="Georgia"/>
           <w:i/>
           <w:iCs/>
-          <w:color w:val="724026"/>
+          <w:color w:val="35826B"/>
           <w:sz w:val="28"/>
           <w:szCs w:val="28"/>
         </w:rPr>
@@ -10159,7 +10159,7 @@
               <w:bottom w:val="single" w:color="CFE3DF" w:sz="4"/>
               <w:right w:val="single" w:color="CFE3DF" w:sz="4"/>
             </w:tcBorders>
-            <w:shd w:fill="724026" w:val="clear"/>
+            <w:shd w:fill="35826B" w:val="clear"/>
             <w:tcMar>
               <w:top w:type="dxa" w:w="40"/>
               <w:left w:type="dxa" w:w="110"/>
@@ -10377,7 +10377,7 @@
               <w:bottom w:val="single" w:color="CFE3DF" w:sz="4"/>
               <w:right w:val="single" w:color="CFE3DF" w:sz="4"/>
             </w:tcBorders>
-            <w:shd w:fill="724026" w:val="clear"/>
+            <w:shd w:fill="35826B" w:val="clear"/>
             <w:tcMar>
               <w:top w:type="dxa" w:w="40"/>
               <w:left w:type="dxa" w:w="110"/>
@@ -10735,7 +10735,7 @@
               <w:bottom w:val="single" w:color="CFE3DF" w:sz="4"/>
               <w:right w:val="single" w:color="CFE3DF" w:sz="4"/>
             </w:tcBorders>
-            <w:shd w:fill="724026" w:val="clear"/>
+            <w:shd w:fill="35826B" w:val="clear"/>
             <w:tcMar>
               <w:top w:type="dxa" w:w="40"/>
               <w:left w:type="dxa" w:w="110"/>
@@ -10839,7 +10839,7 @@
               <w:bottom w:val="single" w:color="CFE3DF" w:sz="4"/>
               <w:right w:val="single" w:color="CFE3DF" w:sz="4"/>
             </w:tcBorders>
-            <w:shd w:fill="724026" w:val="clear"/>
+            <w:shd w:fill="35826B" w:val="clear"/>
             <w:tcMar>
               <w:top w:type="dxa" w:w="40"/>
               <w:left w:type="dxa" w:w="110"/>
@@ -10872,7 +10872,7 @@
               <w:bottom w:val="single" w:color="CFE3DF" w:sz="4"/>
               <w:right w:val="single" w:color="CFE3DF" w:sz="4"/>
             </w:tcBorders>
-            <w:shd w:fill="724026" w:val="clear"/>
+            <w:shd w:fill="35826B" w:val="clear"/>
             <w:tcMar>
               <w:top w:type="dxa" w:w="40"/>
               <w:left w:type="dxa" w:w="110"/>
@@ -10905,7 +10905,7 @@
               <w:bottom w:val="single" w:color="CFE3DF" w:sz="4"/>
               <w:right w:val="single" w:color="CFE3DF" w:sz="4"/>
             </w:tcBorders>
-            <w:shd w:fill="724026" w:val="clear"/>
+            <w:shd w:fill="35826B" w:val="clear"/>
             <w:tcMar>
               <w:top w:type="dxa" w:w="40"/>
               <w:left w:type="dxa" w:w="110"/>
@@ -11034,7 +11034,7 @@
       <w:pPr>
         <w:pStyle w:val="Heading1"/>
         <w:pageBreakBefore/>
-        <w:shd w:fill="7A5F2C" w:val="clear"/>
+        <w:shd w:fill="903B91" w:val="clear"/>
         <w:spacing w:after="40" w:before="0"/>
       </w:pPr>
       <w:r>
@@ -11051,7 +11051,7 @@
           <w:rFonts w:ascii="Georgia" w:cs="Georgia" w:eastAsia="Georgia" w:hAnsi="Georgia"/>
           <w:i/>
           <w:iCs/>
-          <w:color w:val="7A5F2C"/>
+          <w:color w:val="903B91"/>
           <w:sz w:val="28"/>
           <w:szCs w:val="28"/>
         </w:rPr>
@@ -11361,7 +11361,7 @@
               <w:bottom w:val="single" w:color="CFE3DF" w:sz="4"/>
               <w:right w:val="single" w:color="CFE3DF" w:sz="4"/>
             </w:tcBorders>
-            <w:shd w:fill="7A5F2C" w:val="clear"/>
+            <w:shd w:fill="903B91" w:val="clear"/>
             <w:tcMar>
               <w:top w:type="dxa" w:w="40"/>
               <w:left w:type="dxa" w:w="110"/>
@@ -11479,7 +11479,7 @@
               <w:bottom w:val="single" w:color="CFE3DF" w:sz="4"/>
               <w:right w:val="single" w:color="CFE3DF" w:sz="4"/>
             </w:tcBorders>
-            <w:shd w:fill="7A5F2C" w:val="clear"/>
+            <w:shd w:fill="903B91" w:val="clear"/>
             <w:tcMar>
               <w:top w:type="dxa" w:w="40"/>
               <w:left w:type="dxa" w:w="110"/>
@@ -11637,7 +11637,7 @@
               <w:bottom w:val="single" w:color="CFE3DF" w:sz="4"/>
               <w:right w:val="single" w:color="CFE3DF" w:sz="4"/>
             </w:tcBorders>
-            <w:shd w:fill="7A5F2C" w:val="clear"/>
+            <w:shd w:fill="903B91" w:val="clear"/>
             <w:tcMar>
               <w:top w:type="dxa" w:w="40"/>
               <w:left w:type="dxa" w:w="110"/>
@@ -11741,7 +11741,7 @@
               <w:bottom w:val="single" w:color="CFE3DF" w:sz="4"/>
               <w:right w:val="single" w:color="CFE3DF" w:sz="4"/>
             </w:tcBorders>
-            <w:shd w:fill="7A5F2C" w:val="clear"/>
+            <w:shd w:fill="903B91" w:val="clear"/>
             <w:tcMar>
               <w:top w:type="dxa" w:w="40"/>
               <w:left w:type="dxa" w:w="110"/>
@@ -11774,7 +11774,7 @@
               <w:bottom w:val="single" w:color="CFE3DF" w:sz="4"/>
               <w:right w:val="single" w:color="CFE3DF" w:sz="4"/>
             </w:tcBorders>
-            <w:shd w:fill="7A5F2C" w:val="clear"/>
+            <w:shd w:fill="903B91" w:val="clear"/>
             <w:tcMar>
               <w:top w:type="dxa" w:w="40"/>
               <w:left w:type="dxa" w:w="110"/>
@@ -11807,7 +11807,7 @@
               <w:bottom w:val="single" w:color="CFE3DF" w:sz="4"/>
               <w:right w:val="single" w:color="CFE3DF" w:sz="4"/>
             </w:tcBorders>
-            <w:shd w:fill="7A5F2C" w:val="clear"/>
+            <w:shd w:fill="903B91" w:val="clear"/>
             <w:tcMar>
               <w:top w:type="dxa" w:w="40"/>
               <w:left w:type="dxa" w:w="110"/>
@@ -11936,7 +11936,7 @@
       <w:pPr>
         <w:pStyle w:val="Heading1"/>
         <w:pageBreakBefore/>
-        <w:shd w:fill="4F3252" w:val="clear"/>
+        <w:shd w:fill="677B32" w:val="clear"/>
         <w:spacing w:after="40" w:before="0"/>
       </w:pPr>
       <w:r>
@@ -11953,7 +11953,7 @@
           <w:rFonts w:ascii="Georgia" w:cs="Georgia" w:eastAsia="Georgia" w:hAnsi="Georgia"/>
           <w:i/>
           <w:iCs/>
-          <w:color w:val="4F3252"/>
+          <w:color w:val="677B32"/>
           <w:sz w:val="28"/>
           <w:szCs w:val="28"/>
         </w:rPr>
@@ -12107,7 +12107,7 @@
               <w:bottom w:val="single" w:color="CFE3DF" w:sz="4"/>
               <w:right w:val="single" w:color="CFE3DF" w:sz="4"/>
             </w:tcBorders>
-            <w:shd w:fill="4F3252" w:val="clear"/>
+            <w:shd w:fill="677B32" w:val="clear"/>
             <w:tcMar>
               <w:top w:type="dxa" w:w="40"/>
               <w:left w:type="dxa" w:w="110"/>
@@ -12285,7 +12285,7 @@
               <w:bottom w:val="single" w:color="CFE3DF" w:sz="4"/>
               <w:right w:val="single" w:color="CFE3DF" w:sz="4"/>
             </w:tcBorders>
-            <w:shd w:fill="4F3252" w:val="clear"/>
+            <w:shd w:fill="677B32" w:val="clear"/>
             <w:tcMar>
               <w:top w:type="dxa" w:w="40"/>
               <w:left w:type="dxa" w:w="110"/>
@@ -12403,7 +12403,7 @@
               <w:bottom w:val="single" w:color="CFE3DF" w:sz="4"/>
               <w:right w:val="single" w:color="CFE3DF" w:sz="4"/>
             </w:tcBorders>
-            <w:shd w:fill="4F3252" w:val="clear"/>
+            <w:shd w:fill="677B32" w:val="clear"/>
             <w:tcMar>
               <w:top w:type="dxa" w:w="40"/>
               <w:left w:type="dxa" w:w="110"/>
@@ -12507,7 +12507,7 @@
               <w:bottom w:val="single" w:color="CFE3DF" w:sz="4"/>
               <w:right w:val="single" w:color="CFE3DF" w:sz="4"/>
             </w:tcBorders>
-            <w:shd w:fill="4F3252" w:val="clear"/>
+            <w:shd w:fill="677B32" w:val="clear"/>
             <w:tcMar>
               <w:top w:type="dxa" w:w="40"/>
               <w:left w:type="dxa" w:w="110"/>
@@ -12540,7 +12540,7 @@
               <w:bottom w:val="single" w:color="CFE3DF" w:sz="4"/>
               <w:right w:val="single" w:color="CFE3DF" w:sz="4"/>
             </w:tcBorders>
-            <w:shd w:fill="4F3252" w:val="clear"/>
+            <w:shd w:fill="677B32" w:val="clear"/>
             <w:tcMar>
               <w:top w:type="dxa" w:w="40"/>
               <w:left w:type="dxa" w:w="110"/>
@@ -12573,7 +12573,7 @@
               <w:bottom w:val="single" w:color="CFE3DF" w:sz="4"/>
               <w:right w:val="single" w:color="CFE3DF" w:sz="4"/>
             </w:tcBorders>
-            <w:shd w:fill="4F3252" w:val="clear"/>
+            <w:shd w:fill="677B32" w:val="clear"/>
             <w:tcMar>
               <w:top w:type="dxa" w:w="40"/>
               <w:left w:type="dxa" w:w="110"/>
@@ -12702,7 +12702,7 @@
       <w:pPr>
         <w:pStyle w:val="Heading1"/>
         <w:pageBreakBefore/>
-        <w:shd w:fill="1F5C52" w:val="clear"/>
+        <w:shd w:fill="3B6091" w:val="clear"/>
         <w:spacing w:after="40" w:before="0"/>
       </w:pPr>
       <w:r>
@@ -12719,7 +12719,7 @@
           <w:rFonts w:ascii="Georgia" w:cs="Georgia" w:eastAsia="Georgia" w:hAnsi="Georgia"/>
           <w:i/>
           <w:iCs/>
-          <w:color w:val="1F5C52"/>
+          <w:color w:val="3B6091"/>
           <w:sz w:val="28"/>
           <w:szCs w:val="28"/>
         </w:rPr>
@@ -12801,7 +12801,7 @@
               <w:bottom w:val="single" w:color="CFE3DF" w:sz="4"/>
               <w:right w:val="single" w:color="CFE3DF" w:sz="4"/>
             </w:tcBorders>
-            <w:shd w:fill="1F5C52" w:val="clear"/>
+            <w:shd w:fill="3B6091" w:val="clear"/>
             <w:tcMar>
               <w:top w:type="dxa" w:w="40"/>
               <w:left w:type="dxa" w:w="110"/>
@@ -12939,7 +12939,7 @@
               <w:bottom w:val="single" w:color="CFE3DF" w:sz="4"/>
               <w:right w:val="single" w:color="CFE3DF" w:sz="4"/>
             </w:tcBorders>
-            <w:shd w:fill="1F5C52" w:val="clear"/>
+            <w:shd w:fill="3B6091" w:val="clear"/>
             <w:tcMar>
               <w:top w:type="dxa" w:w="40"/>
               <w:left w:type="dxa" w:w="110"/>
@@ -13043,7 +13043,7 @@
               <w:bottom w:val="single" w:color="CFE3DF" w:sz="4"/>
               <w:right w:val="single" w:color="CFE3DF" w:sz="4"/>
             </w:tcBorders>
-            <w:shd w:fill="1F5C52" w:val="clear"/>
+            <w:shd w:fill="3B6091" w:val="clear"/>
             <w:tcMar>
               <w:top w:type="dxa" w:w="40"/>
               <w:left w:type="dxa" w:w="110"/>
@@ -13076,7 +13076,7 @@
               <w:bottom w:val="single" w:color="CFE3DF" w:sz="4"/>
               <w:right w:val="single" w:color="CFE3DF" w:sz="4"/>
             </w:tcBorders>
-            <w:shd w:fill="1F5C52" w:val="clear"/>
+            <w:shd w:fill="3B6091" w:val="clear"/>
             <w:tcMar>
               <w:top w:type="dxa" w:w="40"/>
               <w:left w:type="dxa" w:w="110"/>
@@ -13109,7 +13109,7 @@
               <w:bottom w:val="single" w:color="CFE3DF" w:sz="4"/>
               <w:right w:val="single" w:color="CFE3DF" w:sz="4"/>
             </w:tcBorders>
-            <w:shd w:fill="1F5C52" w:val="clear"/>
+            <w:shd w:fill="3B6091" w:val="clear"/>
             <w:tcMar>
               <w:top w:type="dxa" w:w="40"/>
               <w:left w:type="dxa" w:w="110"/>
@@ -13238,7 +13238,7 @@
       <w:pPr>
         <w:pStyle w:val="Heading1"/>
         <w:pageBreakBefore/>
-        <w:shd w:fill="7A4F1D" w:val="clear"/>
+        <w:shd w:fill="913B47" w:val="clear"/>
         <w:spacing w:after="40" w:before="0"/>
       </w:pPr>
       <w:r>
@@ -13255,7 +13255,7 @@
           <w:rFonts w:ascii="Georgia" w:cs="Georgia" w:eastAsia="Georgia" w:hAnsi="Georgia"/>
           <w:i/>
           <w:iCs/>
-          <w:color w:val="7A4F1D"/>
+          <w:color w:val="913B47"/>
           <w:sz w:val="28"/>
           <w:szCs w:val="28"/>
         </w:rPr>
@@ -13333,7 +13333,7 @@
               <w:bottom w:val="single" w:color="CFE3DF" w:sz="4"/>
               <w:right w:val="single" w:color="CFE3DF" w:sz="4"/>
             </w:tcBorders>
-            <w:shd w:fill="7A4F1D" w:val="clear"/>
+            <w:shd w:fill="913B47" w:val="clear"/>
             <w:tcMar>
               <w:top w:type="dxa" w:w="40"/>
               <w:left w:type="dxa" w:w="110"/>
@@ -13467,7 +13467,7 @@
               <w:bottom w:val="single" w:color="CFE3DF" w:sz="4"/>
               <w:right w:val="single" w:color="CFE3DF" w:sz="4"/>
             </w:tcBorders>
-            <w:shd w:fill="7A4F1D" w:val="clear"/>
+            <w:shd w:fill="913B47" w:val="clear"/>
             <w:tcMar>
               <w:top w:type="dxa" w:w="40"/>
               <w:left w:type="dxa" w:w="110"/>
@@ -13571,7 +13571,7 @@
               <w:bottom w:val="single" w:color="CFE3DF" w:sz="4"/>
               <w:right w:val="single" w:color="CFE3DF" w:sz="4"/>
             </w:tcBorders>
-            <w:shd w:fill="7A4F1D" w:val="clear"/>
+            <w:shd w:fill="913B47" w:val="clear"/>
             <w:tcMar>
               <w:top w:type="dxa" w:w="40"/>
               <w:left w:type="dxa" w:w="110"/>
@@ -13604,7 +13604,7 @@
               <w:bottom w:val="single" w:color="CFE3DF" w:sz="4"/>
               <w:right w:val="single" w:color="CFE3DF" w:sz="4"/>
             </w:tcBorders>
-            <w:shd w:fill="7A4F1D" w:val="clear"/>
+            <w:shd w:fill="913B47" w:val="clear"/>
             <w:tcMar>
               <w:top w:type="dxa" w:w="40"/>
               <w:left w:type="dxa" w:w="110"/>
@@ -13637,7 +13637,7 @@
               <w:bottom w:val="single" w:color="CFE3DF" w:sz="4"/>
               <w:right w:val="single" w:color="CFE3DF" w:sz="4"/>
             </w:tcBorders>
-            <w:shd w:fill="7A4F1D" w:val="clear"/>
+            <w:shd w:fill="913B47" w:val="clear"/>
             <w:tcMar>
               <w:top w:type="dxa" w:w="40"/>
               <w:left w:type="dxa" w:w="110"/>
@@ -13766,7 +13766,7 @@
       <w:pPr>
         <w:pStyle w:val="Heading1"/>
         <w:pageBreakBefore/>
-        <w:shd w:fill="324D61" w:val="clear"/>
+        <w:shd w:fill="358241" w:val="clear"/>
         <w:spacing w:after="40" w:before="0"/>
       </w:pPr>
       <w:r>
@@ -13783,7 +13783,7 @@
           <w:rFonts w:ascii="Georgia" w:cs="Georgia" w:eastAsia="Georgia" w:hAnsi="Georgia"/>
           <w:i/>
           <w:iCs/>
-          <w:color w:val="324D61"/>
+          <w:color w:val="358241"/>
           <w:sz w:val="28"/>
           <w:szCs w:val="28"/>
         </w:rPr>
@@ -13845,7 +13845,7 @@
               <w:bottom w:val="single" w:color="CFE3DF" w:sz="4"/>
               <w:right w:val="single" w:color="CFE3DF" w:sz="4"/>
             </w:tcBorders>
-            <w:shd w:fill="324D61" w:val="clear"/>
+            <w:shd w:fill="358241" w:val="clear"/>
             <w:tcMar>
               <w:top w:type="dxa" w:w="40"/>
               <w:left w:type="dxa" w:w="110"/>
@@ -14035,7 +14035,7 @@
               <w:bottom w:val="single" w:color="CFE3DF" w:sz="4"/>
               <w:right w:val="single" w:color="CFE3DF" w:sz="4"/>
             </w:tcBorders>
-            <w:shd w:fill="324D61" w:val="clear"/>
+            <w:shd w:fill="358241" w:val="clear"/>
             <w:tcMar>
               <w:top w:type="dxa" w:w="40"/>
               <w:left w:type="dxa" w:w="110"/>
@@ -14139,7 +14139,7 @@
               <w:bottom w:val="single" w:color="CFE3DF" w:sz="4"/>
               <w:right w:val="single" w:color="CFE3DF" w:sz="4"/>
             </w:tcBorders>
-            <w:shd w:fill="324D61" w:val="clear"/>
+            <w:shd w:fill="358241" w:val="clear"/>
             <w:tcMar>
               <w:top w:type="dxa" w:w="40"/>
               <w:left w:type="dxa" w:w="110"/>
@@ -14172,7 +14172,7 @@
               <w:bottom w:val="single" w:color="CFE3DF" w:sz="4"/>
               <w:right w:val="single" w:color="CFE3DF" w:sz="4"/>
             </w:tcBorders>
-            <w:shd w:fill="324D61" w:val="clear"/>
+            <w:shd w:fill="358241" w:val="clear"/>
             <w:tcMar>
               <w:top w:type="dxa" w:w="40"/>
               <w:left w:type="dxa" w:w="110"/>
@@ -14205,7 +14205,7 @@
               <w:bottom w:val="single" w:color="CFE3DF" w:sz="4"/>
               <w:right w:val="single" w:color="CFE3DF" w:sz="4"/>
             </w:tcBorders>
-            <w:shd w:fill="324D61" w:val="clear"/>
+            <w:shd w:fill="358241" w:val="clear"/>
             <w:tcMar>
               <w:top w:type="dxa" w:w="40"/>
               <w:left w:type="dxa" w:w="110"/>
@@ -14334,7 +14334,7 @@
       <w:pPr>
         <w:pStyle w:val="Heading1"/>
         <w:pageBreakBefore/>
-        <w:shd w:fill="7A474D" w:val="clear"/>
+        <w:shd w:fill="613B91" w:val="clear"/>
         <w:spacing w:after="40" w:before="0"/>
       </w:pPr>
       <w:r>
@@ -14351,7 +14351,7 @@
           <w:rFonts w:ascii="Georgia" w:cs="Georgia" w:eastAsia="Georgia" w:hAnsi="Georgia"/>
           <w:i/>
           <w:iCs/>
-          <w:color w:val="7A474D"/>
+          <w:color w:val="613B91"/>
           <w:sz w:val="28"/>
           <w:szCs w:val="28"/>
         </w:rPr>
@@ -14445,7 +14445,7 @@
               <w:bottom w:val="single" w:color="CFE3DF" w:sz="4"/>
               <w:right w:val="single" w:color="CFE3DF" w:sz="4"/>
             </w:tcBorders>
-            <w:shd w:fill="7A474D" w:val="clear"/>
+            <w:shd w:fill="613B91" w:val="clear"/>
             <w:tcMar>
               <w:top w:type="dxa" w:w="40"/>
               <w:left w:type="dxa" w:w="110"/>
@@ -14549,7 +14549,7 @@
               <w:bottom w:val="single" w:color="CFE3DF" w:sz="4"/>
               <w:right w:val="single" w:color="CFE3DF" w:sz="4"/>
             </w:tcBorders>
-            <w:shd w:fill="7A474D" w:val="clear"/>
+            <w:shd w:fill="613B91" w:val="clear"/>
             <w:tcMar>
               <w:top w:type="dxa" w:w="40"/>
               <w:left w:type="dxa" w:w="110"/>
@@ -14582,7 +14582,7 @@
               <w:bottom w:val="single" w:color="CFE3DF" w:sz="4"/>
               <w:right w:val="single" w:color="CFE3DF" w:sz="4"/>
             </w:tcBorders>
-            <w:shd w:fill="7A474D" w:val="clear"/>
+            <w:shd w:fill="613B91" w:val="clear"/>
             <w:tcMar>
               <w:top w:type="dxa" w:w="40"/>
               <w:left w:type="dxa" w:w="110"/>
@@ -14615,7 +14615,7 @@
               <w:bottom w:val="single" w:color="CFE3DF" w:sz="4"/>
               <w:right w:val="single" w:color="CFE3DF" w:sz="4"/>
             </w:tcBorders>
-            <w:shd w:fill="7A474D" w:val="clear"/>
+            <w:shd w:fill="613B91" w:val="clear"/>
             <w:tcMar>
               <w:top w:type="dxa" w:w="40"/>
               <w:left w:type="dxa" w:w="110"/>
@@ -14744,7 +14744,7 @@
       <w:pPr>
         <w:pStyle w:val="Heading1"/>
         <w:pageBreakBefore/>
-        <w:shd w:fill="2C4D35" w:val="clear"/>
+        <w:shd w:fill="8A7438" w:val="clear"/>
         <w:spacing w:after="40" w:before="0"/>
       </w:pPr>
       <w:r>
@@ -14761,7 +14761,7 @@
           <w:rFonts w:ascii="Georgia" w:cs="Georgia" w:eastAsia="Georgia" w:hAnsi="Georgia"/>
           <w:i/>
           <w:iCs/>
-          <w:color w:val="2C4D35"/>
+          <w:color w:val="8A7438"/>
           <w:sz w:val="28"/>
           <w:szCs w:val="28"/>
         </w:rPr>
@@ -14839,7 +14839,7 @@
               <w:bottom w:val="single" w:color="CFE3DF" w:sz="4"/>
               <w:right w:val="single" w:color="CFE3DF" w:sz="4"/>
             </w:tcBorders>
-            <w:shd w:fill="2C4D35" w:val="clear"/>
+            <w:shd w:fill="8A7438" w:val="clear"/>
             <w:tcMar>
               <w:top w:type="dxa" w:w="40"/>
               <w:left w:type="dxa" w:w="110"/>
@@ -15025,7 +15025,7 @@
               <w:bottom w:val="single" w:color="CFE3DF" w:sz="4"/>
               <w:right w:val="single" w:color="CFE3DF" w:sz="4"/>
             </w:tcBorders>
-            <w:shd w:fill="2C4D35" w:val="clear"/>
+            <w:shd w:fill="8A7438" w:val="clear"/>
             <w:tcMar>
               <w:top w:type="dxa" w:w="40"/>
               <w:left w:type="dxa" w:w="110"/>
@@ -15129,7 +15129,7 @@
               <w:bottom w:val="single" w:color="CFE3DF" w:sz="4"/>
               <w:right w:val="single" w:color="CFE3DF" w:sz="4"/>
             </w:tcBorders>
-            <w:shd w:fill="2C4D35" w:val="clear"/>
+            <w:shd w:fill="8A7438" w:val="clear"/>
             <w:tcMar>
               <w:top w:type="dxa" w:w="40"/>
               <w:left w:type="dxa" w:w="110"/>
@@ -15162,7 +15162,7 @@
               <w:bottom w:val="single" w:color="CFE3DF" w:sz="4"/>
               <w:right w:val="single" w:color="CFE3DF" w:sz="4"/>
             </w:tcBorders>
-            <w:shd w:fill="2C4D35" w:val="clear"/>
+            <w:shd w:fill="8A7438" w:val="clear"/>
             <w:tcMar>
               <w:top w:type="dxa" w:w="40"/>
               <w:left w:type="dxa" w:w="110"/>
@@ -15195,7 +15195,7 @@
               <w:bottom w:val="single" w:color="CFE3DF" w:sz="4"/>
               <w:right w:val="single" w:color="CFE3DF" w:sz="4"/>
             </w:tcBorders>
-            <w:shd w:fill="2C4D35" w:val="clear"/>
+            <w:shd w:fill="8A7438" w:val="clear"/>
             <w:tcMar>
               <w:top w:type="dxa" w:w="40"/>
               <w:left w:type="dxa" w:w="110"/>
@@ -15324,7 +15324,7 @@
       <w:pPr>
         <w:pStyle w:val="Heading1"/>
         <w:pageBreakBefore/>
-        <w:shd w:fill="724026" w:val="clear"/>
+        <w:shd w:fill="358082" w:val="clear"/>
         <w:spacing w:after="40" w:before="0"/>
       </w:pPr>
       <w:r>
@@ -15341,7 +15341,7 @@
           <w:rFonts w:ascii="Georgia" w:cs="Georgia" w:eastAsia="Georgia" w:hAnsi="Georgia"/>
           <w:i/>
           <w:iCs/>
-          <w:color w:val="724026"/>
+          <w:color w:val="358082"/>
           <w:sz w:val="28"/>
           <w:szCs w:val="28"/>
         </w:rPr>
@@ -15403,7 +15403,7 @@
               <w:bottom w:val="single" w:color="CFE3DF" w:sz="4"/>
               <w:right w:val="single" w:color="CFE3DF" w:sz="4"/>
             </w:tcBorders>
-            <w:shd w:fill="724026" w:val="clear"/>
+            <w:shd w:fill="358082" w:val="clear"/>
             <w:tcMar>
               <w:top w:type="dxa" w:w="40"/>
               <w:left w:type="dxa" w:w="110"/>
@@ -15547,7 +15547,7 @@
               <w:bottom w:val="single" w:color="CFE3DF" w:sz="4"/>
               <w:right w:val="single" w:color="CFE3DF" w:sz="4"/>
             </w:tcBorders>
-            <w:shd w:fill="724026" w:val="clear"/>
+            <w:shd w:fill="358082" w:val="clear"/>
             <w:tcMar>
               <w:top w:type="dxa" w:w="40"/>
               <w:left w:type="dxa" w:w="110"/>
@@ -15713,7 +15713,7 @@
               <w:bottom w:val="single" w:color="CFE3DF" w:sz="4"/>
               <w:right w:val="single" w:color="CFE3DF" w:sz="4"/>
             </w:tcBorders>
-            <w:shd w:fill="724026" w:val="clear"/>
+            <w:shd w:fill="358082" w:val="clear"/>
             <w:tcMar>
               <w:top w:type="dxa" w:w="40"/>
               <w:left w:type="dxa" w:w="110"/>
@@ -15817,7 +15817,7 @@
               <w:bottom w:val="single" w:color="CFE3DF" w:sz="4"/>
               <w:right w:val="single" w:color="CFE3DF" w:sz="4"/>
             </w:tcBorders>
-            <w:shd w:fill="724026" w:val="clear"/>
+            <w:shd w:fill="358082" w:val="clear"/>
             <w:tcMar>
               <w:top w:type="dxa" w:w="40"/>
               <w:left w:type="dxa" w:w="110"/>
@@ -15850,7 +15850,7 @@
               <w:bottom w:val="single" w:color="CFE3DF" w:sz="4"/>
               <w:right w:val="single" w:color="CFE3DF" w:sz="4"/>
             </w:tcBorders>
-            <w:shd w:fill="724026" w:val="clear"/>
+            <w:shd w:fill="358082" w:val="clear"/>
             <w:tcMar>
               <w:top w:type="dxa" w:w="40"/>
               <w:left w:type="dxa" w:w="110"/>
@@ -15883,7 +15883,7 @@
               <w:bottom w:val="single" w:color="CFE3DF" w:sz="4"/>
               <w:right w:val="single" w:color="CFE3DF" w:sz="4"/>
             </w:tcBorders>
-            <w:shd w:fill="724026" w:val="clear"/>
+            <w:shd w:fill="358082" w:val="clear"/>
             <w:tcMar>
               <w:top w:type="dxa" w:w="40"/>
               <w:left w:type="dxa" w:w="110"/>
@@ -16012,7 +16012,7 @@
       <w:pPr>
         <w:pStyle w:val="Heading1"/>
         <w:pageBreakBefore/>
-        <w:shd w:fill="7A5F2C" w:val="clear"/>
+        <w:shd w:fill="913B75" w:val="clear"/>
         <w:spacing w:after="40" w:before="0"/>
       </w:pPr>
       <w:r>
@@ -16029,7 +16029,7 @@
           <w:rFonts w:ascii="Georgia" w:cs="Georgia" w:eastAsia="Georgia" w:hAnsi="Georgia"/>
           <w:i/>
           <w:iCs/>
-          <w:color w:val="7A5F2C"/>
+          <w:color w:val="913B75"/>
           <w:sz w:val="28"/>
           <w:szCs w:val="28"/>
         </w:rPr>
@@ -16321,7 +16321,7 @@
             </w:pPr>
             <w:r>
               <w:rPr>
-                <w:color w:val="7A5F2C"/>
+                <w:color w:val="913B75"/>
                 <w:sz w:val="18"/>
                 <w:szCs w:val="18"/>
               </w:rPr>
@@ -16444,7 +16444,7 @@
               <w:bottom w:val="single" w:color="CFE3DF" w:sz="4"/>
               <w:right w:val="single" w:color="CFE3DF" w:sz="4"/>
             </w:tcBorders>
-            <w:shd w:fill="7A5F2C" w:val="clear"/>
+            <w:shd w:fill="913B75" w:val="clear"/>
             <w:tcMar>
               <w:top w:type="dxa" w:w="40"/>
               <w:left w:type="dxa" w:w="110"/>
@@ -16642,7 +16642,7 @@
               <w:bottom w:val="single" w:color="CFE3DF" w:sz="4"/>
               <w:right w:val="single" w:color="CFE3DF" w:sz="4"/>
             </w:tcBorders>
-            <w:shd w:fill="7A5F2C" w:val="clear"/>
+            <w:shd w:fill="913B75" w:val="clear"/>
             <w:tcMar>
               <w:top w:type="dxa" w:w="40"/>
               <w:left w:type="dxa" w:w="110"/>
@@ -16746,7 +16746,7 @@
               <w:bottom w:val="single" w:color="CFE3DF" w:sz="4"/>
               <w:right w:val="single" w:color="CFE3DF" w:sz="4"/>
             </w:tcBorders>
-            <w:shd w:fill="7A5F2C" w:val="clear"/>
+            <w:shd w:fill="913B75" w:val="clear"/>
             <w:tcMar>
               <w:top w:type="dxa" w:w="40"/>
               <w:left w:type="dxa" w:w="110"/>
@@ -16779,7 +16779,7 @@
               <w:bottom w:val="single" w:color="CFE3DF" w:sz="4"/>
               <w:right w:val="single" w:color="CFE3DF" w:sz="4"/>
             </w:tcBorders>
-            <w:shd w:fill="7A5F2C" w:val="clear"/>
+            <w:shd w:fill="913B75" w:val="clear"/>
             <w:tcMar>
               <w:top w:type="dxa" w:w="40"/>
               <w:left w:type="dxa" w:w="110"/>
@@ -16812,7 +16812,7 @@
               <w:bottom w:val="single" w:color="CFE3DF" w:sz="4"/>
               <w:right w:val="single" w:color="CFE3DF" w:sz="4"/>
             </w:tcBorders>
-            <w:shd w:fill="7A5F2C" w:val="clear"/>
+            <w:shd w:fill="913B75" w:val="clear"/>
             <w:tcMar>
               <w:top w:type="dxa" w:w="40"/>
               <w:left w:type="dxa" w:w="110"/>
@@ -16941,7 +16941,7 @@
       <w:pPr>
         <w:pStyle w:val="Heading1"/>
         <w:pageBreakBefore/>
-        <w:shd w:fill="4F3252" w:val="clear"/>
+        <w:shd w:fill="538235" w:val="clear"/>
         <w:spacing w:after="40" w:before="0"/>
       </w:pPr>
       <w:r>
@@ -16958,7 +16958,7 @@
           <w:rFonts w:ascii="Georgia" w:cs="Georgia" w:eastAsia="Georgia" w:hAnsi="Georgia"/>
           <w:i/>
           <w:iCs/>
-          <w:color w:val="4F3252"/>
+          <w:color w:val="538235"/>
           <w:sz w:val="28"/>
           <w:szCs w:val="28"/>
         </w:rPr>
@@ -17212,7 +17212,7 @@
               <w:bottom w:val="single" w:color="CFE3DF" w:sz="4"/>
               <w:right w:val="single" w:color="CFE3DF" w:sz="4"/>
             </w:tcBorders>
-            <w:shd w:fill="4F3252" w:val="clear"/>
+            <w:shd w:fill="538235" w:val="clear"/>
             <w:tcMar>
               <w:top w:type="dxa" w:w="40"/>
               <w:left w:type="dxa" w:w="110"/>
@@ -17382,7 +17382,7 @@
               <w:bottom w:val="single" w:color="CFE3DF" w:sz="4"/>
               <w:right w:val="single" w:color="CFE3DF" w:sz="4"/>
             </w:tcBorders>
-            <w:shd w:fill="4F3252" w:val="clear"/>
+            <w:shd w:fill="538235" w:val="clear"/>
             <w:tcMar>
               <w:top w:type="dxa" w:w="40"/>
               <w:left w:type="dxa" w:w="110"/>
@@ -17540,7 +17540,7 @@
               <w:bottom w:val="single" w:color="CFE3DF" w:sz="4"/>
               <w:right w:val="single" w:color="CFE3DF" w:sz="4"/>
             </w:tcBorders>
-            <w:shd w:fill="4F3252" w:val="clear"/>
+            <w:shd w:fill="538235" w:val="clear"/>
             <w:tcMar>
               <w:top w:type="dxa" w:w="40"/>
               <w:left w:type="dxa" w:w="110"/>
@@ -17792,7 +17792,7 @@
               <w:bottom w:val="single" w:color="CFE3DF" w:sz="4"/>
               <w:right w:val="single" w:color="CFE3DF" w:sz="4"/>
             </w:tcBorders>
-            <w:shd w:fill="4F3252" w:val="clear"/>
+            <w:shd w:fill="538235" w:val="clear"/>
             <w:tcMar>
               <w:top w:type="dxa" w:w="40"/>
               <w:left w:type="dxa" w:w="110"/>
@@ -17896,7 +17896,7 @@
               <w:bottom w:val="single" w:color="CFE3DF" w:sz="4"/>
               <w:right w:val="single" w:color="CFE3DF" w:sz="4"/>
             </w:tcBorders>
-            <w:shd w:fill="4F3252" w:val="clear"/>
+            <w:shd w:fill="538235" w:val="clear"/>
             <w:tcMar>
               <w:top w:type="dxa" w:w="40"/>
               <w:left w:type="dxa" w:w="110"/>
@@ -17929,7 +17929,7 @@
               <w:bottom w:val="single" w:color="CFE3DF" w:sz="4"/>
               <w:right w:val="single" w:color="CFE3DF" w:sz="4"/>
             </w:tcBorders>
-            <w:shd w:fill="4F3252" w:val="clear"/>
+            <w:shd w:fill="538235" w:val="clear"/>
             <w:tcMar>
               <w:top w:type="dxa" w:w="40"/>
               <w:left w:type="dxa" w:w="110"/>
@@ -17962,7 +17962,7 @@
               <w:bottom w:val="single" w:color="CFE3DF" w:sz="4"/>
               <w:right w:val="single" w:color="CFE3DF" w:sz="4"/>
             </w:tcBorders>
-            <w:shd w:fill="4F3252" w:val="clear"/>
+            <w:shd w:fill="538235" w:val="clear"/>
             <w:tcMar>
               <w:top w:type="dxa" w:w="40"/>
               <w:left w:type="dxa" w:w="110"/>
@@ -18091,7 +18091,7 @@
       <w:pPr>
         <w:pStyle w:val="Heading1"/>
         <w:pageBreakBefore/>
-        <w:shd w:fill="1F5C52" w:val="clear"/>
+        <w:shd w:fill="3B4391" w:val="clear"/>
         <w:spacing w:after="40" w:before="0"/>
       </w:pPr>
       <w:r>
@@ -18108,7 +18108,7 @@
           <w:rFonts w:ascii="Georgia" w:cs="Georgia" w:eastAsia="Georgia" w:hAnsi="Georgia"/>
           <w:i/>
           <w:iCs/>
-          <w:color w:val="1F5C52"/>
+          <w:color w:val="3B4391"/>
           <w:sz w:val="28"/>
           <w:szCs w:val="28"/>
         </w:rPr>
@@ -18234,7 +18234,7 @@
               <w:bottom w:val="single" w:color="CFE3DF" w:sz="4"/>
               <w:right w:val="single" w:color="CFE3DF" w:sz="4"/>
             </w:tcBorders>
-            <w:shd w:fill="1F5C52" w:val="clear"/>
+            <w:shd w:fill="3B4391" w:val="clear"/>
             <w:tcMar>
               <w:top w:type="dxa" w:w="40"/>
               <w:left w:type="dxa" w:w="110"/>
@@ -18384,7 +18384,7 @@
               <w:bottom w:val="single" w:color="CFE3DF" w:sz="4"/>
               <w:right w:val="single" w:color="CFE3DF" w:sz="4"/>
             </w:tcBorders>
-            <w:shd w:fill="1F5C52" w:val="clear"/>
+            <w:shd w:fill="3B4391" w:val="clear"/>
             <w:tcMar>
               <w:top w:type="dxa" w:w="40"/>
               <w:left w:type="dxa" w:w="110"/>
@@ -18488,7 +18488,7 @@
               <w:bottom w:val="single" w:color="CFE3DF" w:sz="4"/>
               <w:right w:val="single" w:color="CFE3DF" w:sz="4"/>
             </w:tcBorders>
-            <w:shd w:fill="1F5C52" w:val="clear"/>
+            <w:shd w:fill="3B4391" w:val="clear"/>
             <w:tcMar>
               <w:top w:type="dxa" w:w="40"/>
               <w:left w:type="dxa" w:w="110"/>
@@ -18521,7 +18521,7 @@
               <w:bottom w:val="single" w:color="CFE3DF" w:sz="4"/>
               <w:right w:val="single" w:color="CFE3DF" w:sz="4"/>
             </w:tcBorders>
-            <w:shd w:fill="1F5C52" w:val="clear"/>
+            <w:shd w:fill="3B4391" w:val="clear"/>
             <w:tcMar>
               <w:top w:type="dxa" w:w="40"/>
               <w:left w:type="dxa" w:w="110"/>
@@ -18554,7 +18554,7 @@
               <w:bottom w:val="single" w:color="CFE3DF" w:sz="4"/>
               <w:right w:val="single" w:color="CFE3DF" w:sz="4"/>
             </w:tcBorders>
-            <w:shd w:fill="1F5C52" w:val="clear"/>
+            <w:shd w:fill="3B4391" w:val="clear"/>
             <w:tcMar>
               <w:top w:type="dxa" w:w="40"/>
               <w:left w:type="dxa" w:w="110"/>
@@ -18683,7 +18683,7 @@
       <w:pPr>
         <w:pStyle w:val="Heading1"/>
         <w:pageBreakBefore/>
-        <w:shd w:fill="7A4F1D" w:val="clear"/>
+        <w:shd w:fill="914C3B" w:val="clear"/>
         <w:spacing w:after="40" w:before="0"/>
       </w:pPr>
       <w:r>
@@ -18700,7 +18700,7 @@
           <w:rFonts w:ascii="Georgia" w:cs="Georgia" w:eastAsia="Georgia" w:hAnsi="Georgia"/>
           <w:i/>
           <w:iCs/>
-          <w:color w:val="7A4F1D"/>
+          <w:color w:val="914C3B"/>
           <w:sz w:val="28"/>
           <w:szCs w:val="28"/>
         </w:rPr>
@@ -18762,7 +18762,7 @@
               <w:bottom w:val="single" w:color="CFE3DF" w:sz="4"/>
               <w:right w:val="single" w:color="CFE3DF" w:sz="4"/>
             </w:tcBorders>
-            <w:shd w:fill="7A4F1D" w:val="clear"/>
+            <w:shd w:fill="914C3B" w:val="clear"/>
             <w:tcMar>
               <w:top w:type="dxa" w:w="40"/>
               <w:left w:type="dxa" w:w="110"/>
@@ -18928,7 +18928,7 @@
               <w:bottom w:val="single" w:color="CFE3DF" w:sz="4"/>
               <w:right w:val="single" w:color="CFE3DF" w:sz="4"/>
             </w:tcBorders>
-            <w:shd w:fill="7A4F1D" w:val="clear"/>
+            <w:shd w:fill="914C3B" w:val="clear"/>
             <w:tcMar>
               <w:top w:type="dxa" w:w="40"/>
               <w:left w:type="dxa" w:w="110"/>
@@ -19094,7 +19094,7 @@
               <w:bottom w:val="single" w:color="CFE3DF" w:sz="4"/>
               <w:right w:val="single" w:color="CFE3DF" w:sz="4"/>
             </w:tcBorders>
-            <w:shd w:fill="7A4F1D" w:val="clear"/>
+            <w:shd w:fill="914C3B" w:val="clear"/>
             <w:tcMar>
               <w:top w:type="dxa" w:w="40"/>
               <w:left w:type="dxa" w:w="110"/>
@@ -19198,7 +19198,7 @@
               <w:bottom w:val="single" w:color="CFE3DF" w:sz="4"/>
               <w:right w:val="single" w:color="CFE3DF" w:sz="4"/>
             </w:tcBorders>
-            <w:shd w:fill="7A4F1D" w:val="clear"/>
+            <w:shd w:fill="914C3B" w:val="clear"/>
             <w:tcMar>
               <w:top w:type="dxa" w:w="40"/>
               <w:left w:type="dxa" w:w="110"/>
@@ -19231,7 +19231,7 @@
               <w:bottom w:val="single" w:color="CFE3DF" w:sz="4"/>
               <w:right w:val="single" w:color="CFE3DF" w:sz="4"/>
             </w:tcBorders>
-            <w:shd w:fill="7A4F1D" w:val="clear"/>
+            <w:shd w:fill="914C3B" w:val="clear"/>
             <w:tcMar>
               <w:top w:type="dxa" w:w="40"/>
               <w:left w:type="dxa" w:w="110"/>
@@ -19264,7 +19264,7 @@
               <w:bottom w:val="single" w:color="CFE3DF" w:sz="4"/>
               <w:right w:val="single" w:color="CFE3DF" w:sz="4"/>
             </w:tcBorders>
-            <w:shd w:fill="7A4F1D" w:val="clear"/>
+            <w:shd w:fill="914C3B" w:val="clear"/>
             <w:tcMar>
               <w:top w:type="dxa" w:w="40"/>
               <w:left w:type="dxa" w:w="110"/>
@@ -19393,7 +19393,7 @@
       <w:pPr>
         <w:pStyle w:val="Heading1"/>
         <w:pageBreakBefore/>
-        <w:shd w:fill="324D61" w:val="clear"/>
+        <w:shd w:fill="35825B" w:val="clear"/>
         <w:spacing w:after="40" w:before="0"/>
       </w:pPr>
       <w:r>
@@ -19410,7 +19410,7 @@
           <w:rFonts w:ascii="Georgia" w:cs="Georgia" w:eastAsia="Georgia" w:hAnsi="Georgia"/>
           <w:i/>
           <w:iCs/>
-          <w:color w:val="324D61"/>
+          <w:color w:val="35825B"/>
           <w:sz w:val="28"/>
           <w:szCs w:val="28"/>
         </w:rPr>
@@ -19472,7 +19472,7 @@
               <w:bottom w:val="single" w:color="CFE3DF" w:sz="4"/>
               <w:right w:val="single" w:color="CFE3DF" w:sz="4"/>
             </w:tcBorders>
-            <w:shd w:fill="324D61" w:val="clear"/>
+            <w:shd w:fill="35825B" w:val="clear"/>
             <w:tcMar>
               <w:top w:type="dxa" w:w="40"/>
               <w:left w:type="dxa" w:w="110"/>
@@ -19622,7 +19622,7 @@
               <w:bottom w:val="single" w:color="CFE3DF" w:sz="4"/>
               <w:right w:val="single" w:color="CFE3DF" w:sz="4"/>
             </w:tcBorders>
-            <w:shd w:fill="324D61" w:val="clear"/>
+            <w:shd w:fill="35825B" w:val="clear"/>
             <w:tcMar>
               <w:top w:type="dxa" w:w="40"/>
               <w:left w:type="dxa" w:w="110"/>
@@ -19912,7 +19912,7 @@
               <w:bottom w:val="single" w:color="CFE3DF" w:sz="4"/>
               <w:right w:val="single" w:color="CFE3DF" w:sz="4"/>
             </w:tcBorders>
-            <w:shd w:fill="324D61" w:val="clear"/>
+            <w:shd w:fill="35825B" w:val="clear"/>
             <w:tcMar>
               <w:top w:type="dxa" w:w="40"/>
               <w:left w:type="dxa" w:w="110"/>
@@ -20016,7 +20016,7 @@
               <w:bottom w:val="single" w:color="CFE3DF" w:sz="4"/>
               <w:right w:val="single" w:color="CFE3DF" w:sz="4"/>
             </w:tcBorders>
-            <w:shd w:fill="324D61" w:val="clear"/>
+            <w:shd w:fill="35825B" w:val="clear"/>
             <w:tcMar>
               <w:top w:type="dxa" w:w="40"/>
               <w:left w:type="dxa" w:w="110"/>
@@ -20049,7 +20049,7 @@
               <w:bottom w:val="single" w:color="CFE3DF" w:sz="4"/>
               <w:right w:val="single" w:color="CFE3DF" w:sz="4"/>
             </w:tcBorders>
-            <w:shd w:fill="324D61" w:val="clear"/>
+            <w:shd w:fill="35825B" w:val="clear"/>
             <w:tcMar>
               <w:top w:type="dxa" w:w="40"/>
               <w:left w:type="dxa" w:w="110"/>
@@ -20082,7 +20082,7 @@
               <w:bottom w:val="single" w:color="CFE3DF" w:sz="4"/>
               <w:right w:val="single" w:color="CFE3DF" w:sz="4"/>
             </w:tcBorders>
-            <w:shd w:fill="324D61" w:val="clear"/>
+            <w:shd w:fill="35825B" w:val="clear"/>
             <w:tcMar>
               <w:top w:type="dxa" w:w="40"/>
               <w:left w:type="dxa" w:w="110"/>
@@ -20211,7 +20211,7 @@
       <w:pPr>
         <w:pStyle w:val="Heading1"/>
         <w:pageBreakBefore/>
-        <w:shd w:fill="7A474D" w:val="clear"/>
+        <w:shd w:fill="7E3B91" w:val="clear"/>
         <w:spacing w:after="40" w:before="0"/>
       </w:pPr>
       <w:r>
@@ -20228,7 +20228,7 @@
           <w:rFonts w:ascii="Georgia" w:cs="Georgia" w:eastAsia="Georgia" w:hAnsi="Georgia"/>
           <w:i/>
           <w:iCs/>
-          <w:color w:val="7A474D"/>
+          <w:color w:val="7E3B91"/>
           <w:sz w:val="28"/>
           <w:szCs w:val="28"/>
         </w:rPr>
@@ -20474,7 +20474,7 @@
               <w:bottom w:val="single" w:color="CFE3DF" w:sz="4"/>
               <w:right w:val="single" w:color="CFE3DF" w:sz="4"/>
             </w:tcBorders>
-            <w:shd w:fill="7A474D" w:val="clear"/>
+            <w:shd w:fill="7E3B91" w:val="clear"/>
             <w:tcMar>
               <w:top w:type="dxa" w:w="40"/>
               <w:left w:type="dxa" w:w="110"/>
@@ -20624,7 +20624,7 @@
               <w:bottom w:val="single" w:color="CFE3DF" w:sz="4"/>
               <w:right w:val="single" w:color="CFE3DF" w:sz="4"/>
             </w:tcBorders>
-            <w:shd w:fill="7A474D" w:val="clear"/>
+            <w:shd w:fill="7E3B91" w:val="clear"/>
             <w:tcMar>
               <w:top w:type="dxa" w:w="40"/>
               <w:left w:type="dxa" w:w="110"/>
@@ -20728,7 +20728,7 @@
               <w:bottom w:val="single" w:color="CFE3DF" w:sz="4"/>
               <w:right w:val="single" w:color="CFE3DF" w:sz="4"/>
             </w:tcBorders>
-            <w:shd w:fill="7A474D" w:val="clear"/>
+            <w:shd w:fill="7E3B91" w:val="clear"/>
             <w:tcMar>
               <w:top w:type="dxa" w:w="40"/>
               <w:left w:type="dxa" w:w="110"/>
@@ -20761,7 +20761,7 @@
               <w:bottom w:val="single" w:color="CFE3DF" w:sz="4"/>
               <w:right w:val="single" w:color="CFE3DF" w:sz="4"/>
             </w:tcBorders>
-            <w:shd w:fill="7A474D" w:val="clear"/>
+            <w:shd w:fill="7E3B91" w:val="clear"/>
             <w:tcMar>
               <w:top w:type="dxa" w:w="40"/>
               <w:left w:type="dxa" w:w="110"/>
@@ -20794,7 +20794,7 @@
               <w:bottom w:val="single" w:color="CFE3DF" w:sz="4"/>
               <w:right w:val="single" w:color="CFE3DF" w:sz="4"/>
             </w:tcBorders>
-            <w:shd w:fill="7A474D" w:val="clear"/>
+            <w:shd w:fill="7E3B91" w:val="clear"/>
             <w:tcMar>
               <w:top w:type="dxa" w:w="40"/>
               <w:left w:type="dxa" w:w="110"/>
@@ -20923,7 +20923,7 @@
       <w:pPr>
         <w:pStyle w:val="Heading1"/>
         <w:pageBreakBefore/>
-        <w:shd w:fill="2C4D35" w:val="clear"/>
+        <w:shd w:fill="767B32" w:val="clear"/>
         <w:spacing w:after="40" w:before="0"/>
       </w:pPr>
       <w:r>
@@ -20940,7 +20940,7 @@
           <w:rFonts w:ascii="Georgia" w:cs="Georgia" w:eastAsia="Georgia" w:hAnsi="Georgia"/>
           <w:i/>
           <w:iCs/>
-          <w:color w:val="2C4D35"/>
+          <w:color w:val="767B32"/>
           <w:sz w:val="28"/>
           <w:szCs w:val="28"/>
         </w:rPr>
@@ -21118,7 +21118,7 @@
               <w:bottom w:val="single" w:color="CFE3DF" w:sz="4"/>
               <w:right w:val="single" w:color="CFE3DF" w:sz="4"/>
             </w:tcBorders>
-            <w:shd w:fill="2C4D35" w:val="clear"/>
+            <w:shd w:fill="767B32" w:val="clear"/>
             <w:tcMar>
               <w:top w:type="dxa" w:w="40"/>
               <w:left w:type="dxa" w:w="110"/>
@@ -21252,7 +21252,7 @@
               <w:bottom w:val="single" w:color="CFE3DF" w:sz="4"/>
               <w:right w:val="single" w:color="CFE3DF" w:sz="4"/>
             </w:tcBorders>
-            <w:shd w:fill="2C4D35" w:val="clear"/>
+            <w:shd w:fill="767B32" w:val="clear"/>
             <w:tcMar>
               <w:top w:type="dxa" w:w="40"/>
               <w:left w:type="dxa" w:w="110"/>
@@ -21482,7 +21482,7 @@
               <w:bottom w:val="single" w:color="CFE3DF" w:sz="4"/>
               <w:right w:val="single" w:color="CFE3DF" w:sz="4"/>
             </w:tcBorders>
-            <w:shd w:fill="2C4D35" w:val="clear"/>
+            <w:shd w:fill="767B32" w:val="clear"/>
             <w:tcMar>
               <w:top w:type="dxa" w:w="40"/>
               <w:left w:type="dxa" w:w="110"/>
@@ -21586,7 +21586,7 @@
               <w:bottom w:val="single" w:color="CFE3DF" w:sz="4"/>
               <w:right w:val="single" w:color="CFE3DF" w:sz="4"/>
             </w:tcBorders>
-            <w:shd w:fill="2C4D35" w:val="clear"/>
+            <w:shd w:fill="767B32" w:val="clear"/>
             <w:tcMar>
               <w:top w:type="dxa" w:w="40"/>
               <w:left w:type="dxa" w:w="110"/>
@@ -21619,7 +21619,7 @@
               <w:bottom w:val="single" w:color="CFE3DF" w:sz="4"/>
               <w:right w:val="single" w:color="CFE3DF" w:sz="4"/>
             </w:tcBorders>
-            <w:shd w:fill="2C4D35" w:val="clear"/>
+            <w:shd w:fill="767B32" w:val="clear"/>
             <w:tcMar>
               <w:top w:type="dxa" w:w="40"/>
               <w:left w:type="dxa" w:w="110"/>
@@ -21652,7 +21652,7 @@
               <w:bottom w:val="single" w:color="CFE3DF" w:sz="4"/>
               <w:right w:val="single" w:color="CFE3DF" w:sz="4"/>
             </w:tcBorders>
-            <w:shd w:fill="2C4D35" w:val="clear"/>
+            <w:shd w:fill="767B32" w:val="clear"/>
             <w:tcMar>
               <w:top w:type="dxa" w:w="40"/>
               <w:left w:type="dxa" w:w="110"/>
@@ -21781,7 +21781,7 @@
       <w:pPr>
         <w:pStyle w:val="Heading1"/>
         <w:pageBreakBefore/>
-        <w:shd w:fill="724026" w:val="clear"/>
+        <w:shd w:fill="3B7291" w:val="clear"/>
         <w:spacing w:after="40" w:before="0"/>
       </w:pPr>
       <w:r>
@@ -21798,7 +21798,7 @@
           <w:rFonts w:ascii="Georgia" w:cs="Georgia" w:eastAsia="Georgia" w:hAnsi="Georgia"/>
           <w:i/>
           <w:iCs/>
-          <w:color w:val="724026"/>
+          <w:color w:val="3B7291"/>
           <w:sz w:val="28"/>
           <w:szCs w:val="28"/>
         </w:rPr>
@@ -21944,7 +21944,7 @@
               <w:bottom w:val="single" w:color="CFE3DF" w:sz="4"/>
               <w:right w:val="single" w:color="CFE3DF" w:sz="4"/>
             </w:tcBorders>
-            <w:shd w:fill="724026" w:val="clear"/>
+            <w:shd w:fill="3B7291" w:val="clear"/>
             <w:tcMar>
               <w:top w:type="dxa" w:w="40"/>
               <w:left w:type="dxa" w:w="110"/>
@@ -22094,7 +22094,7 @@
               <w:bottom w:val="single" w:color="CFE3DF" w:sz="4"/>
               <w:right w:val="single" w:color="CFE3DF" w:sz="4"/>
             </w:tcBorders>
-            <w:shd w:fill="724026" w:val="clear"/>
+            <w:shd w:fill="3B7291" w:val="clear"/>
             <w:tcMar>
               <w:top w:type="dxa" w:w="40"/>
               <w:left w:type="dxa" w:w="110"/>
@@ -22198,7 +22198,7 @@
               <w:bottom w:val="single" w:color="CFE3DF" w:sz="4"/>
               <w:right w:val="single" w:color="CFE3DF" w:sz="4"/>
             </w:tcBorders>
-            <w:shd w:fill="724026" w:val="clear"/>
+            <w:shd w:fill="3B7291" w:val="clear"/>
             <w:tcMar>
               <w:top w:type="dxa" w:w="40"/>
               <w:left w:type="dxa" w:w="110"/>
@@ -22231,7 +22231,7 @@
               <w:bottom w:val="single" w:color="CFE3DF" w:sz="4"/>
               <w:right w:val="single" w:color="CFE3DF" w:sz="4"/>
             </w:tcBorders>
-            <w:shd w:fill="724026" w:val="clear"/>
+            <w:shd w:fill="3B7291" w:val="clear"/>
             <w:tcMar>
               <w:top w:type="dxa" w:w="40"/>
               <w:left w:type="dxa" w:w="110"/>
@@ -22264,7 +22264,7 @@
               <w:bottom w:val="single" w:color="CFE3DF" w:sz="4"/>
               <w:right w:val="single" w:color="CFE3DF" w:sz="4"/>
             </w:tcBorders>
-            <w:shd w:fill="724026" w:val="clear"/>
+            <w:shd w:fill="3B7291" w:val="clear"/>
             <w:tcMar>
               <w:top w:type="dxa" w:w="40"/>
               <w:left w:type="dxa" w:w="110"/>
@@ -22393,7 +22393,7 @@
       <w:pPr>
         <w:pStyle w:val="Heading1"/>
         <w:pageBreakBefore/>
-        <w:shd w:fill="7A5F2C" w:val="clear"/>
+        <w:shd w:fill="913B59" w:val="clear"/>
         <w:spacing w:after="40" w:before="0"/>
       </w:pPr>
       <w:r>
@@ -22410,7 +22410,7 @@
           <w:rFonts w:ascii="Georgia" w:cs="Georgia" w:eastAsia="Georgia" w:hAnsi="Georgia"/>
           <w:i/>
           <w:iCs/>
-          <w:color w:val="7A5F2C"/>
+          <w:color w:val="913B59"/>
           <w:sz w:val="28"/>
           <w:szCs w:val="28"/>
         </w:rPr>
@@ -22564,7 +22564,7 @@
               <w:bottom w:val="single" w:color="CFE3DF" w:sz="4"/>
               <w:right w:val="single" w:color="CFE3DF" w:sz="4"/>
             </w:tcBorders>
-            <w:shd w:fill="7A5F2C" w:val="clear"/>
+            <w:shd w:fill="913B59" w:val="clear"/>
             <w:tcMar>
               <w:top w:type="dxa" w:w="40"/>
               <w:left w:type="dxa" w:w="110"/>
@@ -22782,7 +22782,7 @@
               <w:bottom w:val="single" w:color="CFE3DF" w:sz="4"/>
               <w:right w:val="single" w:color="CFE3DF" w:sz="4"/>
             </w:tcBorders>
-            <w:shd w:fill="7A5F2C" w:val="clear"/>
+            <w:shd w:fill="913B59" w:val="clear"/>
             <w:tcMar>
               <w:top w:type="dxa" w:w="40"/>
               <w:left w:type="dxa" w:w="110"/>
@@ -22886,7 +22886,7 @@
               <w:bottom w:val="single" w:color="CFE3DF" w:sz="4"/>
               <w:right w:val="single" w:color="CFE3DF" w:sz="4"/>
             </w:tcBorders>
-            <w:shd w:fill="7A5F2C" w:val="clear"/>
+            <w:shd w:fill="913B59" w:val="clear"/>
             <w:tcMar>
               <w:top w:type="dxa" w:w="40"/>
               <w:left w:type="dxa" w:w="110"/>
@@ -22919,7 +22919,7 @@
               <w:bottom w:val="single" w:color="CFE3DF" w:sz="4"/>
               <w:right w:val="single" w:color="CFE3DF" w:sz="4"/>
             </w:tcBorders>
-            <w:shd w:fill="7A5F2C" w:val="clear"/>
+            <w:shd w:fill="913B59" w:val="clear"/>
             <w:tcMar>
               <w:top w:type="dxa" w:w="40"/>
               <w:left w:type="dxa" w:w="110"/>
@@ -22952,7 +22952,7 @@
               <w:bottom w:val="single" w:color="CFE3DF" w:sz="4"/>
               <w:right w:val="single" w:color="CFE3DF" w:sz="4"/>
             </w:tcBorders>
-            <w:shd w:fill="7A5F2C" w:val="clear"/>
+            <w:shd w:fill="913B59" w:val="clear"/>
             <w:tcMar>
               <w:top w:type="dxa" w:w="40"/>
               <w:left w:type="dxa" w:w="110"/>
@@ -23081,7 +23081,7 @@
       <w:pPr>
         <w:pStyle w:val="Heading1"/>
         <w:pageBreakBefore/>
-        <w:shd w:fill="4F3252" w:val="clear"/>
+        <w:shd w:fill="398235" w:val="clear"/>
         <w:spacing w:after="40" w:before="0"/>
       </w:pPr>
       <w:r>
@@ -23098,7 +23098,7 @@
           <w:rFonts w:ascii="Georgia" w:cs="Georgia" w:eastAsia="Georgia" w:hAnsi="Georgia"/>
           <w:i/>
           <w:iCs/>
-          <w:color w:val="4F3252"/>
+          <w:color w:val="398235"/>
           <w:sz w:val="28"/>
           <w:szCs w:val="28"/>
         </w:rPr>
@@ -23196,7 +23196,7 @@
               <w:bottom w:val="single" w:color="CFE3DF" w:sz="4"/>
               <w:right w:val="single" w:color="CFE3DF" w:sz="4"/>
             </w:tcBorders>
-            <w:shd w:fill="4F3252" w:val="clear"/>
+            <w:shd w:fill="398235" w:val="clear"/>
             <w:tcMar>
               <w:top w:type="dxa" w:w="40"/>
               <w:left w:type="dxa" w:w="110"/>
@@ -23382,7 +23382,7 @@
               <w:bottom w:val="single" w:color="CFE3DF" w:sz="4"/>
               <w:right w:val="single" w:color="CFE3DF" w:sz="4"/>
             </w:tcBorders>
-            <w:shd w:fill="4F3252" w:val="clear"/>
+            <w:shd w:fill="398235" w:val="clear"/>
             <w:tcMar>
               <w:top w:type="dxa" w:w="40"/>
               <w:left w:type="dxa" w:w="110"/>
@@ -23486,7 +23486,7 @@
               <w:bottom w:val="single" w:color="CFE3DF" w:sz="4"/>
               <w:right w:val="single" w:color="CFE3DF" w:sz="4"/>
             </w:tcBorders>
-            <w:shd w:fill="4F3252" w:val="clear"/>
+            <w:shd w:fill="398235" w:val="clear"/>
             <w:tcMar>
               <w:top w:type="dxa" w:w="40"/>
               <w:left w:type="dxa" w:w="110"/>
@@ -23519,7 +23519,7 @@
               <w:bottom w:val="single" w:color="CFE3DF" w:sz="4"/>
               <w:right w:val="single" w:color="CFE3DF" w:sz="4"/>
             </w:tcBorders>
-            <w:shd w:fill="4F3252" w:val="clear"/>
+            <w:shd w:fill="398235" w:val="clear"/>
             <w:tcMar>
               <w:top w:type="dxa" w:w="40"/>
               <w:left w:type="dxa" w:w="110"/>
@@ -23552,7 +23552,7 @@
               <w:bottom w:val="single" w:color="CFE3DF" w:sz="4"/>
               <w:right w:val="single" w:color="CFE3DF" w:sz="4"/>
             </w:tcBorders>
-            <w:shd w:fill="4F3252" w:val="clear"/>
+            <w:shd w:fill="398235" w:val="clear"/>
             <w:tcMar>
               <w:top w:type="dxa" w:w="40"/>
               <w:left w:type="dxa" w:w="110"/>
@@ -23681,7 +23681,7 @@
       <w:pPr>
         <w:pStyle w:val="Heading1"/>
         <w:pageBreakBefore/>
-        <w:shd w:fill="1F5C52" w:val="clear"/>
+        <w:shd w:fill="503B91" w:val="clear"/>
         <w:spacing w:after="40" w:before="0"/>
       </w:pPr>
       <w:r>
@@ -23698,7 +23698,7 @@
           <w:rFonts w:ascii="Georgia" w:cs="Georgia" w:eastAsia="Georgia" w:hAnsi="Georgia"/>
           <w:i/>
           <w:iCs/>
-          <w:color w:val="1F5C52"/>
+          <w:color w:val="503B91"/>
           <w:sz w:val="28"/>
           <w:szCs w:val="28"/>
         </w:rPr>
@@ -23860,7 +23860,7 @@
               <w:bottom w:val="single" w:color="CFE3DF" w:sz="4"/>
               <w:right w:val="single" w:color="CFE3DF" w:sz="4"/>
             </w:tcBorders>
-            <w:shd w:fill="1F5C52" w:val="clear"/>
+            <w:shd w:fill="503B91" w:val="clear"/>
             <w:tcMar>
               <w:top w:type="dxa" w:w="40"/>
               <w:left w:type="dxa" w:w="110"/>
@@ -24102,7 +24102,7 @@
               <w:bottom w:val="single" w:color="CFE3DF" w:sz="4"/>
               <w:right w:val="single" w:color="CFE3DF" w:sz="4"/>
             </w:tcBorders>
-            <w:shd w:fill="1F5C52" w:val="clear"/>
+            <w:shd w:fill="503B91" w:val="clear"/>
             <w:tcMar>
               <w:top w:type="dxa" w:w="40"/>
               <w:left w:type="dxa" w:w="110"/>
@@ -24206,7 +24206,7 @@
               <w:bottom w:val="single" w:color="CFE3DF" w:sz="4"/>
               <w:right w:val="single" w:color="CFE3DF" w:sz="4"/>
             </w:tcBorders>
-            <w:shd w:fill="1F5C52" w:val="clear"/>
+            <w:shd w:fill="503B91" w:val="clear"/>
             <w:tcMar>
               <w:top w:type="dxa" w:w="40"/>
               <w:left w:type="dxa" w:w="110"/>
@@ -24239,7 +24239,7 @@
               <w:bottom w:val="single" w:color="CFE3DF" w:sz="4"/>
               <w:right w:val="single" w:color="CFE3DF" w:sz="4"/>
             </w:tcBorders>
-            <w:shd w:fill="1F5C52" w:val="clear"/>
+            <w:shd w:fill="503B91" w:val="clear"/>
             <w:tcMar>
               <w:top w:type="dxa" w:w="40"/>
               <w:left w:type="dxa" w:w="110"/>
@@ -24272,7 +24272,7 @@
               <w:bottom w:val="single" w:color="CFE3DF" w:sz="4"/>
               <w:right w:val="single" w:color="CFE3DF" w:sz="4"/>
             </w:tcBorders>
-            <w:shd w:fill="1F5C52" w:val="clear"/>
+            <w:shd w:fill="503B91" w:val="clear"/>
             <w:tcMar>
               <w:top w:type="dxa" w:w="40"/>
               <w:left w:type="dxa" w:w="110"/>
@@ -24401,7 +24401,7 @@
       <w:pPr>
         <w:pStyle w:val="Heading1"/>
         <w:pageBreakBefore/>
-        <w:shd w:fill="7A4F1D" w:val="clear"/>
+        <w:shd w:fill="91693B" w:val="clear"/>
         <w:spacing w:after="40" w:before="0"/>
       </w:pPr>
       <w:r>
@@ -24418,7 +24418,7 @@
           <w:rFonts w:ascii="Georgia" w:cs="Georgia" w:eastAsia="Georgia" w:hAnsi="Georgia"/>
           <w:i/>
           <w:iCs/>
-          <w:color w:val="7A4F1D"/>
+          <w:color w:val="91693B"/>
           <w:sz w:val="28"/>
           <w:szCs w:val="28"/>
         </w:rPr>
@@ -24632,7 +24632,7 @@
               <w:bottom w:val="single" w:color="CFE3DF" w:sz="4"/>
               <w:right w:val="single" w:color="CFE3DF" w:sz="4"/>
             </w:tcBorders>
-            <w:shd w:fill="7A4F1D" w:val="clear"/>
+            <w:shd w:fill="91693B" w:val="clear"/>
             <w:tcMar>
               <w:top w:type="dxa" w:w="40"/>
               <w:left w:type="dxa" w:w="110"/>
@@ -24736,7 +24736,7 @@
               <w:bottom w:val="single" w:color="CFE3DF" w:sz="4"/>
               <w:right w:val="single" w:color="CFE3DF" w:sz="4"/>
             </w:tcBorders>
-            <w:shd w:fill="7A4F1D" w:val="clear"/>
+            <w:shd w:fill="91693B" w:val="clear"/>
             <w:tcMar>
               <w:top w:type="dxa" w:w="40"/>
               <w:left w:type="dxa" w:w="110"/>
@@ -24769,7 +24769,7 @@
               <w:bottom w:val="single" w:color="CFE3DF" w:sz="4"/>
               <w:right w:val="single" w:color="CFE3DF" w:sz="4"/>
             </w:tcBorders>
-            <w:shd w:fill="7A4F1D" w:val="clear"/>
+            <w:shd w:fill="91693B" w:val="clear"/>
             <w:tcMar>
               <w:top w:type="dxa" w:w="40"/>
               <w:left w:type="dxa" w:w="110"/>
@@ -24802,7 +24802,7 @@
               <w:bottom w:val="single" w:color="CFE3DF" w:sz="4"/>
               <w:right w:val="single" w:color="CFE3DF" w:sz="4"/>
             </w:tcBorders>
-            <w:shd w:fill="7A4F1D" w:val="clear"/>
+            <w:shd w:fill="91693B" w:val="clear"/>
             <w:tcMar>
               <w:top w:type="dxa" w:w="40"/>
               <w:left w:type="dxa" w:w="110"/>
@@ -24931,7 +24931,7 @@
       <w:pPr>
         <w:pStyle w:val="Heading1"/>
         <w:pageBreakBefore/>
-        <w:shd w:fill="324D61" w:val="clear"/>
+        <w:shd w:fill="358275" w:val="clear"/>
         <w:spacing w:after="40" w:before="0"/>
       </w:pPr>
       <w:r>
@@ -24948,7 +24948,7 @@
           <w:rFonts w:ascii="Georgia" w:cs="Georgia" w:eastAsia="Georgia" w:hAnsi="Georgia"/>
           <w:i/>
           <w:iCs/>
-          <w:color w:val="324D61"/>
+          <w:color w:val="358275"/>
           <w:sz w:val="28"/>
           <w:szCs w:val="28"/>
         </w:rPr>
@@ -25030,7 +25030,7 @@
               <w:bottom w:val="single" w:color="CFE3DF" w:sz="4"/>
               <w:right w:val="single" w:color="CFE3DF" w:sz="4"/>
             </w:tcBorders>
-            <w:shd w:fill="324D61" w:val="clear"/>
+            <w:shd w:fill="358275" w:val="clear"/>
             <w:tcMar>
               <w:top w:type="dxa" w:w="40"/>
               <w:left w:type="dxa" w:w="110"/>
@@ -25196,7 +25196,7 @@
               <w:bottom w:val="single" w:color="CFE3DF" w:sz="4"/>
               <w:right w:val="single" w:color="CFE3DF" w:sz="4"/>
             </w:tcBorders>
-            <w:shd w:fill="324D61" w:val="clear"/>
+            <w:shd w:fill="358275" w:val="clear"/>
             <w:tcMar>
               <w:top w:type="dxa" w:w="40"/>
               <w:left w:type="dxa" w:w="110"/>
@@ -25346,7 +25346,7 @@
               <w:bottom w:val="single" w:color="CFE3DF" w:sz="4"/>
               <w:right w:val="single" w:color="CFE3DF" w:sz="4"/>
             </w:tcBorders>
-            <w:shd w:fill="324D61" w:val="clear"/>
+            <w:shd w:fill="358275" w:val="clear"/>
             <w:tcMar>
               <w:top w:type="dxa" w:w="40"/>
               <w:left w:type="dxa" w:w="110"/>
@@ -25450,7 +25450,7 @@
               <w:bottom w:val="single" w:color="CFE3DF" w:sz="4"/>
               <w:right w:val="single" w:color="CFE3DF" w:sz="4"/>
             </w:tcBorders>
-            <w:shd w:fill="324D61" w:val="clear"/>
+            <w:shd w:fill="358275" w:val="clear"/>
             <w:tcMar>
               <w:top w:type="dxa" w:w="40"/>
               <w:left w:type="dxa" w:w="110"/>
@@ -25483,7 +25483,7 @@
               <w:bottom w:val="single" w:color="CFE3DF" w:sz="4"/>
               <w:right w:val="single" w:color="CFE3DF" w:sz="4"/>
             </w:tcBorders>
-            <w:shd w:fill="324D61" w:val="clear"/>
+            <w:shd w:fill="358275" w:val="clear"/>
             <w:tcMar>
               <w:top w:type="dxa" w:w="40"/>
               <w:left w:type="dxa" w:w="110"/>
@@ -25516,7 +25516,7 @@
               <w:bottom w:val="single" w:color="CFE3DF" w:sz="4"/>
               <w:right w:val="single" w:color="CFE3DF" w:sz="4"/>
             </w:tcBorders>
-            <w:shd w:fill="324D61" w:val="clear"/>
+            <w:shd w:fill="358275" w:val="clear"/>
             <w:tcMar>
               <w:top w:type="dxa" w:w="40"/>
               <w:left w:type="dxa" w:w="110"/>
@@ -25645,7 +25645,7 @@
       <w:pPr>
         <w:pStyle w:val="Heading1"/>
         <w:pageBreakBefore/>
-        <w:shd w:fill="7A474D" w:val="clear"/>
+        <w:shd w:fill="913B87" w:val="clear"/>
         <w:spacing w:after="40" w:before="0"/>
       </w:pPr>
       <w:r>
@@ -25662,7 +25662,7 @@
           <w:rFonts w:ascii="Georgia" w:cs="Georgia" w:eastAsia="Georgia" w:hAnsi="Georgia"/>
           <w:i/>
           <w:iCs/>
-          <w:color w:val="7A474D"/>
+          <w:color w:val="913B87"/>
           <w:sz w:val="28"/>
           <w:szCs w:val="28"/>
         </w:rPr>
@@ -25804,7 +25804,7 @@
               <w:bottom w:val="single" w:color="CFE3DF" w:sz="4"/>
               <w:right w:val="single" w:color="CFE3DF" w:sz="4"/>
             </w:tcBorders>
-            <w:shd w:fill="7A474D" w:val="clear"/>
+            <w:shd w:fill="913B87" w:val="clear"/>
             <w:tcMar>
               <w:top w:type="dxa" w:w="40"/>
               <w:left w:type="dxa" w:w="110"/>
@@ -26050,7 +26050,7 @@
               <w:bottom w:val="single" w:color="CFE3DF" w:sz="4"/>
               <w:right w:val="single" w:color="CFE3DF" w:sz="4"/>
             </w:tcBorders>
-            <w:shd w:fill="7A474D" w:val="clear"/>
+            <w:shd w:fill="913B87" w:val="clear"/>
             <w:tcMar>
               <w:top w:type="dxa" w:w="40"/>
               <w:left w:type="dxa" w:w="110"/>
@@ -26154,7 +26154,7 @@
               <w:bottom w:val="single" w:color="CFE3DF" w:sz="4"/>
               <w:right w:val="single" w:color="CFE3DF" w:sz="4"/>
             </w:tcBorders>
-            <w:shd w:fill="7A474D" w:val="clear"/>
+            <w:shd w:fill="913B87" w:val="clear"/>
             <w:tcMar>
               <w:top w:type="dxa" w:w="40"/>
               <w:left w:type="dxa" w:w="110"/>
@@ -26187,7 +26187,7 @@
               <w:bottom w:val="single" w:color="CFE3DF" w:sz="4"/>
               <w:right w:val="single" w:color="CFE3DF" w:sz="4"/>
             </w:tcBorders>
-            <w:shd w:fill="7A474D" w:val="clear"/>
+            <w:shd w:fill="913B87" w:val="clear"/>
             <w:tcMar>
               <w:top w:type="dxa" w:w="40"/>
               <w:left w:type="dxa" w:w="110"/>
@@ -26220,7 +26220,7 @@
               <w:bottom w:val="single" w:color="CFE3DF" w:sz="4"/>
               <w:right w:val="single" w:color="CFE3DF" w:sz="4"/>
             </w:tcBorders>
-            <w:shd w:fill="7A474D" w:val="clear"/>
+            <w:shd w:fill="913B87" w:val="clear"/>
             <w:tcMar>
               <w:top w:type="dxa" w:w="40"/>
               <w:left w:type="dxa" w:w="110"/>
@@ -26349,7 +26349,7 @@
       <w:pPr>
         <w:pStyle w:val="Heading1"/>
         <w:pageBreakBefore/>
-        <w:shd w:fill="2C4D35" w:val="clear"/>
+        <w:shd w:fill="5E7B32" w:val="clear"/>
         <w:spacing w:after="40" w:before="0"/>
       </w:pPr>
       <w:r>
@@ -26366,7 +26366,7 @@
           <w:rFonts w:ascii="Georgia" w:cs="Georgia" w:eastAsia="Georgia" w:hAnsi="Georgia"/>
           <w:i/>
           <w:iCs/>
-          <w:color w:val="2C4D35"/>
+          <w:color w:val="5E7B32"/>
           <w:sz w:val="28"/>
           <w:szCs w:val="28"/>
         </w:rPr>
@@ -26560,7 +26560,7 @@
               <w:bottom w:val="single" w:color="CFE3DF" w:sz="4"/>
               <w:right w:val="single" w:color="CFE3DF" w:sz="4"/>
             </w:tcBorders>
-            <w:shd w:fill="2C4D35" w:val="clear"/>
+            <w:shd w:fill="5E7B32" w:val="clear"/>
             <w:tcMar>
               <w:top w:type="dxa" w:w="40"/>
               <w:left w:type="dxa" w:w="110"/>
@@ -26746,7 +26746,7 @@
               <w:bottom w:val="single" w:color="CFE3DF" w:sz="4"/>
               <w:right w:val="single" w:color="CFE3DF" w:sz="4"/>
             </w:tcBorders>
-            <w:shd w:fill="2C4D35" w:val="clear"/>
+            <w:shd w:fill="5E7B32" w:val="clear"/>
             <w:tcMar>
               <w:top w:type="dxa" w:w="40"/>
               <w:left w:type="dxa" w:w="110"/>
@@ -26850,7 +26850,7 @@
               <w:bottom w:val="single" w:color="CFE3DF" w:sz="4"/>
               <w:right w:val="single" w:color="CFE3DF" w:sz="4"/>
             </w:tcBorders>
-            <w:shd w:fill="2C4D35" w:val="clear"/>
+            <w:shd w:fill="5E7B32" w:val="clear"/>
             <w:tcMar>
               <w:top w:type="dxa" w:w="40"/>
               <w:left w:type="dxa" w:w="110"/>
@@ -26883,7 +26883,7 @@
               <w:bottom w:val="single" w:color="CFE3DF" w:sz="4"/>
               <w:right w:val="single" w:color="CFE3DF" w:sz="4"/>
             </w:tcBorders>
-            <w:shd w:fill="2C4D35" w:val="clear"/>
+            <w:shd w:fill="5E7B32" w:val="clear"/>
             <w:tcMar>
               <w:top w:type="dxa" w:w="40"/>
               <w:left w:type="dxa" w:w="110"/>
@@ -26916,7 +26916,7 @@
               <w:bottom w:val="single" w:color="CFE3DF" w:sz="4"/>
               <w:right w:val="single" w:color="CFE3DF" w:sz="4"/>
             </w:tcBorders>
-            <w:shd w:fill="2C4D35" w:val="clear"/>
+            <w:shd w:fill="5E7B32" w:val="clear"/>
             <w:tcMar>
               <w:top w:type="dxa" w:w="40"/>
               <w:left w:type="dxa" w:w="110"/>
@@ -27045,7 +27045,7 @@
       <w:pPr>
         <w:pStyle w:val="Heading1"/>
         <w:pageBreakBefore/>
-        <w:shd w:fill="724026" w:val="clear"/>
+        <w:shd w:fill="3B5591" w:val="clear"/>
         <w:spacing w:after="40" w:before="0"/>
       </w:pPr>
       <w:r>
@@ -27062,7 +27062,7 @@
           <w:rFonts w:ascii="Georgia" w:cs="Georgia" w:eastAsia="Georgia" w:hAnsi="Georgia"/>
           <w:i/>
           <w:iCs/>
-          <w:color w:val="724026"/>
+          <w:color w:val="3B5591"/>
           <w:sz w:val="28"/>
           <w:szCs w:val="28"/>
         </w:rPr>
@@ -27280,7 +27280,7 @@
               <w:bottom w:val="single" w:color="CFE3DF" w:sz="4"/>
               <w:right w:val="single" w:color="CFE3DF" w:sz="4"/>
             </w:tcBorders>
-            <w:shd w:fill="724026" w:val="clear"/>
+            <w:shd w:fill="3B5591" w:val="clear"/>
             <w:tcMar>
               <w:top w:type="dxa" w:w="40"/>
               <w:left w:type="dxa" w:w="110"/>
@@ -27384,7 +27384,7 @@
               <w:bottom w:val="single" w:color="CFE3DF" w:sz="4"/>
               <w:right w:val="single" w:color="CFE3DF" w:sz="4"/>
             </w:tcBorders>
-            <w:shd w:fill="724026" w:val="clear"/>
+            <w:shd w:fill="3B5591" w:val="clear"/>
             <w:tcMar>
               <w:top w:type="dxa" w:w="40"/>
               <w:left w:type="dxa" w:w="110"/>
@@ -27417,7 +27417,7 @@
               <w:bottom w:val="single" w:color="CFE3DF" w:sz="4"/>
               <w:right w:val="single" w:color="CFE3DF" w:sz="4"/>
             </w:tcBorders>
-            <w:shd w:fill="724026" w:val="clear"/>
+            <w:shd w:fill="3B5591" w:val="clear"/>
             <w:tcMar>
               <w:top w:type="dxa" w:w="40"/>
               <w:left w:type="dxa" w:w="110"/>
@@ -27450,7 +27450,7 @@
               <w:bottom w:val="single" w:color="CFE3DF" w:sz="4"/>
               <w:right w:val="single" w:color="CFE3DF" w:sz="4"/>
             </w:tcBorders>
-            <w:shd w:fill="724026" w:val="clear"/>
+            <w:shd w:fill="3B5591" w:val="clear"/>
             <w:tcMar>
               <w:top w:type="dxa" w:w="40"/>
               <w:left w:type="dxa" w:w="110"/>
@@ -27579,7 +27579,7 @@
       <w:pPr>
         <w:pStyle w:val="Heading1"/>
         <w:pageBreakBefore/>
-        <w:shd w:fill="7A5F2C" w:val="clear"/>
+        <w:shd w:fill="913B3C" w:val="clear"/>
         <w:spacing w:after="40" w:before="0"/>
       </w:pPr>
       <w:r>
@@ -27596,7 +27596,7 @@
           <w:rFonts w:ascii="Georgia" w:cs="Georgia" w:eastAsia="Georgia" w:hAnsi="Georgia"/>
           <w:i/>
           <w:iCs/>
-          <w:color w:val="7A5F2C"/>
+          <w:color w:val="913B3C"/>
           <w:sz w:val="28"/>
           <w:szCs w:val="28"/>
         </w:rPr>
@@ -27706,7 +27706,7 @@
               <w:bottom w:val="single" w:color="CFE3DF" w:sz="4"/>
               <w:right w:val="single" w:color="CFE3DF" w:sz="4"/>
             </w:tcBorders>
-            <w:shd w:fill="7A5F2C" w:val="clear"/>
+            <w:shd w:fill="913B3C" w:val="clear"/>
             <w:tcMar>
               <w:top w:type="dxa" w:w="40"/>
               <w:left w:type="dxa" w:w="110"/>
@@ -27936,7 +27936,7 @@
               <w:bottom w:val="single" w:color="CFE3DF" w:sz="4"/>
               <w:right w:val="single" w:color="CFE3DF" w:sz="4"/>
             </w:tcBorders>
-            <w:shd w:fill="7A5F2C" w:val="clear"/>
+            <w:shd w:fill="913B3C" w:val="clear"/>
             <w:tcMar>
               <w:top w:type="dxa" w:w="40"/>
               <w:left w:type="dxa" w:w="110"/>
@@ -28040,7 +28040,7 @@
               <w:bottom w:val="single" w:color="CFE3DF" w:sz="4"/>
               <w:right w:val="single" w:color="CFE3DF" w:sz="4"/>
             </w:tcBorders>
-            <w:shd w:fill="7A5F2C" w:val="clear"/>
+            <w:shd w:fill="913B3C" w:val="clear"/>
             <w:tcMar>
               <w:top w:type="dxa" w:w="40"/>
               <w:left w:type="dxa" w:w="110"/>
@@ -28073,7 +28073,7 @@
               <w:bottom w:val="single" w:color="CFE3DF" w:sz="4"/>
               <w:right w:val="single" w:color="CFE3DF" w:sz="4"/>
             </w:tcBorders>
-            <w:shd w:fill="7A5F2C" w:val="clear"/>
+            <w:shd w:fill="913B3C" w:val="clear"/>
             <w:tcMar>
               <w:top w:type="dxa" w:w="40"/>
               <w:left w:type="dxa" w:w="110"/>
@@ -28106,7 +28106,7 @@
               <w:bottom w:val="single" w:color="CFE3DF" w:sz="4"/>
               <w:right w:val="single" w:color="CFE3DF" w:sz="4"/>
             </w:tcBorders>
-            <w:shd w:fill="7A5F2C" w:val="clear"/>
+            <w:shd w:fill="913B3C" w:val="clear"/>
             <w:tcMar>
               <w:top w:type="dxa" w:w="40"/>
               <w:left w:type="dxa" w:w="110"/>
@@ -28235,7 +28235,7 @@
       <w:pPr>
         <w:pStyle w:val="Heading1"/>
         <w:pageBreakBefore/>
-        <w:shd w:fill="4F3252" w:val="clear"/>
+        <w:shd w:fill="35824B" w:val="clear"/>
         <w:spacing w:after="40" w:before="0"/>
       </w:pPr>
       <w:r>
@@ -28252,7 +28252,7 @@
           <w:rFonts w:ascii="Georgia" w:cs="Georgia" w:eastAsia="Georgia" w:hAnsi="Georgia"/>
           <w:i/>
           <w:iCs/>
-          <w:color w:val="4F3252"/>
+          <w:color w:val="35824B"/>
           <w:sz w:val="28"/>
           <w:szCs w:val="28"/>
         </w:rPr>
@@ -28378,7 +28378,7 @@
               <w:bottom w:val="single" w:color="CFE3DF" w:sz="4"/>
               <w:right w:val="single" w:color="CFE3DF" w:sz="4"/>
             </w:tcBorders>
-            <w:shd w:fill="4F3252" w:val="clear"/>
+            <w:shd w:fill="35824B" w:val="clear"/>
             <w:tcMar>
               <w:top w:type="dxa" w:w="40"/>
               <w:left w:type="dxa" w:w="110"/>
@@ -28716,7 +28716,7 @@
               <w:bottom w:val="single" w:color="CFE3DF" w:sz="4"/>
               <w:right w:val="single" w:color="CFE3DF" w:sz="4"/>
             </w:tcBorders>
-            <w:shd w:fill="4F3252" w:val="clear"/>
+            <w:shd w:fill="35824B" w:val="clear"/>
             <w:tcMar>
               <w:top w:type="dxa" w:w="40"/>
               <w:left w:type="dxa" w:w="110"/>
@@ -28820,7 +28820,7 @@
               <w:bottom w:val="single" w:color="CFE3DF" w:sz="4"/>
               <w:right w:val="single" w:color="CFE3DF" w:sz="4"/>
             </w:tcBorders>
-            <w:shd w:fill="4F3252" w:val="clear"/>
+            <w:shd w:fill="35824B" w:val="clear"/>
             <w:tcMar>
               <w:top w:type="dxa" w:w="40"/>
               <w:left w:type="dxa" w:w="110"/>
@@ -28853,7 +28853,7 @@
               <w:bottom w:val="single" w:color="CFE3DF" w:sz="4"/>
               <w:right w:val="single" w:color="CFE3DF" w:sz="4"/>
             </w:tcBorders>
-            <w:shd w:fill="4F3252" w:val="clear"/>
+            <w:shd w:fill="35824B" w:val="clear"/>
             <w:tcMar>
               <w:top w:type="dxa" w:w="40"/>
               <w:left w:type="dxa" w:w="110"/>
@@ -28886,7 +28886,7 @@
               <w:bottom w:val="single" w:color="CFE3DF" w:sz="4"/>
               <w:right w:val="single" w:color="CFE3DF" w:sz="4"/>
             </w:tcBorders>
-            <w:shd w:fill="4F3252" w:val="clear"/>
+            <w:shd w:fill="35824B" w:val="clear"/>
             <w:tcMar>
               <w:top w:type="dxa" w:w="40"/>
               <w:left w:type="dxa" w:w="110"/>
@@ -29015,7 +29015,7 @@
       <w:pPr>
         <w:pStyle w:val="Heading1"/>
         <w:pageBreakBefore/>
-        <w:shd w:fill="1F5C52" w:val="clear"/>
+        <w:shd w:fill="6C3B91" w:val="clear"/>
         <w:spacing w:after="40" w:before="0"/>
       </w:pPr>
       <w:r>
@@ -29032,7 +29032,7 @@
           <w:rFonts w:ascii="Georgia" w:cs="Georgia" w:eastAsia="Georgia" w:hAnsi="Georgia"/>
           <w:i/>
           <w:iCs/>
-          <w:color w:val="1F5C52"/>
+          <w:color w:val="6C3B91"/>
           <w:sz w:val="28"/>
           <w:szCs w:val="28"/>
         </w:rPr>
@@ -29110,7 +29110,7 @@
               <w:bottom w:val="single" w:color="CFE3DF" w:sz="4"/>
               <w:right w:val="single" w:color="CFE3DF" w:sz="4"/>
             </w:tcBorders>
-            <w:shd w:fill="1F5C52" w:val="clear"/>
+            <w:shd w:fill="6C3B91" w:val="clear"/>
             <w:tcMar>
               <w:top w:type="dxa" w:w="40"/>
               <w:left w:type="dxa" w:w="110"/>
@@ -29384,7 +29384,7 @@
               <w:bottom w:val="single" w:color="CFE3DF" w:sz="4"/>
               <w:right w:val="single" w:color="CFE3DF" w:sz="4"/>
             </w:tcBorders>
-            <w:shd w:fill="1F5C52" w:val="clear"/>
+            <w:shd w:fill="6C3B91" w:val="clear"/>
             <w:tcMar>
               <w:top w:type="dxa" w:w="40"/>
               <w:left w:type="dxa" w:w="110"/>
@@ -29534,7 +29534,7 @@
               <w:bottom w:val="single" w:color="CFE3DF" w:sz="4"/>
               <w:right w:val="single" w:color="CFE3DF" w:sz="4"/>
             </w:tcBorders>
-            <w:shd w:fill="1F5C52" w:val="clear"/>
+            <w:shd w:fill="6C3B91" w:val="clear"/>
             <w:tcMar>
               <w:top w:type="dxa" w:w="40"/>
               <w:left w:type="dxa" w:w="110"/>
@@ -29638,7 +29638,7 @@
               <w:bottom w:val="single" w:color="CFE3DF" w:sz="4"/>
               <w:right w:val="single" w:color="CFE3DF" w:sz="4"/>
             </w:tcBorders>
-            <w:shd w:fill="1F5C52" w:val="clear"/>
+            <w:shd w:fill="6C3B91" w:val="clear"/>
             <w:tcMar>
               <w:top w:type="dxa" w:w="40"/>
               <w:left w:type="dxa" w:w="110"/>
@@ -29671,7 +29671,7 @@
               <w:bottom w:val="single" w:color="CFE3DF" w:sz="4"/>
               <w:right w:val="single" w:color="CFE3DF" w:sz="4"/>
             </w:tcBorders>
-            <w:shd w:fill="1F5C52" w:val="clear"/>
+            <w:shd w:fill="6C3B91" w:val="clear"/>
             <w:tcMar>
               <w:top w:type="dxa" w:w="40"/>
               <w:left w:type="dxa" w:w="110"/>
@@ -29704,7 +29704,7 @@
               <w:bottom w:val="single" w:color="CFE3DF" w:sz="4"/>
               <w:right w:val="single" w:color="CFE3DF" w:sz="4"/>
             </w:tcBorders>
-            <w:shd w:fill="1F5C52" w:val="clear"/>
+            <w:shd w:fill="6C3B91" w:val="clear"/>
             <w:tcMar>
               <w:top w:type="dxa" w:w="40"/>
               <w:left w:type="dxa" w:w="110"/>
@@ -29833,7 +29833,7 @@
       <w:pPr>
         <w:pStyle w:val="Heading1"/>
         <w:pageBreakBefore/>
-        <w:shd w:fill="7A4F1D" w:val="clear"/>
+        <w:shd w:fill="7B7132" w:val="clear"/>
         <w:spacing w:after="40" w:before="0"/>
       </w:pPr>
       <w:r>
@@ -29850,7 +29850,7 @@
           <w:rFonts w:ascii="Georgia" w:cs="Georgia" w:eastAsia="Georgia" w:hAnsi="Georgia"/>
           <w:i/>
           <w:iCs/>
-          <w:color w:val="7A4F1D"/>
+          <w:color w:val="7B7132"/>
           <w:sz w:val="28"/>
           <w:szCs w:val="28"/>
         </w:rPr>
@@ -29960,7 +29960,7 @@
               <w:bottom w:val="single" w:color="CFE3DF" w:sz="4"/>
               <w:right w:val="single" w:color="CFE3DF" w:sz="4"/>
             </w:tcBorders>
-            <w:shd w:fill="7A4F1D" w:val="clear"/>
+            <w:shd w:fill="7B7132" w:val="clear"/>
             <w:tcMar>
               <w:top w:type="dxa" w:w="40"/>
               <w:left w:type="dxa" w:w="110"/>
@@ -30158,7 +30158,7 @@
               <w:bottom w:val="single" w:color="CFE3DF" w:sz="4"/>
               <w:right w:val="single" w:color="CFE3DF" w:sz="4"/>
             </w:tcBorders>
-            <w:shd w:fill="7A4F1D" w:val="clear"/>
+            <w:shd w:fill="7B7132" w:val="clear"/>
             <w:tcMar>
               <w:top w:type="dxa" w:w="40"/>
               <w:left w:type="dxa" w:w="110"/>
@@ -30262,7 +30262,7 @@
               <w:bottom w:val="single" w:color="CFE3DF" w:sz="4"/>
               <w:right w:val="single" w:color="CFE3DF" w:sz="4"/>
             </w:tcBorders>
-            <w:shd w:fill="7A4F1D" w:val="clear"/>
+            <w:shd w:fill="7B7132" w:val="clear"/>
             <w:tcMar>
               <w:top w:type="dxa" w:w="40"/>
               <w:left w:type="dxa" w:w="110"/>
@@ -30295,7 +30295,7 @@
               <w:bottom w:val="single" w:color="CFE3DF" w:sz="4"/>
               <w:right w:val="single" w:color="CFE3DF" w:sz="4"/>
             </w:tcBorders>
-            <w:shd w:fill="7A4F1D" w:val="clear"/>
+            <w:shd w:fill="7B7132" w:val="clear"/>
             <w:tcMar>
               <w:top w:type="dxa" w:w="40"/>
               <w:left w:type="dxa" w:w="110"/>
@@ -30328,7 +30328,7 @@
               <w:bottom w:val="single" w:color="CFE3DF" w:sz="4"/>
               <w:right w:val="single" w:color="CFE3DF" w:sz="4"/>
             </w:tcBorders>
-            <w:shd w:fill="7A4F1D" w:val="clear"/>
+            <w:shd w:fill="7B7132" w:val="clear"/>
             <w:tcMar>
               <w:top w:type="dxa" w:w="40"/>
               <w:left w:type="dxa" w:w="110"/>
@@ -30457,7 +30457,7 @@
       <w:pPr>
         <w:pStyle w:val="Heading1"/>
         <w:pageBreakBefore/>
-        <w:shd w:fill="324D61" w:val="clear"/>
+        <w:shd w:fill="387D8A" w:val="clear"/>
         <w:spacing w:after="40" w:before="0"/>
       </w:pPr>
       <w:r>
@@ -30474,7 +30474,7 @@
           <w:rFonts w:ascii="Georgia" w:cs="Georgia" w:eastAsia="Georgia" w:hAnsi="Georgia"/>
           <w:i/>
           <w:iCs/>
-          <w:color w:val="324D61"/>
+          <w:color w:val="387D8A"/>
           <w:sz w:val="28"/>
           <w:szCs w:val="28"/>
         </w:rPr>
@@ -30740,7 +30740,7 @@
               <w:bottom w:val="single" w:color="CFE3DF" w:sz="4"/>
               <w:right w:val="single" w:color="CFE3DF" w:sz="4"/>
             </w:tcBorders>
-            <w:shd w:fill="324D61" w:val="clear"/>
+            <w:shd w:fill="387D8A" w:val="clear"/>
             <w:tcMar>
               <w:top w:type="dxa" w:w="40"/>
               <w:left w:type="dxa" w:w="110"/>
@@ -30844,7 +30844,7 @@
               <w:bottom w:val="single" w:color="CFE3DF" w:sz="4"/>
               <w:right w:val="single" w:color="CFE3DF" w:sz="4"/>
             </w:tcBorders>
-            <w:shd w:fill="324D61" w:val="clear"/>
+            <w:shd w:fill="387D8A" w:val="clear"/>
             <w:tcMar>
               <w:top w:type="dxa" w:w="40"/>
               <w:left w:type="dxa" w:w="110"/>
@@ -30877,7 +30877,7 @@
               <w:bottom w:val="single" w:color="CFE3DF" w:sz="4"/>
               <w:right w:val="single" w:color="CFE3DF" w:sz="4"/>
             </w:tcBorders>
-            <w:shd w:fill="324D61" w:val="clear"/>
+            <w:shd w:fill="387D8A" w:val="clear"/>
             <w:tcMar>
               <w:top w:type="dxa" w:w="40"/>
               <w:left w:type="dxa" w:w="110"/>
@@ -30910,7 +30910,7 @@
               <w:bottom w:val="single" w:color="CFE3DF" w:sz="4"/>
               <w:right w:val="single" w:color="CFE3DF" w:sz="4"/>
             </w:tcBorders>
-            <w:shd w:fill="324D61" w:val="clear"/>
+            <w:shd w:fill="387D8A" w:val="clear"/>
             <w:tcMar>
               <w:top w:type="dxa" w:w="40"/>
               <w:left w:type="dxa" w:w="110"/>
@@ -31039,7 +31039,7 @@
       <w:pPr>
         <w:pStyle w:val="Heading1"/>
         <w:pageBreakBefore/>
-        <w:shd w:fill="7A474D" w:val="clear"/>
+        <w:shd w:fill="913B6A" w:val="clear"/>
         <w:spacing w:after="40" w:before="0"/>
       </w:pPr>
       <w:r>
@@ -31056,7 +31056,7 @@
           <w:rFonts w:ascii="Georgia" w:cs="Georgia" w:eastAsia="Georgia" w:hAnsi="Georgia"/>
           <w:i/>
           <w:iCs/>
-          <w:color w:val="7A474D"/>
+          <w:color w:val="913B6A"/>
           <w:sz w:val="28"/>
           <w:szCs w:val="28"/>
         </w:rPr>
@@ -31390,7 +31390,7 @@
               <w:bottom w:val="single" w:color="CFE3DF" w:sz="4"/>
               <w:right w:val="single" w:color="CFE3DF" w:sz="4"/>
             </w:tcBorders>
-            <w:shd w:fill="7A474D" w:val="clear"/>
+            <w:shd w:fill="913B6A" w:val="clear"/>
             <w:tcMar>
               <w:top w:type="dxa" w:w="40"/>
               <w:left w:type="dxa" w:w="110"/>
@@ -31494,7 +31494,7 @@
               <w:bottom w:val="single" w:color="CFE3DF" w:sz="4"/>
               <w:right w:val="single" w:color="CFE3DF" w:sz="4"/>
             </w:tcBorders>
-            <w:shd w:fill="7A474D" w:val="clear"/>
+            <w:shd w:fill="913B6A" w:val="clear"/>
             <w:tcMar>
               <w:top w:type="dxa" w:w="40"/>
               <w:left w:type="dxa" w:w="110"/>
@@ -31527,7 +31527,7 @@
               <w:bottom w:val="single" w:color="CFE3DF" w:sz="4"/>
               <w:right w:val="single" w:color="CFE3DF" w:sz="4"/>
             </w:tcBorders>
-            <w:shd w:fill="7A474D" w:val="clear"/>
+            <w:shd w:fill="913B6A" w:val="clear"/>
             <w:tcMar>
               <w:top w:type="dxa" w:w="40"/>
               <w:left w:type="dxa" w:w="110"/>
@@ -31560,7 +31560,7 @@
               <w:bottom w:val="single" w:color="CFE3DF" w:sz="4"/>
               <w:right w:val="single" w:color="CFE3DF" w:sz="4"/>
             </w:tcBorders>
-            <w:shd w:fill="7A474D" w:val="clear"/>
+            <w:shd w:fill="913B6A" w:val="clear"/>
             <w:tcMar>
               <w:top w:type="dxa" w:w="40"/>
               <w:left w:type="dxa" w:w="110"/>
@@ -31689,7 +31689,7 @@
       <w:pPr>
         <w:pStyle w:val="Heading1"/>
         <w:pageBreakBefore/>
-        <w:shd w:fill="2C4D35" w:val="clear"/>
+        <w:shd w:fill="498235" w:val="clear"/>
         <w:spacing w:after="40" w:before="0"/>
       </w:pPr>
       <w:r>
@@ -31706,7 +31706,7 @@
           <w:rFonts w:ascii="Georgia" w:cs="Georgia" w:eastAsia="Georgia" w:hAnsi="Georgia"/>
           <w:i/>
           <w:iCs/>
-          <w:color w:val="2C4D35"/>
+          <w:color w:val="498235"/>
           <w:sz w:val="28"/>
           <w:szCs w:val="28"/>
         </w:rPr>
@@ -32094,7 +32094,7 @@
             </w:pPr>
             <w:r>
               <w:rPr>
-                <w:color w:val="2C4D35"/>
+                <w:color w:val="498235"/>
                 <w:sz w:val="18"/>
                 <w:szCs w:val="18"/>
               </w:rPr>
@@ -32339,7 +32339,7 @@
             </w:pPr>
             <w:r>
               <w:rPr>
-                <w:color w:val="2C4D35"/>
+                <w:color w:val="498235"/>
                 <w:sz w:val="18"/>
                 <w:szCs w:val="18"/>
               </w:rPr>
@@ -32514,7 +32514,7 @@
               <w:bottom w:val="single" w:color="CFE3DF" w:sz="4"/>
               <w:right w:val="single" w:color="CFE3DF" w:sz="4"/>
             </w:tcBorders>
-            <w:shd w:fill="2C4D35" w:val="clear"/>
+            <w:shd w:fill="498235" w:val="clear"/>
             <w:tcMar>
               <w:top w:type="dxa" w:w="40"/>
               <w:left w:type="dxa" w:w="110"/>
@@ -32618,7 +32618,7 @@
               <w:bottom w:val="single" w:color="CFE3DF" w:sz="4"/>
               <w:right w:val="single" w:color="CFE3DF" w:sz="4"/>
             </w:tcBorders>
-            <w:shd w:fill="2C4D35" w:val="clear"/>
+            <w:shd w:fill="498235" w:val="clear"/>
             <w:tcMar>
               <w:top w:type="dxa" w:w="40"/>
               <w:left w:type="dxa" w:w="110"/>
@@ -32651,7 +32651,7 @@
               <w:bottom w:val="single" w:color="CFE3DF" w:sz="4"/>
               <w:right w:val="single" w:color="CFE3DF" w:sz="4"/>
             </w:tcBorders>
-            <w:shd w:fill="2C4D35" w:val="clear"/>
+            <w:shd w:fill="498235" w:val="clear"/>
             <w:tcMar>
               <w:top w:type="dxa" w:w="40"/>
               <w:left w:type="dxa" w:w="110"/>
@@ -32684,7 +32684,7 @@
               <w:bottom w:val="single" w:color="CFE3DF" w:sz="4"/>
               <w:right w:val="single" w:color="CFE3DF" w:sz="4"/>
             </w:tcBorders>
-            <w:shd w:fill="2C4D35" w:val="clear"/>
+            <w:shd w:fill="498235" w:val="clear"/>
             <w:tcMar>
               <w:top w:type="dxa" w:w="40"/>
               <w:left w:type="dxa" w:w="110"/>
@@ -32813,7 +32813,7 @@
       <w:pPr>
         <w:pStyle w:val="Heading1"/>
         <w:pageBreakBefore/>
-        <w:shd w:fill="724026" w:val="clear"/>
+        <w:shd w:fill="3E3B91" w:val="clear"/>
         <w:spacing w:after="40" w:before="0"/>
       </w:pPr>
       <w:r>
@@ -32830,7 +32830,7 @@
           <w:rFonts w:ascii="Georgia" w:cs="Georgia" w:eastAsia="Georgia" w:hAnsi="Georgia"/>
           <w:i/>
           <w:iCs/>
-          <w:color w:val="724026"/>
+          <w:color w:val="3E3B91"/>
           <w:sz w:val="28"/>
           <w:szCs w:val="28"/>
         </w:rPr>
@@ -32984,7 +32984,7 @@
               <w:bottom w:val="single" w:color="CFE3DF" w:sz="4"/>
               <w:right w:val="single" w:color="CFE3DF" w:sz="4"/>
             </w:tcBorders>
-            <w:shd w:fill="724026" w:val="clear"/>
+            <w:shd w:fill="3E3B91" w:val="clear"/>
             <w:tcMar>
               <w:top w:type="dxa" w:w="40"/>
               <w:left w:type="dxa" w:w="110"/>
@@ -33206,7 +33206,7 @@
               <w:bottom w:val="single" w:color="CFE3DF" w:sz="4"/>
               <w:right w:val="single" w:color="CFE3DF" w:sz="4"/>
             </w:tcBorders>
-            <w:shd w:fill="724026" w:val="clear"/>
+            <w:shd w:fill="3E3B91" w:val="clear"/>
             <w:tcMar>
               <w:top w:type="dxa" w:w="40"/>
               <w:left w:type="dxa" w:w="110"/>
@@ -33310,7 +33310,7 @@
               <w:bottom w:val="single" w:color="CFE3DF" w:sz="4"/>
               <w:right w:val="single" w:color="CFE3DF" w:sz="4"/>
             </w:tcBorders>
-            <w:shd w:fill="724026" w:val="clear"/>
+            <w:shd w:fill="3E3B91" w:val="clear"/>
             <w:tcMar>
               <w:top w:type="dxa" w:w="40"/>
               <w:left w:type="dxa" w:w="110"/>
@@ -33343,7 +33343,7 @@
               <w:bottom w:val="single" w:color="CFE3DF" w:sz="4"/>
               <w:right w:val="single" w:color="CFE3DF" w:sz="4"/>
             </w:tcBorders>
-            <w:shd w:fill="724026" w:val="clear"/>
+            <w:shd w:fill="3E3B91" w:val="clear"/>
             <w:tcMar>
               <w:top w:type="dxa" w:w="40"/>
               <w:left w:type="dxa" w:w="110"/>
@@ -33376,7 +33376,7 @@
               <w:bottom w:val="single" w:color="CFE3DF" w:sz="4"/>
               <w:right w:val="single" w:color="CFE3DF" w:sz="4"/>
             </w:tcBorders>
-            <w:shd w:fill="724026" w:val="clear"/>
+            <w:shd w:fill="3E3B91" w:val="clear"/>
             <w:tcMar>
               <w:top w:type="dxa" w:w="40"/>
               <w:left w:type="dxa" w:w="110"/>
@@ -33505,7 +33505,7 @@
       <w:pPr>
         <w:pStyle w:val="Heading1"/>
         <w:pageBreakBefore/>
-        <w:shd w:fill="7A5F2C" w:val="clear"/>
+        <w:shd w:fill="91573B" w:val="clear"/>
         <w:spacing w:after="40" w:before="0"/>
       </w:pPr>
       <w:r>
@@ -33522,7 +33522,7 @@
           <w:rFonts w:ascii="Georgia" w:cs="Georgia" w:eastAsia="Georgia" w:hAnsi="Georgia"/>
           <w:i/>
           <w:iCs/>
-          <w:color w:val="7A5F2C"/>
+          <w:color w:val="91573B"/>
           <w:sz w:val="28"/>
           <w:szCs w:val="28"/>
         </w:rPr>
@@ -33664,7 +33664,7 @@
               <w:bottom w:val="single" w:color="CFE3DF" w:sz="4"/>
               <w:right w:val="single" w:color="CFE3DF" w:sz="4"/>
             </w:tcBorders>
-            <w:shd w:fill="7A5F2C" w:val="clear"/>
+            <w:shd w:fill="91573B" w:val="clear"/>
             <w:tcMar>
               <w:top w:type="dxa" w:w="40"/>
               <w:left w:type="dxa" w:w="110"/>
@@ -33978,7 +33978,7 @@
               <w:bottom w:val="single" w:color="CFE3DF" w:sz="4"/>
               <w:right w:val="single" w:color="CFE3DF" w:sz="4"/>
             </w:tcBorders>
-            <w:shd w:fill="7A5F2C" w:val="clear"/>
+            <w:shd w:fill="91573B" w:val="clear"/>
             <w:tcMar>
               <w:top w:type="dxa" w:w="40"/>
               <w:left w:type="dxa" w:w="110"/>
@@ -34082,7 +34082,7 @@
               <w:bottom w:val="single" w:color="CFE3DF" w:sz="4"/>
               <w:right w:val="single" w:color="CFE3DF" w:sz="4"/>
             </w:tcBorders>
-            <w:shd w:fill="7A5F2C" w:val="clear"/>
+            <w:shd w:fill="91573B" w:val="clear"/>
             <w:tcMar>
               <w:top w:type="dxa" w:w="40"/>
               <w:left w:type="dxa" w:w="110"/>
@@ -34115,7 +34115,7 @@
               <w:bottom w:val="single" w:color="CFE3DF" w:sz="4"/>
               <w:right w:val="single" w:color="CFE3DF" w:sz="4"/>
             </w:tcBorders>
-            <w:shd w:fill="7A5F2C" w:val="clear"/>
+            <w:shd w:fill="91573B" w:val="clear"/>
             <w:tcMar>
               <w:top w:type="dxa" w:w="40"/>
               <w:left w:type="dxa" w:w="110"/>
@@ -34148,7 +34148,7 @@
               <w:bottom w:val="single" w:color="CFE3DF" w:sz="4"/>
               <w:right w:val="single" w:color="CFE3DF" w:sz="4"/>
             </w:tcBorders>
-            <w:shd w:fill="7A5F2C" w:val="clear"/>
+            <w:shd w:fill="91573B" w:val="clear"/>
             <w:tcMar>
               <w:top w:type="dxa" w:w="40"/>
               <w:left w:type="dxa" w:w="110"/>
@@ -34277,7 +34277,7 @@
       <w:pPr>
         <w:pStyle w:val="Heading1"/>
         <w:pageBreakBefore/>
-        <w:shd w:fill="4F3252" w:val="clear"/>
+        <w:shd w:fill="358265" w:val="clear"/>
         <w:spacing w:after="40" w:before="0"/>
       </w:pPr>
       <w:r>
@@ -34294,7 +34294,7 @@
           <w:rFonts w:ascii="Georgia" w:cs="Georgia" w:eastAsia="Georgia" w:hAnsi="Georgia"/>
           <w:i/>
           <w:iCs/>
-          <w:color w:val="4F3252"/>
+          <w:color w:val="358265"/>
           <w:sz w:val="28"/>
           <w:szCs w:val="28"/>
         </w:rPr>
@@ -34472,7 +34472,7 @@
               <w:bottom w:val="single" w:color="CFE3DF" w:sz="4"/>
               <w:right w:val="single" w:color="CFE3DF" w:sz="4"/>
             </w:tcBorders>
-            <w:shd w:fill="4F3252" w:val="clear"/>
+            <w:shd w:fill="358265" w:val="clear"/>
             <w:tcMar>
               <w:top w:type="dxa" w:w="40"/>
               <w:left w:type="dxa" w:w="110"/>
@@ -34654,7 +34654,7 @@
               <w:bottom w:val="single" w:color="CFE3DF" w:sz="4"/>
               <w:right w:val="single" w:color="CFE3DF" w:sz="4"/>
             </w:tcBorders>
-            <w:shd w:fill="4F3252" w:val="clear"/>
+            <w:shd w:fill="358265" w:val="clear"/>
             <w:tcMar>
               <w:top w:type="dxa" w:w="40"/>
               <w:left w:type="dxa" w:w="110"/>
@@ -34758,7 +34758,7 @@
               <w:bottom w:val="single" w:color="CFE3DF" w:sz="4"/>
               <w:right w:val="single" w:color="CFE3DF" w:sz="4"/>
             </w:tcBorders>
-            <w:shd w:fill="4F3252" w:val="clear"/>
+            <w:shd w:fill="358265" w:val="clear"/>
             <w:tcMar>
               <w:top w:type="dxa" w:w="40"/>
               <w:left w:type="dxa" w:w="110"/>
@@ -34791,7 +34791,7 @@
               <w:bottom w:val="single" w:color="CFE3DF" w:sz="4"/>
               <w:right w:val="single" w:color="CFE3DF" w:sz="4"/>
             </w:tcBorders>
-            <w:shd w:fill="4F3252" w:val="clear"/>
+            <w:shd w:fill="358265" w:val="clear"/>
             <w:tcMar>
               <w:top w:type="dxa" w:w="40"/>
               <w:left w:type="dxa" w:w="110"/>
@@ -34824,7 +34824,7 @@
               <w:bottom w:val="single" w:color="CFE3DF" w:sz="4"/>
               <w:right w:val="single" w:color="CFE3DF" w:sz="4"/>
             </w:tcBorders>
-            <w:shd w:fill="4F3252" w:val="clear"/>
+            <w:shd w:fill="358265" w:val="clear"/>
             <w:tcMar>
               <w:top w:type="dxa" w:w="40"/>
               <w:left w:type="dxa" w:w="110"/>
@@ -34953,7 +34953,7 @@
       <w:pPr>
         <w:pStyle w:val="Heading1"/>
         <w:pageBreakBefore/>
-        <w:shd w:fill="1F5C52" w:val="clear"/>
+        <w:shd w:fill="893B91" w:val="clear"/>
         <w:spacing w:after="40" w:before="0"/>
       </w:pPr>
       <w:r>
@@ -34970,7 +34970,7 @@
           <w:rFonts w:ascii="Georgia" w:cs="Georgia" w:eastAsia="Georgia" w:hAnsi="Georgia"/>
           <w:i/>
           <w:iCs/>
-          <w:color w:val="1F5C52"/>
+          <w:color w:val="893B91"/>
           <w:sz w:val="28"/>
           <w:szCs w:val="28"/>
         </w:rPr>
@@ -35124,7 +35124,7 @@
               <w:bottom w:val="single" w:color="CFE3DF" w:sz="4"/>
               <w:right w:val="single" w:color="CFE3DF" w:sz="4"/>
             </w:tcBorders>
-            <w:shd w:fill="1F5C52" w:val="clear"/>
+            <w:shd w:fill="893B91" w:val="clear"/>
             <w:tcMar>
               <w:top w:type="dxa" w:w="40"/>
               <w:left w:type="dxa" w:w="110"/>
@@ -35290,7 +35290,7 @@
               <w:bottom w:val="single" w:color="CFE3DF" w:sz="4"/>
               <w:right w:val="single" w:color="CFE3DF" w:sz="4"/>
             </w:tcBorders>
-            <w:shd w:fill="1F5C52" w:val="clear"/>
+            <w:shd w:fill="893B91" w:val="clear"/>
             <w:tcMar>
               <w:top w:type="dxa" w:w="40"/>
               <w:left w:type="dxa" w:w="110"/>
@@ -35394,7 +35394,7 @@
               <w:bottom w:val="single" w:color="CFE3DF" w:sz="4"/>
               <w:right w:val="single" w:color="CFE3DF" w:sz="4"/>
             </w:tcBorders>
-            <w:shd w:fill="1F5C52" w:val="clear"/>
+            <w:shd w:fill="893B91" w:val="clear"/>
             <w:tcMar>
               <w:top w:type="dxa" w:w="40"/>
               <w:left w:type="dxa" w:w="110"/>
@@ -35427,7 +35427,7 @@
               <w:bottom w:val="single" w:color="CFE3DF" w:sz="4"/>
               <w:right w:val="single" w:color="CFE3DF" w:sz="4"/>
             </w:tcBorders>
-            <w:shd w:fill="1F5C52" w:val="clear"/>
+            <w:shd w:fill="893B91" w:val="clear"/>
             <w:tcMar>
               <w:top w:type="dxa" w:w="40"/>
               <w:left w:type="dxa" w:w="110"/>
@@ -35460,7 +35460,7 @@
               <w:bottom w:val="single" w:color="CFE3DF" w:sz="4"/>
               <w:right w:val="single" w:color="CFE3DF" w:sz="4"/>
             </w:tcBorders>
-            <w:shd w:fill="1F5C52" w:val="clear"/>
+            <w:shd w:fill="893B91" w:val="clear"/>
             <w:tcMar>
               <w:top w:type="dxa" w:w="40"/>
               <w:left w:type="dxa" w:w="110"/>
@@ -35589,7 +35589,7 @@
       <w:pPr>
         <w:pStyle w:val="Heading1"/>
         <w:pageBreakBefore/>
-        <w:shd w:fill="7A4F1D" w:val="clear"/>
+        <w:shd w:fill="6D7B32" w:val="clear"/>
         <w:spacing w:after="40" w:before="0"/>
       </w:pPr>
       <w:r>
@@ -35606,7 +35606,7 @@
           <w:rFonts w:ascii="Georgia" w:cs="Georgia" w:eastAsia="Georgia" w:hAnsi="Georgia"/>
           <w:i/>
           <w:iCs/>
-          <w:color w:val="7A4F1D"/>
+          <w:color w:val="6D7B32"/>
           <w:sz w:val="28"/>
           <w:szCs w:val="28"/>
         </w:rPr>
@@ -35756,7 +35756,7 @@
               <w:bottom w:val="single" w:color="CFE3DF" w:sz="4"/>
               <w:right w:val="single" w:color="CFE3DF" w:sz="4"/>
             </w:tcBorders>
-            <w:shd w:fill="7A4F1D" w:val="clear"/>
+            <w:shd w:fill="6D7B32" w:val="clear"/>
             <w:tcMar>
               <w:top w:type="dxa" w:w="40"/>
               <w:left w:type="dxa" w:w="110"/>
@@ -35998,7 +35998,7 @@
               <w:bottom w:val="single" w:color="CFE3DF" w:sz="4"/>
               <w:right w:val="single" w:color="CFE3DF" w:sz="4"/>
             </w:tcBorders>
-            <w:shd w:fill="7A4F1D" w:val="clear"/>
+            <w:shd w:fill="6D7B32" w:val="clear"/>
             <w:tcMar>
               <w:top w:type="dxa" w:w="40"/>
               <w:left w:type="dxa" w:w="110"/>
@@ -36200,7 +36200,7 @@
               <w:bottom w:val="single" w:color="CFE3DF" w:sz="4"/>
               <w:right w:val="single" w:color="CFE3DF" w:sz="4"/>
             </w:tcBorders>
-            <w:shd w:fill="7A4F1D" w:val="clear"/>
+            <w:shd w:fill="6D7B32" w:val="clear"/>
             <w:tcMar>
               <w:top w:type="dxa" w:w="40"/>
               <w:left w:type="dxa" w:w="110"/>
@@ -36304,7 +36304,7 @@
               <w:bottom w:val="single" w:color="CFE3DF" w:sz="4"/>
               <w:right w:val="single" w:color="CFE3DF" w:sz="4"/>
             </w:tcBorders>
-            <w:shd w:fill="7A4F1D" w:val="clear"/>
+            <w:shd w:fill="6D7B32" w:val="clear"/>
             <w:tcMar>
               <w:top w:type="dxa" w:w="40"/>
               <w:left w:type="dxa" w:w="110"/>
@@ -36337,7 +36337,7 @@
               <w:bottom w:val="single" w:color="CFE3DF" w:sz="4"/>
               <w:right w:val="single" w:color="CFE3DF" w:sz="4"/>
             </w:tcBorders>
-            <w:shd w:fill="7A4F1D" w:val="clear"/>
+            <w:shd w:fill="6D7B32" w:val="clear"/>
             <w:tcMar>
               <w:top w:type="dxa" w:w="40"/>
               <w:left w:type="dxa" w:w="110"/>
@@ -36370,7 +36370,7 @@
               <w:bottom w:val="single" w:color="CFE3DF" w:sz="4"/>
               <w:right w:val="single" w:color="CFE3DF" w:sz="4"/>
             </w:tcBorders>
-            <w:shd w:fill="7A4F1D" w:val="clear"/>
+            <w:shd w:fill="6D7B32" w:val="clear"/>
             <w:tcMar>
               <w:top w:type="dxa" w:w="40"/>
               <w:left w:type="dxa" w:w="110"/>
@@ -36499,7 +36499,7 @@
       <w:pPr>
         <w:pStyle w:val="Heading1"/>
         <w:pageBreakBefore/>
-        <w:shd w:fill="324D61" w:val="clear"/>
+        <w:shd w:fill="3B6791" w:val="clear"/>
         <w:spacing w:after="40" w:before="0"/>
       </w:pPr>
       <w:r>
@@ -36516,7 +36516,7 @@
           <w:rFonts w:ascii="Georgia" w:cs="Georgia" w:eastAsia="Georgia" w:hAnsi="Georgia"/>
           <w:i/>
           <w:iCs/>
-          <w:color w:val="324D61"/>
+          <w:color w:val="3B6791"/>
           <w:sz w:val="28"/>
           <w:szCs w:val="28"/>
         </w:rPr>
@@ -36646,7 +36646,7 @@
               <w:bottom w:val="single" w:color="CFE3DF" w:sz="4"/>
               <w:right w:val="single" w:color="CFE3DF" w:sz="4"/>
             </w:tcBorders>
-            <w:shd w:fill="324D61" w:val="clear"/>
+            <w:shd w:fill="3B6791" w:val="clear"/>
             <w:tcMar>
               <w:top w:type="dxa" w:w="40"/>
               <w:left w:type="dxa" w:w="110"/>
@@ -36848,7 +36848,7 @@
               <w:bottom w:val="single" w:color="CFE3DF" w:sz="4"/>
               <w:right w:val="single" w:color="CFE3DF" w:sz="4"/>
             </w:tcBorders>
-            <w:shd w:fill="324D61" w:val="clear"/>
+            <w:shd w:fill="3B6791" w:val="clear"/>
             <w:tcMar>
               <w:top w:type="dxa" w:w="40"/>
               <w:left w:type="dxa" w:w="110"/>
@@ -36952,7 +36952,7 @@
               <w:bottom w:val="single" w:color="CFE3DF" w:sz="4"/>
               <w:right w:val="single" w:color="CFE3DF" w:sz="4"/>
             </w:tcBorders>
-            <w:shd w:fill="324D61" w:val="clear"/>
+            <w:shd w:fill="3B6791" w:val="clear"/>
             <w:tcMar>
               <w:top w:type="dxa" w:w="40"/>
               <w:left w:type="dxa" w:w="110"/>
@@ -36985,7 +36985,7 @@
               <w:bottom w:val="single" w:color="CFE3DF" w:sz="4"/>
               <w:right w:val="single" w:color="CFE3DF" w:sz="4"/>
             </w:tcBorders>
-            <w:shd w:fill="324D61" w:val="clear"/>
+            <w:shd w:fill="3B6791" w:val="clear"/>
             <w:tcMar>
               <w:top w:type="dxa" w:w="40"/>
               <w:left w:type="dxa" w:w="110"/>
@@ -37018,7 +37018,7 @@
               <w:bottom w:val="single" w:color="CFE3DF" w:sz="4"/>
               <w:right w:val="single" w:color="CFE3DF" w:sz="4"/>
             </w:tcBorders>
-            <w:shd w:fill="324D61" w:val="clear"/>
+            <w:shd w:fill="3B6791" w:val="clear"/>
             <w:tcMar>
               <w:top w:type="dxa" w:w="40"/>
               <w:left w:type="dxa" w:w="110"/>
@@ -37147,7 +37147,7 @@
       <w:pPr>
         <w:pStyle w:val="Heading1"/>
         <w:pageBreakBefore/>
-        <w:shd w:fill="7A474D" w:val="clear"/>
+        <w:shd w:fill="913B4E" w:val="clear"/>
         <w:spacing w:after="40" w:before="0"/>
       </w:pPr>
       <w:r>
@@ -37164,7 +37164,7 @@
           <w:rFonts w:ascii="Georgia" w:cs="Georgia" w:eastAsia="Georgia" w:hAnsi="Georgia"/>
           <w:i/>
           <w:iCs/>
-          <w:color w:val="7A474D"/>
+          <w:color w:val="913B4E"/>
           <w:sz w:val="28"/>
           <w:szCs w:val="28"/>
         </w:rPr>
@@ -37226,7 +37226,7 @@
               <w:bottom w:val="single" w:color="CFE3DF" w:sz="4"/>
               <w:right w:val="single" w:color="CFE3DF" w:sz="4"/>
             </w:tcBorders>
-            <w:shd w:fill="7A474D" w:val="clear"/>
+            <w:shd w:fill="913B4E" w:val="clear"/>
             <w:tcMar>
               <w:top w:type="dxa" w:w="40"/>
               <w:left w:type="dxa" w:w="110"/>
@@ -37344,7 +37344,7 @@
               <w:bottom w:val="single" w:color="CFE3DF" w:sz="4"/>
               <w:right w:val="single" w:color="CFE3DF" w:sz="4"/>
             </w:tcBorders>
-            <w:shd w:fill="7A474D" w:val="clear"/>
+            <w:shd w:fill="913B4E" w:val="clear"/>
             <w:tcMar>
               <w:top w:type="dxa" w:w="40"/>
               <w:left w:type="dxa" w:w="110"/>
@@ -37478,7 +37478,7 @@
               <w:bottom w:val="single" w:color="CFE3DF" w:sz="4"/>
               <w:right w:val="single" w:color="CFE3DF" w:sz="4"/>
             </w:tcBorders>
-            <w:shd w:fill="7A474D" w:val="clear"/>
+            <w:shd w:fill="913B4E" w:val="clear"/>
             <w:tcMar>
               <w:top w:type="dxa" w:w="40"/>
               <w:left w:type="dxa" w:w="110"/>
@@ -37582,7 +37582,7 @@
               <w:bottom w:val="single" w:color="CFE3DF" w:sz="4"/>
               <w:right w:val="single" w:color="CFE3DF" w:sz="4"/>
             </w:tcBorders>
-            <w:shd w:fill="7A474D" w:val="clear"/>
+            <w:shd w:fill="913B4E" w:val="clear"/>
             <w:tcMar>
               <w:top w:type="dxa" w:w="40"/>
               <w:left w:type="dxa" w:w="110"/>
@@ -37615,7 +37615,7 @@
               <w:bottom w:val="single" w:color="CFE3DF" w:sz="4"/>
               <w:right w:val="single" w:color="CFE3DF" w:sz="4"/>
             </w:tcBorders>
-            <w:shd w:fill="7A474D" w:val="clear"/>
+            <w:shd w:fill="913B4E" w:val="clear"/>
             <w:tcMar>
               <w:top w:type="dxa" w:w="40"/>
               <w:left w:type="dxa" w:w="110"/>
@@ -37648,7 +37648,7 @@
               <w:bottom w:val="single" w:color="CFE3DF" w:sz="4"/>
               <w:right w:val="single" w:color="CFE3DF" w:sz="4"/>
             </w:tcBorders>
-            <w:shd w:fill="7A474D" w:val="clear"/>
+            <w:shd w:fill="913B4E" w:val="clear"/>
             <w:tcMar>
               <w:top w:type="dxa" w:w="40"/>
               <w:left w:type="dxa" w:w="110"/>

</xml_diff>

<commit_message>
Workbook: link words in practice titles + inline shaded fill-in fields
- Run practice titles through the link logic too, so 'needs list' / 'feelings
  list' in a title (e.g. Week 4 Practice #1/#2) become hyperlinks. Non-link
  parts inherit the heading style.
- Replace the model+separate-cell template with INLINE input fields: each blank
  is a shaded, lightly underlined inline field (no underscores) typed directly
  into, so it clearly contains the input and stretches with the text. Links
  inside the template still work. 59 pages preserved.

Co-Authored-By: Claude Opus 4.8 (1M context) <noreply@anthropic.com>
</commit_message>
<xml_diff>
--- a/.local-workbook/The Compassion Course 2026-2027 Workbook.docx
+++ b/.local-workbook/The Compassion Course 2026-2027 Workbook.docx
@@ -558,7 +558,10 @@
         <w:spacing w:after="50" w:before="200"/>
       </w:pPr>
       <w:r>
-        <w:t xml:space="preserve">Practice #1 — Learn About and Notice Needs</w:t>
+        <w:t xml:space="preserve">Practice #1 — </w:t>
+      </w:r>
+      <w:r>
+        <w:t xml:space="preserve">Learn About and Notice Needs</w:t>
       </w:r>
     </w:p>
     <w:p>
@@ -576,7 +579,7 @@
         </w:rPr>
         <w:t xml:space="preserve">Keep a small journal with you throughout the day. Make 1 to 5 entries per day that include the description of an act or words spoken by someone and what need you imagine they were trying to meet. It is SUPER important to limit the words you use to those on the </w:t>
       </w:r>
-      <w:hyperlink w:history="1" r:id="rIdbyssb9tp1ptnfw4irzaso">
+      <w:hyperlink w:history="1" r:id="rIddfafcjvpdhx62l5h0otoc">
         <w:r>
           <w:rPr>
             <w:color w:val="1155CC"/>
@@ -697,7 +700,10 @@
         <w:spacing w:after="50" w:before="200"/>
       </w:pPr>
       <w:r>
-        <w:t xml:space="preserve">Practice #2 — Notice Needs — More Challenge</w:t>
+        <w:t xml:space="preserve">Practice #2 — </w:t>
+      </w:r>
+      <w:r>
+        <w:t xml:space="preserve">Notice Needs — More Challenge</w:t>
       </w:r>
     </w:p>
     <w:p>
@@ -715,7 +721,7 @@
         </w:rPr>
         <w:t xml:space="preserve">Think of someone who is close to you who is doing or saying something you don't like. See if you can figure out what need they are attempting to fulfill. Again, it is really important to limit the words you use to those on the </w:t>
       </w:r>
-      <w:hyperlink w:history="1" r:id="rIdhqu2nrcw_q2eeqk6lqpvx">
+      <w:hyperlink w:history="1" r:id="rId_lberb_fj1-ivotgpueaj">
         <w:r>
           <w:rPr>
             <w:color w:val="1155CC"/>
@@ -836,7 +842,10 @@
         <w:spacing w:after="50" w:before="200"/>
       </w:pPr>
       <w:r>
-        <w:t xml:space="preserve">Practice #3 — Join the Course's Global Compassion Network</w:t>
+        <w:t xml:space="preserve">Practice #3 — </w:t>
+      </w:r>
+      <w:r>
+        <w:t xml:space="preserve">Join the Course's Global Compassion Network</w:t>
       </w:r>
     </w:p>
     <w:p>
@@ -970,7 +979,10 @@
         <w:spacing w:after="50" w:before="200"/>
       </w:pPr>
       <w:r>
-        <w:t xml:space="preserve">Practice #4 — Consider Sharing the Course with Someone Who is Important to You</w:t>
+        <w:t xml:space="preserve">Practice #4 — </w:t>
+      </w:r>
+      <w:r>
+        <w:t xml:space="preserve">Consider Sharing the Course with Someone Who is Important to You</w:t>
       </w:r>
     </w:p>
     <w:p>
@@ -1004,7 +1016,7 @@
         </w:rPr>
         <w:t xml:space="preserve">Extended registration lasts for one week. To let someone know about the course you can use the following link: </w:t>
       </w:r>
-      <w:hyperlink w:history="1" r:id="rIdaqc6q1kbhv7k-_zhnhpkx">
+      <w:hyperlink w:history="1" r:id="rIdvz01i_fjdlp8moa4xwdsb">
         <w:r>
           <w:rPr>
             <w:color w:val="1155CC"/>
@@ -1385,7 +1397,10 @@
         <w:spacing w:after="50" w:before="200"/>
       </w:pPr>
       <w:r>
-        <w:t xml:space="preserve">Practice #1 — Noticing and Translating Judgments in Oneself</w:t>
+        <w:t xml:space="preserve">Practice #1 — </w:t>
+      </w:r>
+      <w:r>
+        <w:t xml:space="preserve">Noticing and Translating Judgments in Oneself</w:t>
       </w:r>
     </w:p>
     <w:p>
@@ -1403,7 +1418,7 @@
         </w:rPr>
         <w:t xml:space="preserve">Keep a small journal with you throughout the day. Make 1 to 5 entries per day that include judgment words you said or were thinking of saying. Later on, when you have time, sit down with the </w:t>
       </w:r>
-      <w:hyperlink w:history="1" r:id="rId39y0y-q6jntwoqzrxzt_n">
+      <w:hyperlink w:history="1" r:id="rIdznibp0jjjfg3n2ltp7gy-">
         <w:r>
           <w:rPr>
             <w:color w:val="1155CC"/>
@@ -1424,7 +1439,7 @@
         </w:rPr>
         <w:t xml:space="preserve"> and see if you can figure out what need of yours the judgment was (or is) related to. Remember, to successfully complete this exercise, limit the words you use to those on the </w:t>
       </w:r>
-      <w:hyperlink w:history="1" r:id="rIdrisd7yqqovt4gk2glgyls">
+      <w:hyperlink w:history="1" r:id="rIdnfsihrazdwissapzjy4xy">
         <w:r>
           <w:rPr>
             <w:color w:val="1155CC"/>
@@ -1545,7 +1560,10 @@
         <w:spacing w:after="50" w:before="200"/>
       </w:pPr>
       <w:r>
-        <w:t xml:space="preserve">Practice #2 — Noticing and Translating Judgments by Others</w:t>
+        <w:t xml:space="preserve">Practice #2 — </w:t>
+      </w:r>
+      <w:r>
+        <w:t xml:space="preserve">Noticing and Translating Judgments by Others</w:t>
       </w:r>
     </w:p>
     <w:p>
@@ -1563,7 +1581,7 @@
         </w:rPr>
         <w:t xml:space="preserve">Keep a small journal with you throughout the day. It could be a little book, a folded piece of paper or a napkin -anything you can write on. Make 1 to 5 entries per day that include judgment words spoken by someone. Later on, when you have time, sit down with the </w:t>
       </w:r>
-      <w:hyperlink w:history="1" r:id="rIdbjzu2_jn5fk-fr6oorbm7">
+      <w:hyperlink w:history="1" r:id="rIdmkzeauc-rrc3l4chykoar">
         <w:r>
           <w:rPr>
             <w:color w:val="1155CC"/>
@@ -1584,7 +1602,7 @@
         </w:rPr>
         <w:t xml:space="preserve"> and see if you can figure out what need was unmet for them. Remember to limit the words you use to those on the </w:t>
       </w:r>
-      <w:hyperlink w:history="1" r:id="rId9afiypx4rmotlkkjim_ex">
+      <w:hyperlink w:history="1" r:id="rIdqg-wrl5pflkfloucyy5ho">
         <w:r>
           <w:rPr>
             <w:color w:val="1155CC"/>
@@ -1705,7 +1723,10 @@
         <w:spacing w:after="50" w:before="200"/>
       </w:pPr>
       <w:r>
-        <w:t xml:space="preserve">Practice #3 — Judgment Liberation</w:t>
+        <w:t xml:space="preserve">Practice #3 — </w:t>
+      </w:r>
+      <w:r>
+        <w:t xml:space="preserve">Judgment Liberation</w:t>
       </w:r>
     </w:p>
     <w:p>
@@ -2083,7 +2104,10 @@
         <w:spacing w:after="50" w:before="200"/>
       </w:pPr>
       <w:r>
-        <w:t xml:space="preserve">Practice #1 — Notice Feelings</w:t>
+        <w:t xml:space="preserve">Practice #1 — </w:t>
+      </w:r>
+      <w:r>
+        <w:t xml:space="preserve">Notice Feelings</w:t>
       </w:r>
     </w:p>
     <w:p>
@@ -2117,7 +2141,7 @@
         </w:rPr>
         <w:t xml:space="preserve">Later on, when you have time, sit down with the </w:t>
       </w:r>
-      <w:hyperlink w:history="1" r:id="rIdcss76xkhhj-cmspd8sqru">
+      <w:hyperlink w:history="1" r:id="rIdsjlp8yfhpbh8isgd_o57d">
         <w:r>
           <w:rPr>
             <w:color w:val="1155CC"/>
@@ -2174,7 +2198,7 @@
         </w:rPr>
         <w:t xml:space="preserve"> at the top of the </w:t>
       </w:r>
-      <w:hyperlink w:history="1" r:id="rIdf7kk9odez5sjvkmaefxz0">
+      <w:hyperlink w:history="1" r:id="rIdggsdban4kdl_sx6vm76bc">
         <w:r>
           <w:rPr>
             <w:color w:val="1155CC"/>
@@ -2211,7 +2235,7 @@
         </w:rPr>
         <w:t xml:space="preserve">Then look at the </w:t>
       </w:r>
-      <w:hyperlink w:history="1" r:id="rIdbtauzug4nagfay9mbyvhc">
+      <w:hyperlink w:history="1" r:id="rId7apbtcimfuz17tmr9pnby">
         <w:r>
           <w:rPr>
             <w:color w:val="1155CC"/>
@@ -2232,7 +2256,7 @@
         </w:rPr>
         <w:t xml:space="preserve"> and see if you can figure out what need your feeling was about. Remember, it's VERY helpful to limit the words you use to those on the </w:t>
       </w:r>
-      <w:hyperlink w:history="1" r:id="rIdd4v8occ3mhybl3xynu8ez">
+      <w:hyperlink w:history="1" r:id="rIdvrqqnyrthax4lqgzbodam">
         <w:r>
           <w:rPr>
             <w:color w:val="1155CC"/>
@@ -2353,7 +2377,10 @@
         <w:spacing w:after="50" w:before="200"/>
       </w:pPr>
       <w:r>
-        <w:t xml:space="preserve">Practice #2 — Notice More Feelings</w:t>
+        <w:t xml:space="preserve">Practice #2 — </w:t>
+      </w:r>
+      <w:r>
+        <w:t xml:space="preserve">Notice More Feelings</w:t>
       </w:r>
     </w:p>
     <w:p>
@@ -2371,7 +2398,7 @@
         </w:rPr>
         <w:t xml:space="preserve">Keep a small journal with you throughout the day. Make 2 to 4 entries per day that include something you did, said or were thinking of saying and the feeling (or feelings) you experienced at that moment. Again, later on, when you have time, sit down with the </w:t>
       </w:r>
-      <w:hyperlink w:history="1" r:id="rIdqbd_2m6h0g0zbsetu_wyk">
+      <w:hyperlink w:history="1" r:id="rId6bye6fisdjkiulfxyejtu">
         <w:r>
           <w:rPr>
             <w:color w:val="1155CC"/>
@@ -2428,7 +2455,7 @@
         </w:rPr>
         <w:t xml:space="preserve"> at the top of the </w:t>
       </w:r>
-      <w:hyperlink w:history="1" r:id="rIdrotlnpwjjxqirrhbzq3it">
+      <w:hyperlink w:history="1" r:id="rIdweak6lv2edz25szx_qex9">
         <w:r>
           <w:rPr>
             <w:color w:val="1155CC"/>
@@ -2465,7 +2492,7 @@
         </w:rPr>
         <w:t xml:space="preserve">Then look at the </w:t>
       </w:r>
-      <w:hyperlink w:history="1" r:id="rIdc82s1b5ltf6_tmzq_ksrz">
+      <w:hyperlink w:history="1" r:id="rIdpqz4osu95lju_pyoe8a_0">
         <w:r>
           <w:rPr>
             <w:color w:val="1155CC"/>
@@ -2486,7 +2513,7 @@
         </w:rPr>
         <w:t xml:space="preserve"> and see if you can figure out what need your feeling was about. Remember, here too, it's VERY important to limit the words you use to those on the </w:t>
       </w:r>
-      <w:hyperlink w:history="1" r:id="rIdfgz5wbsupxshtwqtblkml">
+      <w:hyperlink w:history="1" r:id="rIdszj_ntu69os7npnypsgws">
         <w:r>
           <w:rPr>
             <w:color w:val="1155CC"/>
@@ -2867,7 +2894,22 @@
         <w:spacing w:after="50" w:before="200"/>
       </w:pPr>
       <w:r>
-        <w:t xml:space="preserve">Practice #1 — Read the needs list.</w:t>
+        <w:t xml:space="preserve">Practice #1 — </w:t>
+      </w:r>
+      <w:r>
+        <w:t xml:space="preserve">Read the </w:t>
+      </w:r>
+      <w:hyperlink w:history="1" r:id="rIdfwuldzoxdjczfyimcnyuk">
+        <w:r>
+          <w:rPr>
+            <w:color w:val="1155CC"/>
+            <w:u w:val="single"/>
+          </w:rPr>
+          <w:t xml:space="preserve">needs list</w:t>
+        </w:r>
+      </w:hyperlink>
+      <w:r>
+        <w:t xml:space="preserve">.</w:t>
       </w:r>
     </w:p>
     <w:p>
@@ -2985,7 +3027,22 @@
         <w:spacing w:after="50" w:before="200"/>
       </w:pPr>
       <w:r>
-        <w:t xml:space="preserve">Practice #2 — Print a copy of the needs list.</w:t>
+        <w:t xml:space="preserve">Practice #2 — </w:t>
+      </w:r>
+      <w:r>
+        <w:t xml:space="preserve">Print a copy of the </w:t>
+      </w:r>
+      <w:hyperlink w:history="1" r:id="rIdc8sz9rhyxoe_cjkhebfcp">
+        <w:r>
+          <w:rPr>
+            <w:color w:val="1155CC"/>
+            <w:u w:val="single"/>
+          </w:rPr>
+          <w:t xml:space="preserve">needs list</w:t>
+        </w:r>
+      </w:hyperlink>
+      <w:r>
+        <w:t xml:space="preserve">.</w:t>
       </w:r>
     </w:p>
     <w:p>
@@ -3119,7 +3176,10 @@
         <w:spacing w:after="50" w:before="200"/>
       </w:pPr>
       <w:r>
-        <w:t xml:space="preserve">Practice #3 — More Noticing Needs - Renew from Week 1</w:t>
+        <w:t xml:space="preserve">Practice #3 — </w:t>
+      </w:r>
+      <w:r>
+        <w:t xml:space="preserve">More Noticing Needs - Renew from Week 1</w:t>
       </w:r>
     </w:p>
     <w:p>
@@ -3137,7 +3197,7 @@
         </w:rPr>
         <w:t xml:space="preserve">Keep a small journal with you throughout the day. Make 1 to 5 entries per day that include an act or words spoken by someone and what need(s) you imagine they were trying to meet. Remember, it's VERY helpful to limit the words you use to those on the </w:t>
       </w:r>
-      <w:hyperlink w:history="1" r:id="rIdrvnkfq2ukgtv1gmopu0ck">
+      <w:hyperlink w:history="1" r:id="rIdkps4ml-h1hstsvmktsdsx">
         <w:r>
           <w:rPr>
             <w:color w:val="1155CC"/>
@@ -3258,7 +3318,10 @@
         <w:spacing w:after="50" w:before="200"/>
       </w:pPr>
       <w:r>
-        <w:t xml:space="preserve">Practice #4 — Liberation Exercise #2</w:t>
+        <w:t xml:space="preserve">Practice #4 — </w:t>
+      </w:r>
+      <w:r>
+        <w:t xml:space="preserve">Liberation Exercise #2</w:t>
       </w:r>
     </w:p>
     <w:p>
@@ -3276,7 +3339,7 @@
         </w:rPr>
         <w:t xml:space="preserve">Think of someone that you think is preventing you from getting a need(s) met. Write down the need(s) from the </w:t>
       </w:r>
-      <w:hyperlink w:history="1" r:id="rIdu_7ip_ixckssbgiirbsf2">
+      <w:hyperlink w:history="1" r:id="rIdt6hngjzv1ftpmzecb8i7n">
         <w:r>
           <w:rPr>
             <w:color w:val="1155CC"/>
@@ -3657,7 +3720,10 @@
         <w:spacing w:after="50" w:before="200"/>
       </w:pPr>
       <w:r>
-        <w:t xml:space="preserve">Practice #1 — Review the "Shifting Toward Compassion" exercise</w:t>
+        <w:t xml:space="preserve">Practice #1 — </w:t>
+      </w:r>
+      <w:r>
+        <w:t xml:space="preserve">Review the "Shifting Toward Compassion" exercise</w:t>
       </w:r>
     </w:p>
     <w:p>
@@ -3675,7 +3741,7 @@
         </w:rPr>
         <w:t xml:space="preserve">Visit: http://</w:t>
       </w:r>
-      <w:hyperlink w:history="1" r:id="rIdyz7mercjybz4ic8o929mk">
+      <w:hyperlink w:history="1" r:id="rIdm_zv2-homfk0qswlasgcy">
         <w:r>
           <w:rPr>
             <w:color w:val="1155CC"/>
@@ -3796,7 +3862,10 @@
         <w:spacing w:after="50" w:before="200"/>
       </w:pPr>
       <w:r>
-        <w:t xml:space="preserve">Practice #2 — Increasing Awareness</w:t>
+        <w:t xml:space="preserve">Practice #2 — </w:t>
+      </w:r>
+      <w:r>
+        <w:t xml:space="preserve">Increasing Awareness</w:t>
       </w:r>
     </w:p>
     <w:p>
@@ -3948,7 +4017,7 @@
         <w:keepLines/>
         <w:spacing w:after="60" w:before="0" w:line="276" w:lineRule="auto"/>
       </w:pPr>
-      <w:hyperlink w:history="1" r:id="rIdshwn9xuir8qkefvyzt3q3">
+      <w:hyperlink w:history="1" r:id="rId4hmqj6lt-irz0t2sjgnn9">
         <w:r>
           <w:rPr>
             <w:color w:val="1155CC"/>
@@ -4319,7 +4388,10 @@
         <w:spacing w:after="50" w:before="200"/>
       </w:pPr>
       <w:r>
-        <w:t xml:space="preserve">Practice #1 — "Shifting towards Compassion"</w:t>
+        <w:t xml:space="preserve">Practice #1 — </w:t>
+      </w:r>
+      <w:r>
+        <w:t xml:space="preserve">"Shifting towards Compassion"</w:t>
       </w:r>
     </w:p>
     <w:p>
@@ -4337,7 +4409,7 @@
         </w:rPr>
         <w:t xml:space="preserve">Continue working with this exercise (</w:t>
       </w:r>
-      <w:hyperlink w:history="1" r:id="rIdnfmuf_aclbg5opkfo7xnu">
+      <w:hyperlink w:history="1" r:id="rIdjdydw09qbhtwlrzf-r-84">
         <w:r>
           <w:rPr>
             <w:color w:val="1155CC"/>
@@ -4387,38 +4459,32 @@
               <w:bottom w:val="single" w:color="CFE3DF" w:sz="4"/>
               <w:right w:val="single" w:color="CFE3DF" w:sz="4"/>
             </w:tcBorders>
-            <w:shd w:fill="F1F1EE" w:val="clear"/>
-            <w:tcMar>
-              <w:top w:type="dxa" w:w="70"/>
+            <w:shd w:fill="FCFBF7" w:val="clear"/>
+            <w:tcMar>
+              <w:top w:type="dxa" w:w="100"/>
               <w:left w:type="dxa" w:w="130"/>
-              <w:bottom w:type="dxa" w:w="70"/>
+              <w:bottom w:type="dxa" w:w="100"/>
               <w:right w:type="dxa" w:w="130"/>
             </w:tcMar>
-          </w:tcPr>
-          <w:p>
-            <w:pPr>
-              <w:spacing w:after="50" w:before="0" w:line="240" w:lineRule="auto"/>
-            </w:pPr>
-            <w:r>
-              <w:rPr>
-                <w:b/>
-                <w:bCs/>
+            <w:vAlign w:val="top"/>
+          </w:tcPr>
+          <w:p>
+            <w:pPr>
+              <w:spacing w:after="0" w:before="0" w:line="320" w:lineRule="auto"/>
+            </w:pPr>
+            <w:r>
+              <w:rPr>
                 <w:color w:val="447E59"/>
-                <w:sz w:val="16"/>
-                <w:szCs w:val="16"/>
-              </w:rPr>
-              <w:t xml:space="preserve">✎  Write your version — for example:</w:t>
-            </w:r>
-          </w:p>
-          <w:p>
-            <w:pPr>
-              <w:spacing w:after="0" w:before="0" w:line="276" w:lineRule="auto"/>
-            </w:pPr>
+                <w:sz w:val="18"/>
+                <w:szCs w:val="18"/>
+              </w:rPr>
+              <w:t xml:space="preserve">✎  </w:t>
+            </w:r>
             <w:r>
               <w:rPr>
                 <w:i/>
                 <w:iCs/>
-                <w:color w:val="6B6B6B"/>
+                <w:color w:val="2D2D2D"/>
                 <w:sz w:val="20"/>
                 <w:szCs w:val="20"/>
               </w:rPr>
@@ -4428,58 +4494,31 @@
               <w:rPr>
                 <w:i/>
                 <w:iCs/>
-                <w:color w:val="6B6B6B"/>
+                <w:color w:val="2D2D2D"/>
                 <w:sz w:val="20"/>
                 <w:szCs w:val="20"/>
               </w:rPr>
-              <w:t xml:space="preserve">I'm telling myself ____</w:t>
+              <w:t xml:space="preserve">I'm telling myself </w:t>
+            </w:r>
+            <w:r>
+              <w:rPr>
+                <w:color w:val="2D2D2D"/>
+                <w:sz w:val="20"/>
+                <w:szCs w:val="20"/>
+                <w:u w:val="single" w:color="8A9099"/>
+                <w:shd w:fill="E4E7EC" w:val="clear"/>
+              </w:rPr>
+              <w:t xml:space="preserve">          </w:t>
             </w:r>
             <w:r>
               <w:rPr>
                 <w:i/>
                 <w:iCs/>
-                <w:color w:val="6B6B6B"/>
+                <w:color w:val="2D2D2D"/>
                 <w:sz w:val="20"/>
                 <w:szCs w:val="20"/>
               </w:rPr>
               <w:t xml:space="preserve">”</w:t>
-            </w:r>
-          </w:p>
-        </w:tc>
-      </w:tr>
-      <w:tr>
-        <w:trPr>
-          <w:cantSplit/>
-          <w:trHeight w:val="520" w:hRule="atLeast"/>
-        </w:trPr>
-        <w:tc>
-          <w:tcPr>
-            <w:tcW w:type="dxa" w:w="9360"/>
-            <w:tcBorders>
-              <w:top w:val="single" w:color="CFE3DF" w:sz="4"/>
-              <w:left w:val="single" w:color="CFE3DF" w:sz="4"/>
-              <w:bottom w:val="single" w:color="CFE3DF" w:sz="4"/>
-              <w:right w:val="single" w:color="CFE3DF" w:sz="4"/>
-            </w:tcBorders>
-            <w:shd w:fill="FCFBF7" w:val="clear"/>
-            <w:tcMar>
-              <w:top w:type="dxa" w:w="80"/>
-              <w:left w:type="dxa" w:w="130"/>
-              <w:bottom w:type="dxa" w:w="80"/>
-              <w:right w:type="dxa" w:w="130"/>
-            </w:tcMar>
-            <w:vAlign w:val="top"/>
-          </w:tcPr>
-          <w:p>
-            <w:pPr>
-              <w:spacing w:after="0" w:before="0"/>
-            </w:pPr>
-            <w:r>
-              <w:rPr>
-                <w:sz w:val="20"/>
-                <w:szCs w:val="20"/>
-              </w:rPr>
-              <w:t xml:space="preserve"/>
             </w:r>
           </w:p>
         </w:tc>
@@ -4620,7 +4659,10 @@
         <w:spacing w:after="50" w:before="200"/>
       </w:pPr>
       <w:r>
-        <w:t xml:space="preserve">Practice #2 — Experiencing Judgments versus Needs</w:t>
+        <w:t xml:space="preserve">Practice #2 — </w:t>
+      </w:r>
+      <w:r>
+        <w:t xml:space="preserve">Experiencing Judgments versus Needs</w:t>
       </w:r>
     </w:p>
     <w:p>
@@ -4678,7 +4720,7 @@
         </w:rPr>
         <w:t xml:space="preserve"> - take your time). Next, view or print a copy of the </w:t>
       </w:r>
-      <w:hyperlink w:history="1" r:id="rIdzsugrhzrgb-dbkzxt8bm4">
+      <w:hyperlink w:history="1" r:id="rIdoaup967qrgoqi1gfjbotm">
         <w:r>
           <w:rPr>
             <w:color w:val="1155CC"/>
@@ -4819,7 +4861,10 @@
         <w:spacing w:after="50" w:before="200"/>
       </w:pPr>
       <w:r>
-        <w:t xml:space="preserve">Practice #3 — Non-Feeling Word Game</w:t>
+        <w:t xml:space="preserve">Practice #3 — </w:t>
+      </w:r>
+      <w:r>
+        <w:t xml:space="preserve">Non-Feeling Word Game</w:t>
       </w:r>
     </w:p>
     <w:p>
@@ -4997,7 +5042,10 @@
         <w:spacing w:after="50" w:before="200"/>
       </w:pPr>
       <w:r>
-        <w:t xml:space="preserve">Practice #4 — Heavier Lifting</w:t>
+        <w:t xml:space="preserve">Practice #4 — </w:t>
+      </w:r>
+      <w:r>
+        <w:t xml:space="preserve">Heavier Lifting</w:t>
       </w:r>
     </w:p>
     <w:p>
@@ -5205,7 +5253,7 @@
         <w:keepLines/>
         <w:spacing w:after="60" w:before="0" w:line="276" w:lineRule="auto"/>
       </w:pPr>
-      <w:hyperlink w:history="1" r:id="rIdfep_fgiysx7xggdpfatvg">
+      <w:hyperlink w:history="1" r:id="rId8vfflrijnokbq-vkk2j5s">
         <w:r>
           <w:rPr>
             <w:color w:val="1155CC"/>
@@ -5576,7 +5624,10 @@
         <w:spacing w:after="50" w:before="200"/>
       </w:pPr>
       <w:r>
-        <w:t xml:space="preserve">Practice #1 — Me and My Feelings</w:t>
+        <w:t xml:space="preserve">Practice #1 — </w:t>
+      </w:r>
+      <w:r>
+        <w:t xml:space="preserve">Me and My Feelings</w:t>
       </w:r>
     </w:p>
     <w:p>
@@ -5726,7 +5777,10 @@
         <w:spacing w:after="50" w:before="200"/>
       </w:pPr>
       <w:r>
-        <w:t xml:space="preserve">Practice #2 — Deeper Exploration - Noticing What I Tell Myself About My Feelings</w:t>
+        <w:t xml:space="preserve">Practice #2 — </w:t>
+      </w:r>
+      <w:r>
+        <w:t xml:space="preserve">Deeper Exploration - Noticing What I Tell Myself About My Feelings</w:t>
       </w:r>
     </w:p>
     <w:p>
@@ -6192,7 +6246,10 @@
         <w:spacing w:after="50" w:before="200"/>
       </w:pPr>
       <w:r>
-        <w:t xml:space="preserve">Practice #1 — Start a Judgment Journal</w:t>
+        <w:t xml:space="preserve">Practice #1 — </w:t>
+      </w:r>
+      <w:r>
+        <w:t xml:space="preserve">Start a Judgment Journal</w:t>
       </w:r>
     </w:p>
     <w:p>
@@ -6322,7 +6379,7 @@
         </w:rPr>
         <w:t xml:space="preserve">Then look at the </w:t>
       </w:r>
-      <w:hyperlink w:history="1" r:id="rIdfeyd___f6as8c-vr0i5t5">
+      <w:hyperlink w:history="1" r:id="rIdhyhzesqczlpbklu8rro_u">
         <w:r>
           <w:rPr>
             <w:color w:val="1155CC"/>
@@ -6703,7 +6760,10 @@
         <w:spacing w:after="50" w:before="200"/>
       </w:pPr>
       <w:r>
-        <w:t xml:space="preserve">Practice #1 — Noticing Disconnecting Habitual Thoughts</w:t>
+        <w:t xml:space="preserve">Practice #1 — </w:t>
+      </w:r>
+      <w:r>
+        <w:t xml:space="preserve">Noticing Disconnecting Habitual Thoughts</w:t>
       </w:r>
     </w:p>
     <w:p>
@@ -6997,7 +7057,10 @@
         <w:spacing w:after="50" w:before="200"/>
       </w:pPr>
       <w:r>
-        <w:t xml:space="preserve">Practice #2 — Start or Continue Your Judgment Journal</w:t>
+        <w:t xml:space="preserve">Practice #2 — </w:t>
+      </w:r>
+      <w:r>
+        <w:t xml:space="preserve">Start or Continue Your Judgment Journal</w:t>
       </w:r>
     </w:p>
     <w:p>
@@ -7031,7 +7094,7 @@
         </w:rPr>
         <w:t xml:space="preserve">Later on, when you have time, read over your journal for the day. Next, check in with yourself about how you feel as you think about those thoughts. Then look at the </w:t>
       </w:r>
-      <w:hyperlink w:history="1" r:id="rIdhvvwz5v0qelptkzwz4phu">
+      <w:hyperlink w:history="1" r:id="rIdfmdnzfbdlob2s2hneaw-j">
         <w:r>
           <w:rPr>
             <w:color w:val="1155CC"/>
@@ -7428,7 +7491,10 @@
         <w:spacing w:after="50" w:before="200"/>
       </w:pPr>
       <w:r>
-        <w:t xml:space="preserve">Practice #1 — Increase Your Awareness</w:t>
+        <w:t xml:space="preserve">Practice #1 — </w:t>
+      </w:r>
+      <w:r>
+        <w:t xml:space="preserve">Increase Your Awareness</w:t>
       </w:r>
     </w:p>
     <w:p>
@@ -7486,7 +7552,7 @@
         </w:rPr>
         <w:t xml:space="preserve"> response would be. What was that person feeling? What was that person needing, wanting to have more of, or yearning to experience? Check the </w:t>
       </w:r>
-      <w:hyperlink w:history="1" r:id="rIdajv4ve6tdq7-s-fpfzpbp">
+      <w:hyperlink w:history="1" r:id="rIdxexn0twd9wezhrrqbcx_n">
         <w:r>
           <w:rPr>
             <w:color w:val="1155CC"/>
@@ -7507,7 +7573,7 @@
         </w:rPr>
         <w:t xml:space="preserve"> and the </w:t>
       </w:r>
-      <w:hyperlink w:history="1" r:id="rIdbprectz-vk3dsf9prxvpa">
+      <w:hyperlink w:history="1" r:id="rIdt3hbizggnai3in70szjz5">
         <w:r>
           <w:rPr>
             <w:color w:val="1155CC"/>
@@ -7628,7 +7694,10 @@
         <w:spacing w:after="50" w:before="200"/>
       </w:pPr>
       <w:r>
-        <w:t xml:space="preserve">Practice #2 — Play the Empathy/Non-Empathy Game</w:t>
+        <w:t xml:space="preserve">Practice #2 — </w:t>
+      </w:r>
+      <w:r>
+        <w:t xml:space="preserve">Play the Empathy/Non-Empathy Game</w:t>
       </w:r>
     </w:p>
     <w:p>
@@ -7895,38 +7964,32 @@
               <w:bottom w:val="single" w:color="CFE3DF" w:sz="4"/>
               <w:right w:val="single" w:color="CFE3DF" w:sz="4"/>
             </w:tcBorders>
-            <w:shd w:fill="F1F1EE" w:val="clear"/>
-            <w:tcMar>
-              <w:top w:type="dxa" w:w="70"/>
+            <w:shd w:fill="FCFBF7" w:val="clear"/>
+            <w:tcMar>
+              <w:top w:type="dxa" w:w="100"/>
               <w:left w:type="dxa" w:w="130"/>
-              <w:bottom w:type="dxa" w:w="70"/>
+              <w:bottom w:type="dxa" w:w="100"/>
               <w:right w:type="dxa" w:w="130"/>
             </w:tcMar>
-          </w:tcPr>
-          <w:p>
-            <w:pPr>
-              <w:spacing w:after="50" w:before="0" w:line="240" w:lineRule="auto"/>
-            </w:pPr>
-            <w:r>
-              <w:rPr>
-                <w:b/>
-                <w:bCs/>
+            <w:vAlign w:val="top"/>
+          </w:tcPr>
+          <w:p>
+            <w:pPr>
+              <w:spacing w:after="0" w:before="0" w:line="320" w:lineRule="auto"/>
+            </w:pPr>
+            <w:r>
+              <w:rPr>
                 <w:color w:val="985273"/>
-                <w:sz w:val="16"/>
-                <w:szCs w:val="16"/>
-              </w:rPr>
-              <w:t xml:space="preserve">✎  Write your version — for example:</w:t>
-            </w:r>
-          </w:p>
-          <w:p>
-            <w:pPr>
-              <w:spacing w:after="0" w:before="0" w:line="276" w:lineRule="auto"/>
-            </w:pPr>
+                <w:sz w:val="18"/>
+                <w:szCs w:val="18"/>
+              </w:rPr>
+              <w:t xml:space="preserve">✎  </w:t>
+            </w:r>
             <w:r>
               <w:rPr>
                 <w:i/>
                 <w:iCs/>
-                <w:color w:val="6B6B6B"/>
+                <w:color w:val="2D2D2D"/>
                 <w:sz w:val="20"/>
                 <w:szCs w:val="20"/>
               </w:rPr>
@@ -7936,13 +7999,33 @@
               <w:rPr>
                 <w:i/>
                 <w:iCs/>
-                <w:color w:val="6B6B6B"/>
+                <w:color w:val="2D2D2D"/>
                 <w:sz w:val="20"/>
                 <w:szCs w:val="20"/>
               </w:rPr>
-              <w:t xml:space="preserve">Are you feeling ______ (feeling from the </w:t>
-            </w:r>
-            <w:hyperlink w:history="1" r:id="rId7hv8iv4eqlqxtbxyiuxyg">
+              <w:t xml:space="preserve">Are you feeling </w:t>
+            </w:r>
+            <w:r>
+              <w:rPr>
+                <w:color w:val="2D2D2D"/>
+                <w:sz w:val="20"/>
+                <w:szCs w:val="20"/>
+                <w:u w:val="single" w:color="8A9099"/>
+                <w:shd w:fill="E4E7EC" w:val="clear"/>
+              </w:rPr>
+              <w:t xml:space="preserve">          </w:t>
+            </w:r>
+            <w:r>
+              <w:rPr>
+                <w:i/>
+                <w:iCs/>
+                <w:color w:val="2D2D2D"/>
+                <w:sz w:val="20"/>
+                <w:szCs w:val="20"/>
+              </w:rPr>
+              <w:t xml:space="preserve"> (feeling from the </w:t>
+            </w:r>
+            <w:hyperlink w:history="1" r:id="rIdbdftpt9undhv5j3yj-twe">
               <w:r>
                 <w:rPr>
                   <w:color w:val="1155CC"/>
@@ -7957,13 +8040,33 @@
               <w:rPr>
                 <w:i/>
                 <w:iCs/>
-                <w:color w:val="6B6B6B"/>
+                <w:color w:val="2D2D2D"/>
                 <w:sz w:val="20"/>
                 <w:szCs w:val="20"/>
               </w:rPr>
-              <w:t xml:space="preserve">) because you need more ______ (need from the </w:t>
-            </w:r>
-            <w:hyperlink w:history="1" r:id="rIdm7nsh_yq-eium82-l43bx">
+              <w:t xml:space="preserve">) because you need more </w:t>
+            </w:r>
+            <w:r>
+              <w:rPr>
+                <w:color w:val="2D2D2D"/>
+                <w:sz w:val="20"/>
+                <w:szCs w:val="20"/>
+                <w:u w:val="single" w:color="8A9099"/>
+                <w:shd w:fill="E4E7EC" w:val="clear"/>
+              </w:rPr>
+              <w:t xml:space="preserve">          </w:t>
+            </w:r>
+            <w:r>
+              <w:rPr>
+                <w:i/>
+                <w:iCs/>
+                <w:color w:val="2D2D2D"/>
+                <w:sz w:val="20"/>
+                <w:szCs w:val="20"/>
+              </w:rPr>
+              <w:t xml:space="preserve"> (need from the </w:t>
+            </w:r>
+            <w:hyperlink w:history="1" r:id="rIdapy49mic0tpculkszskdc">
               <w:r>
                 <w:rPr>
                   <w:color w:val="1155CC"/>
@@ -7978,7 +8081,7 @@
               <w:rPr>
                 <w:i/>
                 <w:iCs/>
-                <w:color w:val="6B6B6B"/>
+                <w:color w:val="2D2D2D"/>
                 <w:sz w:val="20"/>
                 <w:szCs w:val="20"/>
               </w:rPr>
@@ -7988,48 +8091,11 @@
               <w:rPr>
                 <w:i/>
                 <w:iCs/>
-                <w:color w:val="6B6B6B"/>
+                <w:color w:val="2D2D2D"/>
                 <w:sz w:val="20"/>
                 <w:szCs w:val="20"/>
               </w:rPr>
               <w:t xml:space="preserve">”</w:t>
-            </w:r>
-          </w:p>
-        </w:tc>
-      </w:tr>
-      <w:tr>
-        <w:trPr>
-          <w:cantSplit/>
-          <w:trHeight w:val="520" w:hRule="atLeast"/>
-        </w:trPr>
-        <w:tc>
-          <w:tcPr>
-            <w:tcW w:type="dxa" w:w="9360"/>
-            <w:tcBorders>
-              <w:top w:val="single" w:color="CFE3DF" w:sz="4"/>
-              <w:left w:val="single" w:color="CFE3DF" w:sz="4"/>
-              <w:bottom w:val="single" w:color="CFE3DF" w:sz="4"/>
-              <w:right w:val="single" w:color="CFE3DF" w:sz="4"/>
-            </w:tcBorders>
-            <w:shd w:fill="FCFBF7" w:val="clear"/>
-            <w:tcMar>
-              <w:top w:type="dxa" w:w="80"/>
-              <w:left w:type="dxa" w:w="130"/>
-              <w:bottom w:type="dxa" w:w="80"/>
-              <w:right w:type="dxa" w:w="130"/>
-            </w:tcMar>
-            <w:vAlign w:val="top"/>
-          </w:tcPr>
-          <w:p>
-            <w:pPr>
-              <w:spacing w:after="0" w:before="0"/>
-            </w:pPr>
-            <w:r>
-              <w:rPr>
-                <w:sz w:val="20"/>
-                <w:szCs w:val="20"/>
-              </w:rPr>
-              <w:t xml:space="preserve"/>
             </w:r>
           </w:p>
         </w:tc>
@@ -8394,7 +8460,10 @@
         <w:spacing w:after="50" w:before="200"/>
       </w:pPr>
       <w:r>
-        <w:t xml:space="preserve">Practice #1 — Reminding and Remembering</w:t>
+        <w:t xml:space="preserve">Practice #1 — </w:t>
+      </w:r>
+      <w:r>
+        <w:t xml:space="preserve">Reminding and Remembering</w:t>
       </w:r>
     </w:p>
     <w:p>
@@ -8512,7 +8581,10 @@
         <w:spacing w:after="50" w:before="200"/>
       </w:pPr>
       <w:r>
-        <w:t xml:space="preserve">Practice #2 — Read or Join the GCN Community Message Forum</w:t>
+        <w:t xml:space="preserve">Practice #2 — </w:t>
+      </w:r>
+      <w:r>
+        <w:t xml:space="preserve">Read or Join the GCN Community Message Forum</w:t>
       </w:r>
     </w:p>
     <w:p>
@@ -8630,7 +8702,10 @@
         <w:spacing w:after="50" w:before="200"/>
       </w:pPr>
       <w:r>
-        <w:t xml:space="preserve">Practice #3 — Find an Empathy Buddy</w:t>
+        <w:t xml:space="preserve">Practice #3 — </w:t>
+      </w:r>
+      <w:r>
+        <w:t xml:space="preserve">Find an Empathy Buddy</w:t>
       </w:r>
     </w:p>
     <w:p>
@@ -8748,7 +8823,10 @@
         <w:spacing w:after="50" w:before="200"/>
       </w:pPr>
       <w:r>
-        <w:t xml:space="preserve">Practice #4 — Join a Practice Group</w:t>
+        <w:t xml:space="preserve">Practice #4 — </w:t>
+      </w:r>
+      <w:r>
+        <w:t xml:space="preserve">Join a Practice Group</w:t>
       </w:r>
     </w:p>
     <w:p>
@@ -9136,7 +9214,10 @@
         <w:spacing w:after="50" w:before="200"/>
       </w:pPr>
       <w:r>
-        <w:t xml:space="preserve">Practice #1 — Find Your Moment</w:t>
+        <w:t xml:space="preserve">Practice #1 — </w:t>
+      </w:r>
+      <w:r>
+        <w:t xml:space="preserve">Find Your Moment</w:t>
       </w:r>
     </w:p>
     <w:p>
@@ -9406,7 +9487,10 @@
         <w:spacing w:after="50" w:before="200"/>
       </w:pPr>
       <w:r>
-        <w:t xml:space="preserve">Practice #2 — Find Your Words</w:t>
+        <w:t xml:space="preserve">Practice #2 — </w:t>
+      </w:r>
+      <w:r>
+        <w:t xml:space="preserve">Find Your Words</w:t>
       </w:r>
     </w:p>
     <w:p>
@@ -9952,7 +10036,10 @@
         <w:spacing w:after="50" w:before="200"/>
       </w:pPr>
       <w:r>
-        <w:t xml:space="preserve">Practice #1 — Find Your Moment</w:t>
+        <w:t xml:space="preserve">Practice #1 — </w:t>
+      </w:r>
+      <w:r>
+        <w:t xml:space="preserve">Find Your Moment</w:t>
       </w:r>
     </w:p>
     <w:p>
@@ -10070,7 +10157,10 @@
         <w:spacing w:after="50" w:before="200"/>
       </w:pPr>
       <w:r>
-        <w:t xml:space="preserve">Practice #2 — Liberate Yourself</w:t>
+        <w:t xml:space="preserve">Practice #2 — </w:t>
+      </w:r>
+      <w:r>
+        <w:t xml:space="preserve">Liberate Yourself</w:t>
       </w:r>
     </w:p>
     <w:p>
@@ -10280,7 +10370,10 @@
         <w:spacing w:after="50" w:before="200"/>
       </w:pPr>
       <w:r>
-        <w:t xml:space="preserve">Practice #3 — Compassionate Understanding</w:t>
+        <w:t xml:space="preserve">Practice #3 — </w:t>
+      </w:r>
+      <w:r>
+        <w:t xml:space="preserve">Compassionate Understanding</w:t>
       </w:r>
     </w:p>
     <w:p>
@@ -10698,7 +10791,10 @@
         <w:spacing w:after="50" w:before="200"/>
       </w:pPr>
       <w:r>
-        <w:t xml:space="preserve">Practice #1 — Welcome Your Judgments</w:t>
+        <w:t xml:space="preserve">Practice #1 — </w:t>
+      </w:r>
+      <w:r>
+        <w:t xml:space="preserve">Welcome Your Judgments</w:t>
       </w:r>
     </w:p>
     <w:p>
@@ -10816,7 +10912,10 @@
         <w:spacing w:after="50" w:before="200"/>
       </w:pPr>
       <w:r>
-        <w:t xml:space="preserve">Practice #2 — Feel Your Feelings</w:t>
+        <w:t xml:space="preserve">Practice #2 — </w:t>
+      </w:r>
+      <w:r>
+        <w:t xml:space="preserve">Feel Your Feelings</w:t>
       </w:r>
     </w:p>
     <w:p>
@@ -11034,7 +11133,10 @@
         <w:spacing w:after="50" w:before="200"/>
       </w:pPr>
       <w:r>
-        <w:t xml:space="preserve">Practice #3 — Connect to Your Needs</w:t>
+        <w:t xml:space="preserve">Practice #3 — </w:t>
+      </w:r>
+      <w:r>
+        <w:t xml:space="preserve">Connect to Your Needs</w:t>
       </w:r>
     </w:p>
     <w:p>
@@ -11652,7 +11754,10 @@
         <w:spacing w:after="50" w:before="200"/>
       </w:pPr>
       <w:r>
-        <w:t xml:space="preserve">Practice #1 — Try for Some Connection</w:t>
+        <w:t xml:space="preserve">Practice #1 — </w:t>
+      </w:r>
+      <w:r>
+        <w:t xml:space="preserve">Try for Some Connection</w:t>
       </w:r>
     </w:p>
     <w:p>
@@ -12018,7 +12123,10 @@
         <w:spacing w:after="50" w:before="200"/>
       </w:pPr>
       <w:r>
-        <w:t xml:space="preserve">Practice #2 — Review and Support Yourself</w:t>
+        <w:t xml:space="preserve">Practice #2 — </w:t>
+      </w:r>
+      <w:r>
+        <w:t xml:space="preserve">Review and Support Yourself</w:t>
       </w:r>
     </w:p>
     <w:p>
@@ -12136,7 +12244,10 @@
         <w:spacing w:after="50" w:before="200"/>
       </w:pPr>
       <w:r>
-        <w:t xml:space="preserve">Practice #3 — Requesting Self-Connection</w:t>
+        <w:t xml:space="preserve">Practice #3 — </w:t>
+      </w:r>
+      <w:r>
+        <w:t xml:space="preserve">Requesting Self-Connection</w:t>
       </w:r>
     </w:p>
     <w:p>
@@ -12554,7 +12665,10 @@
         <w:spacing w:after="50" w:before="200"/>
       </w:pPr>
       <w:r>
-        <w:t xml:space="preserve">Practice #1 — Try Saying "No"</w:t>
+        <w:t xml:space="preserve">Practice #1 — </w:t>
+      </w:r>
+      <w:r>
+        <w:t xml:space="preserve">Try Saying "No"</w:t>
       </w:r>
     </w:p>
     <w:p>
@@ -12764,7 +12878,10 @@
         <w:spacing w:after="50" w:before="200"/>
       </w:pPr>
       <w:r>
-        <w:t xml:space="preserve">Practice #2 — Saying "No" Do-over</w:t>
+        <w:t xml:space="preserve">Practice #2 — </w:t>
+      </w:r>
+      <w:r>
+        <w:t xml:space="preserve">Saying "No" Do-over</w:t>
       </w:r>
     </w:p>
     <w:p>
@@ -12942,7 +13059,10 @@
         <w:spacing w:after="50" w:before="200"/>
       </w:pPr>
       <w:r>
-        <w:t xml:space="preserve">Practice #3 — Review and Support Yourself</w:t>
+        <w:t xml:space="preserve">Practice #3 — </w:t>
+      </w:r>
+      <w:r>
+        <w:t xml:space="preserve">Review and Support Yourself</w:t>
       </w:r>
     </w:p>
     <w:p>
@@ -13320,7 +13440,10 @@
         <w:spacing w:after="50" w:before="200"/>
       </w:pPr>
       <w:r>
-        <w:t xml:space="preserve">Practice #1 — Use of Force Do-over</w:t>
+        <w:t xml:space="preserve">Practice #1 — </w:t>
+      </w:r>
+      <w:r>
+        <w:t xml:space="preserve">Use of Force Do-over</w:t>
       </w:r>
     </w:p>
     <w:p>
@@ -13458,7 +13581,10 @@
         <w:spacing w:after="50" w:before="200"/>
       </w:pPr>
       <w:r>
-        <w:t xml:space="preserve">Practice #2 — Try Something New</w:t>
+        <w:t xml:space="preserve">Practice #2 — </w:t>
+      </w:r>
+      <w:r>
+        <w:t xml:space="preserve">Try Something New</w:t>
       </w:r>
     </w:p>
     <w:p>
@@ -13856,7 +13982,10 @@
         <w:spacing w:after="50" w:before="200"/>
       </w:pPr>
       <w:r>
-        <w:t xml:space="preserve">Practice #1 — Inventory Your Beliefs</w:t>
+        <w:t xml:space="preserve">Practice #1 — </w:t>
+      </w:r>
+      <w:r>
+        <w:t xml:space="preserve">Inventory Your Beliefs</w:t>
       </w:r>
     </w:p>
     <w:p>
@@ -13990,7 +14119,10 @@
         <w:spacing w:after="50" w:before="200"/>
       </w:pPr>
       <w:r>
-        <w:t xml:space="preserve">Practice #2 — Think of a New Belief</w:t>
+        <w:t xml:space="preserve">Practice #2 — </w:t>
+      </w:r>
+      <w:r>
+        <w:t xml:space="preserve">Think of a New Belief</w:t>
       </w:r>
     </w:p>
     <w:p>
@@ -14384,7 +14516,10 @@
         <w:spacing w:after="50" w:before="200"/>
       </w:pPr>
       <w:r>
-        <w:t xml:space="preserve">Practice #1 — Review the "Shifting to Compassion" Exercise</w:t>
+        <w:t xml:space="preserve">Practice #1 — </w:t>
+      </w:r>
+      <w:r>
+        <w:t xml:space="preserve">Review the "Shifting to Compassion" Exercise</w:t>
       </w:r>
     </w:p>
     <w:p>
@@ -14502,7 +14637,10 @@
         <w:spacing w:after="50" w:before="200"/>
       </w:pPr>
       <w:r>
-        <w:t xml:space="preserve">Practice #2 — Distinguishing Evaluations and Judgments</w:t>
+        <w:t xml:space="preserve">Practice #2 — </w:t>
+      </w:r>
+      <w:r>
+        <w:t xml:space="preserve">Distinguishing Evaluations and Judgments</w:t>
       </w:r>
     </w:p>
     <w:p>
@@ -14566,7 +14704,7 @@
         <w:keepLines/>
         <w:spacing w:after="60" w:before="0" w:line="276" w:lineRule="auto"/>
       </w:pPr>
-      <w:hyperlink w:history="1" r:id="rIddvflyghidh373sczt8-q4">
+      <w:hyperlink w:history="1" r:id="rIdc7px8xkdzxp0wcymmwt2z">
         <w:r>
           <w:rPr>
             <w:color w:val="1155CC"/>
@@ -14583,7 +14721,7 @@
         <w:keepLines/>
         <w:spacing w:after="60" w:before="0" w:line="276" w:lineRule="auto"/>
       </w:pPr>
-      <w:hyperlink w:history="1" r:id="rIdor2ug5lcilzwo0jdlyj3w">
+      <w:hyperlink w:history="1" r:id="rId4gw6uci_crzrar6blwcnm">
         <w:r>
           <w:rPr>
             <w:color w:val="1155CC"/>
@@ -14954,7 +15092,10 @@
         <w:spacing w:after="50" w:before="200"/>
       </w:pPr>
       <w:r>
-        <w:t xml:space="preserve">Practice #1 — Scary Honesty in Action</w:t>
+        <w:t xml:space="preserve">Practice #1 — </w:t>
+      </w:r>
+      <w:r>
+        <w:t xml:space="preserve">Scary Honesty in Action</w:t>
       </w:r>
     </w:p>
     <w:p>
@@ -14978,7 +15119,7 @@
         <w:keepLines/>
         <w:spacing w:after="60" w:before="0" w:line="276" w:lineRule="auto"/>
       </w:pPr>
-      <w:hyperlink w:history="1" r:id="rIdh3gzzowq_3ipd6adyx-me">
+      <w:hyperlink w:history="1" r:id="rIdelkkll8x7lacdtqyuxfuw">
         <w:r>
           <w:rPr>
             <w:color w:val="1155CC"/>
@@ -14995,7 +15136,7 @@
         <w:keepLines/>
         <w:spacing w:after="60" w:before="0" w:line="276" w:lineRule="auto"/>
       </w:pPr>
-      <w:hyperlink w:history="1" r:id="rIdlgxagytd3ifkubyojssky">
+      <w:hyperlink w:history="1" r:id="rIdjd2ylbcqu5wbikpo8ydmi">
         <w:r>
           <w:rPr>
             <w:color w:val="1155CC"/>
@@ -15366,7 +15507,10 @@
         <w:spacing w:after="50" w:before="200"/>
       </w:pPr>
       <w:r>
-        <w:t xml:space="preserve">Practice #1 — Practice Noticing</w:t>
+        <w:t xml:space="preserve">Practice #1 — </w:t>
+      </w:r>
+      <w:r>
+        <w:t xml:space="preserve">Practice Noticing</w:t>
       </w:r>
     </w:p>
     <w:p>
@@ -15500,7 +15644,10 @@
         <w:spacing w:after="50" w:before="200"/>
       </w:pPr>
       <w:r>
-        <w:t xml:space="preserve">Practice #2 — Share an Appreciation</w:t>
+        <w:t xml:space="preserve">Practice #2 — </w:t>
+      </w:r>
+      <w:r>
+        <w:t xml:space="preserve">Share an Appreciation</w:t>
       </w:r>
     </w:p>
     <w:p>
@@ -15560,7 +15707,7 @@
         <w:keepLines/>
         <w:spacing w:after="60" w:before="0" w:line="276" w:lineRule="auto"/>
       </w:pPr>
-      <w:hyperlink w:history="1" r:id="rIddukmyppv4z6id09_qj5c7">
+      <w:hyperlink w:history="1" r:id="rIdybctaetvl632_h6q1aiqd">
         <w:r>
           <w:rPr>
             <w:color w:val="1155CC"/>
@@ -15577,7 +15724,7 @@
         <w:keepLines/>
         <w:spacing w:after="60" w:before="0" w:line="276" w:lineRule="auto"/>
       </w:pPr>
-      <w:hyperlink w:history="1" r:id="rIdk3vppusimg9fvgaby3byw">
+      <w:hyperlink w:history="1" r:id="rId6r5lj3ag6o1iqucaonjm8">
         <w:r>
           <w:rPr>
             <w:color w:val="1155CC"/>
@@ -15948,7 +16095,10 @@
         <w:spacing w:after="50" w:before="200"/>
       </w:pPr>
       <w:r>
-        <w:t xml:space="preserve">Practice #1 — Check In Again</w:t>
+        <w:t xml:space="preserve">Practice #1 — </w:t>
+      </w:r>
+      <w:r>
+        <w:t xml:space="preserve">Check In Again</w:t>
       </w:r>
     </w:p>
     <w:p>
@@ -16066,7 +16216,10 @@
         <w:spacing w:after="50" w:before="200"/>
       </w:pPr>
       <w:r>
-        <w:t xml:space="preserve">Practice #2 — Appreciate Yourself</w:t>
+        <w:t xml:space="preserve">Practice #2 — </w:t>
+      </w:r>
+      <w:r>
+        <w:t xml:space="preserve">Appreciate Yourself</w:t>
       </w:r>
     </w:p>
     <w:p>
@@ -16210,7 +16363,10 @@
         <w:spacing w:after="50" w:before="200"/>
       </w:pPr>
       <w:r>
-        <w:t xml:space="preserve">Practice #3 — Renewed Sharing an Appreciation</w:t>
+        <w:t xml:space="preserve">Practice #3 — </w:t>
+      </w:r>
+      <w:r>
+        <w:t xml:space="preserve">Renewed Sharing an Appreciation</w:t>
       </w:r>
     </w:p>
     <w:p>
@@ -16636,7 +16792,10 @@
         <w:spacing w:after="50" w:before="200"/>
       </w:pPr>
       <w:r>
-        <w:t xml:space="preserve">Practice #1 — "Restoration Preparation"</w:t>
+        <w:t xml:space="preserve">Practice #1 — </w:t>
+      </w:r>
+      <w:r>
+        <w:t xml:space="preserve">"Restoration Preparation"</w:t>
       </w:r>
     </w:p>
     <w:p>
@@ -16899,38 +17058,32 @@
               <w:bottom w:val="single" w:color="CFE3DF" w:sz="4"/>
               <w:right w:val="single" w:color="CFE3DF" w:sz="4"/>
             </w:tcBorders>
-            <w:shd w:fill="F1F1EE" w:val="clear"/>
-            <w:tcMar>
-              <w:top w:type="dxa" w:w="70"/>
+            <w:shd w:fill="FCFBF7" w:val="clear"/>
+            <w:tcMar>
+              <w:top w:type="dxa" w:w="100"/>
               <w:left w:type="dxa" w:w="130"/>
-              <w:bottom w:type="dxa" w:w="70"/>
+              <w:bottom w:type="dxa" w:w="100"/>
               <w:right w:type="dxa" w:w="130"/>
             </w:tcMar>
-          </w:tcPr>
-          <w:p>
-            <w:pPr>
-              <w:spacing w:after="50" w:before="0" w:line="240" w:lineRule="auto"/>
-            </w:pPr>
-            <w:r>
-              <w:rPr>
-                <w:b/>
-                <w:bCs/>
+            <w:vAlign w:val="top"/>
+          </w:tcPr>
+          <w:p>
+            <w:pPr>
+              <w:spacing w:after="0" w:before="0" w:line="320" w:lineRule="auto"/>
+            </w:pPr>
+            <w:r>
+              <w:rPr>
                 <w:color w:val="985282"/>
-                <w:sz w:val="16"/>
-                <w:szCs w:val="16"/>
-              </w:rPr>
-              <w:t xml:space="preserve">✎  Write your version — for example:</w:t>
-            </w:r>
-          </w:p>
-          <w:p>
-            <w:pPr>
-              <w:spacing w:after="0" w:before="0" w:line="276" w:lineRule="auto"/>
-            </w:pPr>
+                <w:sz w:val="18"/>
+                <w:szCs w:val="18"/>
+              </w:rPr>
+              <w:t xml:space="preserve">✎  </w:t>
+            </w:r>
             <w:r>
               <w:rPr>
                 <w:i/>
                 <w:iCs/>
-                <w:color w:val="6B6B6B"/>
+                <w:color w:val="2D2D2D"/>
                 <w:sz w:val="20"/>
                 <w:szCs w:val="20"/>
               </w:rPr>
@@ -16940,58 +17093,61 @@
               <w:rPr>
                 <w:i/>
                 <w:iCs/>
-                <w:color w:val="6B6B6B"/>
+                <w:color w:val="2D2D2D"/>
                 <w:sz w:val="20"/>
                 <w:szCs w:val="20"/>
               </w:rPr>
-              <w:t xml:space="preserve">When I (did, said etc.), I would have loved to have shown more __________ (ex. care, consideration, etc.) - I know that had an impact on you and so it's really important to me. Now that I understand this, I would like to deal with that differently in the future, in a way that is more in alignment with my values and creates more__________.</w:t>
+              <w:t xml:space="preserve">When I (did, said etc.), I would have loved to have shown more </w:t>
+            </w:r>
+            <w:r>
+              <w:rPr>
+                <w:color w:val="2D2D2D"/>
+                <w:sz w:val="20"/>
+                <w:szCs w:val="20"/>
+                <w:u w:val="single" w:color="8A9099"/>
+                <w:shd w:fill="E4E7EC" w:val="clear"/>
+              </w:rPr>
+              <w:t xml:space="preserve">          </w:t>
             </w:r>
             <w:r>
               <w:rPr>
                 <w:i/>
                 <w:iCs/>
-                <w:color w:val="6B6B6B"/>
+                <w:color w:val="2D2D2D"/>
                 <w:sz w:val="20"/>
                 <w:szCs w:val="20"/>
               </w:rPr>
-              <w:t xml:space="preserve">”</w:t>
-            </w:r>
-          </w:p>
-        </w:tc>
-      </w:tr>
-      <w:tr>
-        <w:trPr>
-          <w:cantSplit/>
-          <w:trHeight w:val="520" w:hRule="atLeast"/>
-        </w:trPr>
-        <w:tc>
-          <w:tcPr>
-            <w:tcW w:type="dxa" w:w="9360"/>
-            <w:tcBorders>
-              <w:top w:val="single" w:color="CFE3DF" w:sz="4"/>
-              <w:left w:val="single" w:color="CFE3DF" w:sz="4"/>
-              <w:bottom w:val="single" w:color="CFE3DF" w:sz="4"/>
-              <w:right w:val="single" w:color="CFE3DF" w:sz="4"/>
-            </w:tcBorders>
-            <w:shd w:fill="FCFBF7" w:val="clear"/>
-            <w:tcMar>
-              <w:top w:type="dxa" w:w="80"/>
-              <w:left w:type="dxa" w:w="130"/>
-              <w:bottom w:type="dxa" w:w="80"/>
-              <w:right w:type="dxa" w:w="130"/>
-            </w:tcMar>
-            <w:vAlign w:val="top"/>
-          </w:tcPr>
-          <w:p>
-            <w:pPr>
-              <w:spacing w:after="0" w:before="0"/>
-            </w:pPr>
-            <w:r>
-              <w:rPr>
+              <w:t xml:space="preserve"> (ex. care, consideration, etc.) - I know that had an impact on you and so it's really important to me. Now that I understand this, I would like to deal with that differently in the future, in a way that is more in alignment with my values and creates more</w:t>
+            </w:r>
+            <w:r>
+              <w:rPr>
+                <w:color w:val="2D2D2D"/>
                 <w:sz w:val="20"/>
                 <w:szCs w:val="20"/>
-              </w:rPr>
-              <w:t xml:space="preserve"/>
+                <w:u w:val="single" w:color="8A9099"/>
+                <w:shd w:fill="E4E7EC" w:val="clear"/>
+              </w:rPr>
+              <w:t xml:space="preserve">          </w:t>
+            </w:r>
+            <w:r>
+              <w:rPr>
+                <w:i/>
+                <w:iCs/>
+                <w:color w:val="2D2D2D"/>
+                <w:sz w:val="20"/>
+                <w:szCs w:val="20"/>
+              </w:rPr>
+              <w:t xml:space="preserve">.</w:t>
+            </w:r>
+            <w:r>
+              <w:rPr>
+                <w:i/>
+                <w:iCs/>
+                <w:color w:val="2D2D2D"/>
+                <w:sz w:val="20"/>
+                <w:szCs w:val="20"/>
+              </w:rPr>
+              <w:t xml:space="preserve">”</w:t>
             </w:r>
           </w:p>
         </w:tc>
@@ -17112,7 +17268,10 @@
         <w:spacing w:after="50" w:before="200"/>
       </w:pPr>
       <w:r>
-        <w:t xml:space="preserve">Practice #2 — "Restoration"</w:t>
+        <w:t xml:space="preserve">Practice #2 — </w:t>
+      </w:r>
+      <w:r>
+        <w:t xml:space="preserve">"Restoration"</w:t>
       </w:r>
     </w:p>
     <w:p>
@@ -17184,7 +17343,7 @@
         <w:keepLines/>
         <w:spacing w:after="60" w:before="0" w:line="276" w:lineRule="auto"/>
       </w:pPr>
-      <w:hyperlink w:history="1" r:id="rId65u_u8fu7fsd0lr7zua7c">
+      <w:hyperlink w:history="1" r:id="rIdteeq_gmkph1ra94sfpilp">
         <w:r>
           <w:rPr>
             <w:color w:val="1155CC"/>
@@ -17201,7 +17360,7 @@
         <w:keepLines/>
         <w:spacing w:after="60" w:before="0" w:line="276" w:lineRule="auto"/>
       </w:pPr>
-      <w:hyperlink w:history="1" r:id="rIdp12qi582qwtihd6n_aoly">
+      <w:hyperlink w:history="1" r:id="rIdem5kh4x6os1hfnfez780n">
         <w:r>
           <w:rPr>
             <w:color w:val="1155CC"/>
@@ -17572,7 +17731,10 @@
         <w:spacing w:after="50" w:before="200"/>
       </w:pPr>
       <w:r>
-        <w:t xml:space="preserve">Practice #1 — Inventory Your Beliefs about "No"</w:t>
+        <w:t xml:space="preserve">Practice #1 — </w:t>
+      </w:r>
+      <w:r>
+        <w:t xml:space="preserve">Inventory Your Beliefs about "No"</w:t>
       </w:r>
     </w:p>
     <w:p>
@@ -17882,7 +18044,10 @@
         <w:spacing w:after="50" w:before="200"/>
       </w:pPr>
       <w:r>
-        <w:t xml:space="preserve">Practice #2 — (Repeated from Week 13) Liberate Yourself</w:t>
+        <w:t xml:space="preserve">Practice #2 — </w:t>
+      </w:r>
+      <w:r>
+        <w:t xml:space="preserve">(Repeated from Week 13) Liberate Yourself</w:t>
       </w:r>
     </w:p>
     <w:p>
@@ -18052,7 +18217,10 @@
         <w:spacing w:after="50" w:before="200"/>
       </w:pPr>
       <w:r>
-        <w:t xml:space="preserve">Practice #3 — (Repeated from Week 13) Compassionate Understanding</w:t>
+        <w:t xml:space="preserve">Practice #3 — </w:t>
+      </w:r>
+      <w:r>
+        <w:t xml:space="preserve">(Repeated from Week 13) Compassionate Understanding</w:t>
       </w:r>
     </w:p>
     <w:p>
@@ -18210,7 +18378,10 @@
         <w:spacing w:after="50" w:before="200"/>
       </w:pPr>
       <w:r>
-        <w:t xml:space="preserve">Practice #4 — Requesting Self-Connection</w:t>
+        <w:t xml:space="preserve">Practice #4 — </w:t>
+      </w:r>
+      <w:r>
+        <w:t xml:space="preserve">Requesting Self-Connection</w:t>
       </w:r>
     </w:p>
     <w:p>
@@ -18336,7 +18507,7 @@
         <w:keepLines/>
         <w:spacing w:after="60" w:before="0" w:line="276" w:lineRule="auto"/>
       </w:pPr>
-      <w:hyperlink w:history="1" r:id="rId3-eakvsnqbb64t9_6l938">
+      <w:hyperlink w:history="1" r:id="rIdnkkrdcda5vqg3u5qqzvgw">
         <w:r>
           <w:rPr>
             <w:color w:val="1155CC"/>
@@ -18353,7 +18524,7 @@
         <w:keepLines/>
         <w:spacing w:after="60" w:before="0" w:line="276" w:lineRule="auto"/>
       </w:pPr>
-      <w:hyperlink w:history="1" r:id="rIdsnjujhh0zaxmqcacgnq9_">
+      <w:hyperlink w:history="1" r:id="rIdxrbnbiatmu84l-ednvgvu">
         <w:r>
           <w:rPr>
             <w:color w:val="1155CC"/>
@@ -18724,7 +18895,10 @@
         <w:spacing w:after="50" w:before="200"/>
       </w:pPr>
       <w:r>
-        <w:t xml:space="preserve">Practice #1 — Review and Renew</w:t>
+        <w:t xml:space="preserve">Practice #1 — </w:t>
+      </w:r>
+      <w:r>
+        <w:t xml:space="preserve">Review and Renew</w:t>
       </w:r>
     </w:p>
     <w:p>
@@ -18906,7 +19080,10 @@
         <w:spacing w:after="50" w:before="200"/>
       </w:pPr>
       <w:r>
-        <w:t xml:space="preserve">Practice #2 — Let's Inspire One Another</w:t>
+        <w:t xml:space="preserve">Practice #2 — </w:t>
+      </w:r>
+      <w:r>
+        <w:t xml:space="preserve">Let's Inspire One Another</w:t>
       </w:r>
     </w:p>
     <w:p>
@@ -18930,7 +19107,7 @@
         <w:keepLines/>
         <w:spacing w:after="60" w:before="0" w:line="276" w:lineRule="auto"/>
       </w:pPr>
-      <w:hyperlink w:history="1" r:id="rIdov5reky_ukwdhm_74x34y">
+      <w:hyperlink w:history="1" r:id="rId9oan_hsw_5qw9rmddrtoo">
         <w:r>
           <w:rPr>
             <w:color w:val="1155CC"/>
@@ -18947,7 +19124,7 @@
         <w:keepLines/>
         <w:spacing w:after="60" w:before="0" w:line="276" w:lineRule="auto"/>
       </w:pPr>
-      <w:hyperlink w:history="1" r:id="rIdbzqxntwcuf-bjyw8saksc">
+      <w:hyperlink w:history="1" r:id="rIdxe3eerxgaf5zirmx_ko58">
         <w:r>
           <w:rPr>
             <w:color w:val="1155CC"/>
@@ -19318,7 +19495,10 @@
         <w:spacing w:after="50" w:before="200"/>
       </w:pPr>
       <w:r>
-        <w:t xml:space="preserve">Practice #1 — Review and Renew</w:t>
+        <w:t xml:space="preserve">Practice #1 — </w:t>
+      </w:r>
+      <w:r>
+        <w:t xml:space="preserve">Review and Renew</w:t>
       </w:r>
     </w:p>
     <w:p>
@@ -19436,7 +19616,10 @@
         <w:spacing w:after="50" w:before="200"/>
       </w:pPr>
       <w:r>
-        <w:t xml:space="preserve">Practice #2 — Create Some Clarity</w:t>
+        <w:t xml:space="preserve">Practice #2 — </w:t>
+      </w:r>
+      <w:r>
+        <w:t xml:space="preserve">Create Some Clarity</w:t>
       </w:r>
     </w:p>
     <w:p>
@@ -19602,7 +19785,10 @@
         <w:spacing w:after="50" w:before="200"/>
       </w:pPr>
       <w:r>
-        <w:t xml:space="preserve">Practice #3 — More Clarity</w:t>
+        <w:t xml:space="preserve">Practice #3 — </w:t>
+      </w:r>
+      <w:r>
+        <w:t xml:space="preserve">More Clarity</w:t>
       </w:r>
     </w:p>
     <w:p>
@@ -19642,7 +19828,7 @@
         <w:keepLines/>
         <w:spacing w:after="60" w:before="0" w:line="276" w:lineRule="auto"/>
       </w:pPr>
-      <w:hyperlink w:history="1" r:id="rIdnkatxbpyhmytlyp_-cf1-">
+      <w:hyperlink w:history="1" r:id="rIdlytxtbhc3whw6or54eai9">
         <w:r>
           <w:rPr>
             <w:color w:val="1155CC"/>
@@ -19659,7 +19845,7 @@
         <w:keepLines/>
         <w:spacing w:after="60" w:before="0" w:line="276" w:lineRule="auto"/>
       </w:pPr>
-      <w:hyperlink w:history="1" r:id="rIdrl_bxuwaji6kiupggjtr0">
+      <w:hyperlink w:history="1" r:id="rIdeyhb_vrull8ptalgdrjmj">
         <w:r>
           <w:rPr>
             <w:color w:val="1155CC"/>
@@ -20030,7 +20216,10 @@
         <w:spacing w:after="50" w:before="200"/>
       </w:pPr>
       <w:r>
-        <w:t xml:space="preserve">Practice #1 — Review and Renew</w:t>
+        <w:t xml:space="preserve">Practice #1 — </w:t>
+      </w:r>
+      <w:r>
+        <w:t xml:space="preserve">Review and Renew</w:t>
       </w:r>
     </w:p>
     <w:p>
@@ -20148,7 +20337,10 @@
         <w:spacing w:after="50" w:before="200"/>
       </w:pPr>
       <w:r>
-        <w:t xml:space="preserve">Practice #2 — Feel Your Feelings (From Week #7)</w:t>
+        <w:t xml:space="preserve">Practice #2 — </w:t>
+      </w:r>
+      <w:r>
+        <w:t xml:space="preserve">Feel Your Feelings (From Week #7)</w:t>
       </w:r>
     </w:p>
     <w:p>
@@ -20298,7 +20490,10 @@
         <w:spacing w:after="50" w:before="200"/>
       </w:pPr>
       <w:r>
-        <w:t xml:space="preserve">Practice #3 — Embody a Need</w:t>
+        <w:t xml:space="preserve">Practice #3 — </w:t>
+      </w:r>
+      <w:r>
+        <w:t xml:space="preserve">Embody a Need</w:t>
       </w:r>
     </w:p>
     <w:p>
@@ -20316,7 +20511,7 @@
         </w:rPr>
         <w:t xml:space="preserve">You may want to find some quiet space and time for this exercise. Start by going to the </w:t>
       </w:r>
-      <w:hyperlink w:history="1" r:id="rIdprlrik4edd3h0zvc-83og">
+      <w:hyperlink w:history="1" r:id="rIdxar-iot-lchwh8lxselfs">
         <w:r>
           <w:rPr>
             <w:color w:val="1155CC"/>
@@ -20483,7 +20678,7 @@
         <w:keepLines/>
         <w:spacing w:after="60" w:before="0" w:line="276" w:lineRule="auto"/>
       </w:pPr>
-      <w:hyperlink w:history="1" r:id="rIdpr7m-zhouud1a9shr7sq2">
+      <w:hyperlink w:history="1" r:id="rIdl1wbgjk_cdayacs24quff">
         <w:r>
           <w:rPr>
             <w:color w:val="1155CC"/>
@@ -20500,7 +20695,7 @@
         <w:keepLines/>
         <w:spacing w:after="60" w:before="0" w:line="276" w:lineRule="auto"/>
       </w:pPr>
-      <w:hyperlink w:history="1" r:id="rIdu4hy-z0goqe5bcdnfm-nv">
+      <w:hyperlink w:history="1" r:id="rId_nln6y08nwhlptwjgveji">
         <w:r>
           <w:rPr>
             <w:color w:val="1155CC"/>
@@ -20871,7 +21066,10 @@
         <w:spacing w:after="50" w:before="200"/>
       </w:pPr>
       <w:r>
-        <w:t xml:space="preserve">Practice #1 — Shifting Toward Compassion Redo</w:t>
+        <w:t xml:space="preserve">Practice #1 — </w:t>
+      </w:r>
+      <w:r>
+        <w:t xml:space="preserve">Shifting Toward Compassion Redo</w:t>
       </w:r>
     </w:p>
     <w:p>
@@ -20909,7 +21107,7 @@
         </w:rPr>
         <w:t xml:space="preserve"> exercise at: http://</w:t>
       </w:r>
-      <w:hyperlink w:history="1" r:id="rId9h5kdnyezzjzbaqmeswq1">
+      <w:hyperlink w:history="1" r:id="rIdqku4rjwasa9c8c58oykad">
         <w:r>
           <w:rPr>
             <w:color w:val="1155CC"/>
@@ -21194,7 +21392,10 @@
         <w:spacing w:after="50" w:before="200"/>
       </w:pPr>
       <w:r>
-        <w:t xml:space="preserve">Practice #2 — Review and Renew</w:t>
+        <w:t xml:space="preserve">Practice #2 — </w:t>
+      </w:r>
+      <w:r>
+        <w:t xml:space="preserve">Review and Renew</w:t>
       </w:r>
     </w:p>
     <w:p>
@@ -21218,7 +21419,7 @@
         <w:keepLines/>
         <w:spacing w:after="60" w:before="0" w:line="276" w:lineRule="auto"/>
       </w:pPr>
-      <w:hyperlink w:history="1" r:id="rIdj5wvqonpcxncyxbfxn4md">
+      <w:hyperlink w:history="1" r:id="rIds3gzsaoozdjnpmruuh9jz">
         <w:r>
           <w:rPr>
             <w:color w:val="1155CC"/>
@@ -21235,7 +21436,7 @@
         <w:keepLines/>
         <w:spacing w:after="60" w:before="0" w:line="276" w:lineRule="auto"/>
       </w:pPr>
-      <w:hyperlink w:history="1" r:id="rId3qwzarkw9ybeodtr3beux">
+      <w:hyperlink w:history="1" r:id="rIdqjoyd1qmf0n8xl6xqtido">
         <w:r>
           <w:rPr>
             <w:color w:val="1155CC"/>
@@ -21606,7 +21807,10 @@
         <w:spacing w:after="50" w:before="200"/>
       </w:pPr>
       <w:r>
-        <w:t xml:space="preserve">Practice #1 — Learn to Get Your Own Attention</w:t>
+        <w:t xml:space="preserve">Practice #1 — </w:t>
+      </w:r>
+      <w:r>
+        <w:t xml:space="preserve">Learn to Get Your Own Attention</w:t>
       </w:r>
     </w:p>
     <w:p>
@@ -21676,7 +21880,7 @@
         </w:rPr>
         <w:t xml:space="preserve">Either at that time, or later on, write down a word (or words) from the </w:t>
       </w:r>
-      <w:hyperlink w:history="1" r:id="rIdaqqmc8hkok1udrfha1pco">
+      <w:hyperlink w:history="1" r:id="rIdcrrkrsjsayatw-rg-h5zn">
         <w:r>
           <w:rPr>
             <w:color w:val="1155CC"/>
@@ -21713,7 +21917,7 @@
         </w:rPr>
         <w:t xml:space="preserve">Then look at the </w:t>
       </w:r>
-      <w:hyperlink w:history="1" r:id="rIdftemvnegj6ox9bn6cgpgq">
+      <w:hyperlink w:history="1" r:id="rIdccggnuomaqswrzhbld9mu">
         <w:r>
           <w:rPr>
             <w:color w:val="1155CC"/>
@@ -21882,7 +22086,10 @@
         <w:spacing w:after="50" w:before="200"/>
       </w:pPr>
       <w:r>
-        <w:t xml:space="preserve">Practice #2 — Take It to the Next Level</w:t>
+        <w:t xml:space="preserve">Practice #2 — </w:t>
+      </w:r>
+      <w:r>
+        <w:t xml:space="preserve">Take It to the Next Level</w:t>
       </w:r>
     </w:p>
     <w:p>
@@ -22016,7 +22223,10 @@
         <w:spacing w:after="50" w:before="200"/>
       </w:pPr>
       <w:r>
-        <w:t xml:space="preserve">Practice #3 — Review</w:t>
+        <w:t xml:space="preserve">Practice #3 — </w:t>
+      </w:r>
+      <w:r>
+        <w:t xml:space="preserve">Review</w:t>
       </w:r>
     </w:p>
     <w:p>
@@ -22120,7 +22330,7 @@
         <w:keepLines/>
         <w:spacing w:after="60" w:before="0" w:line="276" w:lineRule="auto"/>
       </w:pPr>
-      <w:hyperlink w:history="1" r:id="rId-m9ghwltmvapqq5rnxgr9">
+      <w:hyperlink w:history="1" r:id="rIdrh6icp4-d912myplwdllx">
         <w:r>
           <w:rPr>
             <w:color w:val="1155CC"/>
@@ -22137,7 +22347,7 @@
         <w:keepLines/>
         <w:spacing w:after="60" w:before="0" w:line="276" w:lineRule="auto"/>
       </w:pPr>
-      <w:hyperlink w:history="1" r:id="rId2tvraycmrl9vb1l5rggts">
+      <w:hyperlink w:history="1" r:id="rIdt8l_rg0ntkml1kodjpn1y">
         <w:r>
           <w:rPr>
             <w:color w:val="1155CC"/>
@@ -22508,7 +22718,10 @@
         <w:spacing w:after="50" w:before="200"/>
       </w:pPr>
       <w:r>
-        <w:t xml:space="preserve">Practice #1 — Moving from Anger to Pain</w:t>
+        <w:t xml:space="preserve">Practice #1 — </w:t>
+      </w:r>
+      <w:r>
+        <w:t xml:space="preserve">Moving from Anger to Pain</w:t>
       </w:r>
     </w:p>
     <w:p>
@@ -22710,7 +22923,10 @@
         <w:spacing w:after="50" w:before="200"/>
       </w:pPr>
       <w:r>
-        <w:t xml:space="preserve">Practice #2 — Un-numbing</w:t>
+        <w:t xml:space="preserve">Practice #2 — </w:t>
+      </w:r>
+      <w:r>
+        <w:t xml:space="preserve">Un-numbing</w:t>
       </w:r>
     </w:p>
     <w:p>
@@ -22734,7 +22950,7 @@
         <w:keepLines/>
         <w:spacing w:after="60" w:before="0" w:line="276" w:lineRule="auto"/>
       </w:pPr>
-      <w:hyperlink w:history="1" r:id="rIddqoi7lj_31ozwwwuoff-2">
+      <w:hyperlink w:history="1" r:id="rIdr3f_g0djdiulujz2llsgd">
         <w:r>
           <w:rPr>
             <w:color w:val="1155CC"/>
@@ -22751,7 +22967,7 @@
         <w:keepLines/>
         <w:spacing w:after="60" w:before="0" w:line="276" w:lineRule="auto"/>
       </w:pPr>
-      <w:hyperlink w:history="1" r:id="rIdyn7ghyubqaa3h_njun-qu">
+      <w:hyperlink w:history="1" r:id="rIdhxs_svfbbyn2diiup8efh">
         <w:r>
           <w:rPr>
             <w:color w:val="1155CC"/>
@@ -23122,7 +23338,10 @@
         <w:spacing w:after="50" w:before="200"/>
       </w:pPr>
       <w:r>
-        <w:t xml:space="preserve">Practice #1 — Moving from Compromise to a Shift</w:t>
+        <w:t xml:space="preserve">Practice #1 — </w:t>
+      </w:r>
+      <w:r>
+        <w:t xml:space="preserve">Moving from Compromise to a Shift</w:t>
       </w:r>
     </w:p>
     <w:p>
@@ -23176,7 +23395,7 @@
         </w:rPr>
         <w:t xml:space="preserve"> at http://</w:t>
       </w:r>
-      <w:hyperlink w:history="1" r:id="rId7ggodbqief-ixg3lfpcx2">
+      <w:hyperlink w:history="1" r:id="rIdk2hyifyhsdqj95cueqsjp">
         <w:r>
           <w:rPr>
             <w:color w:val="1155CC"/>
@@ -23353,7 +23572,10 @@
         <w:spacing w:after="50" w:before="200"/>
       </w:pPr>
       <w:r>
-        <w:t xml:space="preserve">Practice #2 — Deeper Practice</w:t>
+        <w:t xml:space="preserve">Practice #2 — </w:t>
+      </w:r>
+      <w:r>
+        <w:t xml:space="preserve">Deeper Practice</w:t>
       </w:r>
     </w:p>
     <w:p>
@@ -23445,7 +23667,7 @@
         <w:keepLines/>
         <w:spacing w:after="60" w:before="0" w:line="276" w:lineRule="auto"/>
       </w:pPr>
-      <w:hyperlink w:history="1" r:id="rId-0zcatnvoxbamtooqugt9">
+      <w:hyperlink w:history="1" r:id="rIddwo6ewknh3rlnzenx-avi">
         <w:r>
           <w:rPr>
             <w:color w:val="1155CC"/>
@@ -23462,7 +23684,7 @@
         <w:keepLines/>
         <w:spacing w:after="60" w:before="0" w:line="276" w:lineRule="auto"/>
       </w:pPr>
-      <w:hyperlink w:history="1" r:id="rIdld2_ze1casp8g3tdbupmg">
+      <w:hyperlink w:history="1" r:id="rIdtorhkf1wiwfc09ylkhrdu">
         <w:r>
           <w:rPr>
             <w:color w:val="1155CC"/>
@@ -23833,7 +24055,10 @@
         <w:spacing w:after="50" w:before="200"/>
       </w:pPr>
       <w:r>
-        <w:t xml:space="preserve">Practice #1 — Changing Focus</w:t>
+        <w:t xml:space="preserve">Practice #1 — </w:t>
+      </w:r>
+      <w:r>
+        <w:t xml:space="preserve">Changing Focus</w:t>
       </w:r>
     </w:p>
     <w:p>
@@ -23987,7 +24212,10 @@
         <w:spacing w:after="50" w:before="200"/>
       </w:pPr>
       <w:r>
-        <w:t xml:space="preserve">Practice #2 — Changing Focus Again</w:t>
+        <w:t xml:space="preserve">Practice #2 — </w:t>
+      </w:r>
+      <w:r>
+        <w:t xml:space="preserve">Changing Focus Again</w:t>
       </w:r>
     </w:p>
     <w:p>
@@ -24047,7 +24275,7 @@
         <w:keepLines/>
         <w:spacing w:after="60" w:before="0" w:line="276" w:lineRule="auto"/>
       </w:pPr>
-      <w:hyperlink w:history="1" r:id="rIdtdjz2a7x54x-890ou5mdh">
+      <w:hyperlink w:history="1" r:id="rIde49s8oqx76mxdpcl1glj5">
         <w:r>
           <w:rPr>
             <w:color w:val="1155CC"/>
@@ -24064,7 +24292,7 @@
         <w:keepLines/>
         <w:spacing w:after="60" w:before="0" w:line="276" w:lineRule="auto"/>
       </w:pPr>
-      <w:hyperlink w:history="1" r:id="rIdmripgfh0wn8njuaop1tij">
+      <w:hyperlink w:history="1" r:id="rIdamy9e9oabhzfzcr2gysmv">
         <w:r>
           <w:rPr>
             <w:color w:val="1155CC"/>
@@ -24435,7 +24663,10 @@
         <w:spacing w:after="50" w:before="200"/>
       </w:pPr>
       <w:r>
-        <w:t xml:space="preserve">Practice #1 — Dismantling Anger</w:t>
+        <w:t xml:space="preserve">Practice #1 — </w:t>
+      </w:r>
+      <w:r>
+        <w:t xml:space="preserve">Dismantling Anger</w:t>
       </w:r>
     </w:p>
     <w:p>
@@ -24653,7 +24884,10 @@
         <w:spacing w:after="50" w:before="200"/>
       </w:pPr>
       <w:r>
-        <w:t xml:space="preserve">Practice #2 — Heavy Lifting - Dismantling Anger and Making Requests</w:t>
+        <w:t xml:space="preserve">Practice #2 — </w:t>
+      </w:r>
+      <w:r>
+        <w:t xml:space="preserve">Heavy Lifting - Dismantling Anger and Making Requests</w:t>
       </w:r>
     </w:p>
     <w:p>
@@ -24769,7 +25003,7 @@
         <w:keepLines/>
         <w:spacing w:after="60" w:before="0" w:line="276" w:lineRule="auto"/>
       </w:pPr>
-      <w:hyperlink w:history="1" r:id="rIdf9_3asvoscflyzjwid7ng">
+      <w:hyperlink w:history="1" r:id="rIdsfa9slpzvd8kguapgpfqi">
         <w:r>
           <w:rPr>
             <w:color w:val="1155CC"/>
@@ -24786,7 +25020,7 @@
         <w:keepLines/>
         <w:spacing w:after="60" w:before="0" w:line="276" w:lineRule="auto"/>
       </w:pPr>
-      <w:hyperlink w:history="1" r:id="rId_m0-joyuj8uxjmty_n4uo">
+      <w:hyperlink w:history="1" r:id="rIddxpx7it5uwsu7lkvomxlq">
         <w:r>
           <w:rPr>
             <w:color w:val="1155CC"/>
@@ -25157,7 +25391,10 @@
         <w:spacing w:after="50" w:before="200"/>
       </w:pPr>
       <w:r>
-        <w:t xml:space="preserve">Practice #1 — Moving from Responsible to Responsive</w:t>
+        <w:t xml:space="preserve">Practice #1 — </w:t>
+      </w:r>
+      <w:r>
+        <w:t xml:space="preserve">Moving from Responsible to Responsive</w:t>
       </w:r>
     </w:p>
     <w:p>
@@ -25301,7 +25538,7 @@
         <w:keepLines/>
         <w:spacing w:after="60" w:before="0" w:line="276" w:lineRule="auto"/>
       </w:pPr>
-      <w:hyperlink w:history="1" r:id="rId0unluufurqax3offzv7fh">
+      <w:hyperlink w:history="1" r:id="rIdhh0mrnxgpjj3hrrht0f0a">
         <w:r>
           <w:rPr>
             <w:color w:val="1155CC"/>
@@ -25318,7 +25555,7 @@
         <w:keepLines/>
         <w:spacing w:after="60" w:before="0" w:line="276" w:lineRule="auto"/>
       </w:pPr>
-      <w:hyperlink w:history="1" r:id="rIdnshnaviitdhxm1envcxg7">
+      <w:hyperlink w:history="1" r:id="rIdv0xaviralf0q6mwgd34fp">
         <w:r>
           <w:rPr>
             <w:color w:val="1155CC"/>
@@ -25689,7 +25926,10 @@
         <w:spacing w:after="50" w:before="200"/>
       </w:pPr>
       <w:r>
-        <w:t xml:space="preserve">Practice #1 — Noticing</w:t>
+        <w:t xml:space="preserve">Practice #1 — </w:t>
+      </w:r>
+      <w:r>
+        <w:t xml:space="preserve">Noticing</w:t>
       </w:r>
     </w:p>
     <w:p>
@@ -25827,7 +26067,10 @@
         <w:spacing w:after="50" w:before="200"/>
       </w:pPr>
       <w:r>
-        <w:t xml:space="preserve">Practice #2 — Stepping into Awareness</w:t>
+        <w:t xml:space="preserve">Practice #2 — </w:t>
+      </w:r>
+      <w:r>
+        <w:t xml:space="preserve">Stepping into Awareness</w:t>
       </w:r>
     </w:p>
     <w:p>
@@ -25845,7 +26088,7 @@
         </w:rPr>
         <w:t xml:space="preserve">Later on, when you have time, sit down with the </w:t>
       </w:r>
-      <w:hyperlink w:history="1" r:id="rIdy2heekz3x4nl1i6tkgvsh">
+      <w:hyperlink w:history="1" r:id="rIdma2cwe5kpk3jpoporwnyq">
         <w:r>
           <w:rPr>
             <w:color w:val="1155CC"/>
@@ -25866,7 +26109,7 @@
         </w:rPr>
         <w:t xml:space="preserve"> and see if you can figure out what need(s) you were in pain about. Translate your judgment words into need words. As usual, I suggest that you limit the words you use to those on the </w:t>
       </w:r>
-      <w:hyperlink w:history="1" r:id="rIdfnvgyguujarxcgonspeog">
+      <w:hyperlink w:history="1" r:id="rIdg_qmdctfwckh9venvxatk">
         <w:r>
           <w:rPr>
             <w:color w:val="1155CC"/>
@@ -26035,7 +26278,10 @@
         <w:spacing w:after="50" w:before="200"/>
       </w:pPr>
       <w:r>
-        <w:t xml:space="preserve">Practice #3 — Get Support</w:t>
+        <w:t xml:space="preserve">Practice #3 — </w:t>
+      </w:r>
+      <w:r>
+        <w:t xml:space="preserve">Get Support</w:t>
       </w:r>
     </w:p>
     <w:p>
@@ -26059,7 +26305,7 @@
         <w:keepLines/>
         <w:spacing w:after="60" w:before="0" w:line="276" w:lineRule="auto"/>
       </w:pPr>
-      <w:hyperlink w:history="1" r:id="rIdnfaucjwmv4cg5-fiikzrf">
+      <w:hyperlink w:history="1" r:id="rIdpa6uten8_6w35qdisairw">
         <w:r>
           <w:rPr>
             <w:color w:val="1155CC"/>
@@ -26076,7 +26322,7 @@
         <w:keepLines/>
         <w:spacing w:after="60" w:before="0" w:line="276" w:lineRule="auto"/>
       </w:pPr>
-      <w:hyperlink w:history="1" r:id="rIdja2n4pj3xa5cagvjzzvy8">
+      <w:hyperlink w:history="1" r:id="rIdix9sf9--cznouoixxauoa">
         <w:r>
           <w:rPr>
             <w:color w:val="1155CC"/>
@@ -26447,7 +26693,10 @@
         <w:spacing w:after="50" w:before="200"/>
       </w:pPr>
       <w:r>
-        <w:t xml:space="preserve">Practice #1 — Your Anger Redo</w:t>
+        <w:t xml:space="preserve">Practice #1 — </w:t>
+      </w:r>
+      <w:r>
+        <w:t xml:space="preserve">Your Anger Redo</w:t>
       </w:r>
     </w:p>
     <w:p>
@@ -26645,7 +26894,10 @@
         <w:spacing w:after="50" w:before="200"/>
       </w:pPr>
       <w:r>
-        <w:t xml:space="preserve">Practice #2 — Their Anger Redo</w:t>
+        <w:t xml:space="preserve">Practice #2 — </w:t>
+      </w:r>
+      <w:r>
+        <w:t xml:space="preserve">Their Anger Redo</w:t>
       </w:r>
     </w:p>
     <w:p>
@@ -26765,7 +27017,7 @@
         <w:keepLines/>
         <w:spacing w:after="60" w:before="0" w:line="276" w:lineRule="auto"/>
       </w:pPr>
-      <w:hyperlink w:history="1" r:id="rIdvbh6y54jtepywoy8qlizg">
+      <w:hyperlink w:history="1" r:id="rId2o-mnfuic4u_suh965zlb">
         <w:r>
           <w:rPr>
             <w:color w:val="1155CC"/>
@@ -26782,7 +27034,7 @@
         <w:keepLines/>
         <w:spacing w:after="60" w:before="0" w:line="276" w:lineRule="auto"/>
       </w:pPr>
-      <w:hyperlink w:history="1" r:id="rIdfisca-o28elao5ntyjvmi">
+      <w:hyperlink w:history="1" r:id="rIdgw5a_sz757o0zvfrhuh2_">
         <w:r>
           <w:rPr>
             <w:color w:val="1155CC"/>
@@ -27153,7 +27405,10 @@
         <w:spacing w:after="50" w:before="200"/>
       </w:pPr>
       <w:r>
-        <w:t xml:space="preserve">Practice #1 — Yell Out to Yourself</w:t>
+        <w:t xml:space="preserve">Practice #1 — </w:t>
+      </w:r>
+      <w:r>
+        <w:t xml:space="preserve">Yell Out to Yourself</w:t>
       </w:r>
     </w:p>
     <w:p>
@@ -27403,7 +27658,10 @@
         <w:spacing w:after="50" w:before="200"/>
       </w:pPr>
       <w:r>
-        <w:t xml:space="preserve">Practice #2 — Yell Out to a Friend</w:t>
+        <w:t xml:space="preserve">Practice #2 — </w:t>
+      </w:r>
+      <w:r>
+        <w:t xml:space="preserve">Yell Out to a Friend</w:t>
       </w:r>
     </w:p>
     <w:p>
@@ -27463,7 +27721,7 @@
         <w:keepLines/>
         <w:spacing w:after="60" w:before="0" w:line="276" w:lineRule="auto"/>
       </w:pPr>
-      <w:hyperlink w:history="1" r:id="rIdeomlral3nt49c7bg4mmrc">
+      <w:hyperlink w:history="1" r:id="rIdl79znptadw2a4hx0a1mo_">
         <w:r>
           <w:rPr>
             <w:color w:val="1155CC"/>
@@ -27480,7 +27738,7 @@
         <w:keepLines/>
         <w:spacing w:after="60" w:before="0" w:line="276" w:lineRule="auto"/>
       </w:pPr>
-      <w:hyperlink w:history="1" r:id="rId19jfi0mkgsv5kxj_1z70f">
+      <w:hyperlink w:history="1" r:id="rId-xnnof_ysc-cs633hl6iv">
         <w:r>
           <w:rPr>
             <w:color w:val="1155CC"/>
@@ -27851,7 +28109,10 @@
         <w:spacing w:after="50" w:before="200"/>
       </w:pPr>
       <w:r>
-        <w:t xml:space="preserve">Practice #1 — Make Your Life More Wonderful</w:t>
+        <w:t xml:space="preserve">Practice #1 — </w:t>
+      </w:r>
+      <w:r>
+        <w:t xml:space="preserve">Make Your Life More Wonderful</w:t>
       </w:r>
     </w:p>
     <w:p>
@@ -27999,7 +28260,7 @@
         <w:keepLines/>
         <w:spacing w:after="60" w:before="0" w:line="276" w:lineRule="auto"/>
       </w:pPr>
-      <w:hyperlink w:history="1" r:id="rIdllo0rmzhqmvynaziy-pmj">
+      <w:hyperlink w:history="1" r:id="rIdrujltxzvtdkgk2zei58pt">
         <w:r>
           <w:rPr>
             <w:color w:val="1155CC"/>
@@ -28016,7 +28277,7 @@
         <w:keepLines/>
         <w:spacing w:after="60" w:before="0" w:line="276" w:lineRule="auto"/>
       </w:pPr>
-      <w:hyperlink w:history="1" r:id="rId9qcjqlpwrdat_vpq2id_s">
+      <w:hyperlink w:history="1" r:id="rId6cykzbiwxkad39mk_w0bg">
         <w:r>
           <w:rPr>
             <w:color w:val="1155CC"/>
@@ -28387,7 +28648,10 @@
         <w:spacing w:after="50" w:before="200"/>
       </w:pPr>
       <w:r>
-        <w:t xml:space="preserve">Practice #1 — Rule Redo</w:t>
+        <w:t xml:space="preserve">Practice #1 — </w:t>
+      </w:r>
+      <w:r>
+        <w:t xml:space="preserve">Rule Redo</w:t>
       </w:r>
     </w:p>
     <w:p>
@@ -28553,7 +28817,10 @@
         <w:spacing w:after="50" w:before="200"/>
       </w:pPr>
       <w:r>
-        <w:t xml:space="preserve">Practice #2 — Agreement Redo</w:t>
+        <w:t xml:space="preserve">Practice #2 — </w:t>
+      </w:r>
+      <w:r>
+        <w:t xml:space="preserve">Agreement Redo</w:t>
       </w:r>
     </w:p>
     <w:p>
@@ -28657,7 +28924,7 @@
         <w:keepLines/>
         <w:spacing w:after="60" w:before="0" w:line="276" w:lineRule="auto"/>
       </w:pPr>
-      <w:hyperlink w:history="1" r:id="rIdhnpqknu-e1esrnme-g_eg">
+      <w:hyperlink w:history="1" r:id="rIdqdga3a7txrmb2hpzdjebx">
         <w:r>
           <w:rPr>
             <w:color w:val="1155CC"/>
@@ -28674,7 +28941,7 @@
         <w:keepLines/>
         <w:spacing w:after="60" w:before="0" w:line="276" w:lineRule="auto"/>
       </w:pPr>
-      <w:hyperlink w:history="1" r:id="rIdj_4ftagwsgif_j-expgwo">
+      <w:hyperlink w:history="1" r:id="rIdvpzmeyshcr2qpwgadfsem">
         <w:r>
           <w:rPr>
             <w:color w:val="1155CC"/>
@@ -29045,7 +29312,10 @@
         <w:spacing w:after="50" w:before="200"/>
       </w:pPr>
       <w:r>
-        <w:t xml:space="preserve">Practice #1 — Connecting with Feelings and Needs</w:t>
+        <w:t xml:space="preserve">Practice #1 — </w:t>
+      </w:r>
+      <w:r>
+        <w:t xml:space="preserve">Connecting with Feelings and Needs</w:t>
       </w:r>
     </w:p>
     <w:p>
@@ -29227,7 +29497,10 @@
         <w:spacing w:after="50" w:before="200"/>
       </w:pPr>
       <w:r>
-        <w:t xml:space="preserve">Practice #2 — Embodying Needs</w:t>
+        <w:t xml:space="preserve">Practice #2 — </w:t>
+      </w:r>
+      <w:r>
+        <w:t xml:space="preserve">Embodying Needs</w:t>
       </w:r>
     </w:p>
     <w:p>
@@ -29439,7 +29712,7 @@
         <w:keepLines/>
         <w:spacing w:after="60" w:before="0" w:line="276" w:lineRule="auto"/>
       </w:pPr>
-      <w:hyperlink w:history="1" r:id="rId5uwjqx6njruerxzxzbym4">
+      <w:hyperlink w:history="1" r:id="rIdcwecygekortjsjmooxgsy">
         <w:r>
           <w:rPr>
             <w:color w:val="1155CC"/>
@@ -29456,7 +29729,7 @@
         <w:keepLines/>
         <w:spacing w:after="60" w:before="0" w:line="276" w:lineRule="auto"/>
       </w:pPr>
-      <w:hyperlink w:history="1" r:id="rIduvezfvwrz-el8aqy-qdx5">
+      <w:hyperlink w:history="1" r:id="rIdhtxj9zmh8f0nijo0jvd8e">
         <w:r>
           <w:rPr>
             <w:color w:val="1155CC"/>
@@ -29827,7 +30100,10 @@
         <w:spacing w:after="50" w:before="200"/>
       </w:pPr>
       <w:r>
-        <w:t xml:space="preserve">Practice #1 — Changing Your Focus</w:t>
+        <w:t xml:space="preserve">Practice #1 — </w:t>
+      </w:r>
+      <w:r>
+        <w:t xml:space="preserve">Changing Your Focus</w:t>
       </w:r>
     </w:p>
     <w:p>
@@ -29961,7 +30237,10 @@
         <w:spacing w:after="50" w:before="200"/>
       </w:pPr>
       <w:r>
-        <w:t xml:space="preserve">Practice #2 — Embodying Needs (intentionally repeated from last week)</w:t>
+        <w:t xml:space="preserve">Practice #2 — </w:t>
+      </w:r>
+      <w:r>
+        <w:t xml:space="preserve">Embodying Needs (intentionally repeated from last week)</w:t>
       </w:r>
     </w:p>
     <w:p>
@@ -30235,7 +30514,10 @@
         <w:spacing w:after="50" w:before="200"/>
       </w:pPr>
       <w:r>
-        <w:t xml:space="preserve">Practice #3 — Expanding</w:t>
+        <w:t xml:space="preserve">Practice #3 — </w:t>
+      </w:r>
+      <w:r>
+        <w:t xml:space="preserve">Expanding</w:t>
       </w:r>
     </w:p>
     <w:p>
@@ -30259,7 +30541,7 @@
         <w:keepLines/>
         <w:spacing w:after="60" w:before="0" w:line="276" w:lineRule="auto"/>
       </w:pPr>
-      <w:hyperlink w:history="1" r:id="rIdexdaiwuhljbcgh8m62kfm">
+      <w:hyperlink w:history="1" r:id="rIdnfnjfryfkuaswmvx89oqb">
         <w:r>
           <w:rPr>
             <w:color w:val="1155CC"/>
@@ -30276,7 +30558,7 @@
         <w:keepLines/>
         <w:spacing w:after="60" w:before="0" w:line="276" w:lineRule="auto"/>
       </w:pPr>
-      <w:hyperlink w:history="1" r:id="rIdhg2p52vo4qxmvjeuip6ip">
+      <w:hyperlink w:history="1" r:id="rIdhhx4gk9o7yqsiaeiylnmf">
         <w:r>
           <w:rPr>
             <w:color w:val="1155CC"/>
@@ -30647,7 +30929,10 @@
         <w:spacing w:after="50" w:before="200"/>
       </w:pPr>
       <w:r>
-        <w:t xml:space="preserve">Practice #1 — Power Over Redo</w:t>
+        <w:t xml:space="preserve">Practice #1 — </w:t>
+      </w:r>
+      <w:r>
+        <w:t xml:space="preserve">Power Over Redo</w:t>
       </w:r>
     </w:p>
     <w:p>
@@ -30813,7 +31098,10 @@
         <w:spacing w:after="50" w:before="200"/>
       </w:pPr>
       <w:r>
-        <w:t xml:space="preserve">Practice #2 — Power With Transformation</w:t>
+        <w:t xml:space="preserve">Practice #2 — </w:t>
+      </w:r>
+      <w:r>
+        <w:t xml:space="preserve">Power With Transformation</w:t>
       </w:r>
     </w:p>
     <w:p>
@@ -30885,7 +31173,7 @@
         <w:keepLines/>
         <w:spacing w:after="60" w:before="0" w:line="276" w:lineRule="auto"/>
       </w:pPr>
-      <w:hyperlink w:history="1" r:id="rIdx6hnv5q_xq5p8pguenozv">
+      <w:hyperlink w:history="1" r:id="rIdncjg3ib1eubc69rapp7lq">
         <w:r>
           <w:rPr>
             <w:color w:val="1155CC"/>
@@ -30902,7 +31190,7 @@
         <w:keepLines/>
         <w:spacing w:after="60" w:before="0" w:line="276" w:lineRule="auto"/>
       </w:pPr>
-      <w:hyperlink w:history="1" r:id="rId505rkya7dnb2qqbpuwlys">
+      <w:hyperlink w:history="1" r:id="rIdpvexszj43suhtjbxq0mc-">
         <w:r>
           <w:rPr>
             <w:color w:val="1155CC"/>
@@ -31273,7 +31561,10 @@
         <w:spacing w:after="50" w:before="200"/>
       </w:pPr>
       <w:r>
-        <w:t xml:space="preserve">Practice #1 — Compassionate Self-Discipline Redo</w:t>
+        <w:t xml:space="preserve">Practice #1 — </w:t>
+      </w:r>
+      <w:r>
+        <w:t xml:space="preserve">Compassionate Self-Discipline Redo</w:t>
       </w:r>
     </w:p>
     <w:p>
@@ -31469,7 +31760,7 @@
         <w:keepLines/>
         <w:spacing w:after="60" w:before="0" w:line="276" w:lineRule="auto"/>
       </w:pPr>
-      <w:hyperlink w:history="1" r:id="rIdochn3tjxbdkad7uudnciq">
+      <w:hyperlink w:history="1" r:id="rId8z6a31k4chpc5utjs1iya">
         <w:r>
           <w:rPr>
             <w:color w:val="1155CC"/>
@@ -31486,7 +31777,7 @@
         <w:keepLines/>
         <w:spacing w:after="60" w:before="0" w:line="276" w:lineRule="auto"/>
       </w:pPr>
-      <w:hyperlink w:history="1" r:id="rIdrqft-qtvvhagldbf-uozo">
+      <w:hyperlink w:history="1" r:id="rIdtl8kpdnvfugkvq2uzlpdt">
         <w:r>
           <w:rPr>
             <w:color w:val="1155CC"/>
@@ -31857,7 +32148,10 @@
         <w:spacing w:after="50" w:before="200"/>
       </w:pPr>
       <w:r>
-        <w:t xml:space="preserve">Practice #1 — Transforming Authority</w:t>
+        <w:t xml:space="preserve">Practice #1 — </w:t>
+      </w:r>
+      <w:r>
+        <w:t xml:space="preserve">Transforming Authority</w:t>
       </w:r>
     </w:p>
     <w:p>
@@ -32121,7 +32415,7 @@
         <w:keepLines/>
         <w:spacing w:after="60" w:before="0" w:line="276" w:lineRule="auto"/>
       </w:pPr>
-      <w:hyperlink w:history="1" r:id="rIdwg-suhnbxohtz6kgxjuqc">
+      <w:hyperlink w:history="1" r:id="rIdkbeimr1ybfdgdxjznr5oe">
         <w:r>
           <w:rPr>
             <w:color w:val="1155CC"/>
@@ -32138,7 +32432,7 @@
         <w:keepLines/>
         <w:spacing w:after="60" w:before="0" w:line="276" w:lineRule="auto"/>
       </w:pPr>
-      <w:hyperlink w:history="1" r:id="rIdnbbdxbcfufw6ryz7pmldy">
+      <w:hyperlink w:history="1" r:id="rId6u_n5ia8ohixxoettdxdl">
         <w:r>
           <w:rPr>
             <w:color w:val="1155CC"/>
@@ -32509,7 +32803,10 @@
         <w:spacing w:after="50" w:before="200"/>
       </w:pPr>
       <w:r>
-        <w:t xml:space="preserve">Practice #1 — "Vulnerability Test Flight"</w:t>
+        <w:t xml:space="preserve">Practice #1 — </w:t>
+      </w:r>
+      <w:r>
+        <w:t xml:space="preserve">"Vulnerability Test Flight"</w:t>
       </w:r>
     </w:p>
     <w:p>
@@ -32868,38 +33165,32 @@
               <w:bottom w:val="single" w:color="CFE3DF" w:sz="4"/>
               <w:right w:val="single" w:color="CFE3DF" w:sz="4"/>
             </w:tcBorders>
-            <w:shd w:fill="F1F1EE" w:val="clear"/>
-            <w:tcMar>
-              <w:top w:type="dxa" w:w="70"/>
+            <w:shd w:fill="FCFBF7" w:val="clear"/>
+            <w:tcMar>
+              <w:top w:type="dxa" w:w="100"/>
               <w:left w:type="dxa" w:w="130"/>
-              <w:bottom w:type="dxa" w:w="70"/>
+              <w:bottom w:type="dxa" w:w="100"/>
               <w:right w:type="dxa" w:w="130"/>
             </w:tcMar>
-          </w:tcPr>
-          <w:p>
-            <w:pPr>
-              <w:spacing w:after="50" w:before="0" w:line="240" w:lineRule="auto"/>
-            </w:pPr>
-            <w:r>
-              <w:rPr>
-                <w:b/>
-                <w:bCs/>
+            <w:vAlign w:val="top"/>
+          </w:tcPr>
+          <w:p>
+            <w:pPr>
+              <w:spacing w:after="0" w:before="0" w:line="320" w:lineRule="auto"/>
+            </w:pPr>
+            <w:r>
+              <w:rPr>
                 <w:color w:val="4F7740"/>
-                <w:sz w:val="16"/>
-                <w:szCs w:val="16"/>
-              </w:rPr>
-              <w:t xml:space="preserve">✎  Write your version — for example:</w:t>
-            </w:r>
-          </w:p>
-          <w:p>
-            <w:pPr>
-              <w:spacing w:after="0" w:before="0" w:line="276" w:lineRule="auto"/>
-            </w:pPr>
+                <w:sz w:val="18"/>
+                <w:szCs w:val="18"/>
+              </w:rPr>
+              <w:t xml:space="preserve">✎  </w:t>
+            </w:r>
             <w:r>
               <w:rPr>
                 <w:i/>
                 <w:iCs/>
-                <w:color w:val="6B6B6B"/>
+                <w:color w:val="2D2D2D"/>
                 <w:sz w:val="20"/>
                 <w:szCs w:val="20"/>
               </w:rPr>
@@ -32909,58 +33200,141 @@
               <w:rPr>
                 <w:i/>
                 <w:iCs/>
-                <w:color w:val="6B6B6B"/>
+                <w:color w:val="2D2D2D"/>
                 <w:sz w:val="20"/>
                 <w:szCs w:val="20"/>
               </w:rPr>
-              <w:t xml:space="preserve">I understand why I did that. I was trying to meet my needs for ______, _____ and _____. And even though I understand that, I would love to meet those needs in a way that is more in alignment with my other needs for ______, _____ and _______.</w:t>
+              <w:t xml:space="preserve">I understand why I did that. I was trying to meet my needs for </w:t>
+            </w:r>
+            <w:r>
+              <w:rPr>
+                <w:color w:val="2D2D2D"/>
+                <w:sz w:val="20"/>
+                <w:szCs w:val="20"/>
+                <w:u w:val="single" w:color="8A9099"/>
+                <w:shd w:fill="E4E7EC" w:val="clear"/>
+              </w:rPr>
+              <w:t xml:space="preserve">          </w:t>
             </w:r>
             <w:r>
               <w:rPr>
                 <w:i/>
                 <w:iCs/>
-                <w:color w:val="6B6B6B"/>
+                <w:color w:val="2D2D2D"/>
                 <w:sz w:val="20"/>
                 <w:szCs w:val="20"/>
               </w:rPr>
-              <w:t xml:space="preserve">”</w:t>
-            </w:r>
-          </w:p>
-        </w:tc>
-      </w:tr>
-      <w:tr>
-        <w:trPr>
-          <w:cantSplit/>
-          <w:trHeight w:val="520" w:hRule="atLeast"/>
-        </w:trPr>
-        <w:tc>
-          <w:tcPr>
-            <w:tcW w:type="dxa" w:w="9360"/>
-            <w:tcBorders>
-              <w:top w:val="single" w:color="CFE3DF" w:sz="4"/>
-              <w:left w:val="single" w:color="CFE3DF" w:sz="4"/>
-              <w:bottom w:val="single" w:color="CFE3DF" w:sz="4"/>
-              <w:right w:val="single" w:color="CFE3DF" w:sz="4"/>
-            </w:tcBorders>
-            <w:shd w:fill="FCFBF7" w:val="clear"/>
-            <w:tcMar>
-              <w:top w:type="dxa" w:w="80"/>
-              <w:left w:type="dxa" w:w="130"/>
-              <w:bottom w:type="dxa" w:w="80"/>
-              <w:right w:type="dxa" w:w="130"/>
-            </w:tcMar>
-            <w:vAlign w:val="top"/>
-          </w:tcPr>
-          <w:p>
-            <w:pPr>
-              <w:spacing w:after="0" w:before="0"/>
-            </w:pPr>
-            <w:r>
-              <w:rPr>
+              <w:t xml:space="preserve">, </w:t>
+            </w:r>
+            <w:r>
+              <w:rPr>
+                <w:color w:val="2D2D2D"/>
                 <w:sz w:val="20"/>
                 <w:szCs w:val="20"/>
-              </w:rPr>
-              <w:t xml:space="preserve"/>
+                <w:u w:val="single" w:color="8A9099"/>
+                <w:shd w:fill="E4E7EC" w:val="clear"/>
+              </w:rPr>
+              <w:t xml:space="preserve">          </w:t>
+            </w:r>
+            <w:r>
+              <w:rPr>
+                <w:i/>
+                <w:iCs/>
+                <w:color w:val="2D2D2D"/>
+                <w:sz w:val="20"/>
+                <w:szCs w:val="20"/>
+              </w:rPr>
+              <w:t xml:space="preserve"> and </w:t>
+            </w:r>
+            <w:r>
+              <w:rPr>
+                <w:color w:val="2D2D2D"/>
+                <w:sz w:val="20"/>
+                <w:szCs w:val="20"/>
+                <w:u w:val="single" w:color="8A9099"/>
+                <w:shd w:fill="E4E7EC" w:val="clear"/>
+              </w:rPr>
+              <w:t xml:space="preserve">          </w:t>
+            </w:r>
+            <w:r>
+              <w:rPr>
+                <w:i/>
+                <w:iCs/>
+                <w:color w:val="2D2D2D"/>
+                <w:sz w:val="20"/>
+                <w:szCs w:val="20"/>
+              </w:rPr>
+              <w:t xml:space="preserve">. And even though I understand that, I would love to meet those needs in a way that is more in alignment with my other needs for </w:t>
+            </w:r>
+            <w:r>
+              <w:rPr>
+                <w:color w:val="2D2D2D"/>
+                <w:sz w:val="20"/>
+                <w:szCs w:val="20"/>
+                <w:u w:val="single" w:color="8A9099"/>
+                <w:shd w:fill="E4E7EC" w:val="clear"/>
+              </w:rPr>
+              <w:t xml:space="preserve">          </w:t>
+            </w:r>
+            <w:r>
+              <w:rPr>
+                <w:i/>
+                <w:iCs/>
+                <w:color w:val="2D2D2D"/>
+                <w:sz w:val="20"/>
+                <w:szCs w:val="20"/>
+              </w:rPr>
+              <w:t xml:space="preserve">, </w:t>
+            </w:r>
+            <w:r>
+              <w:rPr>
+                <w:color w:val="2D2D2D"/>
+                <w:sz w:val="20"/>
+                <w:szCs w:val="20"/>
+                <w:u w:val="single" w:color="8A9099"/>
+                <w:shd w:fill="E4E7EC" w:val="clear"/>
+              </w:rPr>
+              <w:t xml:space="preserve">          </w:t>
+            </w:r>
+            <w:r>
+              <w:rPr>
+                <w:i/>
+                <w:iCs/>
+                <w:color w:val="2D2D2D"/>
+                <w:sz w:val="20"/>
+                <w:szCs w:val="20"/>
+              </w:rPr>
+              <w:t xml:space="preserve"> and </w:t>
+            </w:r>
+            <w:r>
+              <w:rPr>
+                <w:color w:val="2D2D2D"/>
+                <w:sz w:val="20"/>
+                <w:szCs w:val="20"/>
+                <w:u w:val="single" w:color="8A9099"/>
+                <w:shd w:fill="E4E7EC" w:val="clear"/>
+              </w:rPr>
+              <w:t xml:space="preserve">          </w:t>
+            </w:r>
+            <w:r>
+              <w:rPr>
+                <w:i/>
+                <w:iCs/>
+                <w:color w:val="2D2D2D"/>
+                <w:sz w:val="20"/>
+                <w:szCs w:val="20"/>
+              </w:rPr>
+              <w:t xml:space="preserve">.</w:t>
+            </w:r>
+            <w:r>
+              <w:rPr>
+                <w:i/>
+                <w:iCs/>
+                <w:color w:val="2D2D2D"/>
+                <w:sz w:val="20"/>
+                <w:szCs w:val="20"/>
+              </w:rPr>
+              <w:t xml:space="preserve">”</w:t>
             </w:r>
           </w:p>
         </w:tc>
@@ -33042,38 +33416,32 @@
               <w:bottom w:val="single" w:color="CFE3DF" w:sz="4"/>
               <w:right w:val="single" w:color="CFE3DF" w:sz="4"/>
             </w:tcBorders>
-            <w:shd w:fill="F1F1EE" w:val="clear"/>
-            <w:tcMar>
-              <w:top w:type="dxa" w:w="70"/>
+            <w:shd w:fill="FCFBF7" w:val="clear"/>
+            <w:tcMar>
+              <w:top w:type="dxa" w:w="100"/>
               <w:left w:type="dxa" w:w="130"/>
-              <w:bottom w:type="dxa" w:w="70"/>
+              <w:bottom w:type="dxa" w:w="100"/>
               <w:right w:type="dxa" w:w="130"/>
             </w:tcMar>
-          </w:tcPr>
-          <w:p>
-            <w:pPr>
-              <w:spacing w:after="50" w:before="0" w:line="240" w:lineRule="auto"/>
-            </w:pPr>
-            <w:r>
-              <w:rPr>
-                <w:b/>
-                <w:bCs/>
+            <w:vAlign w:val="top"/>
+          </w:tcPr>
+          <w:p>
+            <w:pPr>
+              <w:spacing w:after="0" w:before="0" w:line="320" w:lineRule="auto"/>
+            </w:pPr>
+            <w:r>
+              <w:rPr>
                 <w:color w:val="4F7740"/>
-                <w:sz w:val="16"/>
-                <w:szCs w:val="16"/>
-              </w:rPr>
-              <w:t xml:space="preserve">✎  Write your version — for example:</w:t>
-            </w:r>
-          </w:p>
-          <w:p>
-            <w:pPr>
-              <w:spacing w:after="0" w:before="0" w:line="276" w:lineRule="auto"/>
-            </w:pPr>
+                <w:sz w:val="18"/>
+                <w:szCs w:val="18"/>
+              </w:rPr>
+              <w:t xml:space="preserve">✎  </w:t>
+            </w:r>
             <w:r>
               <w:rPr>
                 <w:i/>
                 <w:iCs/>
-                <w:color w:val="6B6B6B"/>
+                <w:color w:val="2D2D2D"/>
                 <w:sz w:val="20"/>
                 <w:szCs w:val="20"/>
               </w:rPr>
@@ -33083,58 +33451,61 @@
               <w:rPr>
                 <w:i/>
                 <w:iCs/>
-                <w:color w:val="6B6B6B"/>
+                <w:color w:val="2D2D2D"/>
                 <w:sz w:val="20"/>
                 <w:szCs w:val="20"/>
               </w:rPr>
-              <w:t xml:space="preserve">I'm feeling a bit scared sharing this with you because I'm afraid of being judged, but I really want to reconnect. When I (did, said etc.), I didn't meet my need for __________ (ex. care, consideration, ...), and that is really important to me because I know it had an impact on you. Now that I realize this, I would like to deal with that differently, in a way that is more in alignment with my values and creates more __________. I'm wondering what goes on for you hearing this?</w:t>
+              <w:t xml:space="preserve">I'm feeling a bit scared sharing this with you because I'm afraid of being judged, but I really want to reconnect. When I (did, said etc.), I didn't meet my need for </w:t>
+            </w:r>
+            <w:r>
+              <w:rPr>
+                <w:color w:val="2D2D2D"/>
+                <w:sz w:val="20"/>
+                <w:szCs w:val="20"/>
+                <w:u w:val="single" w:color="8A9099"/>
+                <w:shd w:fill="E4E7EC" w:val="clear"/>
+              </w:rPr>
+              <w:t xml:space="preserve">          </w:t>
             </w:r>
             <w:r>
               <w:rPr>
                 <w:i/>
                 <w:iCs/>
-                <w:color w:val="6B6B6B"/>
+                <w:color w:val="2D2D2D"/>
                 <w:sz w:val="20"/>
                 <w:szCs w:val="20"/>
               </w:rPr>
-              <w:t xml:space="preserve">”</w:t>
-            </w:r>
-          </w:p>
-        </w:tc>
-      </w:tr>
-      <w:tr>
-        <w:trPr>
-          <w:cantSplit/>
-          <w:trHeight w:val="520" w:hRule="atLeast"/>
-        </w:trPr>
-        <w:tc>
-          <w:tcPr>
-            <w:tcW w:type="dxa" w:w="9360"/>
-            <w:tcBorders>
-              <w:top w:val="single" w:color="CFE3DF" w:sz="4"/>
-              <w:left w:val="single" w:color="CFE3DF" w:sz="4"/>
-              <w:bottom w:val="single" w:color="CFE3DF" w:sz="4"/>
-              <w:right w:val="single" w:color="CFE3DF" w:sz="4"/>
-            </w:tcBorders>
-            <w:shd w:fill="FCFBF7" w:val="clear"/>
-            <w:tcMar>
-              <w:top w:type="dxa" w:w="80"/>
-              <w:left w:type="dxa" w:w="130"/>
-              <w:bottom w:type="dxa" w:w="80"/>
-              <w:right w:type="dxa" w:w="130"/>
-            </w:tcMar>
-            <w:vAlign w:val="top"/>
-          </w:tcPr>
-          <w:p>
-            <w:pPr>
-              <w:spacing w:after="0" w:before="0"/>
-            </w:pPr>
-            <w:r>
-              <w:rPr>
+              <w:t xml:space="preserve"> (ex. care, consideration, ...), and that is really important to me because I know it had an impact on you. Now that I realize this, I would like to deal with that differently, in a way that is more in alignment with my values and creates more </w:t>
+            </w:r>
+            <w:r>
+              <w:rPr>
+                <w:color w:val="2D2D2D"/>
                 <w:sz w:val="20"/>
                 <w:szCs w:val="20"/>
-              </w:rPr>
-              <w:t xml:space="preserve"/>
+                <w:u w:val="single" w:color="8A9099"/>
+                <w:shd w:fill="E4E7EC" w:val="clear"/>
+              </w:rPr>
+              <w:t xml:space="preserve">          </w:t>
+            </w:r>
+            <w:r>
+              <w:rPr>
+                <w:i/>
+                <w:iCs/>
+                <w:color w:val="2D2D2D"/>
+                <w:sz w:val="20"/>
+                <w:szCs w:val="20"/>
+              </w:rPr>
+              <w:t xml:space="preserve">. I'm wondering what goes on for you hearing this?</w:t>
+            </w:r>
+            <w:r>
+              <w:rPr>
+                <w:i/>
+                <w:iCs/>
+                <w:color w:val="2D2D2D"/>
+                <w:sz w:val="20"/>
+                <w:szCs w:val="20"/>
+              </w:rPr>
+              <w:t xml:space="preserve">”</w:t>
             </w:r>
           </w:p>
         </w:tc>
@@ -33181,7 +33552,7 @@
         <w:keepLines/>
         <w:spacing w:after="60" w:before="0" w:line="276" w:lineRule="auto"/>
       </w:pPr>
-      <w:hyperlink w:history="1" r:id="rIdzle9ulueeef1hb_1cxao2">
+      <w:hyperlink w:history="1" r:id="rIdkfmyqxkf_dyiayitdtzh6">
         <w:r>
           <w:rPr>
             <w:color w:val="1155CC"/>
@@ -33198,7 +33569,7 @@
         <w:keepLines/>
         <w:spacing w:after="60" w:before="0" w:line="276" w:lineRule="auto"/>
       </w:pPr>
-      <w:hyperlink w:history="1" r:id="rIdvuofvnrm1lauuspvho--k">
+      <w:hyperlink w:history="1" r:id="rIdmwuspn45udbpvncu1kym8">
         <w:r>
           <w:rPr>
             <w:color w:val="1155CC"/>
@@ -33569,7 +33940,10 @@
         <w:spacing w:after="50" w:before="200"/>
       </w:pPr>
       <w:r>
-        <w:t xml:space="preserve">Practice #1 — Liberate Yourself</w:t>
+        <w:t xml:space="preserve">Practice #1 — </w:t>
+      </w:r>
+      <w:r>
+        <w:t xml:space="preserve">Liberate Yourself</w:t>
       </w:r>
     </w:p>
     <w:p>
@@ -33779,7 +34153,10 @@
         <w:spacing w:after="50" w:before="200"/>
       </w:pPr>
       <w:r>
-        <w:t xml:space="preserve">Practice #2 — Persist</w:t>
+        <w:t xml:space="preserve">Practice #2 — </w:t>
+      </w:r>
+      <w:r>
+        <w:t xml:space="preserve">Persist</w:t>
       </w:r>
     </w:p>
     <w:p>
@@ -33875,7 +34252,7 @@
         <w:keepLines/>
         <w:spacing w:after="60" w:before="0" w:line="276" w:lineRule="auto"/>
       </w:pPr>
-      <w:hyperlink w:history="1" r:id="rIdknwhx2r8wtioettezinib">
+      <w:hyperlink w:history="1" r:id="rIdikcehciin7qifl-zozn8b">
         <w:r>
           <w:rPr>
             <w:color w:val="1155CC"/>
@@ -33892,7 +34269,7 @@
         <w:keepLines/>
         <w:spacing w:after="60" w:before="0" w:line="276" w:lineRule="auto"/>
       </w:pPr>
-      <w:hyperlink w:history="1" r:id="rIdmx2k8wm0egldj0h_iuel2">
+      <w:hyperlink w:history="1" r:id="rIdluabj_vhu89m4stige2vu">
         <w:r>
           <w:rPr>
             <w:color w:val="1155CC"/>
@@ -34263,7 +34640,10 @@
         <w:spacing w:after="50" w:before="200"/>
       </w:pPr>
       <w:r>
-        <w:t xml:space="preserve">Practice #1 — Finding Your Triggers</w:t>
+        <w:t xml:space="preserve">Practice #1 — </w:t>
+      </w:r>
+      <w:r>
+        <w:t xml:space="preserve">Finding Your Triggers</w:t>
       </w:r>
     </w:p>
     <w:p>
@@ -34461,7 +34841,10 @@
         <w:spacing w:after="50" w:before="200"/>
       </w:pPr>
       <w:r>
-        <w:t xml:space="preserve">Practice #2 — Working with Your Trigger</w:t>
+        <w:t xml:space="preserve">Practice #2 — </w:t>
+      </w:r>
+      <w:r>
+        <w:t xml:space="preserve">Working with Your Trigger</w:t>
       </w:r>
     </w:p>
     <w:p>
@@ -34649,7 +35032,7 @@
         <w:keepLines/>
         <w:spacing w:after="60" w:before="0" w:line="276" w:lineRule="auto"/>
       </w:pPr>
-      <w:hyperlink w:history="1" r:id="rIdm7cnnz4cl9_vppohysjai">
+      <w:hyperlink w:history="1" r:id="rIdum0-w_k6hrsygvqsv2_kf">
         <w:r>
           <w:rPr>
             <w:color w:val="1155CC"/>
@@ -34666,7 +35049,7 @@
         <w:keepLines/>
         <w:spacing w:after="60" w:before="0" w:line="276" w:lineRule="auto"/>
       </w:pPr>
-      <w:hyperlink w:history="1" r:id="rIdkwz9g3zdrl6seffwwdpql">
+      <w:hyperlink w:history="1" r:id="rId-fhkcrigsu294cdxzoxcz">
         <w:r>
           <w:rPr>
             <w:color w:val="1155CC"/>
@@ -35037,7 +35420,10 @@
         <w:spacing w:after="50" w:before="200"/>
       </w:pPr>
       <w:r>
-        <w:t xml:space="preserve">Practice #1 — Noticing Small Feelings</w:t>
+        <w:t xml:space="preserve">Practice #1 — </w:t>
+      </w:r>
+      <w:r>
+        <w:t xml:space="preserve">Noticing Small Feelings</w:t>
       </w:r>
     </w:p>
     <w:p>
@@ -35271,7 +35657,10 @@
         <w:spacing w:after="50" w:before="200"/>
       </w:pPr>
       <w:r>
-        <w:t xml:space="preserve">Practice #2 — Noticing "Pervasive Feelings"</w:t>
+        <w:t xml:space="preserve">Practice #2 — </w:t>
+      </w:r>
+      <w:r>
+        <w:t xml:space="preserve">Noticing "Pervasive Feelings"</w:t>
       </w:r>
     </w:p>
     <w:p>
@@ -35327,7 +35716,7 @@
         <w:keepLines/>
         <w:spacing w:after="60" w:before="0" w:line="276" w:lineRule="auto"/>
       </w:pPr>
-      <w:hyperlink w:history="1" r:id="rIdboerrpo-pawnk_lf8rsrp">
+      <w:hyperlink w:history="1" r:id="rIdaqejmcjbuwpqzjgqpaezo">
         <w:r>
           <w:rPr>
             <w:color w:val="1155CC"/>
@@ -35344,7 +35733,7 @@
         <w:keepLines/>
         <w:spacing w:after="60" w:before="0" w:line="276" w:lineRule="auto"/>
       </w:pPr>
-      <w:hyperlink w:history="1" r:id="rIdtcrxumcdhckm2wfqzssoy">
+      <w:hyperlink w:history="1" r:id="rIdedlgahv46pu51p14-q-co">
         <w:r>
           <w:rPr>
             <w:color w:val="1155CC"/>
@@ -35715,7 +36104,10 @@
         <w:spacing w:after="50" w:before="200"/>
       </w:pPr>
       <w:r>
-        <w:t xml:space="preserve">Practice #1 — Needs Assessment Exercise</w:t>
+        <w:t xml:space="preserve">Practice #1 — </w:t>
+      </w:r>
+      <w:r>
+        <w:t xml:space="preserve">Needs Assessment Exercise</w:t>
       </w:r>
     </w:p>
     <w:p>
@@ -35925,7 +36317,10 @@
         <w:spacing w:after="50" w:before="200"/>
       </w:pPr>
       <w:r>
-        <w:t xml:space="preserve">Practice #2 — Keep Your Needs in Front of You</w:t>
+        <w:t xml:space="preserve">Practice #2 — </w:t>
+      </w:r>
+      <w:r>
+        <w:t xml:space="preserve">Keep Your Needs in Front of You</w:t>
       </w:r>
     </w:p>
     <w:p>
@@ -35965,7 +36360,7 @@
         <w:keepLines/>
         <w:spacing w:after="60" w:before="0" w:line="276" w:lineRule="auto"/>
       </w:pPr>
-      <w:hyperlink w:history="1" r:id="rIdvq4wpmfvailtzwytvkifr">
+      <w:hyperlink w:history="1" r:id="rIdqa5jwkhpmrfxlbvvjsn-r">
         <w:r>
           <w:rPr>
             <w:color w:val="1155CC"/>
@@ -35982,7 +36377,7 @@
         <w:keepLines/>
         <w:spacing w:after="60" w:before="0" w:line="276" w:lineRule="auto"/>
       </w:pPr>
-      <w:hyperlink w:history="1" r:id="rIdkuxpuykx5lafdqeouvesf">
+      <w:hyperlink w:history="1" r:id="rIdkbtrisp5cfngzuujolacp">
         <w:r>
           <w:rPr>
             <w:color w:val="1155CC"/>
@@ -36353,7 +36748,10 @@
         <w:spacing w:after="50" w:before="200"/>
       </w:pPr>
       <w:r>
-        <w:t xml:space="preserve">Practice #1 — Practice Your Street Empathy</w:t>
+        <w:t xml:space="preserve">Practice #1 — </w:t>
+      </w:r>
+      <w:r>
+        <w:t xml:space="preserve">Practice Your Street Empathy</w:t>
       </w:r>
     </w:p>
     <w:p>
@@ -36559,7 +36957,10 @@
         <w:spacing w:after="50" w:before="200"/>
       </w:pPr>
       <w:r>
-        <w:t xml:space="preserve">Practice #2 — Practice Your Street Empathy Again</w:t>
+        <w:t xml:space="preserve">Practice #2 — </w:t>
+      </w:r>
+      <w:r>
+        <w:t xml:space="preserve">Practice Your Street Empathy Again</w:t>
       </w:r>
     </w:p>
     <w:p>
@@ -36801,7 +37202,10 @@
         <w:spacing w:after="50" w:before="200"/>
       </w:pPr>
       <w:r>
-        <w:t xml:space="preserve">Practice #3 — Plan B - Getting Transparent</w:t>
+        <w:t xml:space="preserve">Practice #3 — </w:t>
+      </w:r>
+      <w:r>
+        <w:t xml:space="preserve">Plan B - Getting Transparent</w:t>
       </w:r>
     </w:p>
     <w:p>
@@ -36877,7 +37281,7 @@
         <w:keepLines/>
         <w:spacing w:after="60" w:before="0" w:line="276" w:lineRule="auto"/>
       </w:pPr>
-      <w:hyperlink w:history="1" r:id="rIdng6oni73kfl6djfwnysi7">
+      <w:hyperlink w:history="1" r:id="rIdhl3da_nzv4-nudibvszlx">
         <w:r>
           <w:rPr>
             <w:color w:val="1155CC"/>
@@ -36894,7 +37298,7 @@
         <w:keepLines/>
         <w:spacing w:after="60" w:before="0" w:line="276" w:lineRule="auto"/>
       </w:pPr>
-      <w:hyperlink w:history="1" r:id="rIdetpdcezv50rp0lq_mbrnl">
+      <w:hyperlink w:history="1" r:id="rIdvtuql2sa67uchekq16pin">
         <w:r>
           <w:rPr>
             <w:color w:val="1155CC"/>
@@ -37265,7 +37669,10 @@
         <w:spacing w:after="50" w:before="200"/>
       </w:pPr>
       <w:r>
-        <w:t xml:space="preserve">Practice #1 — Appreciating Life</w:t>
+        <w:t xml:space="preserve">Practice #1 — </w:t>
+      </w:r>
+      <w:r>
+        <w:t xml:space="preserve">Appreciating Life</w:t>
       </w:r>
     </w:p>
     <w:p>
@@ -37451,7 +37858,10 @@
         <w:spacing w:after="50" w:before="200"/>
       </w:pPr>
       <w:r>
-        <w:t xml:space="preserve">Practice #2 — Contributing to Life</w:t>
+        <w:t xml:space="preserve">Practice #2 — </w:t>
+      </w:r>
+      <w:r>
+        <w:t xml:space="preserve">Contributing to Life</w:t>
       </w:r>
     </w:p>
     <w:p>
@@ -37527,7 +37937,7 @@
         <w:keepLines/>
         <w:spacing w:after="60" w:before="0" w:line="276" w:lineRule="auto"/>
       </w:pPr>
-      <w:hyperlink w:history="1" r:id="rIdvzevdmsva7nccn1bpopqh">
+      <w:hyperlink w:history="1" r:id="rIdsunkqcmnututswxq99wkm">
         <w:r>
           <w:rPr>
             <w:color w:val="1155CC"/>
@@ -37544,7 +37954,7 @@
         <w:keepLines/>
         <w:spacing w:after="60" w:before="0" w:line="276" w:lineRule="auto"/>
       </w:pPr>
-      <w:hyperlink w:history="1" r:id="rId_m3pbgowrv_dzvk22rewn">
+      <w:hyperlink w:history="1" r:id="rIdkohbkg_apdmjw0xbj8hxr">
         <w:r>
           <w:rPr>
             <w:color w:val="1155CC"/>
@@ -37915,7 +38325,10 @@
         <w:spacing w:after="50" w:before="200"/>
       </w:pPr>
       <w:r>
-        <w:t xml:space="preserve">Practice #1 — Practice, Practice</w:t>
+        <w:t xml:space="preserve">Practice #1 — </w:t>
+      </w:r>
+      <w:r>
+        <w:t xml:space="preserve">Practice, Practice</w:t>
       </w:r>
     </w:p>
     <w:p>
@@ -38033,7 +38446,10 @@
         <w:spacing w:after="50" w:before="200"/>
       </w:pPr>
       <w:r>
-        <w:t xml:space="preserve">Practice #2 — Practice, Practice, Practice</w:t>
+        <w:t xml:space="preserve">Practice #2 — </w:t>
+      </w:r>
+      <w:r>
+        <w:t xml:space="preserve">Practice, Practice, Practice</w:t>
       </w:r>
     </w:p>
     <w:p>
@@ -38151,15 +38567,18 @@
         <w:spacing w:after="50" w:before="200"/>
       </w:pPr>
       <w:r>
-        <w:t xml:space="preserve">Practice #3 — Dream...</w:t>
-      </w:r>
-    </w:p>
-    <w:p>
-      <w:pPr>
-        <w:keepLines/>
-        <w:spacing w:after="60" w:before="0" w:line="276" w:lineRule="auto"/>
-      </w:pPr>
-      <w:hyperlink w:history="1" r:id="rIdjyodhh2pucw2_u8ix7fde">
+        <w:t xml:space="preserve">Practice #3 — </w:t>
+      </w:r>
+      <w:r>
+        <w:t xml:space="preserve">Dream...</w:t>
+      </w:r>
+    </w:p>
+    <w:p>
+      <w:pPr>
+        <w:keepLines/>
+        <w:spacing w:after="60" w:before="0" w:line="276" w:lineRule="auto"/>
+      </w:pPr>
+      <w:hyperlink w:history="1" r:id="rIdrspr9_33dnyxlh2bdkvfa">
         <w:r>
           <w:rPr>
             <w:color w:val="1155CC"/>
@@ -38176,7 +38595,7 @@
         <w:keepLines/>
         <w:spacing w:after="60" w:before="0" w:line="276" w:lineRule="auto"/>
       </w:pPr>
-      <w:hyperlink w:history="1" r:id="rIdgyykwmarwok9wifbreiu2">
+      <w:hyperlink w:history="1" r:id="rIdtz6pj8vc7zlncmqxpgaun">
         <w:r>
           <w:rPr>
             <w:color w:val="1155CC"/>

</xml_diff>

<commit_message>
Workbook: add small 'Empathy hours' number field to weeks 11-52
A compact inline field (title + short shaded blank) at the bottom of every week
after week 10, below Reflections & Notes. Regenerated the docx.

Co-Authored-By: Claude Opus 4.8 (1M context) <noreply@anthropic.com>
</commit_message>
<xml_diff>
--- a/.local-workbook/The Compassion Course 2026-2027 Workbook.docx
+++ b/.local-workbook/The Compassion Course 2026-2027 Workbook.docx
@@ -579,7 +579,7 @@
         </w:rPr>
         <w:t xml:space="preserve">Keep a small journal with you throughout the day. Make 1 to 5 entries per day that include the description of an act or words spoken by someone and what need you imagine they were trying to meet. It is SUPER important to limit the words you use to those on the </w:t>
       </w:r>
-      <w:hyperlink w:history="1" r:id="rIddfafcjvpdhx62l5h0otoc">
+      <w:hyperlink w:history="1" r:id="rId4a7_q9tjzutwtfcxvcq0p">
         <w:r>
           <w:rPr>
             <w:color w:val="1155CC"/>
@@ -721,7 +721,7 @@
         </w:rPr>
         <w:t xml:space="preserve">Think of someone who is close to you who is doing or saying something you don't like. See if you can figure out what need they are attempting to fulfill. Again, it is really important to limit the words you use to those on the </w:t>
       </w:r>
-      <w:hyperlink w:history="1" r:id="rId_lberb_fj1-ivotgpueaj">
+      <w:hyperlink w:history="1" r:id="rIdj628tpuvmfytovyomd63p">
         <w:r>
           <w:rPr>
             <w:color w:val="1155CC"/>
@@ -1016,7 +1016,7 @@
         </w:rPr>
         <w:t xml:space="preserve">Extended registration lasts for one week. To let someone know about the course you can use the following link: </w:t>
       </w:r>
-      <w:hyperlink w:history="1" r:id="rIdvz01i_fjdlp8moa4xwdsb">
+      <w:hyperlink w:history="1" r:id="rIdiqxfemsr1xim8u50mpse0">
         <w:r>
           <w:rPr>
             <w:color w:val="1155CC"/>
@@ -1418,7 +1418,7 @@
         </w:rPr>
         <w:t xml:space="preserve">Keep a small journal with you throughout the day. Make 1 to 5 entries per day that include judgment words you said or were thinking of saying. Later on, when you have time, sit down with the </w:t>
       </w:r>
-      <w:hyperlink w:history="1" r:id="rIdznibp0jjjfg3n2ltp7gy-">
+      <w:hyperlink w:history="1" r:id="rIdz78-fopbiwmahumatvv38">
         <w:r>
           <w:rPr>
             <w:color w:val="1155CC"/>
@@ -1439,7 +1439,7 @@
         </w:rPr>
         <w:t xml:space="preserve"> and see if you can figure out what need of yours the judgment was (or is) related to. Remember, to successfully complete this exercise, limit the words you use to those on the </w:t>
       </w:r>
-      <w:hyperlink w:history="1" r:id="rIdnfsihrazdwissapzjy4xy">
+      <w:hyperlink w:history="1" r:id="rIdlavnwli2dqvhukhur_x11">
         <w:r>
           <w:rPr>
             <w:color w:val="1155CC"/>
@@ -1581,7 +1581,7 @@
         </w:rPr>
         <w:t xml:space="preserve">Keep a small journal with you throughout the day. It could be a little book, a folded piece of paper or a napkin -anything you can write on. Make 1 to 5 entries per day that include judgment words spoken by someone. Later on, when you have time, sit down with the </w:t>
       </w:r>
-      <w:hyperlink w:history="1" r:id="rIdmkzeauc-rrc3l4chykoar">
+      <w:hyperlink w:history="1" r:id="rIde2wfxb9-hbmsgnvf2v0_g">
         <w:r>
           <w:rPr>
             <w:color w:val="1155CC"/>
@@ -1602,7 +1602,7 @@
         </w:rPr>
         <w:t xml:space="preserve"> and see if you can figure out what need was unmet for them. Remember to limit the words you use to those on the </w:t>
       </w:r>
-      <w:hyperlink w:history="1" r:id="rIdqg-wrl5pflkfloucyy5ho">
+      <w:hyperlink w:history="1" r:id="rIdocih2lttuysuk9uxtgidz">
         <w:r>
           <w:rPr>
             <w:color w:val="1155CC"/>
@@ -2141,7 +2141,7 @@
         </w:rPr>
         <w:t xml:space="preserve">Later on, when you have time, sit down with the </w:t>
       </w:r>
-      <w:hyperlink w:history="1" r:id="rIdsjlp8yfhpbh8isgd_o57d">
+      <w:hyperlink w:history="1" r:id="rIdgubsxleismu5wtnlek-gw">
         <w:r>
           <w:rPr>
             <w:color w:val="1155CC"/>
@@ -2198,7 +2198,7 @@
         </w:rPr>
         <w:t xml:space="preserve"> at the top of the </w:t>
       </w:r>
-      <w:hyperlink w:history="1" r:id="rIdggsdban4kdl_sx6vm76bc">
+      <w:hyperlink w:history="1" r:id="rIdadqxop-bwjr59x1hjq-bp">
         <w:r>
           <w:rPr>
             <w:color w:val="1155CC"/>
@@ -2235,7 +2235,7 @@
         </w:rPr>
         <w:t xml:space="preserve">Then look at the </w:t>
       </w:r>
-      <w:hyperlink w:history="1" r:id="rId7apbtcimfuz17tmr9pnby">
+      <w:hyperlink w:history="1" r:id="rIdq7eznpt-xc_agrf4qx-fb">
         <w:r>
           <w:rPr>
             <w:color w:val="1155CC"/>
@@ -2256,7 +2256,7 @@
         </w:rPr>
         <w:t xml:space="preserve"> and see if you can figure out what need your feeling was about. Remember, it's VERY helpful to limit the words you use to those on the </w:t>
       </w:r>
-      <w:hyperlink w:history="1" r:id="rIdvrqqnyrthax4lqgzbodam">
+      <w:hyperlink w:history="1" r:id="rIdphzvbxpen57nir6zfw_pe">
         <w:r>
           <w:rPr>
             <w:color w:val="1155CC"/>
@@ -2398,7 +2398,7 @@
         </w:rPr>
         <w:t xml:space="preserve">Keep a small journal with you throughout the day. Make 2 to 4 entries per day that include something you did, said or were thinking of saying and the feeling (or feelings) you experienced at that moment. Again, later on, when you have time, sit down with the </w:t>
       </w:r>
-      <w:hyperlink w:history="1" r:id="rId6bye6fisdjkiulfxyejtu">
+      <w:hyperlink w:history="1" r:id="rIdnpgj6n8bjjxsik-bpurd4">
         <w:r>
           <w:rPr>
             <w:color w:val="1155CC"/>
@@ -2455,7 +2455,7 @@
         </w:rPr>
         <w:t xml:space="preserve"> at the top of the </w:t>
       </w:r>
-      <w:hyperlink w:history="1" r:id="rIdweak6lv2edz25szx_qex9">
+      <w:hyperlink w:history="1" r:id="rId8us7xobnjnjhytlyfpjkf">
         <w:r>
           <w:rPr>
             <w:color w:val="1155CC"/>
@@ -2492,7 +2492,7 @@
         </w:rPr>
         <w:t xml:space="preserve">Then look at the </w:t>
       </w:r>
-      <w:hyperlink w:history="1" r:id="rIdpqz4osu95lju_pyoe8a_0">
+      <w:hyperlink w:history="1" r:id="rId_3rgr1r5ptkh46hd3b9ms">
         <w:r>
           <w:rPr>
             <w:color w:val="1155CC"/>
@@ -2513,7 +2513,7 @@
         </w:rPr>
         <w:t xml:space="preserve"> and see if you can figure out what need your feeling was about. Remember, here too, it's VERY important to limit the words you use to those on the </w:t>
       </w:r>
-      <w:hyperlink w:history="1" r:id="rIdszj_ntu69os7npnypsgws">
+      <w:hyperlink w:history="1" r:id="rIdbmvl0cdgxla5-ogjsmnqm">
         <w:r>
           <w:rPr>
             <w:color w:val="1155CC"/>
@@ -2899,7 +2899,7 @@
       <w:r>
         <w:t xml:space="preserve">Read the </w:t>
       </w:r>
-      <w:hyperlink w:history="1" r:id="rIdfwuldzoxdjczfyimcnyuk">
+      <w:hyperlink w:history="1" r:id="rIdudg0ntqasdqono2-xtams">
         <w:r>
           <w:rPr>
             <w:color w:val="1155CC"/>
@@ -3032,7 +3032,7 @@
       <w:r>
         <w:t xml:space="preserve">Print a copy of the </w:t>
       </w:r>
-      <w:hyperlink w:history="1" r:id="rIdc8sz9rhyxoe_cjkhebfcp">
+      <w:hyperlink w:history="1" r:id="rId31dt3ye4fmb-cwzjkupm7">
         <w:r>
           <w:rPr>
             <w:color w:val="1155CC"/>
@@ -3197,7 +3197,7 @@
         </w:rPr>
         <w:t xml:space="preserve">Keep a small journal with you throughout the day. Make 1 to 5 entries per day that include an act or words spoken by someone and what need(s) you imagine they were trying to meet. Remember, it's VERY helpful to limit the words you use to those on the </w:t>
       </w:r>
-      <w:hyperlink w:history="1" r:id="rIdkps4ml-h1hstsvmktsdsx">
+      <w:hyperlink w:history="1" r:id="rIdhrdg_z9eibhgs9w-uh4re">
         <w:r>
           <w:rPr>
             <w:color w:val="1155CC"/>
@@ -3339,7 +3339,7 @@
         </w:rPr>
         <w:t xml:space="preserve">Think of someone that you think is preventing you from getting a need(s) met. Write down the need(s) from the </w:t>
       </w:r>
-      <w:hyperlink w:history="1" r:id="rIdt6hngjzv1ftpmzecb8i7n">
+      <w:hyperlink w:history="1" r:id="rIdtxugbqs89e5djpgluiw8c">
         <w:r>
           <w:rPr>
             <w:color w:val="1155CC"/>
@@ -3741,7 +3741,7 @@
         </w:rPr>
         <w:t xml:space="preserve">Visit: http://</w:t>
       </w:r>
-      <w:hyperlink w:history="1" r:id="rIdm_zv2-homfk0qswlasgcy">
+      <w:hyperlink w:history="1" r:id="rIdeksmhepsysaibzenzpzsr">
         <w:r>
           <w:rPr>
             <w:color w:val="1155CC"/>
@@ -4017,7 +4017,7 @@
         <w:keepLines/>
         <w:spacing w:after="60" w:before="0" w:line="276" w:lineRule="auto"/>
       </w:pPr>
-      <w:hyperlink w:history="1" r:id="rId4hmqj6lt-irz0t2sjgnn9">
+      <w:hyperlink w:history="1" r:id="rIdnpt64pbuyvvchumbiamvs">
         <w:r>
           <w:rPr>
             <w:color w:val="1155CC"/>
@@ -4409,7 +4409,7 @@
         </w:rPr>
         <w:t xml:space="preserve">Continue working with this exercise (</w:t>
       </w:r>
-      <w:hyperlink w:history="1" r:id="rIdjdydw09qbhtwlrzf-r-84">
+      <w:hyperlink w:history="1" r:id="rIdkqk15h3wpeehb55g1vykc">
         <w:r>
           <w:rPr>
             <w:color w:val="1155CC"/>
@@ -4720,7 +4720,7 @@
         </w:rPr>
         <w:t xml:space="preserve"> - take your time). Next, view or print a copy of the </w:t>
       </w:r>
-      <w:hyperlink w:history="1" r:id="rIdoaup967qrgoqi1gfjbotm">
+      <w:hyperlink w:history="1" r:id="rIddaxydr7lone9j6wwcuef_">
         <w:r>
           <w:rPr>
             <w:color w:val="1155CC"/>
@@ -5253,7 +5253,7 @@
         <w:keepLines/>
         <w:spacing w:after="60" w:before="0" w:line="276" w:lineRule="auto"/>
       </w:pPr>
-      <w:hyperlink w:history="1" r:id="rId8vfflrijnokbq-vkk2j5s">
+      <w:hyperlink w:history="1" r:id="rIdiyo88thfovxbukyclk5jr">
         <w:r>
           <w:rPr>
             <w:color w:val="1155CC"/>
@@ -6379,7 +6379,7 @@
         </w:rPr>
         <w:t xml:space="preserve">Then look at the </w:t>
       </w:r>
-      <w:hyperlink w:history="1" r:id="rIdhyhzesqczlpbklu8rro_u">
+      <w:hyperlink w:history="1" r:id="rIdv7acenax6dhrqz44wwydb">
         <w:r>
           <w:rPr>
             <w:color w:val="1155CC"/>
@@ -7094,7 +7094,7 @@
         </w:rPr>
         <w:t xml:space="preserve">Later on, when you have time, read over your journal for the day. Next, check in with yourself about how you feel as you think about those thoughts. Then look at the </w:t>
       </w:r>
-      <w:hyperlink w:history="1" r:id="rIdfmdnzfbdlob2s2hneaw-j">
+      <w:hyperlink w:history="1" r:id="rIdpn7tzxmibpxxvu44i3c0b">
         <w:r>
           <w:rPr>
             <w:color w:val="1155CC"/>
@@ -7552,7 +7552,7 @@
         </w:rPr>
         <w:t xml:space="preserve"> response would be. What was that person feeling? What was that person needing, wanting to have more of, or yearning to experience? Check the </w:t>
       </w:r>
-      <w:hyperlink w:history="1" r:id="rIdxexn0twd9wezhrrqbcx_n">
+      <w:hyperlink w:history="1" r:id="rIdrou7w4fbsk8iakaqig2o1">
         <w:r>
           <w:rPr>
             <w:color w:val="1155CC"/>
@@ -7573,7 +7573,7 @@
         </w:rPr>
         <w:t xml:space="preserve"> and the </w:t>
       </w:r>
-      <w:hyperlink w:history="1" r:id="rIdt3hbizggnai3in70szjz5">
+      <w:hyperlink w:history="1" r:id="rIdcxyso28i1c0fojtit5t5l">
         <w:r>
           <w:rPr>
             <w:color w:val="1155CC"/>
@@ -8025,7 +8025,7 @@
               </w:rPr>
               <w:t xml:space="preserve"> (feeling from the </w:t>
             </w:r>
-            <w:hyperlink w:history="1" r:id="rIdbdftpt9undhv5j3yj-twe">
+            <w:hyperlink w:history="1" r:id="rIdsg4mby3lgovnzp6mrrt41">
               <w:r>
                 <w:rPr>
                   <w:color w:val="1155CC"/>
@@ -8066,7 +8066,7 @@
               </w:rPr>
               <w:t xml:space="preserve"> (need from the </w:t>
             </w:r>
-            <w:hyperlink w:history="1" r:id="rIdapy49mic0tpculkszskdc">
+            <w:hyperlink w:history="1" r:id="rId0vmnt9livagytad4xn8hr">
               <w:r>
                 <w:rPr>
                   <w:color w:val="1155CC"/>
@@ -9181,6 +9181,31 @@
     </w:tbl>
     <w:p>
       <w:pPr>
+        <w:spacing w:after="0" w:before="150"/>
+      </w:pPr>
+      <w:r>
+        <w:rPr>
+          <w:b/>
+          <w:bCs/>
+          <w:color w:val="2D2D2D"/>
+          <w:sz w:val="20"/>
+          <w:szCs w:val="20"/>
+        </w:rPr>
+        <w:t xml:space="preserve">Empathy hours:  </w:t>
+      </w:r>
+      <w:r>
+        <w:rPr>
+          <w:color w:val="2D2D2D"/>
+          <w:sz w:val="20"/>
+          <w:szCs w:val="20"/>
+          <w:u w:val="single" w:color="8A9099"/>
+          <w:shd w:fill="E4E7EC" w:val="clear"/>
+        </w:rPr>
+        <w:t xml:space="preserve">        </w:t>
+      </w:r>
+    </w:p>
+    <w:p>
+      <w:pPr>
         <w:pStyle w:val="Heading1"/>
         <w:pageBreakBefore/>
         <w:shd w:fill="5A5298" w:val="clear"/>
@@ -10003,6 +10028,31 @@
     </w:tbl>
     <w:p>
       <w:pPr>
+        <w:spacing w:after="0" w:before="150"/>
+      </w:pPr>
+      <w:r>
+        <w:rPr>
+          <w:b/>
+          <w:bCs/>
+          <w:color w:val="2D2D2D"/>
+          <w:sz w:val="20"/>
+          <w:szCs w:val="20"/>
+        </w:rPr>
+        <w:t xml:space="preserve">Empathy hours:  </w:t>
+      </w:r>
+      <w:r>
+        <w:rPr>
+          <w:color w:val="2D2D2D"/>
+          <w:sz w:val="20"/>
+          <w:szCs w:val="20"/>
+          <w:u w:val="single" w:color="8A9099"/>
+          <w:shd w:fill="E4E7EC" w:val="clear"/>
+        </w:rPr>
+        <w:t xml:space="preserve">        </w:t>
+      </w:r>
+    </w:p>
+    <w:p>
+      <w:pPr>
         <w:pStyle w:val="Heading1"/>
         <w:pageBreakBefore/>
         <w:shd w:fill="8B654B" w:val="clear"/>
@@ -10758,6 +10808,31 @@
     </w:tbl>
     <w:p>
       <w:pPr>
+        <w:spacing w:after="0" w:before="150"/>
+      </w:pPr>
+      <w:r>
+        <w:rPr>
+          <w:b/>
+          <w:bCs/>
+          <w:color w:val="2D2D2D"/>
+          <w:sz w:val="20"/>
+          <w:szCs w:val="20"/>
+        </w:rPr>
+        <w:t xml:space="preserve">Empathy hours:  </w:t>
+      </w:r>
+      <w:r>
+        <w:rPr>
+          <w:color w:val="2D2D2D"/>
+          <w:sz w:val="20"/>
+          <w:szCs w:val="20"/>
+          <w:u w:val="single" w:color="8A9099"/>
+          <w:shd w:fill="E4E7EC" w:val="clear"/>
+        </w:rPr>
+        <w:t xml:space="preserve">        </w:t>
+      </w:r>
+    </w:p>
+    <w:p>
+      <w:pPr>
         <w:pStyle w:val="Heading1"/>
         <w:pageBreakBefore/>
         <w:shd w:fill="407766" w:val="clear"/>
@@ -11721,6 +11796,31 @@
     </w:tbl>
     <w:p>
       <w:pPr>
+        <w:spacing w:after="0" w:before="150"/>
+      </w:pPr>
+      <w:r>
+        <w:rPr>
+          <w:b/>
+          <w:bCs/>
+          <w:color w:val="2D2D2D"/>
+          <w:sz w:val="20"/>
+          <w:szCs w:val="20"/>
+        </w:rPr>
+        <w:t xml:space="preserve">Empathy hours:  </w:t>
+      </w:r>
+      <w:r>
+        <w:rPr>
+          <w:color w:val="2D2D2D"/>
+          <w:sz w:val="20"/>
+          <w:szCs w:val="20"/>
+          <w:u w:val="single" w:color="8A9099"/>
+          <w:shd w:fill="E4E7EC" w:val="clear"/>
+        </w:rPr>
+        <w:t xml:space="preserve">        </w:t>
+      </w:r>
+    </w:p>
+    <w:p>
+      <w:pPr>
         <w:pStyle w:val="Heading1"/>
         <w:pageBreakBefore/>
         <w:shd w:fill="975298" w:val="clear"/>
@@ -12632,6 +12732,31 @@
     </w:tbl>
     <w:p>
       <w:pPr>
+        <w:spacing w:after="0" w:before="150"/>
+      </w:pPr>
+      <w:r>
+        <w:rPr>
+          <w:b/>
+          <w:bCs/>
+          <w:color w:val="2D2D2D"/>
+          <w:sz w:val="20"/>
+          <w:szCs w:val="20"/>
+        </w:rPr>
+        <w:t xml:space="preserve">Empathy hours:  </w:t>
+      </w:r>
+      <w:r>
+        <w:rPr>
+          <w:color w:val="2D2D2D"/>
+          <w:sz w:val="20"/>
+          <w:szCs w:val="20"/>
+          <w:u w:val="single" w:color="8A9099"/>
+          <w:shd w:fill="E4E7EC" w:val="clear"/>
+        </w:rPr>
+        <w:t xml:space="preserve">        </w:t>
+      </w:r>
+    </w:p>
+    <w:p>
+      <w:pPr>
         <w:pStyle w:val="Heading1"/>
         <w:pageBreakBefore/>
         <w:shd w:fill="687740" w:val="clear"/>
@@ -13407,6 +13532,31 @@
     </w:tbl>
     <w:p>
       <w:pPr>
+        <w:spacing w:after="0" w:before="150"/>
+      </w:pPr>
+      <w:r>
+        <w:rPr>
+          <w:b/>
+          <w:bCs/>
+          <w:color w:val="2D2D2D"/>
+          <w:sz w:val="20"/>
+          <w:szCs w:val="20"/>
+        </w:rPr>
+        <w:t xml:space="preserve">Empathy hours:  </w:t>
+      </w:r>
+      <w:r>
+        <w:rPr>
+          <w:color w:val="2D2D2D"/>
+          <w:sz w:val="20"/>
+          <w:szCs w:val="20"/>
+          <w:u w:val="single" w:color="8A9099"/>
+          <w:shd w:fill="E4E7EC" w:val="clear"/>
+        </w:rPr>
+        <w:t xml:space="preserve">        </w:t>
+      </w:r>
+    </w:p>
+    <w:p>
+      <w:pPr>
         <w:pStyle w:val="Heading1"/>
         <w:pageBreakBefore/>
         <w:shd w:fill="527098" w:val="clear"/>
@@ -13949,6 +14099,31 @@
     </w:tbl>
     <w:p>
       <w:pPr>
+        <w:spacing w:after="0" w:before="150"/>
+      </w:pPr>
+      <w:r>
+        <w:rPr>
+          <w:b/>
+          <w:bCs/>
+          <w:color w:val="2D2D2D"/>
+          <w:sz w:val="20"/>
+          <w:szCs w:val="20"/>
+        </w:rPr>
+        <w:t xml:space="preserve">Empathy hours:  </w:t>
+      </w:r>
+      <w:r>
+        <w:rPr>
+          <w:color w:val="2D2D2D"/>
+          <w:sz w:val="20"/>
+          <w:szCs w:val="20"/>
+          <w:u w:val="single" w:color="8A9099"/>
+          <w:shd w:fill="E4E7EC" w:val="clear"/>
+        </w:rPr>
+        <w:t xml:space="preserve">        </w:t>
+      </w:r>
+    </w:p>
+    <w:p>
+      <w:pPr>
         <w:pStyle w:val="Heading1"/>
         <w:pageBreakBefore/>
         <w:shd w:fill="98525C" w:val="clear"/>
@@ -14483,6 +14658,31 @@
     </w:tbl>
     <w:p>
       <w:pPr>
+        <w:spacing w:after="0" w:before="150"/>
+      </w:pPr>
+      <w:r>
+        <w:rPr>
+          <w:b/>
+          <w:bCs/>
+          <w:color w:val="2D2D2D"/>
+          <w:sz w:val="20"/>
+          <w:szCs w:val="20"/>
+        </w:rPr>
+        <w:t xml:space="preserve">Empathy hours:  </w:t>
+      </w:r>
+      <w:r>
+        <w:rPr>
+          <w:color w:val="2D2D2D"/>
+          <w:sz w:val="20"/>
+          <w:szCs w:val="20"/>
+          <w:u w:val="single" w:color="8A9099"/>
+          <w:shd w:fill="E4E7EC" w:val="clear"/>
+        </w:rPr>
+        <w:t xml:space="preserve">        </w:t>
+      </w:r>
+    </w:p>
+    <w:p>
+      <w:pPr>
         <w:pStyle w:val="Heading1"/>
         <w:pageBreakBefore/>
         <w:shd w:fill="447E4D" w:val="clear"/>
@@ -14704,7 +14904,7 @@
         <w:keepLines/>
         <w:spacing w:after="60" w:before="0" w:line="276" w:lineRule="auto"/>
       </w:pPr>
-      <w:hyperlink w:history="1" r:id="rIdc7px8xkdzxp0wcymmwt2z">
+      <w:hyperlink w:history="1" r:id="rIdf_reejd2w1fozgluvpboe">
         <w:r>
           <w:rPr>
             <w:color w:val="1155CC"/>
@@ -14721,7 +14921,7 @@
         <w:keepLines/>
         <w:spacing w:after="60" w:before="0" w:line="276" w:lineRule="auto"/>
       </w:pPr>
-      <w:hyperlink w:history="1" r:id="rId4gw6uci_crzrar6blwcnm">
+      <w:hyperlink w:history="1" r:id="rIdegfh7dpcpmomgt_z7oiz1">
         <w:r>
           <w:rPr>
             <w:color w:val="1155CC"/>
@@ -15059,6 +15259,31 @@
     </w:tbl>
     <w:p>
       <w:pPr>
+        <w:spacing w:after="0" w:before="150"/>
+      </w:pPr>
+      <w:r>
+        <w:rPr>
+          <w:b/>
+          <w:bCs/>
+          <w:color w:val="2D2D2D"/>
+          <w:sz w:val="20"/>
+          <w:szCs w:val="20"/>
+        </w:rPr>
+        <w:t xml:space="preserve">Empathy hours:  </w:t>
+      </w:r>
+      <w:r>
+        <w:rPr>
+          <w:color w:val="2D2D2D"/>
+          <w:sz w:val="20"/>
+          <w:szCs w:val="20"/>
+          <w:u w:val="single" w:color="8A9099"/>
+          <w:shd w:fill="E4E7EC" w:val="clear"/>
+        </w:rPr>
+        <w:t xml:space="preserve">        </w:t>
+      </w:r>
+    </w:p>
+    <w:p>
+      <w:pPr>
         <w:pStyle w:val="Heading1"/>
         <w:pageBreakBefore/>
         <w:shd w:fill="715298" w:val="clear"/>
@@ -15119,7 +15344,7 @@
         <w:keepLines/>
         <w:spacing w:after="60" w:before="0" w:line="276" w:lineRule="auto"/>
       </w:pPr>
-      <w:hyperlink w:history="1" r:id="rIdelkkll8x7lacdtqyuxfuw">
+      <w:hyperlink w:history="1" r:id="rId9go18docutktiuovhu23p">
         <w:r>
           <w:rPr>
             <w:color w:val="1155CC"/>
@@ -15136,7 +15361,7 @@
         <w:keepLines/>
         <w:spacing w:after="60" w:before="0" w:line="276" w:lineRule="auto"/>
       </w:pPr>
-      <w:hyperlink w:history="1" r:id="rIdjd2ylbcqu5wbikpo8ydmi">
+      <w:hyperlink w:history="1" r:id="rIdailo9bz_cb_tepcv8l20a">
         <w:r>
           <w:rPr>
             <w:color w:val="1155CC"/>
@@ -15474,6 +15699,31 @@
     </w:tbl>
     <w:p>
       <w:pPr>
+        <w:spacing w:after="0" w:before="150"/>
+      </w:pPr>
+      <w:r>
+        <w:rPr>
+          <w:b/>
+          <w:bCs/>
+          <w:color w:val="2D2D2D"/>
+          <w:sz w:val="20"/>
+          <w:szCs w:val="20"/>
+        </w:rPr>
+        <w:t xml:space="preserve">Empathy hours:  </w:t>
+      </w:r>
+      <w:r>
+        <w:rPr>
+          <w:color w:val="2D2D2D"/>
+          <w:sz w:val="20"/>
+          <w:szCs w:val="20"/>
+          <w:u w:val="single" w:color="8A9099"/>
+          <w:shd w:fill="E4E7EC" w:val="clear"/>
+        </w:rPr>
+        <w:t xml:space="preserve">        </w:t>
+      </w:r>
+    </w:p>
+    <w:p>
+      <w:pPr>
         <w:pStyle w:val="Heading1"/>
         <w:pageBreakBefore/>
         <w:shd w:fill="7E6F44" w:val="clear"/>
@@ -15707,7 +15957,7 @@
         <w:keepLines/>
         <w:spacing w:after="60" w:before="0" w:line="276" w:lineRule="auto"/>
       </w:pPr>
-      <w:hyperlink w:history="1" r:id="rIdybctaetvl632_h6q1aiqd">
+      <w:hyperlink w:history="1" r:id="rIdnngpugu0pawvll7ez3voi">
         <w:r>
           <w:rPr>
             <w:color w:val="1155CC"/>
@@ -15724,7 +15974,7 @@
         <w:keepLines/>
         <w:spacing w:after="60" w:before="0" w:line="276" w:lineRule="auto"/>
       </w:pPr>
-      <w:hyperlink w:history="1" r:id="rId6r5lj3ag6o1iqucaonjm8">
+      <w:hyperlink w:history="1" r:id="rIdljyrtpqwyc7sejmqx-gyq">
         <w:r>
           <w:rPr>
             <w:color w:val="1155CC"/>
@@ -16062,6 +16312,31 @@
     </w:tbl>
     <w:p>
       <w:pPr>
+        <w:spacing w:after="0" w:before="150"/>
+      </w:pPr>
+      <w:r>
+        <w:rPr>
+          <w:b/>
+          <w:bCs/>
+          <w:color w:val="2D2D2D"/>
+          <w:sz w:val="20"/>
+          <w:szCs w:val="20"/>
+        </w:rPr>
+        <w:t xml:space="preserve">Empathy hours:  </w:t>
+      </w:r>
+      <w:r>
+        <w:rPr>
+          <w:color w:val="2D2D2D"/>
+          <w:sz w:val="20"/>
+          <w:szCs w:val="20"/>
+          <w:u w:val="single" w:color="8A9099"/>
+          <w:shd w:fill="E4E7EC" w:val="clear"/>
+        </w:rPr>
+        <w:t xml:space="preserve">        </w:t>
+      </w:r>
+    </w:p>
+    <w:p>
+      <w:pPr>
         <w:pStyle w:val="Heading1"/>
         <w:pageBreakBefore/>
         <w:shd w:fill="407677" w:val="clear"/>
@@ -16759,6 +17034,31 @@
     </w:tbl>
     <w:p>
       <w:pPr>
+        <w:spacing w:after="0" w:before="150"/>
+      </w:pPr>
+      <w:r>
+        <w:rPr>
+          <w:b/>
+          <w:bCs/>
+          <w:color w:val="2D2D2D"/>
+          <w:sz w:val="20"/>
+          <w:szCs w:val="20"/>
+        </w:rPr>
+        <w:t xml:space="preserve">Empathy hours:  </w:t>
+      </w:r>
+      <w:r>
+        <w:rPr>
+          <w:color w:val="2D2D2D"/>
+          <w:sz w:val="20"/>
+          <w:szCs w:val="20"/>
+          <w:u w:val="single" w:color="8A9099"/>
+          <w:shd w:fill="E4E7EC" w:val="clear"/>
+        </w:rPr>
+        <w:t xml:space="preserve">        </w:t>
+      </w:r>
+    </w:p>
+    <w:p>
+      <w:pPr>
         <w:pStyle w:val="Heading1"/>
         <w:pageBreakBefore/>
         <w:shd w:fill="985282" w:val="clear"/>
@@ -17343,7 +17643,7 @@
         <w:keepLines/>
         <w:spacing w:after="60" w:before="0" w:line="276" w:lineRule="auto"/>
       </w:pPr>
-      <w:hyperlink w:history="1" r:id="rIdteeq_gmkph1ra94sfpilp">
+      <w:hyperlink w:history="1" r:id="rIda0dbnk2oqsdt8nx2xyr53">
         <w:r>
           <w:rPr>
             <w:color w:val="1155CC"/>
@@ -17360,7 +17660,7 @@
         <w:keepLines/>
         <w:spacing w:after="60" w:before="0" w:line="276" w:lineRule="auto"/>
       </w:pPr>
-      <w:hyperlink w:history="1" r:id="rIdem5kh4x6os1hfnfez780n">
+      <w:hyperlink w:history="1" r:id="rIdarnnv7z92kf3wtvkmy0h-">
         <w:r>
           <w:rPr>
             <w:color w:val="1155CC"/>
@@ -17698,6 +17998,31 @@
     </w:tbl>
     <w:p>
       <w:pPr>
+        <w:spacing w:after="0" w:before="150"/>
+      </w:pPr>
+      <w:r>
+        <w:rPr>
+          <w:b/>
+          <w:bCs/>
+          <w:color w:val="2D2D2D"/>
+          <w:sz w:val="20"/>
+          <w:szCs w:val="20"/>
+        </w:rPr>
+        <w:t xml:space="preserve">Empathy hours:  </w:t>
+      </w:r>
+      <w:r>
+        <w:rPr>
+          <w:color w:val="2D2D2D"/>
+          <w:sz w:val="20"/>
+          <w:szCs w:val="20"/>
+          <w:u w:val="single" w:color="8A9099"/>
+          <w:shd w:fill="E4E7EC" w:val="clear"/>
+        </w:rPr>
+        <w:t xml:space="preserve">        </w:t>
+      </w:r>
+    </w:p>
+    <w:p>
+      <w:pPr>
         <w:pStyle w:val="Heading1"/>
         <w:pageBreakBefore/>
         <w:shd w:fill="567740" w:val="clear"/>
@@ -18507,7 +18832,7 @@
         <w:keepLines/>
         <w:spacing w:after="60" w:before="0" w:line="276" w:lineRule="auto"/>
       </w:pPr>
-      <w:hyperlink w:history="1" r:id="rIdnkkrdcda5vqg3u5qqzvgw">
+      <w:hyperlink w:history="1" r:id="rIduatlxl4r_hkiuws8eydpv">
         <w:r>
           <w:rPr>
             <w:color w:val="1155CC"/>
@@ -18524,7 +18849,7 @@
         <w:keepLines/>
         <w:spacing w:after="60" w:before="0" w:line="276" w:lineRule="auto"/>
       </w:pPr>
-      <w:hyperlink w:history="1" r:id="rIdxrbnbiatmu84l-ednvgvu">
+      <w:hyperlink w:history="1" r:id="rIdikh_zeq2ljowmxkwtrwk7">
         <w:r>
           <w:rPr>
             <w:color w:val="1155CC"/>
@@ -18862,6 +19187,31 @@
     </w:tbl>
     <w:p>
       <w:pPr>
+        <w:spacing w:after="0" w:before="150"/>
+      </w:pPr>
+      <w:r>
+        <w:rPr>
+          <w:b/>
+          <w:bCs/>
+          <w:color w:val="2D2D2D"/>
+          <w:sz w:val="20"/>
+          <w:szCs w:val="20"/>
+        </w:rPr>
+        <w:t xml:space="preserve">Empathy hours:  </w:t>
+      </w:r>
+      <w:r>
+        <w:rPr>
+          <w:color w:val="2D2D2D"/>
+          <w:sz w:val="20"/>
+          <w:szCs w:val="20"/>
+          <w:u w:val="single" w:color="8A9099"/>
+          <w:shd w:fill="E4E7EC" w:val="clear"/>
+        </w:rPr>
+        <w:t xml:space="preserve">        </w:t>
+      </w:r>
+    </w:p>
+    <w:p>
+      <w:pPr>
         <w:pStyle w:val="Heading1"/>
         <w:pageBreakBefore/>
         <w:shd w:fill="525998" w:val="clear"/>
@@ -19107,7 +19457,7 @@
         <w:keepLines/>
         <w:spacing w:after="60" w:before="0" w:line="276" w:lineRule="auto"/>
       </w:pPr>
-      <w:hyperlink w:history="1" r:id="rId9oan_hsw_5qw9rmddrtoo">
+      <w:hyperlink w:history="1" r:id="rIdryhzqn86gykvtv0nc0px-">
         <w:r>
           <w:rPr>
             <w:color w:val="1155CC"/>
@@ -19124,7 +19474,7 @@
         <w:keepLines/>
         <w:spacing w:after="60" w:before="0" w:line="276" w:lineRule="auto"/>
       </w:pPr>
-      <w:hyperlink w:history="1" r:id="rIdxe3eerxgaf5zirmx_ko58">
+      <w:hyperlink w:history="1" r:id="rIdxzqi_9lcwtu8ysvixitei">
         <w:r>
           <w:rPr>
             <w:color w:val="1155CC"/>
@@ -19462,6 +19812,31 @@
     </w:tbl>
     <w:p>
       <w:pPr>
+        <w:spacing w:after="0" w:before="150"/>
+      </w:pPr>
+      <w:r>
+        <w:rPr>
+          <w:b/>
+          <w:bCs/>
+          <w:color w:val="2D2D2D"/>
+          <w:sz w:val="20"/>
+          <w:szCs w:val="20"/>
+        </w:rPr>
+        <w:t xml:space="preserve">Empathy hours:  </w:t>
+      </w:r>
+      <w:r>
+        <w:rPr>
+          <w:color w:val="2D2D2D"/>
+          <w:sz w:val="20"/>
+          <w:szCs w:val="20"/>
+          <w:u w:val="single" w:color="8A9099"/>
+          <w:shd w:fill="E4E7EC" w:val="clear"/>
+        </w:rPr>
+        <w:t xml:space="preserve">        </w:t>
+      </w:r>
+    </w:p>
+    <w:p>
+      <w:pPr>
         <w:pStyle w:val="Heading1"/>
         <w:pageBreakBefore/>
         <w:shd w:fill="986052" w:val="clear"/>
@@ -19828,7 +20203,7 @@
         <w:keepLines/>
         <w:spacing w:after="60" w:before="0" w:line="276" w:lineRule="auto"/>
       </w:pPr>
-      <w:hyperlink w:history="1" r:id="rIdlytxtbhc3whw6or54eai9">
+      <w:hyperlink w:history="1" r:id="rId9h6m_lad0qjvex_yeykei">
         <w:r>
           <w:rPr>
             <w:color w:val="1155CC"/>
@@ -19845,7 +20220,7 @@
         <w:keepLines/>
         <w:spacing w:after="60" w:before="0" w:line="276" w:lineRule="auto"/>
       </w:pPr>
-      <w:hyperlink w:history="1" r:id="rIdeyhb_vrull8ptalgdrjmj">
+      <w:hyperlink w:history="1" r:id="rIdiroakcymbpc9a53b6lru7">
         <w:r>
           <w:rPr>
             <w:color w:val="1155CC"/>
@@ -20183,6 +20558,31 @@
     </w:tbl>
     <w:p>
       <w:pPr>
+        <w:spacing w:after="0" w:before="150"/>
+      </w:pPr>
+      <w:r>
+        <w:rPr>
+          <w:b/>
+          <w:bCs/>
+          <w:color w:val="2D2D2D"/>
+          <w:sz w:val="20"/>
+          <w:szCs w:val="20"/>
+        </w:rPr>
+        <w:t xml:space="preserve">Empathy hours:  </w:t>
+      </w:r>
+      <w:r>
+        <w:rPr>
+          <w:color w:val="2D2D2D"/>
+          <w:sz w:val="20"/>
+          <w:szCs w:val="20"/>
+          <w:u w:val="single" w:color="8A9099"/>
+          <w:shd w:fill="E4E7EC" w:val="clear"/>
+        </w:rPr>
+        <w:t xml:space="preserve">        </w:t>
+      </w:r>
+    </w:p>
+    <w:p>
+      <w:pPr>
         <w:pStyle w:val="Heading1"/>
         <w:pageBreakBefore/>
         <w:shd w:fill="40775B" w:val="clear"/>
@@ -20511,7 +20911,7 @@
         </w:rPr>
         <w:t xml:space="preserve">You may want to find some quiet space and time for this exercise. Start by going to the </w:t>
       </w:r>
-      <w:hyperlink w:history="1" r:id="rIdxar-iot-lchwh8lxselfs">
+      <w:hyperlink w:history="1" r:id="rIdgiabh_goikgzorwupxwqy">
         <w:r>
           <w:rPr>
             <w:color w:val="1155CC"/>
@@ -20678,7 +21078,7 @@
         <w:keepLines/>
         <w:spacing w:after="60" w:before="0" w:line="276" w:lineRule="auto"/>
       </w:pPr>
-      <w:hyperlink w:history="1" r:id="rIdl1wbgjk_cdayacs24quff">
+      <w:hyperlink w:history="1" r:id="rIdcxxurgvnumytndxwhveej">
         <w:r>
           <w:rPr>
             <w:color w:val="1155CC"/>
@@ -20695,7 +21095,7 @@
         <w:keepLines/>
         <w:spacing w:after="60" w:before="0" w:line="276" w:lineRule="auto"/>
       </w:pPr>
-      <w:hyperlink w:history="1" r:id="rId_nln6y08nwhlptwjgveji">
+      <w:hyperlink w:history="1" r:id="rId-wixmtgw_v9tzx-s_97oc">
         <w:r>
           <w:rPr>
             <w:color w:val="1155CC"/>
@@ -21033,6 +21433,31 @@
     </w:tbl>
     <w:p>
       <w:pPr>
+        <w:spacing w:after="0" w:before="150"/>
+      </w:pPr>
+      <w:r>
+        <w:rPr>
+          <w:b/>
+          <w:bCs/>
+          <w:color w:val="2D2D2D"/>
+          <w:sz w:val="20"/>
+          <w:szCs w:val="20"/>
+        </w:rPr>
+        <w:t xml:space="preserve">Empathy hours:  </w:t>
+      </w:r>
+      <w:r>
+        <w:rPr>
+          <w:color w:val="2D2D2D"/>
+          <w:sz w:val="20"/>
+          <w:szCs w:val="20"/>
+          <w:u w:val="single" w:color="8A9099"/>
+          <w:shd w:fill="E4E7EC" w:val="clear"/>
+        </w:rPr>
+        <w:t xml:space="preserve">        </w:t>
+      </w:r>
+    </w:p>
+    <w:p>
+      <w:pPr>
         <w:pStyle w:val="Heading1"/>
         <w:pageBreakBefore/>
         <w:shd w:fill="895298" w:val="clear"/>
@@ -21107,7 +21532,7 @@
         </w:rPr>
         <w:t xml:space="preserve"> exercise at: http://</w:t>
       </w:r>
-      <w:hyperlink w:history="1" r:id="rIdqku4rjwasa9c8c58oykad">
+      <w:hyperlink w:history="1" r:id="rIdpqcy0m0_j3stufgvmyrov">
         <w:r>
           <w:rPr>
             <w:color w:val="1155CC"/>
@@ -21419,7 +21844,7 @@
         <w:keepLines/>
         <w:spacing w:after="60" w:before="0" w:line="276" w:lineRule="auto"/>
       </w:pPr>
-      <w:hyperlink w:history="1" r:id="rIds3gzsaoozdjnpmruuh9jz">
+      <w:hyperlink w:history="1" r:id="rIddsvlsb6laaffxekep8jho">
         <w:r>
           <w:rPr>
             <w:color w:val="1155CC"/>
@@ -21436,7 +21861,7 @@
         <w:keepLines/>
         <w:spacing w:after="60" w:before="0" w:line="276" w:lineRule="auto"/>
       </w:pPr>
-      <w:hyperlink w:history="1" r:id="rIdqjoyd1qmf0n8xl6xqtido">
+      <w:hyperlink w:history="1" r:id="rIdhunxldtdbep_w8mrkjiv1">
         <w:r>
           <w:rPr>
             <w:color w:val="1155CC"/>
@@ -21774,6 +22199,31 @@
     </w:tbl>
     <w:p>
       <w:pPr>
+        <w:spacing w:after="0" w:before="150"/>
+      </w:pPr>
+      <w:r>
+        <w:rPr>
+          <w:b/>
+          <w:bCs/>
+          <w:color w:val="2D2D2D"/>
+          <w:sz w:val="20"/>
+          <w:szCs w:val="20"/>
+        </w:rPr>
+        <w:t xml:space="preserve">Empathy hours:  </w:t>
+      </w:r>
+      <w:r>
+        <w:rPr>
+          <w:color w:val="2D2D2D"/>
+          <w:sz w:val="20"/>
+          <w:szCs w:val="20"/>
+          <w:u w:val="single" w:color="8A9099"/>
+          <w:shd w:fill="E4E7EC" w:val="clear"/>
+        </w:rPr>
+        <w:t xml:space="preserve">        </w:t>
+      </w:r>
+    </w:p>
+    <w:p>
+      <w:pPr>
         <w:pStyle w:val="Heading1"/>
         <w:pageBreakBefore/>
         <w:shd w:fill="6D713D" w:val="clear"/>
@@ -21880,7 +22330,7 @@
         </w:rPr>
         <w:t xml:space="preserve">Either at that time, or later on, write down a word (or words) from the </w:t>
       </w:r>
-      <w:hyperlink w:history="1" r:id="rIdcrrkrsjsayatw-rg-h5zn">
+      <w:hyperlink w:history="1" r:id="rIdktlyejhxbgiacycidg4iz">
         <w:r>
           <w:rPr>
             <w:color w:val="1155CC"/>
@@ -21917,7 +22367,7 @@
         </w:rPr>
         <w:t xml:space="preserve">Then look at the </w:t>
       </w:r>
-      <w:hyperlink w:history="1" r:id="rIdccggnuomaqswrzhbld9mu">
+      <w:hyperlink w:history="1" r:id="rIdonohllnvzxaoi9ippbdv6">
         <w:r>
           <w:rPr>
             <w:color w:val="1155CC"/>
@@ -22330,7 +22780,7 @@
         <w:keepLines/>
         <w:spacing w:after="60" w:before="0" w:line="276" w:lineRule="auto"/>
       </w:pPr>
-      <w:hyperlink w:history="1" r:id="rIdrh6icp4-d912myplwdllx">
+      <w:hyperlink w:history="1" r:id="rIdk7mpa9j4pbbuxzohdntng">
         <w:r>
           <w:rPr>
             <w:color w:val="1155CC"/>
@@ -22347,7 +22797,7 @@
         <w:keepLines/>
         <w:spacing w:after="60" w:before="0" w:line="276" w:lineRule="auto"/>
       </w:pPr>
-      <w:hyperlink w:history="1" r:id="rIdt8l_rg0ntkml1kodjpn1y">
+      <w:hyperlink w:history="1" r:id="rId6sm-sldqk53wi0mqfgq6r">
         <w:r>
           <w:rPr>
             <w:color w:val="1155CC"/>
@@ -22685,6 +23135,31 @@
     </w:tbl>
     <w:p>
       <w:pPr>
+        <w:spacing w:after="0" w:before="150"/>
+      </w:pPr>
+      <w:r>
+        <w:rPr>
+          <w:b/>
+          <w:bCs/>
+          <w:color w:val="2D2D2D"/>
+          <w:sz w:val="20"/>
+          <w:szCs w:val="20"/>
+        </w:rPr>
+        <w:t xml:space="preserve">Empathy hours:  </w:t>
+      </w:r>
+      <w:r>
+        <w:rPr>
+          <w:color w:val="2D2D2D"/>
+          <w:sz w:val="20"/>
+          <w:szCs w:val="20"/>
+          <w:u w:val="single" w:color="8A9099"/>
+          <w:shd w:fill="E4E7EC" w:val="clear"/>
+        </w:rPr>
+        <w:t xml:space="preserve">        </w:t>
+      </w:r>
+    </w:p>
+    <w:p>
+      <w:pPr>
         <w:pStyle w:val="Heading1"/>
         <w:pageBreakBefore/>
         <w:shd w:fill="4B748B" w:val="clear"/>
@@ -22950,7 +23425,7 @@
         <w:keepLines/>
         <w:spacing w:after="60" w:before="0" w:line="276" w:lineRule="auto"/>
       </w:pPr>
-      <w:hyperlink w:history="1" r:id="rIdr3f_g0djdiulujz2llsgd">
+      <w:hyperlink w:history="1" r:id="rIdugclzw20vpokiwyjjocyr">
         <w:r>
           <w:rPr>
             <w:color w:val="1155CC"/>
@@ -22967,7 +23442,7 @@
         <w:keepLines/>
         <w:spacing w:after="60" w:before="0" w:line="276" w:lineRule="auto"/>
       </w:pPr>
-      <w:hyperlink w:history="1" r:id="rIdhxs_svfbbyn2diiup8efh">
+      <w:hyperlink w:history="1" r:id="rIdhuxegxpxbvzovvpa-j2uw">
         <w:r>
           <w:rPr>
             <w:color w:val="1155CC"/>
@@ -23305,6 +23780,31 @@
     </w:tbl>
     <w:p>
       <w:pPr>
+        <w:spacing w:after="0" w:before="150"/>
+      </w:pPr>
+      <w:r>
+        <w:rPr>
+          <w:b/>
+          <w:bCs/>
+          <w:color w:val="2D2D2D"/>
+          <w:sz w:val="20"/>
+          <w:szCs w:val="20"/>
+        </w:rPr>
+        <w:t xml:space="preserve">Empathy hours:  </w:t>
+      </w:r>
+      <w:r>
+        <w:rPr>
+          <w:color w:val="2D2D2D"/>
+          <w:sz w:val="20"/>
+          <w:szCs w:val="20"/>
+          <w:u w:val="single" w:color="8A9099"/>
+          <w:shd w:fill="E4E7EC" w:val="clear"/>
+        </w:rPr>
+        <w:t xml:space="preserve">        </w:t>
+      </w:r>
+    </w:p>
+    <w:p>
+      <w:pPr>
         <w:pStyle w:val="Heading1"/>
         <w:pageBreakBefore/>
         <w:shd w:fill="98526A" w:val="clear"/>
@@ -23395,7 +23895,7 @@
         </w:rPr>
         <w:t xml:space="preserve"> at http://</w:t>
       </w:r>
-      <w:hyperlink w:history="1" r:id="rIdk2hyifyhsdqj95cueqsjp">
+      <w:hyperlink w:history="1" r:id="rIdev3mrmngfs6bpgjmii9h1">
         <w:r>
           <w:rPr>
             <w:color w:val="1155CC"/>
@@ -23667,7 +24167,7 @@
         <w:keepLines/>
         <w:spacing w:after="60" w:before="0" w:line="276" w:lineRule="auto"/>
       </w:pPr>
-      <w:hyperlink w:history="1" r:id="rIddwo6ewknh3rlnzenx-avi">
+      <w:hyperlink w:history="1" r:id="rId6ibtq0ney4uyrhkv86t6b">
         <w:r>
           <w:rPr>
             <w:color w:val="1155CC"/>
@@ -23684,7 +24184,7 @@
         <w:keepLines/>
         <w:spacing w:after="60" w:before="0" w:line="276" w:lineRule="auto"/>
       </w:pPr>
-      <w:hyperlink w:history="1" r:id="rIdtorhkf1wiwfc09ylkhrdu">
+      <w:hyperlink w:history="1" r:id="rIdtjrv6onb7apctkrunrwqh">
         <w:r>
           <w:rPr>
             <w:color w:val="1155CC"/>
@@ -24022,6 +24522,31 @@
     </w:tbl>
     <w:p>
       <w:pPr>
+        <w:spacing w:after="0" w:before="150"/>
+      </w:pPr>
+      <w:r>
+        <w:rPr>
+          <w:b/>
+          <w:bCs/>
+          <w:color w:val="2D2D2D"/>
+          <w:sz w:val="20"/>
+          <w:szCs w:val="20"/>
+        </w:rPr>
+        <w:t xml:space="preserve">Empathy hours:  </w:t>
+      </w:r>
+      <w:r>
+        <w:rPr>
+          <w:color w:val="2D2D2D"/>
+          <w:sz w:val="20"/>
+          <w:szCs w:val="20"/>
+          <w:u w:val="single" w:color="8A9099"/>
+          <w:shd w:fill="E4E7EC" w:val="clear"/>
+        </w:rPr>
+        <w:t xml:space="preserve">        </w:t>
+      </w:r>
+    </w:p>
+    <w:p>
+      <w:pPr>
         <w:pStyle w:val="Heading1"/>
         <w:pageBreakBefore/>
         <w:shd w:fill="477E44" w:val="clear"/>
@@ -24275,7 +24800,7 @@
         <w:keepLines/>
         <w:spacing w:after="60" w:before="0" w:line="276" w:lineRule="auto"/>
       </w:pPr>
-      <w:hyperlink w:history="1" r:id="rIde49s8oqx76mxdpcl1glj5">
+      <w:hyperlink w:history="1" r:id="rIdfdrstg72xgwlwsxct_uwl">
         <w:r>
           <w:rPr>
             <w:color w:val="1155CC"/>
@@ -24292,7 +24817,7 @@
         <w:keepLines/>
         <w:spacing w:after="60" w:before="0" w:line="276" w:lineRule="auto"/>
       </w:pPr>
-      <w:hyperlink w:history="1" r:id="rIdamy9e9oabhzfzcr2gysmv">
+      <w:hyperlink w:history="1" r:id="rId8xucveys91l0nl0juwfb3">
         <w:r>
           <w:rPr>
             <w:color w:val="1155CC"/>
@@ -24630,6 +25155,31 @@
     </w:tbl>
     <w:p>
       <w:pPr>
+        <w:spacing w:after="0" w:before="150"/>
+      </w:pPr>
+      <w:r>
+        <w:rPr>
+          <w:b/>
+          <w:bCs/>
+          <w:color w:val="2D2D2D"/>
+          <w:sz w:val="20"/>
+          <w:szCs w:val="20"/>
+        </w:rPr>
+        <w:t xml:space="preserve">Empathy hours:  </w:t>
+      </w:r>
+      <w:r>
+        <w:rPr>
+          <w:color w:val="2D2D2D"/>
+          <w:sz w:val="20"/>
+          <w:szCs w:val="20"/>
+          <w:u w:val="single" w:color="8A9099"/>
+          <w:shd w:fill="E4E7EC" w:val="clear"/>
+        </w:rPr>
+        <w:t xml:space="preserve">        </w:t>
+      </w:r>
+    </w:p>
+    <w:p>
+      <w:pPr>
         <w:pStyle w:val="Heading1"/>
         <w:pageBreakBefore/>
         <w:shd w:fill="635298" w:val="clear"/>
@@ -25003,7 +25553,7 @@
         <w:keepLines/>
         <w:spacing w:after="60" w:before="0" w:line="276" w:lineRule="auto"/>
       </w:pPr>
-      <w:hyperlink w:history="1" r:id="rIdsfa9slpzvd8kguapgpfqi">
+      <w:hyperlink w:history="1" r:id="rIdaolpepookdgdgzx_mbosk">
         <w:r>
           <w:rPr>
             <w:color w:val="1155CC"/>
@@ -25020,7 +25570,7 @@
         <w:keepLines/>
         <w:spacing w:after="60" w:before="0" w:line="276" w:lineRule="auto"/>
       </w:pPr>
-      <w:hyperlink w:history="1" r:id="rIddxpx7it5uwsu7lkvomxlq">
+      <w:hyperlink w:history="1" r:id="rId8-rmepeeji9ckqbmfj7wl">
         <w:r>
           <w:rPr>
             <w:color w:val="1155CC"/>
@@ -25358,6 +25908,31 @@
     </w:tbl>
     <w:p>
       <w:pPr>
+        <w:spacing w:after="0" w:before="150"/>
+      </w:pPr>
+      <w:r>
+        <w:rPr>
+          <w:b/>
+          <w:bCs/>
+          <w:color w:val="2D2D2D"/>
+          <w:sz w:val="20"/>
+          <w:szCs w:val="20"/>
+        </w:rPr>
+        <w:t xml:space="preserve">Empathy hours:  </w:t>
+      </w:r>
+      <w:r>
+        <w:rPr>
+          <w:color w:val="2D2D2D"/>
+          <w:sz w:val="20"/>
+          <w:szCs w:val="20"/>
+          <w:u w:val="single" w:color="8A9099"/>
+          <w:shd w:fill="E4E7EC" w:val="clear"/>
+        </w:rPr>
+        <w:t xml:space="preserve">        </w:t>
+      </w:r>
+    </w:p>
+    <w:p>
+      <w:pPr>
         <w:pStyle w:val="Heading1"/>
         <w:pageBreakBefore/>
         <w:shd w:fill="856847" w:val="clear"/>
@@ -25538,7 +26113,7 @@
         <w:keepLines/>
         <w:spacing w:after="60" w:before="0" w:line="276" w:lineRule="auto"/>
       </w:pPr>
-      <w:hyperlink w:history="1" r:id="rIdhh0mrnxgpjj3hrrht0f0a">
+      <w:hyperlink w:history="1" r:id="rIdxy07azllms8hcx6peexa8">
         <w:r>
           <w:rPr>
             <w:color w:val="1155CC"/>
@@ -25555,7 +26130,7 @@
         <w:keepLines/>
         <w:spacing w:after="60" w:before="0" w:line="276" w:lineRule="auto"/>
       </w:pPr>
-      <w:hyperlink w:history="1" r:id="rIdv0xaviralf0q6mwgd34fp">
+      <w:hyperlink w:history="1" r:id="rId-hzcyjlzfinfothr2bbdo">
         <w:r>
           <w:rPr>
             <w:color w:val="1155CC"/>
@@ -25893,6 +26468,31 @@
     </w:tbl>
     <w:p>
       <w:pPr>
+        <w:spacing w:after="0" w:before="150"/>
+      </w:pPr>
+      <w:r>
+        <w:rPr>
+          <w:b/>
+          <w:bCs/>
+          <w:color w:val="2D2D2D"/>
+          <w:sz w:val="20"/>
+          <w:szCs w:val="20"/>
+        </w:rPr>
+        <w:t xml:space="preserve">Empathy hours:  </w:t>
+      </w:r>
+      <w:r>
+        <w:rPr>
+          <w:color w:val="2D2D2D"/>
+          <w:sz w:val="20"/>
+          <w:szCs w:val="20"/>
+          <w:u w:val="single" w:color="8A9099"/>
+          <w:shd w:fill="E4E7EC" w:val="clear"/>
+        </w:rPr>
+        <w:t xml:space="preserve">        </w:t>
+      </w:r>
+    </w:p>
+    <w:p>
+      <w:pPr>
         <w:pStyle w:val="Heading1"/>
         <w:pageBreakBefore/>
         <w:shd w:fill="40776D" w:val="clear"/>
@@ -26088,7 +26688,7 @@
         </w:rPr>
         <w:t xml:space="preserve">Later on, when you have time, sit down with the </w:t>
       </w:r>
-      <w:hyperlink w:history="1" r:id="rIdma2cwe5kpk3jpoporwnyq">
+      <w:hyperlink w:history="1" r:id="rId8bka-57bobinkye_frcju">
         <w:r>
           <w:rPr>
             <w:color w:val="1155CC"/>
@@ -26109,7 +26709,7 @@
         </w:rPr>
         <w:t xml:space="preserve"> and see if you can figure out what need(s) you were in pain about. Translate your judgment words into need words. As usual, I suggest that you limit the words you use to those on the </w:t>
       </w:r>
-      <w:hyperlink w:history="1" r:id="rIdg_qmdctfwckh9venvxatk">
+      <w:hyperlink w:history="1" r:id="rId_uusdboc2h2ogkwq8vjwn">
         <w:r>
           <w:rPr>
             <w:color w:val="1155CC"/>
@@ -26305,7 +26905,7 @@
         <w:keepLines/>
         <w:spacing w:after="60" w:before="0" w:line="276" w:lineRule="auto"/>
       </w:pPr>
-      <w:hyperlink w:history="1" r:id="rIdpa6uten8_6w35qdisairw">
+      <w:hyperlink w:history="1" r:id="rId9cbhstjujgkuozpofzntu">
         <w:r>
           <w:rPr>
             <w:color w:val="1155CC"/>
@@ -26322,7 +26922,7 @@
         <w:keepLines/>
         <w:spacing w:after="60" w:before="0" w:line="276" w:lineRule="auto"/>
       </w:pPr>
-      <w:hyperlink w:history="1" r:id="rIdix9sf9--cznouoixxauoa">
+      <w:hyperlink w:history="1" r:id="rIdgdkcw_8lh8lrswyvfd9gw">
         <w:r>
           <w:rPr>
             <w:color w:val="1155CC"/>
@@ -26660,6 +27260,31 @@
     </w:tbl>
     <w:p>
       <w:pPr>
+        <w:spacing w:after="0" w:before="150"/>
+      </w:pPr>
+      <w:r>
+        <w:rPr>
+          <w:b/>
+          <w:bCs/>
+          <w:color w:val="2D2D2D"/>
+          <w:sz w:val="20"/>
+          <w:szCs w:val="20"/>
+        </w:rPr>
+        <w:t xml:space="preserve">Empathy hours:  </w:t>
+      </w:r>
+      <w:r>
+        <w:rPr>
+          <w:color w:val="2D2D2D"/>
+          <w:sz w:val="20"/>
+          <w:szCs w:val="20"/>
+          <w:u w:val="single" w:color="8A9099"/>
+          <w:shd w:fill="E4E7EC" w:val="clear"/>
+        </w:rPr>
+        <w:t xml:space="preserve">        </w:t>
+      </w:r>
+    </w:p>
+    <w:p>
+      <w:pPr>
         <w:pStyle w:val="Heading1"/>
         <w:pageBreakBefore/>
         <w:shd w:fill="985291" w:val="clear"/>
@@ -27017,7 +27642,7 @@
         <w:keepLines/>
         <w:spacing w:after="60" w:before="0" w:line="276" w:lineRule="auto"/>
       </w:pPr>
-      <w:hyperlink w:history="1" r:id="rId2o-mnfuic4u_suh965zlb">
+      <w:hyperlink w:history="1" r:id="rIdcmthvde8xnho8xakqcdrd">
         <w:r>
           <w:rPr>
             <w:color w:val="1155CC"/>
@@ -27034,7 +27659,7 @@
         <w:keepLines/>
         <w:spacing w:after="60" w:before="0" w:line="276" w:lineRule="auto"/>
       </w:pPr>
-      <w:hyperlink w:history="1" r:id="rIdgw5a_sz757o0zvfrhuh2_">
+      <w:hyperlink w:history="1" r:id="rIdzfhkgdkyzfk2me5ag4b_k">
         <w:r>
           <w:rPr>
             <w:color w:val="1155CC"/>
@@ -27372,6 +27997,31 @@
     </w:tbl>
     <w:p>
       <w:pPr>
+        <w:spacing w:after="0" w:before="150"/>
+      </w:pPr>
+      <w:r>
+        <w:rPr>
+          <w:b/>
+          <w:bCs/>
+          <w:color w:val="2D2D2D"/>
+          <w:sz w:val="20"/>
+          <w:szCs w:val="20"/>
+        </w:rPr>
+        <w:t xml:space="preserve">Empathy hours:  </w:t>
+      </w:r>
+      <w:r>
+        <w:rPr>
+          <w:color w:val="2D2D2D"/>
+          <w:sz w:val="20"/>
+          <w:szCs w:val="20"/>
+          <w:u w:val="single" w:color="8A9099"/>
+          <w:shd w:fill="E4E7EC" w:val="clear"/>
+        </w:rPr>
+        <w:t xml:space="preserve">        </w:t>
+      </w:r>
+    </w:p>
+    <w:p>
+      <w:pPr>
         <w:pStyle w:val="Heading1"/>
         <w:pageBreakBefore/>
         <w:shd w:fill="617740" w:val="clear"/>
@@ -27721,7 +28371,7 @@
         <w:keepLines/>
         <w:spacing w:after="60" w:before="0" w:line="276" w:lineRule="auto"/>
       </w:pPr>
-      <w:hyperlink w:history="1" r:id="rIdl79znptadw2a4hx0a1mo_">
+      <w:hyperlink w:history="1" r:id="rIdsb2czzvlti2bnr_-dt2mv">
         <w:r>
           <w:rPr>
             <w:color w:val="1155CC"/>
@@ -27738,7 +28388,7 @@
         <w:keepLines/>
         <w:spacing w:after="60" w:before="0" w:line="276" w:lineRule="auto"/>
       </w:pPr>
-      <w:hyperlink w:history="1" r:id="rId-xnnof_ysc-cs633hl6iv">
+      <w:hyperlink w:history="1" r:id="rIdayqrfpfhzoh9dymullt0m">
         <w:r>
           <w:rPr>
             <w:color w:val="1155CC"/>
@@ -28076,6 +28726,31 @@
     </w:tbl>
     <w:p>
       <w:pPr>
+        <w:spacing w:after="0" w:before="150"/>
+      </w:pPr>
+      <w:r>
+        <w:rPr>
+          <w:b/>
+          <w:bCs/>
+          <w:color w:val="2D2D2D"/>
+          <w:sz w:val="20"/>
+          <w:szCs w:val="20"/>
+        </w:rPr>
+        <w:t xml:space="preserve">Empathy hours:  </w:t>
+      </w:r>
+      <w:r>
+        <w:rPr>
+          <w:color w:val="2D2D2D"/>
+          <w:sz w:val="20"/>
+          <w:szCs w:val="20"/>
+          <w:u w:val="single" w:color="8A9099"/>
+          <w:shd w:fill="E4E7EC" w:val="clear"/>
+        </w:rPr>
+        <w:t xml:space="preserve">        </w:t>
+      </w:r>
+    </w:p>
+    <w:p>
+      <w:pPr>
         <w:pStyle w:val="Heading1"/>
         <w:pageBreakBefore/>
         <w:shd w:fill="526798" w:val="clear"/>
@@ -28260,7 +28935,7 @@
         <w:keepLines/>
         <w:spacing w:after="60" w:before="0" w:line="276" w:lineRule="auto"/>
       </w:pPr>
-      <w:hyperlink w:history="1" r:id="rIdrujltxzvtdkgk2zei58pt">
+      <w:hyperlink w:history="1" r:id="rIdi0n1j1xxxlxiyj53rde3e">
         <w:r>
           <w:rPr>
             <w:color w:val="1155CC"/>
@@ -28277,7 +28952,7 @@
         <w:keepLines/>
         <w:spacing w:after="60" w:before="0" w:line="276" w:lineRule="auto"/>
       </w:pPr>
-      <w:hyperlink w:history="1" r:id="rId6cykzbiwxkad39mk_w0bg">
+      <w:hyperlink w:history="1" r:id="rIdcrbn8o6l-3idtlpdjnow-">
         <w:r>
           <w:rPr>
             <w:color w:val="1155CC"/>
@@ -28615,6 +29290,31 @@
     </w:tbl>
     <w:p>
       <w:pPr>
+        <w:spacing w:after="0" w:before="150"/>
+      </w:pPr>
+      <w:r>
+        <w:rPr>
+          <w:b/>
+          <w:bCs/>
+          <w:color w:val="2D2D2D"/>
+          <w:sz w:val="20"/>
+          <w:szCs w:val="20"/>
+        </w:rPr>
+        <w:t xml:space="preserve">Empathy hours:  </w:t>
+      </w:r>
+      <w:r>
+        <w:rPr>
+          <w:color w:val="2D2D2D"/>
+          <w:sz w:val="20"/>
+          <w:szCs w:val="20"/>
+          <w:u w:val="single" w:color="8A9099"/>
+          <w:shd w:fill="E4E7EC" w:val="clear"/>
+        </w:rPr>
+        <w:t xml:space="preserve">        </w:t>
+      </w:r>
+    </w:p>
+    <w:p>
+      <w:pPr>
         <w:pStyle w:val="Heading1"/>
         <w:pageBreakBefore/>
         <w:shd w:fill="985253" w:val="clear"/>
@@ -28924,7 +29624,7 @@
         <w:keepLines/>
         <w:spacing w:after="60" w:before="0" w:line="276" w:lineRule="auto"/>
       </w:pPr>
-      <w:hyperlink w:history="1" r:id="rIdqdga3a7txrmb2hpzdjebx">
+      <w:hyperlink w:history="1" r:id="rIdlhuoyjsxf6v_fond6madm">
         <w:r>
           <w:rPr>
             <w:color w:val="1155CC"/>
@@ -28941,7 +29641,7 @@
         <w:keepLines/>
         <w:spacing w:after="60" w:before="0" w:line="276" w:lineRule="auto"/>
       </w:pPr>
-      <w:hyperlink w:history="1" r:id="rIdvpzmeyshcr2qpwgadfsem">
+      <w:hyperlink w:history="1" r:id="rIdo88h661gt2_bosyulvurm">
         <w:r>
           <w:rPr>
             <w:color w:val="1155CC"/>
@@ -29279,6 +29979,31 @@
     </w:tbl>
     <w:p>
       <w:pPr>
+        <w:spacing w:after="0" w:before="150"/>
+      </w:pPr>
+      <w:r>
+        <w:rPr>
+          <w:b/>
+          <w:bCs/>
+          <w:color w:val="2D2D2D"/>
+          <w:sz w:val="20"/>
+          <w:szCs w:val="20"/>
+        </w:rPr>
+        <w:t xml:space="preserve">Empathy hours:  </w:t>
+      </w:r>
+      <w:r>
+        <w:rPr>
+          <w:color w:val="2D2D2D"/>
+          <w:sz w:val="20"/>
+          <w:szCs w:val="20"/>
+          <w:u w:val="single" w:color="8A9099"/>
+          <w:shd w:fill="E4E7EC" w:val="clear"/>
+        </w:rPr>
+        <w:t xml:space="preserve">        </w:t>
+      </w:r>
+    </w:p>
+    <w:p>
+      <w:pPr>
         <w:pStyle w:val="Heading1"/>
         <w:pageBreakBefore/>
         <w:shd w:fill="447E54" w:val="clear"/>
@@ -29712,7 +30437,7 @@
         <w:keepLines/>
         <w:spacing w:after="60" w:before="0" w:line="276" w:lineRule="auto"/>
       </w:pPr>
-      <w:hyperlink w:history="1" r:id="rIdcwecygekortjsjmooxgsy">
+      <w:hyperlink w:history="1" r:id="rIdvv4s0b-z9mzl65fl0u7xr">
         <w:r>
           <w:rPr>
             <w:color w:val="1155CC"/>
@@ -29729,7 +30454,7 @@
         <w:keepLines/>
         <w:spacing w:after="60" w:before="0" w:line="276" w:lineRule="auto"/>
       </w:pPr>
-      <w:hyperlink w:history="1" r:id="rIdhtxj9zmh8f0nijo0jvd8e">
+      <w:hyperlink w:history="1" r:id="rId4bewbibwjmqok-1z6sngv">
         <w:r>
           <w:rPr>
             <w:color w:val="1155CC"/>
@@ -30067,6 +30792,31 @@
     </w:tbl>
     <w:p>
       <w:pPr>
+        <w:spacing w:after="0" w:before="150"/>
+      </w:pPr>
+      <w:r>
+        <w:rPr>
+          <w:b/>
+          <w:bCs/>
+          <w:color w:val="2D2D2D"/>
+          <w:sz w:val="20"/>
+          <w:szCs w:val="20"/>
+        </w:rPr>
+        <w:t xml:space="preserve">Empathy hours:  </w:t>
+      </w:r>
+      <w:r>
+        <w:rPr>
+          <w:color w:val="2D2D2D"/>
+          <w:sz w:val="20"/>
+          <w:szCs w:val="20"/>
+          <w:u w:val="single" w:color="8A9099"/>
+          <w:shd w:fill="E4E7EC" w:val="clear"/>
+        </w:rPr>
+        <w:t xml:space="preserve">        </w:t>
+      </w:r>
+    </w:p>
+    <w:p>
+      <w:pPr>
         <w:pStyle w:val="Heading1"/>
         <w:pageBreakBefore/>
         <w:shd w:fill="7A5298" w:val="clear"/>
@@ -30541,7 +31291,7 @@
         <w:keepLines/>
         <w:spacing w:after="60" w:before="0" w:line="276" w:lineRule="auto"/>
       </w:pPr>
-      <w:hyperlink w:history="1" r:id="rIdnfnjfryfkuaswmvx89oqb">
+      <w:hyperlink w:history="1" r:id="rIdxh3-sszisu-_fohxq3tu2">
         <w:r>
           <w:rPr>
             <w:color w:val="1155CC"/>
@@ -30558,7 +31308,7 @@
         <w:keepLines/>
         <w:spacing w:after="60" w:before="0" w:line="276" w:lineRule="auto"/>
       </w:pPr>
-      <w:hyperlink w:history="1" r:id="rIdhhx4gk9o7yqsiaeiylnmf">
+      <w:hyperlink w:history="1" r:id="rIdrd2ud9ojnbjyoigisjsjo">
         <w:r>
           <w:rPr>
             <w:color w:val="1155CC"/>
@@ -30896,6 +31646,31 @@
     </w:tbl>
     <w:p>
       <w:pPr>
+        <w:spacing w:after="0" w:before="150"/>
+      </w:pPr>
+      <w:r>
+        <w:rPr>
+          <w:b/>
+          <w:bCs/>
+          <w:color w:val="2D2D2D"/>
+          <w:sz w:val="20"/>
+          <w:szCs w:val="20"/>
+        </w:rPr>
+        <w:t xml:space="preserve">Empathy hours:  </w:t>
+      </w:r>
+      <w:r>
+        <w:rPr>
+          <w:color w:val="2D2D2D"/>
+          <w:sz w:val="20"/>
+          <w:szCs w:val="20"/>
+          <w:u w:val="single" w:color="8A9099"/>
+          <w:shd w:fill="E4E7EC" w:val="clear"/>
+        </w:rPr>
+        <w:t xml:space="preserve">        </w:t>
+      </w:r>
+    </w:p>
+    <w:p>
+      <w:pPr>
         <w:pStyle w:val="Heading1"/>
         <w:pageBreakBefore/>
         <w:shd w:fill="777040" w:val="clear"/>
@@ -31173,7 +31948,7 @@
         <w:keepLines/>
         <w:spacing w:after="60" w:before="0" w:line="276" w:lineRule="auto"/>
       </w:pPr>
-      <w:hyperlink w:history="1" r:id="rIdncjg3ib1eubc69rapp7lq">
+      <w:hyperlink w:history="1" r:id="rIdismoouspbgmzn8jih1b6w">
         <w:r>
           <w:rPr>
             <w:color w:val="1155CC"/>
@@ -31190,7 +31965,7 @@
         <w:keepLines/>
         <w:spacing w:after="60" w:before="0" w:line="276" w:lineRule="auto"/>
       </w:pPr>
-      <w:hyperlink w:history="1" r:id="rIdpvexszj43suhtjbxq0mc-">
+      <w:hyperlink w:history="1" r:id="rIdtgjgcaigsi5fs4ii07pnu">
         <w:r>
           <w:rPr>
             <w:color w:val="1155CC"/>
@@ -31528,6 +32303,31 @@
     </w:tbl>
     <w:p>
       <w:pPr>
+        <w:spacing w:after="0" w:before="150"/>
+      </w:pPr>
+      <w:r>
+        <w:rPr>
+          <w:b/>
+          <w:bCs/>
+          <w:color w:val="2D2D2D"/>
+          <w:sz w:val="20"/>
+          <w:szCs w:val="20"/>
+        </w:rPr>
+        <w:t xml:space="preserve">Empathy hours:  </w:t>
+      </w:r>
+      <w:r>
+        <w:rPr>
+          <w:color w:val="2D2D2D"/>
+          <w:sz w:val="20"/>
+          <w:szCs w:val="20"/>
+          <w:u w:val="single" w:color="8A9099"/>
+          <w:shd w:fill="E4E7EC" w:val="clear"/>
+        </w:rPr>
+        <w:t xml:space="preserve">        </w:t>
+      </w:r>
+    </w:p>
+    <w:p>
+      <w:pPr>
         <w:pStyle w:val="Heading1"/>
         <w:pageBreakBefore/>
         <w:shd w:fill="44757E" w:val="clear"/>
@@ -31760,7 +32560,7 @@
         <w:keepLines/>
         <w:spacing w:after="60" w:before="0" w:line="276" w:lineRule="auto"/>
       </w:pPr>
-      <w:hyperlink w:history="1" r:id="rId8z6a31k4chpc5utjs1iya">
+      <w:hyperlink w:history="1" r:id="rIdmz0bglocd70w_s-8my6eo">
         <w:r>
           <w:rPr>
             <w:color w:val="1155CC"/>
@@ -31777,7 +32577,7 @@
         <w:keepLines/>
         <w:spacing w:after="60" w:before="0" w:line="276" w:lineRule="auto"/>
       </w:pPr>
-      <w:hyperlink w:history="1" r:id="rIdtl8kpdnvfugkvq2uzlpdt">
+      <w:hyperlink w:history="1" r:id="rIdsajcqo_ayoaef3agkwqjt">
         <w:r>
           <w:rPr>
             <w:color w:val="1155CC"/>
@@ -32115,6 +32915,31 @@
     </w:tbl>
     <w:p>
       <w:pPr>
+        <w:spacing w:after="0" w:before="150"/>
+      </w:pPr>
+      <w:r>
+        <w:rPr>
+          <w:b/>
+          <w:bCs/>
+          <w:color w:val="2D2D2D"/>
+          <w:sz w:val="20"/>
+          <w:szCs w:val="20"/>
+        </w:rPr>
+        <w:t xml:space="preserve">Empathy hours:  </w:t>
+      </w:r>
+      <w:r>
+        <w:rPr>
+          <w:color w:val="2D2D2D"/>
+          <w:sz w:val="20"/>
+          <w:szCs w:val="20"/>
+          <w:u w:val="single" w:color="8A9099"/>
+          <w:shd w:fill="E4E7EC" w:val="clear"/>
+        </w:rPr>
+        <w:t xml:space="preserve">        </w:t>
+      </w:r>
+    </w:p>
+    <w:p>
+      <w:pPr>
         <w:pStyle w:val="Heading1"/>
         <w:pageBreakBefore/>
         <w:shd w:fill="985279" w:val="clear"/>
@@ -32415,7 +33240,7 @@
         <w:keepLines/>
         <w:spacing w:after="60" w:before="0" w:line="276" w:lineRule="auto"/>
       </w:pPr>
-      <w:hyperlink w:history="1" r:id="rIdkbeimr1ybfdgdxjznr5oe">
+      <w:hyperlink w:history="1" r:id="rId6qhvupcbtym3olazp7d16">
         <w:r>
           <w:rPr>
             <w:color w:val="1155CC"/>
@@ -32432,7 +33257,7 @@
         <w:keepLines/>
         <w:spacing w:after="60" w:before="0" w:line="276" w:lineRule="auto"/>
       </w:pPr>
-      <w:hyperlink w:history="1" r:id="rId6u_n5ia8ohixxoettdxdl">
+      <w:hyperlink w:history="1" r:id="rIdxgxsa6xidsyxrauggiqdr">
         <w:r>
           <w:rPr>
             <w:color w:val="1155CC"/>
@@ -32770,6 +33595,31 @@
     </w:tbl>
     <w:p>
       <w:pPr>
+        <w:spacing w:after="0" w:before="150"/>
+      </w:pPr>
+      <w:r>
+        <w:rPr>
+          <w:b/>
+          <w:bCs/>
+          <w:color w:val="2D2D2D"/>
+          <w:sz w:val="20"/>
+          <w:szCs w:val="20"/>
+        </w:rPr>
+        <w:t xml:space="preserve">Empathy hours:  </w:t>
+      </w:r>
+      <w:r>
+        <w:rPr>
+          <w:color w:val="2D2D2D"/>
+          <w:sz w:val="20"/>
+          <w:szCs w:val="20"/>
+          <w:u w:val="single" w:color="8A9099"/>
+          <w:shd w:fill="E4E7EC" w:val="clear"/>
+        </w:rPr>
+        <w:t xml:space="preserve">        </w:t>
+      </w:r>
+    </w:p>
+    <w:p>
+      <w:pPr>
         <w:pStyle w:val="Heading1"/>
         <w:pageBreakBefore/>
         <w:shd w:fill="4F7740" w:val="clear"/>
@@ -33552,7 +34402,7 @@
         <w:keepLines/>
         <w:spacing w:after="60" w:before="0" w:line="276" w:lineRule="auto"/>
       </w:pPr>
-      <w:hyperlink w:history="1" r:id="rIdkfmyqxkf_dyiayitdtzh6">
+      <w:hyperlink w:history="1" r:id="rIdq7xnjy85h6kwbudi8psth">
         <w:r>
           <w:rPr>
             <w:color w:val="1155CC"/>
@@ -33569,7 +34419,7 @@
         <w:keepLines/>
         <w:spacing w:after="60" w:before="0" w:line="276" w:lineRule="auto"/>
       </w:pPr>
-      <w:hyperlink w:history="1" r:id="rIdmwuspn45udbpvncu1kym8">
+      <w:hyperlink w:history="1" r:id="rIdrfbl0jr82oxnwyhtywxto">
         <w:r>
           <w:rPr>
             <w:color w:val="1155CC"/>
@@ -33907,6 +34757,31 @@
     </w:tbl>
     <w:p>
       <w:pPr>
+        <w:spacing w:after="0" w:before="150"/>
+      </w:pPr>
+      <w:r>
+        <w:rPr>
+          <w:b/>
+          <w:bCs/>
+          <w:color w:val="2D2D2D"/>
+          <w:sz w:val="20"/>
+          <w:szCs w:val="20"/>
+        </w:rPr>
+        <w:t xml:space="preserve">Empathy hours:  </w:t>
+      </w:r>
+      <w:r>
+        <w:rPr>
+          <w:color w:val="2D2D2D"/>
+          <w:sz w:val="20"/>
+          <w:szCs w:val="20"/>
+          <w:u w:val="single" w:color="8A9099"/>
+          <w:shd w:fill="E4E7EC" w:val="clear"/>
+        </w:rPr>
+        <w:t xml:space="preserve">        </w:t>
+      </w:r>
+    </w:p>
+    <w:p>
+      <w:pPr>
         <w:pStyle w:val="Heading1"/>
         <w:pageBreakBefore/>
         <w:shd w:fill="545298" w:val="clear"/>
@@ -34252,7 +35127,7 @@
         <w:keepLines/>
         <w:spacing w:after="60" w:before="0" w:line="276" w:lineRule="auto"/>
       </w:pPr>
-      <w:hyperlink w:history="1" r:id="rIdikcehciin7qifl-zozn8b">
+      <w:hyperlink w:history="1" r:id="rIdp4moof-ml9qhazhgj9dvx">
         <w:r>
           <w:rPr>
             <w:color w:val="1155CC"/>
@@ -34269,7 +35144,7 @@
         <w:keepLines/>
         <w:spacing w:after="60" w:before="0" w:line="276" w:lineRule="auto"/>
       </w:pPr>
-      <w:hyperlink w:history="1" r:id="rIdluabj_vhu89m4stige2vu">
+      <w:hyperlink w:history="1" r:id="rIddbkpt5w4cpbhij3w_5hr9">
         <w:r>
           <w:rPr>
             <w:color w:val="1155CC"/>
@@ -34607,6 +35482,31 @@
     </w:tbl>
     <w:p>
       <w:pPr>
+        <w:spacing w:after="0" w:before="150"/>
+      </w:pPr>
+      <w:r>
+        <w:rPr>
+          <w:b/>
+          <w:bCs/>
+          <w:color w:val="2D2D2D"/>
+          <w:sz w:val="20"/>
+          <w:szCs w:val="20"/>
+        </w:rPr>
+        <w:t xml:space="preserve">Empathy hours:  </w:t>
+      </w:r>
+      <w:r>
+        <w:rPr>
+          <w:color w:val="2D2D2D"/>
+          <w:sz w:val="20"/>
+          <w:szCs w:val="20"/>
+          <w:u w:val="single" w:color="8A9099"/>
+          <w:shd w:fill="E4E7EC" w:val="clear"/>
+        </w:rPr>
+        <w:t xml:space="preserve">        </w:t>
+      </w:r>
+    </w:p>
+    <w:p>
+      <w:pPr>
         <w:pStyle w:val="Heading1"/>
         <w:pageBreakBefore/>
         <w:shd w:fill="92644F" w:val="clear"/>
@@ -35032,7 +35932,7 @@
         <w:keepLines/>
         <w:spacing w:after="60" w:before="0" w:line="276" w:lineRule="auto"/>
       </w:pPr>
-      <w:hyperlink w:history="1" r:id="rIdum0-w_k6hrsygvqsv2_kf">
+      <w:hyperlink w:history="1" r:id="rIdgtzsmryi3ctza3qrdmcgq">
         <w:r>
           <w:rPr>
             <w:color w:val="1155CC"/>
@@ -35049,7 +35949,7 @@
         <w:keepLines/>
         <w:spacing w:after="60" w:before="0" w:line="276" w:lineRule="auto"/>
       </w:pPr>
-      <w:hyperlink w:history="1" r:id="rId-fhkcrigsu294cdxzoxcz">
+      <w:hyperlink w:history="1" r:id="rIdwlnwkjdcwwnpdx35gds2n">
         <w:r>
           <w:rPr>
             <w:color w:val="1155CC"/>
@@ -35387,6 +36287,31 @@
     </w:tbl>
     <w:p>
       <w:pPr>
+        <w:spacing w:after="0" w:before="150"/>
+      </w:pPr>
+      <w:r>
+        <w:rPr>
+          <w:b/>
+          <w:bCs/>
+          <w:color w:val="2D2D2D"/>
+          <w:sz w:val="20"/>
+          <w:szCs w:val="20"/>
+        </w:rPr>
+        <w:t xml:space="preserve">Empathy hours:  </w:t>
+      </w:r>
+      <w:r>
+        <w:rPr>
+          <w:color w:val="2D2D2D"/>
+          <w:sz w:val="20"/>
+          <w:szCs w:val="20"/>
+          <w:u w:val="single" w:color="8A9099"/>
+          <w:shd w:fill="E4E7EC" w:val="clear"/>
+        </w:rPr>
+        <w:t xml:space="preserve">        </w:t>
+      </w:r>
+    </w:p>
+    <w:p>
+      <w:pPr>
         <w:pStyle w:val="Heading1"/>
         <w:pageBreakBefore/>
         <w:shd w:fill="407762" w:val="clear"/>
@@ -35716,7 +36641,7 @@
         <w:keepLines/>
         <w:spacing w:after="60" w:before="0" w:line="276" w:lineRule="auto"/>
       </w:pPr>
-      <w:hyperlink w:history="1" r:id="rIdaqejmcjbuwpqzjgqpaezo">
+      <w:hyperlink w:history="1" r:id="rIdz9tqswp-8vbfr8ccgwqbv">
         <w:r>
           <w:rPr>
             <w:color w:val="1155CC"/>
@@ -35733,7 +36658,7 @@
         <w:keepLines/>
         <w:spacing w:after="60" w:before="0" w:line="276" w:lineRule="auto"/>
       </w:pPr>
-      <w:hyperlink w:history="1" r:id="rIdedlgahv46pu51p14-q-co">
+      <w:hyperlink w:history="1" r:id="rIdnzowkjan33xwpu1lidvny">
         <w:r>
           <w:rPr>
             <w:color w:val="1155CC"/>
@@ -36071,6 +36996,31 @@
     </w:tbl>
     <w:p>
       <w:pPr>
+        <w:spacing w:after="0" w:before="150"/>
+      </w:pPr>
+      <w:r>
+        <w:rPr>
+          <w:b/>
+          <w:bCs/>
+          <w:color w:val="2D2D2D"/>
+          <w:sz w:val="20"/>
+          <w:szCs w:val="20"/>
+        </w:rPr>
+        <w:t xml:space="preserve">Empathy hours:  </w:t>
+      </w:r>
+      <w:r>
+        <w:rPr>
+          <w:color w:val="2D2D2D"/>
+          <w:sz w:val="20"/>
+          <w:szCs w:val="20"/>
+          <w:u w:val="single" w:color="8A9099"/>
+          <w:shd w:fill="E4E7EC" w:val="clear"/>
+        </w:rPr>
+        <w:t xml:space="preserve">        </w:t>
+      </w:r>
+    </w:p>
+    <w:p>
+      <w:pPr>
         <w:pStyle w:val="Heading1"/>
         <w:pageBreakBefore/>
         <w:shd w:fill="925298" w:val="clear"/>
@@ -36360,7 +37310,7 @@
         <w:keepLines/>
         <w:spacing w:after="60" w:before="0" w:line="276" w:lineRule="auto"/>
       </w:pPr>
-      <w:hyperlink w:history="1" r:id="rIdqa5jwkhpmrfxlbvvjsn-r">
+      <w:hyperlink w:history="1" r:id="rIdtp76ypfiukgleuk4dfrft">
         <w:r>
           <w:rPr>
             <w:color w:val="1155CC"/>
@@ -36377,7 +37327,7 @@
         <w:keepLines/>
         <w:spacing w:after="60" w:before="0" w:line="276" w:lineRule="auto"/>
       </w:pPr>
-      <w:hyperlink w:history="1" r:id="rIdkbtrisp5cfngzuujolacp">
+      <w:hyperlink w:history="1" r:id="rIddze7nwkwur3gn4a3i2uf-">
         <w:r>
           <w:rPr>
             <w:color w:val="1155CC"/>
@@ -36715,6 +37665,31 @@
     </w:tbl>
     <w:p>
       <w:pPr>
+        <w:spacing w:after="0" w:before="150"/>
+      </w:pPr>
+      <w:r>
+        <w:rPr>
+          <w:b/>
+          <w:bCs/>
+          <w:color w:val="2D2D2D"/>
+          <w:sz w:val="20"/>
+          <w:szCs w:val="20"/>
+        </w:rPr>
+        <w:t xml:space="preserve">Empathy hours:  </w:t>
+      </w:r>
+      <w:r>
+        <w:rPr>
+          <w:color w:val="2D2D2D"/>
+          <w:sz w:val="20"/>
+          <w:szCs w:val="20"/>
+          <w:u w:val="single" w:color="8A9099"/>
+          <w:shd w:fill="E4E7EC" w:val="clear"/>
+        </w:rPr>
+        <w:t xml:space="preserve">        </w:t>
+      </w:r>
+    </w:p>
+    <w:p>
+      <w:pPr>
         <w:pStyle w:val="Heading1"/>
         <w:pageBreakBefore/>
         <w:shd w:fill="6C7740" w:val="clear"/>
@@ -37281,7 +38256,7 @@
         <w:keepLines/>
         <w:spacing w:after="60" w:before="0" w:line="276" w:lineRule="auto"/>
       </w:pPr>
-      <w:hyperlink w:history="1" r:id="rIdhl3da_nzv4-nudibvszlx">
+      <w:hyperlink w:history="1" r:id="rIdj1rsf7pyyzgixkfgrdrgh">
         <w:r>
           <w:rPr>
             <w:color w:val="1155CC"/>
@@ -37298,7 +38273,7 @@
         <w:keepLines/>
         <w:spacing w:after="60" w:before="0" w:line="276" w:lineRule="auto"/>
       </w:pPr>
-      <w:hyperlink w:history="1" r:id="rIdvtuql2sa67uchekq16pin">
+      <w:hyperlink w:history="1" r:id="rIdbwx8nms-hdq9netrzf6qh">
         <w:r>
           <w:rPr>
             <w:color w:val="1155CC"/>
@@ -37636,6 +38611,31 @@
     </w:tbl>
     <w:p>
       <w:pPr>
+        <w:spacing w:after="0" w:before="150"/>
+      </w:pPr>
+      <w:r>
+        <w:rPr>
+          <w:b/>
+          <w:bCs/>
+          <w:color w:val="2D2D2D"/>
+          <w:sz w:val="20"/>
+          <w:szCs w:val="20"/>
+        </w:rPr>
+        <w:t xml:space="preserve">Empathy hours:  </w:t>
+      </w:r>
+      <w:r>
+        <w:rPr>
+          <w:color w:val="2D2D2D"/>
+          <w:sz w:val="20"/>
+          <w:szCs w:val="20"/>
+          <w:u w:val="single" w:color="8A9099"/>
+          <w:shd w:fill="E4E7EC" w:val="clear"/>
+        </w:rPr>
+        <w:t xml:space="preserve">        </w:t>
+      </w:r>
+    </w:p>
+    <w:p>
+      <w:pPr>
         <w:pStyle w:val="Heading1"/>
         <w:pageBreakBefore/>
         <w:shd w:fill="4F7192" w:val="clear"/>
@@ -37937,7 +38937,7 @@
         <w:keepLines/>
         <w:spacing w:after="60" w:before="0" w:line="276" w:lineRule="auto"/>
       </w:pPr>
-      <w:hyperlink w:history="1" r:id="rIdsunkqcmnututswxq99wkm">
+      <w:hyperlink w:history="1" r:id="rId7j_uovisv-az0dkvg9h_v">
         <w:r>
           <w:rPr>
             <w:color w:val="1155CC"/>
@@ -37954,7 +38954,7 @@
         <w:keepLines/>
         <w:spacing w:after="60" w:before="0" w:line="276" w:lineRule="auto"/>
       </w:pPr>
-      <w:hyperlink w:history="1" r:id="rIdkohbkg_apdmjw0xbj8hxr">
+      <w:hyperlink w:history="1" r:id="rIdgk99f7tlklg2i2guyvacw">
         <w:r>
           <w:rPr>
             <w:color w:val="1155CC"/>
@@ -38292,6 +39292,31 @@
     </w:tbl>
     <w:p>
       <w:pPr>
+        <w:spacing w:after="0" w:before="150"/>
+      </w:pPr>
+      <w:r>
+        <w:rPr>
+          <w:b/>
+          <w:bCs/>
+          <w:color w:val="2D2D2D"/>
+          <w:sz w:val="20"/>
+          <w:szCs w:val="20"/>
+        </w:rPr>
+        <w:t xml:space="preserve">Empathy hours:  </w:t>
+      </w:r>
+      <w:r>
+        <w:rPr>
+          <w:color w:val="2D2D2D"/>
+          <w:sz w:val="20"/>
+          <w:szCs w:val="20"/>
+          <w:u w:val="single" w:color="8A9099"/>
+          <w:shd w:fill="E4E7EC" w:val="clear"/>
+        </w:rPr>
+        <w:t xml:space="preserve">        </w:t>
+      </w:r>
+    </w:p>
+    <w:p>
+      <w:pPr>
         <w:pStyle w:val="Heading1"/>
         <w:pageBreakBefore/>
         <w:shd w:fill="985261" w:val="clear"/>
@@ -38578,7 +39603,7 @@
         <w:keepLines/>
         <w:spacing w:after="60" w:before="0" w:line="276" w:lineRule="auto"/>
       </w:pPr>
-      <w:hyperlink w:history="1" r:id="rIdrspr9_33dnyxlh2bdkvfa">
+      <w:hyperlink w:history="1" r:id="rId02fefefudor53amycyawf">
         <w:r>
           <w:rPr>
             <w:color w:val="1155CC"/>
@@ -38595,7 +39620,7 @@
         <w:keepLines/>
         <w:spacing w:after="60" w:before="0" w:line="276" w:lineRule="auto"/>
       </w:pPr>
-      <w:hyperlink w:history="1" r:id="rIdtz6pj8vc7zlncmqxpgaun">
+      <w:hyperlink w:history="1" r:id="rIdjgof89i0zj1jgitdlf9dz">
         <w:r>
           <w:rPr>
             <w:color w:val="1155CC"/>
@@ -38931,6 +39956,31 @@
         </w:tc>
       </w:tr>
     </w:tbl>
+    <w:p>
+      <w:pPr>
+        <w:spacing w:after="0" w:before="150"/>
+      </w:pPr>
+      <w:r>
+        <w:rPr>
+          <w:b/>
+          <w:bCs/>
+          <w:color w:val="2D2D2D"/>
+          <w:sz w:val="20"/>
+          <w:szCs w:val="20"/>
+        </w:rPr>
+        <w:t xml:space="preserve">Empathy hours:  </w:t>
+      </w:r>
+      <w:r>
+        <w:rPr>
+          <w:color w:val="2D2D2D"/>
+          <w:sz w:val="20"/>
+          <w:szCs w:val="20"/>
+          <w:u w:val="single" w:color="8A9099"/>
+          <w:shd w:fill="E4E7EC" w:val="clear"/>
+        </w:rPr>
+        <w:t xml:space="preserve">        </w:t>
+      </w:r>
+    </w:p>
     <w:sectPr>
       <w:footerReference w:type="default" r:id="rId7"/>
       <w:pgSz w:w="12240" w:h="15840" w:orient="portrait"/>

</xml_diff>

<commit_message>
Workbook: stop borderline weeks (12, 29) spilling onto a near-blank page
The empathy heading-row table sat directly before the answer table; Word
auto-inserts a full blank line between two adjacent tables, which was enough to
push weeks 12 and 29 slightly onto page 2. Insert a controlled ~24-twip
separator instead, and lower the box floor a touch on weeks 11-52.

Co-Authored-By: Claude Opus 4.8 (1M context) <noreply@anthropic.com>
</commit_message>
<xml_diff>
--- a/.local-workbook/The Compassion Course 2026-2027 Workbook.docx
+++ b/.local-workbook/The Compassion Course 2026-2027 Workbook.docx
@@ -579,7 +579,7 @@
         </w:rPr>
         <w:t xml:space="preserve">Keep a small journal with you throughout the day. Make 1 to 5 entries per day that include the description of an act or words spoken by someone and what need you imagine they were trying to meet. It is SUPER important to limit the words you use to those on the </w:t>
       </w:r>
-      <w:hyperlink w:history="1" r:id="rIdjgcudb4lz0ilp6ezihxua">
+      <w:hyperlink w:history="1" r:id="rIdsf_bsn8a4bvbca7lrd2o-">
         <w:r>
           <w:rPr>
             <w:color w:val="1155CC"/>
@@ -721,7 +721,7 @@
         </w:rPr>
         <w:t xml:space="preserve">Think of someone who is close to you who is doing or saying something you don't like. See if you can figure out what need they are attempting to fulfill. Again, it is really important to limit the words you use to those on the </w:t>
       </w:r>
-      <w:hyperlink w:history="1" r:id="rIdzzwbmo6q7pufcui-wdug_">
+      <w:hyperlink w:history="1" r:id="rIdlbnjrmebd0jusadxaizsm">
         <w:r>
           <w:rPr>
             <w:color w:val="1155CC"/>
@@ -1016,7 +1016,7 @@
         </w:rPr>
         <w:t xml:space="preserve">Extended registration lasts for one week. To let someone know about the course you can use the following link: </w:t>
       </w:r>
-      <w:hyperlink w:history="1" r:id="rIdlv4u8qt46qhxkqpytxuut">
+      <w:hyperlink w:history="1" r:id="rIdu320s6wh_zx7eo63h8gkz">
         <w:r>
           <w:rPr>
             <w:color w:val="1155CC"/>
@@ -1418,7 +1418,7 @@
         </w:rPr>
         <w:t xml:space="preserve">Keep a small journal with you throughout the day. Make 1 to 5 entries per day that include judgment words you said or were thinking of saying. Later on, when you have time, sit down with the </w:t>
       </w:r>
-      <w:hyperlink w:history="1" r:id="rIdts6ntsycwxih3ilepwxnu">
+      <w:hyperlink w:history="1" r:id="rIdy_jagparsazkxcsoc1kjl">
         <w:r>
           <w:rPr>
             <w:color w:val="1155CC"/>
@@ -1439,7 +1439,7 @@
         </w:rPr>
         <w:t xml:space="preserve"> and see if you can figure out what need of yours the judgment was (or is) related to. Remember, to successfully complete this exercise, limit the words you use to those on the </w:t>
       </w:r>
-      <w:hyperlink w:history="1" r:id="rIdedzgg5kppbfjgtvzwouik">
+      <w:hyperlink w:history="1" r:id="rId1dgco26xcpab-usjru8su">
         <w:r>
           <w:rPr>
             <w:color w:val="1155CC"/>
@@ -1581,7 +1581,7 @@
         </w:rPr>
         <w:t xml:space="preserve">Keep a small journal with you throughout the day. It could be a little book, a folded piece of paper or a napkin -anything you can write on. Make 1 to 5 entries per day that include judgment words spoken by someone. Later on, when you have time, sit down with the </w:t>
       </w:r>
-      <w:hyperlink w:history="1" r:id="rIdv57zvet5cru6ab__l4dfz">
+      <w:hyperlink w:history="1" r:id="rIdb3zhmxzuyqww7vtod0fz0">
         <w:r>
           <w:rPr>
             <w:color w:val="1155CC"/>
@@ -1602,7 +1602,7 @@
         </w:rPr>
         <w:t xml:space="preserve"> and see if you can figure out what need was unmet for them. Remember to limit the words you use to those on the </w:t>
       </w:r>
-      <w:hyperlink w:history="1" r:id="rIdxwoor7lrgwdkgf-i4ruom">
+      <w:hyperlink w:history="1" r:id="rId0wvskjiy4zzxyqdyegr3z">
         <w:r>
           <w:rPr>
             <w:color w:val="1155CC"/>
@@ -2141,7 +2141,7 @@
         </w:rPr>
         <w:t xml:space="preserve">Later on, when you have time, sit down with the </w:t>
       </w:r>
-      <w:hyperlink w:history="1" r:id="rIdrua4y-r9ofd1haxmj3gli">
+      <w:hyperlink w:history="1" r:id="rId-u6pwjnhs4z38vuhggjqc">
         <w:r>
           <w:rPr>
             <w:color w:val="1155CC"/>
@@ -2198,7 +2198,7 @@
         </w:rPr>
         <w:t xml:space="preserve"> at the top of the </w:t>
       </w:r>
-      <w:hyperlink w:history="1" r:id="rIdcqswkqt-c7kve0rgs3yj2">
+      <w:hyperlink w:history="1" r:id="rIdswzavpkc1jp0ib2ubzxxk">
         <w:r>
           <w:rPr>
             <w:color w:val="1155CC"/>
@@ -2235,7 +2235,7 @@
         </w:rPr>
         <w:t xml:space="preserve">Then look at the </w:t>
       </w:r>
-      <w:hyperlink w:history="1" r:id="rIdoct_icaqcjwza7evnhrg_">
+      <w:hyperlink w:history="1" r:id="rIdu_anh8qjm5qs10scmcyhp">
         <w:r>
           <w:rPr>
             <w:color w:val="1155CC"/>
@@ -2256,7 +2256,7 @@
         </w:rPr>
         <w:t xml:space="preserve"> and see if you can figure out what need your feeling was about. Remember, it's VERY helpful to limit the words you use to those on the </w:t>
       </w:r>
-      <w:hyperlink w:history="1" r:id="rId4u5x1thu_dmbjswyllqgp">
+      <w:hyperlink w:history="1" r:id="rIdh8s6zoiluuhycrtcjxtif">
         <w:r>
           <w:rPr>
             <w:color w:val="1155CC"/>
@@ -2398,7 +2398,7 @@
         </w:rPr>
         <w:t xml:space="preserve">Keep a small journal with you throughout the day. Make 2 to 4 entries per day that include something you did, said or were thinking of saying and the feeling (or feelings) you experienced at that moment. Again, later on, when you have time, sit down with the </w:t>
       </w:r>
-      <w:hyperlink w:history="1" r:id="rId8qirbblzkaznfa2nveopb">
+      <w:hyperlink w:history="1" r:id="rIdec2jfilio4xgskuv4iium">
         <w:r>
           <w:rPr>
             <w:color w:val="1155CC"/>
@@ -2455,7 +2455,7 @@
         </w:rPr>
         <w:t xml:space="preserve"> at the top of the </w:t>
       </w:r>
-      <w:hyperlink w:history="1" r:id="rId-f2sj2duswuyev4y26mb0">
+      <w:hyperlink w:history="1" r:id="rIdjujt4il3aoh9m8uqy4tgs">
         <w:r>
           <w:rPr>
             <w:color w:val="1155CC"/>
@@ -2492,7 +2492,7 @@
         </w:rPr>
         <w:t xml:space="preserve">Then look at the </w:t>
       </w:r>
-      <w:hyperlink w:history="1" r:id="rIdcyag_uhoqgd-drxv28a0w">
+      <w:hyperlink w:history="1" r:id="rIdi5ip8cnf4zx8jnb7mgkjp">
         <w:r>
           <w:rPr>
             <w:color w:val="1155CC"/>
@@ -2513,7 +2513,7 @@
         </w:rPr>
         <w:t xml:space="preserve"> and see if you can figure out what need your feeling was about. Remember, here too, it's VERY important to limit the words you use to those on the </w:t>
       </w:r>
-      <w:hyperlink w:history="1" r:id="rId12hjiylkellriic-hzgg8">
+      <w:hyperlink w:history="1" r:id="rIdfmxw9unpiq237liyvqdyq">
         <w:r>
           <w:rPr>
             <w:color w:val="1155CC"/>
@@ -2899,7 +2899,7 @@
       <w:r>
         <w:t xml:space="preserve">Read the </w:t>
       </w:r>
-      <w:hyperlink w:history="1" r:id="rIdjpbwbs9raccs1vzwpaeor">
+      <w:hyperlink w:history="1" r:id="rIdz1nl4m44fg4js6dwwh8xq">
         <w:r>
           <w:rPr>
             <w:color w:val="1155CC"/>
@@ -3032,7 +3032,7 @@
       <w:r>
         <w:t xml:space="preserve">Print a copy of the </w:t>
       </w:r>
-      <w:hyperlink w:history="1" r:id="rIdefo_33w4t1ik4wite-6zl">
+      <w:hyperlink w:history="1" r:id="rId6zjyh5mdwocaz5fl-ine8">
         <w:r>
           <w:rPr>
             <w:color w:val="1155CC"/>
@@ -3197,7 +3197,7 @@
         </w:rPr>
         <w:t xml:space="preserve">Keep a small journal with you throughout the day. Make 1 to 5 entries per day that include an act or words spoken by someone and what need(s) you imagine they were trying to meet. Remember, it's VERY helpful to limit the words you use to those on the </w:t>
       </w:r>
-      <w:hyperlink w:history="1" r:id="rIdobgtznr3wi27ikg-uwozu">
+      <w:hyperlink w:history="1" r:id="rIddcmt2l3-jq2i4iw8iw8hp">
         <w:r>
           <w:rPr>
             <w:color w:val="1155CC"/>
@@ -3339,7 +3339,7 @@
         </w:rPr>
         <w:t xml:space="preserve">Think of someone that you think is preventing you from getting a need(s) met. Write down the need(s) from the </w:t>
       </w:r>
-      <w:hyperlink w:history="1" r:id="rId-yov9e25zzg9iq_j1og-n">
+      <w:hyperlink w:history="1" r:id="rIdid2uikvrkriyjmgwp4-1l">
         <w:r>
           <w:rPr>
             <w:color w:val="1155CC"/>
@@ -3741,7 +3741,7 @@
         </w:rPr>
         <w:t xml:space="preserve">Visit: http://</w:t>
       </w:r>
-      <w:hyperlink w:history="1" r:id="rIdbqk8uyy3p1nyh5w4wdpbo">
+      <w:hyperlink w:history="1" r:id="rId505yzoxnz82uv13lnyoqd">
         <w:r>
           <w:rPr>
             <w:color w:val="1155CC"/>
@@ -4017,7 +4017,7 @@
         <w:keepLines/>
         <w:spacing w:after="60" w:before="0" w:line="276" w:lineRule="auto"/>
       </w:pPr>
-      <w:hyperlink w:history="1" r:id="rIdlga2ma9ujreclu4vltat9">
+      <w:hyperlink w:history="1" r:id="rIds6_1ut2wwihbvgx2c89so">
         <w:r>
           <w:rPr>
             <w:color w:val="1155CC"/>
@@ -4409,7 +4409,7 @@
         </w:rPr>
         <w:t xml:space="preserve">Continue working with this exercise (</w:t>
       </w:r>
-      <w:hyperlink w:history="1" r:id="rIdi_myisvqd0-p1qm8-xbi-">
+      <w:hyperlink w:history="1" r:id="rIdg4siyypsx_ru-a0qzk6wz">
         <w:r>
           <w:rPr>
             <w:color w:val="1155CC"/>
@@ -4720,7 +4720,7 @@
         </w:rPr>
         <w:t xml:space="preserve"> - take your time). Next, view or print a copy of the </w:t>
       </w:r>
-      <w:hyperlink w:history="1" r:id="rIdcjfswfnjmqvgors39n3kp">
+      <w:hyperlink w:history="1" r:id="rIdohglmw7hsuaslsumgyjhl">
         <w:r>
           <w:rPr>
             <w:color w:val="1155CC"/>
@@ -5253,7 +5253,7 @@
         <w:keepLines/>
         <w:spacing w:after="60" w:before="0" w:line="276" w:lineRule="auto"/>
       </w:pPr>
-      <w:hyperlink w:history="1" r:id="rIddicbjgolvukhcgb0ni6iv">
+      <w:hyperlink w:history="1" r:id="rId4rlhgghittm73vv23l8ju">
         <w:r>
           <w:rPr>
             <w:color w:val="1155CC"/>
@@ -6379,7 +6379,7 @@
         </w:rPr>
         <w:t xml:space="preserve">Then look at the </w:t>
       </w:r>
-      <w:hyperlink w:history="1" r:id="rIdfhrcbbu8l2n1ybtuwcacz">
+      <w:hyperlink w:history="1" r:id="rIdfijmfhsgt7uebu53teept">
         <w:r>
           <w:rPr>
             <w:color w:val="1155CC"/>
@@ -7094,7 +7094,7 @@
         </w:rPr>
         <w:t xml:space="preserve">Later on, when you have time, read over your journal for the day. Next, check in with yourself about how you feel as you think about those thoughts. Then look at the </w:t>
       </w:r>
-      <w:hyperlink w:history="1" r:id="rIdn9mr5re_l3g3wo8snrntr">
+      <w:hyperlink w:history="1" r:id="rIdj84oktukittfzpnvvozc-">
         <w:r>
           <w:rPr>
             <w:color w:val="1155CC"/>
@@ -7552,7 +7552,7 @@
         </w:rPr>
         <w:t xml:space="preserve"> response would be. What was that person feeling? What was that person needing, wanting to have more of, or yearning to experience? Check the </w:t>
       </w:r>
-      <w:hyperlink w:history="1" r:id="rIdwltd1kcyevgfpoh6qn2ya">
+      <w:hyperlink w:history="1" r:id="rIdk7g-vogh5-vo7qxd6ndea">
         <w:r>
           <w:rPr>
             <w:color w:val="1155CC"/>
@@ -7573,7 +7573,7 @@
         </w:rPr>
         <w:t xml:space="preserve"> and the </w:t>
       </w:r>
-      <w:hyperlink w:history="1" r:id="rIdpn5ksaybyy6w-wapxli_e">
+      <w:hyperlink w:history="1" r:id="rIdgtclnm1_vgqlbec45wtlk">
         <w:r>
           <w:rPr>
             <w:color w:val="1155CC"/>
@@ -8025,7 +8025,7 @@
               </w:rPr>
               <w:t xml:space="preserve"> (feeling from the </w:t>
             </w:r>
-            <w:hyperlink w:history="1" r:id="rIdgj6a9dh72wluo_sy0oixs">
+            <w:hyperlink w:history="1" r:id="rIdovdokrqkghekn77fxumlg">
               <w:r>
                 <w:rPr>
                   <w:color w:val="1155CC"/>
@@ -8066,7 +8066,7 @@
               </w:rPr>
               <w:t xml:space="preserve"> (need from the </w:t>
             </w:r>
-            <w:hyperlink w:history="1" r:id="rIdxupg4eq4artvhr0fosdaw">
+            <w:hyperlink w:history="1" r:id="rIddlkgf7v4mnxdjmsk-tlye">
               <w:r>
                 <w:rPr>
                   <w:color w:val="1155CC"/>
@@ -9067,6 +9067,18 @@
         </w:tc>
       </w:tr>
     </w:tbl>
+    <w:p>
+      <w:pPr>
+        <w:spacing w:after="0" w:before="0" w:line="24" w:lineRule="exact"/>
+      </w:pPr>
+      <w:r>
+        <w:rPr>
+          <w:sz w:val="2"/>
+          <w:szCs w:val="2"/>
+        </w:rPr>
+        <w:t xml:space="preserve"/>
+      </w:r>
+    </w:p>
     <w:tbl>
       <w:tblPr>
         <w:tblW w:type="dxa" w:w="9360"/>
@@ -9555,7 +9567,7 @@
       <w:tr>
         <w:trPr>
           <w:cantSplit/>
-          <w:trHeight w:val="300" w:hRule="atLeast"/>
+          <w:trHeight w:val="240" w:hRule="atLeast"/>
         </w:trPr>
         <w:tc>
           <w:tcPr>
@@ -9844,7 +9856,7 @@
       <w:tr>
         <w:trPr>
           <w:cantSplit/>
-          <w:trHeight w:val="300" w:hRule="atLeast"/>
+          <w:trHeight w:val="240" w:hRule="atLeast"/>
         </w:trPr>
         <w:tc>
           <w:tcPr>
@@ -9999,6 +10011,18 @@
         </w:tc>
       </w:tr>
     </w:tbl>
+    <w:p>
+      <w:pPr>
+        <w:spacing w:after="0" w:before="0" w:line="24" w:lineRule="exact"/>
+      </w:pPr>
+      <w:r>
+        <w:rPr>
+          <w:sz w:val="2"/>
+          <w:szCs w:val="2"/>
+        </w:rPr>
+        <w:t xml:space="preserve"/>
+      </w:r>
+    </w:p>
     <w:tbl>
       <w:tblPr>
         <w:tblW w:type="dxa" w:w="9360"/>
@@ -10124,7 +10148,7 @@
       <w:tr>
         <w:trPr>
           <w:cantSplit/>
-          <w:trHeight w:val="380" w:hRule="atLeast"/>
+          <w:trHeight w:val="320" w:hRule="atLeast"/>
         </w:trPr>
         <w:tc>
           <w:tcPr>
@@ -10864,6 +10888,18 @@
         </w:tc>
       </w:tr>
     </w:tbl>
+    <w:p>
+      <w:pPr>
+        <w:spacing w:after="0" w:before="0" w:line="24" w:lineRule="exact"/>
+      </w:pPr>
+      <w:r>
+        <w:rPr>
+          <w:sz w:val="2"/>
+          <w:szCs w:val="2"/>
+        </w:rPr>
+        <w:t xml:space="preserve"/>
+      </w:r>
+    </w:p>
     <w:tbl>
       <w:tblPr>
         <w:tblW w:type="dxa" w:w="9360"/>
@@ -11937,6 +11973,18 @@
         </w:tc>
       </w:tr>
     </w:tbl>
+    <w:p>
+      <w:pPr>
+        <w:spacing w:after="0" w:before="0" w:line="24" w:lineRule="exact"/>
+      </w:pPr>
+      <w:r>
+        <w:rPr>
+          <w:sz w:val="2"/>
+          <w:szCs w:val="2"/>
+        </w:rPr>
+        <w:t xml:space="preserve"/>
+      </w:r>
+    </w:p>
     <w:tbl>
       <w:tblPr>
         <w:tblW w:type="dxa" w:w="9360"/>
@@ -12958,6 +13006,18 @@
         </w:tc>
       </w:tr>
     </w:tbl>
+    <w:p>
+      <w:pPr>
+        <w:spacing w:after="0" w:before="0" w:line="24" w:lineRule="exact"/>
+      </w:pPr>
+      <w:r>
+        <w:rPr>
+          <w:sz w:val="2"/>
+          <w:szCs w:val="2"/>
+        </w:rPr>
+        <w:t xml:space="preserve"/>
+      </w:r>
+    </w:p>
     <w:tbl>
       <w:tblPr>
         <w:tblW w:type="dxa" w:w="9360"/>
@@ -13843,6 +13903,18 @@
         </w:tc>
       </w:tr>
     </w:tbl>
+    <w:p>
+      <w:pPr>
+        <w:spacing w:after="0" w:before="0" w:line="24" w:lineRule="exact"/>
+      </w:pPr>
+      <w:r>
+        <w:rPr>
+          <w:sz w:val="2"/>
+          <w:szCs w:val="2"/>
+        </w:rPr>
+        <w:t xml:space="preserve"/>
+      </w:r>
+    </w:p>
     <w:tbl>
       <w:tblPr>
         <w:tblW w:type="dxa" w:w="9360"/>
@@ -14495,6 +14567,18 @@
         </w:tc>
       </w:tr>
     </w:tbl>
+    <w:p>
+      <w:pPr>
+        <w:spacing w:after="0" w:before="0" w:line="24" w:lineRule="exact"/>
+      </w:pPr>
+      <w:r>
+        <w:rPr>
+          <w:sz w:val="2"/>
+          <w:szCs w:val="2"/>
+        </w:rPr>
+        <w:t xml:space="preserve"/>
+      </w:r>
+    </w:p>
     <w:tbl>
       <w:tblPr>
         <w:tblW w:type="dxa" w:w="9360"/>
@@ -15139,6 +15223,18 @@
         </w:tc>
       </w:tr>
     </w:tbl>
+    <w:p>
+      <w:pPr>
+        <w:spacing w:after="0" w:before="0" w:line="24" w:lineRule="exact"/>
+      </w:pPr>
+      <w:r>
+        <w:rPr>
+          <w:sz w:val="2"/>
+          <w:szCs w:val="2"/>
+        </w:rPr>
+        <w:t xml:space="preserve"/>
+      </w:r>
+    </w:p>
     <w:tbl>
       <w:tblPr>
         <w:tblW w:type="dxa" w:w="9360"/>
@@ -15584,7 +15680,7 @@
         <w:keepLines/>
         <w:spacing w:after="60" w:before="0" w:line="276" w:lineRule="auto"/>
       </w:pPr>
-      <w:hyperlink w:history="1" r:id="rId49lcz9lg7mb71eoutafyc">
+      <w:hyperlink w:history="1" r:id="rId_6v6v5hq9dyvavfuzwfl5">
         <w:r>
           <w:rPr>
             <w:color w:val="1155CC"/>
@@ -15601,7 +15697,7 @@
         <w:keepLines/>
         <w:spacing w:after="60" w:before="0" w:line="276" w:lineRule="auto"/>
       </w:pPr>
-      <w:hyperlink w:history="1" r:id="rIdiqkcfyxbkbadus2zr7dud">
+      <w:hyperlink w:history="1" r:id="rIdmb5ugcckhnrq1iea0mb8b">
         <w:r>
           <w:rPr>
             <w:color w:val="1155CC"/>
@@ -15825,6 +15921,18 @@
         </w:tc>
       </w:tr>
     </w:tbl>
+    <w:p>
+      <w:pPr>
+        <w:spacing w:after="0" w:before="0" w:line="24" w:lineRule="exact"/>
+      </w:pPr>
+      <w:r>
+        <w:rPr>
+          <w:sz w:val="2"/>
+          <w:szCs w:val="2"/>
+        </w:rPr>
+        <w:t xml:space="preserve"/>
+      </w:r>
+    </w:p>
     <w:tbl>
       <w:tblPr>
         <w:tblW w:type="dxa" w:w="9360"/>
@@ -16109,7 +16217,7 @@
         <w:keepLines/>
         <w:spacing w:after="60" w:before="0" w:line="276" w:lineRule="auto"/>
       </w:pPr>
-      <w:hyperlink w:history="1" r:id="rId0x7sku1y9jzzbftj6sjx5">
+      <w:hyperlink w:history="1" r:id="rId2gdgznhqmucs0idprbgue">
         <w:r>
           <w:rPr>
             <w:color w:val="1155CC"/>
@@ -16126,7 +16234,7 @@
         <w:keepLines/>
         <w:spacing w:after="60" w:before="0" w:line="276" w:lineRule="auto"/>
       </w:pPr>
-      <w:hyperlink w:history="1" r:id="rIdxgxag3toab7mqgirdy-lc">
+      <w:hyperlink w:history="1" r:id="rIdvhpv0afocjumbi9eqpwar">
         <w:r>
           <w:rPr>
             <w:color w:val="1155CC"/>
@@ -16350,6 +16458,18 @@
         </w:tc>
       </w:tr>
     </w:tbl>
+    <w:p>
+      <w:pPr>
+        <w:spacing w:after="0" w:before="0" w:line="24" w:lineRule="exact"/>
+      </w:pPr>
+      <w:r>
+        <w:rPr>
+          <w:sz w:val="2"/>
+          <w:szCs w:val="2"/>
+        </w:rPr>
+        <w:t xml:space="preserve"/>
+      </w:r>
+    </w:p>
     <w:tbl>
       <w:tblPr>
         <w:tblW w:type="dxa" w:w="9360"/>
@@ -16807,7 +16927,7 @@
         <w:keepLines/>
         <w:spacing w:after="60" w:before="0" w:line="276" w:lineRule="auto"/>
       </w:pPr>
-      <w:hyperlink w:history="1" r:id="rIdfuczwwy6osayxi0eljnpz">
+      <w:hyperlink w:history="1" r:id="rIdoysm9s1lby4ni6l8ddrf4">
         <w:r>
           <w:rPr>
             <w:color w:val="1155CC"/>
@@ -16824,7 +16944,7 @@
         <w:keepLines/>
         <w:spacing w:after="60" w:before="0" w:line="276" w:lineRule="auto"/>
       </w:pPr>
-      <w:hyperlink w:history="1" r:id="rIdwmtj2iz3rcjco3idgzvm4">
+      <w:hyperlink w:history="1" r:id="rId2_lc4vsptc1szfrj77y8o">
         <w:r>
           <w:rPr>
             <w:color w:val="1155CC"/>
@@ -17048,6 +17168,18 @@
         </w:tc>
       </w:tr>
     </w:tbl>
+    <w:p>
+      <w:pPr>
+        <w:spacing w:after="0" w:before="0" w:line="24" w:lineRule="exact"/>
+      </w:pPr>
+      <w:r>
+        <w:rPr>
+          <w:sz w:val="2"/>
+          <w:szCs w:val="2"/>
+        </w:rPr>
+        <w:t xml:space="preserve"/>
+      </w:r>
+    </w:p>
     <w:tbl>
       <w:tblPr>
         <w:tblW w:type="dxa" w:w="9360"/>
@@ -17855,6 +17987,18 @@
         </w:tc>
       </w:tr>
     </w:tbl>
+    <w:p>
+      <w:pPr>
+        <w:spacing w:after="0" w:before="0" w:line="24" w:lineRule="exact"/>
+      </w:pPr>
+      <w:r>
+        <w:rPr>
+          <w:sz w:val="2"/>
+          <w:szCs w:val="2"/>
+        </w:rPr>
+        <w:t xml:space="preserve"/>
+      </w:r>
+    </w:p>
     <w:tbl>
       <w:tblPr>
         <w:tblW w:type="dxa" w:w="9360"/>
@@ -18663,7 +18807,7 @@
         <w:keepLines/>
         <w:spacing w:after="60" w:before="0" w:line="276" w:lineRule="auto"/>
       </w:pPr>
-      <w:hyperlink w:history="1" r:id="rIdltuhyvusbmrx2sdydkcw9">
+      <w:hyperlink w:history="1" r:id="rIdhxrfow0ygx-lh_4iyecih">
         <w:r>
           <w:rPr>
             <w:color w:val="1155CC"/>
@@ -18680,7 +18824,7 @@
         <w:keepLines/>
         <w:spacing w:after="60" w:before="0" w:line="276" w:lineRule="auto"/>
       </w:pPr>
-      <w:hyperlink w:history="1" r:id="rId0tk3ogvdqab4-rpmwfrsp">
+      <w:hyperlink w:history="1" r:id="rIdud8yiuivp4cp7cw4jpqfy">
         <w:r>
           <w:rPr>
             <w:color w:val="1155CC"/>
@@ -18904,6 +19048,18 @@
         </w:tc>
       </w:tr>
     </w:tbl>
+    <w:p>
+      <w:pPr>
+        <w:spacing w:after="0" w:before="0" w:line="24" w:lineRule="exact"/>
+      </w:pPr>
+      <w:r>
+        <w:rPr>
+          <w:sz w:val="2"/>
+          <w:szCs w:val="2"/>
+        </w:rPr>
+        <w:t xml:space="preserve"/>
+      </w:r>
+    </w:p>
     <w:tbl>
       <w:tblPr>
         <w:tblW w:type="dxa" w:w="9360"/>
@@ -19937,7 +20093,7 @@
         <w:keepLines/>
         <w:spacing w:after="60" w:before="0" w:line="276" w:lineRule="auto"/>
       </w:pPr>
-      <w:hyperlink w:history="1" r:id="rIdgxn4wctsxmig9enujxe-x">
+      <w:hyperlink w:history="1" r:id="rIdwiwi2kwixaqoopj87ir5d">
         <w:r>
           <w:rPr>
             <w:color w:val="1155CC"/>
@@ -19954,7 +20110,7 @@
         <w:keepLines/>
         <w:spacing w:after="60" w:before="0" w:line="276" w:lineRule="auto"/>
       </w:pPr>
-      <w:hyperlink w:history="1" r:id="rId7edbbfq5s1uvb3-s5qtu2">
+      <w:hyperlink w:history="1" r:id="rIdv5f8dyzloct-ydrcsyzxw">
         <w:r>
           <w:rPr>
             <w:color w:val="1155CC"/>
@@ -20178,6 +20334,18 @@
         </w:tc>
       </w:tr>
     </w:tbl>
+    <w:p>
+      <w:pPr>
+        <w:spacing w:after="0" w:before="0" w:line="24" w:lineRule="exact"/>
+      </w:pPr>
+      <w:r>
+        <w:rPr>
+          <w:sz w:val="2"/>
+          <w:szCs w:val="2"/>
+        </w:rPr>
+        <w:t xml:space="preserve"/>
+      </w:r>
+    </w:p>
     <w:tbl>
       <w:tblPr>
         <w:tblW w:type="dxa" w:w="9360"/>
@@ -20647,7 +20815,7 @@
         <w:keepLines/>
         <w:spacing w:after="60" w:before="0" w:line="276" w:lineRule="auto"/>
       </w:pPr>
-      <w:hyperlink w:history="1" r:id="rIdayyg42szhva_kqytkazqa">
+      <w:hyperlink w:history="1" r:id="rIdrwvrjukrffkodoclwkf_m">
         <w:r>
           <w:rPr>
             <w:color w:val="1155CC"/>
@@ -20664,7 +20832,7 @@
         <w:keepLines/>
         <w:spacing w:after="60" w:before="0" w:line="276" w:lineRule="auto"/>
       </w:pPr>
-      <w:hyperlink w:history="1" r:id="rIdog1oz62p0o1nygbfqojjl">
+      <w:hyperlink w:history="1" r:id="rId3rpiut9wyzdoihkhzlhlp">
         <w:r>
           <w:rPr>
             <w:color w:val="1155CC"/>
@@ -20888,6 +21056,18 @@
         </w:tc>
       </w:tr>
     </w:tbl>
+    <w:p>
+      <w:pPr>
+        <w:spacing w:after="0" w:before="0" w:line="24" w:lineRule="exact"/>
+      </w:pPr>
+      <w:r>
+        <w:rPr>
+          <w:sz w:val="2"/>
+          <w:szCs w:val="2"/>
+        </w:rPr>
+        <w:t xml:space="preserve"/>
+      </w:r>
+    </w:p>
     <w:tbl>
       <w:tblPr>
         <w:tblW w:type="dxa" w:w="9360"/>
@@ -21478,7 +21658,7 @@
         <w:keepLines/>
         <w:spacing w:after="60" w:before="0" w:line="276" w:lineRule="auto"/>
       </w:pPr>
-      <w:hyperlink w:history="1" r:id="rIdxnof_zp346xkf-ng7jl4m">
+      <w:hyperlink w:history="1" r:id="rIdhtduy48gjaqe28h6grzqt">
         <w:r>
           <w:rPr>
             <w:color w:val="1155CC"/>
@@ -21495,7 +21675,7 @@
         <w:keepLines/>
         <w:spacing w:after="60" w:before="0" w:line="276" w:lineRule="auto"/>
       </w:pPr>
-      <w:hyperlink w:history="1" r:id="rIdum14daimzkexw1aoa9wxe">
+      <w:hyperlink w:history="1" r:id="rIdivd94l6ed3lbofz2b9oz9">
         <w:r>
           <w:rPr>
             <w:color w:val="1155CC"/>
@@ -21719,6 +21899,18 @@
         </w:tc>
       </w:tr>
     </w:tbl>
+    <w:p>
+      <w:pPr>
+        <w:spacing w:after="0" w:before="0" w:line="24" w:lineRule="exact"/>
+      </w:pPr>
+      <w:r>
+        <w:rPr>
+          <w:sz w:val="2"/>
+          <w:szCs w:val="2"/>
+        </w:rPr>
+        <w:t xml:space="preserve"/>
+      </w:r>
+    </w:p>
     <w:tbl>
       <w:tblPr>
         <w:tblW w:type="dxa" w:w="9360"/>
@@ -22055,7 +22247,7 @@
       <w:tr>
         <w:trPr>
           <w:cantSplit/>
-          <w:trHeight w:val="300" w:hRule="atLeast"/>
+          <w:trHeight w:val="240" w:hRule="atLeast"/>
         </w:trPr>
         <w:tc>
           <w:tcPr>
@@ -22208,7 +22400,7 @@
       <w:tr>
         <w:trPr>
           <w:cantSplit/>
-          <w:trHeight w:val="300" w:hRule="atLeast"/>
+          <w:trHeight w:val="240" w:hRule="atLeast"/>
         </w:trPr>
         <w:tc>
           <w:tcPr>
@@ -22271,7 +22463,7 @@
         </w:rPr>
         <w:t xml:space="preserve">You may want to find some quiet space and time for this exercise. Start by going to the </w:t>
       </w:r>
-      <w:hyperlink w:history="1" r:id="rId2hxt7ms_w9pop6hvylx2t">
+      <w:hyperlink w:history="1" r:id="rIdv2suknr_s1odjrvbwweqe">
         <w:r>
           <w:rPr>
             <w:color w:val="1155CC"/>
@@ -22438,7 +22630,7 @@
         <w:keepLines/>
         <w:spacing w:after="60" w:before="0" w:line="276" w:lineRule="auto"/>
       </w:pPr>
-      <w:hyperlink w:history="1" r:id="rIdosgbop0xmzkmdpwrkauuh">
+      <w:hyperlink w:history="1" r:id="rIdxvugnnohehzu_iqkgpwy4">
         <w:r>
           <w:rPr>
             <w:color w:val="1155CC"/>
@@ -22455,7 +22647,7 @@
         <w:keepLines/>
         <w:spacing w:after="60" w:before="0" w:line="276" w:lineRule="auto"/>
       </w:pPr>
-      <w:hyperlink w:history="1" r:id="rId5vpf2e8p1ib_0gcjperc-">
+      <w:hyperlink w:history="1" r:id="rIdobnkctqxk5renzwijjyqy">
         <w:r>
           <w:rPr>
             <w:color w:val="1155CC"/>
@@ -22524,7 +22716,7 @@
       <w:tr>
         <w:trPr>
           <w:cantSplit/>
-          <w:trHeight w:val="300" w:hRule="atLeast"/>
+          <w:trHeight w:val="240" w:hRule="atLeast"/>
         </w:trPr>
         <w:tc>
           <w:tcPr>
@@ -22679,6 +22871,18 @@
         </w:tc>
       </w:tr>
     </w:tbl>
+    <w:p>
+      <w:pPr>
+        <w:spacing w:after="0" w:before="0" w:line="24" w:lineRule="exact"/>
+      </w:pPr>
+      <w:r>
+        <w:rPr>
+          <w:sz w:val="2"/>
+          <w:szCs w:val="2"/>
+        </w:rPr>
+        <w:t xml:space="preserve"/>
+      </w:r>
+    </w:p>
     <w:tbl>
       <w:tblPr>
         <w:tblW w:type="dxa" w:w="9360"/>
@@ -22804,7 +23008,7 @@
       <w:tr>
         <w:trPr>
           <w:cantSplit/>
-          <w:trHeight w:val="380" w:hRule="atLeast"/>
+          <w:trHeight w:val="320" w:hRule="atLeast"/>
         </w:trPr>
         <w:tc>
           <w:tcPr>
@@ -22977,7 +23181,7 @@
         </w:rPr>
         <w:t xml:space="preserve"> exercise at: http://</w:t>
       </w:r>
-      <w:hyperlink w:history="1" r:id="rIdxhir-c1oyh8-pbmbbfzef">
+      <w:hyperlink w:history="1" r:id="rIdsrb6xnznkhedcxjq_ydsg">
         <w:r>
           <w:rPr>
             <w:color w:val="1155CC"/>
@@ -23289,7 +23493,7 @@
         <w:keepLines/>
         <w:spacing w:after="60" w:before="0" w:line="276" w:lineRule="auto"/>
       </w:pPr>
-      <w:hyperlink w:history="1" r:id="rIdk4lpy4zxwkm9n0dq5fvog">
+      <w:hyperlink w:history="1" r:id="rIdlhasjbu6hhbcky0oqooub">
         <w:r>
           <w:rPr>
             <w:color w:val="1155CC"/>
@@ -23306,7 +23510,7 @@
         <w:keepLines/>
         <w:spacing w:after="60" w:before="0" w:line="276" w:lineRule="auto"/>
       </w:pPr>
-      <w:hyperlink w:history="1" r:id="rIdezvkm8kdnv_3hxlme_2v7">
+      <w:hyperlink w:history="1" r:id="rIdj5pv77pxgvmwwddlw3hme">
         <w:r>
           <w:rPr>
             <w:color w:val="1155CC"/>
@@ -23530,6 +23734,18 @@
         </w:tc>
       </w:tr>
     </w:tbl>
+    <w:p>
+      <w:pPr>
+        <w:spacing w:after="0" w:before="0" w:line="24" w:lineRule="exact"/>
+      </w:pPr>
+      <w:r>
+        <w:rPr>
+          <w:sz w:val="2"/>
+          <w:szCs w:val="2"/>
+        </w:rPr>
+        <w:t xml:space="preserve"/>
+      </w:r>
+    </w:p>
     <w:tbl>
       <w:tblPr>
         <w:tblW w:type="dxa" w:w="9360"/>
@@ -23860,7 +24076,7 @@
         </w:rPr>
         <w:t xml:space="preserve">Either at that time, or later on, write down a word (or words) from the </w:t>
       </w:r>
-      <w:hyperlink w:history="1" r:id="rIdnzab-aca0pm7lnpd5r1hv">
+      <w:hyperlink w:history="1" r:id="rIda7sra7v00psfabqy13_h7">
         <w:r>
           <w:rPr>
             <w:color w:val="1155CC"/>
@@ -23897,7 +24113,7 @@
         </w:rPr>
         <w:t xml:space="preserve">Then look at the </w:t>
       </w:r>
-      <w:hyperlink w:history="1" r:id="rId9073eyq1rabtipgcfx3vn">
+      <w:hyperlink w:history="1" r:id="rIdfjobo8xk9tlrzvbg9ivrb">
         <w:r>
           <w:rPr>
             <w:color w:val="1155CC"/>
@@ -24024,7 +24240,7 @@
       <w:tr>
         <w:trPr>
           <w:cantSplit/>
-          <w:trHeight w:val="300" w:hRule="atLeast"/>
+          <w:trHeight w:val="240" w:hRule="atLeast"/>
         </w:trPr>
         <w:tc>
           <w:tcPr>
@@ -24161,7 +24377,7 @@
       <w:tr>
         <w:trPr>
           <w:cantSplit/>
-          <w:trHeight w:val="300" w:hRule="atLeast"/>
+          <w:trHeight w:val="240" w:hRule="atLeast"/>
         </w:trPr>
         <w:tc>
           <w:tcPr>
@@ -24310,7 +24526,7 @@
         <w:keepLines/>
         <w:spacing w:after="60" w:before="0" w:line="276" w:lineRule="auto"/>
       </w:pPr>
-      <w:hyperlink w:history="1" r:id="rIdk9webref1judlxj7jdbdf">
+      <w:hyperlink w:history="1" r:id="rIdjam7_zvwmbank6tnqhxrj">
         <w:r>
           <w:rPr>
             <w:color w:val="1155CC"/>
@@ -24327,7 +24543,7 @@
         <w:keepLines/>
         <w:spacing w:after="60" w:before="0" w:line="276" w:lineRule="auto"/>
       </w:pPr>
-      <w:hyperlink w:history="1" r:id="rId5-l05ig50lsobert449up">
+      <w:hyperlink w:history="1" r:id="rIdcnmzwux5l_prtamqis1a3">
         <w:r>
           <w:rPr>
             <w:color w:val="1155CC"/>
@@ -24396,7 +24612,7 @@
       <w:tr>
         <w:trPr>
           <w:cantSplit/>
-          <w:trHeight w:val="300" w:hRule="atLeast"/>
+          <w:trHeight w:val="240" w:hRule="atLeast"/>
         </w:trPr>
         <w:tc>
           <w:tcPr>
@@ -24551,6 +24767,18 @@
         </w:tc>
       </w:tr>
     </w:tbl>
+    <w:p>
+      <w:pPr>
+        <w:spacing w:after="0" w:before="0" w:line="24" w:lineRule="exact"/>
+      </w:pPr>
+      <w:r>
+        <w:rPr>
+          <w:sz w:val="2"/>
+          <w:szCs w:val="2"/>
+        </w:rPr>
+        <w:t xml:space="preserve"/>
+      </w:r>
+    </w:p>
     <w:tbl>
       <w:tblPr>
         <w:tblW w:type="dxa" w:w="9360"/>
@@ -24676,7 +24904,7 @@
       <w:tr>
         <w:trPr>
           <w:cantSplit/>
-          <w:trHeight w:val="380" w:hRule="atLeast"/>
+          <w:trHeight w:val="320" w:hRule="atLeast"/>
         </w:trPr>
         <w:tc>
           <w:tcPr>
@@ -25040,7 +25268,7 @@
         <w:keepLines/>
         <w:spacing w:after="60" w:before="0" w:line="276" w:lineRule="auto"/>
       </w:pPr>
-      <w:hyperlink w:history="1" r:id="rIdup9tdj_4ml4owqfv7ohdf">
+      <w:hyperlink w:history="1" r:id="rIddfrhsspuloqzvtqjuhrj1">
         <w:r>
           <w:rPr>
             <w:color w:val="1155CC"/>
@@ -25057,7 +25285,7 @@
         <w:keepLines/>
         <w:spacing w:after="60" w:before="0" w:line="276" w:lineRule="auto"/>
       </w:pPr>
-      <w:hyperlink w:history="1" r:id="rIdu9lmm84rprgpuidig3oc4">
+      <w:hyperlink w:history="1" r:id="rIdoneh9ldhorjpn-7ox7cvv">
         <w:r>
           <w:rPr>
             <w:color w:val="1155CC"/>
@@ -25281,6 +25509,18 @@
         </w:tc>
       </w:tr>
     </w:tbl>
+    <w:p>
+      <w:pPr>
+        <w:spacing w:after="0" w:before="0" w:line="24" w:lineRule="exact"/>
+      </w:pPr>
+      <w:r>
+        <w:rPr>
+          <w:sz w:val="2"/>
+          <w:szCs w:val="2"/>
+        </w:rPr>
+        <w:t xml:space="preserve"/>
+      </w:r>
+    </w:p>
     <w:tbl>
       <w:tblPr>
         <w:tblW w:type="dxa" w:w="9360"/>
@@ -25595,7 +25835,7 @@
         </w:rPr>
         <w:t xml:space="preserve"> at http://</w:t>
       </w:r>
-      <w:hyperlink w:history="1" r:id="rIdgwqbzuvlo-mw6fdi-sfhb">
+      <w:hyperlink w:history="1" r:id="rIdwmfb5850nm6h0zufq_ssc">
         <w:r>
           <w:rPr>
             <w:color w:val="1155CC"/>
@@ -25867,7 +26107,7 @@
         <w:keepLines/>
         <w:spacing w:after="60" w:before="0" w:line="276" w:lineRule="auto"/>
       </w:pPr>
-      <w:hyperlink w:history="1" r:id="rIdi7ge-ytnoitlf_btgt-sr">
+      <w:hyperlink w:history="1" r:id="rIduszhl5wsaqhrz-kd98pg0">
         <w:r>
           <w:rPr>
             <w:color w:val="1155CC"/>
@@ -25884,7 +26124,7 @@
         <w:keepLines/>
         <w:spacing w:after="60" w:before="0" w:line="276" w:lineRule="auto"/>
       </w:pPr>
-      <w:hyperlink w:history="1" r:id="rIdhrhir7y2hauceet0z7dvt">
+      <w:hyperlink w:history="1" r:id="rIdp6epxafdvzrtynqiydoea">
         <w:r>
           <w:rPr>
             <w:color w:val="1155CC"/>
@@ -26108,6 +26348,18 @@
         </w:tc>
       </w:tr>
     </w:tbl>
+    <w:p>
+      <w:pPr>
+        <w:spacing w:after="0" w:before="0" w:line="24" w:lineRule="exact"/>
+      </w:pPr>
+      <w:r>
+        <w:rPr>
+          <w:sz w:val="2"/>
+          <w:szCs w:val="2"/>
+        </w:rPr>
+        <w:t xml:space="preserve"/>
+      </w:r>
+    </w:p>
     <w:tbl>
       <w:tblPr>
         <w:tblW w:type="dxa" w:w="9360"/>
@@ -26585,7 +26837,7 @@
         <w:keepLines/>
         <w:spacing w:after="60" w:before="0" w:line="276" w:lineRule="auto"/>
       </w:pPr>
-      <w:hyperlink w:history="1" r:id="rId4wbmu1ynfugpehibylvbv">
+      <w:hyperlink w:history="1" r:id="rId-bgcnev2gryvwpqmonwq5">
         <w:r>
           <w:rPr>
             <w:color w:val="1155CC"/>
@@ -26602,7 +26854,7 @@
         <w:keepLines/>
         <w:spacing w:after="60" w:before="0" w:line="276" w:lineRule="auto"/>
       </w:pPr>
-      <w:hyperlink w:history="1" r:id="rIdbxb35r3f8yyk1axnfcmqa">
+      <w:hyperlink w:history="1" r:id="rId1xgawg3u-xnyh-x9_exz5">
         <w:r>
           <w:rPr>
             <w:color w:val="1155CC"/>
@@ -26826,6 +27078,18 @@
         </w:tc>
       </w:tr>
     </w:tbl>
+    <w:p>
+      <w:pPr>
+        <w:spacing w:after="0" w:before="0" w:line="24" w:lineRule="exact"/>
+      </w:pPr>
+      <w:r>
+        <w:rPr>
+          <w:sz w:val="2"/>
+          <w:szCs w:val="2"/>
+        </w:rPr>
+        <w:t xml:space="preserve"/>
+      </w:r>
+    </w:p>
     <w:tbl>
       <w:tblPr>
         <w:tblW w:type="dxa" w:w="9360"/>
@@ -27262,7 +27526,7 @@
       <w:tr>
         <w:trPr>
           <w:cantSplit/>
-          <w:trHeight w:val="572" w:hRule="atLeast"/>
+          <w:trHeight w:val="594" w:hRule="atLeast"/>
         </w:trPr>
         <w:tc>
           <w:tcPr>
@@ -27423,7 +27687,7 @@
         <w:keepLines/>
         <w:spacing w:after="60" w:before="0" w:line="276" w:lineRule="auto"/>
       </w:pPr>
-      <w:hyperlink w:history="1" r:id="rIdtezx5ajcvfrnchlxkm-sz">
+      <w:hyperlink w:history="1" r:id="rIdx9dxr9jzcnjg-hgc-fenm">
         <w:r>
           <w:rPr>
             <w:color w:val="1155CC"/>
@@ -27440,7 +27704,7 @@
         <w:keepLines/>
         <w:spacing w:after="60" w:before="0" w:line="276" w:lineRule="auto"/>
       </w:pPr>
-      <w:hyperlink w:history="1" r:id="rId9tbw1wr7vfglqltrgf7tn">
+      <w:hyperlink w:history="1" r:id="rIdv74xv934ovu4ofvmb72ko">
         <w:r>
           <w:rPr>
             <w:color w:val="1155CC"/>
@@ -27509,7 +27773,7 @@
       <w:tr>
         <w:trPr>
           <w:cantSplit/>
-          <w:trHeight w:val="572" w:hRule="atLeast"/>
+          <w:trHeight w:val="594" w:hRule="atLeast"/>
         </w:trPr>
         <w:tc>
           <w:tcPr>
@@ -27664,6 +27928,18 @@
         </w:tc>
       </w:tr>
     </w:tbl>
+    <w:p>
+      <w:pPr>
+        <w:spacing w:after="0" w:before="0" w:line="24" w:lineRule="exact"/>
+      </w:pPr>
+      <w:r>
+        <w:rPr>
+          <w:sz w:val="2"/>
+          <w:szCs w:val="2"/>
+        </w:rPr>
+        <w:t xml:space="preserve"/>
+      </w:r>
+    </w:p>
     <w:tbl>
       <w:tblPr>
         <w:tblW w:type="dxa" w:w="9360"/>
@@ -27789,7 +28065,7 @@
       <w:tr>
         <w:trPr>
           <w:cantSplit/>
-          <w:trHeight w:val="380" w:hRule="atLeast"/>
+          <w:trHeight w:val="335" w:hRule="atLeast"/>
         </w:trPr>
         <w:tc>
           <w:tcPr>
@@ -28068,7 +28344,7 @@
         <w:keepLines/>
         <w:spacing w:after="60" w:before="0" w:line="276" w:lineRule="auto"/>
       </w:pPr>
-      <w:hyperlink w:history="1" r:id="rIdqocwafmlp67prn2afyl7b">
+      <w:hyperlink w:history="1" r:id="rIdwlrmr2e3__0rng3xqvv-i">
         <w:r>
           <w:rPr>
             <w:color w:val="1155CC"/>
@@ -28085,7 +28361,7 @@
         <w:keepLines/>
         <w:spacing w:after="60" w:before="0" w:line="276" w:lineRule="auto"/>
       </w:pPr>
-      <w:hyperlink w:history="1" r:id="rIdyyuhu8szj6ki41cgs7rko">
+      <w:hyperlink w:history="1" r:id="rIdqptynaaf0jpi3nu4vbusq">
         <w:r>
           <w:rPr>
             <w:color w:val="1155CC"/>
@@ -28309,6 +28585,18 @@
         </w:tc>
       </w:tr>
     </w:tbl>
+    <w:p>
+      <w:pPr>
+        <w:spacing w:after="0" w:before="0" w:line="24" w:lineRule="exact"/>
+      </w:pPr>
+      <w:r>
+        <w:rPr>
+          <w:sz w:val="2"/>
+          <w:szCs w:val="2"/>
+        </w:rPr>
+        <w:t xml:space="preserve"/>
+      </w:r>
+    </w:p>
     <w:tbl>
       <w:tblPr>
         <w:tblW w:type="dxa" w:w="9360"/>
@@ -28728,7 +29016,7 @@
         </w:rPr>
         <w:t xml:space="preserve">Later on, when you have time, sit down with the </w:t>
       </w:r>
-      <w:hyperlink w:history="1" r:id="rIdyjgxlgwrsfe81wbwdflfn">
+      <w:hyperlink w:history="1" r:id="rIdrzwk81fcdlifrcswzf8l_">
         <w:r>
           <w:rPr>
             <w:color w:val="1155CC"/>
@@ -28749,7 +29037,7 @@
         </w:rPr>
         <w:t xml:space="preserve"> and see if you can figure out what need(s) you were in pain about. Translate your judgment words into need words. As usual, I suggest that you limit the words you use to those on the </w:t>
       </w:r>
-      <w:hyperlink w:history="1" r:id="rIdvfryk7khzq_b2_s7xwzni">
+      <w:hyperlink w:history="1" r:id="rIdh7wfplejulqg0-a8ay53l">
         <w:r>
           <w:rPr>
             <w:color w:val="1155CC"/>
@@ -28945,7 +29233,7 @@
         <w:keepLines/>
         <w:spacing w:after="60" w:before="0" w:line="276" w:lineRule="auto"/>
       </w:pPr>
-      <w:hyperlink w:history="1" r:id="rIdncybsjq7jefoezfdbtzik">
+      <w:hyperlink w:history="1" r:id="rIdalfte90csln49nocpql1_">
         <w:r>
           <w:rPr>
             <w:color w:val="1155CC"/>
@@ -28962,7 +29250,7 @@
         <w:keepLines/>
         <w:spacing w:after="60" w:before="0" w:line="276" w:lineRule="auto"/>
       </w:pPr>
-      <w:hyperlink w:history="1" r:id="rIdy9u6oyperljpkzudhhc0q">
+      <w:hyperlink w:history="1" r:id="rIdl1tsc9ef_phjok9fytlso">
         <w:r>
           <w:rPr>
             <w:color w:val="1155CC"/>
@@ -29186,6 +29474,18 @@
         </w:tc>
       </w:tr>
     </w:tbl>
+    <w:p>
+      <w:pPr>
+        <w:spacing w:after="0" w:before="0" w:line="24" w:lineRule="exact"/>
+      </w:pPr>
+      <w:r>
+        <w:rPr>
+          <w:sz w:val="2"/>
+          <w:szCs w:val="2"/>
+        </w:rPr>
+        <w:t xml:space="preserve"/>
+      </w:r>
+    </w:p>
     <w:tbl>
       <w:tblPr>
         <w:tblW w:type="dxa" w:w="9360"/>
@@ -29767,7 +30067,7 @@
         <w:keepLines/>
         <w:spacing w:after="60" w:before="0" w:line="276" w:lineRule="auto"/>
       </w:pPr>
-      <w:hyperlink w:history="1" r:id="rIdl9unsbaezdbtkrbb4jrf4">
+      <w:hyperlink w:history="1" r:id="rIdansbaxpodioonptqwwqtv">
         <w:r>
           <w:rPr>
             <w:color w:val="1155CC"/>
@@ -29784,7 +30084,7 @@
         <w:keepLines/>
         <w:spacing w:after="60" w:before="0" w:line="276" w:lineRule="auto"/>
       </w:pPr>
-      <w:hyperlink w:history="1" r:id="rIdmughemi7ydxdco9nhp_qc">
+      <w:hyperlink w:history="1" r:id="rIdqu2obbppbn4ny_egraxbm">
         <w:r>
           <w:rPr>
             <w:color w:val="1155CC"/>
@@ -30008,6 +30308,18 @@
         </w:tc>
       </w:tr>
     </w:tbl>
+    <w:p>
+      <w:pPr>
+        <w:spacing w:after="0" w:before="0" w:line="24" w:lineRule="exact"/>
+      </w:pPr>
+      <w:r>
+        <w:rPr>
+          <w:sz w:val="2"/>
+          <w:szCs w:val="2"/>
+        </w:rPr>
+        <w:t xml:space="preserve"/>
+      </w:r>
+    </w:p>
     <w:tbl>
       <w:tblPr>
         <w:tblW w:type="dxa" w:w="9360"/>
@@ -30476,7 +30788,7 @@
       <w:tr>
         <w:trPr>
           <w:cantSplit/>
-          <w:trHeight w:val="423" w:hRule="atLeast"/>
+          <w:trHeight w:val="453" w:hRule="atLeast"/>
         </w:trPr>
         <w:tc>
           <w:tcPr>
@@ -30581,7 +30893,7 @@
         <w:keepLines/>
         <w:spacing w:after="60" w:before="0" w:line="276" w:lineRule="auto"/>
       </w:pPr>
-      <w:hyperlink w:history="1" r:id="rIdighvpxurt2nfww27vshz7">
+      <w:hyperlink w:history="1" r:id="rIdfer1kyxb8ihcrbgvuv4vh">
         <w:r>
           <w:rPr>
             <w:color w:val="1155CC"/>
@@ -30598,7 +30910,7 @@
         <w:keepLines/>
         <w:spacing w:after="60" w:before="0" w:line="276" w:lineRule="auto"/>
       </w:pPr>
-      <w:hyperlink w:history="1" r:id="rId8bj4y0pizmpbyuuilfhg6">
+      <w:hyperlink w:history="1" r:id="rIdzz6rh0wuiphtdxb1lji5b">
         <w:r>
           <w:rPr>
             <w:color w:val="1155CC"/>
@@ -30667,7 +30979,7 @@
       <w:tr>
         <w:trPr>
           <w:cantSplit/>
-          <w:trHeight w:val="423" w:hRule="atLeast"/>
+          <w:trHeight w:val="453" w:hRule="atLeast"/>
         </w:trPr>
         <w:tc>
           <w:tcPr>
@@ -30822,6 +31134,18 @@
         </w:tc>
       </w:tr>
     </w:tbl>
+    <w:p>
+      <w:pPr>
+        <w:spacing w:after="0" w:before="0" w:line="24" w:lineRule="exact"/>
+      </w:pPr>
+      <w:r>
+        <w:rPr>
+          <w:sz w:val="2"/>
+          <w:szCs w:val="2"/>
+        </w:rPr>
+        <w:t xml:space="preserve"/>
+      </w:r>
+    </w:p>
     <w:tbl>
       <w:tblPr>
         <w:tblW w:type="dxa" w:w="9360"/>
@@ -30947,7 +31271,7 @@
       <w:tr>
         <w:trPr>
           <w:cantSplit/>
-          <w:trHeight w:val="380" w:hRule="atLeast"/>
+          <w:trHeight w:val="320" w:hRule="atLeast"/>
         </w:trPr>
         <w:tc>
           <w:tcPr>
@@ -31230,7 +31554,7 @@
         <w:keepLines/>
         <w:spacing w:after="60" w:before="0" w:line="276" w:lineRule="auto"/>
       </w:pPr>
-      <w:hyperlink w:history="1" r:id="rIdljwn0lg3cttx38-4694uj">
+      <w:hyperlink w:history="1" r:id="rIdydr_mltswonavmum4yaok">
         <w:r>
           <w:rPr>
             <w:color w:val="1155CC"/>
@@ -31247,7 +31571,7 @@
         <w:keepLines/>
         <w:spacing w:after="60" w:before="0" w:line="276" w:lineRule="auto"/>
       </w:pPr>
-      <w:hyperlink w:history="1" r:id="rIdr0hgims58m2vxalsvllhl">
+      <w:hyperlink w:history="1" r:id="rIdo1tmj0asyz-xfsfx0ncmo">
         <w:r>
           <w:rPr>
             <w:color w:val="1155CC"/>
@@ -31471,6 +31795,18 @@
         </w:tc>
       </w:tr>
     </w:tbl>
+    <w:p>
+      <w:pPr>
+        <w:spacing w:after="0" w:before="0" w:line="24" w:lineRule="exact"/>
+      </w:pPr>
+      <w:r>
+        <w:rPr>
+          <w:sz w:val="2"/>
+          <w:szCs w:val="2"/>
+        </w:rPr>
+        <w:t xml:space="preserve"/>
+      </w:r>
+    </w:p>
     <w:tbl>
       <w:tblPr>
         <w:tblW w:type="dxa" w:w="9360"/>
@@ -32004,7 +32340,7 @@
         <w:keepLines/>
         <w:spacing w:after="60" w:before="0" w:line="276" w:lineRule="auto"/>
       </w:pPr>
-      <w:hyperlink w:history="1" r:id="rIdz1vc1lu9mo2pv4nkww-fy">
+      <w:hyperlink w:history="1" r:id="rIdvvfxf4rqjwh1r6vutk8lu">
         <w:r>
           <w:rPr>
             <w:color w:val="1155CC"/>
@@ -32021,7 +32357,7 @@
         <w:keepLines/>
         <w:spacing w:after="60" w:before="0" w:line="276" w:lineRule="auto"/>
       </w:pPr>
-      <w:hyperlink w:history="1" r:id="rId6pl6l5sfdba5pjgbql3__">
+      <w:hyperlink w:history="1" r:id="rIdaz_32f3elonv4htndai4c">
         <w:r>
           <w:rPr>
             <w:color w:val="1155CC"/>
@@ -32245,6 +32581,18 @@
         </w:tc>
       </w:tr>
     </w:tbl>
+    <w:p>
+      <w:pPr>
+        <w:spacing w:after="0" w:before="0" w:line="24" w:lineRule="exact"/>
+      </w:pPr>
+      <w:r>
+        <w:rPr>
+          <w:sz w:val="2"/>
+          <w:szCs w:val="2"/>
+        </w:rPr>
+        <w:t xml:space="preserve"/>
+      </w:r>
+    </w:p>
     <w:tbl>
       <w:tblPr>
         <w:tblW w:type="dxa" w:w="9360"/>
@@ -32645,7 +32993,7 @@
       <w:tr>
         <w:trPr>
           <w:cantSplit/>
-          <w:trHeight w:val="300" w:hRule="atLeast"/>
+          <w:trHeight w:val="240" w:hRule="atLeast"/>
         </w:trPr>
         <w:tc>
           <w:tcPr>
@@ -32902,7 +33250,7 @@
         <w:keepLines/>
         <w:spacing w:after="60" w:before="0" w:line="276" w:lineRule="auto"/>
       </w:pPr>
-      <w:hyperlink w:history="1" r:id="rIdvl-ttr5ighczj-pj8_e9y">
+      <w:hyperlink w:history="1" r:id="rIdaaiwai-iumuplvd5s2tps">
         <w:r>
           <w:rPr>
             <w:color w:val="1155CC"/>
@@ -32919,7 +33267,7 @@
         <w:keepLines/>
         <w:spacing w:after="60" w:before="0" w:line="276" w:lineRule="auto"/>
       </w:pPr>
-      <w:hyperlink w:history="1" r:id="rIdvsmakztk1rso9n8cncphe">
+      <w:hyperlink w:history="1" r:id="rIdxhiyrvufdewxtbix09qci">
         <w:r>
           <w:rPr>
             <w:color w:val="1155CC"/>
@@ -32988,7 +33336,7 @@
       <w:tr>
         <w:trPr>
           <w:cantSplit/>
-          <w:trHeight w:val="300" w:hRule="atLeast"/>
+          <w:trHeight w:val="240" w:hRule="atLeast"/>
         </w:trPr>
         <w:tc>
           <w:tcPr>
@@ -33143,6 +33491,18 @@
         </w:tc>
       </w:tr>
     </w:tbl>
+    <w:p>
+      <w:pPr>
+        <w:spacing w:after="0" w:before="0" w:line="24" w:lineRule="exact"/>
+      </w:pPr>
+      <w:r>
+        <w:rPr>
+          <w:sz w:val="2"/>
+          <w:szCs w:val="2"/>
+        </w:rPr>
+        <w:t xml:space="preserve"/>
+      </w:r>
+    </w:p>
     <w:tbl>
       <w:tblPr>
         <w:tblW w:type="dxa" w:w="9360"/>
@@ -33268,7 +33628,7 @@
       <w:tr>
         <w:trPr>
           <w:cantSplit/>
-          <w:trHeight w:val="380" w:hRule="atLeast"/>
+          <w:trHeight w:val="320" w:hRule="atLeast"/>
         </w:trPr>
         <w:tc>
           <w:tcPr>
@@ -33495,7 +33855,7 @@
       <w:tr>
         <w:trPr>
           <w:cantSplit/>
-          <w:trHeight w:val="300" w:hRule="atLeast"/>
+          <w:trHeight w:val="240" w:hRule="atLeast"/>
         </w:trPr>
         <w:tc>
           <w:tcPr>
@@ -33772,7 +34132,7 @@
       <w:tr>
         <w:trPr>
           <w:cantSplit/>
-          <w:trHeight w:val="300" w:hRule="atLeast"/>
+          <w:trHeight w:val="240" w:hRule="atLeast"/>
         </w:trPr>
         <w:tc>
           <w:tcPr>
@@ -33841,7 +34201,7 @@
         <w:keepLines/>
         <w:spacing w:after="60" w:before="0" w:line="276" w:lineRule="auto"/>
       </w:pPr>
-      <w:hyperlink w:history="1" r:id="rIdt54qdjfa1usd6ier7rp9f">
+      <w:hyperlink w:history="1" r:id="rIdhsfdyh2ncrxxtx9hijn2v">
         <w:r>
           <w:rPr>
             <w:color w:val="1155CC"/>
@@ -33858,7 +34218,7 @@
         <w:keepLines/>
         <w:spacing w:after="60" w:before="0" w:line="276" w:lineRule="auto"/>
       </w:pPr>
-      <w:hyperlink w:history="1" r:id="rId3srdbpaekfapo8lvlt-qv">
+      <w:hyperlink w:history="1" r:id="rIdolkykf9m3ab6an_n6iojp">
         <w:r>
           <w:rPr>
             <w:color w:val="1155CC"/>
@@ -33927,7 +34287,7 @@
       <w:tr>
         <w:trPr>
           <w:cantSplit/>
-          <w:trHeight w:val="300" w:hRule="atLeast"/>
+          <w:trHeight w:val="240" w:hRule="atLeast"/>
         </w:trPr>
         <w:tc>
           <w:tcPr>
@@ -34082,6 +34442,18 @@
         </w:tc>
       </w:tr>
     </w:tbl>
+    <w:p>
+      <w:pPr>
+        <w:spacing w:after="0" w:before="0" w:line="24" w:lineRule="exact"/>
+      </w:pPr>
+      <w:r>
+        <w:rPr>
+          <w:sz w:val="2"/>
+          <w:szCs w:val="2"/>
+        </w:rPr>
+        <w:t xml:space="preserve"/>
+      </w:r>
+    </w:p>
     <w:tbl>
       <w:tblPr>
         <w:tblW w:type="dxa" w:w="9360"/>
@@ -34207,7 +34579,7 @@
       <w:tr>
         <w:trPr>
           <w:cantSplit/>
-          <w:trHeight w:val="380" w:hRule="atLeast"/>
+          <w:trHeight w:val="320" w:hRule="atLeast"/>
         </w:trPr>
         <w:tc>
           <w:tcPr>
@@ -34583,7 +34955,7 @@
         <w:keepLines/>
         <w:spacing w:after="60" w:before="0" w:line="276" w:lineRule="auto"/>
       </w:pPr>
-      <w:hyperlink w:history="1" r:id="rIdtq7q6aquomcckp82kiabq">
+      <w:hyperlink w:history="1" r:id="rIdsm1pjw76r1kcjys6q1oyc">
         <w:r>
           <w:rPr>
             <w:color w:val="1155CC"/>
@@ -34600,7 +34972,7 @@
         <w:keepLines/>
         <w:spacing w:after="60" w:before="0" w:line="276" w:lineRule="auto"/>
       </w:pPr>
-      <w:hyperlink w:history="1" r:id="rIdxxcmzisboazx0eff2zmu9">
+      <w:hyperlink w:history="1" r:id="rIdf7qxzezxortpkfse0sfyt">
         <w:r>
           <w:rPr>
             <w:color w:val="1155CC"/>
@@ -34824,6 +35196,18 @@
         </w:tc>
       </w:tr>
     </w:tbl>
+    <w:p>
+      <w:pPr>
+        <w:spacing w:after="0" w:before="0" w:line="24" w:lineRule="exact"/>
+      </w:pPr>
+      <w:r>
+        <w:rPr>
+          <w:sz w:val="2"/>
+          <w:szCs w:val="2"/>
+        </w:rPr>
+        <w:t xml:space="preserve"/>
+      </w:r>
+    </w:p>
     <w:tbl>
       <w:tblPr>
         <w:tblW w:type="dxa" w:w="9360"/>
@@ -35280,7 +35664,7 @@
         <w:keepLines/>
         <w:spacing w:after="60" w:before="0" w:line="276" w:lineRule="auto"/>
       </w:pPr>
-      <w:hyperlink w:history="1" r:id="rIdedakv9dnsf5huamwt3n_y">
+      <w:hyperlink w:history="1" r:id="rIdjqvqizjpicdenc9wvdemx">
         <w:r>
           <w:rPr>
             <w:color w:val="1155CC"/>
@@ -35297,7 +35681,7 @@
         <w:keepLines/>
         <w:spacing w:after="60" w:before="0" w:line="276" w:lineRule="auto"/>
       </w:pPr>
-      <w:hyperlink w:history="1" r:id="rId4223qwfgkz0pwtszmda_q">
+      <w:hyperlink w:history="1" r:id="rIdxtexyzuhhsh6atqv6wkvf">
         <w:r>
           <w:rPr>
             <w:color w:val="1155CC"/>
@@ -35521,6 +35905,18 @@
         </w:tc>
       </w:tr>
     </w:tbl>
+    <w:p>
+      <w:pPr>
+        <w:spacing w:after="0" w:before="0" w:line="24" w:lineRule="exact"/>
+      </w:pPr>
+      <w:r>
+        <w:rPr>
+          <w:sz w:val="2"/>
+          <w:szCs w:val="2"/>
+        </w:rPr>
+        <w:t xml:space="preserve"/>
+      </w:r>
+    </w:p>
     <w:tbl>
       <w:tblPr>
         <w:tblW w:type="dxa" w:w="9360"/>
@@ -36045,7 +36441,7 @@
         <w:keepLines/>
         <w:spacing w:after="60" w:before="0" w:line="276" w:lineRule="auto"/>
       </w:pPr>
-      <w:hyperlink w:history="1" r:id="rId3jkermgmr5ka7prstsbpw">
+      <w:hyperlink w:history="1" r:id="rIdvqrowwhkto0xu1hpzu1zv">
         <w:r>
           <w:rPr>
             <w:color w:val="1155CC"/>
@@ -36062,7 +36458,7 @@
         <w:keepLines/>
         <w:spacing w:after="60" w:before="0" w:line="276" w:lineRule="auto"/>
       </w:pPr>
-      <w:hyperlink w:history="1" r:id="rIdqkquxtryvq4atu1b14nhp">
+      <w:hyperlink w:history="1" r:id="rIdvln6sq9wh3wls3e49mzqn">
         <w:r>
           <w:rPr>
             <w:color w:val="1155CC"/>
@@ -36131,7 +36527,7 @@
       <w:tr>
         <w:trPr>
           <w:cantSplit/>
-          <w:trHeight w:val="1218" w:hRule="atLeast"/>
+          <w:trHeight w:val="1246" w:hRule="atLeast"/>
         </w:trPr>
         <w:tc>
           <w:tcPr>
@@ -36286,6 +36682,18 @@
         </w:tc>
       </w:tr>
     </w:tbl>
+    <w:p>
+      <w:pPr>
+        <w:spacing w:after="0" w:before="0" w:line="24" w:lineRule="exact"/>
+      </w:pPr>
+      <w:r>
+        <w:rPr>
+          <w:sz w:val="2"/>
+          <w:szCs w:val="2"/>
+        </w:rPr>
+        <w:t xml:space="preserve"/>
+      </w:r>
+    </w:p>
     <w:tbl>
       <w:tblPr>
         <w:tblW w:type="dxa" w:w="9360"/>
@@ -36411,7 +36819,7 @@
       <w:tr>
         <w:trPr>
           <w:cantSplit/>
-          <w:trHeight w:val="380" w:hRule="atLeast"/>
+          <w:trHeight w:val="352" w:hRule="atLeast"/>
         </w:trPr>
         <w:tc>
           <w:tcPr>
@@ -37292,7 +37700,7 @@
         <w:keepLines/>
         <w:spacing w:after="60" w:before="0" w:line="276" w:lineRule="auto"/>
       </w:pPr>
-      <w:hyperlink w:history="1" r:id="rIdx99hxli_f8ohlbalrxh0w">
+      <w:hyperlink w:history="1" r:id="rIddoy6vv7idknnesldzwjvx">
         <w:r>
           <w:rPr>
             <w:color w:val="1155CC"/>
@@ -37309,7 +37717,7 @@
         <w:keepLines/>
         <w:spacing w:after="60" w:before="0" w:line="276" w:lineRule="auto"/>
       </w:pPr>
-      <w:hyperlink w:history="1" r:id="rIdxuxwwsityie06teen-kmi">
+      <w:hyperlink w:history="1" r:id="rIdf7c02l865jzqdyqjp_rqv">
         <w:r>
           <w:rPr>
             <w:color w:val="1155CC"/>
@@ -37533,6 +37941,18 @@
         </w:tc>
       </w:tr>
     </w:tbl>
+    <w:p>
+      <w:pPr>
+        <w:spacing w:after="0" w:before="0" w:line="24" w:lineRule="exact"/>
+      </w:pPr>
+      <w:r>
+        <w:rPr>
+          <w:sz w:val="2"/>
+          <w:szCs w:val="2"/>
+        </w:rPr>
+        <w:t xml:space="preserve"/>
+      </w:r>
+    </w:p>
     <w:tbl>
       <w:tblPr>
         <w:tblW w:type="dxa" w:w="9360"/>
@@ -38102,7 +38522,7 @@
         <w:keepLines/>
         <w:spacing w:after="60" w:before="0" w:line="276" w:lineRule="auto"/>
       </w:pPr>
-      <w:hyperlink w:history="1" r:id="rIdvldx4v545pf4l3mmizfmg">
+      <w:hyperlink w:history="1" r:id="rIdmu1ztvrowttjsgohltjh9">
         <w:r>
           <w:rPr>
             <w:color w:val="1155CC"/>
@@ -38119,7 +38539,7 @@
         <w:keepLines/>
         <w:spacing w:after="60" w:before="0" w:line="276" w:lineRule="auto"/>
       </w:pPr>
-      <w:hyperlink w:history="1" r:id="rIdlplghrmke3nmlyaeizlec">
+      <w:hyperlink w:history="1" r:id="rIdko51hxsotfmp62fn3q5_t">
         <w:r>
           <w:rPr>
             <w:color w:val="1155CC"/>
@@ -38343,6 +38763,18 @@
         </w:tc>
       </w:tr>
     </w:tbl>
+    <w:p>
+      <w:pPr>
+        <w:spacing w:after="0" w:before="0" w:line="24" w:lineRule="exact"/>
+      </w:pPr>
+      <w:r>
+        <w:rPr>
+          <w:sz w:val="2"/>
+          <w:szCs w:val="2"/>
+        </w:rPr>
+        <w:t xml:space="preserve"/>
+      </w:r>
+    </w:p>
     <w:tbl>
       <w:tblPr>
         <w:tblW w:type="dxa" w:w="9360"/>
@@ -38759,7 +39191,7 @@
       <w:tr>
         <w:trPr>
           <w:cantSplit/>
-          <w:trHeight w:val="300" w:hRule="atLeast"/>
+          <w:trHeight w:val="240" w:hRule="atLeast"/>
         </w:trPr>
         <w:tc>
           <w:tcPr>
@@ -38992,7 +39424,7 @@
         <w:keepLines/>
         <w:spacing w:after="60" w:before="0" w:line="276" w:lineRule="auto"/>
       </w:pPr>
-      <w:hyperlink w:history="1" r:id="rId_-t3luactahkx3bfve2u3">
+      <w:hyperlink w:history="1" r:id="rIduwmodo65p3xt62mnpchae">
         <w:r>
           <w:rPr>
             <w:color w:val="1155CC"/>
@@ -39009,7 +39441,7 @@
         <w:keepLines/>
         <w:spacing w:after="60" w:before="0" w:line="276" w:lineRule="auto"/>
       </w:pPr>
-      <w:hyperlink w:history="1" r:id="rIdxztb6nzgz20-lstuvmgcn">
+      <w:hyperlink w:history="1" r:id="rId9-lrxat_aw4_sq76cvahc">
         <w:r>
           <w:rPr>
             <w:color w:val="1155CC"/>
@@ -39078,7 +39510,7 @@
       <w:tr>
         <w:trPr>
           <w:cantSplit/>
-          <w:trHeight w:val="300" w:hRule="atLeast"/>
+          <w:trHeight w:val="240" w:hRule="atLeast"/>
         </w:trPr>
         <w:tc>
           <w:tcPr>
@@ -39233,6 +39665,18 @@
         </w:tc>
       </w:tr>
     </w:tbl>
+    <w:p>
+      <w:pPr>
+        <w:spacing w:after="0" w:before="0" w:line="24" w:lineRule="exact"/>
+      </w:pPr>
+      <w:r>
+        <w:rPr>
+          <w:sz w:val="2"/>
+          <w:szCs w:val="2"/>
+        </w:rPr>
+        <w:t xml:space="preserve"/>
+      </w:r>
+    </w:p>
     <w:tbl>
       <w:tblPr>
         <w:tblW w:type="dxa" w:w="9360"/>
@@ -39358,7 +39802,7 @@
       <w:tr>
         <w:trPr>
           <w:cantSplit/>
-          <w:trHeight w:val="380" w:hRule="atLeast"/>
+          <w:trHeight w:val="320" w:hRule="atLeast"/>
         </w:trPr>
         <w:tc>
           <w:tcPr>
@@ -39786,7 +40230,7 @@
         <w:keepLines/>
         <w:spacing w:after="60" w:before="0" w:line="276" w:lineRule="auto"/>
       </w:pPr>
-      <w:hyperlink w:history="1" r:id="rIdzahug5sgbqzqnfdvfbyag">
+      <w:hyperlink w:history="1" r:id="rIdemx1kxfmsqrxgqda6wtrt">
         <w:r>
           <w:rPr>
             <w:color w:val="1155CC"/>
@@ -39803,7 +40247,7 @@
         <w:keepLines/>
         <w:spacing w:after="60" w:before="0" w:line="276" w:lineRule="auto"/>
       </w:pPr>
-      <w:hyperlink w:history="1" r:id="rId7_ztvcdedoza4z4oy7hn1">
+      <w:hyperlink w:history="1" r:id="rIdtsbc4s8lhhgpodtk7lsid">
         <w:r>
           <w:rPr>
             <w:color w:val="1155CC"/>
@@ -40027,6 +40471,18 @@
         </w:tc>
       </w:tr>
     </w:tbl>
+    <w:p>
+      <w:pPr>
+        <w:spacing w:after="0" w:before="0" w:line="24" w:lineRule="exact"/>
+      </w:pPr>
+      <w:r>
+        <w:rPr>
+          <w:sz w:val="2"/>
+          <w:szCs w:val="2"/>
+        </w:rPr>
+        <w:t xml:space="preserve"/>
+      </w:r>
+    </w:p>
     <w:tbl>
       <w:tblPr>
         <w:tblW w:type="dxa" w:w="9360"/>
@@ -40540,7 +40996,7 @@
         <w:keepLines/>
         <w:spacing w:after="60" w:before="0" w:line="276" w:lineRule="auto"/>
       </w:pPr>
-      <w:hyperlink w:history="1" r:id="rIdg258u5vubm4rnnw8uxibn">
+      <w:hyperlink w:history="1" r:id="rIdlz9u9gpxs0lijq8_sbulx">
         <w:r>
           <w:rPr>
             <w:color w:val="1155CC"/>
@@ -40557,7 +41013,7 @@
         <w:keepLines/>
         <w:spacing w:after="60" w:before="0" w:line="276" w:lineRule="auto"/>
       </w:pPr>
-      <w:hyperlink w:history="1" r:id="rId7v_wyx2xi74ynodkilem7">
+      <w:hyperlink w:history="1" r:id="rIdzb_4-8dxhfysuf4tbkwz9">
         <w:r>
           <w:rPr>
             <w:color w:val="1155CC"/>
@@ -40781,6 +41237,18 @@
         </w:tc>
       </w:tr>
     </w:tbl>
+    <w:p>
+      <w:pPr>
+        <w:spacing w:after="0" w:before="0" w:line="24" w:lineRule="exact"/>
+      </w:pPr>
+      <w:r>
+        <w:rPr>
+          <w:sz w:val="2"/>
+          <w:szCs w:val="2"/>
+        </w:rPr>
+        <w:t xml:space="preserve"/>
+      </w:r>
+    </w:p>
     <w:tbl>
       <w:tblPr>
         <w:tblW w:type="dxa" w:w="9360"/>
@@ -41571,7 +42039,7 @@
         <w:keepLines/>
         <w:spacing w:after="60" w:before="0" w:line="276" w:lineRule="auto"/>
       </w:pPr>
-      <w:hyperlink w:history="1" r:id="rIdqbakzwfdujmsfjqelw7r_">
+      <w:hyperlink w:history="1" r:id="rIdnct4ehfptv-cgw1q_swvz">
         <w:r>
           <w:rPr>
             <w:color w:val="1155CC"/>
@@ -41588,7 +42056,7 @@
         <w:keepLines/>
         <w:spacing w:after="60" w:before="0" w:line="276" w:lineRule="auto"/>
       </w:pPr>
-      <w:hyperlink w:history="1" r:id="rIdzjeclkm2uncgjc-9rfd2j">
+      <w:hyperlink w:history="1" r:id="rIdahakb2ubfhiddzy_s0t8c">
         <w:r>
           <w:rPr>
             <w:color w:val="1155CC"/>
@@ -41812,6 +42280,18 @@
         </w:tc>
       </w:tr>
     </w:tbl>
+    <w:p>
+      <w:pPr>
+        <w:spacing w:after="0" w:before="0" w:line="24" w:lineRule="exact"/>
+      </w:pPr>
+      <w:r>
+        <w:rPr>
+          <w:sz w:val="2"/>
+          <w:szCs w:val="2"/>
+        </w:rPr>
+        <w:t xml:space="preserve"/>
+      </w:r>
+    </w:p>
     <w:tbl>
       <w:tblPr>
         <w:tblW w:type="dxa" w:w="9360"/>
@@ -42337,7 +42817,7 @@
         <w:keepLines/>
         <w:spacing w:after="60" w:before="0" w:line="276" w:lineRule="auto"/>
       </w:pPr>
-      <w:hyperlink w:history="1" r:id="rIdhg2dbgh5xseyeurecxclg">
+      <w:hyperlink w:history="1" r:id="rIdw9zh8szu2khbyqfwnxf-c">
         <w:r>
           <w:rPr>
             <w:color w:val="1155CC"/>
@@ -42354,7 +42834,7 @@
         <w:keepLines/>
         <w:spacing w:after="60" w:before="0" w:line="276" w:lineRule="auto"/>
       </w:pPr>
-      <w:hyperlink w:history="1" r:id="rIdlxmjohcgl7b2mbwmh72ge">
+      <w:hyperlink w:history="1" r:id="rId-orfzghnimqwaqs_y5bkb">
         <w:r>
           <w:rPr>
             <w:color w:val="1155CC"/>
@@ -42578,6 +43058,18 @@
         </w:tc>
       </w:tr>
     </w:tbl>
+    <w:p>
+      <w:pPr>
+        <w:spacing w:after="0" w:before="0" w:line="24" w:lineRule="exact"/>
+      </w:pPr>
+      <w:r>
+        <w:rPr>
+          <w:sz w:val="2"/>
+          <w:szCs w:val="2"/>
+        </w:rPr>
+        <w:t xml:space="preserve"/>
+      </w:r>
+    </w:p>
     <w:tbl>
       <w:tblPr>
         <w:tblW w:type="dxa" w:w="9360"/>
@@ -43088,7 +43580,7 @@
         <w:keepLines/>
         <w:spacing w:after="60" w:before="0" w:line="276" w:lineRule="auto"/>
       </w:pPr>
-      <w:hyperlink w:history="1" r:id="rIdl_rumh_-cuzaotxe-q1_h">
+      <w:hyperlink w:history="1" r:id="rIdhnnr1wc68lhm0fuogpsgt">
         <w:r>
           <w:rPr>
             <w:color w:val="1155CC"/>
@@ -43105,7 +43597,7 @@
         <w:keepLines/>
         <w:spacing w:after="60" w:before="0" w:line="276" w:lineRule="auto"/>
       </w:pPr>
-      <w:hyperlink w:history="1" r:id="rIdecg_nrccc5lkdraahjj-w">
+      <w:hyperlink w:history="1" r:id="rId3kczfcdx0ozpla3zwxhgu">
         <w:r>
           <w:rPr>
             <w:color w:val="1155CC"/>
@@ -43329,6 +43821,18 @@
         </w:tc>
       </w:tr>
     </w:tbl>
+    <w:p>
+      <w:pPr>
+        <w:spacing w:after="0" w:before="0" w:line="24" w:lineRule="exact"/>
+      </w:pPr>
+      <w:r>
+        <w:rPr>
+          <w:sz w:val="2"/>
+          <w:szCs w:val="2"/>
+        </w:rPr>
+        <w:t xml:space="preserve"/>
+      </w:r>
+    </w:p>
     <w:tbl>
       <w:tblPr>
         <w:tblW w:type="dxa" w:w="9360"/>

</xml_diff>

<commit_message>
Workbook: apply Thom's feedback (year, footer, empathy label, stray links, uniform boxes)
- Course year shown as 2026-27 (cover + footer) instead of 2026-2027
- Footer: drop the mid-dot between 'Course' and the year
- Rename 'Empathy hours' -> 'Empathy practice hours' (widened its column)
- Filter out stray, duplicated GCN join/access lines that leaked into the
  practice text under weeks 19-52 (Thom flagged Week 19 / Practice 2)
- Make every answer box a uniform single line (they grow when typed in Docs),
  instead of the old per-week auto-fit that varied box heights

Co-Authored-By: Claude Opus 4.8 (1M context) <noreply@anthropic.com>
</commit_message>
<xml_diff>
--- a/.local-workbook/The Compassion Course 2026-2027 Workbook.docx
+++ b/.local-workbook/The Compassion Course 2026-2027 Workbook.docx
@@ -94,7 +94,7 @@
           <w:sz w:val="30"/>
           <w:szCs w:val="30"/>
         </w:rPr>
-        <w:t xml:space="preserve">2026 – 2027</w:t>
+        <w:t xml:space="preserve">2026-27</w:t>
       </w:r>
     </w:p>
     <w:p>
@@ -579,7 +579,7 @@
         </w:rPr>
         <w:t xml:space="preserve">Keep a small journal with you throughout the day. Make 1 to 5 entries per day that include the description of an act or words spoken by someone and what need you imagine they were trying to meet. It is SUPER important to limit the words you use to those on the </w:t>
       </w:r>
-      <w:hyperlink w:history="1" r:id="rIdsf_bsn8a4bvbca7lrd2o-">
+      <w:hyperlink w:history="1" r:id="rIdocgx-uuq4oibbywpqudmt">
         <w:r>
           <w:rPr>
             <w:color w:val="1155CC"/>
@@ -658,7 +658,7 @@
       <w:tr>
         <w:trPr>
           <w:cantSplit/>
-          <w:trHeight w:val="300" w:hRule="atLeast"/>
+          <w:trHeight w:val="340" w:hRule="atLeast"/>
         </w:trPr>
         <w:tc>
           <w:tcPr>
@@ -721,7 +721,7 @@
         </w:rPr>
         <w:t xml:space="preserve">Think of someone who is close to you who is doing or saying something you don't like. See if you can figure out what need they are attempting to fulfill. Again, it is really important to limit the words you use to those on the </w:t>
       </w:r>
-      <w:hyperlink w:history="1" r:id="rIdlbnjrmebd0jusadxaizsm">
+      <w:hyperlink w:history="1" r:id="rIdfqvudtmit01q4gz9ks2c7">
         <w:r>
           <w:rPr>
             <w:color w:val="1155CC"/>
@@ -800,7 +800,7 @@
       <w:tr>
         <w:trPr>
           <w:cantSplit/>
-          <w:trHeight w:val="300" w:hRule="atLeast"/>
+          <w:trHeight w:val="340" w:hRule="atLeast"/>
         </w:trPr>
         <w:tc>
           <w:tcPr>
@@ -937,7 +937,7 @@
       <w:tr>
         <w:trPr>
           <w:cantSplit/>
-          <w:trHeight w:val="300" w:hRule="atLeast"/>
+          <w:trHeight w:val="340" w:hRule="atLeast"/>
         </w:trPr>
         <w:tc>
           <w:tcPr>
@@ -1016,7 +1016,7 @@
         </w:rPr>
         <w:t xml:space="preserve">Extended registration lasts for one week. To let someone know about the course you can use the following link: </w:t>
       </w:r>
-      <w:hyperlink w:history="1" r:id="rIdu320s6wh_zx7eo63h8gkz">
+      <w:hyperlink w:history="1" r:id="rId5rtd5p33cyzpq6r3ao-jb">
         <w:r>
           <w:rPr>
             <w:color w:val="1155CC"/>
@@ -1095,7 +1095,7 @@
       <w:tr>
         <w:trPr>
           <w:cantSplit/>
-          <w:trHeight w:val="300" w:hRule="atLeast"/>
+          <w:trHeight w:val="340" w:hRule="atLeast"/>
         </w:trPr>
         <w:tc>
           <w:tcPr>
@@ -1265,7 +1265,7 @@
       <w:tr>
         <w:trPr>
           <w:cantSplit/>
-          <w:trHeight w:val="380" w:hRule="atLeast"/>
+          <w:trHeight w:val="340" w:hRule="atLeast"/>
         </w:trPr>
         <w:tc>
           <w:tcPr>
@@ -1418,7 +1418,7 @@
         </w:rPr>
         <w:t xml:space="preserve">Keep a small journal with you throughout the day. Make 1 to 5 entries per day that include judgment words you said or were thinking of saying. Later on, when you have time, sit down with the </w:t>
       </w:r>
-      <w:hyperlink w:history="1" r:id="rIdy_jagparsazkxcsoc1kjl">
+      <w:hyperlink w:history="1" r:id="rIdcbtqqfk9zeragj7br8eff">
         <w:r>
           <w:rPr>
             <w:color w:val="1155CC"/>
@@ -1439,7 +1439,7 @@
         </w:rPr>
         <w:t xml:space="preserve"> and see if you can figure out what need of yours the judgment was (or is) related to. Remember, to successfully complete this exercise, limit the words you use to those on the </w:t>
       </w:r>
-      <w:hyperlink w:history="1" r:id="rId1dgco26xcpab-usjru8su">
+      <w:hyperlink w:history="1" r:id="rId990raxvxj4ezhqhpwda__">
         <w:r>
           <w:rPr>
             <w:color w:val="1155CC"/>
@@ -1518,7 +1518,7 @@
       <w:tr>
         <w:trPr>
           <w:cantSplit/>
-          <w:trHeight w:val="720" w:hRule="atLeast"/>
+          <w:trHeight w:val="340" w:hRule="atLeast"/>
         </w:trPr>
         <w:tc>
           <w:tcPr>
@@ -1581,7 +1581,7 @@
         </w:rPr>
         <w:t xml:space="preserve">Keep a small journal with you throughout the day. It could be a little book, a folded piece of paper or a napkin -anything you can write on. Make 1 to 5 entries per day that include judgment words spoken by someone. Later on, when you have time, sit down with the </w:t>
       </w:r>
-      <w:hyperlink w:history="1" r:id="rIdb3zhmxzuyqww7vtod0fz0">
+      <w:hyperlink w:history="1" r:id="rIda1u7z6wd-avb-j2lwo-7e">
         <w:r>
           <w:rPr>
             <w:color w:val="1155CC"/>
@@ -1602,7 +1602,7 @@
         </w:rPr>
         <w:t xml:space="preserve"> and see if you can figure out what need was unmet for them. Remember to limit the words you use to those on the </w:t>
       </w:r>
-      <w:hyperlink w:history="1" r:id="rId0wvskjiy4zzxyqdyegr3z">
+      <w:hyperlink w:history="1" r:id="rIdn9_imqshqvd3pzfsltepy">
         <w:r>
           <w:rPr>
             <w:color w:val="1155CC"/>
@@ -1681,7 +1681,7 @@
       <w:tr>
         <w:trPr>
           <w:cantSplit/>
-          <w:trHeight w:val="720" w:hRule="atLeast"/>
+          <w:trHeight w:val="340" w:hRule="atLeast"/>
         </w:trPr>
         <w:tc>
           <w:tcPr>
@@ -1802,7 +1802,7 @@
       <w:tr>
         <w:trPr>
           <w:cantSplit/>
-          <w:trHeight w:val="720" w:hRule="atLeast"/>
+          <w:trHeight w:val="340" w:hRule="atLeast"/>
         </w:trPr>
         <w:tc>
           <w:tcPr>
@@ -1972,7 +1972,7 @@
       <w:tr>
         <w:trPr>
           <w:cantSplit/>
-          <w:trHeight w:val="609" w:hRule="atLeast"/>
+          <w:trHeight w:val="340" w:hRule="atLeast"/>
         </w:trPr>
         <w:tc>
           <w:tcPr>
@@ -2141,7 +2141,7 @@
         </w:rPr>
         <w:t xml:space="preserve">Later on, when you have time, sit down with the </w:t>
       </w:r>
-      <w:hyperlink w:history="1" r:id="rId-u6pwjnhs4z38vuhggjqc">
+      <w:hyperlink w:history="1" r:id="rIdn2c1fbcsjqjzmopfmig3e">
         <w:r>
           <w:rPr>
             <w:color w:val="1155CC"/>
@@ -2198,7 +2198,7 @@
         </w:rPr>
         <w:t xml:space="preserve"> at the top of the </w:t>
       </w:r>
-      <w:hyperlink w:history="1" r:id="rIdswzavpkc1jp0ib2ubzxxk">
+      <w:hyperlink w:history="1" r:id="rIdz64b4wx8jcw2w8djya6b5">
         <w:r>
           <w:rPr>
             <w:color w:val="1155CC"/>
@@ -2235,7 +2235,7 @@
         </w:rPr>
         <w:t xml:space="preserve">Then look at the </w:t>
       </w:r>
-      <w:hyperlink w:history="1" r:id="rIdu_anh8qjm5qs10scmcyhp">
+      <w:hyperlink w:history="1" r:id="rIdgsiqqqduwkvukpravjx5p">
         <w:r>
           <w:rPr>
             <w:color w:val="1155CC"/>
@@ -2256,7 +2256,7 @@
         </w:rPr>
         <w:t xml:space="preserve"> and see if you can figure out what need your feeling was about. Remember, it's VERY helpful to limit the words you use to those on the </w:t>
       </w:r>
-      <w:hyperlink w:history="1" r:id="rIdh8s6zoiluuhycrtcjxtif">
+      <w:hyperlink w:history="1" r:id="rIdyoslnwyugazzbnhh8jajr">
         <w:r>
           <w:rPr>
             <w:color w:val="1155CC"/>
@@ -2335,7 +2335,7 @@
       <w:tr>
         <w:trPr>
           <w:cantSplit/>
-          <w:trHeight w:val="771" w:hRule="atLeast"/>
+          <w:trHeight w:val="340" w:hRule="atLeast"/>
         </w:trPr>
         <w:tc>
           <w:tcPr>
@@ -2398,7 +2398,7 @@
         </w:rPr>
         <w:t xml:space="preserve">Keep a small journal with you throughout the day. Make 2 to 4 entries per day that include something you did, said or were thinking of saying and the feeling (or feelings) you experienced at that moment. Again, later on, when you have time, sit down with the </w:t>
       </w:r>
-      <w:hyperlink w:history="1" r:id="rIdec2jfilio4xgskuv4iium">
+      <w:hyperlink w:history="1" r:id="rId8v-buufbg67cqojfycq3g">
         <w:r>
           <w:rPr>
             <w:color w:val="1155CC"/>
@@ -2455,7 +2455,7 @@
         </w:rPr>
         <w:t xml:space="preserve"> at the top of the </w:t>
       </w:r>
-      <w:hyperlink w:history="1" r:id="rIdjujt4il3aoh9m8uqy4tgs">
+      <w:hyperlink w:history="1" r:id="rIduxchx725-sbpzs9hc5cln">
         <w:r>
           <w:rPr>
             <w:color w:val="1155CC"/>
@@ -2492,7 +2492,7 @@
         </w:rPr>
         <w:t xml:space="preserve">Then look at the </w:t>
       </w:r>
-      <w:hyperlink w:history="1" r:id="rIdi5ip8cnf4zx8jnb7mgkjp">
+      <w:hyperlink w:history="1" r:id="rIdxomj22-vzhfnjwspvdwhn">
         <w:r>
           <w:rPr>
             <w:color w:val="1155CC"/>
@@ -2513,7 +2513,7 @@
         </w:rPr>
         <w:t xml:space="preserve"> and see if you can figure out what need your feeling was about. Remember, here too, it's VERY important to limit the words you use to those on the </w:t>
       </w:r>
-      <w:hyperlink w:history="1" r:id="rIdfmxw9unpiq237liyvqdyq">
+      <w:hyperlink w:history="1" r:id="rIdfin5ptwticsf4sttqjlly">
         <w:r>
           <w:rPr>
             <w:color w:val="1155CC"/>
@@ -2592,7 +2592,7 @@
       <w:tr>
         <w:trPr>
           <w:cantSplit/>
-          <w:trHeight w:val="771" w:hRule="atLeast"/>
+          <w:trHeight w:val="340" w:hRule="atLeast"/>
         </w:trPr>
         <w:tc>
           <w:tcPr>
@@ -2762,7 +2762,7 @@
       <w:tr>
         <w:trPr>
           <w:cantSplit/>
-          <w:trHeight w:val="435" w:hRule="atLeast"/>
+          <w:trHeight w:val="340" w:hRule="atLeast"/>
         </w:trPr>
         <w:tc>
           <w:tcPr>
@@ -2899,7 +2899,7 @@
       <w:r>
         <w:t xml:space="preserve">Read the </w:t>
       </w:r>
-      <w:hyperlink w:history="1" r:id="rIdz1nl4m44fg4js6dwwh8xq">
+      <w:hyperlink w:history="1" r:id="rIdse80lv1waets4pojtqj67">
         <w:r>
           <w:rPr>
             <w:color w:val="1155CC"/>
@@ -2985,7 +2985,7 @@
       <w:tr>
         <w:trPr>
           <w:cantSplit/>
-          <w:trHeight w:val="482" w:hRule="atLeast"/>
+          <w:trHeight w:val="340" w:hRule="atLeast"/>
         </w:trPr>
         <w:tc>
           <w:tcPr>
@@ -3032,7 +3032,7 @@
       <w:r>
         <w:t xml:space="preserve">Print a copy of the </w:t>
       </w:r>
-      <w:hyperlink w:history="1" r:id="rId6zjyh5mdwocaz5fl-ine8">
+      <w:hyperlink w:history="1" r:id="rIdayqwe7dq7moglovupqlgc">
         <w:r>
           <w:rPr>
             <w:color w:val="1155CC"/>
@@ -3134,7 +3134,7 @@
       <w:tr>
         <w:trPr>
           <w:cantSplit/>
-          <w:trHeight w:val="482" w:hRule="atLeast"/>
+          <w:trHeight w:val="340" w:hRule="atLeast"/>
         </w:trPr>
         <w:tc>
           <w:tcPr>
@@ -3197,7 +3197,7 @@
         </w:rPr>
         <w:t xml:space="preserve">Keep a small journal with you throughout the day. Make 1 to 5 entries per day that include an act or words spoken by someone and what need(s) you imagine they were trying to meet. Remember, it's VERY helpful to limit the words you use to those on the </w:t>
       </w:r>
-      <w:hyperlink w:history="1" r:id="rIddcmt2l3-jq2i4iw8iw8hp">
+      <w:hyperlink w:history="1" r:id="rId7qstlsudba4ottxcikc-h">
         <w:r>
           <w:rPr>
             <w:color w:val="1155CC"/>
@@ -3276,7 +3276,7 @@
       <w:tr>
         <w:trPr>
           <w:cantSplit/>
-          <w:trHeight w:val="482" w:hRule="atLeast"/>
+          <w:trHeight w:val="340" w:hRule="atLeast"/>
         </w:trPr>
         <w:tc>
           <w:tcPr>
@@ -3339,7 +3339,7 @@
         </w:rPr>
         <w:t xml:space="preserve">Think of someone that you think is preventing you from getting a need(s) met. Write down the need(s) from the </w:t>
       </w:r>
-      <w:hyperlink w:history="1" r:id="rIdid2uikvrkriyjmgwp4-1l">
+      <w:hyperlink w:history="1" r:id="rIdnjyqqz8cskqe6rgh5z4zx">
         <w:r>
           <w:rPr>
             <w:color w:val="1155CC"/>
@@ -3418,7 +3418,7 @@
       <w:tr>
         <w:trPr>
           <w:cantSplit/>
-          <w:trHeight w:val="482" w:hRule="atLeast"/>
+          <w:trHeight w:val="340" w:hRule="atLeast"/>
         </w:trPr>
         <w:tc>
           <w:tcPr>
@@ -3588,7 +3588,7 @@
       <w:tr>
         <w:trPr>
           <w:cantSplit/>
-          <w:trHeight w:val="545" w:hRule="atLeast"/>
+          <w:trHeight w:val="340" w:hRule="atLeast"/>
         </w:trPr>
         <w:tc>
           <w:tcPr>
@@ -3741,7 +3741,7 @@
         </w:rPr>
         <w:t xml:space="preserve">Visit: http://</w:t>
       </w:r>
-      <w:hyperlink w:history="1" r:id="rId505yzoxnz82uv13lnyoqd">
+      <w:hyperlink w:history="1" r:id="rIdzcs41_bzzb-by3ndy-bub">
         <w:r>
           <w:rPr>
             <w:color w:val="1155CC"/>
@@ -3820,7 +3820,7 @@
       <w:tr>
         <w:trPr>
           <w:cantSplit/>
-          <w:trHeight w:val="1772" w:hRule="atLeast"/>
+          <w:trHeight w:val="340" w:hRule="atLeast"/>
         </w:trPr>
         <w:tc>
           <w:tcPr>
@@ -4017,7 +4017,7 @@
         <w:keepLines/>
         <w:spacing w:after="60" w:before="0" w:line="276" w:lineRule="auto"/>
       </w:pPr>
-      <w:hyperlink w:history="1" r:id="rIds6_1ut2wwihbvgx2c89so">
+      <w:hyperlink w:history="1" r:id="rIdhx7od-bzmskagipmyevh6">
         <w:r>
           <w:rPr>
             <w:color w:val="1155CC"/>
@@ -4086,7 +4086,7 @@
       <w:tr>
         <w:trPr>
           <w:cantSplit/>
-          <w:trHeight w:val="1772" w:hRule="atLeast"/>
+          <w:trHeight w:val="340" w:hRule="atLeast"/>
         </w:trPr>
         <w:tc>
           <w:tcPr>
@@ -4256,7 +4256,7 @@
       <w:tr>
         <w:trPr>
           <w:cantSplit/>
-          <w:trHeight w:val="1000" w:hRule="atLeast"/>
+          <w:trHeight w:val="340" w:hRule="atLeast"/>
         </w:trPr>
         <w:tc>
           <w:tcPr>
@@ -4409,7 +4409,7 @@
         </w:rPr>
         <w:t xml:space="preserve">Continue working with this exercise (</w:t>
       </w:r>
-      <w:hyperlink w:history="1" r:id="rIdg4siyypsx_ru-a0qzk6wz">
+      <w:hyperlink w:history="1" r:id="rIdjyi8iebcxywdyagh_qzsd">
         <w:r>
           <w:rPr>
             <w:color w:val="1155CC"/>
@@ -4617,7 +4617,7 @@
       <w:tr>
         <w:trPr>
           <w:cantSplit/>
-          <w:trHeight w:val="820" w:hRule="atLeast"/>
+          <w:trHeight w:val="340" w:hRule="atLeast"/>
         </w:trPr>
         <w:tc>
           <w:tcPr>
@@ -4720,7 +4720,7 @@
         </w:rPr>
         <w:t xml:space="preserve"> - take your time). Next, view or print a copy of the </w:t>
       </w:r>
-      <w:hyperlink w:history="1" r:id="rIdohglmw7hsuaslsumgyjhl">
+      <w:hyperlink w:history="1" r:id="rIdoz3qtjzvnjrstj0dm_rcx">
         <w:r>
           <w:rPr>
             <w:color w:val="1155CC"/>
@@ -4819,7 +4819,7 @@
       <w:tr>
         <w:trPr>
           <w:cantSplit/>
-          <w:trHeight w:val="820" w:hRule="atLeast"/>
+          <w:trHeight w:val="340" w:hRule="atLeast"/>
         </w:trPr>
         <w:tc>
           <w:tcPr>
@@ -5000,7 +5000,7 @@
       <w:tr>
         <w:trPr>
           <w:cantSplit/>
-          <w:trHeight w:val="820" w:hRule="atLeast"/>
+          <w:trHeight w:val="340" w:hRule="atLeast"/>
         </w:trPr>
         <w:tc>
           <w:tcPr>
@@ -5253,7 +5253,7 @@
         <w:keepLines/>
         <w:spacing w:after="60" w:before="0" w:line="276" w:lineRule="auto"/>
       </w:pPr>
-      <w:hyperlink w:history="1" r:id="rId4rlhgghittm73vv23l8ju">
+      <w:hyperlink w:history="1" r:id="rIdcqeqy5wm9cnq38npaye5y">
         <w:r>
           <w:rPr>
             <w:color w:val="1155CC"/>
@@ -5322,7 +5322,7 @@
       <w:tr>
         <w:trPr>
           <w:cantSplit/>
-          <w:trHeight w:val="820" w:hRule="atLeast"/>
+          <w:trHeight w:val="340" w:hRule="atLeast"/>
         </w:trPr>
         <w:tc>
           <w:tcPr>
@@ -5492,7 +5492,7 @@
       <w:tr>
         <w:trPr>
           <w:cantSplit/>
-          <w:trHeight w:val="1300" w:hRule="atLeast"/>
+          <w:trHeight w:val="340" w:hRule="atLeast"/>
         </w:trPr>
         <w:tc>
           <w:tcPr>
@@ -5735,7 +5735,7 @@
       <w:tr>
         <w:trPr>
           <w:cantSplit/>
-          <w:trHeight w:val="1157" w:hRule="atLeast"/>
+          <w:trHeight w:val="340" w:hRule="atLeast"/>
         </w:trPr>
         <w:tc>
           <w:tcPr>
@@ -5944,7 +5944,7 @@
       <w:tr>
         <w:trPr>
           <w:cantSplit/>
-          <w:trHeight w:val="1157" w:hRule="atLeast"/>
+          <w:trHeight w:val="340" w:hRule="atLeast"/>
         </w:trPr>
         <w:tc>
           <w:tcPr>
@@ -6114,7 +6114,7 @@
       <w:tr>
         <w:trPr>
           <w:cantSplit/>
-          <w:trHeight w:val="653" w:hRule="atLeast"/>
+          <w:trHeight w:val="340" w:hRule="atLeast"/>
         </w:trPr>
         <w:tc>
           <w:tcPr>
@@ -6379,7 +6379,7 @@
         </w:rPr>
         <w:t xml:space="preserve">Then look at the </w:t>
       </w:r>
-      <w:hyperlink w:history="1" r:id="rIdfijmfhsgt7uebu53teept">
+      <w:hyperlink w:history="1" r:id="rIdps_d1ziedr2ue2ptzsbpu">
         <w:r>
           <w:rPr>
             <w:color w:val="1155CC"/>
@@ -6458,7 +6458,7 @@
       <w:tr>
         <w:trPr>
           <w:cantSplit/>
-          <w:trHeight w:val="2200" w:hRule="atLeast"/>
+          <w:trHeight w:val="340" w:hRule="atLeast"/>
         </w:trPr>
         <w:tc>
           <w:tcPr>
@@ -6628,7 +6628,7 @@
       <w:tr>
         <w:trPr>
           <w:cantSplit/>
-          <w:trHeight w:val="1380" w:hRule="atLeast"/>
+          <w:trHeight w:val="340" w:hRule="atLeast"/>
         </w:trPr>
         <w:tc>
           <w:tcPr>
@@ -7015,7 +7015,7 @@
       <w:tr>
         <w:trPr>
           <w:cantSplit/>
-          <w:trHeight w:val="905" w:hRule="atLeast"/>
+          <w:trHeight w:val="340" w:hRule="atLeast"/>
         </w:trPr>
         <w:tc>
           <w:tcPr>
@@ -7094,7 +7094,7 @@
         </w:rPr>
         <w:t xml:space="preserve">Later on, when you have time, read over your journal for the day. Next, check in with yourself about how you feel as you think about those thoughts. Then look at the </w:t>
       </w:r>
-      <w:hyperlink w:history="1" r:id="rIdj84oktukittfzpnvvozc-">
+      <w:hyperlink w:history="1" r:id="rId6mycd98vjb5g5mv44u9wg">
         <w:r>
           <w:rPr>
             <w:color w:val="1155CC"/>
@@ -7189,7 +7189,7 @@
       <w:tr>
         <w:trPr>
           <w:cantSplit/>
-          <w:trHeight w:val="905" w:hRule="atLeast"/>
+          <w:trHeight w:val="340" w:hRule="atLeast"/>
         </w:trPr>
         <w:tc>
           <w:tcPr>
@@ -7359,7 +7359,7 @@
       <w:tr>
         <w:trPr>
           <w:cantSplit/>
-          <w:trHeight w:val="511" w:hRule="atLeast"/>
+          <w:trHeight w:val="340" w:hRule="atLeast"/>
         </w:trPr>
         <w:tc>
           <w:tcPr>
@@ -7552,7 +7552,7 @@
         </w:rPr>
         <w:t xml:space="preserve"> response would be. What was that person feeling? What was that person needing, wanting to have more of, or yearning to experience? Check the </w:t>
       </w:r>
-      <w:hyperlink w:history="1" r:id="rIdk7g-vogh5-vo7qxd6ndea">
+      <w:hyperlink w:history="1" r:id="rIdcnku0ogxvenbrrkixh7mg">
         <w:r>
           <w:rPr>
             <w:color w:val="1155CC"/>
@@ -7573,7 +7573,7 @@
         </w:rPr>
         <w:t xml:space="preserve"> and the </w:t>
       </w:r>
-      <w:hyperlink w:history="1" r:id="rIdgtclnm1_vgqlbec45wtlk">
+      <w:hyperlink w:history="1" r:id="rId2doknaiaqrhvru2peq2ai">
         <w:r>
           <w:rPr>
             <w:color w:val="1155CC"/>
@@ -7652,7 +7652,7 @@
       <w:tr>
         <w:trPr>
           <w:cantSplit/>
-          <w:trHeight w:val="771" w:hRule="atLeast"/>
+          <w:trHeight w:val="340" w:hRule="atLeast"/>
         </w:trPr>
         <w:tc>
           <w:tcPr>
@@ -8025,7 +8025,7 @@
               </w:rPr>
               <w:t xml:space="preserve"> (feeling from the </w:t>
             </w:r>
-            <w:hyperlink w:history="1" r:id="rIdovdokrqkghekn77fxumlg">
+            <w:hyperlink w:history="1" r:id="rIdhqlnrlg-mdcevg1fqubzl">
               <w:r>
                 <w:rPr>
                   <w:color w:val="1155CC"/>
@@ -8066,7 +8066,7 @@
               </w:rPr>
               <w:t xml:space="preserve"> (need from the </w:t>
             </w:r>
-            <w:hyperlink w:history="1" r:id="rIddlkgf7v4mnxdjmsk-tlye">
+            <w:hyperlink w:history="1" r:id="rIdt5rtpkogdvqx0mufnh2n1">
               <w:r>
                 <w:rPr>
                   <w:color w:val="1155CC"/>
@@ -8158,7 +8158,7 @@
       <w:tr>
         <w:trPr>
           <w:cantSplit/>
-          <w:trHeight w:val="771" w:hRule="atLeast"/>
+          <w:trHeight w:val="340" w:hRule="atLeast"/>
         </w:trPr>
         <w:tc>
           <w:tcPr>
@@ -8328,7 +8328,7 @@
       <w:tr>
         <w:trPr>
           <w:cantSplit/>
-          <w:trHeight w:val="435" w:hRule="atLeast"/>
+          <w:trHeight w:val="340" w:hRule="atLeast"/>
         </w:trPr>
         <w:tc>
           <w:tcPr>
@@ -8539,7 +8539,7 @@
       <w:tr>
         <w:trPr>
           <w:cantSplit/>
-          <w:trHeight w:val="804" w:hRule="atLeast"/>
+          <w:trHeight w:val="340" w:hRule="atLeast"/>
         </w:trPr>
         <w:tc>
           <w:tcPr>
@@ -8660,7 +8660,7 @@
       <w:tr>
         <w:trPr>
           <w:cantSplit/>
-          <w:trHeight w:val="804" w:hRule="atLeast"/>
+          <w:trHeight w:val="340" w:hRule="atLeast"/>
         </w:trPr>
         <w:tc>
           <w:tcPr>
@@ -8781,7 +8781,7 @@
       <w:tr>
         <w:trPr>
           <w:cantSplit/>
-          <w:trHeight w:val="804" w:hRule="atLeast"/>
+          <w:trHeight w:val="340" w:hRule="atLeast"/>
         </w:trPr>
         <w:tc>
           <w:tcPr>
@@ -8912,7 +8912,7 @@
       <w:tr>
         <w:trPr>
           <w:cantSplit/>
-          <w:trHeight w:val="804" w:hRule="atLeast"/>
+          <w:trHeight w:val="340" w:hRule="atLeast"/>
         </w:trPr>
         <w:tc>
           <w:tcPr>
@@ -8965,8 +8965,8 @@
         </w:tblBorders>
       </w:tblPr>
       <w:tblGrid>
-        <w:gridCol w:w="6760"/>
-        <w:gridCol w:w="1500"/>
+        <w:gridCol w:w="5560"/>
+        <w:gridCol w:w="2700"/>
         <w:gridCol w:w="1100"/>
       </w:tblGrid>
       <w:tr>
@@ -8975,7 +8975,7 @@
         </w:trPr>
         <w:tc>
           <w:tcPr>
-            <w:tcW w:type="dxa" w:w="6760"/>
+            <w:tcW w:type="dxa" w:w="5560"/>
             <w:tcBorders>
               <w:top w:val="none" w:color="FFFFFF" w:sz="0"/>
               <w:left w:val="single" w:color="B8860B" w:sz="24" w:space="10"/>
@@ -9009,7 +9009,7 @@
         </w:tc>
         <w:tc>
           <w:tcPr>
-            <w:tcW w:type="dxa" w:w="1500"/>
+            <w:tcW w:type="dxa" w:w="2700"/>
             <w:tcBorders>
               <w:top w:val="none" w:color="FFFFFF" w:sz="0"/>
               <w:left w:val="none" w:color="FFFFFF" w:sz="0"/>
@@ -9037,7 +9037,7 @@
                 <w:sz w:val="20"/>
                 <w:szCs w:val="20"/>
               </w:rPr>
-              <w:t xml:space="preserve">Empathy hours</w:t>
+              <w:t xml:space="preserve">Empathy practice hours</w:t>
             </w:r>
           </w:p>
         </w:tc>
@@ -9204,7 +9204,7 @@
       <w:tr>
         <w:trPr>
           <w:cantSplit/>
-          <w:trHeight w:val="907" w:hRule="atLeast"/>
+          <w:trHeight w:val="340" w:hRule="atLeast"/>
         </w:trPr>
         <w:tc>
           <w:tcPr>
@@ -9567,7 +9567,7 @@
       <w:tr>
         <w:trPr>
           <w:cantSplit/>
-          <w:trHeight w:val="240" w:hRule="atLeast"/>
+          <w:trHeight w:val="340" w:hRule="atLeast"/>
         </w:trPr>
         <w:tc>
           <w:tcPr>
@@ -9856,7 +9856,7 @@
       <w:tr>
         <w:trPr>
           <w:cantSplit/>
-          <w:trHeight w:val="240" w:hRule="atLeast"/>
+          <w:trHeight w:val="340" w:hRule="atLeast"/>
         </w:trPr>
         <w:tc>
           <w:tcPr>
@@ -9909,8 +9909,8 @@
         </w:tblBorders>
       </w:tblPr>
       <w:tblGrid>
-        <w:gridCol w:w="6760"/>
-        <w:gridCol w:w="1500"/>
+        <w:gridCol w:w="5560"/>
+        <w:gridCol w:w="2700"/>
         <w:gridCol w:w="1100"/>
       </w:tblGrid>
       <w:tr>
@@ -9919,7 +9919,7 @@
         </w:trPr>
         <w:tc>
           <w:tcPr>
-            <w:tcW w:type="dxa" w:w="6760"/>
+            <w:tcW w:type="dxa" w:w="5560"/>
             <w:tcBorders>
               <w:top w:val="none" w:color="FFFFFF" w:sz="0"/>
               <w:left w:val="single" w:color="B8860B" w:sz="24" w:space="10"/>
@@ -9953,7 +9953,7 @@
         </w:tc>
         <w:tc>
           <w:tcPr>
-            <w:tcW w:type="dxa" w:w="1500"/>
+            <w:tcW w:type="dxa" w:w="2700"/>
             <w:tcBorders>
               <w:top w:val="none" w:color="FFFFFF" w:sz="0"/>
               <w:left w:val="none" w:color="FFFFFF" w:sz="0"/>
@@ -9981,7 +9981,7 @@
                 <w:sz w:val="20"/>
                 <w:szCs w:val="20"/>
               </w:rPr>
-              <w:t xml:space="preserve">Empathy hours</w:t>
+              <w:t xml:space="preserve">Empathy practice hours</w:t>
             </w:r>
           </w:p>
         </w:tc>
@@ -10148,7 +10148,7 @@
       <w:tr>
         <w:trPr>
           <w:cantSplit/>
-          <w:trHeight w:val="320" w:hRule="atLeast"/>
+          <w:trHeight w:val="340" w:hRule="atLeast"/>
         </w:trPr>
         <w:tc>
           <w:tcPr>
@@ -10359,7 +10359,7 @@
       <w:tr>
         <w:trPr>
           <w:cantSplit/>
-          <w:trHeight w:val="1304" w:hRule="atLeast"/>
+          <w:trHeight w:val="340" w:hRule="atLeast"/>
         </w:trPr>
         <w:tc>
           <w:tcPr>
@@ -10572,7 +10572,7 @@
       <w:tr>
         <w:trPr>
           <w:cantSplit/>
-          <w:trHeight w:val="1304" w:hRule="atLeast"/>
+          <w:trHeight w:val="340" w:hRule="atLeast"/>
         </w:trPr>
         <w:tc>
           <w:tcPr>
@@ -10733,7 +10733,7 @@
       <w:tr>
         <w:trPr>
           <w:cantSplit/>
-          <w:trHeight w:val="1304" w:hRule="atLeast"/>
+          <w:trHeight w:val="340" w:hRule="atLeast"/>
         </w:trPr>
         <w:tc>
           <w:tcPr>
@@ -10786,8 +10786,8 @@
         </w:tblBorders>
       </w:tblPr>
       <w:tblGrid>
-        <w:gridCol w:w="6760"/>
-        <w:gridCol w:w="1500"/>
+        <w:gridCol w:w="5560"/>
+        <w:gridCol w:w="2700"/>
         <w:gridCol w:w="1100"/>
       </w:tblGrid>
       <w:tr>
@@ -10796,7 +10796,7 @@
         </w:trPr>
         <w:tc>
           <w:tcPr>
-            <w:tcW w:type="dxa" w:w="6760"/>
+            <w:tcW w:type="dxa" w:w="5560"/>
             <w:tcBorders>
               <w:top w:val="none" w:color="FFFFFF" w:sz="0"/>
               <w:left w:val="single" w:color="B8860B" w:sz="24" w:space="10"/>
@@ -10830,7 +10830,7 @@
         </w:tc>
         <w:tc>
           <w:tcPr>
-            <w:tcW w:type="dxa" w:w="1500"/>
+            <w:tcW w:type="dxa" w:w="2700"/>
             <w:tcBorders>
               <w:top w:val="none" w:color="FFFFFF" w:sz="0"/>
               <w:left w:val="none" w:color="FFFFFF" w:sz="0"/>
@@ -10858,7 +10858,7 @@
                 <w:sz w:val="20"/>
                 <w:szCs w:val="20"/>
               </w:rPr>
-              <w:t xml:space="preserve">Empathy hours</w:t>
+              <w:t xml:space="preserve">Empathy practice hours</w:t>
             </w:r>
           </w:p>
         </w:tc>
@@ -11025,7 +11025,7 @@
       <w:tr>
         <w:trPr>
           <w:cantSplit/>
-          <w:trHeight w:val="1104" w:hRule="atLeast"/>
+          <w:trHeight w:val="340" w:hRule="atLeast"/>
         </w:trPr>
         <w:tc>
           <w:tcPr>
@@ -11236,7 +11236,7 @@
       <w:tr>
         <w:trPr>
           <w:cantSplit/>
-          <w:trHeight w:val="820" w:hRule="atLeast"/>
+          <w:trHeight w:val="340" w:hRule="atLeast"/>
         </w:trPr>
         <w:tc>
           <w:tcPr>
@@ -11457,7 +11457,7 @@
       <w:tr>
         <w:trPr>
           <w:cantSplit/>
-          <w:trHeight w:val="820" w:hRule="atLeast"/>
+          <w:trHeight w:val="340" w:hRule="atLeast"/>
         </w:trPr>
         <w:tc>
           <w:tcPr>
@@ -11818,7 +11818,7 @@
       <w:tr>
         <w:trPr>
           <w:cantSplit/>
-          <w:trHeight w:val="820" w:hRule="atLeast"/>
+          <w:trHeight w:val="340" w:hRule="atLeast"/>
         </w:trPr>
         <w:tc>
           <w:tcPr>
@@ -11871,8 +11871,8 @@
         </w:tblBorders>
       </w:tblPr>
       <w:tblGrid>
-        <w:gridCol w:w="6760"/>
-        <w:gridCol w:w="1500"/>
+        <w:gridCol w:w="5560"/>
+        <w:gridCol w:w="2700"/>
         <w:gridCol w:w="1100"/>
       </w:tblGrid>
       <w:tr>
@@ -11881,7 +11881,7 @@
         </w:trPr>
         <w:tc>
           <w:tcPr>
-            <w:tcW w:type="dxa" w:w="6760"/>
+            <w:tcW w:type="dxa" w:w="5560"/>
             <w:tcBorders>
               <w:top w:val="none" w:color="FFFFFF" w:sz="0"/>
               <w:left w:val="single" w:color="B8860B" w:sz="24" w:space="10"/>
@@ -11915,7 +11915,7 @@
         </w:tc>
         <w:tc>
           <w:tcPr>
-            <w:tcW w:type="dxa" w:w="1500"/>
+            <w:tcW w:type="dxa" w:w="2700"/>
             <w:tcBorders>
               <w:top w:val="none" w:color="FFFFFF" w:sz="0"/>
               <w:left w:val="none" w:color="FFFFFF" w:sz="0"/>
@@ -11943,7 +11943,7 @@
                 <w:sz w:val="20"/>
                 <w:szCs w:val="20"/>
               </w:rPr>
-              <w:t xml:space="preserve">Empathy hours</w:t>
+              <w:t xml:space="preserve">Empathy practice hours</w:t>
             </w:r>
           </w:p>
         </w:tc>
@@ -12110,7 +12110,7 @@
       <w:tr>
         <w:trPr>
           <w:cantSplit/>
-          <w:trHeight w:val="1300" w:hRule="atLeast"/>
+          <w:trHeight w:val="340" w:hRule="atLeast"/>
         </w:trPr>
         <w:tc>
           <w:tcPr>
@@ -12569,7 +12569,7 @@
       <w:tr>
         <w:trPr>
           <w:cantSplit/>
-          <w:trHeight w:val="615" w:hRule="atLeast"/>
+          <w:trHeight w:val="340" w:hRule="atLeast"/>
         </w:trPr>
         <w:tc>
           <w:tcPr>
@@ -12690,7 +12690,7 @@
       <w:tr>
         <w:trPr>
           <w:cantSplit/>
-          <w:trHeight w:val="615" w:hRule="atLeast"/>
+          <w:trHeight w:val="340" w:hRule="atLeast"/>
         </w:trPr>
         <w:tc>
           <w:tcPr>
@@ -12851,7 +12851,7 @@
       <w:tr>
         <w:trPr>
           <w:cantSplit/>
-          <w:trHeight w:val="615" w:hRule="atLeast"/>
+          <w:trHeight w:val="340" w:hRule="atLeast"/>
         </w:trPr>
         <w:tc>
           <w:tcPr>
@@ -12904,8 +12904,8 @@
         </w:tblBorders>
       </w:tblPr>
       <w:tblGrid>
-        <w:gridCol w:w="6760"/>
-        <w:gridCol w:w="1500"/>
+        <w:gridCol w:w="5560"/>
+        <w:gridCol w:w="2700"/>
         <w:gridCol w:w="1100"/>
       </w:tblGrid>
       <w:tr>
@@ -12914,7 +12914,7 @@
         </w:trPr>
         <w:tc>
           <w:tcPr>
-            <w:tcW w:type="dxa" w:w="6760"/>
+            <w:tcW w:type="dxa" w:w="5560"/>
             <w:tcBorders>
               <w:top w:val="none" w:color="FFFFFF" w:sz="0"/>
               <w:left w:val="single" w:color="B8860B" w:sz="24" w:space="10"/>
@@ -12948,7 +12948,7 @@
         </w:tc>
         <w:tc>
           <w:tcPr>
-            <w:tcW w:type="dxa" w:w="1500"/>
+            <w:tcW w:type="dxa" w:w="2700"/>
             <w:tcBorders>
               <w:top w:val="none" w:color="FFFFFF" w:sz="0"/>
               <w:left w:val="none" w:color="FFFFFF" w:sz="0"/>
@@ -12976,7 +12976,7 @@
                 <w:sz w:val="20"/>
                 <w:szCs w:val="20"/>
               </w:rPr>
-              <w:t xml:space="preserve">Empathy hours</w:t>
+              <w:t xml:space="preserve">Empathy practice hours</w:t>
             </w:r>
           </w:p>
         </w:tc>
@@ -13143,7 +13143,7 @@
       <w:tr>
         <w:trPr>
           <w:cantSplit/>
-          <w:trHeight w:val="521" w:hRule="atLeast"/>
+          <w:trHeight w:val="340" w:hRule="atLeast"/>
         </w:trPr>
         <w:tc>
           <w:tcPr>
@@ -13446,7 +13446,7 @@
       <w:tr>
         <w:trPr>
           <w:cantSplit/>
-          <w:trHeight w:val="1042" w:hRule="atLeast"/>
+          <w:trHeight w:val="340" w:hRule="atLeast"/>
         </w:trPr>
         <w:tc>
           <w:tcPr>
@@ -13627,7 +13627,7 @@
       <w:tr>
         <w:trPr>
           <w:cantSplit/>
-          <w:trHeight w:val="1042" w:hRule="atLeast"/>
+          <w:trHeight w:val="340" w:hRule="atLeast"/>
         </w:trPr>
         <w:tc>
           <w:tcPr>
@@ -13748,7 +13748,7 @@
       <w:tr>
         <w:trPr>
           <w:cantSplit/>
-          <w:trHeight w:val="1042" w:hRule="atLeast"/>
+          <w:trHeight w:val="340" w:hRule="atLeast"/>
         </w:trPr>
         <w:tc>
           <w:tcPr>
@@ -13801,8 +13801,8 @@
         </w:tblBorders>
       </w:tblPr>
       <w:tblGrid>
-        <w:gridCol w:w="6760"/>
-        <w:gridCol w:w="1500"/>
+        <w:gridCol w:w="5560"/>
+        <w:gridCol w:w="2700"/>
         <w:gridCol w:w="1100"/>
       </w:tblGrid>
       <w:tr>
@@ -13811,7 +13811,7 @@
         </w:trPr>
         <w:tc>
           <w:tcPr>
-            <w:tcW w:type="dxa" w:w="6760"/>
+            <w:tcW w:type="dxa" w:w="5560"/>
             <w:tcBorders>
               <w:top w:val="none" w:color="FFFFFF" w:sz="0"/>
               <w:left w:val="single" w:color="B8860B" w:sz="24" w:space="10"/>
@@ -13845,7 +13845,7 @@
         </w:tc>
         <w:tc>
           <w:tcPr>
-            <w:tcW w:type="dxa" w:w="1500"/>
+            <w:tcW w:type="dxa" w:w="2700"/>
             <w:tcBorders>
               <w:top w:val="none" w:color="FFFFFF" w:sz="0"/>
               <w:left w:val="none" w:color="FFFFFF" w:sz="0"/>
@@ -13873,7 +13873,7 @@
                 <w:sz w:val="20"/>
                 <w:szCs w:val="20"/>
               </w:rPr>
-              <w:t xml:space="preserve">Empathy hours</w:t>
+              <w:t xml:space="preserve">Empathy practice hours</w:t>
             </w:r>
           </w:p>
         </w:tc>
@@ -14040,7 +14040,7 @@
       <w:tr>
         <w:trPr>
           <w:cantSplit/>
-          <w:trHeight w:val="882" w:hRule="atLeast"/>
+          <w:trHeight w:val="340" w:hRule="atLeast"/>
         </w:trPr>
         <w:tc>
           <w:tcPr>
@@ -14271,7 +14271,7 @@
       <w:tr>
         <w:trPr>
           <w:cantSplit/>
-          <w:trHeight w:val="2200" w:hRule="atLeast"/>
+          <w:trHeight w:val="340" w:hRule="atLeast"/>
         </w:trPr>
         <w:tc>
           <w:tcPr>
@@ -14412,7 +14412,7 @@
       <w:tr>
         <w:trPr>
           <w:cantSplit/>
-          <w:trHeight w:val="2200" w:hRule="atLeast"/>
+          <w:trHeight w:val="340" w:hRule="atLeast"/>
         </w:trPr>
         <w:tc>
           <w:tcPr>
@@ -14465,8 +14465,8 @@
         </w:tblBorders>
       </w:tblPr>
       <w:tblGrid>
-        <w:gridCol w:w="6760"/>
-        <w:gridCol w:w="1500"/>
+        <w:gridCol w:w="5560"/>
+        <w:gridCol w:w="2700"/>
         <w:gridCol w:w="1100"/>
       </w:tblGrid>
       <w:tr>
@@ -14475,7 +14475,7 @@
         </w:trPr>
         <w:tc>
           <w:tcPr>
-            <w:tcW w:type="dxa" w:w="6760"/>
+            <w:tcW w:type="dxa" w:w="5560"/>
             <w:tcBorders>
               <w:top w:val="none" w:color="FFFFFF" w:sz="0"/>
               <w:left w:val="single" w:color="B8860B" w:sz="24" w:space="10"/>
@@ -14509,7 +14509,7 @@
         </w:tc>
         <w:tc>
           <w:tcPr>
-            <w:tcW w:type="dxa" w:w="1500"/>
+            <w:tcW w:type="dxa" w:w="2700"/>
             <w:tcBorders>
               <w:top w:val="none" w:color="FFFFFF" w:sz="0"/>
               <w:left w:val="none" w:color="FFFFFF" w:sz="0"/>
@@ -14537,7 +14537,7 @@
                 <w:sz w:val="20"/>
                 <w:szCs w:val="20"/>
               </w:rPr>
-              <w:t xml:space="preserve">Empathy hours</w:t>
+              <w:t xml:space="preserve">Empathy practice hours</w:t>
             </w:r>
           </w:p>
         </w:tc>
@@ -14704,7 +14704,7 @@
       <w:tr>
         <w:trPr>
           <w:cantSplit/>
-          <w:trHeight w:val="1380" w:hRule="atLeast"/>
+          <w:trHeight w:val="340" w:hRule="atLeast"/>
         </w:trPr>
         <w:tc>
           <w:tcPr>
@@ -14931,7 +14931,7 @@
       <w:tr>
         <w:trPr>
           <w:cantSplit/>
-          <w:trHeight w:val="1759" w:hRule="atLeast"/>
+          <w:trHeight w:val="340" w:hRule="atLeast"/>
         </w:trPr>
         <w:tc>
           <w:tcPr>
@@ -15068,7 +15068,7 @@
       <w:tr>
         <w:trPr>
           <w:cantSplit/>
-          <w:trHeight w:val="1759" w:hRule="atLeast"/>
+          <w:trHeight w:val="340" w:hRule="atLeast"/>
         </w:trPr>
         <w:tc>
           <w:tcPr>
@@ -15121,8 +15121,8 @@
         </w:tblBorders>
       </w:tblPr>
       <w:tblGrid>
-        <w:gridCol w:w="6760"/>
-        <w:gridCol w:w="1500"/>
+        <w:gridCol w:w="5560"/>
+        <w:gridCol w:w="2700"/>
         <w:gridCol w:w="1100"/>
       </w:tblGrid>
       <w:tr>
@@ -15131,7 +15131,7 @@
         </w:trPr>
         <w:tc>
           <w:tcPr>
-            <w:tcW w:type="dxa" w:w="6760"/>
+            <w:tcW w:type="dxa" w:w="5560"/>
             <w:tcBorders>
               <w:top w:val="none" w:color="FFFFFF" w:sz="0"/>
               <w:left w:val="single" w:color="B8860B" w:sz="24" w:space="10"/>
@@ -15165,7 +15165,7 @@
         </w:tc>
         <w:tc>
           <w:tcPr>
-            <w:tcW w:type="dxa" w:w="1500"/>
+            <w:tcW w:type="dxa" w:w="2700"/>
             <w:tcBorders>
               <w:top w:val="none" w:color="FFFFFF" w:sz="0"/>
               <w:left w:val="none" w:color="FFFFFF" w:sz="0"/>
@@ -15193,7 +15193,7 @@
                 <w:sz w:val="20"/>
                 <w:szCs w:val="20"/>
               </w:rPr>
-              <w:t xml:space="preserve">Empathy hours</w:t>
+              <w:t xml:space="preserve">Empathy practice hours</w:t>
             </w:r>
           </w:p>
         </w:tc>
@@ -15360,7 +15360,7 @@
       <w:tr>
         <w:trPr>
           <w:cantSplit/>
-          <w:trHeight w:val="992" w:hRule="atLeast"/>
+          <w:trHeight w:val="340" w:hRule="atLeast"/>
         </w:trPr>
         <w:tc>
           <w:tcPr>
@@ -15571,7 +15571,7 @@
       <w:tr>
         <w:trPr>
           <w:cantSplit/>
-          <w:trHeight w:val="2200" w:hRule="atLeast"/>
+          <w:trHeight w:val="340" w:hRule="atLeast"/>
         </w:trPr>
         <w:tc>
           <w:tcPr>
@@ -15674,40 +15674,6 @@
         </w:rPr>
         <w:t xml:space="preserve"> manner. CLICK HERE to go to this exercise.</w:t>
       </w:r>
-    </w:p>
-    <w:p>
-      <w:pPr>
-        <w:keepLines/>
-        <w:spacing w:after="60" w:before="0" w:line="276" w:lineRule="auto"/>
-      </w:pPr>
-      <w:hyperlink w:history="1" r:id="rId_6v6v5hq9dyvavfuzwfl5">
-        <w:r>
-          <w:rPr>
-            <w:color w:val="1155CC"/>
-            <w:sz w:val="20"/>
-            <w:szCs w:val="20"/>
-            <w:u w:val="single"/>
-          </w:rPr>
-          <w:t xml:space="preserve">New to the GCN? Click Here to Join</w:t>
-        </w:r>
-      </w:hyperlink>
-    </w:p>
-    <w:p>
-      <w:pPr>
-        <w:keepLines/>
-        <w:spacing w:after="60" w:before="0" w:line="276" w:lineRule="auto"/>
-      </w:pPr>
-      <w:hyperlink w:history="1" r:id="rIdmb5ugcckhnrq1iea0mb8b">
-        <w:r>
-          <w:rPr>
-            <w:color w:val="1155CC"/>
-            <w:sz w:val="20"/>
-            <w:szCs w:val="20"/>
-            <w:u w:val="single"/>
-          </w:rPr>
-          <w:t xml:space="preserve">GCN Members Click Here to Access it</w:t>
-        </w:r>
-      </w:hyperlink>
     </w:p>
     <w:tbl>
       <w:tblPr>
@@ -15766,7 +15732,7 @@
       <w:tr>
         <w:trPr>
           <w:cantSplit/>
-          <w:trHeight w:val="2200" w:hRule="atLeast"/>
+          <w:trHeight w:val="340" w:hRule="atLeast"/>
         </w:trPr>
         <w:tc>
           <w:tcPr>
@@ -15819,8 +15785,8 @@
         </w:tblBorders>
       </w:tblPr>
       <w:tblGrid>
-        <w:gridCol w:w="6760"/>
-        <w:gridCol w:w="1500"/>
+        <w:gridCol w:w="5560"/>
+        <w:gridCol w:w="2700"/>
         <w:gridCol w:w="1100"/>
       </w:tblGrid>
       <w:tr>
@@ -15829,7 +15795,7 @@
         </w:trPr>
         <w:tc>
           <w:tcPr>
-            <w:tcW w:type="dxa" w:w="6760"/>
+            <w:tcW w:type="dxa" w:w="5560"/>
             <w:tcBorders>
               <w:top w:val="none" w:color="FFFFFF" w:sz="0"/>
               <w:left w:val="single" w:color="B8860B" w:sz="24" w:space="10"/>
@@ -15863,7 +15829,7 @@
         </w:tc>
         <w:tc>
           <w:tcPr>
-            <w:tcW w:type="dxa" w:w="1500"/>
+            <w:tcW w:type="dxa" w:w="2700"/>
             <w:tcBorders>
               <w:top w:val="none" w:color="FFFFFF" w:sz="0"/>
               <w:left w:val="none" w:color="FFFFFF" w:sz="0"/>
@@ -15891,7 +15857,7 @@
                 <w:sz w:val="20"/>
                 <w:szCs w:val="20"/>
               </w:rPr>
-              <w:t xml:space="preserve">Empathy hours</w:t>
+              <w:t xml:space="preserve">Empathy practice hours</w:t>
             </w:r>
           </w:p>
         </w:tc>
@@ -16058,7 +16024,7 @@
       <w:tr>
         <w:trPr>
           <w:cantSplit/>
-          <w:trHeight w:val="1261" w:hRule="atLeast"/>
+          <w:trHeight w:val="340" w:hRule="atLeast"/>
         </w:trPr>
         <w:tc>
           <w:tcPr>
@@ -16211,40 +16177,6 @@
         </w:rPr>
         <w:t xml:space="preserve">Think of someone who you care about, who often speaks more than you enjoy. Then, imagine what you could say (compassionately interrupting them) to create more connection in that moment. Consider trying it out for real.</w:t>
       </w:r>
-    </w:p>
-    <w:p>
-      <w:pPr>
-        <w:keepLines/>
-        <w:spacing w:after="60" w:before="0" w:line="276" w:lineRule="auto"/>
-      </w:pPr>
-      <w:hyperlink w:history="1" r:id="rId2gdgznhqmucs0idprbgue">
-        <w:r>
-          <w:rPr>
-            <w:color w:val="1155CC"/>
-            <w:sz w:val="20"/>
-            <w:szCs w:val="20"/>
-            <w:u w:val="single"/>
-          </w:rPr>
-          <w:t xml:space="preserve">New to the GCN? Click Here to Join</w:t>
-        </w:r>
-      </w:hyperlink>
-    </w:p>
-    <w:p>
-      <w:pPr>
-        <w:keepLines/>
-        <w:spacing w:after="60" w:before="0" w:line="276" w:lineRule="auto"/>
-      </w:pPr>
-      <w:hyperlink w:history="1" r:id="rIdvhpv0afocjumbi9eqpwar">
-        <w:r>
-          <w:rPr>
-            <w:color w:val="1155CC"/>
-            <w:sz w:val="20"/>
-            <w:szCs w:val="20"/>
-            <w:u w:val="single"/>
-          </w:rPr>
-          <w:t xml:space="preserve">GCN Members Click Here to Access it</w:t>
-        </w:r>
-      </w:hyperlink>
     </w:p>
     <w:tbl>
       <w:tblPr>
@@ -16303,7 +16235,7 @@
       <w:tr>
         <w:trPr>
           <w:cantSplit/>
-          <w:trHeight w:val="2200" w:hRule="atLeast"/>
+          <w:trHeight w:val="340" w:hRule="atLeast"/>
         </w:trPr>
         <w:tc>
           <w:tcPr>
@@ -16356,8 +16288,8 @@
         </w:tblBorders>
       </w:tblPr>
       <w:tblGrid>
-        <w:gridCol w:w="6760"/>
-        <w:gridCol w:w="1500"/>
+        <w:gridCol w:w="5560"/>
+        <w:gridCol w:w="2700"/>
         <w:gridCol w:w="1100"/>
       </w:tblGrid>
       <w:tr>
@@ -16366,7 +16298,7 @@
         </w:trPr>
         <w:tc>
           <w:tcPr>
-            <w:tcW w:type="dxa" w:w="6760"/>
+            <w:tcW w:type="dxa" w:w="5560"/>
             <w:tcBorders>
               <w:top w:val="none" w:color="FFFFFF" w:sz="0"/>
               <w:left w:val="single" w:color="B8860B" w:sz="24" w:space="10"/>
@@ -16400,7 +16332,7 @@
         </w:tc>
         <w:tc>
           <w:tcPr>
-            <w:tcW w:type="dxa" w:w="1500"/>
+            <w:tcW w:type="dxa" w:w="2700"/>
             <w:tcBorders>
               <w:top w:val="none" w:color="FFFFFF" w:sz="0"/>
               <w:left w:val="none" w:color="FFFFFF" w:sz="0"/>
@@ -16428,7 +16360,7 @@
                 <w:sz w:val="20"/>
                 <w:szCs w:val="20"/>
               </w:rPr>
-              <w:t xml:space="preserve">Empathy hours</w:t>
+              <w:t xml:space="preserve">Empathy practice hours</w:t>
             </w:r>
           </w:p>
         </w:tc>
@@ -16595,7 +16527,7 @@
       <w:tr>
         <w:trPr>
           <w:cantSplit/>
-          <w:trHeight w:val="1380" w:hRule="atLeast"/>
+          <w:trHeight w:val="340" w:hRule="atLeast"/>
         </w:trPr>
         <w:tc>
           <w:tcPr>
@@ -16822,7 +16754,7 @@
       <w:tr>
         <w:trPr>
           <w:cantSplit/>
-          <w:trHeight w:val="1414" w:hRule="atLeast"/>
+          <w:trHeight w:val="340" w:hRule="atLeast"/>
         </w:trPr>
         <w:tc>
           <w:tcPr>
@@ -16921,40 +16853,6 @@
         </w:rPr>
         <w:t xml:space="preserve"> Again, consider sharing your experience with this exercise on our Community Forum.</w:t>
       </w:r>
-    </w:p>
-    <w:p>
-      <w:pPr>
-        <w:keepLines/>
-        <w:spacing w:after="60" w:before="0" w:line="276" w:lineRule="auto"/>
-      </w:pPr>
-      <w:hyperlink w:history="1" r:id="rIdoysm9s1lby4ni6l8ddrf4">
-        <w:r>
-          <w:rPr>
-            <w:color w:val="1155CC"/>
-            <w:sz w:val="20"/>
-            <w:szCs w:val="20"/>
-            <w:u w:val="single"/>
-          </w:rPr>
-          <w:t xml:space="preserve">New to the GCN? Click Here to Join</w:t>
-        </w:r>
-      </w:hyperlink>
-    </w:p>
-    <w:p>
-      <w:pPr>
-        <w:keepLines/>
-        <w:spacing w:after="60" w:before="0" w:line="276" w:lineRule="auto"/>
-      </w:pPr>
-      <w:hyperlink w:history="1" r:id="rId2_lc4vsptc1szfrj77y8o">
-        <w:r>
-          <w:rPr>
-            <w:color w:val="1155CC"/>
-            <w:sz w:val="20"/>
-            <w:szCs w:val="20"/>
-            <w:u w:val="single"/>
-          </w:rPr>
-          <w:t xml:space="preserve">GCN Members Click Here to Access it</w:t>
-        </w:r>
-      </w:hyperlink>
     </w:p>
     <w:tbl>
       <w:tblPr>
@@ -17013,7 +16911,7 @@
       <w:tr>
         <w:trPr>
           <w:cantSplit/>
-          <w:trHeight w:val="1414" w:hRule="atLeast"/>
+          <w:trHeight w:val="340" w:hRule="atLeast"/>
         </w:trPr>
         <w:tc>
           <w:tcPr>
@@ -17066,8 +16964,8 @@
         </w:tblBorders>
       </w:tblPr>
       <w:tblGrid>
-        <w:gridCol w:w="6760"/>
-        <w:gridCol w:w="1500"/>
+        <w:gridCol w:w="5560"/>
+        <w:gridCol w:w="2700"/>
         <w:gridCol w:w="1100"/>
       </w:tblGrid>
       <w:tr>
@@ -17076,7 +16974,7 @@
         </w:trPr>
         <w:tc>
           <w:tcPr>
-            <w:tcW w:type="dxa" w:w="6760"/>
+            <w:tcW w:type="dxa" w:w="5560"/>
             <w:tcBorders>
               <w:top w:val="none" w:color="FFFFFF" w:sz="0"/>
               <w:left w:val="single" w:color="B8860B" w:sz="24" w:space="10"/>
@@ -17110,7 +17008,7 @@
         </w:tc>
         <w:tc>
           <w:tcPr>
-            <w:tcW w:type="dxa" w:w="1500"/>
+            <w:tcW w:type="dxa" w:w="2700"/>
             <w:tcBorders>
               <w:top w:val="none" w:color="FFFFFF" w:sz="0"/>
               <w:left w:val="none" w:color="FFFFFF" w:sz="0"/>
@@ -17138,7 +17036,7 @@
                 <w:sz w:val="20"/>
                 <w:szCs w:val="20"/>
               </w:rPr>
-              <w:t xml:space="preserve">Empathy hours</w:t>
+              <w:t xml:space="preserve">Empathy practice hours</w:t>
             </w:r>
           </w:p>
         </w:tc>
@@ -17305,7 +17203,7 @@
       <w:tr>
         <w:trPr>
           <w:cantSplit/>
-          <w:trHeight w:val="798" w:hRule="atLeast"/>
+          <w:trHeight w:val="340" w:hRule="atLeast"/>
         </w:trPr>
         <w:tc>
           <w:tcPr>
@@ -17516,7 +17414,7 @@
       <w:tr>
         <w:trPr>
           <w:cantSplit/>
-          <w:trHeight w:val="616" w:hRule="atLeast"/>
+          <w:trHeight w:val="340" w:hRule="atLeast"/>
         </w:trPr>
         <w:tc>
           <w:tcPr>
@@ -17663,7 +17561,7 @@
       <w:tr>
         <w:trPr>
           <w:cantSplit/>
-          <w:trHeight w:val="616" w:hRule="atLeast"/>
+          <w:trHeight w:val="340" w:hRule="atLeast"/>
         </w:trPr>
         <w:tc>
           <w:tcPr>
@@ -17832,7 +17730,7 @@
       <w:tr>
         <w:trPr>
           <w:cantSplit/>
-          <w:trHeight w:val="616" w:hRule="atLeast"/>
+          <w:trHeight w:val="340" w:hRule="atLeast"/>
         </w:trPr>
         <w:tc>
           <w:tcPr>
@@ -17885,8 +17783,8 @@
         </w:tblBorders>
       </w:tblPr>
       <w:tblGrid>
-        <w:gridCol w:w="6760"/>
-        <w:gridCol w:w="1500"/>
+        <w:gridCol w:w="5560"/>
+        <w:gridCol w:w="2700"/>
         <w:gridCol w:w="1100"/>
       </w:tblGrid>
       <w:tr>
@@ -17895,7 +17793,7 @@
         </w:trPr>
         <w:tc>
           <w:tcPr>
-            <w:tcW w:type="dxa" w:w="6760"/>
+            <w:tcW w:type="dxa" w:w="5560"/>
             <w:tcBorders>
               <w:top w:val="none" w:color="FFFFFF" w:sz="0"/>
               <w:left w:val="single" w:color="B8860B" w:sz="24" w:space="10"/>
@@ -17929,7 +17827,7 @@
         </w:tc>
         <w:tc>
           <w:tcPr>
-            <w:tcW w:type="dxa" w:w="1500"/>
+            <w:tcW w:type="dxa" w:w="2700"/>
             <w:tcBorders>
               <w:top w:val="none" w:color="FFFFFF" w:sz="0"/>
               <w:left w:val="none" w:color="FFFFFF" w:sz="0"/>
@@ -17957,7 +17855,7 @@
                 <w:sz w:val="20"/>
                 <w:szCs w:val="20"/>
               </w:rPr>
-              <w:t xml:space="preserve">Empathy hours</w:t>
+              <w:t xml:space="preserve">Empathy practice hours</w:t>
             </w:r>
           </w:p>
         </w:tc>
@@ -18124,7 +18022,7 @@
       <w:tr>
         <w:trPr>
           <w:cantSplit/>
-          <w:trHeight w:val="521" w:hRule="atLeast"/>
+          <w:trHeight w:val="340" w:hRule="atLeast"/>
         </w:trPr>
         <w:tc>
           <w:tcPr>
@@ -18690,7 +18588,7 @@
       <w:tr>
         <w:trPr>
           <w:cantSplit/>
-          <w:trHeight w:val="820" w:hRule="atLeast"/>
+          <w:trHeight w:val="340" w:hRule="atLeast"/>
         </w:trPr>
         <w:tc>
           <w:tcPr>
@@ -18801,40 +18699,6 @@
         </w:rPr>
         <w:t xml:space="preserve">You may want to share your experience on the GCN.</w:t>
       </w:r>
-    </w:p>
-    <w:p>
-      <w:pPr>
-        <w:keepLines/>
-        <w:spacing w:after="60" w:before="0" w:line="276" w:lineRule="auto"/>
-      </w:pPr>
-      <w:hyperlink w:history="1" r:id="rIdhxrfow0ygx-lh_4iyecih">
-        <w:r>
-          <w:rPr>
-            <w:color w:val="1155CC"/>
-            <w:sz w:val="20"/>
-            <w:szCs w:val="20"/>
-            <w:u w:val="single"/>
-          </w:rPr>
-          <w:t xml:space="preserve">New to the GCN? Click Here to Join</w:t>
-        </w:r>
-      </w:hyperlink>
-    </w:p>
-    <w:p>
-      <w:pPr>
-        <w:keepLines/>
-        <w:spacing w:after="60" w:before="0" w:line="276" w:lineRule="auto"/>
-      </w:pPr>
-      <w:hyperlink w:history="1" r:id="rIdud8yiuivp4cp7cw4jpqfy">
-        <w:r>
-          <w:rPr>
-            <w:color w:val="1155CC"/>
-            <w:sz w:val="20"/>
-            <w:szCs w:val="20"/>
-            <w:u w:val="single"/>
-          </w:rPr>
-          <w:t xml:space="preserve">GCN Members Click Here to Access it</w:t>
-        </w:r>
-      </w:hyperlink>
     </w:p>
     <w:tbl>
       <w:tblPr>
@@ -18893,7 +18757,7 @@
       <w:tr>
         <w:trPr>
           <w:cantSplit/>
-          <w:trHeight w:val="820" w:hRule="atLeast"/>
+          <w:trHeight w:val="340" w:hRule="atLeast"/>
         </w:trPr>
         <w:tc>
           <w:tcPr>
@@ -18946,8 +18810,8 @@
         </w:tblBorders>
       </w:tblPr>
       <w:tblGrid>
-        <w:gridCol w:w="6760"/>
-        <w:gridCol w:w="1500"/>
+        <w:gridCol w:w="5560"/>
+        <w:gridCol w:w="2700"/>
         <w:gridCol w:w="1100"/>
       </w:tblGrid>
       <w:tr>
@@ -18956,7 +18820,7 @@
         </w:trPr>
         <w:tc>
           <w:tcPr>
-            <w:tcW w:type="dxa" w:w="6760"/>
+            <w:tcW w:type="dxa" w:w="5560"/>
             <w:tcBorders>
               <w:top w:val="none" w:color="FFFFFF" w:sz="0"/>
               <w:left w:val="single" w:color="B8860B" w:sz="24" w:space="10"/>
@@ -18990,7 +18854,7 @@
         </w:tc>
         <w:tc>
           <w:tcPr>
-            <w:tcW w:type="dxa" w:w="1500"/>
+            <w:tcW w:type="dxa" w:w="2700"/>
             <w:tcBorders>
               <w:top w:val="none" w:color="FFFFFF" w:sz="0"/>
               <w:left w:val="none" w:color="FFFFFF" w:sz="0"/>
@@ -19018,7 +18882,7 @@
                 <w:sz w:val="20"/>
                 <w:szCs w:val="20"/>
               </w:rPr>
-              <w:t xml:space="preserve">Empathy hours</w:t>
+              <w:t xml:space="preserve">Empathy practice hours</w:t>
             </w:r>
           </w:p>
         </w:tc>
@@ -19185,7 +19049,7 @@
       <w:tr>
         <w:trPr>
           <w:cantSplit/>
-          <w:trHeight w:val="1300" w:hRule="atLeast"/>
+          <w:trHeight w:val="340" w:hRule="atLeast"/>
         </w:trPr>
         <w:tc>
           <w:tcPr>
@@ -19588,7 +19452,7 @@
       <w:tr>
         <w:trPr>
           <w:cantSplit/>
-          <w:trHeight w:val="820" w:hRule="atLeast"/>
+          <w:trHeight w:val="340" w:hRule="atLeast"/>
         </w:trPr>
         <w:tc>
           <w:tcPr>
@@ -19761,7 +19625,7 @@
       <w:tr>
         <w:trPr>
           <w:cantSplit/>
-          <w:trHeight w:val="820" w:hRule="atLeast"/>
+          <w:trHeight w:val="340" w:hRule="atLeast"/>
         </w:trPr>
         <w:tc>
           <w:tcPr>
@@ -19922,7 +19786,7 @@
       <w:tr>
         <w:trPr>
           <w:cantSplit/>
-          <w:trHeight w:val="820" w:hRule="atLeast"/>
+          <w:trHeight w:val="340" w:hRule="atLeast"/>
         </w:trPr>
         <w:tc>
           <w:tcPr>
@@ -20087,40 +19951,6 @@
         </w:rPr>
         <w:t xml:space="preserve">“If you want to travel far, go with others.”</w:t>
       </w:r>
-    </w:p>
-    <w:p>
-      <w:pPr>
-        <w:keepLines/>
-        <w:spacing w:after="60" w:before="0" w:line="276" w:lineRule="auto"/>
-      </w:pPr>
-      <w:hyperlink w:history="1" r:id="rIdwiwi2kwixaqoopj87ir5d">
-        <w:r>
-          <w:rPr>
-            <w:color w:val="1155CC"/>
-            <w:sz w:val="20"/>
-            <w:szCs w:val="20"/>
-            <w:u w:val="single"/>
-          </w:rPr>
-          <w:t xml:space="preserve">New to the GCN? Click Here to Join</w:t>
-        </w:r>
-      </w:hyperlink>
-    </w:p>
-    <w:p>
-      <w:pPr>
-        <w:keepLines/>
-        <w:spacing w:after="60" w:before="0" w:line="276" w:lineRule="auto"/>
-      </w:pPr>
-      <w:hyperlink w:history="1" r:id="rIdv5f8dyzloct-ydrcsyzxw">
-        <w:r>
-          <w:rPr>
-            <w:color w:val="1155CC"/>
-            <w:sz w:val="20"/>
-            <w:szCs w:val="20"/>
-            <w:u w:val="single"/>
-          </w:rPr>
-          <w:t xml:space="preserve">GCN Members Click Here to Access it</w:t>
-        </w:r>
-      </w:hyperlink>
     </w:p>
     <w:tbl>
       <w:tblPr>
@@ -20179,7 +20009,7 @@
       <w:tr>
         <w:trPr>
           <w:cantSplit/>
-          <w:trHeight w:val="820" w:hRule="atLeast"/>
+          <w:trHeight w:val="340" w:hRule="atLeast"/>
         </w:trPr>
         <w:tc>
           <w:tcPr>
@@ -20232,8 +20062,8 @@
         </w:tblBorders>
       </w:tblPr>
       <w:tblGrid>
-        <w:gridCol w:w="6760"/>
-        <w:gridCol w:w="1500"/>
+        <w:gridCol w:w="5560"/>
+        <w:gridCol w:w="2700"/>
         <w:gridCol w:w="1100"/>
       </w:tblGrid>
       <w:tr>
@@ -20242,7 +20072,7 @@
         </w:trPr>
         <w:tc>
           <w:tcPr>
-            <w:tcW w:type="dxa" w:w="6760"/>
+            <w:tcW w:type="dxa" w:w="5560"/>
             <w:tcBorders>
               <w:top w:val="none" w:color="FFFFFF" w:sz="0"/>
               <w:left w:val="single" w:color="B8860B" w:sz="24" w:space="10"/>
@@ -20276,7 +20106,7 @@
         </w:tc>
         <w:tc>
           <w:tcPr>
-            <w:tcW w:type="dxa" w:w="1500"/>
+            <w:tcW w:type="dxa" w:w="2700"/>
             <w:tcBorders>
               <w:top w:val="none" w:color="FFFFFF" w:sz="0"/>
               <w:left w:val="none" w:color="FFFFFF" w:sz="0"/>
@@ -20304,7 +20134,7 @@
                 <w:sz w:val="20"/>
                 <w:szCs w:val="20"/>
               </w:rPr>
-              <w:t xml:space="preserve">Empathy hours</w:t>
+              <w:t xml:space="preserve">Empathy practice hours</w:t>
             </w:r>
           </w:p>
         </w:tc>
@@ -20471,7 +20301,7 @@
       <w:tr>
         <w:trPr>
           <w:cantSplit/>
-          <w:trHeight w:val="1300" w:hRule="atLeast"/>
+          <w:trHeight w:val="340" w:hRule="atLeast"/>
         </w:trPr>
         <w:tc>
           <w:tcPr>
@@ -20746,7 +20576,7 @@
       <w:tr>
         <w:trPr>
           <w:cantSplit/>
-          <w:trHeight w:val="2150" w:hRule="atLeast"/>
+          <w:trHeight w:val="340" w:hRule="atLeast"/>
         </w:trPr>
         <w:tc>
           <w:tcPr>
@@ -20809,40 +20639,6 @@
         </w:rPr>
         <w:t xml:space="preserve">Join or post on our Community Forum (it's not too late). Consider sharing any stories or experiences you have had pursuing your life of compassion.</w:t>
       </w:r>
-    </w:p>
-    <w:p>
-      <w:pPr>
-        <w:keepLines/>
-        <w:spacing w:after="60" w:before="0" w:line="276" w:lineRule="auto"/>
-      </w:pPr>
-      <w:hyperlink w:history="1" r:id="rIdrwvrjukrffkodoclwkf_m">
-        <w:r>
-          <w:rPr>
-            <w:color w:val="1155CC"/>
-            <w:sz w:val="20"/>
-            <w:szCs w:val="20"/>
-            <w:u w:val="single"/>
-          </w:rPr>
-          <w:t xml:space="preserve">New to the GCN? Click Here to Join</w:t>
-        </w:r>
-      </w:hyperlink>
-    </w:p>
-    <w:p>
-      <w:pPr>
-        <w:keepLines/>
-        <w:spacing w:after="60" w:before="0" w:line="276" w:lineRule="auto"/>
-      </w:pPr>
-      <w:hyperlink w:history="1" r:id="rId3rpiut9wyzdoihkhzlhlp">
-        <w:r>
-          <w:rPr>
-            <w:color w:val="1155CC"/>
-            <w:sz w:val="20"/>
-            <w:szCs w:val="20"/>
-            <w:u w:val="single"/>
-          </w:rPr>
-          <w:t xml:space="preserve">GCN Members Click Here to Access it</w:t>
-        </w:r>
-      </w:hyperlink>
     </w:p>
     <w:tbl>
       <w:tblPr>
@@ -20901,7 +20697,7 @@
       <w:tr>
         <w:trPr>
           <w:cantSplit/>
-          <w:trHeight w:val="2150" w:hRule="atLeast"/>
+          <w:trHeight w:val="340" w:hRule="atLeast"/>
         </w:trPr>
         <w:tc>
           <w:tcPr>
@@ -20954,8 +20750,8 @@
         </w:tblBorders>
       </w:tblPr>
       <w:tblGrid>
-        <w:gridCol w:w="6760"/>
-        <w:gridCol w:w="1500"/>
+        <w:gridCol w:w="5560"/>
+        <w:gridCol w:w="2700"/>
         <w:gridCol w:w="1100"/>
       </w:tblGrid>
       <w:tr>
@@ -20964,7 +20760,7 @@
         </w:trPr>
         <w:tc>
           <w:tcPr>
-            <w:tcW w:type="dxa" w:w="6760"/>
+            <w:tcW w:type="dxa" w:w="5560"/>
             <w:tcBorders>
               <w:top w:val="none" w:color="FFFFFF" w:sz="0"/>
               <w:left w:val="single" w:color="B8860B" w:sz="24" w:space="10"/>
@@ -20998,7 +20794,7 @@
         </w:tc>
         <w:tc>
           <w:tcPr>
-            <w:tcW w:type="dxa" w:w="1500"/>
+            <w:tcW w:type="dxa" w:w="2700"/>
             <w:tcBorders>
               <w:top w:val="none" w:color="FFFFFF" w:sz="0"/>
               <w:left w:val="none" w:color="FFFFFF" w:sz="0"/>
@@ -21026,7 +20822,7 @@
                 <w:sz w:val="20"/>
                 <w:szCs w:val="20"/>
               </w:rPr>
-              <w:t xml:space="preserve">Empathy hours</w:t>
+              <w:t xml:space="preserve">Empathy practice hours</w:t>
             </w:r>
           </w:p>
         </w:tc>
@@ -21193,7 +20989,7 @@
       <w:tr>
         <w:trPr>
           <w:cantSplit/>
-          <w:trHeight w:val="1213" w:hRule="atLeast"/>
+          <w:trHeight w:val="340" w:hRule="atLeast"/>
         </w:trPr>
         <w:tc>
           <w:tcPr>
@@ -21404,7 +21200,7 @@
       <w:tr>
         <w:trPr>
           <w:cantSplit/>
-          <w:trHeight w:val="779" w:hRule="atLeast"/>
+          <w:trHeight w:val="340" w:hRule="atLeast"/>
         </w:trPr>
         <w:tc>
           <w:tcPr>
@@ -21573,7 +21369,7 @@
       <w:tr>
         <w:trPr>
           <w:cantSplit/>
-          <w:trHeight w:val="779" w:hRule="atLeast"/>
+          <w:trHeight w:val="340" w:hRule="atLeast"/>
         </w:trPr>
         <w:tc>
           <w:tcPr>
@@ -21652,40 +21448,6 @@
         </w:rPr>
         <w:t xml:space="preserve">Note: I can not express in these few words, how powerful this practice is. In past years, this has been a pivotal experience for many of the Compassion Course participants. Consider sharing your experience with this exercise on the GCN so that others might understand and perhaps be inspired.</w:t>
       </w:r>
-    </w:p>
-    <w:p>
-      <w:pPr>
-        <w:keepLines/>
-        <w:spacing w:after="60" w:before="0" w:line="276" w:lineRule="auto"/>
-      </w:pPr>
-      <w:hyperlink w:history="1" r:id="rIdhtduy48gjaqe28h6grzqt">
-        <w:r>
-          <w:rPr>
-            <w:color w:val="1155CC"/>
-            <w:sz w:val="20"/>
-            <w:szCs w:val="20"/>
-            <w:u w:val="single"/>
-          </w:rPr>
-          <w:t xml:space="preserve">New to the GCN? Click Here to Join</w:t>
-        </w:r>
-      </w:hyperlink>
-    </w:p>
-    <w:p>
-      <w:pPr>
-        <w:keepLines/>
-        <w:spacing w:after="60" w:before="0" w:line="276" w:lineRule="auto"/>
-      </w:pPr>
-      <w:hyperlink w:history="1" r:id="rIdivd94l6ed3lbofz2b9oz9">
-        <w:r>
-          <w:rPr>
-            <w:color w:val="1155CC"/>
-            <w:sz w:val="20"/>
-            <w:szCs w:val="20"/>
-            <w:u w:val="single"/>
-          </w:rPr>
-          <w:t xml:space="preserve">GCN Members Click Here to Access it</w:t>
-        </w:r>
-      </w:hyperlink>
     </w:p>
     <w:tbl>
       <w:tblPr>
@@ -21744,7 +21506,7 @@
       <w:tr>
         <w:trPr>
           <w:cantSplit/>
-          <w:trHeight w:val="779" w:hRule="atLeast"/>
+          <w:trHeight w:val="340" w:hRule="atLeast"/>
         </w:trPr>
         <w:tc>
           <w:tcPr>
@@ -21797,8 +21559,8 @@
         </w:tblBorders>
       </w:tblPr>
       <w:tblGrid>
-        <w:gridCol w:w="6760"/>
-        <w:gridCol w:w="1500"/>
+        <w:gridCol w:w="5560"/>
+        <w:gridCol w:w="2700"/>
         <w:gridCol w:w="1100"/>
       </w:tblGrid>
       <w:tr>
@@ -21807,7 +21569,7 @@
         </w:trPr>
         <w:tc>
           <w:tcPr>
-            <w:tcW w:type="dxa" w:w="6760"/>
+            <w:tcW w:type="dxa" w:w="5560"/>
             <w:tcBorders>
               <w:top w:val="none" w:color="FFFFFF" w:sz="0"/>
               <w:left w:val="single" w:color="B8860B" w:sz="24" w:space="10"/>
@@ -21841,7 +21603,7 @@
         </w:tc>
         <w:tc>
           <w:tcPr>
-            <w:tcW w:type="dxa" w:w="1500"/>
+            <w:tcW w:type="dxa" w:w="2700"/>
             <w:tcBorders>
               <w:top w:val="none" w:color="FFFFFF" w:sz="0"/>
               <w:left w:val="none" w:color="FFFFFF" w:sz="0"/>
@@ -21869,7 +21631,7 @@
                 <w:sz w:val="20"/>
                 <w:szCs w:val="20"/>
               </w:rPr>
-              <w:t xml:space="preserve">Empathy hours</w:t>
+              <w:t xml:space="preserve">Empathy practice hours</w:t>
             </w:r>
           </w:p>
         </w:tc>
@@ -22036,7 +21798,7 @@
       <w:tr>
         <w:trPr>
           <w:cantSplit/>
-          <w:trHeight w:val="660" w:hRule="atLeast"/>
+          <w:trHeight w:val="340" w:hRule="atLeast"/>
         </w:trPr>
         <w:tc>
           <w:tcPr>
@@ -22247,7 +22009,7 @@
       <w:tr>
         <w:trPr>
           <w:cantSplit/>
-          <w:trHeight w:val="240" w:hRule="atLeast"/>
+          <w:trHeight w:val="340" w:hRule="atLeast"/>
         </w:trPr>
         <w:tc>
           <w:tcPr>
@@ -22400,7 +22162,7 @@
       <w:tr>
         <w:trPr>
           <w:cantSplit/>
-          <w:trHeight w:val="240" w:hRule="atLeast"/>
+          <w:trHeight w:val="340" w:hRule="atLeast"/>
         </w:trPr>
         <w:tc>
           <w:tcPr>
@@ -22463,7 +22225,7 @@
         </w:rPr>
         <w:t xml:space="preserve">You may want to find some quiet space and time for this exercise. Start by going to the </w:t>
       </w:r>
-      <w:hyperlink w:history="1" r:id="rIdv2suknr_s1odjrvbwweqe">
+      <w:hyperlink w:history="1" r:id="rIdpsulnsbxbnwnivdt8zyx8">
         <w:r>
           <w:rPr>
             <w:color w:val="1155CC"/>
@@ -22624,40 +22386,6 @@
         </w:rPr>
         <w:t xml:space="preserve">Consider reviewing the following embodiment meditation from my podcast: CLICK HERE.</w:t>
       </w:r>
-    </w:p>
-    <w:p>
-      <w:pPr>
-        <w:keepLines/>
-        <w:spacing w:after="60" w:before="0" w:line="276" w:lineRule="auto"/>
-      </w:pPr>
-      <w:hyperlink w:history="1" r:id="rIdxvugnnohehzu_iqkgpwy4">
-        <w:r>
-          <w:rPr>
-            <w:color w:val="1155CC"/>
-            <w:sz w:val="20"/>
-            <w:szCs w:val="20"/>
-            <w:u w:val="single"/>
-          </w:rPr>
-          <w:t xml:space="preserve">New to the GCN? Click Here to Join</w:t>
-        </w:r>
-      </w:hyperlink>
-    </w:p>
-    <w:p>
-      <w:pPr>
-        <w:keepLines/>
-        <w:spacing w:after="60" w:before="0" w:line="276" w:lineRule="auto"/>
-      </w:pPr>
-      <w:hyperlink w:history="1" r:id="rIdobnkctqxk5renzwijjyqy">
-        <w:r>
-          <w:rPr>
-            <w:color w:val="1155CC"/>
-            <w:sz w:val="20"/>
-            <w:szCs w:val="20"/>
-            <w:u w:val="single"/>
-          </w:rPr>
-          <w:t xml:space="preserve">GCN Members Click Here to Access it</w:t>
-        </w:r>
-      </w:hyperlink>
     </w:p>
     <w:tbl>
       <w:tblPr>
@@ -22716,7 +22444,7 @@
       <w:tr>
         <w:trPr>
           <w:cantSplit/>
-          <w:trHeight w:val="240" w:hRule="atLeast"/>
+          <w:trHeight w:val="340" w:hRule="atLeast"/>
         </w:trPr>
         <w:tc>
           <w:tcPr>
@@ -22769,8 +22497,8 @@
         </w:tblBorders>
       </w:tblPr>
       <w:tblGrid>
-        <w:gridCol w:w="6760"/>
-        <w:gridCol w:w="1500"/>
+        <w:gridCol w:w="5560"/>
+        <w:gridCol w:w="2700"/>
         <w:gridCol w:w="1100"/>
       </w:tblGrid>
       <w:tr>
@@ -22779,7 +22507,7 @@
         </w:trPr>
         <w:tc>
           <w:tcPr>
-            <w:tcW w:type="dxa" w:w="6760"/>
+            <w:tcW w:type="dxa" w:w="5560"/>
             <w:tcBorders>
               <w:top w:val="none" w:color="FFFFFF" w:sz="0"/>
               <w:left w:val="single" w:color="B8860B" w:sz="24" w:space="10"/>
@@ -22813,7 +22541,7 @@
         </w:tc>
         <w:tc>
           <w:tcPr>
-            <w:tcW w:type="dxa" w:w="1500"/>
+            <w:tcW w:type="dxa" w:w="2700"/>
             <w:tcBorders>
               <w:top w:val="none" w:color="FFFFFF" w:sz="0"/>
               <w:left w:val="none" w:color="FFFFFF" w:sz="0"/>
@@ -22841,7 +22569,7 @@
                 <w:sz w:val="20"/>
                 <w:szCs w:val="20"/>
               </w:rPr>
-              <w:t xml:space="preserve">Empathy hours</w:t>
+              <w:t xml:space="preserve">Empathy practice hours</w:t>
             </w:r>
           </w:p>
         </w:tc>
@@ -23008,7 +22736,7 @@
       <w:tr>
         <w:trPr>
           <w:cantSplit/>
-          <w:trHeight w:val="320" w:hRule="atLeast"/>
+          <w:trHeight w:val="340" w:hRule="atLeast"/>
         </w:trPr>
         <w:tc>
           <w:tcPr>
@@ -23181,7 +22909,7 @@
         </w:rPr>
         <w:t xml:space="preserve"> exercise at: http://</w:t>
       </w:r>
-      <w:hyperlink w:history="1" r:id="rIdsrb6xnznkhedcxjq_ydsg">
+      <w:hyperlink w:history="1" r:id="rIdhualkm3obgmzk9tmzlek_">
         <w:r>
           <w:rPr>
             <w:color w:val="1155CC"/>
@@ -23424,7 +23152,7 @@
       <w:tr>
         <w:trPr>
           <w:cantSplit/>
-          <w:trHeight w:val="1337" w:hRule="atLeast"/>
+          <w:trHeight w:val="340" w:hRule="atLeast"/>
         </w:trPr>
         <w:tc>
           <w:tcPr>
@@ -23487,40 +23215,6 @@
         </w:rPr>
         <w:t xml:space="preserve">Go back and reread Weeks 3, 7, 13 and 15.</w:t>
       </w:r>
-    </w:p>
-    <w:p>
-      <w:pPr>
-        <w:keepLines/>
-        <w:spacing w:after="60" w:before="0" w:line="276" w:lineRule="auto"/>
-      </w:pPr>
-      <w:hyperlink w:history="1" r:id="rIdlhasjbu6hhbcky0oqooub">
-        <w:r>
-          <w:rPr>
-            <w:color w:val="1155CC"/>
-            <w:sz w:val="20"/>
-            <w:szCs w:val="20"/>
-            <w:u w:val="single"/>
-          </w:rPr>
-          <w:t xml:space="preserve">New to the GCN? Click Here to Join</w:t>
-        </w:r>
-      </w:hyperlink>
-    </w:p>
-    <w:p>
-      <w:pPr>
-        <w:keepLines/>
-        <w:spacing w:after="60" w:before="0" w:line="276" w:lineRule="auto"/>
-      </w:pPr>
-      <w:hyperlink w:history="1" r:id="rIdj5pv77pxgvmwwddlw3hme">
-        <w:r>
-          <w:rPr>
-            <w:color w:val="1155CC"/>
-            <w:sz w:val="20"/>
-            <w:szCs w:val="20"/>
-            <w:u w:val="single"/>
-          </w:rPr>
-          <w:t xml:space="preserve">GCN Members Click Here to Access it</w:t>
-        </w:r>
-      </w:hyperlink>
     </w:p>
     <w:tbl>
       <w:tblPr>
@@ -23579,7 +23273,7 @@
       <w:tr>
         <w:trPr>
           <w:cantSplit/>
-          <w:trHeight w:val="1337" w:hRule="atLeast"/>
+          <w:trHeight w:val="340" w:hRule="atLeast"/>
         </w:trPr>
         <w:tc>
           <w:tcPr>
@@ -23632,8 +23326,8 @@
         </w:tblBorders>
       </w:tblPr>
       <w:tblGrid>
-        <w:gridCol w:w="6760"/>
-        <w:gridCol w:w="1500"/>
+        <w:gridCol w:w="5560"/>
+        <w:gridCol w:w="2700"/>
         <w:gridCol w:w="1100"/>
       </w:tblGrid>
       <w:tr>
@@ -23642,7 +23336,7 @@
         </w:trPr>
         <w:tc>
           <w:tcPr>
-            <w:tcW w:type="dxa" w:w="6760"/>
+            <w:tcW w:type="dxa" w:w="5560"/>
             <w:tcBorders>
               <w:top w:val="none" w:color="FFFFFF" w:sz="0"/>
               <w:left w:val="single" w:color="B8860B" w:sz="24" w:space="10"/>
@@ -23676,7 +23370,7 @@
         </w:tc>
         <w:tc>
           <w:tcPr>
-            <w:tcW w:type="dxa" w:w="1500"/>
+            <w:tcW w:type="dxa" w:w="2700"/>
             <w:tcBorders>
               <w:top w:val="none" w:color="FFFFFF" w:sz="0"/>
               <w:left w:val="none" w:color="FFFFFF" w:sz="0"/>
@@ -23704,7 +23398,7 @@
                 <w:sz w:val="20"/>
                 <w:szCs w:val="20"/>
               </w:rPr>
-              <w:t xml:space="preserve">Empathy hours</w:t>
+              <w:t xml:space="preserve">Empathy practice hours</w:t>
             </w:r>
           </w:p>
         </w:tc>
@@ -23871,7 +23565,7 @@
       <w:tr>
         <w:trPr>
           <w:cantSplit/>
-          <w:trHeight w:val="755" w:hRule="atLeast"/>
+          <w:trHeight w:val="340" w:hRule="atLeast"/>
         </w:trPr>
         <w:tc>
           <w:tcPr>
@@ -24076,7 +23770,7 @@
         </w:rPr>
         <w:t xml:space="preserve">Either at that time, or later on, write down a word (or words) from the </w:t>
       </w:r>
-      <w:hyperlink w:history="1" r:id="rIda7sra7v00psfabqy13_h7">
+      <w:hyperlink w:history="1" r:id="rIdhnoap6gcvml-2akc9tcty">
         <w:r>
           <w:rPr>
             <w:color w:val="1155CC"/>
@@ -24113,7 +23807,7 @@
         </w:rPr>
         <w:t xml:space="preserve">Then look at the </w:t>
       </w:r>
-      <w:hyperlink w:history="1" r:id="rIdfjobo8xk9tlrzvbg9ivrb">
+      <w:hyperlink w:history="1" r:id="rId9ef57vmbs99uzr7xbkc6a">
         <w:r>
           <w:rPr>
             <w:color w:val="1155CC"/>
@@ -24240,7 +23934,7 @@
       <w:tr>
         <w:trPr>
           <w:cantSplit/>
-          <w:trHeight w:val="240" w:hRule="atLeast"/>
+          <w:trHeight w:val="340" w:hRule="atLeast"/>
         </w:trPr>
         <w:tc>
           <w:tcPr>
@@ -24377,7 +24071,7 @@
       <w:tr>
         <w:trPr>
           <w:cantSplit/>
-          <w:trHeight w:val="240" w:hRule="atLeast"/>
+          <w:trHeight w:val="340" w:hRule="atLeast"/>
         </w:trPr>
         <w:tc>
           <w:tcPr>
@@ -24520,40 +24214,6 @@
         </w:rPr>
         <w:t xml:space="preserve">.</w:t>
       </w:r>
-    </w:p>
-    <w:p>
-      <w:pPr>
-        <w:keepLines/>
-        <w:spacing w:after="60" w:before="0" w:line="276" w:lineRule="auto"/>
-      </w:pPr>
-      <w:hyperlink w:history="1" r:id="rIdjam7_zvwmbank6tnqhxrj">
-        <w:r>
-          <w:rPr>
-            <w:color w:val="1155CC"/>
-            <w:sz w:val="20"/>
-            <w:szCs w:val="20"/>
-            <w:u w:val="single"/>
-          </w:rPr>
-          <w:t xml:space="preserve">New to the GCN? Click Here to Join</w:t>
-        </w:r>
-      </w:hyperlink>
-    </w:p>
-    <w:p>
-      <w:pPr>
-        <w:keepLines/>
-        <w:spacing w:after="60" w:before="0" w:line="276" w:lineRule="auto"/>
-      </w:pPr>
-      <w:hyperlink w:history="1" r:id="rIdcnmzwux5l_prtamqis1a3">
-        <w:r>
-          <w:rPr>
-            <w:color w:val="1155CC"/>
-            <w:sz w:val="20"/>
-            <w:szCs w:val="20"/>
-            <w:u w:val="single"/>
-          </w:rPr>
-          <w:t xml:space="preserve">GCN Members Click Here to Access it</w:t>
-        </w:r>
-      </w:hyperlink>
     </w:p>
     <w:tbl>
       <w:tblPr>
@@ -24612,7 +24272,7 @@
       <w:tr>
         <w:trPr>
           <w:cantSplit/>
-          <w:trHeight w:val="240" w:hRule="atLeast"/>
+          <w:trHeight w:val="340" w:hRule="atLeast"/>
         </w:trPr>
         <w:tc>
           <w:tcPr>
@@ -24665,8 +24325,8 @@
         </w:tblBorders>
       </w:tblPr>
       <w:tblGrid>
-        <w:gridCol w:w="6760"/>
-        <w:gridCol w:w="1500"/>
+        <w:gridCol w:w="5560"/>
+        <w:gridCol w:w="2700"/>
         <w:gridCol w:w="1100"/>
       </w:tblGrid>
       <w:tr>
@@ -24675,7 +24335,7 @@
         </w:trPr>
         <w:tc>
           <w:tcPr>
-            <w:tcW w:type="dxa" w:w="6760"/>
+            <w:tcW w:type="dxa" w:w="5560"/>
             <w:tcBorders>
               <w:top w:val="none" w:color="FFFFFF" w:sz="0"/>
               <w:left w:val="single" w:color="B8860B" w:sz="24" w:space="10"/>
@@ -24709,7 +24369,7 @@
         </w:tc>
         <w:tc>
           <w:tcPr>
-            <w:tcW w:type="dxa" w:w="1500"/>
+            <w:tcW w:type="dxa" w:w="2700"/>
             <w:tcBorders>
               <w:top w:val="none" w:color="FFFFFF" w:sz="0"/>
               <w:left w:val="none" w:color="FFFFFF" w:sz="0"/>
@@ -24737,7 +24397,7 @@
                 <w:sz w:val="20"/>
                 <w:szCs w:val="20"/>
               </w:rPr>
-              <w:t xml:space="preserve">Empathy hours</w:t>
+              <w:t xml:space="preserve">Empathy practice hours</w:t>
             </w:r>
           </w:p>
         </w:tc>
@@ -24904,7 +24564,7 @@
       <w:tr>
         <w:trPr>
           <w:cantSplit/>
-          <w:trHeight w:val="320" w:hRule="atLeast"/>
+          <w:trHeight w:val="340" w:hRule="atLeast"/>
         </w:trPr>
         <w:tc>
           <w:tcPr>
@@ -25199,7 +24859,7 @@
       <w:tr>
         <w:trPr>
           <w:cantSplit/>
-          <w:trHeight w:val="1069" w:hRule="atLeast"/>
+          <w:trHeight w:val="340" w:hRule="atLeast"/>
         </w:trPr>
         <w:tc>
           <w:tcPr>
@@ -25262,40 +24922,6 @@
         </w:rPr>
         <w:t xml:space="preserve">Keep a small journal next to your bed. When you first wake up in the morning, write down the first feeling or feelings you notice. Do you have any unfulfilled feelings? Even tiny ones? Repeat this exercise until you identify any consistent unfulfilled feeling or feelings you may experience. Then, get or give yourself empathy about these feeling(s). See what you notice, including any requests you might make of yourself or others. Consider sharing your experience on our Community Forum.</w:t>
       </w:r>
-    </w:p>
-    <w:p>
-      <w:pPr>
-        <w:keepLines/>
-        <w:spacing w:after="60" w:before="0" w:line="276" w:lineRule="auto"/>
-      </w:pPr>
-      <w:hyperlink w:history="1" r:id="rIddfrhsspuloqzvtqjuhrj1">
-        <w:r>
-          <w:rPr>
-            <w:color w:val="1155CC"/>
-            <w:sz w:val="20"/>
-            <w:szCs w:val="20"/>
-            <w:u w:val="single"/>
-          </w:rPr>
-          <w:t xml:space="preserve">New to the GCN? Click Here to Join</w:t>
-        </w:r>
-      </w:hyperlink>
-    </w:p>
-    <w:p>
-      <w:pPr>
-        <w:keepLines/>
-        <w:spacing w:after="60" w:before="0" w:line="276" w:lineRule="auto"/>
-      </w:pPr>
-      <w:hyperlink w:history="1" r:id="rIdoneh9ldhorjpn-7ox7cvv">
-        <w:r>
-          <w:rPr>
-            <w:color w:val="1155CC"/>
-            <w:sz w:val="20"/>
-            <w:szCs w:val="20"/>
-            <w:u w:val="single"/>
-          </w:rPr>
-          <w:t xml:space="preserve">GCN Members Click Here to Access it</w:t>
-        </w:r>
-      </w:hyperlink>
     </w:p>
     <w:tbl>
       <w:tblPr>
@@ -25354,7 +24980,7 @@
       <w:tr>
         <w:trPr>
           <w:cantSplit/>
-          <w:trHeight w:val="1069" w:hRule="atLeast"/>
+          <w:trHeight w:val="340" w:hRule="atLeast"/>
         </w:trPr>
         <w:tc>
           <w:tcPr>
@@ -25407,8 +25033,8 @@
         </w:tblBorders>
       </w:tblPr>
       <w:tblGrid>
-        <w:gridCol w:w="6760"/>
-        <w:gridCol w:w="1500"/>
+        <w:gridCol w:w="5560"/>
+        <w:gridCol w:w="2700"/>
         <w:gridCol w:w="1100"/>
       </w:tblGrid>
       <w:tr>
@@ -25417,7 +25043,7 @@
         </w:trPr>
         <w:tc>
           <w:tcPr>
-            <w:tcW w:type="dxa" w:w="6760"/>
+            <w:tcW w:type="dxa" w:w="5560"/>
             <w:tcBorders>
               <w:top w:val="none" w:color="FFFFFF" w:sz="0"/>
               <w:left w:val="single" w:color="B8860B" w:sz="24" w:space="10"/>
@@ -25451,7 +25077,7 @@
         </w:tc>
         <w:tc>
           <w:tcPr>
-            <w:tcW w:type="dxa" w:w="1500"/>
+            <w:tcW w:type="dxa" w:w="2700"/>
             <w:tcBorders>
               <w:top w:val="none" w:color="FFFFFF" w:sz="0"/>
               <w:left w:val="none" w:color="FFFFFF" w:sz="0"/>
@@ -25479,7 +25105,7 @@
                 <w:sz w:val="20"/>
                 <w:szCs w:val="20"/>
               </w:rPr>
-              <w:t xml:space="preserve">Empathy hours</w:t>
+              <w:t xml:space="preserve">Empathy practice hours</w:t>
             </w:r>
           </w:p>
         </w:tc>
@@ -25646,7 +25272,7 @@
       <w:tr>
         <w:trPr>
           <w:cantSplit/>
-          <w:trHeight w:val="603" w:hRule="atLeast"/>
+          <w:trHeight w:val="340" w:hRule="atLeast"/>
         </w:trPr>
         <w:tc>
           <w:tcPr>
@@ -25835,7 +25461,7 @@
         </w:rPr>
         <w:t xml:space="preserve"> at http://</w:t>
       </w:r>
-      <w:hyperlink w:history="1" r:id="rIdwmfb5850nm6h0zufq_ssc">
+      <w:hyperlink w:history="1" r:id="rIdomtfh4avj9hv6yi3k7fde">
         <w:r>
           <w:rPr>
             <w:color w:val="1155CC"/>
@@ -25970,7 +25596,7 @@
       <w:tr>
         <w:trPr>
           <w:cantSplit/>
-          <w:trHeight w:val="946" w:hRule="atLeast"/>
+          <w:trHeight w:val="340" w:hRule="atLeast"/>
         </w:trPr>
         <w:tc>
           <w:tcPr>
@@ -26101,40 +25727,6 @@
         </w:rPr>
         <w:t xml:space="preserve">NOTE: Practice #2 requires the agreement of both parties to participate - both parties must want to resolve the conflict and take mutual responsibility and care to see it through (no small thing). That said, the rewards are almost always worth the time and energy.</w:t>
       </w:r>
-    </w:p>
-    <w:p>
-      <w:pPr>
-        <w:keepLines/>
-        <w:spacing w:after="60" w:before="0" w:line="276" w:lineRule="auto"/>
-      </w:pPr>
-      <w:hyperlink w:history="1" r:id="rIduszhl5wsaqhrz-kd98pg0">
-        <w:r>
-          <w:rPr>
-            <w:color w:val="1155CC"/>
-            <w:sz w:val="20"/>
-            <w:szCs w:val="20"/>
-            <w:u w:val="single"/>
-          </w:rPr>
-          <w:t xml:space="preserve">New to the GCN? Click Here to Join</w:t>
-        </w:r>
-      </w:hyperlink>
-    </w:p>
-    <w:p>
-      <w:pPr>
-        <w:keepLines/>
-        <w:spacing w:after="60" w:before="0" w:line="276" w:lineRule="auto"/>
-      </w:pPr>
-      <w:hyperlink w:history="1" r:id="rIdp6epxafdvzrtynqiydoea">
-        <w:r>
-          <w:rPr>
-            <w:color w:val="1155CC"/>
-            <w:sz w:val="20"/>
-            <w:szCs w:val="20"/>
-            <w:u w:val="single"/>
-          </w:rPr>
-          <w:t xml:space="preserve">GCN Members Click Here to Access it</w:t>
-        </w:r>
-      </w:hyperlink>
     </w:p>
     <w:tbl>
       <w:tblPr>
@@ -26193,7 +25785,7 @@
       <w:tr>
         <w:trPr>
           <w:cantSplit/>
-          <w:trHeight w:val="946" w:hRule="atLeast"/>
+          <w:trHeight w:val="340" w:hRule="atLeast"/>
         </w:trPr>
         <w:tc>
           <w:tcPr>
@@ -26246,8 +25838,8 @@
         </w:tblBorders>
       </w:tblPr>
       <w:tblGrid>
-        <w:gridCol w:w="6760"/>
-        <w:gridCol w:w="1500"/>
+        <w:gridCol w:w="5560"/>
+        <w:gridCol w:w="2700"/>
         <w:gridCol w:w="1100"/>
       </w:tblGrid>
       <w:tr>
@@ -26256,7 +25848,7 @@
         </w:trPr>
         <w:tc>
           <w:tcPr>
-            <w:tcW w:type="dxa" w:w="6760"/>
+            <w:tcW w:type="dxa" w:w="5560"/>
             <w:tcBorders>
               <w:top w:val="none" w:color="FFFFFF" w:sz="0"/>
               <w:left w:val="single" w:color="B8860B" w:sz="24" w:space="10"/>
@@ -26290,7 +25882,7 @@
         </w:tc>
         <w:tc>
           <w:tcPr>
-            <w:tcW w:type="dxa" w:w="1500"/>
+            <w:tcW w:type="dxa" w:w="2700"/>
             <w:tcBorders>
               <w:top w:val="none" w:color="FFFFFF" w:sz="0"/>
               <w:left w:val="none" w:color="FFFFFF" w:sz="0"/>
@@ -26318,7 +25910,7 @@
                 <w:sz w:val="20"/>
                 <w:szCs w:val="20"/>
               </w:rPr>
-              <w:t xml:space="preserve">Empathy hours</w:t>
+              <w:t xml:space="preserve">Empathy practice hours</w:t>
             </w:r>
           </w:p>
         </w:tc>
@@ -26485,7 +26077,7 @@
       <w:tr>
         <w:trPr>
           <w:cantSplit/>
-          <w:trHeight w:val="534" w:hRule="atLeast"/>
+          <w:trHeight w:val="340" w:hRule="atLeast"/>
         </w:trPr>
         <w:tc>
           <w:tcPr>
@@ -26732,7 +26324,7 @@
       <w:tr>
         <w:trPr>
           <w:cantSplit/>
-          <w:trHeight w:val="2004" w:hRule="atLeast"/>
+          <w:trHeight w:val="340" w:hRule="atLeast"/>
         </w:trPr>
         <w:tc>
           <w:tcPr>
@@ -26831,40 +26423,6 @@
         </w:rPr>
         <w:t xml:space="preserve">Next, write down your feelings and needs (the cause). Then, see if you can figure out how your need(s) might be met by changing your actions or making a request of yourself or others (see Week 13 and Week 15).</w:t>
       </w:r>
-    </w:p>
-    <w:p>
-      <w:pPr>
-        <w:keepLines/>
-        <w:spacing w:after="60" w:before="0" w:line="276" w:lineRule="auto"/>
-      </w:pPr>
-      <w:hyperlink w:history="1" r:id="rId-bgcnev2gryvwpqmonwq5">
-        <w:r>
-          <w:rPr>
-            <w:color w:val="1155CC"/>
-            <w:sz w:val="20"/>
-            <w:szCs w:val="20"/>
-            <w:u w:val="single"/>
-          </w:rPr>
-          <w:t xml:space="preserve">New to the GCN? Click Here to Join</w:t>
-        </w:r>
-      </w:hyperlink>
-    </w:p>
-    <w:p>
-      <w:pPr>
-        <w:keepLines/>
-        <w:spacing w:after="60" w:before="0" w:line="276" w:lineRule="auto"/>
-      </w:pPr>
-      <w:hyperlink w:history="1" r:id="rId1xgawg3u-xnyh-x9_exz5">
-        <w:r>
-          <w:rPr>
-            <w:color w:val="1155CC"/>
-            <w:sz w:val="20"/>
-            <w:szCs w:val="20"/>
-            <w:u w:val="single"/>
-          </w:rPr>
-          <w:t xml:space="preserve">GCN Members Click Here to Access it</w:t>
-        </w:r>
-      </w:hyperlink>
     </w:p>
     <w:tbl>
       <w:tblPr>
@@ -26923,7 +26481,7 @@
       <w:tr>
         <w:trPr>
           <w:cantSplit/>
-          <w:trHeight w:val="2004" w:hRule="atLeast"/>
+          <w:trHeight w:val="340" w:hRule="atLeast"/>
         </w:trPr>
         <w:tc>
           <w:tcPr>
@@ -26976,8 +26534,8 @@
         </w:tblBorders>
       </w:tblPr>
       <w:tblGrid>
-        <w:gridCol w:w="6760"/>
-        <w:gridCol w:w="1500"/>
+        <w:gridCol w:w="5560"/>
+        <w:gridCol w:w="2700"/>
         <w:gridCol w:w="1100"/>
       </w:tblGrid>
       <w:tr>
@@ -26986,7 +26544,7 @@
         </w:trPr>
         <w:tc>
           <w:tcPr>
-            <w:tcW w:type="dxa" w:w="6760"/>
+            <w:tcW w:type="dxa" w:w="5560"/>
             <w:tcBorders>
               <w:top w:val="none" w:color="FFFFFF" w:sz="0"/>
               <w:left w:val="single" w:color="B8860B" w:sz="24" w:space="10"/>
@@ -27020,7 +26578,7 @@
         </w:tc>
         <w:tc>
           <w:tcPr>
-            <w:tcW w:type="dxa" w:w="1500"/>
+            <w:tcW w:type="dxa" w:w="2700"/>
             <w:tcBorders>
               <w:top w:val="none" w:color="FFFFFF" w:sz="0"/>
               <w:left w:val="none" w:color="FFFFFF" w:sz="0"/>
@@ -27048,7 +26606,7 @@
                 <w:sz w:val="20"/>
                 <w:szCs w:val="20"/>
               </w:rPr>
-              <w:t xml:space="preserve">Empathy hours</w:t>
+              <w:t xml:space="preserve">Empathy practice hours</w:t>
             </w:r>
           </w:p>
         </w:tc>
@@ -27215,7 +26773,7 @@
       <w:tr>
         <w:trPr>
           <w:cantSplit/>
-          <w:trHeight w:val="1130" w:hRule="atLeast"/>
+          <w:trHeight w:val="340" w:hRule="atLeast"/>
         </w:trPr>
         <w:tc>
           <w:tcPr>
@@ -27526,7 +27084,7 @@
       <w:tr>
         <w:trPr>
           <w:cantSplit/>
-          <w:trHeight w:val="594" w:hRule="atLeast"/>
+          <w:trHeight w:val="340" w:hRule="atLeast"/>
         </w:trPr>
         <w:tc>
           <w:tcPr>
@@ -27681,40 +27239,6 @@
         </w:rPr>
         <w:t xml:space="preserve">. See Week 12 for help with this.</w:t>
       </w:r>
-    </w:p>
-    <w:p>
-      <w:pPr>
-        <w:keepLines/>
-        <w:spacing w:after="60" w:before="0" w:line="276" w:lineRule="auto"/>
-      </w:pPr>
-      <w:hyperlink w:history="1" r:id="rIdx9dxr9jzcnjg-hgc-fenm">
-        <w:r>
-          <w:rPr>
-            <w:color w:val="1155CC"/>
-            <w:sz w:val="20"/>
-            <w:szCs w:val="20"/>
-            <w:u w:val="single"/>
-          </w:rPr>
-          <w:t xml:space="preserve">New to the GCN? Click Here to Join</w:t>
-        </w:r>
-      </w:hyperlink>
-    </w:p>
-    <w:p>
-      <w:pPr>
-        <w:keepLines/>
-        <w:spacing w:after="60" w:before="0" w:line="276" w:lineRule="auto"/>
-      </w:pPr>
-      <w:hyperlink w:history="1" r:id="rIdv74xv934ovu4ofvmb72ko">
-        <w:r>
-          <w:rPr>
-            <w:color w:val="1155CC"/>
-            <w:sz w:val="20"/>
-            <w:szCs w:val="20"/>
-            <w:u w:val="single"/>
-          </w:rPr>
-          <w:t xml:space="preserve">GCN Members Click Here to Access it</w:t>
-        </w:r>
-      </w:hyperlink>
     </w:p>
     <w:tbl>
       <w:tblPr>
@@ -27773,7 +27297,7 @@
       <w:tr>
         <w:trPr>
           <w:cantSplit/>
-          <w:trHeight w:val="594" w:hRule="atLeast"/>
+          <w:trHeight w:val="340" w:hRule="atLeast"/>
         </w:trPr>
         <w:tc>
           <w:tcPr>
@@ -27826,8 +27350,8 @@
         </w:tblBorders>
       </w:tblPr>
       <w:tblGrid>
-        <w:gridCol w:w="6760"/>
-        <w:gridCol w:w="1500"/>
+        <w:gridCol w:w="5560"/>
+        <w:gridCol w:w="2700"/>
         <w:gridCol w:w="1100"/>
       </w:tblGrid>
       <w:tr>
@@ -27836,7 +27360,7 @@
         </w:trPr>
         <w:tc>
           <w:tcPr>
-            <w:tcW w:type="dxa" w:w="6760"/>
+            <w:tcW w:type="dxa" w:w="5560"/>
             <w:tcBorders>
               <w:top w:val="none" w:color="FFFFFF" w:sz="0"/>
               <w:left w:val="single" w:color="B8860B" w:sz="24" w:space="10"/>
@@ -27870,7 +27394,7 @@
         </w:tc>
         <w:tc>
           <w:tcPr>
-            <w:tcW w:type="dxa" w:w="1500"/>
+            <w:tcW w:type="dxa" w:w="2700"/>
             <w:tcBorders>
               <w:top w:val="none" w:color="FFFFFF" w:sz="0"/>
               <w:left w:val="none" w:color="FFFFFF" w:sz="0"/>
@@ -27898,7 +27422,7 @@
                 <w:sz w:val="20"/>
                 <w:szCs w:val="20"/>
               </w:rPr>
-              <w:t xml:space="preserve">Empathy hours</w:t>
+              <w:t xml:space="preserve">Empathy practice hours</w:t>
             </w:r>
           </w:p>
         </w:tc>
@@ -28065,7 +27589,7 @@
       <w:tr>
         <w:trPr>
           <w:cantSplit/>
-          <w:trHeight w:val="335" w:hRule="atLeast"/>
+          <w:trHeight w:val="340" w:hRule="atLeast"/>
         </w:trPr>
         <w:tc>
           <w:tcPr>
@@ -28338,40 +27862,6 @@
         </w:rPr>
         <w:t xml:space="preserve">).</w:t>
       </w:r>
-    </w:p>
-    <w:p>
-      <w:pPr>
-        <w:keepLines/>
-        <w:spacing w:after="60" w:before="0" w:line="276" w:lineRule="auto"/>
-      </w:pPr>
-      <w:hyperlink w:history="1" r:id="rIdwlrmr2e3__0rng3xqvv-i">
-        <w:r>
-          <w:rPr>
-            <w:color w:val="1155CC"/>
-            <w:sz w:val="20"/>
-            <w:szCs w:val="20"/>
-            <w:u w:val="single"/>
-          </w:rPr>
-          <w:t xml:space="preserve">New to the GCN? Click Here to Join</w:t>
-        </w:r>
-      </w:hyperlink>
-    </w:p>
-    <w:p>
-      <w:pPr>
-        <w:keepLines/>
-        <w:spacing w:after="60" w:before="0" w:line="276" w:lineRule="auto"/>
-      </w:pPr>
-      <w:hyperlink w:history="1" r:id="rIdqptynaaf0jpi3nu4vbusq">
-        <w:r>
-          <w:rPr>
-            <w:color w:val="1155CC"/>
-            <w:sz w:val="20"/>
-            <w:szCs w:val="20"/>
-            <w:u w:val="single"/>
-          </w:rPr>
-          <w:t xml:space="preserve">GCN Members Click Here to Access it</w:t>
-        </w:r>
-      </w:hyperlink>
     </w:p>
     <w:tbl>
       <w:tblPr>
@@ -28430,7 +27920,7 @@
       <w:tr>
         <w:trPr>
           <w:cantSplit/>
-          <w:trHeight w:val="2200" w:hRule="atLeast"/>
+          <w:trHeight w:val="340" w:hRule="atLeast"/>
         </w:trPr>
         <w:tc>
           <w:tcPr>
@@ -28483,8 +27973,8 @@
         </w:tblBorders>
       </w:tblPr>
       <w:tblGrid>
-        <w:gridCol w:w="6760"/>
-        <w:gridCol w:w="1500"/>
+        <w:gridCol w:w="5560"/>
+        <w:gridCol w:w="2700"/>
         <w:gridCol w:w="1100"/>
       </w:tblGrid>
       <w:tr>
@@ -28493,7 +27983,7 @@
         </w:trPr>
         <w:tc>
           <w:tcPr>
-            <w:tcW w:type="dxa" w:w="6760"/>
+            <w:tcW w:type="dxa" w:w="5560"/>
             <w:tcBorders>
               <w:top w:val="none" w:color="FFFFFF" w:sz="0"/>
               <w:left w:val="single" w:color="B8860B" w:sz="24" w:space="10"/>
@@ -28527,7 +28017,7 @@
         </w:tc>
         <w:tc>
           <w:tcPr>
-            <w:tcW w:type="dxa" w:w="1500"/>
+            <w:tcW w:type="dxa" w:w="2700"/>
             <w:tcBorders>
               <w:top w:val="none" w:color="FFFFFF" w:sz="0"/>
               <w:left w:val="none" w:color="FFFFFF" w:sz="0"/>
@@ -28555,7 +28045,7 @@
                 <w:sz w:val="20"/>
                 <w:szCs w:val="20"/>
               </w:rPr>
-              <w:t xml:space="preserve">Empathy hours</w:t>
+              <w:t xml:space="preserve">Empathy practice hours</w:t>
             </w:r>
           </w:p>
         </w:tc>
@@ -28722,7 +28212,7 @@
       <w:tr>
         <w:trPr>
           <w:cantSplit/>
-          <w:trHeight w:val="695" w:hRule="atLeast"/>
+          <w:trHeight w:val="340" w:hRule="atLeast"/>
         </w:trPr>
         <w:tc>
           <w:tcPr>
@@ -28953,7 +28443,7 @@
       <w:tr>
         <w:trPr>
           <w:cantSplit/>
-          <w:trHeight w:val="665" w:hRule="atLeast"/>
+          <w:trHeight w:val="340" w:hRule="atLeast"/>
         </w:trPr>
         <w:tc>
           <w:tcPr>
@@ -29016,7 +28506,7 @@
         </w:rPr>
         <w:t xml:space="preserve">Later on, when you have time, sit down with the </w:t>
       </w:r>
-      <w:hyperlink w:history="1" r:id="rIdrzwk81fcdlifrcswzf8l_">
+      <w:hyperlink w:history="1" r:id="rIdd1b0i0os6fh3u2ulizgvf">
         <w:r>
           <w:rPr>
             <w:color w:val="1155CC"/>
@@ -29037,7 +28527,7 @@
         </w:rPr>
         <w:t xml:space="preserve"> and see if you can figure out what need(s) you were in pain about. Translate your judgment words into need words. As usual, I suggest that you limit the words you use to those on the </w:t>
       </w:r>
-      <w:hyperlink w:history="1" r:id="rIdh7wfplejulqg0-a8ay53l">
+      <w:hyperlink w:history="1" r:id="rIdwtjnssy-nqrrnxjp9c5nn">
         <w:r>
           <w:rPr>
             <w:color w:val="1155CC"/>
@@ -29164,7 +28654,7 @@
       <w:tr>
         <w:trPr>
           <w:cantSplit/>
-          <w:trHeight w:val="665" w:hRule="atLeast"/>
+          <w:trHeight w:val="340" w:hRule="atLeast"/>
         </w:trPr>
         <w:tc>
           <w:tcPr>
@@ -29227,40 +28717,6 @@
         </w:rPr>
         <w:t xml:space="preserve">If you have not visited or participated in our Community Forum, it's not too late. Directions to join are below.</w:t>
       </w:r>
-    </w:p>
-    <w:p>
-      <w:pPr>
-        <w:keepLines/>
-        <w:spacing w:after="60" w:before="0" w:line="276" w:lineRule="auto"/>
-      </w:pPr>
-      <w:hyperlink w:history="1" r:id="rIdalfte90csln49nocpql1_">
-        <w:r>
-          <w:rPr>
-            <w:color w:val="1155CC"/>
-            <w:sz w:val="20"/>
-            <w:szCs w:val="20"/>
-            <w:u w:val="single"/>
-          </w:rPr>
-          <w:t xml:space="preserve">New to the GCN? Click Here to Join</w:t>
-        </w:r>
-      </w:hyperlink>
-    </w:p>
-    <w:p>
-      <w:pPr>
-        <w:keepLines/>
-        <w:spacing w:after="60" w:before="0" w:line="276" w:lineRule="auto"/>
-      </w:pPr>
-      <w:hyperlink w:history="1" r:id="rIdl1tsc9ef_phjok9fytlso">
-        <w:r>
-          <w:rPr>
-            <w:color w:val="1155CC"/>
-            <w:sz w:val="20"/>
-            <w:szCs w:val="20"/>
-            <w:u w:val="single"/>
-          </w:rPr>
-          <w:t xml:space="preserve">GCN Members Click Here to Access it</w:t>
-        </w:r>
-      </w:hyperlink>
     </w:p>
     <w:tbl>
       <w:tblPr>
@@ -29319,7 +28775,7 @@
       <w:tr>
         <w:trPr>
           <w:cantSplit/>
-          <w:trHeight w:val="665" w:hRule="atLeast"/>
+          <w:trHeight w:val="340" w:hRule="atLeast"/>
         </w:trPr>
         <w:tc>
           <w:tcPr>
@@ -29372,8 +28828,8 @@
         </w:tblBorders>
       </w:tblPr>
       <w:tblGrid>
-        <w:gridCol w:w="6760"/>
-        <w:gridCol w:w="1500"/>
+        <w:gridCol w:w="5560"/>
+        <w:gridCol w:w="2700"/>
         <w:gridCol w:w="1100"/>
       </w:tblGrid>
       <w:tr>
@@ -29382,7 +28838,7 @@
         </w:trPr>
         <w:tc>
           <w:tcPr>
-            <w:tcW w:type="dxa" w:w="6760"/>
+            <w:tcW w:type="dxa" w:w="5560"/>
             <w:tcBorders>
               <w:top w:val="none" w:color="FFFFFF" w:sz="0"/>
               <w:left w:val="single" w:color="B8860B" w:sz="24" w:space="10"/>
@@ -29416,7 +28872,7 @@
         </w:tc>
         <w:tc>
           <w:tcPr>
-            <w:tcW w:type="dxa" w:w="1500"/>
+            <w:tcW w:type="dxa" w:w="2700"/>
             <w:tcBorders>
               <w:top w:val="none" w:color="FFFFFF" w:sz="0"/>
               <w:left w:val="none" w:color="FFFFFF" w:sz="0"/>
@@ -29444,7 +28900,7 @@
                 <w:sz w:val="20"/>
                 <w:szCs w:val="20"/>
               </w:rPr>
-              <w:t xml:space="preserve">Empathy hours</w:t>
+              <w:t xml:space="preserve">Empathy practice hours</w:t>
             </w:r>
           </w:p>
         </w:tc>
@@ -29611,7 +29067,7 @@
       <w:tr>
         <w:trPr>
           <w:cantSplit/>
-          <w:trHeight w:val="563" w:hRule="atLeast"/>
+          <w:trHeight w:val="340" w:hRule="atLeast"/>
         </w:trPr>
         <w:tc>
           <w:tcPr>
@@ -29902,7 +29358,7 @@
       <w:tr>
         <w:trPr>
           <w:cantSplit/>
-          <w:trHeight w:val="698" w:hRule="atLeast"/>
+          <w:trHeight w:val="340" w:hRule="atLeast"/>
         </w:trPr>
         <w:tc>
           <w:tcPr>
@@ -30061,40 +29517,6 @@
         </w:rPr>
         <w:t xml:space="preserve">Finally, write down what you might say to them to create more connection, in light of your inquiry about these thoughts, feelings and needs.</w:t>
       </w:r>
-    </w:p>
-    <w:p>
-      <w:pPr>
-        <w:keepLines/>
-        <w:spacing w:after="60" w:before="0" w:line="276" w:lineRule="auto"/>
-      </w:pPr>
-      <w:hyperlink w:history="1" r:id="rIdansbaxpodioonptqwwqtv">
-        <w:r>
-          <w:rPr>
-            <w:color w:val="1155CC"/>
-            <w:sz w:val="20"/>
-            <w:szCs w:val="20"/>
-            <w:u w:val="single"/>
-          </w:rPr>
-          <w:t xml:space="preserve">New to the GCN? Click Here to Join</w:t>
-        </w:r>
-      </w:hyperlink>
-    </w:p>
-    <w:p>
-      <w:pPr>
-        <w:keepLines/>
-        <w:spacing w:after="60" w:before="0" w:line="276" w:lineRule="auto"/>
-      </w:pPr>
-      <w:hyperlink w:history="1" r:id="rIdqu2obbppbn4ny_egraxbm">
-        <w:r>
-          <w:rPr>
-            <w:color w:val="1155CC"/>
-            <w:sz w:val="20"/>
-            <w:szCs w:val="20"/>
-            <w:u w:val="single"/>
-          </w:rPr>
-          <w:t xml:space="preserve">GCN Members Click Here to Access it</w:t>
-        </w:r>
-      </w:hyperlink>
     </w:p>
     <w:tbl>
       <w:tblPr>
@@ -30153,7 +29575,7 @@
       <w:tr>
         <w:trPr>
           <w:cantSplit/>
-          <w:trHeight w:val="698" w:hRule="atLeast"/>
+          <w:trHeight w:val="340" w:hRule="atLeast"/>
         </w:trPr>
         <w:tc>
           <w:tcPr>
@@ -30206,8 +29628,8 @@
         </w:tblBorders>
       </w:tblPr>
       <w:tblGrid>
-        <w:gridCol w:w="6760"/>
-        <w:gridCol w:w="1500"/>
+        <w:gridCol w:w="5560"/>
+        <w:gridCol w:w="2700"/>
         <w:gridCol w:w="1100"/>
       </w:tblGrid>
       <w:tr>
@@ -30216,7 +29638,7 @@
         </w:trPr>
         <w:tc>
           <w:tcPr>
-            <w:tcW w:type="dxa" w:w="6760"/>
+            <w:tcW w:type="dxa" w:w="5560"/>
             <w:tcBorders>
               <w:top w:val="none" w:color="FFFFFF" w:sz="0"/>
               <w:left w:val="single" w:color="B8860B" w:sz="24" w:space="10"/>
@@ -30250,7 +29672,7 @@
         </w:tc>
         <w:tc>
           <w:tcPr>
-            <w:tcW w:type="dxa" w:w="1500"/>
+            <w:tcW w:type="dxa" w:w="2700"/>
             <w:tcBorders>
               <w:top w:val="none" w:color="FFFFFF" w:sz="0"/>
               <w:left w:val="none" w:color="FFFFFF" w:sz="0"/>
@@ -30278,7 +29700,7 @@
                 <w:sz w:val="20"/>
                 <w:szCs w:val="20"/>
               </w:rPr>
-              <w:t xml:space="preserve">Empathy hours</w:t>
+              <w:t xml:space="preserve">Empathy practice hours</w:t>
             </w:r>
           </w:p>
         </w:tc>
@@ -30445,7 +29867,7 @@
       <w:tr>
         <w:trPr>
           <w:cantSplit/>
-          <w:trHeight w:val="394" w:hRule="atLeast"/>
+          <w:trHeight w:val="340" w:hRule="atLeast"/>
         </w:trPr>
         <w:tc>
           <w:tcPr>
@@ -30788,7 +30210,7 @@
       <w:tr>
         <w:trPr>
           <w:cantSplit/>
-          <w:trHeight w:val="453" w:hRule="atLeast"/>
+          <w:trHeight w:val="340" w:hRule="atLeast"/>
         </w:trPr>
         <w:tc>
           <w:tcPr>
@@ -30887,40 +30309,6 @@
         </w:rPr>
         <w:t xml:space="preserve">If they see or hear judgments that you are sure you are not holding, practice generating more clarity that you are simply screaming your pain. This may require some empathy.</w:t>
       </w:r>
-    </w:p>
-    <w:p>
-      <w:pPr>
-        <w:keepLines/>
-        <w:spacing w:after="60" w:before="0" w:line="276" w:lineRule="auto"/>
-      </w:pPr>
-      <w:hyperlink w:history="1" r:id="rIdfer1kyxb8ihcrbgvuv4vh">
-        <w:r>
-          <w:rPr>
-            <w:color w:val="1155CC"/>
-            <w:sz w:val="20"/>
-            <w:szCs w:val="20"/>
-            <w:u w:val="single"/>
-          </w:rPr>
-          <w:t xml:space="preserve">New to the GCN? Click Here to Join</w:t>
-        </w:r>
-      </w:hyperlink>
-    </w:p>
-    <w:p>
-      <w:pPr>
-        <w:keepLines/>
-        <w:spacing w:after="60" w:before="0" w:line="276" w:lineRule="auto"/>
-      </w:pPr>
-      <w:hyperlink w:history="1" r:id="rIdzz6rh0wuiphtdxb1lji5b">
-        <w:r>
-          <w:rPr>
-            <w:color w:val="1155CC"/>
-            <w:sz w:val="20"/>
-            <w:szCs w:val="20"/>
-            <w:u w:val="single"/>
-          </w:rPr>
-          <w:t xml:space="preserve">GCN Members Click Here to Access it</w:t>
-        </w:r>
-      </w:hyperlink>
     </w:p>
     <w:tbl>
       <w:tblPr>
@@ -30979,7 +30367,7 @@
       <w:tr>
         <w:trPr>
           <w:cantSplit/>
-          <w:trHeight w:val="453" w:hRule="atLeast"/>
+          <w:trHeight w:val="340" w:hRule="atLeast"/>
         </w:trPr>
         <w:tc>
           <w:tcPr>
@@ -31032,8 +30420,8 @@
         </w:tblBorders>
       </w:tblPr>
       <w:tblGrid>
-        <w:gridCol w:w="6760"/>
-        <w:gridCol w:w="1500"/>
+        <w:gridCol w:w="5560"/>
+        <w:gridCol w:w="2700"/>
         <w:gridCol w:w="1100"/>
       </w:tblGrid>
       <w:tr>
@@ -31042,7 +30430,7 @@
         </w:trPr>
         <w:tc>
           <w:tcPr>
-            <w:tcW w:type="dxa" w:w="6760"/>
+            <w:tcW w:type="dxa" w:w="5560"/>
             <w:tcBorders>
               <w:top w:val="none" w:color="FFFFFF" w:sz="0"/>
               <w:left w:val="single" w:color="B8860B" w:sz="24" w:space="10"/>
@@ -31076,7 +30464,7 @@
         </w:tc>
         <w:tc>
           <w:tcPr>
-            <w:tcW w:type="dxa" w:w="1500"/>
+            <w:tcW w:type="dxa" w:w="2700"/>
             <w:tcBorders>
               <w:top w:val="none" w:color="FFFFFF" w:sz="0"/>
               <w:left w:val="none" w:color="FFFFFF" w:sz="0"/>
@@ -31104,7 +30492,7 @@
                 <w:sz w:val="20"/>
                 <w:szCs w:val="20"/>
               </w:rPr>
-              <w:t xml:space="preserve">Empathy hours</w:t>
+              <w:t xml:space="preserve">Empathy practice hours</w:t>
             </w:r>
           </w:p>
         </w:tc>
@@ -31271,7 +30659,7 @@
       <w:tr>
         <w:trPr>
           <w:cantSplit/>
-          <w:trHeight w:val="320" w:hRule="atLeast"/>
+          <w:trHeight w:val="340" w:hRule="atLeast"/>
         </w:trPr>
         <w:tc>
           <w:tcPr>
@@ -31548,40 +30936,6 @@
         </w:rPr>
         <w:t xml:space="preserve">Try keeping all the needs in your awareness for a a while - focusing on just the needs - no particular strategy. This could be done for minutes or days. You can write them down and put them on a mirror or other conspicuous place. Notice what comes up. This can be a very powerful exercise if you stay with it.</w:t>
       </w:r>
-    </w:p>
-    <w:p>
-      <w:pPr>
-        <w:keepLines/>
-        <w:spacing w:after="60" w:before="0" w:line="276" w:lineRule="auto"/>
-      </w:pPr>
-      <w:hyperlink w:history="1" r:id="rIdydr_mltswonavmum4yaok">
-        <w:r>
-          <w:rPr>
-            <w:color w:val="1155CC"/>
-            <w:sz w:val="20"/>
-            <w:szCs w:val="20"/>
-            <w:u w:val="single"/>
-          </w:rPr>
-          <w:t xml:space="preserve">New to the GCN? Click Here to Join</w:t>
-        </w:r>
-      </w:hyperlink>
-    </w:p>
-    <w:p>
-      <w:pPr>
-        <w:keepLines/>
-        <w:spacing w:after="60" w:before="0" w:line="276" w:lineRule="auto"/>
-      </w:pPr>
-      <w:hyperlink w:history="1" r:id="rIdo1tmj0asyz-xfsfx0ncmo">
-        <w:r>
-          <w:rPr>
-            <w:color w:val="1155CC"/>
-            <w:sz w:val="20"/>
-            <w:szCs w:val="20"/>
-            <w:u w:val="single"/>
-          </w:rPr>
-          <w:t xml:space="preserve">GCN Members Click Here to Access it</w:t>
-        </w:r>
-      </w:hyperlink>
     </w:p>
     <w:tbl>
       <w:tblPr>
@@ -31640,7 +30994,7 @@
       <w:tr>
         <w:trPr>
           <w:cantSplit/>
-          <w:trHeight w:val="2200" w:hRule="atLeast"/>
+          <w:trHeight w:val="340" w:hRule="atLeast"/>
         </w:trPr>
         <w:tc>
           <w:tcPr>
@@ -31693,8 +31047,8 @@
         </w:tblBorders>
       </w:tblPr>
       <w:tblGrid>
-        <w:gridCol w:w="6760"/>
-        <w:gridCol w:w="1500"/>
+        <w:gridCol w:w="5560"/>
+        <w:gridCol w:w="2700"/>
         <w:gridCol w:w="1100"/>
       </w:tblGrid>
       <w:tr>
@@ -31703,7 +31057,7 @@
         </w:trPr>
         <w:tc>
           <w:tcPr>
-            <w:tcW w:type="dxa" w:w="6760"/>
+            <w:tcW w:type="dxa" w:w="5560"/>
             <w:tcBorders>
               <w:top w:val="none" w:color="FFFFFF" w:sz="0"/>
               <w:left w:val="single" w:color="B8860B" w:sz="24" w:space="10"/>
@@ -31737,7 +31091,7 @@
         </w:tc>
         <w:tc>
           <w:tcPr>
-            <w:tcW w:type="dxa" w:w="1500"/>
+            <w:tcW w:type="dxa" w:w="2700"/>
             <w:tcBorders>
               <w:top w:val="none" w:color="FFFFFF" w:sz="0"/>
               <w:left w:val="none" w:color="FFFFFF" w:sz="0"/>
@@ -31765,7 +31119,7 @@
                 <w:sz w:val="20"/>
                 <w:szCs w:val="20"/>
               </w:rPr>
-              <w:t xml:space="preserve">Empathy hours</w:t>
+              <w:t xml:space="preserve">Empathy practice hours</w:t>
             </w:r>
           </w:p>
         </w:tc>
@@ -31932,7 +31286,7 @@
       <w:tr>
         <w:trPr>
           <w:cantSplit/>
-          <w:trHeight w:val="1157" w:hRule="atLeast"/>
+          <w:trHeight w:val="340" w:hRule="atLeast"/>
         </w:trPr>
         <w:tc>
           <w:tcPr>
@@ -32191,7 +31545,7 @@
       <w:tr>
         <w:trPr>
           <w:cantSplit/>
-          <w:trHeight w:val="674" w:hRule="atLeast"/>
+          <w:trHeight w:val="340" w:hRule="atLeast"/>
         </w:trPr>
         <w:tc>
           <w:tcPr>
@@ -32334,40 +31688,6 @@
         </w:rPr>
         <w:t xml:space="preserve">agreement with, and see if you can create a deeper understanding of everyone's needs and come to a new agreement that considers and meets more needs.</w:t>
       </w:r>
-    </w:p>
-    <w:p>
-      <w:pPr>
-        <w:keepLines/>
-        <w:spacing w:after="60" w:before="0" w:line="276" w:lineRule="auto"/>
-      </w:pPr>
-      <w:hyperlink w:history="1" r:id="rIdvvfxf4rqjwh1r6vutk8lu">
-        <w:r>
-          <w:rPr>
-            <w:color w:val="1155CC"/>
-            <w:sz w:val="20"/>
-            <w:szCs w:val="20"/>
-            <w:u w:val="single"/>
-          </w:rPr>
-          <w:t xml:space="preserve">New to the GCN? Click Here to Join</w:t>
-        </w:r>
-      </w:hyperlink>
-    </w:p>
-    <w:p>
-      <w:pPr>
-        <w:keepLines/>
-        <w:spacing w:after="60" w:before="0" w:line="276" w:lineRule="auto"/>
-      </w:pPr>
-      <w:hyperlink w:history="1" r:id="rIdaz_32f3elonv4htndai4c">
-        <w:r>
-          <w:rPr>
-            <w:color w:val="1155CC"/>
-            <w:sz w:val="20"/>
-            <w:szCs w:val="20"/>
-            <w:u w:val="single"/>
-          </w:rPr>
-          <w:t xml:space="preserve">GCN Members Click Here to Access it</w:t>
-        </w:r>
-      </w:hyperlink>
     </w:p>
     <w:tbl>
       <w:tblPr>
@@ -32426,7 +31746,7 @@
       <w:tr>
         <w:trPr>
           <w:cantSplit/>
-          <w:trHeight w:val="674" w:hRule="atLeast"/>
+          <w:trHeight w:val="340" w:hRule="atLeast"/>
         </w:trPr>
         <w:tc>
           <w:tcPr>
@@ -32479,8 +31799,8 @@
         </w:tblBorders>
       </w:tblPr>
       <w:tblGrid>
-        <w:gridCol w:w="6760"/>
-        <w:gridCol w:w="1500"/>
+        <w:gridCol w:w="5560"/>
+        <w:gridCol w:w="2700"/>
         <w:gridCol w:w="1100"/>
       </w:tblGrid>
       <w:tr>
@@ -32489,7 +31809,7 @@
         </w:trPr>
         <w:tc>
           <w:tcPr>
-            <w:tcW w:type="dxa" w:w="6760"/>
+            <w:tcW w:type="dxa" w:w="5560"/>
             <w:tcBorders>
               <w:top w:val="none" w:color="FFFFFF" w:sz="0"/>
               <w:left w:val="single" w:color="B8860B" w:sz="24" w:space="10"/>
@@ -32523,7 +31843,7 @@
         </w:tc>
         <w:tc>
           <w:tcPr>
-            <w:tcW w:type="dxa" w:w="1500"/>
+            <w:tcW w:type="dxa" w:w="2700"/>
             <w:tcBorders>
               <w:top w:val="none" w:color="FFFFFF" w:sz="0"/>
               <w:left w:val="none" w:color="FFFFFF" w:sz="0"/>
@@ -32551,7 +31871,7 @@
                 <w:sz w:val="20"/>
                 <w:szCs w:val="20"/>
               </w:rPr>
-              <w:t xml:space="preserve">Empathy hours</w:t>
+              <w:t xml:space="preserve">Empathy practice hours</w:t>
             </w:r>
           </w:p>
         </w:tc>
@@ -32718,7 +32038,7 @@
       <w:tr>
         <w:trPr>
           <w:cantSplit/>
-          <w:trHeight w:val="381" w:hRule="atLeast"/>
+          <w:trHeight w:val="340" w:hRule="atLeast"/>
         </w:trPr>
         <w:tc>
           <w:tcPr>
@@ -32993,7 +32313,7 @@
       <w:tr>
         <w:trPr>
           <w:cantSplit/>
-          <w:trHeight w:val="240" w:hRule="atLeast"/>
+          <w:trHeight w:val="340" w:hRule="atLeast"/>
         </w:trPr>
         <w:tc>
           <w:tcPr>
@@ -33244,40 +32564,6 @@
         </w:rPr>
         <w:t xml:space="preserve">Repeat this exercise with all the needs you have identified from Practice #1 .</w:t>
       </w:r>
-    </w:p>
-    <w:p>
-      <w:pPr>
-        <w:keepLines/>
-        <w:spacing w:after="60" w:before="0" w:line="276" w:lineRule="auto"/>
-      </w:pPr>
-      <w:hyperlink w:history="1" r:id="rIdaaiwai-iumuplvd5s2tps">
-        <w:r>
-          <w:rPr>
-            <w:color w:val="1155CC"/>
-            <w:sz w:val="20"/>
-            <w:szCs w:val="20"/>
-            <w:u w:val="single"/>
-          </w:rPr>
-          <w:t xml:space="preserve">New to the GCN? Click Here to Join</w:t>
-        </w:r>
-      </w:hyperlink>
-    </w:p>
-    <w:p>
-      <w:pPr>
-        <w:keepLines/>
-        <w:spacing w:after="60" w:before="0" w:line="276" w:lineRule="auto"/>
-      </w:pPr>
-      <w:hyperlink w:history="1" r:id="rIdxhiyrvufdewxtbix09qci">
-        <w:r>
-          <w:rPr>
-            <w:color w:val="1155CC"/>
-            <w:sz w:val="20"/>
-            <w:szCs w:val="20"/>
-            <w:u w:val="single"/>
-          </w:rPr>
-          <w:t xml:space="preserve">GCN Members Click Here to Access it</w:t>
-        </w:r>
-      </w:hyperlink>
     </w:p>
     <w:tbl>
       <w:tblPr>
@@ -33336,7 +32622,7 @@
       <w:tr>
         <w:trPr>
           <w:cantSplit/>
-          <w:trHeight w:val="240" w:hRule="atLeast"/>
+          <w:trHeight w:val="340" w:hRule="atLeast"/>
         </w:trPr>
         <w:tc>
           <w:tcPr>
@@ -33389,8 +32675,8 @@
         </w:tblBorders>
       </w:tblPr>
       <w:tblGrid>
-        <w:gridCol w:w="6760"/>
-        <w:gridCol w:w="1500"/>
+        <w:gridCol w:w="5560"/>
+        <w:gridCol w:w="2700"/>
         <w:gridCol w:w="1100"/>
       </w:tblGrid>
       <w:tr>
@@ -33399,7 +32685,7 @@
         </w:trPr>
         <w:tc>
           <w:tcPr>
-            <w:tcW w:type="dxa" w:w="6760"/>
+            <w:tcW w:type="dxa" w:w="5560"/>
             <w:tcBorders>
               <w:top w:val="none" w:color="FFFFFF" w:sz="0"/>
               <w:left w:val="single" w:color="B8860B" w:sz="24" w:space="10"/>
@@ -33433,7 +32719,7 @@
         </w:tc>
         <w:tc>
           <w:tcPr>
-            <w:tcW w:type="dxa" w:w="1500"/>
+            <w:tcW w:type="dxa" w:w="2700"/>
             <w:tcBorders>
               <w:top w:val="none" w:color="FFFFFF" w:sz="0"/>
               <w:left w:val="none" w:color="FFFFFF" w:sz="0"/>
@@ -33461,7 +32747,7 @@
                 <w:sz w:val="20"/>
                 <w:szCs w:val="20"/>
               </w:rPr>
-              <w:t xml:space="preserve">Empathy hours</w:t>
+              <w:t xml:space="preserve">Empathy practice hours</w:t>
             </w:r>
           </w:p>
         </w:tc>
@@ -33628,7 +32914,7 @@
       <w:tr>
         <w:trPr>
           <w:cantSplit/>
-          <w:trHeight w:val="320" w:hRule="atLeast"/>
+          <w:trHeight w:val="340" w:hRule="atLeast"/>
         </w:trPr>
         <w:tc>
           <w:tcPr>
@@ -33855,7 +33141,7 @@
       <w:tr>
         <w:trPr>
           <w:cantSplit/>
-          <w:trHeight w:val="240" w:hRule="atLeast"/>
+          <w:trHeight w:val="340" w:hRule="atLeast"/>
         </w:trPr>
         <w:tc>
           <w:tcPr>
@@ -34132,7 +33418,7 @@
       <w:tr>
         <w:trPr>
           <w:cantSplit/>
-          <w:trHeight w:val="240" w:hRule="atLeast"/>
+          <w:trHeight w:val="340" w:hRule="atLeast"/>
         </w:trPr>
         <w:tc>
           <w:tcPr>
@@ -34195,40 +33481,6 @@
         </w:rPr>
         <w:t xml:space="preserve">See if you can imagine 3 ways each of the need(s) that you embodied in Practice #2 might be met by changing your actions or by making a request of yourself or others (see Week 13 and Week 15).</w:t>
       </w:r>
-    </w:p>
-    <w:p>
-      <w:pPr>
-        <w:keepLines/>
-        <w:spacing w:after="60" w:before="0" w:line="276" w:lineRule="auto"/>
-      </w:pPr>
-      <w:hyperlink w:history="1" r:id="rIdhsfdyh2ncrxxtx9hijn2v">
-        <w:r>
-          <w:rPr>
-            <w:color w:val="1155CC"/>
-            <w:sz w:val="20"/>
-            <w:szCs w:val="20"/>
-            <w:u w:val="single"/>
-          </w:rPr>
-          <w:t xml:space="preserve">New to the GCN? Click Here to Join</w:t>
-        </w:r>
-      </w:hyperlink>
-    </w:p>
-    <w:p>
-      <w:pPr>
-        <w:keepLines/>
-        <w:spacing w:after="60" w:before="0" w:line="276" w:lineRule="auto"/>
-      </w:pPr>
-      <w:hyperlink w:history="1" r:id="rIdolkykf9m3ab6an_n6iojp">
-        <w:r>
-          <w:rPr>
-            <w:color w:val="1155CC"/>
-            <w:sz w:val="20"/>
-            <w:szCs w:val="20"/>
-            <w:u w:val="single"/>
-          </w:rPr>
-          <w:t xml:space="preserve">GCN Members Click Here to Access it</w:t>
-        </w:r>
-      </w:hyperlink>
     </w:p>
     <w:tbl>
       <w:tblPr>
@@ -34287,7 +33539,7 @@
       <w:tr>
         <w:trPr>
           <w:cantSplit/>
-          <w:trHeight w:val="240" w:hRule="atLeast"/>
+          <w:trHeight w:val="340" w:hRule="atLeast"/>
         </w:trPr>
         <w:tc>
           <w:tcPr>
@@ -34340,8 +33592,8 @@
         </w:tblBorders>
       </w:tblPr>
       <w:tblGrid>
-        <w:gridCol w:w="6760"/>
-        <w:gridCol w:w="1500"/>
+        <w:gridCol w:w="5560"/>
+        <w:gridCol w:w="2700"/>
         <w:gridCol w:w="1100"/>
       </w:tblGrid>
       <w:tr>
@@ -34350,7 +33602,7 @@
         </w:trPr>
         <w:tc>
           <w:tcPr>
-            <w:tcW w:type="dxa" w:w="6760"/>
+            <w:tcW w:type="dxa" w:w="5560"/>
             <w:tcBorders>
               <w:top w:val="none" w:color="FFFFFF" w:sz="0"/>
               <w:left w:val="single" w:color="B8860B" w:sz="24" w:space="10"/>
@@ -34384,7 +33636,7 @@
         </w:tc>
         <w:tc>
           <w:tcPr>
-            <w:tcW w:type="dxa" w:w="1500"/>
+            <w:tcW w:type="dxa" w:w="2700"/>
             <w:tcBorders>
               <w:top w:val="none" w:color="FFFFFF" w:sz="0"/>
               <w:left w:val="none" w:color="FFFFFF" w:sz="0"/>
@@ -34412,7 +33664,7 @@
                 <w:sz w:val="20"/>
                 <w:szCs w:val="20"/>
               </w:rPr>
-              <w:t xml:space="preserve">Empathy hours</w:t>
+              <w:t xml:space="preserve">Empathy practice hours</w:t>
             </w:r>
           </w:p>
         </w:tc>
@@ -34579,7 +33831,7 @@
       <w:tr>
         <w:trPr>
           <w:cantSplit/>
-          <w:trHeight w:val="320" w:hRule="atLeast"/>
+          <w:trHeight w:val="340" w:hRule="atLeast"/>
         </w:trPr>
         <w:tc>
           <w:tcPr>
@@ -34838,7 +34090,7 @@
       <w:tr>
         <w:trPr>
           <w:cantSplit/>
-          <w:trHeight w:val="1412" w:hRule="atLeast"/>
+          <w:trHeight w:val="340" w:hRule="atLeast"/>
         </w:trPr>
         <w:tc>
           <w:tcPr>
@@ -34949,40 +34201,6 @@
         </w:rPr>
         <w:t xml:space="preserve">Finally, see if you can imagine a new way these needs might be met by changing your actions or making a request that includes the other person's power (see Week 13 and Week 15).</w:t>
       </w:r>
-    </w:p>
-    <w:p>
-      <w:pPr>
-        <w:keepLines/>
-        <w:spacing w:after="60" w:before="0" w:line="276" w:lineRule="auto"/>
-      </w:pPr>
-      <w:hyperlink w:history="1" r:id="rIdsm1pjw76r1kcjys6q1oyc">
-        <w:r>
-          <w:rPr>
-            <w:color w:val="1155CC"/>
-            <w:sz w:val="20"/>
-            <w:szCs w:val="20"/>
-            <w:u w:val="single"/>
-          </w:rPr>
-          <w:t xml:space="preserve">New to the GCN? Click Here to Join</w:t>
-        </w:r>
-      </w:hyperlink>
-    </w:p>
-    <w:p>
-      <w:pPr>
-        <w:keepLines/>
-        <w:spacing w:after="60" w:before="0" w:line="276" w:lineRule="auto"/>
-      </w:pPr>
-      <w:hyperlink w:history="1" r:id="rIdf7qxzezxortpkfse0sfyt">
-        <w:r>
-          <w:rPr>
-            <w:color w:val="1155CC"/>
-            <w:sz w:val="20"/>
-            <w:szCs w:val="20"/>
-            <w:u w:val="single"/>
-          </w:rPr>
-          <w:t xml:space="preserve">GCN Members Click Here to Access it</w:t>
-        </w:r>
-      </w:hyperlink>
     </w:p>
     <w:tbl>
       <w:tblPr>
@@ -35041,7 +34259,7 @@
       <w:tr>
         <w:trPr>
           <w:cantSplit/>
-          <w:trHeight w:val="1412" w:hRule="atLeast"/>
+          <w:trHeight w:val="340" w:hRule="atLeast"/>
         </w:trPr>
         <w:tc>
           <w:tcPr>
@@ -35094,8 +34312,8 @@
         </w:tblBorders>
       </w:tblPr>
       <w:tblGrid>
-        <w:gridCol w:w="6760"/>
-        <w:gridCol w:w="1500"/>
+        <w:gridCol w:w="5560"/>
+        <w:gridCol w:w="2700"/>
         <w:gridCol w:w="1100"/>
       </w:tblGrid>
       <w:tr>
@@ -35104,7 +34322,7 @@
         </w:trPr>
         <w:tc>
           <w:tcPr>
-            <w:tcW w:type="dxa" w:w="6760"/>
+            <w:tcW w:type="dxa" w:w="5560"/>
             <w:tcBorders>
               <w:top w:val="none" w:color="FFFFFF" w:sz="0"/>
               <w:left w:val="single" w:color="B8860B" w:sz="24" w:space="10"/>
@@ -35138,7 +34356,7 @@
         </w:tc>
         <w:tc>
           <w:tcPr>
-            <w:tcW w:type="dxa" w:w="1500"/>
+            <w:tcW w:type="dxa" w:w="2700"/>
             <w:tcBorders>
               <w:top w:val="none" w:color="FFFFFF" w:sz="0"/>
               <w:left w:val="none" w:color="FFFFFF" w:sz="0"/>
@@ -35166,7 +34384,7 @@
                 <w:sz w:val="20"/>
                 <w:szCs w:val="20"/>
               </w:rPr>
-              <w:t xml:space="preserve">Empathy hours</w:t>
+              <w:t xml:space="preserve">Empathy practice hours</w:t>
             </w:r>
           </w:p>
         </w:tc>
@@ -35333,7 +34551,7 @@
       <w:tr>
         <w:trPr>
           <w:cantSplit/>
-          <w:trHeight w:val="797" w:hRule="atLeast"/>
+          <w:trHeight w:val="340" w:hRule="atLeast"/>
         </w:trPr>
         <w:tc>
           <w:tcPr>
@@ -35658,40 +34876,6 @@
         </w:rPr>
         <w:t xml:space="preserve">Consider sharing your experience on our Community Forum.</w:t>
       </w:r>
-    </w:p>
-    <w:p>
-      <w:pPr>
-        <w:keepLines/>
-        <w:spacing w:after="60" w:before="0" w:line="276" w:lineRule="auto"/>
-      </w:pPr>
-      <w:hyperlink w:history="1" r:id="rIdjqvqizjpicdenc9wvdemx">
-        <w:r>
-          <w:rPr>
-            <w:color w:val="1155CC"/>
-            <w:sz w:val="20"/>
-            <w:szCs w:val="20"/>
-            <w:u w:val="single"/>
-          </w:rPr>
-          <w:t xml:space="preserve">New to the GCN? Click Here to Join</w:t>
-        </w:r>
-      </w:hyperlink>
-    </w:p>
-    <w:p>
-      <w:pPr>
-        <w:keepLines/>
-        <w:spacing w:after="60" w:before="0" w:line="276" w:lineRule="auto"/>
-      </w:pPr>
-      <w:hyperlink w:history="1" r:id="rIdxtexyzuhhsh6atqv6wkvf">
-        <w:r>
-          <w:rPr>
-            <w:color w:val="1155CC"/>
-            <w:sz w:val="20"/>
-            <w:szCs w:val="20"/>
-            <w:u w:val="single"/>
-          </w:rPr>
-          <w:t xml:space="preserve">GCN Members Click Here to Access it</w:t>
-        </w:r>
-      </w:hyperlink>
     </w:p>
     <w:tbl>
       <w:tblPr>
@@ -35750,7 +34934,7 @@
       <w:tr>
         <w:trPr>
           <w:cantSplit/>
-          <w:trHeight w:val="2200" w:hRule="atLeast"/>
+          <w:trHeight w:val="340" w:hRule="atLeast"/>
         </w:trPr>
         <w:tc>
           <w:tcPr>
@@ -35803,8 +34987,8 @@
         </w:tblBorders>
       </w:tblPr>
       <w:tblGrid>
-        <w:gridCol w:w="6760"/>
-        <w:gridCol w:w="1500"/>
+        <w:gridCol w:w="5560"/>
+        <w:gridCol w:w="2700"/>
         <w:gridCol w:w="1100"/>
       </w:tblGrid>
       <w:tr>
@@ -35813,7 +34997,7 @@
         </w:trPr>
         <w:tc>
           <w:tcPr>
-            <w:tcW w:type="dxa" w:w="6760"/>
+            <w:tcW w:type="dxa" w:w="5560"/>
             <w:tcBorders>
               <w:top w:val="none" w:color="FFFFFF" w:sz="0"/>
               <w:left w:val="single" w:color="B8860B" w:sz="24" w:space="10"/>
@@ -35847,7 +35031,7 @@
         </w:tc>
         <w:tc>
           <w:tcPr>
-            <w:tcW w:type="dxa" w:w="1500"/>
+            <w:tcW w:type="dxa" w:w="2700"/>
             <w:tcBorders>
               <w:top w:val="none" w:color="FFFFFF" w:sz="0"/>
               <w:left w:val="none" w:color="FFFFFF" w:sz="0"/>
@@ -35875,7 +35059,7 @@
                 <w:sz w:val="20"/>
                 <w:szCs w:val="20"/>
               </w:rPr>
-              <w:t xml:space="preserve">Empathy hours</w:t>
+              <w:t xml:space="preserve">Empathy practice hours</w:t>
             </w:r>
           </w:p>
         </w:tc>
@@ -36042,7 +35226,7 @@
       <w:tr>
         <w:trPr>
           <w:cantSplit/>
-          <w:trHeight w:val="893" w:hRule="atLeast"/>
+          <w:trHeight w:val="340" w:hRule="atLeast"/>
         </w:trPr>
         <w:tc>
           <w:tcPr>
@@ -36435,40 +35619,6 @@
         </w:rPr>
         <w:t xml:space="preserve">Consider sharing your experience on our Community Forum.</w:t>
       </w:r>
-    </w:p>
-    <w:p>
-      <w:pPr>
-        <w:keepLines/>
-        <w:spacing w:after="60" w:before="0" w:line="276" w:lineRule="auto"/>
-      </w:pPr>
-      <w:hyperlink w:history="1" r:id="rIdvqrowwhkto0xu1hpzu1zv">
-        <w:r>
-          <w:rPr>
-            <w:color w:val="1155CC"/>
-            <w:sz w:val="20"/>
-            <w:szCs w:val="20"/>
-            <w:u w:val="single"/>
-          </w:rPr>
-          <w:t xml:space="preserve">New to the GCN? Click Here to Join</w:t>
-        </w:r>
-      </w:hyperlink>
-    </w:p>
-    <w:p>
-      <w:pPr>
-        <w:keepLines/>
-        <w:spacing w:after="60" w:before="0" w:line="276" w:lineRule="auto"/>
-      </w:pPr>
-      <w:hyperlink w:history="1" r:id="rIdvln6sq9wh3wls3e49mzqn">
-        <w:r>
-          <w:rPr>
-            <w:color w:val="1155CC"/>
-            <w:sz w:val="20"/>
-            <w:szCs w:val="20"/>
-            <w:u w:val="single"/>
-          </w:rPr>
-          <w:t xml:space="preserve">GCN Members Click Here to Access it</w:t>
-        </w:r>
-      </w:hyperlink>
     </w:p>
     <w:tbl>
       <w:tblPr>
@@ -36527,7 +35677,7 @@
       <w:tr>
         <w:trPr>
           <w:cantSplit/>
-          <w:trHeight w:val="1246" w:hRule="atLeast"/>
+          <w:trHeight w:val="340" w:hRule="atLeast"/>
         </w:trPr>
         <w:tc>
           <w:tcPr>
@@ -36580,8 +35730,8 @@
         </w:tblBorders>
       </w:tblPr>
       <w:tblGrid>
-        <w:gridCol w:w="6760"/>
-        <w:gridCol w:w="1500"/>
+        <w:gridCol w:w="5560"/>
+        <w:gridCol w:w="2700"/>
         <w:gridCol w:w="1100"/>
       </w:tblGrid>
       <w:tr>
@@ -36590,7 +35740,7 @@
         </w:trPr>
         <w:tc>
           <w:tcPr>
-            <w:tcW w:type="dxa" w:w="6760"/>
+            <w:tcW w:type="dxa" w:w="5560"/>
             <w:tcBorders>
               <w:top w:val="none" w:color="FFFFFF" w:sz="0"/>
               <w:left w:val="single" w:color="B8860B" w:sz="24" w:space="10"/>
@@ -36624,7 +35774,7 @@
         </w:tc>
         <w:tc>
           <w:tcPr>
-            <w:tcW w:type="dxa" w:w="1500"/>
+            <w:tcW w:type="dxa" w:w="2700"/>
             <w:tcBorders>
               <w:top w:val="none" w:color="FFFFFF" w:sz="0"/>
               <w:left w:val="none" w:color="FFFFFF" w:sz="0"/>
@@ -36652,7 +35802,7 @@
                 <w:sz w:val="20"/>
                 <w:szCs w:val="20"/>
               </w:rPr>
-              <w:t xml:space="preserve">Empathy hours</w:t>
+              <w:t xml:space="preserve">Empathy practice hours</w:t>
             </w:r>
           </w:p>
         </w:tc>
@@ -36819,7 +35969,7 @@
       <w:tr>
         <w:trPr>
           <w:cantSplit/>
-          <w:trHeight w:val="352" w:hRule="atLeast"/>
+          <w:trHeight w:val="340" w:hRule="atLeast"/>
         </w:trPr>
         <w:tc>
           <w:tcPr>
@@ -37694,40 +36844,6 @@
         </w:rPr>
         <w:t xml:space="preserve">. Vulnerable and powerful.</w:t>
       </w:r>
-    </w:p>
-    <w:p>
-      <w:pPr>
-        <w:keepLines/>
-        <w:spacing w:after="60" w:before="0" w:line="276" w:lineRule="auto"/>
-      </w:pPr>
-      <w:hyperlink w:history="1" r:id="rIddoy6vv7idknnesldzwjvx">
-        <w:r>
-          <w:rPr>
-            <w:color w:val="1155CC"/>
-            <w:sz w:val="20"/>
-            <w:szCs w:val="20"/>
-            <w:u w:val="single"/>
-          </w:rPr>
-          <w:t xml:space="preserve">New to the GCN? Click Here to Join</w:t>
-        </w:r>
-      </w:hyperlink>
-    </w:p>
-    <w:p>
-      <w:pPr>
-        <w:keepLines/>
-        <w:spacing w:after="60" w:before="0" w:line="276" w:lineRule="auto"/>
-      </w:pPr>
-      <w:hyperlink w:history="1" r:id="rIdf7c02l865jzqdyqjp_rqv">
-        <w:r>
-          <w:rPr>
-            <w:color w:val="1155CC"/>
-            <w:sz w:val="20"/>
-            <w:szCs w:val="20"/>
-            <w:u w:val="single"/>
-          </w:rPr>
-          <w:t xml:space="preserve">GCN Members Click Here to Access it</w:t>
-        </w:r>
-      </w:hyperlink>
     </w:p>
     <w:tbl>
       <w:tblPr>
@@ -37786,7 +36902,7 @@
       <w:tr>
         <w:trPr>
           <w:cantSplit/>
-          <w:trHeight w:val="820" w:hRule="atLeast"/>
+          <w:trHeight w:val="340" w:hRule="atLeast"/>
         </w:trPr>
         <w:tc>
           <w:tcPr>
@@ -37839,8 +36955,8 @@
         </w:tblBorders>
       </w:tblPr>
       <w:tblGrid>
-        <w:gridCol w:w="6760"/>
-        <w:gridCol w:w="1500"/>
+        <w:gridCol w:w="5560"/>
+        <w:gridCol w:w="2700"/>
         <w:gridCol w:w="1100"/>
       </w:tblGrid>
       <w:tr>
@@ -37849,7 +36965,7 @@
         </w:trPr>
         <w:tc>
           <w:tcPr>
-            <w:tcW w:type="dxa" w:w="6760"/>
+            <w:tcW w:type="dxa" w:w="5560"/>
             <w:tcBorders>
               <w:top w:val="none" w:color="FFFFFF" w:sz="0"/>
               <w:left w:val="single" w:color="B8860B" w:sz="24" w:space="10"/>
@@ -37883,7 +36999,7 @@
         </w:tc>
         <w:tc>
           <w:tcPr>
-            <w:tcW w:type="dxa" w:w="1500"/>
+            <w:tcW w:type="dxa" w:w="2700"/>
             <w:tcBorders>
               <w:top w:val="none" w:color="FFFFFF" w:sz="0"/>
               <w:left w:val="none" w:color="FFFFFF" w:sz="0"/>
@@ -37911,7 +37027,7 @@
                 <w:sz w:val="20"/>
                 <w:szCs w:val="20"/>
               </w:rPr>
-              <w:t xml:space="preserve">Empathy hours</w:t>
+              <w:t xml:space="preserve">Empathy practice hours</w:t>
             </w:r>
           </w:p>
         </w:tc>
@@ -38078,7 +37194,7 @@
       <w:tr>
         <w:trPr>
           <w:cantSplit/>
-          <w:trHeight w:val="1300" w:hRule="atLeast"/>
+          <w:trHeight w:val="340" w:hRule="atLeast"/>
         </w:trPr>
         <w:tc>
           <w:tcPr>
@@ -38381,7 +37497,7 @@
       <w:tr>
         <w:trPr>
           <w:cantSplit/>
-          <w:trHeight w:val="1659" w:hRule="atLeast"/>
+          <w:trHeight w:val="340" w:hRule="atLeast"/>
         </w:trPr>
         <w:tc>
           <w:tcPr>
@@ -38516,40 +37632,6 @@
         </w:rPr>
         <w:t xml:space="preserve"> and can often experience a great sense of choice and abundance as we act on our own behalf with passion and compassion.</w:t>
       </w:r>
-    </w:p>
-    <w:p>
-      <w:pPr>
-        <w:keepLines/>
-        <w:spacing w:after="60" w:before="0" w:line="276" w:lineRule="auto"/>
-      </w:pPr>
-      <w:hyperlink w:history="1" r:id="rIdmu1ztvrowttjsgohltjh9">
-        <w:r>
-          <w:rPr>
-            <w:color w:val="1155CC"/>
-            <w:sz w:val="20"/>
-            <w:szCs w:val="20"/>
-            <w:u w:val="single"/>
-          </w:rPr>
-          <w:t xml:space="preserve">New to the GCN? Click Here to Join</w:t>
-        </w:r>
-      </w:hyperlink>
-    </w:p>
-    <w:p>
-      <w:pPr>
-        <w:keepLines/>
-        <w:spacing w:after="60" w:before="0" w:line="276" w:lineRule="auto"/>
-      </w:pPr>
-      <w:hyperlink w:history="1" r:id="rIdko51hxsotfmp62fn3q5_t">
-        <w:r>
-          <w:rPr>
-            <w:color w:val="1155CC"/>
-            <w:sz w:val="20"/>
-            <w:szCs w:val="20"/>
-            <w:u w:val="single"/>
-          </w:rPr>
-          <w:t xml:space="preserve">GCN Members Click Here to Access it</w:t>
-        </w:r>
-      </w:hyperlink>
     </w:p>
     <w:tbl>
       <w:tblPr>
@@ -38608,7 +37690,7 @@
       <w:tr>
         <w:trPr>
           <w:cantSplit/>
-          <w:trHeight w:val="1659" w:hRule="atLeast"/>
+          <w:trHeight w:val="340" w:hRule="atLeast"/>
         </w:trPr>
         <w:tc>
           <w:tcPr>
@@ -38661,8 +37743,8 @@
         </w:tblBorders>
       </w:tblPr>
       <w:tblGrid>
-        <w:gridCol w:w="6760"/>
-        <w:gridCol w:w="1500"/>
+        <w:gridCol w:w="5560"/>
+        <w:gridCol w:w="2700"/>
         <w:gridCol w:w="1100"/>
       </w:tblGrid>
       <w:tr>
@@ -38671,7 +37753,7 @@
         </w:trPr>
         <w:tc>
           <w:tcPr>
-            <w:tcW w:type="dxa" w:w="6760"/>
+            <w:tcW w:type="dxa" w:w="5560"/>
             <w:tcBorders>
               <w:top w:val="none" w:color="FFFFFF" w:sz="0"/>
               <w:left w:val="single" w:color="B8860B" w:sz="24" w:space="10"/>
@@ -38705,7 +37787,7 @@
         </w:tc>
         <w:tc>
           <w:tcPr>
-            <w:tcW w:type="dxa" w:w="1500"/>
+            <w:tcW w:type="dxa" w:w="2700"/>
             <w:tcBorders>
               <w:top w:val="none" w:color="FFFFFF" w:sz="0"/>
               <w:left w:val="none" w:color="FFFFFF" w:sz="0"/>
@@ -38733,7 +37815,7 @@
                 <w:sz w:val="20"/>
                 <w:szCs w:val="20"/>
               </w:rPr>
-              <w:t xml:space="preserve">Empathy hours</w:t>
+              <w:t xml:space="preserve">Empathy practice hours</w:t>
             </w:r>
           </w:p>
         </w:tc>
@@ -38900,7 +37982,7 @@
       <w:tr>
         <w:trPr>
           <w:cantSplit/>
-          <w:trHeight w:val="936" w:hRule="atLeast"/>
+          <w:trHeight w:val="340" w:hRule="atLeast"/>
         </w:trPr>
         <w:tc>
           <w:tcPr>
@@ -39191,7 +38273,7 @@
       <w:tr>
         <w:trPr>
           <w:cantSplit/>
-          <w:trHeight w:val="240" w:hRule="atLeast"/>
+          <w:trHeight w:val="340" w:hRule="atLeast"/>
         </w:trPr>
         <w:tc>
           <w:tcPr>
@@ -39418,40 +38500,6 @@
         </w:rPr>
         <w:t xml:space="preserve">Note: This is a great exercise to share on our Community Forum. We have about one month left to connect. Sharing our experiences helps us all make life more wonderful.</w:t>
       </w:r>
-    </w:p>
-    <w:p>
-      <w:pPr>
-        <w:keepLines/>
-        <w:spacing w:after="60" w:before="0" w:line="276" w:lineRule="auto"/>
-      </w:pPr>
-      <w:hyperlink w:history="1" r:id="rIduwmodo65p3xt62mnpchae">
-        <w:r>
-          <w:rPr>
-            <w:color w:val="1155CC"/>
-            <w:sz w:val="20"/>
-            <w:szCs w:val="20"/>
-            <w:u w:val="single"/>
-          </w:rPr>
-          <w:t xml:space="preserve">New to the GCN? Click Here to Join</w:t>
-        </w:r>
-      </w:hyperlink>
-    </w:p>
-    <w:p>
-      <w:pPr>
-        <w:keepLines/>
-        <w:spacing w:after="60" w:before="0" w:line="276" w:lineRule="auto"/>
-      </w:pPr>
-      <w:hyperlink w:history="1" r:id="rId9-lrxat_aw4_sq76cvahc">
-        <w:r>
-          <w:rPr>
-            <w:color w:val="1155CC"/>
-            <w:sz w:val="20"/>
-            <w:szCs w:val="20"/>
-            <w:u w:val="single"/>
-          </w:rPr>
-          <w:t xml:space="preserve">GCN Members Click Here to Access it</w:t>
-        </w:r>
-      </w:hyperlink>
     </w:p>
     <w:tbl>
       <w:tblPr>
@@ -39510,7 +38558,7 @@
       <w:tr>
         <w:trPr>
           <w:cantSplit/>
-          <w:trHeight w:val="240" w:hRule="atLeast"/>
+          <w:trHeight w:val="340" w:hRule="atLeast"/>
         </w:trPr>
         <w:tc>
           <w:tcPr>
@@ -39563,8 +38611,8 @@
         </w:tblBorders>
       </w:tblPr>
       <w:tblGrid>
-        <w:gridCol w:w="6760"/>
-        <w:gridCol w:w="1500"/>
+        <w:gridCol w:w="5560"/>
+        <w:gridCol w:w="2700"/>
         <w:gridCol w:w="1100"/>
       </w:tblGrid>
       <w:tr>
@@ -39573,7 +38621,7 @@
         </w:trPr>
         <w:tc>
           <w:tcPr>
-            <w:tcW w:type="dxa" w:w="6760"/>
+            <w:tcW w:type="dxa" w:w="5560"/>
             <w:tcBorders>
               <w:top w:val="none" w:color="FFFFFF" w:sz="0"/>
               <w:left w:val="single" w:color="B8860B" w:sz="24" w:space="10"/>
@@ -39607,7 +38655,7 @@
         </w:tc>
         <w:tc>
           <w:tcPr>
-            <w:tcW w:type="dxa" w:w="1500"/>
+            <w:tcW w:type="dxa" w:w="2700"/>
             <w:tcBorders>
               <w:top w:val="none" w:color="FFFFFF" w:sz="0"/>
               <w:left w:val="none" w:color="FFFFFF" w:sz="0"/>
@@ -39635,7 +38683,7 @@
                 <w:sz w:val="20"/>
                 <w:szCs w:val="20"/>
               </w:rPr>
-              <w:t xml:space="preserve">Empathy hours</w:t>
+              <w:t xml:space="preserve">Empathy practice hours</w:t>
             </w:r>
           </w:p>
         </w:tc>
@@ -39802,7 +38850,7 @@
       <w:tr>
         <w:trPr>
           <w:cantSplit/>
-          <w:trHeight w:val="320" w:hRule="atLeast"/>
+          <w:trHeight w:val="340" w:hRule="atLeast"/>
         </w:trPr>
         <w:tc>
           <w:tcPr>
@@ -40129,7 +39177,7 @@
       <w:tr>
         <w:trPr>
           <w:cantSplit/>
-          <w:trHeight w:val="1192" w:hRule="atLeast"/>
+          <w:trHeight w:val="340" w:hRule="atLeast"/>
         </w:trPr>
         <w:tc>
           <w:tcPr>
@@ -40224,40 +39272,6 @@
         </w:rPr>
         <w:t xml:space="preserve">Finally, if you are able to find the need(s), see if you can think of a request or requests you might make of yourself or others (see Weeks 13 and 15) to address them.</w:t>
       </w:r>
-    </w:p>
-    <w:p>
-      <w:pPr>
-        <w:keepLines/>
-        <w:spacing w:after="60" w:before="0" w:line="276" w:lineRule="auto"/>
-      </w:pPr>
-      <w:hyperlink w:history="1" r:id="rIdemx1kxfmsqrxgqda6wtrt">
-        <w:r>
-          <w:rPr>
-            <w:color w:val="1155CC"/>
-            <w:sz w:val="20"/>
-            <w:szCs w:val="20"/>
-            <w:u w:val="single"/>
-          </w:rPr>
-          <w:t xml:space="preserve">New to the GCN? Click Here to Join</w:t>
-        </w:r>
-      </w:hyperlink>
-    </w:p>
-    <w:p>
-      <w:pPr>
-        <w:keepLines/>
-        <w:spacing w:after="60" w:before="0" w:line="276" w:lineRule="auto"/>
-      </w:pPr>
-      <w:hyperlink w:history="1" r:id="rIdtsbc4s8lhhgpodtk7lsid">
-        <w:r>
-          <w:rPr>
-            <w:color w:val="1155CC"/>
-            <w:sz w:val="20"/>
-            <w:szCs w:val="20"/>
-            <w:u w:val="single"/>
-          </w:rPr>
-          <w:t xml:space="preserve">GCN Members Click Here to Access it</w:t>
-        </w:r>
-      </w:hyperlink>
     </w:p>
     <w:tbl>
       <w:tblPr>
@@ -40316,7 +39330,7 @@
       <w:tr>
         <w:trPr>
           <w:cantSplit/>
-          <w:trHeight w:val="1192" w:hRule="atLeast"/>
+          <w:trHeight w:val="340" w:hRule="atLeast"/>
         </w:trPr>
         <w:tc>
           <w:tcPr>
@@ -40369,8 +39383,8 @@
         </w:tblBorders>
       </w:tblPr>
       <w:tblGrid>
-        <w:gridCol w:w="6760"/>
-        <w:gridCol w:w="1500"/>
+        <w:gridCol w:w="5560"/>
+        <w:gridCol w:w="2700"/>
         <w:gridCol w:w="1100"/>
       </w:tblGrid>
       <w:tr>
@@ -40379,7 +39393,7 @@
         </w:trPr>
         <w:tc>
           <w:tcPr>
-            <w:tcW w:type="dxa" w:w="6760"/>
+            <w:tcW w:type="dxa" w:w="5560"/>
             <w:tcBorders>
               <w:top w:val="none" w:color="FFFFFF" w:sz="0"/>
               <w:left w:val="single" w:color="B8860B" w:sz="24" w:space="10"/>
@@ -40413,7 +39427,7 @@
         </w:tc>
         <w:tc>
           <w:tcPr>
-            <w:tcW w:type="dxa" w:w="1500"/>
+            <w:tcW w:type="dxa" w:w="2700"/>
             <w:tcBorders>
               <w:top w:val="none" w:color="FFFFFF" w:sz="0"/>
               <w:left w:val="none" w:color="FFFFFF" w:sz="0"/>
@@ -40441,7 +39455,7 @@
                 <w:sz w:val="20"/>
                 <w:szCs w:val="20"/>
               </w:rPr>
-              <w:t xml:space="preserve">Empathy hours</w:t>
+              <w:t xml:space="preserve">Empathy practice hours</w:t>
             </w:r>
           </w:p>
         </w:tc>
@@ -40608,7 +39622,7 @@
       <w:tr>
         <w:trPr>
           <w:cantSplit/>
-          <w:trHeight w:val="673" w:hRule="atLeast"/>
+          <w:trHeight w:val="340" w:hRule="atLeast"/>
         </w:trPr>
         <w:tc>
           <w:tcPr>
@@ -40911,7 +39925,7 @@
       <w:tr>
         <w:trPr>
           <w:cantSplit/>
-          <w:trHeight w:val="1389" w:hRule="atLeast"/>
+          <w:trHeight w:val="340" w:hRule="atLeast"/>
         </w:trPr>
         <w:tc>
           <w:tcPr>
@@ -40990,40 +40004,6 @@
         </w:rPr>
         <w:t xml:space="preserve">Identify the need(s) you would have to meet first, in order to meet the original three needs you've identified. Over time (no rush, just keep the list in sight), see if you can think of a request or requests you might make of yourself or others (see Weeks 13 and 15). Continue this practice until your life gets more wonderful.</w:t>
       </w:r>
-    </w:p>
-    <w:p>
-      <w:pPr>
-        <w:keepLines/>
-        <w:spacing w:after="60" w:before="0" w:line="276" w:lineRule="auto"/>
-      </w:pPr>
-      <w:hyperlink w:history="1" r:id="rIdlz9u9gpxs0lijq8_sbulx">
-        <w:r>
-          <w:rPr>
-            <w:color w:val="1155CC"/>
-            <w:sz w:val="20"/>
-            <w:szCs w:val="20"/>
-            <w:u w:val="single"/>
-          </w:rPr>
-          <w:t xml:space="preserve">New to the GCN? Click Here to Join</w:t>
-        </w:r>
-      </w:hyperlink>
-    </w:p>
-    <w:p>
-      <w:pPr>
-        <w:keepLines/>
-        <w:spacing w:after="60" w:before="0" w:line="276" w:lineRule="auto"/>
-      </w:pPr>
-      <w:hyperlink w:history="1" r:id="rIdzb_4-8dxhfysuf4tbkwz9">
-        <w:r>
-          <w:rPr>
-            <w:color w:val="1155CC"/>
-            <w:sz w:val="20"/>
-            <w:szCs w:val="20"/>
-            <w:u w:val="single"/>
-          </w:rPr>
-          <w:t xml:space="preserve">GCN Members Click Here to Access it</w:t>
-        </w:r>
-      </w:hyperlink>
     </w:p>
     <w:tbl>
       <w:tblPr>
@@ -41082,7 +40062,7 @@
       <w:tr>
         <w:trPr>
           <w:cantSplit/>
-          <w:trHeight w:val="1389" w:hRule="atLeast"/>
+          <w:trHeight w:val="340" w:hRule="atLeast"/>
         </w:trPr>
         <w:tc>
           <w:tcPr>
@@ -41135,8 +40115,8 @@
         </w:tblBorders>
       </w:tblPr>
       <w:tblGrid>
-        <w:gridCol w:w="6760"/>
-        <w:gridCol w:w="1500"/>
+        <w:gridCol w:w="5560"/>
+        <w:gridCol w:w="2700"/>
         <w:gridCol w:w="1100"/>
       </w:tblGrid>
       <w:tr>
@@ -41145,7 +40125,7 @@
         </w:trPr>
         <w:tc>
           <w:tcPr>
-            <w:tcW w:type="dxa" w:w="6760"/>
+            <w:tcW w:type="dxa" w:w="5560"/>
             <w:tcBorders>
               <w:top w:val="none" w:color="FFFFFF" w:sz="0"/>
               <w:left w:val="single" w:color="B8860B" w:sz="24" w:space="10"/>
@@ -41179,7 +40159,7 @@
         </w:tc>
         <w:tc>
           <w:tcPr>
-            <w:tcW w:type="dxa" w:w="1500"/>
+            <w:tcW w:type="dxa" w:w="2700"/>
             <w:tcBorders>
               <w:top w:val="none" w:color="FFFFFF" w:sz="0"/>
               <w:left w:val="none" w:color="FFFFFF" w:sz="0"/>
@@ -41207,7 +40187,7 @@
                 <w:sz w:val="20"/>
                 <w:szCs w:val="20"/>
               </w:rPr>
-              <w:t xml:space="preserve">Empathy hours</w:t>
+              <w:t xml:space="preserve">Empathy practice hours</w:t>
             </w:r>
           </w:p>
         </w:tc>
@@ -41374,7 +40354,7 @@
       <w:tr>
         <w:trPr>
           <w:cantSplit/>
-          <w:trHeight w:val="784" w:hRule="atLeast"/>
+          <w:trHeight w:val="340" w:hRule="atLeast"/>
         </w:trPr>
         <w:tc>
           <w:tcPr>
@@ -41673,7 +40653,7 @@
       <w:tr>
         <w:trPr>
           <w:cantSplit/>
-          <w:trHeight w:val="820" w:hRule="atLeast"/>
+          <w:trHeight w:val="340" w:hRule="atLeast"/>
         </w:trPr>
         <w:tc>
           <w:tcPr>
@@ -41918,7 +40898,7 @@
       <w:tr>
         <w:trPr>
           <w:cantSplit/>
-          <w:trHeight w:val="820" w:hRule="atLeast"/>
+          <w:trHeight w:val="340" w:hRule="atLeast"/>
         </w:trPr>
         <w:tc>
           <w:tcPr>
@@ -42033,40 +41013,6 @@
         </w:rPr>
         <w:t xml:space="preserve"> to your strategy of using those words (see Week 13 and Week 15).</w:t>
       </w:r>
-    </w:p>
-    <w:p>
-      <w:pPr>
-        <w:keepLines/>
-        <w:spacing w:after="60" w:before="0" w:line="276" w:lineRule="auto"/>
-      </w:pPr>
-      <w:hyperlink w:history="1" r:id="rIdnct4ehfptv-cgw1q_swvz">
-        <w:r>
-          <w:rPr>
-            <w:color w:val="1155CC"/>
-            <w:sz w:val="20"/>
-            <w:szCs w:val="20"/>
-            <w:u w:val="single"/>
-          </w:rPr>
-          <w:t xml:space="preserve">New to the GCN? Click Here to Join</w:t>
-        </w:r>
-      </w:hyperlink>
-    </w:p>
-    <w:p>
-      <w:pPr>
-        <w:keepLines/>
-        <w:spacing w:after="60" w:before="0" w:line="276" w:lineRule="auto"/>
-      </w:pPr>
-      <w:hyperlink w:history="1" r:id="rIdahakb2ubfhiddzy_s0t8c">
-        <w:r>
-          <w:rPr>
-            <w:color w:val="1155CC"/>
-            <w:sz w:val="20"/>
-            <w:szCs w:val="20"/>
-            <w:u w:val="single"/>
-          </w:rPr>
-          <w:t xml:space="preserve">GCN Members Click Here to Access it</w:t>
-        </w:r>
-      </w:hyperlink>
     </w:p>
     <w:tbl>
       <w:tblPr>
@@ -42125,7 +41071,7 @@
       <w:tr>
         <w:trPr>
           <w:cantSplit/>
-          <w:trHeight w:val="820" w:hRule="atLeast"/>
+          <w:trHeight w:val="340" w:hRule="atLeast"/>
         </w:trPr>
         <w:tc>
           <w:tcPr>
@@ -42178,8 +41124,8 @@
         </w:tblBorders>
       </w:tblPr>
       <w:tblGrid>
-        <w:gridCol w:w="6760"/>
-        <w:gridCol w:w="1500"/>
+        <w:gridCol w:w="5560"/>
+        <w:gridCol w:w="2700"/>
         <w:gridCol w:w="1100"/>
       </w:tblGrid>
       <w:tr>
@@ -42188,7 +41134,7 @@
         </w:trPr>
         <w:tc>
           <w:tcPr>
-            <w:tcW w:type="dxa" w:w="6760"/>
+            <w:tcW w:type="dxa" w:w="5560"/>
             <w:tcBorders>
               <w:top w:val="none" w:color="FFFFFF" w:sz="0"/>
               <w:left w:val="single" w:color="B8860B" w:sz="24" w:space="10"/>
@@ -42222,7 +41168,7 @@
         </w:tc>
         <w:tc>
           <w:tcPr>
-            <w:tcW w:type="dxa" w:w="1500"/>
+            <w:tcW w:type="dxa" w:w="2700"/>
             <w:tcBorders>
               <w:top w:val="none" w:color="FFFFFF" w:sz="0"/>
               <w:left w:val="none" w:color="FFFFFF" w:sz="0"/>
@@ -42250,7 +41196,7 @@
                 <w:sz w:val="20"/>
                 <w:szCs w:val="20"/>
               </w:rPr>
-              <w:t xml:space="preserve">Empathy hours</w:t>
+              <w:t xml:space="preserve">Empathy practice hours</w:t>
             </w:r>
           </w:p>
         </w:tc>
@@ -42417,7 +41363,7 @@
       <w:tr>
         <w:trPr>
           <w:cantSplit/>
-          <w:trHeight w:val="1300" w:hRule="atLeast"/>
+          <w:trHeight w:val="340" w:hRule="atLeast"/>
         </w:trPr>
         <w:tc>
           <w:tcPr>
@@ -42696,7 +41642,7 @@
       <w:tr>
         <w:trPr>
           <w:cantSplit/>
-          <w:trHeight w:val="749" w:hRule="atLeast"/>
+          <w:trHeight w:val="340" w:hRule="atLeast"/>
         </w:trPr>
         <w:tc>
           <w:tcPr>
@@ -42811,40 +41757,6 @@
         </w:rPr>
         <w:t xml:space="preserve">Notice that you are serving life. Notice what happens inside you.</w:t>
       </w:r>
-    </w:p>
-    <w:p>
-      <w:pPr>
-        <w:keepLines/>
-        <w:spacing w:after="60" w:before="0" w:line="276" w:lineRule="auto"/>
-      </w:pPr>
-      <w:hyperlink w:history="1" r:id="rIdw9zh8szu2khbyqfwnxf-c">
-        <w:r>
-          <w:rPr>
-            <w:color w:val="1155CC"/>
-            <w:sz w:val="20"/>
-            <w:szCs w:val="20"/>
-            <w:u w:val="single"/>
-          </w:rPr>
-          <w:t xml:space="preserve">New to the GCN? Click Here to Join</w:t>
-        </w:r>
-      </w:hyperlink>
-    </w:p>
-    <w:p>
-      <w:pPr>
-        <w:keepLines/>
-        <w:spacing w:after="60" w:before="0" w:line="276" w:lineRule="auto"/>
-      </w:pPr>
-      <w:hyperlink w:history="1" r:id="rId-orfzghnimqwaqs_y5bkb">
-        <w:r>
-          <w:rPr>
-            <w:color w:val="1155CC"/>
-            <w:sz w:val="20"/>
-            <w:szCs w:val="20"/>
-            <w:u w:val="single"/>
-          </w:rPr>
-          <w:t xml:space="preserve">GCN Members Click Here to Access it</w:t>
-        </w:r>
-      </w:hyperlink>
     </w:p>
     <w:tbl>
       <w:tblPr>
@@ -42903,7 +41815,7 @@
       <w:tr>
         <w:trPr>
           <w:cantSplit/>
-          <w:trHeight w:val="749" w:hRule="atLeast"/>
+          <w:trHeight w:val="340" w:hRule="atLeast"/>
         </w:trPr>
         <w:tc>
           <w:tcPr>
@@ -42956,8 +41868,8 @@
         </w:tblBorders>
       </w:tblPr>
       <w:tblGrid>
-        <w:gridCol w:w="6760"/>
-        <w:gridCol w:w="1500"/>
+        <w:gridCol w:w="5560"/>
+        <w:gridCol w:w="2700"/>
         <w:gridCol w:w="1100"/>
       </w:tblGrid>
       <w:tr>
@@ -42966,7 +41878,7 @@
         </w:trPr>
         <w:tc>
           <w:tcPr>
-            <w:tcW w:type="dxa" w:w="6760"/>
+            <w:tcW w:type="dxa" w:w="5560"/>
             <w:tcBorders>
               <w:top w:val="none" w:color="FFFFFF" w:sz="0"/>
               <w:left w:val="single" w:color="B8860B" w:sz="24" w:space="10"/>
@@ -43000,7 +41912,7 @@
         </w:tc>
         <w:tc>
           <w:tcPr>
-            <w:tcW w:type="dxa" w:w="1500"/>
+            <w:tcW w:type="dxa" w:w="2700"/>
             <w:tcBorders>
               <w:top w:val="none" w:color="FFFFFF" w:sz="0"/>
               <w:left w:val="none" w:color="FFFFFF" w:sz="0"/>
@@ -43028,7 +41940,7 @@
                 <w:sz w:val="20"/>
                 <w:szCs w:val="20"/>
               </w:rPr>
-              <w:t xml:space="preserve">Empathy hours</w:t>
+              <w:t xml:space="preserve">Empathy practice hours</w:t>
             </w:r>
           </w:p>
         </w:tc>
@@ -43195,7 +42107,7 @@
       <w:tr>
         <w:trPr>
           <w:cantSplit/>
-          <w:trHeight w:val="423" w:hRule="atLeast"/>
+          <w:trHeight w:val="340" w:hRule="atLeast"/>
         </w:trPr>
         <w:tc>
           <w:tcPr>
@@ -43406,7 +42318,7 @@
       <w:tr>
         <w:trPr>
           <w:cantSplit/>
-          <w:trHeight w:val="1190" w:hRule="atLeast"/>
+          <w:trHeight w:val="340" w:hRule="atLeast"/>
         </w:trPr>
         <w:tc>
           <w:tcPr>
@@ -43527,7 +42439,7 @@
       <w:tr>
         <w:trPr>
           <w:cantSplit/>
-          <w:trHeight w:val="1190" w:hRule="atLeast"/>
+          <w:trHeight w:val="340" w:hRule="atLeast"/>
         </w:trPr>
         <w:tc>
           <w:tcPr>
@@ -43574,40 +42486,6 @@
       <w:r>
         <w:t xml:space="preserve">Dream...</w:t>
       </w:r>
-    </w:p>
-    <w:p>
-      <w:pPr>
-        <w:keepLines/>
-        <w:spacing w:after="60" w:before="0" w:line="276" w:lineRule="auto"/>
-      </w:pPr>
-      <w:hyperlink w:history="1" r:id="rIdhnnr1wc68lhm0fuogpsgt">
-        <w:r>
-          <w:rPr>
-            <w:color w:val="1155CC"/>
-            <w:sz w:val="20"/>
-            <w:szCs w:val="20"/>
-            <w:u w:val="single"/>
-          </w:rPr>
-          <w:t xml:space="preserve">New to the GCN? Click Here to Join</w:t>
-        </w:r>
-      </w:hyperlink>
-    </w:p>
-    <w:p>
-      <w:pPr>
-        <w:keepLines/>
-        <w:spacing w:after="60" w:before="0" w:line="276" w:lineRule="auto"/>
-      </w:pPr>
-      <w:hyperlink w:history="1" r:id="rId3kczfcdx0ozpla3zwxhgu">
-        <w:r>
-          <w:rPr>
-            <w:color w:val="1155CC"/>
-            <w:sz w:val="20"/>
-            <w:szCs w:val="20"/>
-            <w:u w:val="single"/>
-          </w:rPr>
-          <w:t xml:space="preserve">GCN Members Click Here to Access it</w:t>
-        </w:r>
-      </w:hyperlink>
     </w:p>
     <w:tbl>
       <w:tblPr>
@@ -43666,7 +42544,7 @@
       <w:tr>
         <w:trPr>
           <w:cantSplit/>
-          <w:trHeight w:val="1190" w:hRule="atLeast"/>
+          <w:trHeight w:val="340" w:hRule="atLeast"/>
         </w:trPr>
         <w:tc>
           <w:tcPr>
@@ -43719,8 +42597,8 @@
         </w:tblBorders>
       </w:tblPr>
       <w:tblGrid>
-        <w:gridCol w:w="6760"/>
-        <w:gridCol w:w="1500"/>
+        <w:gridCol w:w="5560"/>
+        <w:gridCol w:w="2700"/>
         <w:gridCol w:w="1100"/>
       </w:tblGrid>
       <w:tr>
@@ -43729,7 +42607,7 @@
         </w:trPr>
         <w:tc>
           <w:tcPr>
-            <w:tcW w:type="dxa" w:w="6760"/>
+            <w:tcW w:type="dxa" w:w="5560"/>
             <w:tcBorders>
               <w:top w:val="none" w:color="FFFFFF" w:sz="0"/>
               <w:left w:val="single" w:color="B8860B" w:sz="24" w:space="10"/>
@@ -43763,7 +42641,7 @@
         </w:tc>
         <w:tc>
           <w:tcPr>
-            <w:tcW w:type="dxa" w:w="1500"/>
+            <w:tcW w:type="dxa" w:w="2700"/>
             <w:tcBorders>
               <w:top w:val="none" w:color="FFFFFF" w:sz="0"/>
               <w:left w:val="none" w:color="FFFFFF" w:sz="0"/>
@@ -43791,7 +42669,7 @@
                 <w:sz w:val="20"/>
                 <w:szCs w:val="20"/>
               </w:rPr>
-              <w:t xml:space="preserve">Empathy hours</w:t>
+              <w:t xml:space="preserve">Empathy practice hours</w:t>
             </w:r>
           </w:p>
         </w:tc>
@@ -43958,7 +42836,7 @@
       <w:tr>
         <w:trPr>
           <w:cantSplit/>
-          <w:trHeight w:val="1007" w:hRule="atLeast"/>
+          <w:trHeight w:val="340" w:hRule="atLeast"/>
         </w:trPr>
         <w:tc>
           <w:tcPr>
@@ -44124,7 +43002,7 @@
         <w:sz w:val="16"/>
         <w:szCs w:val="16"/>
       </w:rPr>
-      <w:t xml:space="preserve">The Compassion Course  ·  2026–2027 Workbook</w:t>
+      <w:t xml:space="preserve">The Compassion Course 2026-27 Workbook</w:t>
     </w:r>
     <w:r>
       <w:rPr>

</xml_diff>

<commit_message>
Workbook + lessons: one-line reflections header; remove stray GCN links from weeks content
- Workbook: widen the reflections middle column so 'A real-life situation I
  approached in a new way' fits on one line (Thom's feedback, item 3)
- Lessons (weeks 19-52): remove the misplaced, duplicated GCN join/access links
  that sat inside a practice card; the legitimate GCN links in each lesson's GCN
  section are kept. Needs re-upload to Firebase (firebase login --reauth).

Co-Authored-By: Claude Opus 4.8 (1M context) <noreply@anthropic.com>
</commit_message>
<xml_diff>
--- a/.local-workbook/The Compassion Course 2026-2027 Workbook.docx
+++ b/.local-workbook/The Compassion Course 2026-2027 Workbook.docx
@@ -579,7 +579,7 @@
         </w:rPr>
         <w:t xml:space="preserve">Keep a small journal with you throughout the day. Make 1 to 5 entries per day that include the description of an act or words spoken by someone and what need you imagine they were trying to meet. It is SUPER important to limit the words you use to those on the </w:t>
       </w:r>
-      <w:hyperlink w:history="1" r:id="rIdocgx-uuq4oibbywpqudmt">
+      <w:hyperlink w:history="1" r:id="rIdk_bpn0tfp-itwr7b-4yvb">
         <w:r>
           <w:rPr>
             <w:color w:val="1155CC"/>
@@ -721,7 +721,7 @@
         </w:rPr>
         <w:t xml:space="preserve">Think of someone who is close to you who is doing or saying something you don't like. See if you can figure out what need they are attempting to fulfill. Again, it is really important to limit the words you use to those on the </w:t>
       </w:r>
-      <w:hyperlink w:history="1" r:id="rIdfqvudtmit01q4gz9ks2c7">
+      <w:hyperlink w:history="1" r:id="rIdgwwawmosqv5n8esxsfqzh">
         <w:r>
           <w:rPr>
             <w:color w:val="1155CC"/>
@@ -1016,7 +1016,7 @@
         </w:rPr>
         <w:t xml:space="preserve">Extended registration lasts for one week. To let someone know about the course you can use the following link: </w:t>
       </w:r>
-      <w:hyperlink w:history="1" r:id="rId5rtd5p33cyzpq6r3ao-jb">
+      <w:hyperlink w:history="1" r:id="rIdgszycgribjimceawahe-g">
         <w:r>
           <w:rPr>
             <w:color w:val="1155CC"/>
@@ -1153,9 +1153,9 @@
         </w:tblBorders>
       </w:tblPr>
       <w:tblGrid>
-        <w:gridCol w:w="3120"/>
-        <w:gridCol w:w="3120"/>
-        <w:gridCol w:w="3120"/>
+        <w:gridCol w:w="2000"/>
+        <w:gridCol w:w="4660"/>
+        <w:gridCol w:w="2700"/>
       </w:tblGrid>
       <w:tr>
         <w:trPr>
@@ -1164,7 +1164,7 @@
         </w:trPr>
         <w:tc>
           <w:tcPr>
-            <w:tcW w:type="dxa" w:w="3120"/>
+            <w:tcW w:type="dxa" w:w="2000"/>
             <w:tcBorders>
               <w:top w:val="single" w:color="CFE3DF" w:sz="4"/>
               <w:left w:val="single" w:color="CFE3DF" w:sz="4"/>
@@ -1197,7 +1197,7 @@
         </w:tc>
         <w:tc>
           <w:tcPr>
-            <w:tcW w:type="dxa" w:w="3120"/>
+            <w:tcW w:type="dxa" w:w="4660"/>
             <w:tcBorders>
               <w:top w:val="single" w:color="CFE3DF" w:sz="4"/>
               <w:left w:val="single" w:color="CFE3DF" w:sz="4"/>
@@ -1230,7 +1230,7 @@
         </w:tc>
         <w:tc>
           <w:tcPr>
-            <w:tcW w:type="dxa" w:w="3120"/>
+            <w:tcW w:type="dxa" w:w="2700"/>
             <w:tcBorders>
               <w:top w:val="single" w:color="CFE3DF" w:sz="4"/>
               <w:left w:val="single" w:color="CFE3DF" w:sz="4"/>
@@ -1269,7 +1269,7 @@
         </w:trPr>
         <w:tc>
           <w:tcPr>
-            <w:tcW w:type="dxa" w:w="3120"/>
+            <w:tcW w:type="dxa" w:w="2000"/>
             <w:tcBorders>
               <w:top w:val="single" w:color="CFE3DF" w:sz="4"/>
               <w:left w:val="single" w:color="CFE3DF" w:sz="4"/>
@@ -1300,7 +1300,7 @@
         </w:tc>
         <w:tc>
           <w:tcPr>
-            <w:tcW w:type="dxa" w:w="3120"/>
+            <w:tcW w:type="dxa" w:w="4660"/>
             <w:tcBorders>
               <w:top w:val="single" w:color="CFE3DF" w:sz="4"/>
               <w:left w:val="single" w:color="CFE3DF" w:sz="4"/>
@@ -1331,7 +1331,7 @@
         </w:tc>
         <w:tc>
           <w:tcPr>
-            <w:tcW w:type="dxa" w:w="3120"/>
+            <w:tcW w:type="dxa" w:w="2700"/>
             <w:tcBorders>
               <w:top w:val="single" w:color="CFE3DF" w:sz="4"/>
               <w:left w:val="single" w:color="CFE3DF" w:sz="4"/>
@@ -1418,7 +1418,7 @@
         </w:rPr>
         <w:t xml:space="preserve">Keep a small journal with you throughout the day. Make 1 to 5 entries per day that include judgment words you said or were thinking of saying. Later on, when you have time, sit down with the </w:t>
       </w:r>
-      <w:hyperlink w:history="1" r:id="rIdcbtqqfk9zeragj7br8eff">
+      <w:hyperlink w:history="1" r:id="rIdjipg9nv15aspajdtgghxx">
         <w:r>
           <w:rPr>
             <w:color w:val="1155CC"/>
@@ -1439,7 +1439,7 @@
         </w:rPr>
         <w:t xml:space="preserve"> and see if you can figure out what need of yours the judgment was (or is) related to. Remember, to successfully complete this exercise, limit the words you use to those on the </w:t>
       </w:r>
-      <w:hyperlink w:history="1" r:id="rId990raxvxj4ezhqhpwda__">
+      <w:hyperlink w:history="1" r:id="rIdws6jvuoktmcch2houcfsr">
         <w:r>
           <w:rPr>
             <w:color w:val="1155CC"/>
@@ -1581,7 +1581,7 @@
         </w:rPr>
         <w:t xml:space="preserve">Keep a small journal with you throughout the day. It could be a little book, a folded piece of paper or a napkin -anything you can write on. Make 1 to 5 entries per day that include judgment words spoken by someone. Later on, when you have time, sit down with the </w:t>
       </w:r>
-      <w:hyperlink w:history="1" r:id="rIda1u7z6wd-avb-j2lwo-7e">
+      <w:hyperlink w:history="1" r:id="rIdymhvrrv9ahthq6zut0m7u">
         <w:r>
           <w:rPr>
             <w:color w:val="1155CC"/>
@@ -1602,7 +1602,7 @@
         </w:rPr>
         <w:t xml:space="preserve"> and see if you can figure out what need was unmet for them. Remember to limit the words you use to those on the </w:t>
       </w:r>
-      <w:hyperlink w:history="1" r:id="rIdn9_imqshqvd3pzfsltepy">
+      <w:hyperlink w:history="1" r:id="rIdu1als90l_xhnsrq399xqb">
         <w:r>
           <w:rPr>
             <w:color w:val="1155CC"/>
@@ -1860,9 +1860,9 @@
         </w:tblBorders>
       </w:tblPr>
       <w:tblGrid>
-        <w:gridCol w:w="3120"/>
-        <w:gridCol w:w="3120"/>
-        <w:gridCol w:w="3120"/>
+        <w:gridCol w:w="2000"/>
+        <w:gridCol w:w="4660"/>
+        <w:gridCol w:w="2700"/>
       </w:tblGrid>
       <w:tr>
         <w:trPr>
@@ -1871,7 +1871,7 @@
         </w:trPr>
         <w:tc>
           <w:tcPr>
-            <w:tcW w:type="dxa" w:w="3120"/>
+            <w:tcW w:type="dxa" w:w="2000"/>
             <w:tcBorders>
               <w:top w:val="single" w:color="CFE3DF" w:sz="4"/>
               <w:left w:val="single" w:color="CFE3DF" w:sz="4"/>
@@ -1904,7 +1904,7 @@
         </w:tc>
         <w:tc>
           <w:tcPr>
-            <w:tcW w:type="dxa" w:w="3120"/>
+            <w:tcW w:type="dxa" w:w="4660"/>
             <w:tcBorders>
               <w:top w:val="single" w:color="CFE3DF" w:sz="4"/>
               <w:left w:val="single" w:color="CFE3DF" w:sz="4"/>
@@ -1937,7 +1937,7 @@
         </w:tc>
         <w:tc>
           <w:tcPr>
-            <w:tcW w:type="dxa" w:w="3120"/>
+            <w:tcW w:type="dxa" w:w="2700"/>
             <w:tcBorders>
               <w:top w:val="single" w:color="CFE3DF" w:sz="4"/>
               <w:left w:val="single" w:color="CFE3DF" w:sz="4"/>
@@ -1976,7 +1976,7 @@
         </w:trPr>
         <w:tc>
           <w:tcPr>
-            <w:tcW w:type="dxa" w:w="3120"/>
+            <w:tcW w:type="dxa" w:w="2000"/>
             <w:tcBorders>
               <w:top w:val="single" w:color="CFE3DF" w:sz="4"/>
               <w:left w:val="single" w:color="CFE3DF" w:sz="4"/>
@@ -2007,7 +2007,7 @@
         </w:tc>
         <w:tc>
           <w:tcPr>
-            <w:tcW w:type="dxa" w:w="3120"/>
+            <w:tcW w:type="dxa" w:w="4660"/>
             <w:tcBorders>
               <w:top w:val="single" w:color="CFE3DF" w:sz="4"/>
               <w:left w:val="single" w:color="CFE3DF" w:sz="4"/>
@@ -2038,7 +2038,7 @@
         </w:tc>
         <w:tc>
           <w:tcPr>
-            <w:tcW w:type="dxa" w:w="3120"/>
+            <w:tcW w:type="dxa" w:w="2700"/>
             <w:tcBorders>
               <w:top w:val="single" w:color="CFE3DF" w:sz="4"/>
               <w:left w:val="single" w:color="CFE3DF" w:sz="4"/>
@@ -2141,7 +2141,7 @@
         </w:rPr>
         <w:t xml:space="preserve">Later on, when you have time, sit down with the </w:t>
       </w:r>
-      <w:hyperlink w:history="1" r:id="rIdn2c1fbcsjqjzmopfmig3e">
+      <w:hyperlink w:history="1" r:id="rIdngjbfockabkoszsxhchfi">
         <w:r>
           <w:rPr>
             <w:color w:val="1155CC"/>
@@ -2198,7 +2198,7 @@
         </w:rPr>
         <w:t xml:space="preserve"> at the top of the </w:t>
       </w:r>
-      <w:hyperlink w:history="1" r:id="rIdz64b4wx8jcw2w8djya6b5">
+      <w:hyperlink w:history="1" r:id="rIdwacosk-1xtpy_xlkravrz">
         <w:r>
           <w:rPr>
             <w:color w:val="1155CC"/>
@@ -2235,7 +2235,7 @@
         </w:rPr>
         <w:t xml:space="preserve">Then look at the </w:t>
       </w:r>
-      <w:hyperlink w:history="1" r:id="rIdgsiqqqduwkvukpravjx5p">
+      <w:hyperlink w:history="1" r:id="rIdsags5d_9puuqjrpjhmohp">
         <w:r>
           <w:rPr>
             <w:color w:val="1155CC"/>
@@ -2256,7 +2256,7 @@
         </w:rPr>
         <w:t xml:space="preserve"> and see if you can figure out what need your feeling was about. Remember, it's VERY helpful to limit the words you use to those on the </w:t>
       </w:r>
-      <w:hyperlink w:history="1" r:id="rIdyoslnwyugazzbnhh8jajr">
+      <w:hyperlink w:history="1" r:id="rId-i-p_dl_-v0jhzzgu2sb9">
         <w:r>
           <w:rPr>
             <w:color w:val="1155CC"/>
@@ -2398,7 +2398,7 @@
         </w:rPr>
         <w:t xml:space="preserve">Keep a small journal with you throughout the day. Make 2 to 4 entries per day that include something you did, said or were thinking of saying and the feeling (or feelings) you experienced at that moment. Again, later on, when you have time, sit down with the </w:t>
       </w:r>
-      <w:hyperlink w:history="1" r:id="rId8v-buufbg67cqojfycq3g">
+      <w:hyperlink w:history="1" r:id="rIdiafuy0cuz6orx2auxhfan">
         <w:r>
           <w:rPr>
             <w:color w:val="1155CC"/>
@@ -2455,7 +2455,7 @@
         </w:rPr>
         <w:t xml:space="preserve"> at the top of the </w:t>
       </w:r>
-      <w:hyperlink w:history="1" r:id="rIduxchx725-sbpzs9hc5cln">
+      <w:hyperlink w:history="1" r:id="rId6nmljbuahfp9frqps33rk">
         <w:r>
           <w:rPr>
             <w:color w:val="1155CC"/>
@@ -2492,7 +2492,7 @@
         </w:rPr>
         <w:t xml:space="preserve">Then look at the </w:t>
       </w:r>
-      <w:hyperlink w:history="1" r:id="rIdxomj22-vzhfnjwspvdwhn">
+      <w:hyperlink w:history="1" r:id="rId9iyz-dlmgt-n5qevhd2sv">
         <w:r>
           <w:rPr>
             <w:color w:val="1155CC"/>
@@ -2513,7 +2513,7 @@
         </w:rPr>
         <w:t xml:space="preserve"> and see if you can figure out what need your feeling was about. Remember, here too, it's VERY important to limit the words you use to those on the </w:t>
       </w:r>
-      <w:hyperlink w:history="1" r:id="rIdfin5ptwticsf4sttqjlly">
+      <w:hyperlink w:history="1" r:id="rIdvorwi3ukoqmoiwtqrokqf">
         <w:r>
           <w:rPr>
             <w:color w:val="1155CC"/>
@@ -2650,9 +2650,9 @@
         </w:tblBorders>
       </w:tblPr>
       <w:tblGrid>
-        <w:gridCol w:w="3120"/>
-        <w:gridCol w:w="3120"/>
-        <w:gridCol w:w="3120"/>
+        <w:gridCol w:w="2000"/>
+        <w:gridCol w:w="4660"/>
+        <w:gridCol w:w="2700"/>
       </w:tblGrid>
       <w:tr>
         <w:trPr>
@@ -2661,7 +2661,7 @@
         </w:trPr>
         <w:tc>
           <w:tcPr>
-            <w:tcW w:type="dxa" w:w="3120"/>
+            <w:tcW w:type="dxa" w:w="2000"/>
             <w:tcBorders>
               <w:top w:val="single" w:color="CFE3DF" w:sz="4"/>
               <w:left w:val="single" w:color="CFE3DF" w:sz="4"/>
@@ -2694,7 +2694,7 @@
         </w:tc>
         <w:tc>
           <w:tcPr>
-            <w:tcW w:type="dxa" w:w="3120"/>
+            <w:tcW w:type="dxa" w:w="4660"/>
             <w:tcBorders>
               <w:top w:val="single" w:color="CFE3DF" w:sz="4"/>
               <w:left w:val="single" w:color="CFE3DF" w:sz="4"/>
@@ -2727,7 +2727,7 @@
         </w:tc>
         <w:tc>
           <w:tcPr>
-            <w:tcW w:type="dxa" w:w="3120"/>
+            <w:tcW w:type="dxa" w:w="2700"/>
             <w:tcBorders>
               <w:top w:val="single" w:color="CFE3DF" w:sz="4"/>
               <w:left w:val="single" w:color="CFE3DF" w:sz="4"/>
@@ -2766,7 +2766,7 @@
         </w:trPr>
         <w:tc>
           <w:tcPr>
-            <w:tcW w:type="dxa" w:w="3120"/>
+            <w:tcW w:type="dxa" w:w="2000"/>
             <w:tcBorders>
               <w:top w:val="single" w:color="CFE3DF" w:sz="4"/>
               <w:left w:val="single" w:color="CFE3DF" w:sz="4"/>
@@ -2797,7 +2797,7 @@
         </w:tc>
         <w:tc>
           <w:tcPr>
-            <w:tcW w:type="dxa" w:w="3120"/>
+            <w:tcW w:type="dxa" w:w="4660"/>
             <w:tcBorders>
               <w:top w:val="single" w:color="CFE3DF" w:sz="4"/>
               <w:left w:val="single" w:color="CFE3DF" w:sz="4"/>
@@ -2828,7 +2828,7 @@
         </w:tc>
         <w:tc>
           <w:tcPr>
-            <w:tcW w:type="dxa" w:w="3120"/>
+            <w:tcW w:type="dxa" w:w="2700"/>
             <w:tcBorders>
               <w:top w:val="single" w:color="CFE3DF" w:sz="4"/>
               <w:left w:val="single" w:color="CFE3DF" w:sz="4"/>
@@ -2899,7 +2899,7 @@
       <w:r>
         <w:t xml:space="preserve">Read the </w:t>
       </w:r>
-      <w:hyperlink w:history="1" r:id="rIdse80lv1waets4pojtqj67">
+      <w:hyperlink w:history="1" r:id="rIdnahpykoukwc9lwzb6lgrh">
         <w:r>
           <w:rPr>
             <w:color w:val="1155CC"/>
@@ -3032,7 +3032,7 @@
       <w:r>
         <w:t xml:space="preserve">Print a copy of the </w:t>
       </w:r>
-      <w:hyperlink w:history="1" r:id="rIdayqwe7dq7moglovupqlgc">
+      <w:hyperlink w:history="1" r:id="rIdnqhrfbxk6fdzgn2r60wqr">
         <w:r>
           <w:rPr>
             <w:color w:val="1155CC"/>
@@ -3197,7 +3197,7 @@
         </w:rPr>
         <w:t xml:space="preserve">Keep a small journal with you throughout the day. Make 1 to 5 entries per day that include an act or words spoken by someone and what need(s) you imagine they were trying to meet. Remember, it's VERY helpful to limit the words you use to those on the </w:t>
       </w:r>
-      <w:hyperlink w:history="1" r:id="rId7qstlsudba4ottxcikc-h">
+      <w:hyperlink w:history="1" r:id="rIdaawiwc7_25ppsidblj1im">
         <w:r>
           <w:rPr>
             <w:color w:val="1155CC"/>
@@ -3339,7 +3339,7 @@
         </w:rPr>
         <w:t xml:space="preserve">Think of someone that you think is preventing you from getting a need(s) met. Write down the need(s) from the </w:t>
       </w:r>
-      <w:hyperlink w:history="1" r:id="rIdnjyqqz8cskqe6rgh5z4zx">
+      <w:hyperlink w:history="1" r:id="rIdwjnjjtth-dsekcs-jiqls">
         <w:r>
           <w:rPr>
             <w:color w:val="1155CC"/>
@@ -3476,9 +3476,9 @@
         </w:tblBorders>
       </w:tblPr>
       <w:tblGrid>
-        <w:gridCol w:w="3120"/>
-        <w:gridCol w:w="3120"/>
-        <w:gridCol w:w="3120"/>
+        <w:gridCol w:w="2000"/>
+        <w:gridCol w:w="4660"/>
+        <w:gridCol w:w="2700"/>
       </w:tblGrid>
       <w:tr>
         <w:trPr>
@@ -3487,7 +3487,7 @@
         </w:trPr>
         <w:tc>
           <w:tcPr>
-            <w:tcW w:type="dxa" w:w="3120"/>
+            <w:tcW w:type="dxa" w:w="2000"/>
             <w:tcBorders>
               <w:top w:val="single" w:color="CFE3DF" w:sz="4"/>
               <w:left w:val="single" w:color="CFE3DF" w:sz="4"/>
@@ -3520,7 +3520,7 @@
         </w:tc>
         <w:tc>
           <w:tcPr>
-            <w:tcW w:type="dxa" w:w="3120"/>
+            <w:tcW w:type="dxa" w:w="4660"/>
             <w:tcBorders>
               <w:top w:val="single" w:color="CFE3DF" w:sz="4"/>
               <w:left w:val="single" w:color="CFE3DF" w:sz="4"/>
@@ -3553,7 +3553,7 @@
         </w:tc>
         <w:tc>
           <w:tcPr>
-            <w:tcW w:type="dxa" w:w="3120"/>
+            <w:tcW w:type="dxa" w:w="2700"/>
             <w:tcBorders>
               <w:top w:val="single" w:color="CFE3DF" w:sz="4"/>
               <w:left w:val="single" w:color="CFE3DF" w:sz="4"/>
@@ -3592,7 +3592,7 @@
         </w:trPr>
         <w:tc>
           <w:tcPr>
-            <w:tcW w:type="dxa" w:w="3120"/>
+            <w:tcW w:type="dxa" w:w="2000"/>
             <w:tcBorders>
               <w:top w:val="single" w:color="CFE3DF" w:sz="4"/>
               <w:left w:val="single" w:color="CFE3DF" w:sz="4"/>
@@ -3623,7 +3623,7 @@
         </w:tc>
         <w:tc>
           <w:tcPr>
-            <w:tcW w:type="dxa" w:w="3120"/>
+            <w:tcW w:type="dxa" w:w="4660"/>
             <w:tcBorders>
               <w:top w:val="single" w:color="CFE3DF" w:sz="4"/>
               <w:left w:val="single" w:color="CFE3DF" w:sz="4"/>
@@ -3654,7 +3654,7 @@
         </w:tc>
         <w:tc>
           <w:tcPr>
-            <w:tcW w:type="dxa" w:w="3120"/>
+            <w:tcW w:type="dxa" w:w="2700"/>
             <w:tcBorders>
               <w:top w:val="single" w:color="CFE3DF" w:sz="4"/>
               <w:left w:val="single" w:color="CFE3DF" w:sz="4"/>
@@ -3741,7 +3741,7 @@
         </w:rPr>
         <w:t xml:space="preserve">Visit: http://</w:t>
       </w:r>
-      <w:hyperlink w:history="1" r:id="rIdzcs41_bzzb-by3ndy-bub">
+      <w:hyperlink w:history="1" r:id="rIddhcyqokquz4xjbmdgkk-h">
         <w:r>
           <w:rPr>
             <w:color w:val="1155CC"/>
@@ -4017,7 +4017,7 @@
         <w:keepLines/>
         <w:spacing w:after="60" w:before="0" w:line="276" w:lineRule="auto"/>
       </w:pPr>
-      <w:hyperlink w:history="1" r:id="rIdhx7od-bzmskagipmyevh6">
+      <w:hyperlink w:history="1" r:id="rIdhrzqwn4-yq3u5gq9qf8d7">
         <w:r>
           <w:rPr>
             <w:color w:val="1155CC"/>
@@ -4144,9 +4144,9 @@
         </w:tblBorders>
       </w:tblPr>
       <w:tblGrid>
-        <w:gridCol w:w="3120"/>
-        <w:gridCol w:w="3120"/>
-        <w:gridCol w:w="3120"/>
+        <w:gridCol w:w="2000"/>
+        <w:gridCol w:w="4660"/>
+        <w:gridCol w:w="2700"/>
       </w:tblGrid>
       <w:tr>
         <w:trPr>
@@ -4155,7 +4155,7 @@
         </w:trPr>
         <w:tc>
           <w:tcPr>
-            <w:tcW w:type="dxa" w:w="3120"/>
+            <w:tcW w:type="dxa" w:w="2000"/>
             <w:tcBorders>
               <w:top w:val="single" w:color="CFE3DF" w:sz="4"/>
               <w:left w:val="single" w:color="CFE3DF" w:sz="4"/>
@@ -4188,7 +4188,7 @@
         </w:tc>
         <w:tc>
           <w:tcPr>
-            <w:tcW w:type="dxa" w:w="3120"/>
+            <w:tcW w:type="dxa" w:w="4660"/>
             <w:tcBorders>
               <w:top w:val="single" w:color="CFE3DF" w:sz="4"/>
               <w:left w:val="single" w:color="CFE3DF" w:sz="4"/>
@@ -4221,7 +4221,7 @@
         </w:tc>
         <w:tc>
           <w:tcPr>
-            <w:tcW w:type="dxa" w:w="3120"/>
+            <w:tcW w:type="dxa" w:w="2700"/>
             <w:tcBorders>
               <w:top w:val="single" w:color="CFE3DF" w:sz="4"/>
               <w:left w:val="single" w:color="CFE3DF" w:sz="4"/>
@@ -4260,7 +4260,7 @@
         </w:trPr>
         <w:tc>
           <w:tcPr>
-            <w:tcW w:type="dxa" w:w="3120"/>
+            <w:tcW w:type="dxa" w:w="2000"/>
             <w:tcBorders>
               <w:top w:val="single" w:color="CFE3DF" w:sz="4"/>
               <w:left w:val="single" w:color="CFE3DF" w:sz="4"/>
@@ -4291,7 +4291,7 @@
         </w:tc>
         <w:tc>
           <w:tcPr>
-            <w:tcW w:type="dxa" w:w="3120"/>
+            <w:tcW w:type="dxa" w:w="4660"/>
             <w:tcBorders>
               <w:top w:val="single" w:color="CFE3DF" w:sz="4"/>
               <w:left w:val="single" w:color="CFE3DF" w:sz="4"/>
@@ -4322,7 +4322,7 @@
         </w:tc>
         <w:tc>
           <w:tcPr>
-            <w:tcW w:type="dxa" w:w="3120"/>
+            <w:tcW w:type="dxa" w:w="2700"/>
             <w:tcBorders>
               <w:top w:val="single" w:color="CFE3DF" w:sz="4"/>
               <w:left w:val="single" w:color="CFE3DF" w:sz="4"/>
@@ -4409,7 +4409,7 @@
         </w:rPr>
         <w:t xml:space="preserve">Continue working with this exercise (</w:t>
       </w:r>
-      <w:hyperlink w:history="1" r:id="rIdjyi8iebcxywdyagh_qzsd">
+      <w:hyperlink w:history="1" r:id="rIdl-1n-kwbcygzkvtl0bxhh">
         <w:r>
           <w:rPr>
             <w:color w:val="1155CC"/>
@@ -4720,7 +4720,7 @@
         </w:rPr>
         <w:t xml:space="preserve"> - take your time). Next, view or print a copy of the </w:t>
       </w:r>
-      <w:hyperlink w:history="1" r:id="rIdoz3qtjzvnjrstj0dm_rcx">
+      <w:hyperlink w:history="1" r:id="rIdrqqcuf3md5v4m59xd41dn">
         <w:r>
           <w:rPr>
             <w:color w:val="1155CC"/>
@@ -5253,7 +5253,7 @@
         <w:keepLines/>
         <w:spacing w:after="60" w:before="0" w:line="276" w:lineRule="auto"/>
       </w:pPr>
-      <w:hyperlink w:history="1" r:id="rIdcqeqy5wm9cnq38npaye5y">
+      <w:hyperlink w:history="1" r:id="rIdnobqa7s8kx_oj2br1iiuy">
         <w:r>
           <w:rPr>
             <w:color w:val="1155CC"/>
@@ -5380,9 +5380,9 @@
         </w:tblBorders>
       </w:tblPr>
       <w:tblGrid>
-        <w:gridCol w:w="3120"/>
-        <w:gridCol w:w="3120"/>
-        <w:gridCol w:w="3120"/>
+        <w:gridCol w:w="2000"/>
+        <w:gridCol w:w="4660"/>
+        <w:gridCol w:w="2700"/>
       </w:tblGrid>
       <w:tr>
         <w:trPr>
@@ -5391,7 +5391,7 @@
         </w:trPr>
         <w:tc>
           <w:tcPr>
-            <w:tcW w:type="dxa" w:w="3120"/>
+            <w:tcW w:type="dxa" w:w="2000"/>
             <w:tcBorders>
               <w:top w:val="single" w:color="CFE3DF" w:sz="4"/>
               <w:left w:val="single" w:color="CFE3DF" w:sz="4"/>
@@ -5424,7 +5424,7 @@
         </w:tc>
         <w:tc>
           <w:tcPr>
-            <w:tcW w:type="dxa" w:w="3120"/>
+            <w:tcW w:type="dxa" w:w="4660"/>
             <w:tcBorders>
               <w:top w:val="single" w:color="CFE3DF" w:sz="4"/>
               <w:left w:val="single" w:color="CFE3DF" w:sz="4"/>
@@ -5457,7 +5457,7 @@
         </w:tc>
         <w:tc>
           <w:tcPr>
-            <w:tcW w:type="dxa" w:w="3120"/>
+            <w:tcW w:type="dxa" w:w="2700"/>
             <w:tcBorders>
               <w:top w:val="single" w:color="CFE3DF" w:sz="4"/>
               <w:left w:val="single" w:color="CFE3DF" w:sz="4"/>
@@ -5496,7 +5496,7 @@
         </w:trPr>
         <w:tc>
           <w:tcPr>
-            <w:tcW w:type="dxa" w:w="3120"/>
+            <w:tcW w:type="dxa" w:w="2000"/>
             <w:tcBorders>
               <w:top w:val="single" w:color="CFE3DF" w:sz="4"/>
               <w:left w:val="single" w:color="CFE3DF" w:sz="4"/>
@@ -5527,7 +5527,7 @@
         </w:tc>
         <w:tc>
           <w:tcPr>
-            <w:tcW w:type="dxa" w:w="3120"/>
+            <w:tcW w:type="dxa" w:w="4660"/>
             <w:tcBorders>
               <w:top w:val="single" w:color="CFE3DF" w:sz="4"/>
               <w:left w:val="single" w:color="CFE3DF" w:sz="4"/>
@@ -5558,7 +5558,7 @@
         </w:tc>
         <w:tc>
           <w:tcPr>
-            <w:tcW w:type="dxa" w:w="3120"/>
+            <w:tcW w:type="dxa" w:w="2700"/>
             <w:tcBorders>
               <w:top w:val="single" w:color="CFE3DF" w:sz="4"/>
               <w:left w:val="single" w:color="CFE3DF" w:sz="4"/>
@@ -6002,9 +6002,9 @@
         </w:tblBorders>
       </w:tblPr>
       <w:tblGrid>
-        <w:gridCol w:w="3120"/>
-        <w:gridCol w:w="3120"/>
-        <w:gridCol w:w="3120"/>
+        <w:gridCol w:w="2000"/>
+        <w:gridCol w:w="4660"/>
+        <w:gridCol w:w="2700"/>
       </w:tblGrid>
       <w:tr>
         <w:trPr>
@@ -6013,7 +6013,7 @@
         </w:trPr>
         <w:tc>
           <w:tcPr>
-            <w:tcW w:type="dxa" w:w="3120"/>
+            <w:tcW w:type="dxa" w:w="2000"/>
             <w:tcBorders>
               <w:top w:val="single" w:color="CFE3DF" w:sz="4"/>
               <w:left w:val="single" w:color="CFE3DF" w:sz="4"/>
@@ -6046,7 +6046,7 @@
         </w:tc>
         <w:tc>
           <w:tcPr>
-            <w:tcW w:type="dxa" w:w="3120"/>
+            <w:tcW w:type="dxa" w:w="4660"/>
             <w:tcBorders>
               <w:top w:val="single" w:color="CFE3DF" w:sz="4"/>
               <w:left w:val="single" w:color="CFE3DF" w:sz="4"/>
@@ -6079,7 +6079,7 @@
         </w:tc>
         <w:tc>
           <w:tcPr>
-            <w:tcW w:type="dxa" w:w="3120"/>
+            <w:tcW w:type="dxa" w:w="2700"/>
             <w:tcBorders>
               <w:top w:val="single" w:color="CFE3DF" w:sz="4"/>
               <w:left w:val="single" w:color="CFE3DF" w:sz="4"/>
@@ -6118,7 +6118,7 @@
         </w:trPr>
         <w:tc>
           <w:tcPr>
-            <w:tcW w:type="dxa" w:w="3120"/>
+            <w:tcW w:type="dxa" w:w="2000"/>
             <w:tcBorders>
               <w:top w:val="single" w:color="CFE3DF" w:sz="4"/>
               <w:left w:val="single" w:color="CFE3DF" w:sz="4"/>
@@ -6149,7 +6149,7 @@
         </w:tc>
         <w:tc>
           <w:tcPr>
-            <w:tcW w:type="dxa" w:w="3120"/>
+            <w:tcW w:type="dxa" w:w="4660"/>
             <w:tcBorders>
               <w:top w:val="single" w:color="CFE3DF" w:sz="4"/>
               <w:left w:val="single" w:color="CFE3DF" w:sz="4"/>
@@ -6180,7 +6180,7 @@
         </w:tc>
         <w:tc>
           <w:tcPr>
-            <w:tcW w:type="dxa" w:w="3120"/>
+            <w:tcW w:type="dxa" w:w="2700"/>
             <w:tcBorders>
               <w:top w:val="single" w:color="CFE3DF" w:sz="4"/>
               <w:left w:val="single" w:color="CFE3DF" w:sz="4"/>
@@ -6379,7 +6379,7 @@
         </w:rPr>
         <w:t xml:space="preserve">Then look at the </w:t>
       </w:r>
-      <w:hyperlink w:history="1" r:id="rIdps_d1ziedr2ue2ptzsbpu">
+      <w:hyperlink w:history="1" r:id="rId-k5uspqtgfcy7_4x2sgml">
         <w:r>
           <w:rPr>
             <w:color w:val="1155CC"/>
@@ -6516,9 +6516,9 @@
         </w:tblBorders>
       </w:tblPr>
       <w:tblGrid>
-        <w:gridCol w:w="3120"/>
-        <w:gridCol w:w="3120"/>
-        <w:gridCol w:w="3120"/>
+        <w:gridCol w:w="2000"/>
+        <w:gridCol w:w="4660"/>
+        <w:gridCol w:w="2700"/>
       </w:tblGrid>
       <w:tr>
         <w:trPr>
@@ -6527,7 +6527,7 @@
         </w:trPr>
         <w:tc>
           <w:tcPr>
-            <w:tcW w:type="dxa" w:w="3120"/>
+            <w:tcW w:type="dxa" w:w="2000"/>
             <w:tcBorders>
               <w:top w:val="single" w:color="CFE3DF" w:sz="4"/>
               <w:left w:val="single" w:color="CFE3DF" w:sz="4"/>
@@ -6560,7 +6560,7 @@
         </w:tc>
         <w:tc>
           <w:tcPr>
-            <w:tcW w:type="dxa" w:w="3120"/>
+            <w:tcW w:type="dxa" w:w="4660"/>
             <w:tcBorders>
               <w:top w:val="single" w:color="CFE3DF" w:sz="4"/>
               <w:left w:val="single" w:color="CFE3DF" w:sz="4"/>
@@ -6593,7 +6593,7 @@
         </w:tc>
         <w:tc>
           <w:tcPr>
-            <w:tcW w:type="dxa" w:w="3120"/>
+            <w:tcW w:type="dxa" w:w="2700"/>
             <w:tcBorders>
               <w:top w:val="single" w:color="CFE3DF" w:sz="4"/>
               <w:left w:val="single" w:color="CFE3DF" w:sz="4"/>
@@ -6632,7 +6632,7 @@
         </w:trPr>
         <w:tc>
           <w:tcPr>
-            <w:tcW w:type="dxa" w:w="3120"/>
+            <w:tcW w:type="dxa" w:w="2000"/>
             <w:tcBorders>
               <w:top w:val="single" w:color="CFE3DF" w:sz="4"/>
               <w:left w:val="single" w:color="CFE3DF" w:sz="4"/>
@@ -6663,7 +6663,7 @@
         </w:tc>
         <w:tc>
           <w:tcPr>
-            <w:tcW w:type="dxa" w:w="3120"/>
+            <w:tcW w:type="dxa" w:w="4660"/>
             <w:tcBorders>
               <w:top w:val="single" w:color="CFE3DF" w:sz="4"/>
               <w:left w:val="single" w:color="CFE3DF" w:sz="4"/>
@@ -6694,7 +6694,7 @@
         </w:tc>
         <w:tc>
           <w:tcPr>
-            <w:tcW w:type="dxa" w:w="3120"/>
+            <w:tcW w:type="dxa" w:w="2700"/>
             <w:tcBorders>
               <w:top w:val="single" w:color="CFE3DF" w:sz="4"/>
               <w:left w:val="single" w:color="CFE3DF" w:sz="4"/>
@@ -7094,7 +7094,7 @@
         </w:rPr>
         <w:t xml:space="preserve">Later on, when you have time, read over your journal for the day. Next, check in with yourself about how you feel as you think about those thoughts. Then look at the </w:t>
       </w:r>
-      <w:hyperlink w:history="1" r:id="rId6mycd98vjb5g5mv44u9wg">
+      <w:hyperlink w:history="1" r:id="rId67s7mwuvzkq7lpttmi7cw">
         <w:r>
           <w:rPr>
             <w:color w:val="1155CC"/>
@@ -7247,9 +7247,9 @@
         </w:tblBorders>
       </w:tblPr>
       <w:tblGrid>
-        <w:gridCol w:w="3120"/>
-        <w:gridCol w:w="3120"/>
-        <w:gridCol w:w="3120"/>
+        <w:gridCol w:w="2000"/>
+        <w:gridCol w:w="4660"/>
+        <w:gridCol w:w="2700"/>
       </w:tblGrid>
       <w:tr>
         <w:trPr>
@@ -7258,7 +7258,7 @@
         </w:trPr>
         <w:tc>
           <w:tcPr>
-            <w:tcW w:type="dxa" w:w="3120"/>
+            <w:tcW w:type="dxa" w:w="2000"/>
             <w:tcBorders>
               <w:top w:val="single" w:color="CFE3DF" w:sz="4"/>
               <w:left w:val="single" w:color="CFE3DF" w:sz="4"/>
@@ -7291,7 +7291,7 @@
         </w:tc>
         <w:tc>
           <w:tcPr>
-            <w:tcW w:type="dxa" w:w="3120"/>
+            <w:tcW w:type="dxa" w:w="4660"/>
             <w:tcBorders>
               <w:top w:val="single" w:color="CFE3DF" w:sz="4"/>
               <w:left w:val="single" w:color="CFE3DF" w:sz="4"/>
@@ -7324,7 +7324,7 @@
         </w:tc>
         <w:tc>
           <w:tcPr>
-            <w:tcW w:type="dxa" w:w="3120"/>
+            <w:tcW w:type="dxa" w:w="2700"/>
             <w:tcBorders>
               <w:top w:val="single" w:color="CFE3DF" w:sz="4"/>
               <w:left w:val="single" w:color="CFE3DF" w:sz="4"/>
@@ -7363,7 +7363,7 @@
         </w:trPr>
         <w:tc>
           <w:tcPr>
-            <w:tcW w:type="dxa" w:w="3120"/>
+            <w:tcW w:type="dxa" w:w="2000"/>
             <w:tcBorders>
               <w:top w:val="single" w:color="CFE3DF" w:sz="4"/>
               <w:left w:val="single" w:color="CFE3DF" w:sz="4"/>
@@ -7394,7 +7394,7 @@
         </w:tc>
         <w:tc>
           <w:tcPr>
-            <w:tcW w:type="dxa" w:w="3120"/>
+            <w:tcW w:type="dxa" w:w="4660"/>
             <w:tcBorders>
               <w:top w:val="single" w:color="CFE3DF" w:sz="4"/>
               <w:left w:val="single" w:color="CFE3DF" w:sz="4"/>
@@ -7425,7 +7425,7 @@
         </w:tc>
         <w:tc>
           <w:tcPr>
-            <w:tcW w:type="dxa" w:w="3120"/>
+            <w:tcW w:type="dxa" w:w="2700"/>
             <w:tcBorders>
               <w:top w:val="single" w:color="CFE3DF" w:sz="4"/>
               <w:left w:val="single" w:color="CFE3DF" w:sz="4"/>
@@ -7552,7 +7552,7 @@
         </w:rPr>
         <w:t xml:space="preserve"> response would be. What was that person feeling? What was that person needing, wanting to have more of, or yearning to experience? Check the </w:t>
       </w:r>
-      <w:hyperlink w:history="1" r:id="rIdcnku0ogxvenbrrkixh7mg">
+      <w:hyperlink w:history="1" r:id="rIds1j6kosi6psm4jrpp_osr">
         <w:r>
           <w:rPr>
             <w:color w:val="1155CC"/>
@@ -7573,7 +7573,7 @@
         </w:rPr>
         <w:t xml:space="preserve"> and the </w:t>
       </w:r>
-      <w:hyperlink w:history="1" r:id="rId2doknaiaqrhvru2peq2ai">
+      <w:hyperlink w:history="1" r:id="rIdlvi4v7kp_eee_ymdpcald">
         <w:r>
           <w:rPr>
             <w:color w:val="1155CC"/>
@@ -8025,7 +8025,7 @@
               </w:rPr>
               <w:t xml:space="preserve"> (feeling from the </w:t>
             </w:r>
-            <w:hyperlink w:history="1" r:id="rIdhqlnrlg-mdcevg1fqubzl">
+            <w:hyperlink w:history="1" r:id="rIdu5tmb0sithjablzngsvgq">
               <w:r>
                 <w:rPr>
                   <w:color w:val="1155CC"/>
@@ -8066,7 +8066,7 @@
               </w:rPr>
               <w:t xml:space="preserve"> (need from the </w:t>
             </w:r>
-            <w:hyperlink w:history="1" r:id="rIdt5rtpkogdvqx0mufnh2n1">
+            <w:hyperlink w:history="1" r:id="rId7zt31rm8u0khlnpfjtjvw">
               <w:r>
                 <w:rPr>
                   <w:color w:val="1155CC"/>
@@ -8216,9 +8216,9 @@
         </w:tblBorders>
       </w:tblPr>
       <w:tblGrid>
-        <w:gridCol w:w="3120"/>
-        <w:gridCol w:w="3120"/>
-        <w:gridCol w:w="3120"/>
+        <w:gridCol w:w="2000"/>
+        <w:gridCol w:w="4660"/>
+        <w:gridCol w:w="2700"/>
       </w:tblGrid>
       <w:tr>
         <w:trPr>
@@ -8227,7 +8227,7 @@
         </w:trPr>
         <w:tc>
           <w:tcPr>
-            <w:tcW w:type="dxa" w:w="3120"/>
+            <w:tcW w:type="dxa" w:w="2000"/>
             <w:tcBorders>
               <w:top w:val="single" w:color="CFE3DF" w:sz="4"/>
               <w:left w:val="single" w:color="CFE3DF" w:sz="4"/>
@@ -8260,7 +8260,7 @@
         </w:tc>
         <w:tc>
           <w:tcPr>
-            <w:tcW w:type="dxa" w:w="3120"/>
+            <w:tcW w:type="dxa" w:w="4660"/>
             <w:tcBorders>
               <w:top w:val="single" w:color="CFE3DF" w:sz="4"/>
               <w:left w:val="single" w:color="CFE3DF" w:sz="4"/>
@@ -8293,7 +8293,7 @@
         </w:tc>
         <w:tc>
           <w:tcPr>
-            <w:tcW w:type="dxa" w:w="3120"/>
+            <w:tcW w:type="dxa" w:w="2700"/>
             <w:tcBorders>
               <w:top w:val="single" w:color="CFE3DF" w:sz="4"/>
               <w:left w:val="single" w:color="CFE3DF" w:sz="4"/>
@@ -8332,7 +8332,7 @@
         </w:trPr>
         <w:tc>
           <w:tcPr>
-            <w:tcW w:type="dxa" w:w="3120"/>
+            <w:tcW w:type="dxa" w:w="2000"/>
             <w:tcBorders>
               <w:top w:val="single" w:color="CFE3DF" w:sz="4"/>
               <w:left w:val="single" w:color="CFE3DF" w:sz="4"/>
@@ -8363,7 +8363,7 @@
         </w:tc>
         <w:tc>
           <w:tcPr>
-            <w:tcW w:type="dxa" w:w="3120"/>
+            <w:tcW w:type="dxa" w:w="4660"/>
             <w:tcBorders>
               <w:top w:val="single" w:color="CFE3DF" w:sz="4"/>
               <w:left w:val="single" w:color="CFE3DF" w:sz="4"/>
@@ -8394,7 +8394,7 @@
         </w:tc>
         <w:tc>
           <w:tcPr>
-            <w:tcW w:type="dxa" w:w="3120"/>
+            <w:tcW w:type="dxa" w:w="2700"/>
             <w:tcBorders>
               <w:top w:val="single" w:color="CFE3DF" w:sz="4"/>
               <w:left w:val="single" w:color="CFE3DF" w:sz="4"/>
@@ -9092,9 +9092,9 @@
         </w:tblBorders>
       </w:tblPr>
       <w:tblGrid>
-        <w:gridCol w:w="3120"/>
-        <w:gridCol w:w="3120"/>
-        <w:gridCol w:w="3120"/>
+        <w:gridCol w:w="2000"/>
+        <w:gridCol w:w="4660"/>
+        <w:gridCol w:w="2700"/>
       </w:tblGrid>
       <w:tr>
         <w:trPr>
@@ -9103,7 +9103,7 @@
         </w:trPr>
         <w:tc>
           <w:tcPr>
-            <w:tcW w:type="dxa" w:w="3120"/>
+            <w:tcW w:type="dxa" w:w="2000"/>
             <w:tcBorders>
               <w:top w:val="single" w:color="CFE3DF" w:sz="4"/>
               <w:left w:val="single" w:color="CFE3DF" w:sz="4"/>
@@ -9136,7 +9136,7 @@
         </w:tc>
         <w:tc>
           <w:tcPr>
-            <w:tcW w:type="dxa" w:w="3120"/>
+            <w:tcW w:type="dxa" w:w="4660"/>
             <w:tcBorders>
               <w:top w:val="single" w:color="CFE3DF" w:sz="4"/>
               <w:left w:val="single" w:color="CFE3DF" w:sz="4"/>
@@ -9169,7 +9169,7 @@
         </w:tc>
         <w:tc>
           <w:tcPr>
-            <w:tcW w:type="dxa" w:w="3120"/>
+            <w:tcW w:type="dxa" w:w="2700"/>
             <w:tcBorders>
               <w:top w:val="single" w:color="CFE3DF" w:sz="4"/>
               <w:left w:val="single" w:color="CFE3DF" w:sz="4"/>
@@ -9208,7 +9208,7 @@
         </w:trPr>
         <w:tc>
           <w:tcPr>
-            <w:tcW w:type="dxa" w:w="3120"/>
+            <w:tcW w:type="dxa" w:w="2000"/>
             <w:tcBorders>
               <w:top w:val="single" w:color="CFE3DF" w:sz="4"/>
               <w:left w:val="single" w:color="CFE3DF" w:sz="4"/>
@@ -9239,7 +9239,7 @@
         </w:tc>
         <w:tc>
           <w:tcPr>
-            <w:tcW w:type="dxa" w:w="3120"/>
+            <w:tcW w:type="dxa" w:w="4660"/>
             <w:tcBorders>
               <w:top w:val="single" w:color="CFE3DF" w:sz="4"/>
               <w:left w:val="single" w:color="CFE3DF" w:sz="4"/>
@@ -9270,7 +9270,7 @@
         </w:tc>
         <w:tc>
           <w:tcPr>
-            <w:tcW w:type="dxa" w:w="3120"/>
+            <w:tcW w:type="dxa" w:w="2700"/>
             <w:tcBorders>
               <w:top w:val="single" w:color="CFE3DF" w:sz="4"/>
               <w:left w:val="single" w:color="CFE3DF" w:sz="4"/>
@@ -10036,9 +10036,9 @@
         </w:tblBorders>
       </w:tblPr>
       <w:tblGrid>
-        <w:gridCol w:w="3120"/>
-        <w:gridCol w:w="3120"/>
-        <w:gridCol w:w="3120"/>
+        <w:gridCol w:w="2000"/>
+        <w:gridCol w:w="4660"/>
+        <w:gridCol w:w="2700"/>
       </w:tblGrid>
       <w:tr>
         <w:trPr>
@@ -10047,7 +10047,7 @@
         </w:trPr>
         <w:tc>
           <w:tcPr>
-            <w:tcW w:type="dxa" w:w="3120"/>
+            <w:tcW w:type="dxa" w:w="2000"/>
             <w:tcBorders>
               <w:top w:val="single" w:color="CFE3DF" w:sz="4"/>
               <w:left w:val="single" w:color="CFE3DF" w:sz="4"/>
@@ -10080,7 +10080,7 @@
         </w:tc>
         <w:tc>
           <w:tcPr>
-            <w:tcW w:type="dxa" w:w="3120"/>
+            <w:tcW w:type="dxa" w:w="4660"/>
             <w:tcBorders>
               <w:top w:val="single" w:color="CFE3DF" w:sz="4"/>
               <w:left w:val="single" w:color="CFE3DF" w:sz="4"/>
@@ -10113,7 +10113,7 @@
         </w:tc>
         <w:tc>
           <w:tcPr>
-            <w:tcW w:type="dxa" w:w="3120"/>
+            <w:tcW w:type="dxa" w:w="2700"/>
             <w:tcBorders>
               <w:top w:val="single" w:color="CFE3DF" w:sz="4"/>
               <w:left w:val="single" w:color="CFE3DF" w:sz="4"/>
@@ -10152,7 +10152,7 @@
         </w:trPr>
         <w:tc>
           <w:tcPr>
-            <w:tcW w:type="dxa" w:w="3120"/>
+            <w:tcW w:type="dxa" w:w="2000"/>
             <w:tcBorders>
               <w:top w:val="single" w:color="CFE3DF" w:sz="4"/>
               <w:left w:val="single" w:color="CFE3DF" w:sz="4"/>
@@ -10183,7 +10183,7 @@
         </w:tc>
         <w:tc>
           <w:tcPr>
-            <w:tcW w:type="dxa" w:w="3120"/>
+            <w:tcW w:type="dxa" w:w="4660"/>
             <w:tcBorders>
               <w:top w:val="single" w:color="CFE3DF" w:sz="4"/>
               <w:left w:val="single" w:color="CFE3DF" w:sz="4"/>
@@ -10214,7 +10214,7 @@
         </w:tc>
         <w:tc>
           <w:tcPr>
-            <w:tcW w:type="dxa" w:w="3120"/>
+            <w:tcW w:type="dxa" w:w="2700"/>
             <w:tcBorders>
               <w:top w:val="single" w:color="CFE3DF" w:sz="4"/>
               <w:left w:val="single" w:color="CFE3DF" w:sz="4"/>
@@ -10913,9 +10913,9 @@
         </w:tblBorders>
       </w:tblPr>
       <w:tblGrid>
-        <w:gridCol w:w="3120"/>
-        <w:gridCol w:w="3120"/>
-        <w:gridCol w:w="3120"/>
+        <w:gridCol w:w="2000"/>
+        <w:gridCol w:w="4660"/>
+        <w:gridCol w:w="2700"/>
       </w:tblGrid>
       <w:tr>
         <w:trPr>
@@ -10924,7 +10924,7 @@
         </w:trPr>
         <w:tc>
           <w:tcPr>
-            <w:tcW w:type="dxa" w:w="3120"/>
+            <w:tcW w:type="dxa" w:w="2000"/>
             <w:tcBorders>
               <w:top w:val="single" w:color="CFE3DF" w:sz="4"/>
               <w:left w:val="single" w:color="CFE3DF" w:sz="4"/>
@@ -10957,7 +10957,7 @@
         </w:tc>
         <w:tc>
           <w:tcPr>
-            <w:tcW w:type="dxa" w:w="3120"/>
+            <w:tcW w:type="dxa" w:w="4660"/>
             <w:tcBorders>
               <w:top w:val="single" w:color="CFE3DF" w:sz="4"/>
               <w:left w:val="single" w:color="CFE3DF" w:sz="4"/>
@@ -10990,7 +10990,7 @@
         </w:tc>
         <w:tc>
           <w:tcPr>
-            <w:tcW w:type="dxa" w:w="3120"/>
+            <w:tcW w:type="dxa" w:w="2700"/>
             <w:tcBorders>
               <w:top w:val="single" w:color="CFE3DF" w:sz="4"/>
               <w:left w:val="single" w:color="CFE3DF" w:sz="4"/>
@@ -11029,7 +11029,7 @@
         </w:trPr>
         <w:tc>
           <w:tcPr>
-            <w:tcW w:type="dxa" w:w="3120"/>
+            <w:tcW w:type="dxa" w:w="2000"/>
             <w:tcBorders>
               <w:top w:val="single" w:color="CFE3DF" w:sz="4"/>
               <w:left w:val="single" w:color="CFE3DF" w:sz="4"/>
@@ -11060,7 +11060,7 @@
         </w:tc>
         <w:tc>
           <w:tcPr>
-            <w:tcW w:type="dxa" w:w="3120"/>
+            <w:tcW w:type="dxa" w:w="4660"/>
             <w:tcBorders>
               <w:top w:val="single" w:color="CFE3DF" w:sz="4"/>
               <w:left w:val="single" w:color="CFE3DF" w:sz="4"/>
@@ -11091,7 +11091,7 @@
         </w:tc>
         <w:tc>
           <w:tcPr>
-            <w:tcW w:type="dxa" w:w="3120"/>
+            <w:tcW w:type="dxa" w:w="2700"/>
             <w:tcBorders>
               <w:top w:val="single" w:color="CFE3DF" w:sz="4"/>
               <w:left w:val="single" w:color="CFE3DF" w:sz="4"/>
@@ -11998,9 +11998,9 @@
         </w:tblBorders>
       </w:tblPr>
       <w:tblGrid>
-        <w:gridCol w:w="3120"/>
-        <w:gridCol w:w="3120"/>
-        <w:gridCol w:w="3120"/>
+        <w:gridCol w:w="2000"/>
+        <w:gridCol w:w="4660"/>
+        <w:gridCol w:w="2700"/>
       </w:tblGrid>
       <w:tr>
         <w:trPr>
@@ -12009,7 +12009,7 @@
         </w:trPr>
         <w:tc>
           <w:tcPr>
-            <w:tcW w:type="dxa" w:w="3120"/>
+            <w:tcW w:type="dxa" w:w="2000"/>
             <w:tcBorders>
               <w:top w:val="single" w:color="CFE3DF" w:sz="4"/>
               <w:left w:val="single" w:color="CFE3DF" w:sz="4"/>
@@ -12042,7 +12042,7 @@
         </w:tc>
         <w:tc>
           <w:tcPr>
-            <w:tcW w:type="dxa" w:w="3120"/>
+            <w:tcW w:type="dxa" w:w="4660"/>
             <w:tcBorders>
               <w:top w:val="single" w:color="CFE3DF" w:sz="4"/>
               <w:left w:val="single" w:color="CFE3DF" w:sz="4"/>
@@ -12075,7 +12075,7 @@
         </w:tc>
         <w:tc>
           <w:tcPr>
-            <w:tcW w:type="dxa" w:w="3120"/>
+            <w:tcW w:type="dxa" w:w="2700"/>
             <w:tcBorders>
               <w:top w:val="single" w:color="CFE3DF" w:sz="4"/>
               <w:left w:val="single" w:color="CFE3DF" w:sz="4"/>
@@ -12114,7 +12114,7 @@
         </w:trPr>
         <w:tc>
           <w:tcPr>
-            <w:tcW w:type="dxa" w:w="3120"/>
+            <w:tcW w:type="dxa" w:w="2000"/>
             <w:tcBorders>
               <w:top w:val="single" w:color="CFE3DF" w:sz="4"/>
               <w:left w:val="single" w:color="CFE3DF" w:sz="4"/>
@@ -12145,7 +12145,7 @@
         </w:tc>
         <w:tc>
           <w:tcPr>
-            <w:tcW w:type="dxa" w:w="3120"/>
+            <w:tcW w:type="dxa" w:w="4660"/>
             <w:tcBorders>
               <w:top w:val="single" w:color="CFE3DF" w:sz="4"/>
               <w:left w:val="single" w:color="CFE3DF" w:sz="4"/>
@@ -12176,7 +12176,7 @@
         </w:tc>
         <w:tc>
           <w:tcPr>
-            <w:tcW w:type="dxa" w:w="3120"/>
+            <w:tcW w:type="dxa" w:w="2700"/>
             <w:tcBorders>
               <w:top w:val="single" w:color="CFE3DF" w:sz="4"/>
               <w:left w:val="single" w:color="CFE3DF" w:sz="4"/>
@@ -13031,9 +13031,9 @@
         </w:tblBorders>
       </w:tblPr>
       <w:tblGrid>
-        <w:gridCol w:w="3120"/>
-        <w:gridCol w:w="3120"/>
-        <w:gridCol w:w="3120"/>
+        <w:gridCol w:w="2000"/>
+        <w:gridCol w:w="4660"/>
+        <w:gridCol w:w="2700"/>
       </w:tblGrid>
       <w:tr>
         <w:trPr>
@@ -13042,7 +13042,7 @@
         </w:trPr>
         <w:tc>
           <w:tcPr>
-            <w:tcW w:type="dxa" w:w="3120"/>
+            <w:tcW w:type="dxa" w:w="2000"/>
             <w:tcBorders>
               <w:top w:val="single" w:color="CFE3DF" w:sz="4"/>
               <w:left w:val="single" w:color="CFE3DF" w:sz="4"/>
@@ -13075,7 +13075,7 @@
         </w:tc>
         <w:tc>
           <w:tcPr>
-            <w:tcW w:type="dxa" w:w="3120"/>
+            <w:tcW w:type="dxa" w:w="4660"/>
             <w:tcBorders>
               <w:top w:val="single" w:color="CFE3DF" w:sz="4"/>
               <w:left w:val="single" w:color="CFE3DF" w:sz="4"/>
@@ -13108,7 +13108,7 @@
         </w:tc>
         <w:tc>
           <w:tcPr>
-            <w:tcW w:type="dxa" w:w="3120"/>
+            <w:tcW w:type="dxa" w:w="2700"/>
             <w:tcBorders>
               <w:top w:val="single" w:color="CFE3DF" w:sz="4"/>
               <w:left w:val="single" w:color="CFE3DF" w:sz="4"/>
@@ -13147,7 +13147,7 @@
         </w:trPr>
         <w:tc>
           <w:tcPr>
-            <w:tcW w:type="dxa" w:w="3120"/>
+            <w:tcW w:type="dxa" w:w="2000"/>
             <w:tcBorders>
               <w:top w:val="single" w:color="CFE3DF" w:sz="4"/>
               <w:left w:val="single" w:color="CFE3DF" w:sz="4"/>
@@ -13178,7 +13178,7 @@
         </w:tc>
         <w:tc>
           <w:tcPr>
-            <w:tcW w:type="dxa" w:w="3120"/>
+            <w:tcW w:type="dxa" w:w="4660"/>
             <w:tcBorders>
               <w:top w:val="single" w:color="CFE3DF" w:sz="4"/>
               <w:left w:val="single" w:color="CFE3DF" w:sz="4"/>
@@ -13209,7 +13209,7 @@
         </w:tc>
         <w:tc>
           <w:tcPr>
-            <w:tcW w:type="dxa" w:w="3120"/>
+            <w:tcW w:type="dxa" w:w="2700"/>
             <w:tcBorders>
               <w:top w:val="single" w:color="CFE3DF" w:sz="4"/>
               <w:left w:val="single" w:color="CFE3DF" w:sz="4"/>
@@ -13928,9 +13928,9 @@
         </w:tblBorders>
       </w:tblPr>
       <w:tblGrid>
-        <w:gridCol w:w="3120"/>
-        <w:gridCol w:w="3120"/>
-        <w:gridCol w:w="3120"/>
+        <w:gridCol w:w="2000"/>
+        <w:gridCol w:w="4660"/>
+        <w:gridCol w:w="2700"/>
       </w:tblGrid>
       <w:tr>
         <w:trPr>
@@ -13939,7 +13939,7 @@
         </w:trPr>
         <w:tc>
           <w:tcPr>
-            <w:tcW w:type="dxa" w:w="3120"/>
+            <w:tcW w:type="dxa" w:w="2000"/>
             <w:tcBorders>
               <w:top w:val="single" w:color="CFE3DF" w:sz="4"/>
               <w:left w:val="single" w:color="CFE3DF" w:sz="4"/>
@@ -13972,7 +13972,7 @@
         </w:tc>
         <w:tc>
           <w:tcPr>
-            <w:tcW w:type="dxa" w:w="3120"/>
+            <w:tcW w:type="dxa" w:w="4660"/>
             <w:tcBorders>
               <w:top w:val="single" w:color="CFE3DF" w:sz="4"/>
               <w:left w:val="single" w:color="CFE3DF" w:sz="4"/>
@@ -14005,7 +14005,7 @@
         </w:tc>
         <w:tc>
           <w:tcPr>
-            <w:tcW w:type="dxa" w:w="3120"/>
+            <w:tcW w:type="dxa" w:w="2700"/>
             <w:tcBorders>
               <w:top w:val="single" w:color="CFE3DF" w:sz="4"/>
               <w:left w:val="single" w:color="CFE3DF" w:sz="4"/>
@@ -14044,7 +14044,7 @@
         </w:trPr>
         <w:tc>
           <w:tcPr>
-            <w:tcW w:type="dxa" w:w="3120"/>
+            <w:tcW w:type="dxa" w:w="2000"/>
             <w:tcBorders>
               <w:top w:val="single" w:color="CFE3DF" w:sz="4"/>
               <w:left w:val="single" w:color="CFE3DF" w:sz="4"/>
@@ -14075,7 +14075,7 @@
         </w:tc>
         <w:tc>
           <w:tcPr>
-            <w:tcW w:type="dxa" w:w="3120"/>
+            <w:tcW w:type="dxa" w:w="4660"/>
             <w:tcBorders>
               <w:top w:val="single" w:color="CFE3DF" w:sz="4"/>
               <w:left w:val="single" w:color="CFE3DF" w:sz="4"/>
@@ -14106,7 +14106,7 @@
         </w:tc>
         <w:tc>
           <w:tcPr>
-            <w:tcW w:type="dxa" w:w="3120"/>
+            <w:tcW w:type="dxa" w:w="2700"/>
             <w:tcBorders>
               <w:top w:val="single" w:color="CFE3DF" w:sz="4"/>
               <w:left w:val="single" w:color="CFE3DF" w:sz="4"/>
@@ -14592,9 +14592,9 @@
         </w:tblBorders>
       </w:tblPr>
       <w:tblGrid>
-        <w:gridCol w:w="3120"/>
-        <w:gridCol w:w="3120"/>
-        <w:gridCol w:w="3120"/>
+        <w:gridCol w:w="2000"/>
+        <w:gridCol w:w="4660"/>
+        <w:gridCol w:w="2700"/>
       </w:tblGrid>
       <w:tr>
         <w:trPr>
@@ -14603,7 +14603,7 @@
         </w:trPr>
         <w:tc>
           <w:tcPr>
-            <w:tcW w:type="dxa" w:w="3120"/>
+            <w:tcW w:type="dxa" w:w="2000"/>
             <w:tcBorders>
               <w:top w:val="single" w:color="CFE3DF" w:sz="4"/>
               <w:left w:val="single" w:color="CFE3DF" w:sz="4"/>
@@ -14636,7 +14636,7 @@
         </w:tc>
         <w:tc>
           <w:tcPr>
-            <w:tcW w:type="dxa" w:w="3120"/>
+            <w:tcW w:type="dxa" w:w="4660"/>
             <w:tcBorders>
               <w:top w:val="single" w:color="CFE3DF" w:sz="4"/>
               <w:left w:val="single" w:color="CFE3DF" w:sz="4"/>
@@ -14669,7 +14669,7 @@
         </w:tc>
         <w:tc>
           <w:tcPr>
-            <w:tcW w:type="dxa" w:w="3120"/>
+            <w:tcW w:type="dxa" w:w="2700"/>
             <w:tcBorders>
               <w:top w:val="single" w:color="CFE3DF" w:sz="4"/>
               <w:left w:val="single" w:color="CFE3DF" w:sz="4"/>
@@ -14708,7 +14708,7 @@
         </w:trPr>
         <w:tc>
           <w:tcPr>
-            <w:tcW w:type="dxa" w:w="3120"/>
+            <w:tcW w:type="dxa" w:w="2000"/>
             <w:tcBorders>
               <w:top w:val="single" w:color="CFE3DF" w:sz="4"/>
               <w:left w:val="single" w:color="CFE3DF" w:sz="4"/>
@@ -14739,7 +14739,7 @@
         </w:tc>
         <w:tc>
           <w:tcPr>
-            <w:tcW w:type="dxa" w:w="3120"/>
+            <w:tcW w:type="dxa" w:w="4660"/>
             <w:tcBorders>
               <w:top w:val="single" w:color="CFE3DF" w:sz="4"/>
               <w:left w:val="single" w:color="CFE3DF" w:sz="4"/>
@@ -14770,7 +14770,7 @@
         </w:tc>
         <w:tc>
           <w:tcPr>
-            <w:tcW w:type="dxa" w:w="3120"/>
+            <w:tcW w:type="dxa" w:w="2700"/>
             <w:tcBorders>
               <w:top w:val="single" w:color="CFE3DF" w:sz="4"/>
               <w:left w:val="single" w:color="CFE3DF" w:sz="4"/>
@@ -15248,9 +15248,9 @@
         </w:tblBorders>
       </w:tblPr>
       <w:tblGrid>
-        <w:gridCol w:w="3120"/>
-        <w:gridCol w:w="3120"/>
-        <w:gridCol w:w="3120"/>
+        <w:gridCol w:w="2000"/>
+        <w:gridCol w:w="4660"/>
+        <w:gridCol w:w="2700"/>
       </w:tblGrid>
       <w:tr>
         <w:trPr>
@@ -15259,7 +15259,7 @@
         </w:trPr>
         <w:tc>
           <w:tcPr>
-            <w:tcW w:type="dxa" w:w="3120"/>
+            <w:tcW w:type="dxa" w:w="2000"/>
             <w:tcBorders>
               <w:top w:val="single" w:color="CFE3DF" w:sz="4"/>
               <w:left w:val="single" w:color="CFE3DF" w:sz="4"/>
@@ -15292,7 +15292,7 @@
         </w:tc>
         <w:tc>
           <w:tcPr>
-            <w:tcW w:type="dxa" w:w="3120"/>
+            <w:tcW w:type="dxa" w:w="4660"/>
             <w:tcBorders>
               <w:top w:val="single" w:color="CFE3DF" w:sz="4"/>
               <w:left w:val="single" w:color="CFE3DF" w:sz="4"/>
@@ -15325,7 +15325,7 @@
         </w:tc>
         <w:tc>
           <w:tcPr>
-            <w:tcW w:type="dxa" w:w="3120"/>
+            <w:tcW w:type="dxa" w:w="2700"/>
             <w:tcBorders>
               <w:top w:val="single" w:color="CFE3DF" w:sz="4"/>
               <w:left w:val="single" w:color="CFE3DF" w:sz="4"/>
@@ -15364,7 +15364,7 @@
         </w:trPr>
         <w:tc>
           <w:tcPr>
-            <w:tcW w:type="dxa" w:w="3120"/>
+            <w:tcW w:type="dxa" w:w="2000"/>
             <w:tcBorders>
               <w:top w:val="single" w:color="CFE3DF" w:sz="4"/>
               <w:left w:val="single" w:color="CFE3DF" w:sz="4"/>
@@ -15395,7 +15395,7 @@
         </w:tc>
         <w:tc>
           <w:tcPr>
-            <w:tcW w:type="dxa" w:w="3120"/>
+            <w:tcW w:type="dxa" w:w="4660"/>
             <w:tcBorders>
               <w:top w:val="single" w:color="CFE3DF" w:sz="4"/>
               <w:left w:val="single" w:color="CFE3DF" w:sz="4"/>
@@ -15426,7 +15426,7 @@
         </w:tc>
         <w:tc>
           <w:tcPr>
-            <w:tcW w:type="dxa" w:w="3120"/>
+            <w:tcW w:type="dxa" w:w="2700"/>
             <w:tcBorders>
               <w:top w:val="single" w:color="CFE3DF" w:sz="4"/>
               <w:left w:val="single" w:color="CFE3DF" w:sz="4"/>
@@ -15912,9 +15912,9 @@
         </w:tblBorders>
       </w:tblPr>
       <w:tblGrid>
-        <w:gridCol w:w="3120"/>
-        <w:gridCol w:w="3120"/>
-        <w:gridCol w:w="3120"/>
+        <w:gridCol w:w="2000"/>
+        <w:gridCol w:w="4660"/>
+        <w:gridCol w:w="2700"/>
       </w:tblGrid>
       <w:tr>
         <w:trPr>
@@ -15923,7 +15923,7 @@
         </w:trPr>
         <w:tc>
           <w:tcPr>
-            <w:tcW w:type="dxa" w:w="3120"/>
+            <w:tcW w:type="dxa" w:w="2000"/>
             <w:tcBorders>
               <w:top w:val="single" w:color="CFE3DF" w:sz="4"/>
               <w:left w:val="single" w:color="CFE3DF" w:sz="4"/>
@@ -15956,7 +15956,7 @@
         </w:tc>
         <w:tc>
           <w:tcPr>
-            <w:tcW w:type="dxa" w:w="3120"/>
+            <w:tcW w:type="dxa" w:w="4660"/>
             <w:tcBorders>
               <w:top w:val="single" w:color="CFE3DF" w:sz="4"/>
               <w:left w:val="single" w:color="CFE3DF" w:sz="4"/>
@@ -15989,7 +15989,7 @@
         </w:tc>
         <w:tc>
           <w:tcPr>
-            <w:tcW w:type="dxa" w:w="3120"/>
+            <w:tcW w:type="dxa" w:w="2700"/>
             <w:tcBorders>
               <w:top w:val="single" w:color="CFE3DF" w:sz="4"/>
               <w:left w:val="single" w:color="CFE3DF" w:sz="4"/>
@@ -16028,7 +16028,7 @@
         </w:trPr>
         <w:tc>
           <w:tcPr>
-            <w:tcW w:type="dxa" w:w="3120"/>
+            <w:tcW w:type="dxa" w:w="2000"/>
             <w:tcBorders>
               <w:top w:val="single" w:color="CFE3DF" w:sz="4"/>
               <w:left w:val="single" w:color="CFE3DF" w:sz="4"/>
@@ -16059,7 +16059,7 @@
         </w:tc>
         <w:tc>
           <w:tcPr>
-            <w:tcW w:type="dxa" w:w="3120"/>
+            <w:tcW w:type="dxa" w:w="4660"/>
             <w:tcBorders>
               <w:top w:val="single" w:color="CFE3DF" w:sz="4"/>
               <w:left w:val="single" w:color="CFE3DF" w:sz="4"/>
@@ -16090,7 +16090,7 @@
         </w:tc>
         <w:tc>
           <w:tcPr>
-            <w:tcW w:type="dxa" w:w="3120"/>
+            <w:tcW w:type="dxa" w:w="2700"/>
             <w:tcBorders>
               <w:top w:val="single" w:color="CFE3DF" w:sz="4"/>
               <w:left w:val="single" w:color="CFE3DF" w:sz="4"/>
@@ -16415,9 +16415,9 @@
         </w:tblBorders>
       </w:tblPr>
       <w:tblGrid>
-        <w:gridCol w:w="3120"/>
-        <w:gridCol w:w="3120"/>
-        <w:gridCol w:w="3120"/>
+        <w:gridCol w:w="2000"/>
+        <w:gridCol w:w="4660"/>
+        <w:gridCol w:w="2700"/>
       </w:tblGrid>
       <w:tr>
         <w:trPr>
@@ -16426,7 +16426,7 @@
         </w:trPr>
         <w:tc>
           <w:tcPr>
-            <w:tcW w:type="dxa" w:w="3120"/>
+            <w:tcW w:type="dxa" w:w="2000"/>
             <w:tcBorders>
               <w:top w:val="single" w:color="CFE3DF" w:sz="4"/>
               <w:left w:val="single" w:color="CFE3DF" w:sz="4"/>
@@ -16459,7 +16459,7 @@
         </w:tc>
         <w:tc>
           <w:tcPr>
-            <w:tcW w:type="dxa" w:w="3120"/>
+            <w:tcW w:type="dxa" w:w="4660"/>
             <w:tcBorders>
               <w:top w:val="single" w:color="CFE3DF" w:sz="4"/>
               <w:left w:val="single" w:color="CFE3DF" w:sz="4"/>
@@ -16492,7 +16492,7 @@
         </w:tc>
         <w:tc>
           <w:tcPr>
-            <w:tcW w:type="dxa" w:w="3120"/>
+            <w:tcW w:type="dxa" w:w="2700"/>
             <w:tcBorders>
               <w:top w:val="single" w:color="CFE3DF" w:sz="4"/>
               <w:left w:val="single" w:color="CFE3DF" w:sz="4"/>
@@ -16531,7 +16531,7 @@
         </w:trPr>
         <w:tc>
           <w:tcPr>
-            <w:tcW w:type="dxa" w:w="3120"/>
+            <w:tcW w:type="dxa" w:w="2000"/>
             <w:tcBorders>
               <w:top w:val="single" w:color="CFE3DF" w:sz="4"/>
               <w:left w:val="single" w:color="CFE3DF" w:sz="4"/>
@@ -16562,7 +16562,7 @@
         </w:tc>
         <w:tc>
           <w:tcPr>
-            <w:tcW w:type="dxa" w:w="3120"/>
+            <w:tcW w:type="dxa" w:w="4660"/>
             <w:tcBorders>
               <w:top w:val="single" w:color="CFE3DF" w:sz="4"/>
               <w:left w:val="single" w:color="CFE3DF" w:sz="4"/>
@@ -16593,7 +16593,7 @@
         </w:tc>
         <w:tc>
           <w:tcPr>
-            <w:tcW w:type="dxa" w:w="3120"/>
+            <w:tcW w:type="dxa" w:w="2700"/>
             <w:tcBorders>
               <w:top w:val="single" w:color="CFE3DF" w:sz="4"/>
               <w:left w:val="single" w:color="CFE3DF" w:sz="4"/>
@@ -17091,9 +17091,9 @@
         </w:tblBorders>
       </w:tblPr>
       <w:tblGrid>
-        <w:gridCol w:w="3120"/>
-        <w:gridCol w:w="3120"/>
-        <w:gridCol w:w="3120"/>
+        <w:gridCol w:w="2000"/>
+        <w:gridCol w:w="4660"/>
+        <w:gridCol w:w="2700"/>
       </w:tblGrid>
       <w:tr>
         <w:trPr>
@@ -17102,7 +17102,7 @@
         </w:trPr>
         <w:tc>
           <w:tcPr>
-            <w:tcW w:type="dxa" w:w="3120"/>
+            <w:tcW w:type="dxa" w:w="2000"/>
             <w:tcBorders>
               <w:top w:val="single" w:color="CFE3DF" w:sz="4"/>
               <w:left w:val="single" w:color="CFE3DF" w:sz="4"/>
@@ -17135,7 +17135,7 @@
         </w:tc>
         <w:tc>
           <w:tcPr>
-            <w:tcW w:type="dxa" w:w="3120"/>
+            <w:tcW w:type="dxa" w:w="4660"/>
             <w:tcBorders>
               <w:top w:val="single" w:color="CFE3DF" w:sz="4"/>
               <w:left w:val="single" w:color="CFE3DF" w:sz="4"/>
@@ -17168,7 +17168,7 @@
         </w:tc>
         <w:tc>
           <w:tcPr>
-            <w:tcW w:type="dxa" w:w="3120"/>
+            <w:tcW w:type="dxa" w:w="2700"/>
             <w:tcBorders>
               <w:top w:val="single" w:color="CFE3DF" w:sz="4"/>
               <w:left w:val="single" w:color="CFE3DF" w:sz="4"/>
@@ -17207,7 +17207,7 @@
         </w:trPr>
         <w:tc>
           <w:tcPr>
-            <w:tcW w:type="dxa" w:w="3120"/>
+            <w:tcW w:type="dxa" w:w="2000"/>
             <w:tcBorders>
               <w:top w:val="single" w:color="CFE3DF" w:sz="4"/>
               <w:left w:val="single" w:color="CFE3DF" w:sz="4"/>
@@ -17238,7 +17238,7 @@
         </w:tc>
         <w:tc>
           <w:tcPr>
-            <w:tcW w:type="dxa" w:w="3120"/>
+            <w:tcW w:type="dxa" w:w="4660"/>
             <w:tcBorders>
               <w:top w:val="single" w:color="CFE3DF" w:sz="4"/>
               <w:left w:val="single" w:color="CFE3DF" w:sz="4"/>
@@ -17269,7 +17269,7 @@
         </w:tc>
         <w:tc>
           <w:tcPr>
-            <w:tcW w:type="dxa" w:w="3120"/>
+            <w:tcW w:type="dxa" w:w="2700"/>
             <w:tcBorders>
               <w:top w:val="single" w:color="CFE3DF" w:sz="4"/>
               <w:left w:val="single" w:color="CFE3DF" w:sz="4"/>
@@ -17910,9 +17910,9 @@
         </w:tblBorders>
       </w:tblPr>
       <w:tblGrid>
-        <w:gridCol w:w="3120"/>
-        <w:gridCol w:w="3120"/>
-        <w:gridCol w:w="3120"/>
+        <w:gridCol w:w="2000"/>
+        <w:gridCol w:w="4660"/>
+        <w:gridCol w:w="2700"/>
       </w:tblGrid>
       <w:tr>
         <w:trPr>
@@ -17921,7 +17921,7 @@
         </w:trPr>
         <w:tc>
           <w:tcPr>
-            <w:tcW w:type="dxa" w:w="3120"/>
+            <w:tcW w:type="dxa" w:w="2000"/>
             <w:tcBorders>
               <w:top w:val="single" w:color="CFE3DF" w:sz="4"/>
               <w:left w:val="single" w:color="CFE3DF" w:sz="4"/>
@@ -17954,7 +17954,7 @@
         </w:tc>
         <w:tc>
           <w:tcPr>
-            <w:tcW w:type="dxa" w:w="3120"/>
+            <w:tcW w:type="dxa" w:w="4660"/>
             <w:tcBorders>
               <w:top w:val="single" w:color="CFE3DF" w:sz="4"/>
               <w:left w:val="single" w:color="CFE3DF" w:sz="4"/>
@@ -17987,7 +17987,7 @@
         </w:tc>
         <w:tc>
           <w:tcPr>
-            <w:tcW w:type="dxa" w:w="3120"/>
+            <w:tcW w:type="dxa" w:w="2700"/>
             <w:tcBorders>
               <w:top w:val="single" w:color="CFE3DF" w:sz="4"/>
               <w:left w:val="single" w:color="CFE3DF" w:sz="4"/>
@@ -18026,7 +18026,7 @@
         </w:trPr>
         <w:tc>
           <w:tcPr>
-            <w:tcW w:type="dxa" w:w="3120"/>
+            <w:tcW w:type="dxa" w:w="2000"/>
             <w:tcBorders>
               <w:top w:val="single" w:color="CFE3DF" w:sz="4"/>
               <w:left w:val="single" w:color="CFE3DF" w:sz="4"/>
@@ -18057,7 +18057,7 @@
         </w:tc>
         <w:tc>
           <w:tcPr>
-            <w:tcW w:type="dxa" w:w="3120"/>
+            <w:tcW w:type="dxa" w:w="4660"/>
             <w:tcBorders>
               <w:top w:val="single" w:color="CFE3DF" w:sz="4"/>
               <w:left w:val="single" w:color="CFE3DF" w:sz="4"/>
@@ -18088,7 +18088,7 @@
         </w:tc>
         <w:tc>
           <w:tcPr>
-            <w:tcW w:type="dxa" w:w="3120"/>
+            <w:tcW w:type="dxa" w:w="2700"/>
             <w:tcBorders>
               <w:top w:val="single" w:color="CFE3DF" w:sz="4"/>
               <w:left w:val="single" w:color="CFE3DF" w:sz="4"/>
@@ -18937,9 +18937,9 @@
         </w:tblBorders>
       </w:tblPr>
       <w:tblGrid>
-        <w:gridCol w:w="3120"/>
-        <w:gridCol w:w="3120"/>
-        <w:gridCol w:w="3120"/>
+        <w:gridCol w:w="2000"/>
+        <w:gridCol w:w="4660"/>
+        <w:gridCol w:w="2700"/>
       </w:tblGrid>
       <w:tr>
         <w:trPr>
@@ -18948,7 +18948,7 @@
         </w:trPr>
         <w:tc>
           <w:tcPr>
-            <w:tcW w:type="dxa" w:w="3120"/>
+            <w:tcW w:type="dxa" w:w="2000"/>
             <w:tcBorders>
               <w:top w:val="single" w:color="CFE3DF" w:sz="4"/>
               <w:left w:val="single" w:color="CFE3DF" w:sz="4"/>
@@ -18981,7 +18981,7 @@
         </w:tc>
         <w:tc>
           <w:tcPr>
-            <w:tcW w:type="dxa" w:w="3120"/>
+            <w:tcW w:type="dxa" w:w="4660"/>
             <w:tcBorders>
               <w:top w:val="single" w:color="CFE3DF" w:sz="4"/>
               <w:left w:val="single" w:color="CFE3DF" w:sz="4"/>
@@ -19014,7 +19014,7 @@
         </w:tc>
         <w:tc>
           <w:tcPr>
-            <w:tcW w:type="dxa" w:w="3120"/>
+            <w:tcW w:type="dxa" w:w="2700"/>
             <w:tcBorders>
               <w:top w:val="single" w:color="CFE3DF" w:sz="4"/>
               <w:left w:val="single" w:color="CFE3DF" w:sz="4"/>
@@ -19053,7 +19053,7 @@
         </w:trPr>
         <w:tc>
           <w:tcPr>
-            <w:tcW w:type="dxa" w:w="3120"/>
+            <w:tcW w:type="dxa" w:w="2000"/>
             <w:tcBorders>
               <w:top w:val="single" w:color="CFE3DF" w:sz="4"/>
               <w:left w:val="single" w:color="CFE3DF" w:sz="4"/>
@@ -19084,7 +19084,7 @@
         </w:tc>
         <w:tc>
           <w:tcPr>
-            <w:tcW w:type="dxa" w:w="3120"/>
+            <w:tcW w:type="dxa" w:w="4660"/>
             <w:tcBorders>
               <w:top w:val="single" w:color="CFE3DF" w:sz="4"/>
               <w:left w:val="single" w:color="CFE3DF" w:sz="4"/>
@@ -19115,7 +19115,7 @@
         </w:tc>
         <w:tc>
           <w:tcPr>
-            <w:tcW w:type="dxa" w:w="3120"/>
+            <w:tcW w:type="dxa" w:w="2700"/>
             <w:tcBorders>
               <w:top w:val="single" w:color="CFE3DF" w:sz="4"/>
               <w:left w:val="single" w:color="CFE3DF" w:sz="4"/>
@@ -20189,9 +20189,9 @@
         </w:tblBorders>
       </w:tblPr>
       <w:tblGrid>
-        <w:gridCol w:w="3120"/>
-        <w:gridCol w:w="3120"/>
-        <w:gridCol w:w="3120"/>
+        <w:gridCol w:w="2000"/>
+        <w:gridCol w:w="4660"/>
+        <w:gridCol w:w="2700"/>
       </w:tblGrid>
       <w:tr>
         <w:trPr>
@@ -20200,7 +20200,7 @@
         </w:trPr>
         <w:tc>
           <w:tcPr>
-            <w:tcW w:type="dxa" w:w="3120"/>
+            <w:tcW w:type="dxa" w:w="2000"/>
             <w:tcBorders>
               <w:top w:val="single" w:color="CFE3DF" w:sz="4"/>
               <w:left w:val="single" w:color="CFE3DF" w:sz="4"/>
@@ -20233,7 +20233,7 @@
         </w:tc>
         <w:tc>
           <w:tcPr>
-            <w:tcW w:type="dxa" w:w="3120"/>
+            <w:tcW w:type="dxa" w:w="4660"/>
             <w:tcBorders>
               <w:top w:val="single" w:color="CFE3DF" w:sz="4"/>
               <w:left w:val="single" w:color="CFE3DF" w:sz="4"/>
@@ -20266,7 +20266,7 @@
         </w:tc>
         <w:tc>
           <w:tcPr>
-            <w:tcW w:type="dxa" w:w="3120"/>
+            <w:tcW w:type="dxa" w:w="2700"/>
             <w:tcBorders>
               <w:top w:val="single" w:color="CFE3DF" w:sz="4"/>
               <w:left w:val="single" w:color="CFE3DF" w:sz="4"/>
@@ -20305,7 +20305,7 @@
         </w:trPr>
         <w:tc>
           <w:tcPr>
-            <w:tcW w:type="dxa" w:w="3120"/>
+            <w:tcW w:type="dxa" w:w="2000"/>
             <w:tcBorders>
               <w:top w:val="single" w:color="CFE3DF" w:sz="4"/>
               <w:left w:val="single" w:color="CFE3DF" w:sz="4"/>
@@ -20336,7 +20336,7 @@
         </w:tc>
         <w:tc>
           <w:tcPr>
-            <w:tcW w:type="dxa" w:w="3120"/>
+            <w:tcW w:type="dxa" w:w="4660"/>
             <w:tcBorders>
               <w:top w:val="single" w:color="CFE3DF" w:sz="4"/>
               <w:left w:val="single" w:color="CFE3DF" w:sz="4"/>
@@ -20367,7 +20367,7 @@
         </w:tc>
         <w:tc>
           <w:tcPr>
-            <w:tcW w:type="dxa" w:w="3120"/>
+            <w:tcW w:type="dxa" w:w="2700"/>
             <w:tcBorders>
               <w:top w:val="single" w:color="CFE3DF" w:sz="4"/>
               <w:left w:val="single" w:color="CFE3DF" w:sz="4"/>
@@ -20877,9 +20877,9 @@
         </w:tblBorders>
       </w:tblPr>
       <w:tblGrid>
-        <w:gridCol w:w="3120"/>
-        <w:gridCol w:w="3120"/>
-        <w:gridCol w:w="3120"/>
+        <w:gridCol w:w="2000"/>
+        <w:gridCol w:w="4660"/>
+        <w:gridCol w:w="2700"/>
       </w:tblGrid>
       <w:tr>
         <w:trPr>
@@ -20888,7 +20888,7 @@
         </w:trPr>
         <w:tc>
           <w:tcPr>
-            <w:tcW w:type="dxa" w:w="3120"/>
+            <w:tcW w:type="dxa" w:w="2000"/>
             <w:tcBorders>
               <w:top w:val="single" w:color="CFE3DF" w:sz="4"/>
               <w:left w:val="single" w:color="CFE3DF" w:sz="4"/>
@@ -20921,7 +20921,7 @@
         </w:tc>
         <w:tc>
           <w:tcPr>
-            <w:tcW w:type="dxa" w:w="3120"/>
+            <w:tcW w:type="dxa" w:w="4660"/>
             <w:tcBorders>
               <w:top w:val="single" w:color="CFE3DF" w:sz="4"/>
               <w:left w:val="single" w:color="CFE3DF" w:sz="4"/>
@@ -20954,7 +20954,7 @@
         </w:tc>
         <w:tc>
           <w:tcPr>
-            <w:tcW w:type="dxa" w:w="3120"/>
+            <w:tcW w:type="dxa" w:w="2700"/>
             <w:tcBorders>
               <w:top w:val="single" w:color="CFE3DF" w:sz="4"/>
               <w:left w:val="single" w:color="CFE3DF" w:sz="4"/>
@@ -20993,7 +20993,7 @@
         </w:trPr>
         <w:tc>
           <w:tcPr>
-            <w:tcW w:type="dxa" w:w="3120"/>
+            <w:tcW w:type="dxa" w:w="2000"/>
             <w:tcBorders>
               <w:top w:val="single" w:color="CFE3DF" w:sz="4"/>
               <w:left w:val="single" w:color="CFE3DF" w:sz="4"/>
@@ -21024,7 +21024,7 @@
         </w:tc>
         <w:tc>
           <w:tcPr>
-            <w:tcW w:type="dxa" w:w="3120"/>
+            <w:tcW w:type="dxa" w:w="4660"/>
             <w:tcBorders>
               <w:top w:val="single" w:color="CFE3DF" w:sz="4"/>
               <w:left w:val="single" w:color="CFE3DF" w:sz="4"/>
@@ -21055,7 +21055,7 @@
         </w:tc>
         <w:tc>
           <w:tcPr>
-            <w:tcW w:type="dxa" w:w="3120"/>
+            <w:tcW w:type="dxa" w:w="2700"/>
             <w:tcBorders>
               <w:top w:val="single" w:color="CFE3DF" w:sz="4"/>
               <w:left w:val="single" w:color="CFE3DF" w:sz="4"/>
@@ -21686,9 +21686,9 @@
         </w:tblBorders>
       </w:tblPr>
       <w:tblGrid>
-        <w:gridCol w:w="3120"/>
-        <w:gridCol w:w="3120"/>
-        <w:gridCol w:w="3120"/>
+        <w:gridCol w:w="2000"/>
+        <w:gridCol w:w="4660"/>
+        <w:gridCol w:w="2700"/>
       </w:tblGrid>
       <w:tr>
         <w:trPr>
@@ -21697,7 +21697,7 @@
         </w:trPr>
         <w:tc>
           <w:tcPr>
-            <w:tcW w:type="dxa" w:w="3120"/>
+            <w:tcW w:type="dxa" w:w="2000"/>
             <w:tcBorders>
               <w:top w:val="single" w:color="CFE3DF" w:sz="4"/>
               <w:left w:val="single" w:color="CFE3DF" w:sz="4"/>
@@ -21730,7 +21730,7 @@
         </w:tc>
         <w:tc>
           <w:tcPr>
-            <w:tcW w:type="dxa" w:w="3120"/>
+            <w:tcW w:type="dxa" w:w="4660"/>
             <w:tcBorders>
               <w:top w:val="single" w:color="CFE3DF" w:sz="4"/>
               <w:left w:val="single" w:color="CFE3DF" w:sz="4"/>
@@ -21763,7 +21763,7 @@
         </w:tc>
         <w:tc>
           <w:tcPr>
-            <w:tcW w:type="dxa" w:w="3120"/>
+            <w:tcW w:type="dxa" w:w="2700"/>
             <w:tcBorders>
               <w:top w:val="single" w:color="CFE3DF" w:sz="4"/>
               <w:left w:val="single" w:color="CFE3DF" w:sz="4"/>
@@ -21802,7 +21802,7 @@
         </w:trPr>
         <w:tc>
           <w:tcPr>
-            <w:tcW w:type="dxa" w:w="3120"/>
+            <w:tcW w:type="dxa" w:w="2000"/>
             <w:tcBorders>
               <w:top w:val="single" w:color="CFE3DF" w:sz="4"/>
               <w:left w:val="single" w:color="CFE3DF" w:sz="4"/>
@@ -21833,7 +21833,7 @@
         </w:tc>
         <w:tc>
           <w:tcPr>
-            <w:tcW w:type="dxa" w:w="3120"/>
+            <w:tcW w:type="dxa" w:w="4660"/>
             <w:tcBorders>
               <w:top w:val="single" w:color="CFE3DF" w:sz="4"/>
               <w:left w:val="single" w:color="CFE3DF" w:sz="4"/>
@@ -21864,7 +21864,7 @@
         </w:tc>
         <w:tc>
           <w:tcPr>
-            <w:tcW w:type="dxa" w:w="3120"/>
+            <w:tcW w:type="dxa" w:w="2700"/>
             <w:tcBorders>
               <w:top w:val="single" w:color="CFE3DF" w:sz="4"/>
               <w:left w:val="single" w:color="CFE3DF" w:sz="4"/>
@@ -22225,7 +22225,7 @@
         </w:rPr>
         <w:t xml:space="preserve">You may want to find some quiet space and time for this exercise. Start by going to the </w:t>
       </w:r>
-      <w:hyperlink w:history="1" r:id="rIdpsulnsbxbnwnivdt8zyx8">
+      <w:hyperlink w:history="1" r:id="rIdty9k9unn0_gpzyvgrdat2">
         <w:r>
           <w:rPr>
             <w:color w:val="1155CC"/>
@@ -22624,9 +22624,9 @@
         </w:tblBorders>
       </w:tblPr>
       <w:tblGrid>
-        <w:gridCol w:w="3120"/>
-        <w:gridCol w:w="3120"/>
-        <w:gridCol w:w="3120"/>
+        <w:gridCol w:w="2000"/>
+        <w:gridCol w:w="4660"/>
+        <w:gridCol w:w="2700"/>
       </w:tblGrid>
       <w:tr>
         <w:trPr>
@@ -22635,7 +22635,7 @@
         </w:trPr>
         <w:tc>
           <w:tcPr>
-            <w:tcW w:type="dxa" w:w="3120"/>
+            <w:tcW w:type="dxa" w:w="2000"/>
             <w:tcBorders>
               <w:top w:val="single" w:color="CFE3DF" w:sz="4"/>
               <w:left w:val="single" w:color="CFE3DF" w:sz="4"/>
@@ -22668,7 +22668,7 @@
         </w:tc>
         <w:tc>
           <w:tcPr>
-            <w:tcW w:type="dxa" w:w="3120"/>
+            <w:tcW w:type="dxa" w:w="4660"/>
             <w:tcBorders>
               <w:top w:val="single" w:color="CFE3DF" w:sz="4"/>
               <w:left w:val="single" w:color="CFE3DF" w:sz="4"/>
@@ -22701,7 +22701,7 @@
         </w:tc>
         <w:tc>
           <w:tcPr>
-            <w:tcW w:type="dxa" w:w="3120"/>
+            <w:tcW w:type="dxa" w:w="2700"/>
             <w:tcBorders>
               <w:top w:val="single" w:color="CFE3DF" w:sz="4"/>
               <w:left w:val="single" w:color="CFE3DF" w:sz="4"/>
@@ -22740,7 +22740,7 @@
         </w:trPr>
         <w:tc>
           <w:tcPr>
-            <w:tcW w:type="dxa" w:w="3120"/>
+            <w:tcW w:type="dxa" w:w="2000"/>
             <w:tcBorders>
               <w:top w:val="single" w:color="CFE3DF" w:sz="4"/>
               <w:left w:val="single" w:color="CFE3DF" w:sz="4"/>
@@ -22771,7 +22771,7 @@
         </w:tc>
         <w:tc>
           <w:tcPr>
-            <w:tcW w:type="dxa" w:w="3120"/>
+            <w:tcW w:type="dxa" w:w="4660"/>
             <w:tcBorders>
               <w:top w:val="single" w:color="CFE3DF" w:sz="4"/>
               <w:left w:val="single" w:color="CFE3DF" w:sz="4"/>
@@ -22802,7 +22802,7 @@
         </w:tc>
         <w:tc>
           <w:tcPr>
-            <w:tcW w:type="dxa" w:w="3120"/>
+            <w:tcW w:type="dxa" w:w="2700"/>
             <w:tcBorders>
               <w:top w:val="single" w:color="CFE3DF" w:sz="4"/>
               <w:left w:val="single" w:color="CFE3DF" w:sz="4"/>
@@ -22909,7 +22909,7 @@
         </w:rPr>
         <w:t xml:space="preserve"> exercise at: http://</w:t>
       </w:r>
-      <w:hyperlink w:history="1" r:id="rIdhualkm3obgmzk9tmzlek_">
+      <w:hyperlink w:history="1" r:id="rId2uqss-8-qi71y8ruy1aab">
         <w:r>
           <w:rPr>
             <w:color w:val="1155CC"/>
@@ -23453,9 +23453,9 @@
         </w:tblBorders>
       </w:tblPr>
       <w:tblGrid>
-        <w:gridCol w:w="3120"/>
-        <w:gridCol w:w="3120"/>
-        <w:gridCol w:w="3120"/>
+        <w:gridCol w:w="2000"/>
+        <w:gridCol w:w="4660"/>
+        <w:gridCol w:w="2700"/>
       </w:tblGrid>
       <w:tr>
         <w:trPr>
@@ -23464,7 +23464,7 @@
         </w:trPr>
         <w:tc>
           <w:tcPr>
-            <w:tcW w:type="dxa" w:w="3120"/>
+            <w:tcW w:type="dxa" w:w="2000"/>
             <w:tcBorders>
               <w:top w:val="single" w:color="CFE3DF" w:sz="4"/>
               <w:left w:val="single" w:color="CFE3DF" w:sz="4"/>
@@ -23497,7 +23497,7 @@
         </w:tc>
         <w:tc>
           <w:tcPr>
-            <w:tcW w:type="dxa" w:w="3120"/>
+            <w:tcW w:type="dxa" w:w="4660"/>
             <w:tcBorders>
               <w:top w:val="single" w:color="CFE3DF" w:sz="4"/>
               <w:left w:val="single" w:color="CFE3DF" w:sz="4"/>
@@ -23530,7 +23530,7 @@
         </w:tc>
         <w:tc>
           <w:tcPr>
-            <w:tcW w:type="dxa" w:w="3120"/>
+            <w:tcW w:type="dxa" w:w="2700"/>
             <w:tcBorders>
               <w:top w:val="single" w:color="CFE3DF" w:sz="4"/>
               <w:left w:val="single" w:color="CFE3DF" w:sz="4"/>
@@ -23569,7 +23569,7 @@
         </w:trPr>
         <w:tc>
           <w:tcPr>
-            <w:tcW w:type="dxa" w:w="3120"/>
+            <w:tcW w:type="dxa" w:w="2000"/>
             <w:tcBorders>
               <w:top w:val="single" w:color="CFE3DF" w:sz="4"/>
               <w:left w:val="single" w:color="CFE3DF" w:sz="4"/>
@@ -23600,7 +23600,7 @@
         </w:tc>
         <w:tc>
           <w:tcPr>
-            <w:tcW w:type="dxa" w:w="3120"/>
+            <w:tcW w:type="dxa" w:w="4660"/>
             <w:tcBorders>
               <w:top w:val="single" w:color="CFE3DF" w:sz="4"/>
               <w:left w:val="single" w:color="CFE3DF" w:sz="4"/>
@@ -23631,7 +23631,7 @@
         </w:tc>
         <w:tc>
           <w:tcPr>
-            <w:tcW w:type="dxa" w:w="3120"/>
+            <w:tcW w:type="dxa" w:w="2700"/>
             <w:tcBorders>
               <w:top w:val="single" w:color="CFE3DF" w:sz="4"/>
               <w:left w:val="single" w:color="CFE3DF" w:sz="4"/>
@@ -23770,7 +23770,7 @@
         </w:rPr>
         <w:t xml:space="preserve">Either at that time, or later on, write down a word (or words) from the </w:t>
       </w:r>
-      <w:hyperlink w:history="1" r:id="rIdhnoap6gcvml-2akc9tcty">
+      <w:hyperlink w:history="1" r:id="rIdiselblm1a_uyjxhjaagwx">
         <w:r>
           <w:rPr>
             <w:color w:val="1155CC"/>
@@ -23807,7 +23807,7 @@
         </w:rPr>
         <w:t xml:space="preserve">Then look at the </w:t>
       </w:r>
-      <w:hyperlink w:history="1" r:id="rId9ef57vmbs99uzr7xbkc6a">
+      <w:hyperlink w:history="1" r:id="rIdn73qb8kpkq-kth6rmv6rn">
         <w:r>
           <w:rPr>
             <w:color w:val="1155CC"/>
@@ -24452,9 +24452,9 @@
         </w:tblBorders>
       </w:tblPr>
       <w:tblGrid>
-        <w:gridCol w:w="3120"/>
-        <w:gridCol w:w="3120"/>
-        <w:gridCol w:w="3120"/>
+        <w:gridCol w:w="2000"/>
+        <w:gridCol w:w="4660"/>
+        <w:gridCol w:w="2700"/>
       </w:tblGrid>
       <w:tr>
         <w:trPr>
@@ -24463,7 +24463,7 @@
         </w:trPr>
         <w:tc>
           <w:tcPr>
-            <w:tcW w:type="dxa" w:w="3120"/>
+            <w:tcW w:type="dxa" w:w="2000"/>
             <w:tcBorders>
               <w:top w:val="single" w:color="CFE3DF" w:sz="4"/>
               <w:left w:val="single" w:color="CFE3DF" w:sz="4"/>
@@ -24496,7 +24496,7 @@
         </w:tc>
         <w:tc>
           <w:tcPr>
-            <w:tcW w:type="dxa" w:w="3120"/>
+            <w:tcW w:type="dxa" w:w="4660"/>
             <w:tcBorders>
               <w:top w:val="single" w:color="CFE3DF" w:sz="4"/>
               <w:left w:val="single" w:color="CFE3DF" w:sz="4"/>
@@ -24529,7 +24529,7 @@
         </w:tc>
         <w:tc>
           <w:tcPr>
-            <w:tcW w:type="dxa" w:w="3120"/>
+            <w:tcW w:type="dxa" w:w="2700"/>
             <w:tcBorders>
               <w:top w:val="single" w:color="CFE3DF" w:sz="4"/>
               <w:left w:val="single" w:color="CFE3DF" w:sz="4"/>
@@ -24568,7 +24568,7 @@
         </w:trPr>
         <w:tc>
           <w:tcPr>
-            <w:tcW w:type="dxa" w:w="3120"/>
+            <w:tcW w:type="dxa" w:w="2000"/>
             <w:tcBorders>
               <w:top w:val="single" w:color="CFE3DF" w:sz="4"/>
               <w:left w:val="single" w:color="CFE3DF" w:sz="4"/>
@@ -24599,7 +24599,7 @@
         </w:tc>
         <w:tc>
           <w:tcPr>
-            <w:tcW w:type="dxa" w:w="3120"/>
+            <w:tcW w:type="dxa" w:w="4660"/>
             <w:tcBorders>
               <w:top w:val="single" w:color="CFE3DF" w:sz="4"/>
               <w:left w:val="single" w:color="CFE3DF" w:sz="4"/>
@@ -24630,7 +24630,7 @@
         </w:tc>
         <w:tc>
           <w:tcPr>
-            <w:tcW w:type="dxa" w:w="3120"/>
+            <w:tcW w:type="dxa" w:w="2700"/>
             <w:tcBorders>
               <w:top w:val="single" w:color="CFE3DF" w:sz="4"/>
               <w:left w:val="single" w:color="CFE3DF" w:sz="4"/>
@@ -25160,9 +25160,9 @@
         </w:tblBorders>
       </w:tblPr>
       <w:tblGrid>
-        <w:gridCol w:w="3120"/>
-        <w:gridCol w:w="3120"/>
-        <w:gridCol w:w="3120"/>
+        <w:gridCol w:w="2000"/>
+        <w:gridCol w:w="4660"/>
+        <w:gridCol w:w="2700"/>
       </w:tblGrid>
       <w:tr>
         <w:trPr>
@@ -25171,7 +25171,7 @@
         </w:trPr>
         <w:tc>
           <w:tcPr>
-            <w:tcW w:type="dxa" w:w="3120"/>
+            <w:tcW w:type="dxa" w:w="2000"/>
             <w:tcBorders>
               <w:top w:val="single" w:color="CFE3DF" w:sz="4"/>
               <w:left w:val="single" w:color="CFE3DF" w:sz="4"/>
@@ -25204,7 +25204,7 @@
         </w:tc>
         <w:tc>
           <w:tcPr>
-            <w:tcW w:type="dxa" w:w="3120"/>
+            <w:tcW w:type="dxa" w:w="4660"/>
             <w:tcBorders>
               <w:top w:val="single" w:color="CFE3DF" w:sz="4"/>
               <w:left w:val="single" w:color="CFE3DF" w:sz="4"/>
@@ -25237,7 +25237,7 @@
         </w:tc>
         <w:tc>
           <w:tcPr>
-            <w:tcW w:type="dxa" w:w="3120"/>
+            <w:tcW w:type="dxa" w:w="2700"/>
             <w:tcBorders>
               <w:top w:val="single" w:color="CFE3DF" w:sz="4"/>
               <w:left w:val="single" w:color="CFE3DF" w:sz="4"/>
@@ -25276,7 +25276,7 @@
         </w:trPr>
         <w:tc>
           <w:tcPr>
-            <w:tcW w:type="dxa" w:w="3120"/>
+            <w:tcW w:type="dxa" w:w="2000"/>
             <w:tcBorders>
               <w:top w:val="single" w:color="CFE3DF" w:sz="4"/>
               <w:left w:val="single" w:color="CFE3DF" w:sz="4"/>
@@ -25307,7 +25307,7 @@
         </w:tc>
         <w:tc>
           <w:tcPr>
-            <w:tcW w:type="dxa" w:w="3120"/>
+            <w:tcW w:type="dxa" w:w="4660"/>
             <w:tcBorders>
               <w:top w:val="single" w:color="CFE3DF" w:sz="4"/>
               <w:left w:val="single" w:color="CFE3DF" w:sz="4"/>
@@ -25338,7 +25338,7 @@
         </w:tc>
         <w:tc>
           <w:tcPr>
-            <w:tcW w:type="dxa" w:w="3120"/>
+            <w:tcW w:type="dxa" w:w="2700"/>
             <w:tcBorders>
               <w:top w:val="single" w:color="CFE3DF" w:sz="4"/>
               <w:left w:val="single" w:color="CFE3DF" w:sz="4"/>
@@ -25461,7 +25461,7 @@
         </w:rPr>
         <w:t xml:space="preserve"> at http://</w:t>
       </w:r>
-      <w:hyperlink w:history="1" r:id="rIdomtfh4avj9hv6yi3k7fde">
+      <w:hyperlink w:history="1" r:id="rIdujnhtb4syjlebplqjbonc">
         <w:r>
           <w:rPr>
             <w:color w:val="1155CC"/>
@@ -25965,9 +25965,9 @@
         </w:tblBorders>
       </w:tblPr>
       <w:tblGrid>
-        <w:gridCol w:w="3120"/>
-        <w:gridCol w:w="3120"/>
-        <w:gridCol w:w="3120"/>
+        <w:gridCol w:w="2000"/>
+        <w:gridCol w:w="4660"/>
+        <w:gridCol w:w="2700"/>
       </w:tblGrid>
       <w:tr>
         <w:trPr>
@@ -25976,7 +25976,7 @@
         </w:trPr>
         <w:tc>
           <w:tcPr>
-            <w:tcW w:type="dxa" w:w="3120"/>
+            <w:tcW w:type="dxa" w:w="2000"/>
             <w:tcBorders>
               <w:top w:val="single" w:color="CFE3DF" w:sz="4"/>
               <w:left w:val="single" w:color="CFE3DF" w:sz="4"/>
@@ -26009,7 +26009,7 @@
         </w:tc>
         <w:tc>
           <w:tcPr>
-            <w:tcW w:type="dxa" w:w="3120"/>
+            <w:tcW w:type="dxa" w:w="4660"/>
             <w:tcBorders>
               <w:top w:val="single" w:color="CFE3DF" w:sz="4"/>
               <w:left w:val="single" w:color="CFE3DF" w:sz="4"/>
@@ -26042,7 +26042,7 @@
         </w:tc>
         <w:tc>
           <w:tcPr>
-            <w:tcW w:type="dxa" w:w="3120"/>
+            <w:tcW w:type="dxa" w:w="2700"/>
             <w:tcBorders>
               <w:top w:val="single" w:color="CFE3DF" w:sz="4"/>
               <w:left w:val="single" w:color="CFE3DF" w:sz="4"/>
@@ -26081,7 +26081,7 @@
         </w:trPr>
         <w:tc>
           <w:tcPr>
-            <w:tcW w:type="dxa" w:w="3120"/>
+            <w:tcW w:type="dxa" w:w="2000"/>
             <w:tcBorders>
               <w:top w:val="single" w:color="CFE3DF" w:sz="4"/>
               <w:left w:val="single" w:color="CFE3DF" w:sz="4"/>
@@ -26112,7 +26112,7 @@
         </w:tc>
         <w:tc>
           <w:tcPr>
-            <w:tcW w:type="dxa" w:w="3120"/>
+            <w:tcW w:type="dxa" w:w="4660"/>
             <w:tcBorders>
               <w:top w:val="single" w:color="CFE3DF" w:sz="4"/>
               <w:left w:val="single" w:color="CFE3DF" w:sz="4"/>
@@ -26143,7 +26143,7 @@
         </w:tc>
         <w:tc>
           <w:tcPr>
-            <w:tcW w:type="dxa" w:w="3120"/>
+            <w:tcW w:type="dxa" w:w="2700"/>
             <w:tcBorders>
               <w:top w:val="single" w:color="CFE3DF" w:sz="4"/>
               <w:left w:val="single" w:color="CFE3DF" w:sz="4"/>
@@ -26661,9 +26661,9 @@
         </w:tblBorders>
       </w:tblPr>
       <w:tblGrid>
-        <w:gridCol w:w="3120"/>
-        <w:gridCol w:w="3120"/>
-        <w:gridCol w:w="3120"/>
+        <w:gridCol w:w="2000"/>
+        <w:gridCol w:w="4660"/>
+        <w:gridCol w:w="2700"/>
       </w:tblGrid>
       <w:tr>
         <w:trPr>
@@ -26672,7 +26672,7 @@
         </w:trPr>
         <w:tc>
           <w:tcPr>
-            <w:tcW w:type="dxa" w:w="3120"/>
+            <w:tcW w:type="dxa" w:w="2000"/>
             <w:tcBorders>
               <w:top w:val="single" w:color="CFE3DF" w:sz="4"/>
               <w:left w:val="single" w:color="CFE3DF" w:sz="4"/>
@@ -26705,7 +26705,7 @@
         </w:tc>
         <w:tc>
           <w:tcPr>
-            <w:tcW w:type="dxa" w:w="3120"/>
+            <w:tcW w:type="dxa" w:w="4660"/>
             <w:tcBorders>
               <w:top w:val="single" w:color="CFE3DF" w:sz="4"/>
               <w:left w:val="single" w:color="CFE3DF" w:sz="4"/>
@@ -26738,7 +26738,7 @@
         </w:tc>
         <w:tc>
           <w:tcPr>
-            <w:tcW w:type="dxa" w:w="3120"/>
+            <w:tcW w:type="dxa" w:w="2700"/>
             <w:tcBorders>
               <w:top w:val="single" w:color="CFE3DF" w:sz="4"/>
               <w:left w:val="single" w:color="CFE3DF" w:sz="4"/>
@@ -26777,7 +26777,7 @@
         </w:trPr>
         <w:tc>
           <w:tcPr>
-            <w:tcW w:type="dxa" w:w="3120"/>
+            <w:tcW w:type="dxa" w:w="2000"/>
             <w:tcBorders>
               <w:top w:val="single" w:color="CFE3DF" w:sz="4"/>
               <w:left w:val="single" w:color="CFE3DF" w:sz="4"/>
@@ -26808,7 +26808,7 @@
         </w:tc>
         <w:tc>
           <w:tcPr>
-            <w:tcW w:type="dxa" w:w="3120"/>
+            <w:tcW w:type="dxa" w:w="4660"/>
             <w:tcBorders>
               <w:top w:val="single" w:color="CFE3DF" w:sz="4"/>
               <w:left w:val="single" w:color="CFE3DF" w:sz="4"/>
@@ -26839,7 +26839,7 @@
         </w:tc>
         <w:tc>
           <w:tcPr>
-            <w:tcW w:type="dxa" w:w="3120"/>
+            <w:tcW w:type="dxa" w:w="2700"/>
             <w:tcBorders>
               <w:top w:val="single" w:color="CFE3DF" w:sz="4"/>
               <w:left w:val="single" w:color="CFE3DF" w:sz="4"/>
@@ -27477,9 +27477,9 @@
         </w:tblBorders>
       </w:tblPr>
       <w:tblGrid>
-        <w:gridCol w:w="3120"/>
-        <w:gridCol w:w="3120"/>
-        <w:gridCol w:w="3120"/>
+        <w:gridCol w:w="2000"/>
+        <w:gridCol w:w="4660"/>
+        <w:gridCol w:w="2700"/>
       </w:tblGrid>
       <w:tr>
         <w:trPr>
@@ -27488,7 +27488,7 @@
         </w:trPr>
         <w:tc>
           <w:tcPr>
-            <w:tcW w:type="dxa" w:w="3120"/>
+            <w:tcW w:type="dxa" w:w="2000"/>
             <w:tcBorders>
               <w:top w:val="single" w:color="CFE3DF" w:sz="4"/>
               <w:left w:val="single" w:color="CFE3DF" w:sz="4"/>
@@ -27521,7 +27521,7 @@
         </w:tc>
         <w:tc>
           <w:tcPr>
-            <w:tcW w:type="dxa" w:w="3120"/>
+            <w:tcW w:type="dxa" w:w="4660"/>
             <w:tcBorders>
               <w:top w:val="single" w:color="CFE3DF" w:sz="4"/>
               <w:left w:val="single" w:color="CFE3DF" w:sz="4"/>
@@ -27554,7 +27554,7 @@
         </w:tc>
         <w:tc>
           <w:tcPr>
-            <w:tcW w:type="dxa" w:w="3120"/>
+            <w:tcW w:type="dxa" w:w="2700"/>
             <w:tcBorders>
               <w:top w:val="single" w:color="CFE3DF" w:sz="4"/>
               <w:left w:val="single" w:color="CFE3DF" w:sz="4"/>
@@ -27593,7 +27593,7 @@
         </w:trPr>
         <w:tc>
           <w:tcPr>
-            <w:tcW w:type="dxa" w:w="3120"/>
+            <w:tcW w:type="dxa" w:w="2000"/>
             <w:tcBorders>
               <w:top w:val="single" w:color="CFE3DF" w:sz="4"/>
               <w:left w:val="single" w:color="CFE3DF" w:sz="4"/>
@@ -27624,7 +27624,7 @@
         </w:tc>
         <w:tc>
           <w:tcPr>
-            <w:tcW w:type="dxa" w:w="3120"/>
+            <w:tcW w:type="dxa" w:w="4660"/>
             <w:tcBorders>
               <w:top w:val="single" w:color="CFE3DF" w:sz="4"/>
               <w:left w:val="single" w:color="CFE3DF" w:sz="4"/>
@@ -27655,7 +27655,7 @@
         </w:tc>
         <w:tc>
           <w:tcPr>
-            <w:tcW w:type="dxa" w:w="3120"/>
+            <w:tcW w:type="dxa" w:w="2700"/>
             <w:tcBorders>
               <w:top w:val="single" w:color="CFE3DF" w:sz="4"/>
               <w:left w:val="single" w:color="CFE3DF" w:sz="4"/>
@@ -28100,9 +28100,9 @@
         </w:tblBorders>
       </w:tblPr>
       <w:tblGrid>
-        <w:gridCol w:w="3120"/>
-        <w:gridCol w:w="3120"/>
-        <w:gridCol w:w="3120"/>
+        <w:gridCol w:w="2000"/>
+        <w:gridCol w:w="4660"/>
+        <w:gridCol w:w="2700"/>
       </w:tblGrid>
       <w:tr>
         <w:trPr>
@@ -28111,7 +28111,7 @@
         </w:trPr>
         <w:tc>
           <w:tcPr>
-            <w:tcW w:type="dxa" w:w="3120"/>
+            <w:tcW w:type="dxa" w:w="2000"/>
             <w:tcBorders>
               <w:top w:val="single" w:color="CFE3DF" w:sz="4"/>
               <w:left w:val="single" w:color="CFE3DF" w:sz="4"/>
@@ -28144,7 +28144,7 @@
         </w:tc>
         <w:tc>
           <w:tcPr>
-            <w:tcW w:type="dxa" w:w="3120"/>
+            <w:tcW w:type="dxa" w:w="4660"/>
             <w:tcBorders>
               <w:top w:val="single" w:color="CFE3DF" w:sz="4"/>
               <w:left w:val="single" w:color="CFE3DF" w:sz="4"/>
@@ -28177,7 +28177,7 @@
         </w:tc>
         <w:tc>
           <w:tcPr>
-            <w:tcW w:type="dxa" w:w="3120"/>
+            <w:tcW w:type="dxa" w:w="2700"/>
             <w:tcBorders>
               <w:top w:val="single" w:color="CFE3DF" w:sz="4"/>
               <w:left w:val="single" w:color="CFE3DF" w:sz="4"/>
@@ -28216,7 +28216,7 @@
         </w:trPr>
         <w:tc>
           <w:tcPr>
-            <w:tcW w:type="dxa" w:w="3120"/>
+            <w:tcW w:type="dxa" w:w="2000"/>
             <w:tcBorders>
               <w:top w:val="single" w:color="CFE3DF" w:sz="4"/>
               <w:left w:val="single" w:color="CFE3DF" w:sz="4"/>
@@ -28247,7 +28247,7 @@
         </w:tc>
         <w:tc>
           <w:tcPr>
-            <w:tcW w:type="dxa" w:w="3120"/>
+            <w:tcW w:type="dxa" w:w="4660"/>
             <w:tcBorders>
               <w:top w:val="single" w:color="CFE3DF" w:sz="4"/>
               <w:left w:val="single" w:color="CFE3DF" w:sz="4"/>
@@ -28278,7 +28278,7 @@
         </w:tc>
         <w:tc>
           <w:tcPr>
-            <w:tcW w:type="dxa" w:w="3120"/>
+            <w:tcW w:type="dxa" w:w="2700"/>
             <w:tcBorders>
               <w:top w:val="single" w:color="CFE3DF" w:sz="4"/>
               <w:left w:val="single" w:color="CFE3DF" w:sz="4"/>
@@ -28506,7 +28506,7 @@
         </w:rPr>
         <w:t xml:space="preserve">Later on, when you have time, sit down with the </w:t>
       </w:r>
-      <w:hyperlink w:history="1" r:id="rIdd1b0i0os6fh3u2ulizgvf">
+      <w:hyperlink w:history="1" r:id="rIdvw9r_ush8irkkcmuhl9qu">
         <w:r>
           <w:rPr>
             <w:color w:val="1155CC"/>
@@ -28527,7 +28527,7 @@
         </w:rPr>
         <w:t xml:space="preserve"> and see if you can figure out what need(s) you were in pain about. Translate your judgment words into need words. As usual, I suggest that you limit the words you use to those on the </w:t>
       </w:r>
-      <w:hyperlink w:history="1" r:id="rIdwtjnssy-nqrrnxjp9c5nn">
+      <w:hyperlink w:history="1" r:id="rId6-pproc0vzulr7nnyamfd">
         <w:r>
           <w:rPr>
             <w:color w:val="1155CC"/>
@@ -28955,9 +28955,9 @@
         </w:tblBorders>
       </w:tblPr>
       <w:tblGrid>
-        <w:gridCol w:w="3120"/>
-        <w:gridCol w:w="3120"/>
-        <w:gridCol w:w="3120"/>
+        <w:gridCol w:w="2000"/>
+        <w:gridCol w:w="4660"/>
+        <w:gridCol w:w="2700"/>
       </w:tblGrid>
       <w:tr>
         <w:trPr>
@@ -28966,7 +28966,7 @@
         </w:trPr>
         <w:tc>
           <w:tcPr>
-            <w:tcW w:type="dxa" w:w="3120"/>
+            <w:tcW w:type="dxa" w:w="2000"/>
             <w:tcBorders>
               <w:top w:val="single" w:color="CFE3DF" w:sz="4"/>
               <w:left w:val="single" w:color="CFE3DF" w:sz="4"/>
@@ -28999,7 +28999,7 @@
         </w:tc>
         <w:tc>
           <w:tcPr>
-            <w:tcW w:type="dxa" w:w="3120"/>
+            <w:tcW w:type="dxa" w:w="4660"/>
             <w:tcBorders>
               <w:top w:val="single" w:color="CFE3DF" w:sz="4"/>
               <w:left w:val="single" w:color="CFE3DF" w:sz="4"/>
@@ -29032,7 +29032,7 @@
         </w:tc>
         <w:tc>
           <w:tcPr>
-            <w:tcW w:type="dxa" w:w="3120"/>
+            <w:tcW w:type="dxa" w:w="2700"/>
             <w:tcBorders>
               <w:top w:val="single" w:color="CFE3DF" w:sz="4"/>
               <w:left w:val="single" w:color="CFE3DF" w:sz="4"/>
@@ -29071,7 +29071,7 @@
         </w:trPr>
         <w:tc>
           <w:tcPr>
-            <w:tcW w:type="dxa" w:w="3120"/>
+            <w:tcW w:type="dxa" w:w="2000"/>
             <w:tcBorders>
               <w:top w:val="single" w:color="CFE3DF" w:sz="4"/>
               <w:left w:val="single" w:color="CFE3DF" w:sz="4"/>
@@ -29102,7 +29102,7 @@
         </w:tc>
         <w:tc>
           <w:tcPr>
-            <w:tcW w:type="dxa" w:w="3120"/>
+            <w:tcW w:type="dxa" w:w="4660"/>
             <w:tcBorders>
               <w:top w:val="single" w:color="CFE3DF" w:sz="4"/>
               <w:left w:val="single" w:color="CFE3DF" w:sz="4"/>
@@ -29133,7 +29133,7 @@
         </w:tc>
         <w:tc>
           <w:tcPr>
-            <w:tcW w:type="dxa" w:w="3120"/>
+            <w:tcW w:type="dxa" w:w="2700"/>
             <w:tcBorders>
               <w:top w:val="single" w:color="CFE3DF" w:sz="4"/>
               <w:left w:val="single" w:color="CFE3DF" w:sz="4"/>
@@ -29755,9 +29755,9 @@
         </w:tblBorders>
       </w:tblPr>
       <w:tblGrid>
-        <w:gridCol w:w="3120"/>
-        <w:gridCol w:w="3120"/>
-        <w:gridCol w:w="3120"/>
+        <w:gridCol w:w="2000"/>
+        <w:gridCol w:w="4660"/>
+        <w:gridCol w:w="2700"/>
       </w:tblGrid>
       <w:tr>
         <w:trPr>
@@ -29766,7 +29766,7 @@
         </w:trPr>
         <w:tc>
           <w:tcPr>
-            <w:tcW w:type="dxa" w:w="3120"/>
+            <w:tcW w:type="dxa" w:w="2000"/>
             <w:tcBorders>
               <w:top w:val="single" w:color="CFE3DF" w:sz="4"/>
               <w:left w:val="single" w:color="CFE3DF" w:sz="4"/>
@@ -29799,7 +29799,7 @@
         </w:tc>
         <w:tc>
           <w:tcPr>
-            <w:tcW w:type="dxa" w:w="3120"/>
+            <w:tcW w:type="dxa" w:w="4660"/>
             <w:tcBorders>
               <w:top w:val="single" w:color="CFE3DF" w:sz="4"/>
               <w:left w:val="single" w:color="CFE3DF" w:sz="4"/>
@@ -29832,7 +29832,7 @@
         </w:tc>
         <w:tc>
           <w:tcPr>
-            <w:tcW w:type="dxa" w:w="3120"/>
+            <w:tcW w:type="dxa" w:w="2700"/>
             <w:tcBorders>
               <w:top w:val="single" w:color="CFE3DF" w:sz="4"/>
               <w:left w:val="single" w:color="CFE3DF" w:sz="4"/>
@@ -29871,7 +29871,7 @@
         </w:trPr>
         <w:tc>
           <w:tcPr>
-            <w:tcW w:type="dxa" w:w="3120"/>
+            <w:tcW w:type="dxa" w:w="2000"/>
             <w:tcBorders>
               <w:top w:val="single" w:color="CFE3DF" w:sz="4"/>
               <w:left w:val="single" w:color="CFE3DF" w:sz="4"/>
@@ -29902,7 +29902,7 @@
         </w:tc>
         <w:tc>
           <w:tcPr>
-            <w:tcW w:type="dxa" w:w="3120"/>
+            <w:tcW w:type="dxa" w:w="4660"/>
             <w:tcBorders>
               <w:top w:val="single" w:color="CFE3DF" w:sz="4"/>
               <w:left w:val="single" w:color="CFE3DF" w:sz="4"/>
@@ -29933,7 +29933,7 @@
         </w:tc>
         <w:tc>
           <w:tcPr>
-            <w:tcW w:type="dxa" w:w="3120"/>
+            <w:tcW w:type="dxa" w:w="2700"/>
             <w:tcBorders>
               <w:top w:val="single" w:color="CFE3DF" w:sz="4"/>
               <w:left w:val="single" w:color="CFE3DF" w:sz="4"/>
@@ -30547,9 +30547,9 @@
         </w:tblBorders>
       </w:tblPr>
       <w:tblGrid>
-        <w:gridCol w:w="3120"/>
-        <w:gridCol w:w="3120"/>
-        <w:gridCol w:w="3120"/>
+        <w:gridCol w:w="2000"/>
+        <w:gridCol w:w="4660"/>
+        <w:gridCol w:w="2700"/>
       </w:tblGrid>
       <w:tr>
         <w:trPr>
@@ -30558,7 +30558,7 @@
         </w:trPr>
         <w:tc>
           <w:tcPr>
-            <w:tcW w:type="dxa" w:w="3120"/>
+            <w:tcW w:type="dxa" w:w="2000"/>
             <w:tcBorders>
               <w:top w:val="single" w:color="CFE3DF" w:sz="4"/>
               <w:left w:val="single" w:color="CFE3DF" w:sz="4"/>
@@ -30591,7 +30591,7 @@
         </w:tc>
         <w:tc>
           <w:tcPr>
-            <w:tcW w:type="dxa" w:w="3120"/>
+            <w:tcW w:type="dxa" w:w="4660"/>
             <w:tcBorders>
               <w:top w:val="single" w:color="CFE3DF" w:sz="4"/>
               <w:left w:val="single" w:color="CFE3DF" w:sz="4"/>
@@ -30624,7 +30624,7 @@
         </w:tc>
         <w:tc>
           <w:tcPr>
-            <w:tcW w:type="dxa" w:w="3120"/>
+            <w:tcW w:type="dxa" w:w="2700"/>
             <w:tcBorders>
               <w:top w:val="single" w:color="CFE3DF" w:sz="4"/>
               <w:left w:val="single" w:color="CFE3DF" w:sz="4"/>
@@ -30663,7 +30663,7 @@
         </w:trPr>
         <w:tc>
           <w:tcPr>
-            <w:tcW w:type="dxa" w:w="3120"/>
+            <w:tcW w:type="dxa" w:w="2000"/>
             <w:tcBorders>
               <w:top w:val="single" w:color="CFE3DF" w:sz="4"/>
               <w:left w:val="single" w:color="CFE3DF" w:sz="4"/>
@@ -30694,7 +30694,7 @@
         </w:tc>
         <w:tc>
           <w:tcPr>
-            <w:tcW w:type="dxa" w:w="3120"/>
+            <w:tcW w:type="dxa" w:w="4660"/>
             <w:tcBorders>
               <w:top w:val="single" w:color="CFE3DF" w:sz="4"/>
               <w:left w:val="single" w:color="CFE3DF" w:sz="4"/>
@@ -30725,7 +30725,7 @@
         </w:tc>
         <w:tc>
           <w:tcPr>
-            <w:tcW w:type="dxa" w:w="3120"/>
+            <w:tcW w:type="dxa" w:w="2700"/>
             <w:tcBorders>
               <w:top w:val="single" w:color="CFE3DF" w:sz="4"/>
               <w:left w:val="single" w:color="CFE3DF" w:sz="4"/>
@@ -31174,9 +31174,9 @@
         </w:tblBorders>
       </w:tblPr>
       <w:tblGrid>
-        <w:gridCol w:w="3120"/>
-        <w:gridCol w:w="3120"/>
-        <w:gridCol w:w="3120"/>
+        <w:gridCol w:w="2000"/>
+        <w:gridCol w:w="4660"/>
+        <w:gridCol w:w="2700"/>
       </w:tblGrid>
       <w:tr>
         <w:trPr>
@@ -31185,7 +31185,7 @@
         </w:trPr>
         <w:tc>
           <w:tcPr>
-            <w:tcW w:type="dxa" w:w="3120"/>
+            <w:tcW w:type="dxa" w:w="2000"/>
             <w:tcBorders>
               <w:top w:val="single" w:color="CFE3DF" w:sz="4"/>
               <w:left w:val="single" w:color="CFE3DF" w:sz="4"/>
@@ -31218,7 +31218,7 @@
         </w:tc>
         <w:tc>
           <w:tcPr>
-            <w:tcW w:type="dxa" w:w="3120"/>
+            <w:tcW w:type="dxa" w:w="4660"/>
             <w:tcBorders>
               <w:top w:val="single" w:color="CFE3DF" w:sz="4"/>
               <w:left w:val="single" w:color="CFE3DF" w:sz="4"/>
@@ -31251,7 +31251,7 @@
         </w:tc>
         <w:tc>
           <w:tcPr>
-            <w:tcW w:type="dxa" w:w="3120"/>
+            <w:tcW w:type="dxa" w:w="2700"/>
             <w:tcBorders>
               <w:top w:val="single" w:color="CFE3DF" w:sz="4"/>
               <w:left w:val="single" w:color="CFE3DF" w:sz="4"/>
@@ -31290,7 +31290,7 @@
         </w:trPr>
         <w:tc>
           <w:tcPr>
-            <w:tcW w:type="dxa" w:w="3120"/>
+            <w:tcW w:type="dxa" w:w="2000"/>
             <w:tcBorders>
               <w:top w:val="single" w:color="CFE3DF" w:sz="4"/>
               <w:left w:val="single" w:color="CFE3DF" w:sz="4"/>
@@ -31321,7 +31321,7 @@
         </w:tc>
         <w:tc>
           <w:tcPr>
-            <w:tcW w:type="dxa" w:w="3120"/>
+            <w:tcW w:type="dxa" w:w="4660"/>
             <w:tcBorders>
               <w:top w:val="single" w:color="CFE3DF" w:sz="4"/>
               <w:left w:val="single" w:color="CFE3DF" w:sz="4"/>
@@ -31352,7 +31352,7 @@
         </w:tc>
         <w:tc>
           <w:tcPr>
-            <w:tcW w:type="dxa" w:w="3120"/>
+            <w:tcW w:type="dxa" w:w="2700"/>
             <w:tcBorders>
               <w:top w:val="single" w:color="CFE3DF" w:sz="4"/>
               <w:left w:val="single" w:color="CFE3DF" w:sz="4"/>
@@ -31926,9 +31926,9 @@
         </w:tblBorders>
       </w:tblPr>
       <w:tblGrid>
-        <w:gridCol w:w="3120"/>
-        <w:gridCol w:w="3120"/>
-        <w:gridCol w:w="3120"/>
+        <w:gridCol w:w="2000"/>
+        <w:gridCol w:w="4660"/>
+        <w:gridCol w:w="2700"/>
       </w:tblGrid>
       <w:tr>
         <w:trPr>
@@ -31937,7 +31937,7 @@
         </w:trPr>
         <w:tc>
           <w:tcPr>
-            <w:tcW w:type="dxa" w:w="3120"/>
+            <w:tcW w:type="dxa" w:w="2000"/>
             <w:tcBorders>
               <w:top w:val="single" w:color="CFE3DF" w:sz="4"/>
               <w:left w:val="single" w:color="CFE3DF" w:sz="4"/>
@@ -31970,7 +31970,7 @@
         </w:tc>
         <w:tc>
           <w:tcPr>
-            <w:tcW w:type="dxa" w:w="3120"/>
+            <w:tcW w:type="dxa" w:w="4660"/>
             <w:tcBorders>
               <w:top w:val="single" w:color="CFE3DF" w:sz="4"/>
               <w:left w:val="single" w:color="CFE3DF" w:sz="4"/>
@@ -32003,7 +32003,7 @@
         </w:tc>
         <w:tc>
           <w:tcPr>
-            <w:tcW w:type="dxa" w:w="3120"/>
+            <w:tcW w:type="dxa" w:w="2700"/>
             <w:tcBorders>
               <w:top w:val="single" w:color="CFE3DF" w:sz="4"/>
               <w:left w:val="single" w:color="CFE3DF" w:sz="4"/>
@@ -32042,7 +32042,7 @@
         </w:trPr>
         <w:tc>
           <w:tcPr>
-            <w:tcW w:type="dxa" w:w="3120"/>
+            <w:tcW w:type="dxa" w:w="2000"/>
             <w:tcBorders>
               <w:top w:val="single" w:color="CFE3DF" w:sz="4"/>
               <w:left w:val="single" w:color="CFE3DF" w:sz="4"/>
@@ -32073,7 +32073,7 @@
         </w:tc>
         <w:tc>
           <w:tcPr>
-            <w:tcW w:type="dxa" w:w="3120"/>
+            <w:tcW w:type="dxa" w:w="4660"/>
             <w:tcBorders>
               <w:top w:val="single" w:color="CFE3DF" w:sz="4"/>
               <w:left w:val="single" w:color="CFE3DF" w:sz="4"/>
@@ -32104,7 +32104,7 @@
         </w:tc>
         <w:tc>
           <w:tcPr>
-            <w:tcW w:type="dxa" w:w="3120"/>
+            <w:tcW w:type="dxa" w:w="2700"/>
             <w:tcBorders>
               <w:top w:val="single" w:color="CFE3DF" w:sz="4"/>
               <w:left w:val="single" w:color="CFE3DF" w:sz="4"/>
@@ -32802,9 +32802,9 @@
         </w:tblBorders>
       </w:tblPr>
       <w:tblGrid>
-        <w:gridCol w:w="3120"/>
-        <w:gridCol w:w="3120"/>
-        <w:gridCol w:w="3120"/>
+        <w:gridCol w:w="2000"/>
+        <w:gridCol w:w="4660"/>
+        <w:gridCol w:w="2700"/>
       </w:tblGrid>
       <w:tr>
         <w:trPr>
@@ -32813,7 +32813,7 @@
         </w:trPr>
         <w:tc>
           <w:tcPr>
-            <w:tcW w:type="dxa" w:w="3120"/>
+            <w:tcW w:type="dxa" w:w="2000"/>
             <w:tcBorders>
               <w:top w:val="single" w:color="CFE3DF" w:sz="4"/>
               <w:left w:val="single" w:color="CFE3DF" w:sz="4"/>
@@ -32846,7 +32846,7 @@
         </w:tc>
         <w:tc>
           <w:tcPr>
-            <w:tcW w:type="dxa" w:w="3120"/>
+            <w:tcW w:type="dxa" w:w="4660"/>
             <w:tcBorders>
               <w:top w:val="single" w:color="CFE3DF" w:sz="4"/>
               <w:left w:val="single" w:color="CFE3DF" w:sz="4"/>
@@ -32879,7 +32879,7 @@
         </w:tc>
         <w:tc>
           <w:tcPr>
-            <w:tcW w:type="dxa" w:w="3120"/>
+            <w:tcW w:type="dxa" w:w="2700"/>
             <w:tcBorders>
               <w:top w:val="single" w:color="CFE3DF" w:sz="4"/>
               <w:left w:val="single" w:color="CFE3DF" w:sz="4"/>
@@ -32918,7 +32918,7 @@
         </w:trPr>
         <w:tc>
           <w:tcPr>
-            <w:tcW w:type="dxa" w:w="3120"/>
+            <w:tcW w:type="dxa" w:w="2000"/>
             <w:tcBorders>
               <w:top w:val="single" w:color="CFE3DF" w:sz="4"/>
               <w:left w:val="single" w:color="CFE3DF" w:sz="4"/>
@@ -32949,7 +32949,7 @@
         </w:tc>
         <w:tc>
           <w:tcPr>
-            <w:tcW w:type="dxa" w:w="3120"/>
+            <w:tcW w:type="dxa" w:w="4660"/>
             <w:tcBorders>
               <w:top w:val="single" w:color="CFE3DF" w:sz="4"/>
               <w:left w:val="single" w:color="CFE3DF" w:sz="4"/>
@@ -32980,7 +32980,7 @@
         </w:tc>
         <w:tc>
           <w:tcPr>
-            <w:tcW w:type="dxa" w:w="3120"/>
+            <w:tcW w:type="dxa" w:w="2700"/>
             <w:tcBorders>
               <w:top w:val="single" w:color="CFE3DF" w:sz="4"/>
               <w:left w:val="single" w:color="CFE3DF" w:sz="4"/>
@@ -33719,9 +33719,9 @@
         </w:tblBorders>
       </w:tblPr>
       <w:tblGrid>
-        <w:gridCol w:w="3120"/>
-        <w:gridCol w:w="3120"/>
-        <w:gridCol w:w="3120"/>
+        <w:gridCol w:w="2000"/>
+        <w:gridCol w:w="4660"/>
+        <w:gridCol w:w="2700"/>
       </w:tblGrid>
       <w:tr>
         <w:trPr>
@@ -33730,7 +33730,7 @@
         </w:trPr>
         <w:tc>
           <w:tcPr>
-            <w:tcW w:type="dxa" w:w="3120"/>
+            <w:tcW w:type="dxa" w:w="2000"/>
             <w:tcBorders>
               <w:top w:val="single" w:color="CFE3DF" w:sz="4"/>
               <w:left w:val="single" w:color="CFE3DF" w:sz="4"/>
@@ -33763,7 +33763,7 @@
         </w:tc>
         <w:tc>
           <w:tcPr>
-            <w:tcW w:type="dxa" w:w="3120"/>
+            <w:tcW w:type="dxa" w:w="4660"/>
             <w:tcBorders>
               <w:top w:val="single" w:color="CFE3DF" w:sz="4"/>
               <w:left w:val="single" w:color="CFE3DF" w:sz="4"/>
@@ -33796,7 +33796,7 @@
         </w:tc>
         <w:tc>
           <w:tcPr>
-            <w:tcW w:type="dxa" w:w="3120"/>
+            <w:tcW w:type="dxa" w:w="2700"/>
             <w:tcBorders>
               <w:top w:val="single" w:color="CFE3DF" w:sz="4"/>
               <w:left w:val="single" w:color="CFE3DF" w:sz="4"/>
@@ -33835,7 +33835,7 @@
         </w:trPr>
         <w:tc>
           <w:tcPr>
-            <w:tcW w:type="dxa" w:w="3120"/>
+            <w:tcW w:type="dxa" w:w="2000"/>
             <w:tcBorders>
               <w:top w:val="single" w:color="CFE3DF" w:sz="4"/>
               <w:left w:val="single" w:color="CFE3DF" w:sz="4"/>
@@ -33866,7 +33866,7 @@
         </w:tc>
         <w:tc>
           <w:tcPr>
-            <w:tcW w:type="dxa" w:w="3120"/>
+            <w:tcW w:type="dxa" w:w="4660"/>
             <w:tcBorders>
               <w:top w:val="single" w:color="CFE3DF" w:sz="4"/>
               <w:left w:val="single" w:color="CFE3DF" w:sz="4"/>
@@ -33897,7 +33897,7 @@
         </w:tc>
         <w:tc>
           <w:tcPr>
-            <w:tcW w:type="dxa" w:w="3120"/>
+            <w:tcW w:type="dxa" w:w="2700"/>
             <w:tcBorders>
               <w:top w:val="single" w:color="CFE3DF" w:sz="4"/>
               <w:left w:val="single" w:color="CFE3DF" w:sz="4"/>
@@ -34439,9 +34439,9 @@
         </w:tblBorders>
       </w:tblPr>
       <w:tblGrid>
-        <w:gridCol w:w="3120"/>
-        <w:gridCol w:w="3120"/>
-        <w:gridCol w:w="3120"/>
+        <w:gridCol w:w="2000"/>
+        <w:gridCol w:w="4660"/>
+        <w:gridCol w:w="2700"/>
       </w:tblGrid>
       <w:tr>
         <w:trPr>
@@ -34450,7 +34450,7 @@
         </w:trPr>
         <w:tc>
           <w:tcPr>
-            <w:tcW w:type="dxa" w:w="3120"/>
+            <w:tcW w:type="dxa" w:w="2000"/>
             <w:tcBorders>
               <w:top w:val="single" w:color="CFE3DF" w:sz="4"/>
               <w:left w:val="single" w:color="CFE3DF" w:sz="4"/>
@@ -34483,7 +34483,7 @@
         </w:tc>
         <w:tc>
           <w:tcPr>
-            <w:tcW w:type="dxa" w:w="3120"/>
+            <w:tcW w:type="dxa" w:w="4660"/>
             <w:tcBorders>
               <w:top w:val="single" w:color="CFE3DF" w:sz="4"/>
               <w:left w:val="single" w:color="CFE3DF" w:sz="4"/>
@@ -34516,7 +34516,7 @@
         </w:tc>
         <w:tc>
           <w:tcPr>
-            <w:tcW w:type="dxa" w:w="3120"/>
+            <w:tcW w:type="dxa" w:w="2700"/>
             <w:tcBorders>
               <w:top w:val="single" w:color="CFE3DF" w:sz="4"/>
               <w:left w:val="single" w:color="CFE3DF" w:sz="4"/>
@@ -34555,7 +34555,7 @@
         </w:trPr>
         <w:tc>
           <w:tcPr>
-            <w:tcW w:type="dxa" w:w="3120"/>
+            <w:tcW w:type="dxa" w:w="2000"/>
             <w:tcBorders>
               <w:top w:val="single" w:color="CFE3DF" w:sz="4"/>
               <w:left w:val="single" w:color="CFE3DF" w:sz="4"/>
@@ -34586,7 +34586,7 @@
         </w:tc>
         <w:tc>
           <w:tcPr>
-            <w:tcW w:type="dxa" w:w="3120"/>
+            <w:tcW w:type="dxa" w:w="4660"/>
             <w:tcBorders>
               <w:top w:val="single" w:color="CFE3DF" w:sz="4"/>
               <w:left w:val="single" w:color="CFE3DF" w:sz="4"/>
@@ -34617,7 +34617,7 @@
         </w:tc>
         <w:tc>
           <w:tcPr>
-            <w:tcW w:type="dxa" w:w="3120"/>
+            <w:tcW w:type="dxa" w:w="2700"/>
             <w:tcBorders>
               <w:top w:val="single" w:color="CFE3DF" w:sz="4"/>
               <w:left w:val="single" w:color="CFE3DF" w:sz="4"/>
@@ -35114,9 +35114,9 @@
         </w:tblBorders>
       </w:tblPr>
       <w:tblGrid>
-        <w:gridCol w:w="3120"/>
-        <w:gridCol w:w="3120"/>
-        <w:gridCol w:w="3120"/>
+        <w:gridCol w:w="2000"/>
+        <w:gridCol w:w="4660"/>
+        <w:gridCol w:w="2700"/>
       </w:tblGrid>
       <w:tr>
         <w:trPr>
@@ -35125,7 +35125,7 @@
         </w:trPr>
         <w:tc>
           <w:tcPr>
-            <w:tcW w:type="dxa" w:w="3120"/>
+            <w:tcW w:type="dxa" w:w="2000"/>
             <w:tcBorders>
               <w:top w:val="single" w:color="CFE3DF" w:sz="4"/>
               <w:left w:val="single" w:color="CFE3DF" w:sz="4"/>
@@ -35158,7 +35158,7 @@
         </w:tc>
         <w:tc>
           <w:tcPr>
-            <w:tcW w:type="dxa" w:w="3120"/>
+            <w:tcW w:type="dxa" w:w="4660"/>
             <w:tcBorders>
               <w:top w:val="single" w:color="CFE3DF" w:sz="4"/>
               <w:left w:val="single" w:color="CFE3DF" w:sz="4"/>
@@ -35191,7 +35191,7 @@
         </w:tc>
         <w:tc>
           <w:tcPr>
-            <w:tcW w:type="dxa" w:w="3120"/>
+            <w:tcW w:type="dxa" w:w="2700"/>
             <w:tcBorders>
               <w:top w:val="single" w:color="CFE3DF" w:sz="4"/>
               <w:left w:val="single" w:color="CFE3DF" w:sz="4"/>
@@ -35230,7 +35230,7 @@
         </w:trPr>
         <w:tc>
           <w:tcPr>
-            <w:tcW w:type="dxa" w:w="3120"/>
+            <w:tcW w:type="dxa" w:w="2000"/>
             <w:tcBorders>
               <w:top w:val="single" w:color="CFE3DF" w:sz="4"/>
               <w:left w:val="single" w:color="CFE3DF" w:sz="4"/>
@@ -35261,7 +35261,7 @@
         </w:tc>
         <w:tc>
           <w:tcPr>
-            <w:tcW w:type="dxa" w:w="3120"/>
+            <w:tcW w:type="dxa" w:w="4660"/>
             <w:tcBorders>
               <w:top w:val="single" w:color="CFE3DF" w:sz="4"/>
               <w:left w:val="single" w:color="CFE3DF" w:sz="4"/>
@@ -35292,7 +35292,7 @@
         </w:tc>
         <w:tc>
           <w:tcPr>
-            <w:tcW w:type="dxa" w:w="3120"/>
+            <w:tcW w:type="dxa" w:w="2700"/>
             <w:tcBorders>
               <w:top w:val="single" w:color="CFE3DF" w:sz="4"/>
               <w:left w:val="single" w:color="CFE3DF" w:sz="4"/>
@@ -35857,9 +35857,9 @@
         </w:tblBorders>
       </w:tblPr>
       <w:tblGrid>
-        <w:gridCol w:w="3120"/>
-        <w:gridCol w:w="3120"/>
-        <w:gridCol w:w="3120"/>
+        <w:gridCol w:w="2000"/>
+        <w:gridCol w:w="4660"/>
+        <w:gridCol w:w="2700"/>
       </w:tblGrid>
       <w:tr>
         <w:trPr>
@@ -35868,7 +35868,7 @@
         </w:trPr>
         <w:tc>
           <w:tcPr>
-            <w:tcW w:type="dxa" w:w="3120"/>
+            <w:tcW w:type="dxa" w:w="2000"/>
             <w:tcBorders>
               <w:top w:val="single" w:color="CFE3DF" w:sz="4"/>
               <w:left w:val="single" w:color="CFE3DF" w:sz="4"/>
@@ -35901,7 +35901,7 @@
         </w:tc>
         <w:tc>
           <w:tcPr>
-            <w:tcW w:type="dxa" w:w="3120"/>
+            <w:tcW w:type="dxa" w:w="4660"/>
             <w:tcBorders>
               <w:top w:val="single" w:color="CFE3DF" w:sz="4"/>
               <w:left w:val="single" w:color="CFE3DF" w:sz="4"/>
@@ -35934,7 +35934,7 @@
         </w:tc>
         <w:tc>
           <w:tcPr>
-            <w:tcW w:type="dxa" w:w="3120"/>
+            <w:tcW w:type="dxa" w:w="2700"/>
             <w:tcBorders>
               <w:top w:val="single" w:color="CFE3DF" w:sz="4"/>
               <w:left w:val="single" w:color="CFE3DF" w:sz="4"/>
@@ -35973,7 +35973,7 @@
         </w:trPr>
         <w:tc>
           <w:tcPr>
-            <w:tcW w:type="dxa" w:w="3120"/>
+            <w:tcW w:type="dxa" w:w="2000"/>
             <w:tcBorders>
               <w:top w:val="single" w:color="CFE3DF" w:sz="4"/>
               <w:left w:val="single" w:color="CFE3DF" w:sz="4"/>
@@ -36004,7 +36004,7 @@
         </w:tc>
         <w:tc>
           <w:tcPr>
-            <w:tcW w:type="dxa" w:w="3120"/>
+            <w:tcW w:type="dxa" w:w="4660"/>
             <w:tcBorders>
               <w:top w:val="single" w:color="CFE3DF" w:sz="4"/>
               <w:left w:val="single" w:color="CFE3DF" w:sz="4"/>
@@ -36035,7 +36035,7 @@
         </w:tc>
         <w:tc>
           <w:tcPr>
-            <w:tcW w:type="dxa" w:w="3120"/>
+            <w:tcW w:type="dxa" w:w="2700"/>
             <w:tcBorders>
               <w:top w:val="single" w:color="CFE3DF" w:sz="4"/>
               <w:left w:val="single" w:color="CFE3DF" w:sz="4"/>
@@ -37082,9 +37082,9 @@
         </w:tblBorders>
       </w:tblPr>
       <w:tblGrid>
-        <w:gridCol w:w="3120"/>
-        <w:gridCol w:w="3120"/>
-        <w:gridCol w:w="3120"/>
+        <w:gridCol w:w="2000"/>
+        <w:gridCol w:w="4660"/>
+        <w:gridCol w:w="2700"/>
       </w:tblGrid>
       <w:tr>
         <w:trPr>
@@ -37093,7 +37093,7 @@
         </w:trPr>
         <w:tc>
           <w:tcPr>
-            <w:tcW w:type="dxa" w:w="3120"/>
+            <w:tcW w:type="dxa" w:w="2000"/>
             <w:tcBorders>
               <w:top w:val="single" w:color="CFE3DF" w:sz="4"/>
               <w:left w:val="single" w:color="CFE3DF" w:sz="4"/>
@@ -37126,7 +37126,7 @@
         </w:tc>
         <w:tc>
           <w:tcPr>
-            <w:tcW w:type="dxa" w:w="3120"/>
+            <w:tcW w:type="dxa" w:w="4660"/>
             <w:tcBorders>
               <w:top w:val="single" w:color="CFE3DF" w:sz="4"/>
               <w:left w:val="single" w:color="CFE3DF" w:sz="4"/>
@@ -37159,7 +37159,7 @@
         </w:tc>
         <w:tc>
           <w:tcPr>
-            <w:tcW w:type="dxa" w:w="3120"/>
+            <w:tcW w:type="dxa" w:w="2700"/>
             <w:tcBorders>
               <w:top w:val="single" w:color="CFE3DF" w:sz="4"/>
               <w:left w:val="single" w:color="CFE3DF" w:sz="4"/>
@@ -37198,7 +37198,7 @@
         </w:trPr>
         <w:tc>
           <w:tcPr>
-            <w:tcW w:type="dxa" w:w="3120"/>
+            <w:tcW w:type="dxa" w:w="2000"/>
             <w:tcBorders>
               <w:top w:val="single" w:color="CFE3DF" w:sz="4"/>
               <w:left w:val="single" w:color="CFE3DF" w:sz="4"/>
@@ -37229,7 +37229,7 @@
         </w:tc>
         <w:tc>
           <w:tcPr>
-            <w:tcW w:type="dxa" w:w="3120"/>
+            <w:tcW w:type="dxa" w:w="4660"/>
             <w:tcBorders>
               <w:top w:val="single" w:color="CFE3DF" w:sz="4"/>
               <w:left w:val="single" w:color="CFE3DF" w:sz="4"/>
@@ -37260,7 +37260,7 @@
         </w:tc>
         <w:tc>
           <w:tcPr>
-            <w:tcW w:type="dxa" w:w="3120"/>
+            <w:tcW w:type="dxa" w:w="2700"/>
             <w:tcBorders>
               <w:top w:val="single" w:color="CFE3DF" w:sz="4"/>
               <w:left w:val="single" w:color="CFE3DF" w:sz="4"/>
@@ -37870,9 +37870,9 @@
         </w:tblBorders>
       </w:tblPr>
       <w:tblGrid>
-        <w:gridCol w:w="3120"/>
-        <w:gridCol w:w="3120"/>
-        <w:gridCol w:w="3120"/>
+        <w:gridCol w:w="2000"/>
+        <w:gridCol w:w="4660"/>
+        <w:gridCol w:w="2700"/>
       </w:tblGrid>
       <w:tr>
         <w:trPr>
@@ -37881,7 +37881,7 @@
         </w:trPr>
         <w:tc>
           <w:tcPr>
-            <w:tcW w:type="dxa" w:w="3120"/>
+            <w:tcW w:type="dxa" w:w="2000"/>
             <w:tcBorders>
               <w:top w:val="single" w:color="CFE3DF" w:sz="4"/>
               <w:left w:val="single" w:color="CFE3DF" w:sz="4"/>
@@ -37914,7 +37914,7 @@
         </w:tc>
         <w:tc>
           <w:tcPr>
-            <w:tcW w:type="dxa" w:w="3120"/>
+            <w:tcW w:type="dxa" w:w="4660"/>
             <w:tcBorders>
               <w:top w:val="single" w:color="CFE3DF" w:sz="4"/>
               <w:left w:val="single" w:color="CFE3DF" w:sz="4"/>
@@ -37947,7 +37947,7 @@
         </w:tc>
         <w:tc>
           <w:tcPr>
-            <w:tcW w:type="dxa" w:w="3120"/>
+            <w:tcW w:type="dxa" w:w="2700"/>
             <w:tcBorders>
               <w:top w:val="single" w:color="CFE3DF" w:sz="4"/>
               <w:left w:val="single" w:color="CFE3DF" w:sz="4"/>
@@ -37986,7 +37986,7 @@
         </w:trPr>
         <w:tc>
           <w:tcPr>
-            <w:tcW w:type="dxa" w:w="3120"/>
+            <w:tcW w:type="dxa" w:w="2000"/>
             <w:tcBorders>
               <w:top w:val="single" w:color="CFE3DF" w:sz="4"/>
               <w:left w:val="single" w:color="CFE3DF" w:sz="4"/>
@@ -38017,7 +38017,7 @@
         </w:tc>
         <w:tc>
           <w:tcPr>
-            <w:tcW w:type="dxa" w:w="3120"/>
+            <w:tcW w:type="dxa" w:w="4660"/>
             <w:tcBorders>
               <w:top w:val="single" w:color="CFE3DF" w:sz="4"/>
               <w:left w:val="single" w:color="CFE3DF" w:sz="4"/>
@@ -38048,7 +38048,7 @@
         </w:tc>
         <w:tc>
           <w:tcPr>
-            <w:tcW w:type="dxa" w:w="3120"/>
+            <w:tcW w:type="dxa" w:w="2700"/>
             <w:tcBorders>
               <w:top w:val="single" w:color="CFE3DF" w:sz="4"/>
               <w:left w:val="single" w:color="CFE3DF" w:sz="4"/>
@@ -38738,9 +38738,9 @@
         </w:tblBorders>
       </w:tblPr>
       <w:tblGrid>
-        <w:gridCol w:w="3120"/>
-        <w:gridCol w:w="3120"/>
-        <w:gridCol w:w="3120"/>
+        <w:gridCol w:w="2000"/>
+        <w:gridCol w:w="4660"/>
+        <w:gridCol w:w="2700"/>
       </w:tblGrid>
       <w:tr>
         <w:trPr>
@@ -38749,7 +38749,7 @@
         </w:trPr>
         <w:tc>
           <w:tcPr>
-            <w:tcW w:type="dxa" w:w="3120"/>
+            <w:tcW w:type="dxa" w:w="2000"/>
             <w:tcBorders>
               <w:top w:val="single" w:color="CFE3DF" w:sz="4"/>
               <w:left w:val="single" w:color="CFE3DF" w:sz="4"/>
@@ -38782,7 +38782,7 @@
         </w:tc>
         <w:tc>
           <w:tcPr>
-            <w:tcW w:type="dxa" w:w="3120"/>
+            <w:tcW w:type="dxa" w:w="4660"/>
             <w:tcBorders>
               <w:top w:val="single" w:color="CFE3DF" w:sz="4"/>
               <w:left w:val="single" w:color="CFE3DF" w:sz="4"/>
@@ -38815,7 +38815,7 @@
         </w:tc>
         <w:tc>
           <w:tcPr>
-            <w:tcW w:type="dxa" w:w="3120"/>
+            <w:tcW w:type="dxa" w:w="2700"/>
             <w:tcBorders>
               <w:top w:val="single" w:color="CFE3DF" w:sz="4"/>
               <w:left w:val="single" w:color="CFE3DF" w:sz="4"/>
@@ -38854,7 +38854,7 @@
         </w:trPr>
         <w:tc>
           <w:tcPr>
-            <w:tcW w:type="dxa" w:w="3120"/>
+            <w:tcW w:type="dxa" w:w="2000"/>
             <w:tcBorders>
               <w:top w:val="single" w:color="CFE3DF" w:sz="4"/>
               <w:left w:val="single" w:color="CFE3DF" w:sz="4"/>
@@ -38885,7 +38885,7 @@
         </w:tc>
         <w:tc>
           <w:tcPr>
-            <w:tcW w:type="dxa" w:w="3120"/>
+            <w:tcW w:type="dxa" w:w="4660"/>
             <w:tcBorders>
               <w:top w:val="single" w:color="CFE3DF" w:sz="4"/>
               <w:left w:val="single" w:color="CFE3DF" w:sz="4"/>
@@ -38916,7 +38916,7 @@
         </w:tc>
         <w:tc>
           <w:tcPr>
-            <w:tcW w:type="dxa" w:w="3120"/>
+            <w:tcW w:type="dxa" w:w="2700"/>
             <w:tcBorders>
               <w:top w:val="single" w:color="CFE3DF" w:sz="4"/>
               <w:left w:val="single" w:color="CFE3DF" w:sz="4"/>
@@ -39510,9 +39510,9 @@
         </w:tblBorders>
       </w:tblPr>
       <w:tblGrid>
-        <w:gridCol w:w="3120"/>
-        <w:gridCol w:w="3120"/>
-        <w:gridCol w:w="3120"/>
+        <w:gridCol w:w="2000"/>
+        <w:gridCol w:w="4660"/>
+        <w:gridCol w:w="2700"/>
       </w:tblGrid>
       <w:tr>
         <w:trPr>
@@ -39521,7 +39521,7 @@
         </w:trPr>
         <w:tc>
           <w:tcPr>
-            <w:tcW w:type="dxa" w:w="3120"/>
+            <w:tcW w:type="dxa" w:w="2000"/>
             <w:tcBorders>
               <w:top w:val="single" w:color="CFE3DF" w:sz="4"/>
               <w:left w:val="single" w:color="CFE3DF" w:sz="4"/>
@@ -39554,7 +39554,7 @@
         </w:tc>
         <w:tc>
           <w:tcPr>
-            <w:tcW w:type="dxa" w:w="3120"/>
+            <w:tcW w:type="dxa" w:w="4660"/>
             <w:tcBorders>
               <w:top w:val="single" w:color="CFE3DF" w:sz="4"/>
               <w:left w:val="single" w:color="CFE3DF" w:sz="4"/>
@@ -39587,7 +39587,7 @@
         </w:tc>
         <w:tc>
           <w:tcPr>
-            <w:tcW w:type="dxa" w:w="3120"/>
+            <w:tcW w:type="dxa" w:w="2700"/>
             <w:tcBorders>
               <w:top w:val="single" w:color="CFE3DF" w:sz="4"/>
               <w:left w:val="single" w:color="CFE3DF" w:sz="4"/>
@@ -39626,7 +39626,7 @@
         </w:trPr>
         <w:tc>
           <w:tcPr>
-            <w:tcW w:type="dxa" w:w="3120"/>
+            <w:tcW w:type="dxa" w:w="2000"/>
             <w:tcBorders>
               <w:top w:val="single" w:color="CFE3DF" w:sz="4"/>
               <w:left w:val="single" w:color="CFE3DF" w:sz="4"/>
@@ -39657,7 +39657,7 @@
         </w:tc>
         <w:tc>
           <w:tcPr>
-            <w:tcW w:type="dxa" w:w="3120"/>
+            <w:tcW w:type="dxa" w:w="4660"/>
             <w:tcBorders>
               <w:top w:val="single" w:color="CFE3DF" w:sz="4"/>
               <w:left w:val="single" w:color="CFE3DF" w:sz="4"/>
@@ -39688,7 +39688,7 @@
         </w:tc>
         <w:tc>
           <w:tcPr>
-            <w:tcW w:type="dxa" w:w="3120"/>
+            <w:tcW w:type="dxa" w:w="2700"/>
             <w:tcBorders>
               <w:top w:val="single" w:color="CFE3DF" w:sz="4"/>
               <w:left w:val="single" w:color="CFE3DF" w:sz="4"/>
@@ -40242,9 +40242,9 @@
         </w:tblBorders>
       </w:tblPr>
       <w:tblGrid>
-        <w:gridCol w:w="3120"/>
-        <w:gridCol w:w="3120"/>
-        <w:gridCol w:w="3120"/>
+        <w:gridCol w:w="2000"/>
+        <w:gridCol w:w="4660"/>
+        <w:gridCol w:w="2700"/>
       </w:tblGrid>
       <w:tr>
         <w:trPr>
@@ -40253,7 +40253,7 @@
         </w:trPr>
         <w:tc>
           <w:tcPr>
-            <w:tcW w:type="dxa" w:w="3120"/>
+            <w:tcW w:type="dxa" w:w="2000"/>
             <w:tcBorders>
               <w:top w:val="single" w:color="CFE3DF" w:sz="4"/>
               <w:left w:val="single" w:color="CFE3DF" w:sz="4"/>
@@ -40286,7 +40286,7 @@
         </w:tc>
         <w:tc>
           <w:tcPr>
-            <w:tcW w:type="dxa" w:w="3120"/>
+            <w:tcW w:type="dxa" w:w="4660"/>
             <w:tcBorders>
               <w:top w:val="single" w:color="CFE3DF" w:sz="4"/>
               <w:left w:val="single" w:color="CFE3DF" w:sz="4"/>
@@ -40319,7 +40319,7 @@
         </w:tc>
         <w:tc>
           <w:tcPr>
-            <w:tcW w:type="dxa" w:w="3120"/>
+            <w:tcW w:type="dxa" w:w="2700"/>
             <w:tcBorders>
               <w:top w:val="single" w:color="CFE3DF" w:sz="4"/>
               <w:left w:val="single" w:color="CFE3DF" w:sz="4"/>
@@ -40358,7 +40358,7 @@
         </w:trPr>
         <w:tc>
           <w:tcPr>
-            <w:tcW w:type="dxa" w:w="3120"/>
+            <w:tcW w:type="dxa" w:w="2000"/>
             <w:tcBorders>
               <w:top w:val="single" w:color="CFE3DF" w:sz="4"/>
               <w:left w:val="single" w:color="CFE3DF" w:sz="4"/>
@@ -40389,7 +40389,7 @@
         </w:tc>
         <w:tc>
           <w:tcPr>
-            <w:tcW w:type="dxa" w:w="3120"/>
+            <w:tcW w:type="dxa" w:w="4660"/>
             <w:tcBorders>
               <w:top w:val="single" w:color="CFE3DF" w:sz="4"/>
               <w:left w:val="single" w:color="CFE3DF" w:sz="4"/>
@@ -40420,7 +40420,7 @@
         </w:tc>
         <w:tc>
           <w:tcPr>
-            <w:tcW w:type="dxa" w:w="3120"/>
+            <w:tcW w:type="dxa" w:w="2700"/>
             <w:tcBorders>
               <w:top w:val="single" w:color="CFE3DF" w:sz="4"/>
               <w:left w:val="single" w:color="CFE3DF" w:sz="4"/>
@@ -41251,9 +41251,9 @@
         </w:tblBorders>
       </w:tblPr>
       <w:tblGrid>
-        <w:gridCol w:w="3120"/>
-        <w:gridCol w:w="3120"/>
-        <w:gridCol w:w="3120"/>
+        <w:gridCol w:w="2000"/>
+        <w:gridCol w:w="4660"/>
+        <w:gridCol w:w="2700"/>
       </w:tblGrid>
       <w:tr>
         <w:trPr>
@@ -41262,7 +41262,7 @@
         </w:trPr>
         <w:tc>
           <w:tcPr>
-            <w:tcW w:type="dxa" w:w="3120"/>
+            <w:tcW w:type="dxa" w:w="2000"/>
             <w:tcBorders>
               <w:top w:val="single" w:color="CFE3DF" w:sz="4"/>
               <w:left w:val="single" w:color="CFE3DF" w:sz="4"/>
@@ -41295,7 +41295,7 @@
         </w:tc>
         <w:tc>
           <w:tcPr>
-            <w:tcW w:type="dxa" w:w="3120"/>
+            <w:tcW w:type="dxa" w:w="4660"/>
             <w:tcBorders>
               <w:top w:val="single" w:color="CFE3DF" w:sz="4"/>
               <w:left w:val="single" w:color="CFE3DF" w:sz="4"/>
@@ -41328,7 +41328,7 @@
         </w:tc>
         <w:tc>
           <w:tcPr>
-            <w:tcW w:type="dxa" w:w="3120"/>
+            <w:tcW w:type="dxa" w:w="2700"/>
             <w:tcBorders>
               <w:top w:val="single" w:color="CFE3DF" w:sz="4"/>
               <w:left w:val="single" w:color="CFE3DF" w:sz="4"/>
@@ -41367,7 +41367,7 @@
         </w:trPr>
         <w:tc>
           <w:tcPr>
-            <w:tcW w:type="dxa" w:w="3120"/>
+            <w:tcW w:type="dxa" w:w="2000"/>
             <w:tcBorders>
               <w:top w:val="single" w:color="CFE3DF" w:sz="4"/>
               <w:left w:val="single" w:color="CFE3DF" w:sz="4"/>
@@ -41398,7 +41398,7 @@
         </w:tc>
         <w:tc>
           <w:tcPr>
-            <w:tcW w:type="dxa" w:w="3120"/>
+            <w:tcW w:type="dxa" w:w="4660"/>
             <w:tcBorders>
               <w:top w:val="single" w:color="CFE3DF" w:sz="4"/>
               <w:left w:val="single" w:color="CFE3DF" w:sz="4"/>
@@ -41429,7 +41429,7 @@
         </w:tc>
         <w:tc>
           <w:tcPr>
-            <w:tcW w:type="dxa" w:w="3120"/>
+            <w:tcW w:type="dxa" w:w="2700"/>
             <w:tcBorders>
               <w:top w:val="single" w:color="CFE3DF" w:sz="4"/>
               <w:left w:val="single" w:color="CFE3DF" w:sz="4"/>
@@ -41995,9 +41995,9 @@
         </w:tblBorders>
       </w:tblPr>
       <w:tblGrid>
-        <w:gridCol w:w="3120"/>
-        <w:gridCol w:w="3120"/>
-        <w:gridCol w:w="3120"/>
+        <w:gridCol w:w="2000"/>
+        <w:gridCol w:w="4660"/>
+        <w:gridCol w:w="2700"/>
       </w:tblGrid>
       <w:tr>
         <w:trPr>
@@ -42006,7 +42006,7 @@
         </w:trPr>
         <w:tc>
           <w:tcPr>
-            <w:tcW w:type="dxa" w:w="3120"/>
+            <w:tcW w:type="dxa" w:w="2000"/>
             <w:tcBorders>
               <w:top w:val="single" w:color="CFE3DF" w:sz="4"/>
               <w:left w:val="single" w:color="CFE3DF" w:sz="4"/>
@@ -42039,7 +42039,7 @@
         </w:tc>
         <w:tc>
           <w:tcPr>
-            <w:tcW w:type="dxa" w:w="3120"/>
+            <w:tcW w:type="dxa" w:w="4660"/>
             <w:tcBorders>
               <w:top w:val="single" w:color="CFE3DF" w:sz="4"/>
               <w:left w:val="single" w:color="CFE3DF" w:sz="4"/>
@@ -42072,7 +42072,7 @@
         </w:tc>
         <w:tc>
           <w:tcPr>
-            <w:tcW w:type="dxa" w:w="3120"/>
+            <w:tcW w:type="dxa" w:w="2700"/>
             <w:tcBorders>
               <w:top w:val="single" w:color="CFE3DF" w:sz="4"/>
               <w:left w:val="single" w:color="CFE3DF" w:sz="4"/>
@@ -42111,7 +42111,7 @@
         </w:trPr>
         <w:tc>
           <w:tcPr>
-            <w:tcW w:type="dxa" w:w="3120"/>
+            <w:tcW w:type="dxa" w:w="2000"/>
             <w:tcBorders>
               <w:top w:val="single" w:color="CFE3DF" w:sz="4"/>
               <w:left w:val="single" w:color="CFE3DF" w:sz="4"/>
@@ -42142,7 +42142,7 @@
         </w:tc>
         <w:tc>
           <w:tcPr>
-            <w:tcW w:type="dxa" w:w="3120"/>
+            <w:tcW w:type="dxa" w:w="4660"/>
             <w:tcBorders>
               <w:top w:val="single" w:color="CFE3DF" w:sz="4"/>
               <w:left w:val="single" w:color="CFE3DF" w:sz="4"/>
@@ -42173,7 +42173,7 @@
         </w:tc>
         <w:tc>
           <w:tcPr>
-            <w:tcW w:type="dxa" w:w="3120"/>
+            <w:tcW w:type="dxa" w:w="2700"/>
             <w:tcBorders>
               <w:top w:val="single" w:color="CFE3DF" w:sz="4"/>
               <w:left w:val="single" w:color="CFE3DF" w:sz="4"/>
@@ -42724,9 +42724,9 @@
         </w:tblBorders>
       </w:tblPr>
       <w:tblGrid>
-        <w:gridCol w:w="3120"/>
-        <w:gridCol w:w="3120"/>
-        <w:gridCol w:w="3120"/>
+        <w:gridCol w:w="2000"/>
+        <w:gridCol w:w="4660"/>
+        <w:gridCol w:w="2700"/>
       </w:tblGrid>
       <w:tr>
         <w:trPr>
@@ -42735,7 +42735,7 @@
         </w:trPr>
         <w:tc>
           <w:tcPr>
-            <w:tcW w:type="dxa" w:w="3120"/>
+            <w:tcW w:type="dxa" w:w="2000"/>
             <w:tcBorders>
               <w:top w:val="single" w:color="CFE3DF" w:sz="4"/>
               <w:left w:val="single" w:color="CFE3DF" w:sz="4"/>
@@ -42768,7 +42768,7 @@
         </w:tc>
         <w:tc>
           <w:tcPr>
-            <w:tcW w:type="dxa" w:w="3120"/>
+            <w:tcW w:type="dxa" w:w="4660"/>
             <w:tcBorders>
               <w:top w:val="single" w:color="CFE3DF" w:sz="4"/>
               <w:left w:val="single" w:color="CFE3DF" w:sz="4"/>
@@ -42801,7 +42801,7 @@
         </w:tc>
         <w:tc>
           <w:tcPr>
-            <w:tcW w:type="dxa" w:w="3120"/>
+            <w:tcW w:type="dxa" w:w="2700"/>
             <w:tcBorders>
               <w:top w:val="single" w:color="CFE3DF" w:sz="4"/>
               <w:left w:val="single" w:color="CFE3DF" w:sz="4"/>
@@ -42840,7 +42840,7 @@
         </w:trPr>
         <w:tc>
           <w:tcPr>
-            <w:tcW w:type="dxa" w:w="3120"/>
+            <w:tcW w:type="dxa" w:w="2000"/>
             <w:tcBorders>
               <w:top w:val="single" w:color="CFE3DF" w:sz="4"/>
               <w:left w:val="single" w:color="CFE3DF" w:sz="4"/>
@@ -42871,7 +42871,7 @@
         </w:tc>
         <w:tc>
           <w:tcPr>
-            <w:tcW w:type="dxa" w:w="3120"/>
+            <w:tcW w:type="dxa" w:w="4660"/>
             <w:tcBorders>
               <w:top w:val="single" w:color="CFE3DF" w:sz="4"/>
               <w:left w:val="single" w:color="CFE3DF" w:sz="4"/>
@@ -42902,7 +42902,7 @@
         </w:tc>
         <w:tc>
           <w:tcPr>
-            <w:tcW w:type="dxa" w:w="3120"/>
+            <w:tcW w:type="dxa" w:w="2700"/>
             <w:tcBorders>
               <w:top w:val="single" w:color="CFE3DF" w:sz="4"/>
               <w:left w:val="single" w:color="CFE3DF" w:sz="4"/>

</xml_diff>

<commit_message>
Workbook: consolidate 'How to Use' intro (Thom's COC copy) + darken cream boxes
- Replace the How-to-Use + Certificate-of-Completion blocks with Thom's single
  consolidated intro (bulleted list + closing verification paragraph)
- Add bullet support to bodyPara
- Darken answer-box cream FCFBF7 -> F2ECDC so it's clearly distinguishable from
  the white page (per Thom's accessibility note)

Co-Authored-By: Claude Opus 4.8 (1M context) <noreply@anthropic.com>
</commit_message>
<xml_diff>
--- a/.local-workbook/The Compassion Course 2026-2027 Workbook.docx
+++ b/.local-workbook/The Compassion Course 2026-2027 Workbook.docx
@@ -229,7 +229,7 @@
               <w:bottom w:val="single" w:color="CFE3DF" w:sz="4"/>
               <w:right w:val="single" w:color="CFE3DF" w:sz="4"/>
             </w:tcBorders>
-            <w:shd w:fill="FCFBF7" w:val="clear"/>
+            <w:shd w:fill="F2ECDC" w:val="clear"/>
             <w:tcMar>
               <w:top w:type="dxa" w:w="40"/>
               <w:left w:type="dxa" w:w="110"/>
@@ -299,7 +299,7 @@
               <w:bottom w:val="single" w:color="CFE3DF" w:sz="4"/>
               <w:right w:val="single" w:color="CFE3DF" w:sz="4"/>
             </w:tcBorders>
-            <w:shd w:fill="FCFBF7" w:val="clear"/>
+            <w:shd w:fill="F2ECDC" w:val="clear"/>
             <w:tcMar>
               <w:top w:type="dxa" w:w="40"/>
               <w:left w:type="dxa" w:w="110"/>
@@ -369,7 +369,7 @@
               <w:bottom w:val="single" w:color="CFE3DF" w:sz="4"/>
               <w:right w:val="single" w:color="CFE3DF" w:sz="4"/>
             </w:tcBorders>
-            <w:shd w:fill="FCFBF7" w:val="clear"/>
+            <w:shd w:fill="F2ECDC" w:val="clear"/>
             <w:tcMar>
               <w:top w:type="dxa" w:w="40"/>
               <w:left w:type="dxa" w:w="110"/>
@@ -405,6 +405,27 @@
     <w:p>
       <w:pPr>
         <w:keepLines/>
+        <w:spacing w:after="90" w:before="0" w:line="276" w:lineRule="auto"/>
+      </w:pPr>
+      <w:r>
+        <w:rPr>
+          <w:i w:val="false"/>
+          <w:iCs w:val="false"/>
+          <w:color w:val="2D2D2D"/>
+          <w:sz w:val="20"/>
+          <w:szCs w:val="20"/>
+        </w:rPr>
+        <w:t xml:space="preserve">This is your own private copy of The Compassion Course Certificate of Completion (COC) workbook. Use it to record and track your weekly progress through the course:</w:t>
+      </w:r>
+    </w:p>
+    <w:p>
+      <w:pPr>
+        <w:pStyle w:val="ListParagraph"/>
+        <w:keepLines/>
+        <w:numPr>
+          <w:ilvl w:val="0"/>
+          <w:numId w:val="1"/>
+        </w:numPr>
         <w:spacing w:after="60" w:before="0" w:line="276" w:lineRule="auto"/>
       </w:pPr>
       <w:r>
@@ -415,12 +436,17 @@
           <w:sz w:val="20"/>
           <w:szCs w:val="20"/>
         </w:rPr>
-        <w:t xml:space="preserve">This is your own private copy of The Compassion Course workbook, opened from the personal link we send you — there is nothing to download, install, or back up. Your writing saves automatically as you go, and every shaded box grows to fit whatever you type.</w:t>
-      </w:r>
-    </w:p>
-    <w:p>
-      <w:pPr>
+        <w:t xml:space="preserve">There is nothing to download, install, or back up.</w:t>
+      </w:r>
+    </w:p>
+    <w:p>
+      <w:pPr>
+        <w:pStyle w:val="ListParagraph"/>
         <w:keepLines/>
+        <w:numPr>
+          <w:ilvl w:val="0"/>
+          <w:numId w:val="1"/>
+        </w:numPr>
         <w:spacing w:after="60" w:before="0" w:line="276" w:lineRule="auto"/>
       </w:pPr>
       <w:r>
@@ -431,21 +457,17 @@
           <w:sz w:val="20"/>
           <w:szCs w:val="20"/>
         </w:rPr>
-        <w:t xml:space="preserve">Please write only inside the cream-colored boxes. Everything else on the page is the course’s material; keeping your responses in the boxes is what lets us find and confirm your work at the end of the year.</w:t>
-      </w:r>
-    </w:p>
-    <w:p>
-      <w:pPr>
-        <w:pStyle w:val="Heading2"/>
-        <w:spacing w:after="60" w:before="200"/>
-      </w:pPr>
-      <w:r>
-        <w:t xml:space="preserve">Certificate of Completion (COC)</w:t>
-      </w:r>
-    </w:p>
-    <w:p>
-      <w:pPr>
+        <w:t xml:space="preserve">Please write only inside the cream-colored boxes.</w:t>
+      </w:r>
+    </w:p>
+    <w:p>
+      <w:pPr>
+        <w:pStyle w:val="ListParagraph"/>
         <w:keepLines/>
+        <w:numPr>
+          <w:ilvl w:val="0"/>
+          <w:numId w:val="1"/>
+        </w:numPr>
         <w:spacing w:after="60" w:before="0" w:line="276" w:lineRule="auto"/>
       </w:pPr>
       <w:r>
@@ -456,12 +478,17 @@
           <w:sz w:val="20"/>
           <w:szCs w:val="20"/>
         </w:rPr>
-        <w:t xml:space="preserve">Use this workbook to record and track your weekly progress through the course.</w:t>
-      </w:r>
-    </w:p>
-    <w:p>
-      <w:pPr>
+        <w:t xml:space="preserve">Your writing saves automatically as you go, and every cream-colored box grows to fit whatever you type.</w:t>
+      </w:r>
+    </w:p>
+    <w:p>
+      <w:pPr>
+        <w:pStyle w:val="ListParagraph"/>
         <w:keepLines/>
+        <w:numPr>
+          <w:ilvl w:val="0"/>
+          <w:numId w:val="1"/>
+        </w:numPr>
         <w:spacing w:after="60" w:before="0" w:line="276" w:lineRule="auto"/>
       </w:pPr>
       <w:r>
@@ -472,12 +499,17 @@
           <w:sz w:val="20"/>
           <w:szCs w:val="20"/>
         </w:rPr>
-        <w:t xml:space="preserve">We will email you weekly reminders and helpful hints to keep you on track.</w:t>
-      </w:r>
-    </w:p>
-    <w:p>
-      <w:pPr>
+        <w:t xml:space="preserve">Everything else on the page is the course’s material; keeping your responses in the cream-colored boxes is what lets us find and confirm your work at the end of the year.</w:t>
+      </w:r>
+    </w:p>
+    <w:p>
+      <w:pPr>
+        <w:pStyle w:val="ListParagraph"/>
         <w:keepLines/>
+        <w:numPr>
+          <w:ilvl w:val="0"/>
+          <w:numId w:val="1"/>
+        </w:numPr>
         <w:spacing w:after="60" w:before="0" w:line="276" w:lineRule="auto"/>
       </w:pPr>
       <w:r>
@@ -488,39 +520,23 @@
           <w:sz w:val="20"/>
           <w:szCs w:val="20"/>
         </w:rPr>
-        <w:t xml:space="preserve">If you registered for the Certificate of Completion, please fill out every prompt.</w:t>
+        <w:t xml:space="preserve">Please fill out every prompt.</w:t>
       </w:r>
     </w:p>
     <w:p>
       <w:pPr>
         <w:keepLines/>
-        <w:spacing w:after="60" w:before="0" w:line="276" w:lineRule="auto"/>
-      </w:pPr>
-      <w:r>
-        <w:rPr>
-          <w:i w:val="false"/>
-          <w:iCs w:val="false"/>
-          <w:color w:val="2D2D2D"/>
-          <w:sz w:val="20"/>
-          <w:szCs w:val="20"/>
-        </w:rPr>
-        <w:t xml:space="preserve">At the end of the course year, a Compassion Course faculty member will confidentially confirm that you completed your work. This is a completion check — it does not include mentoring or feedback.</w:t>
-      </w:r>
-    </w:p>
-    <w:p>
-      <w:pPr>
-        <w:keepLines/>
-        <w:spacing w:after="60" w:before="0" w:line="276" w:lineRule="auto"/>
-      </w:pPr>
-      <w:r>
-        <w:rPr>
-          <w:i w:val="false"/>
-          <w:iCs w:val="false"/>
-          <w:color w:val="2D2D2D"/>
-          <w:sz w:val="20"/>
-          <w:szCs w:val="20"/>
-        </w:rPr>
-        <w:t xml:space="preserve">Completing your workbook is part of qualifying to become a Mentor the following year.</w:t>
+        <w:spacing w:after="60" w:before="120" w:line="276" w:lineRule="auto"/>
+      </w:pPr>
+      <w:r>
+        <w:rPr>
+          <w:i w:val="false"/>
+          <w:iCs w:val="false"/>
+          <w:color w:val="2D2D2D"/>
+          <w:sz w:val="20"/>
+          <w:szCs w:val="20"/>
+        </w:rPr>
+        <w:t xml:space="preserve">We will email you weekly reminders and helpful hints to keep you on track. At the end of the course year, a Compassion Course faculty member will confidentially confirm that you completed your work. This is a completion verification — it does not include mentoring or feedback.</w:t>
       </w:r>
     </w:p>
     <w:p>
@@ -579,7 +595,7 @@
         </w:rPr>
         <w:t xml:space="preserve">Keep a small journal with you throughout the day. Make 1 to 5 entries per day that include the description of an act or words spoken by someone and what need you imagine they were trying to meet. It is SUPER important to limit the words you use to those on the </w:t>
       </w:r>
-      <w:hyperlink w:history="1" r:id="rIdk_bpn0tfp-itwr7b-4yvb">
+      <w:hyperlink w:history="1" r:id="rIdjjviwinqc-bngzcp_fzhh">
         <w:r>
           <w:rPr>
             <w:color w:val="1155CC"/>
@@ -669,7 +685,7 @@
               <w:bottom w:val="single" w:color="CFE3DF" w:sz="4"/>
               <w:right w:val="single" w:color="CFE3DF" w:sz="4"/>
             </w:tcBorders>
-            <w:shd w:fill="FCFBF7" w:val="clear"/>
+            <w:shd w:fill="F2ECDC" w:val="clear"/>
             <w:tcMar>
               <w:top w:type="dxa" w:w="70"/>
               <w:left w:type="dxa" w:w="110"/>
@@ -721,7 +737,7 @@
         </w:rPr>
         <w:t xml:space="preserve">Think of someone who is close to you who is doing or saying something you don't like. See if you can figure out what need they are attempting to fulfill. Again, it is really important to limit the words you use to those on the </w:t>
       </w:r>
-      <w:hyperlink w:history="1" r:id="rIdgwwawmosqv5n8esxsfqzh">
+      <w:hyperlink w:history="1" r:id="rIddctavoef4kryzx4vthm6s">
         <w:r>
           <w:rPr>
             <w:color w:val="1155CC"/>
@@ -811,7 +827,7 @@
               <w:bottom w:val="single" w:color="CFE3DF" w:sz="4"/>
               <w:right w:val="single" w:color="CFE3DF" w:sz="4"/>
             </w:tcBorders>
-            <w:shd w:fill="FCFBF7" w:val="clear"/>
+            <w:shd w:fill="F2ECDC" w:val="clear"/>
             <w:tcMar>
               <w:top w:type="dxa" w:w="70"/>
               <w:left w:type="dxa" w:w="110"/>
@@ -948,7 +964,7 @@
               <w:bottom w:val="single" w:color="CFE3DF" w:sz="4"/>
               <w:right w:val="single" w:color="CFE3DF" w:sz="4"/>
             </w:tcBorders>
-            <w:shd w:fill="FCFBF7" w:val="clear"/>
+            <w:shd w:fill="F2ECDC" w:val="clear"/>
             <w:tcMar>
               <w:top w:type="dxa" w:w="70"/>
               <w:left w:type="dxa" w:w="110"/>
@@ -1016,7 +1032,7 @@
         </w:rPr>
         <w:t xml:space="preserve">Extended registration lasts for one week. To let someone know about the course you can use the following link: </w:t>
       </w:r>
-      <w:hyperlink w:history="1" r:id="rIdgszycgribjimceawahe-g">
+      <w:hyperlink w:history="1" r:id="rIdmynrnvug6oioy4bni1-7i">
         <w:r>
           <w:rPr>
             <w:color w:val="1155CC"/>
@@ -1106,7 +1122,7 @@
               <w:bottom w:val="single" w:color="CFE3DF" w:sz="4"/>
               <w:right w:val="single" w:color="CFE3DF" w:sz="4"/>
             </w:tcBorders>
-            <w:shd w:fill="FCFBF7" w:val="clear"/>
+            <w:shd w:fill="F2ECDC" w:val="clear"/>
             <w:tcMar>
               <w:top w:type="dxa" w:w="70"/>
               <w:left w:type="dxa" w:w="110"/>
@@ -1276,7 +1292,7 @@
               <w:bottom w:val="single" w:color="CFE3DF" w:sz="4"/>
               <w:right w:val="single" w:color="CFE3DF" w:sz="4"/>
             </w:tcBorders>
-            <w:shd w:fill="FCFBF7" w:val="clear"/>
+            <w:shd w:fill="F2ECDC" w:val="clear"/>
             <w:tcMar>
               <w:top w:type="dxa" w:w="70"/>
               <w:left w:type="dxa" w:w="110"/>
@@ -1307,7 +1323,7 @@
               <w:bottom w:val="single" w:color="CFE3DF" w:sz="4"/>
               <w:right w:val="single" w:color="CFE3DF" w:sz="4"/>
             </w:tcBorders>
-            <w:shd w:fill="FCFBF7" w:val="clear"/>
+            <w:shd w:fill="F2ECDC" w:val="clear"/>
             <w:tcMar>
               <w:top w:type="dxa" w:w="70"/>
               <w:left w:type="dxa" w:w="110"/>
@@ -1338,7 +1354,7 @@
               <w:bottom w:val="single" w:color="CFE3DF" w:sz="4"/>
               <w:right w:val="single" w:color="CFE3DF" w:sz="4"/>
             </w:tcBorders>
-            <w:shd w:fill="FCFBF7" w:val="clear"/>
+            <w:shd w:fill="F2ECDC" w:val="clear"/>
             <w:tcMar>
               <w:top w:type="dxa" w:w="70"/>
               <w:left w:type="dxa" w:w="110"/>
@@ -1418,7 +1434,7 @@
         </w:rPr>
         <w:t xml:space="preserve">Keep a small journal with you throughout the day. Make 1 to 5 entries per day that include judgment words you said or were thinking of saying. Later on, when you have time, sit down with the </w:t>
       </w:r>
-      <w:hyperlink w:history="1" r:id="rIdjipg9nv15aspajdtgghxx">
+      <w:hyperlink w:history="1" r:id="rIdo40z2djquu14vjf6zv9qi">
         <w:r>
           <w:rPr>
             <w:color w:val="1155CC"/>
@@ -1439,7 +1455,7 @@
         </w:rPr>
         <w:t xml:space="preserve"> and see if you can figure out what need of yours the judgment was (or is) related to. Remember, to successfully complete this exercise, limit the words you use to those on the </w:t>
       </w:r>
-      <w:hyperlink w:history="1" r:id="rIdws6jvuoktmcch2houcfsr">
+      <w:hyperlink w:history="1" r:id="rIdwlqw8eyxudhckti6edsld">
         <w:r>
           <w:rPr>
             <w:color w:val="1155CC"/>
@@ -1529,7 +1545,7 @@
               <w:bottom w:val="single" w:color="CFE3DF" w:sz="4"/>
               <w:right w:val="single" w:color="CFE3DF" w:sz="4"/>
             </w:tcBorders>
-            <w:shd w:fill="FCFBF7" w:val="clear"/>
+            <w:shd w:fill="F2ECDC" w:val="clear"/>
             <w:tcMar>
               <w:top w:type="dxa" w:w="70"/>
               <w:left w:type="dxa" w:w="110"/>
@@ -1581,7 +1597,7 @@
         </w:rPr>
         <w:t xml:space="preserve">Keep a small journal with you throughout the day. It could be a little book, a folded piece of paper or a napkin -anything you can write on. Make 1 to 5 entries per day that include judgment words spoken by someone. Later on, when you have time, sit down with the </w:t>
       </w:r>
-      <w:hyperlink w:history="1" r:id="rIdymhvrrv9ahthq6zut0m7u">
+      <w:hyperlink w:history="1" r:id="rIdlotrbjwnctpsax5a4zgvk">
         <w:r>
           <w:rPr>
             <w:color w:val="1155CC"/>
@@ -1602,7 +1618,7 @@
         </w:rPr>
         <w:t xml:space="preserve"> and see if you can figure out what need was unmet for them. Remember to limit the words you use to those on the </w:t>
       </w:r>
-      <w:hyperlink w:history="1" r:id="rIdu1als90l_xhnsrq399xqb">
+      <w:hyperlink w:history="1" r:id="rIdw4mvdo213dn3lrckxfjnu">
         <w:r>
           <w:rPr>
             <w:color w:val="1155CC"/>
@@ -1692,7 +1708,7 @@
               <w:bottom w:val="single" w:color="CFE3DF" w:sz="4"/>
               <w:right w:val="single" w:color="CFE3DF" w:sz="4"/>
             </w:tcBorders>
-            <w:shd w:fill="FCFBF7" w:val="clear"/>
+            <w:shd w:fill="F2ECDC" w:val="clear"/>
             <w:tcMar>
               <w:top w:type="dxa" w:w="70"/>
               <w:left w:type="dxa" w:w="110"/>
@@ -1813,7 +1829,7 @@
               <w:bottom w:val="single" w:color="CFE3DF" w:sz="4"/>
               <w:right w:val="single" w:color="CFE3DF" w:sz="4"/>
             </w:tcBorders>
-            <w:shd w:fill="FCFBF7" w:val="clear"/>
+            <w:shd w:fill="F2ECDC" w:val="clear"/>
             <w:tcMar>
               <w:top w:type="dxa" w:w="70"/>
               <w:left w:type="dxa" w:w="110"/>
@@ -1983,7 +1999,7 @@
               <w:bottom w:val="single" w:color="CFE3DF" w:sz="4"/>
               <w:right w:val="single" w:color="CFE3DF" w:sz="4"/>
             </w:tcBorders>
-            <w:shd w:fill="FCFBF7" w:val="clear"/>
+            <w:shd w:fill="F2ECDC" w:val="clear"/>
             <w:tcMar>
               <w:top w:type="dxa" w:w="70"/>
               <w:left w:type="dxa" w:w="110"/>
@@ -2014,7 +2030,7 @@
               <w:bottom w:val="single" w:color="CFE3DF" w:sz="4"/>
               <w:right w:val="single" w:color="CFE3DF" w:sz="4"/>
             </w:tcBorders>
-            <w:shd w:fill="FCFBF7" w:val="clear"/>
+            <w:shd w:fill="F2ECDC" w:val="clear"/>
             <w:tcMar>
               <w:top w:type="dxa" w:w="70"/>
               <w:left w:type="dxa" w:w="110"/>
@@ -2045,7 +2061,7 @@
               <w:bottom w:val="single" w:color="CFE3DF" w:sz="4"/>
               <w:right w:val="single" w:color="CFE3DF" w:sz="4"/>
             </w:tcBorders>
-            <w:shd w:fill="FCFBF7" w:val="clear"/>
+            <w:shd w:fill="F2ECDC" w:val="clear"/>
             <w:tcMar>
               <w:top w:type="dxa" w:w="70"/>
               <w:left w:type="dxa" w:w="110"/>
@@ -2141,7 +2157,7 @@
         </w:rPr>
         <w:t xml:space="preserve">Later on, when you have time, sit down with the </w:t>
       </w:r>
-      <w:hyperlink w:history="1" r:id="rIdngjbfockabkoszsxhchfi">
+      <w:hyperlink w:history="1" r:id="rIdqwb29boick7gvinvxv7ie">
         <w:r>
           <w:rPr>
             <w:color w:val="1155CC"/>
@@ -2198,7 +2214,7 @@
         </w:rPr>
         <w:t xml:space="preserve"> at the top of the </w:t>
       </w:r>
-      <w:hyperlink w:history="1" r:id="rIdwacosk-1xtpy_xlkravrz">
+      <w:hyperlink w:history="1" r:id="rId4p7kzamjtylfgrrt6uczk">
         <w:r>
           <w:rPr>
             <w:color w:val="1155CC"/>
@@ -2235,7 +2251,7 @@
         </w:rPr>
         <w:t xml:space="preserve">Then look at the </w:t>
       </w:r>
-      <w:hyperlink w:history="1" r:id="rIdsags5d_9puuqjrpjhmohp">
+      <w:hyperlink w:history="1" r:id="rIdg2-dkblxy0hde85h9bn80">
         <w:r>
           <w:rPr>
             <w:color w:val="1155CC"/>
@@ -2256,7 +2272,7 @@
         </w:rPr>
         <w:t xml:space="preserve"> and see if you can figure out what need your feeling was about. Remember, it's VERY helpful to limit the words you use to those on the </w:t>
       </w:r>
-      <w:hyperlink w:history="1" r:id="rId-i-p_dl_-v0jhzzgu2sb9">
+      <w:hyperlink w:history="1" r:id="rIdf3miwvo5qvx7pze1sp1tk">
         <w:r>
           <w:rPr>
             <w:color w:val="1155CC"/>
@@ -2346,7 +2362,7 @@
               <w:bottom w:val="single" w:color="CFE3DF" w:sz="4"/>
               <w:right w:val="single" w:color="CFE3DF" w:sz="4"/>
             </w:tcBorders>
-            <w:shd w:fill="FCFBF7" w:val="clear"/>
+            <w:shd w:fill="F2ECDC" w:val="clear"/>
             <w:tcMar>
               <w:top w:type="dxa" w:w="70"/>
               <w:left w:type="dxa" w:w="110"/>
@@ -2398,7 +2414,7 @@
         </w:rPr>
         <w:t xml:space="preserve">Keep a small journal with you throughout the day. Make 2 to 4 entries per day that include something you did, said or were thinking of saying and the feeling (or feelings) you experienced at that moment. Again, later on, when you have time, sit down with the </w:t>
       </w:r>
-      <w:hyperlink w:history="1" r:id="rIdiafuy0cuz6orx2auxhfan">
+      <w:hyperlink w:history="1" r:id="rId9edtihwatyvedg6rl4jxr">
         <w:r>
           <w:rPr>
             <w:color w:val="1155CC"/>
@@ -2455,7 +2471,7 @@
         </w:rPr>
         <w:t xml:space="preserve"> at the top of the </w:t>
       </w:r>
-      <w:hyperlink w:history="1" r:id="rId6nmljbuahfp9frqps33rk">
+      <w:hyperlink w:history="1" r:id="rIdzsg5uefd9ddjt-szuf2nb">
         <w:r>
           <w:rPr>
             <w:color w:val="1155CC"/>
@@ -2492,7 +2508,7 @@
         </w:rPr>
         <w:t xml:space="preserve">Then look at the </w:t>
       </w:r>
-      <w:hyperlink w:history="1" r:id="rId9iyz-dlmgt-n5qevhd2sv">
+      <w:hyperlink w:history="1" r:id="rIdaissebohgbnjy_zgc92ra">
         <w:r>
           <w:rPr>
             <w:color w:val="1155CC"/>
@@ -2513,7 +2529,7 @@
         </w:rPr>
         <w:t xml:space="preserve"> and see if you can figure out what need your feeling was about. Remember, here too, it's VERY important to limit the words you use to those on the </w:t>
       </w:r>
-      <w:hyperlink w:history="1" r:id="rIdvorwi3ukoqmoiwtqrokqf">
+      <w:hyperlink w:history="1" r:id="rIdlavutcexeipgu-dzpfk6i">
         <w:r>
           <w:rPr>
             <w:color w:val="1155CC"/>
@@ -2603,7 +2619,7 @@
               <w:bottom w:val="single" w:color="CFE3DF" w:sz="4"/>
               <w:right w:val="single" w:color="CFE3DF" w:sz="4"/>
             </w:tcBorders>
-            <w:shd w:fill="FCFBF7" w:val="clear"/>
+            <w:shd w:fill="F2ECDC" w:val="clear"/>
             <w:tcMar>
               <w:top w:type="dxa" w:w="70"/>
               <w:left w:type="dxa" w:w="110"/>
@@ -2773,7 +2789,7 @@
               <w:bottom w:val="single" w:color="CFE3DF" w:sz="4"/>
               <w:right w:val="single" w:color="CFE3DF" w:sz="4"/>
             </w:tcBorders>
-            <w:shd w:fill="FCFBF7" w:val="clear"/>
+            <w:shd w:fill="F2ECDC" w:val="clear"/>
             <w:tcMar>
               <w:top w:type="dxa" w:w="70"/>
               <w:left w:type="dxa" w:w="110"/>
@@ -2804,7 +2820,7 @@
               <w:bottom w:val="single" w:color="CFE3DF" w:sz="4"/>
               <w:right w:val="single" w:color="CFE3DF" w:sz="4"/>
             </w:tcBorders>
-            <w:shd w:fill="FCFBF7" w:val="clear"/>
+            <w:shd w:fill="F2ECDC" w:val="clear"/>
             <w:tcMar>
               <w:top w:type="dxa" w:w="70"/>
               <w:left w:type="dxa" w:w="110"/>
@@ -2835,7 +2851,7 @@
               <w:bottom w:val="single" w:color="CFE3DF" w:sz="4"/>
               <w:right w:val="single" w:color="CFE3DF" w:sz="4"/>
             </w:tcBorders>
-            <w:shd w:fill="FCFBF7" w:val="clear"/>
+            <w:shd w:fill="F2ECDC" w:val="clear"/>
             <w:tcMar>
               <w:top w:type="dxa" w:w="70"/>
               <w:left w:type="dxa" w:w="110"/>
@@ -2899,7 +2915,7 @@
       <w:r>
         <w:t xml:space="preserve">Read the </w:t>
       </w:r>
-      <w:hyperlink w:history="1" r:id="rIdnahpykoukwc9lwzb6lgrh">
+      <w:hyperlink w:history="1" r:id="rIdcnoxj6ip02ivtp8mr4tzh">
         <w:r>
           <w:rPr>
             <w:color w:val="1155CC"/>
@@ -2996,7 +3012,7 @@
               <w:bottom w:val="single" w:color="CFE3DF" w:sz="4"/>
               <w:right w:val="single" w:color="CFE3DF" w:sz="4"/>
             </w:tcBorders>
-            <w:shd w:fill="FCFBF7" w:val="clear"/>
+            <w:shd w:fill="F2ECDC" w:val="clear"/>
             <w:tcMar>
               <w:top w:type="dxa" w:w="70"/>
               <w:left w:type="dxa" w:w="110"/>
@@ -3032,7 +3048,7 @@
       <w:r>
         <w:t xml:space="preserve">Print a copy of the </w:t>
       </w:r>
-      <w:hyperlink w:history="1" r:id="rIdnqhrfbxk6fdzgn2r60wqr">
+      <w:hyperlink w:history="1" r:id="rIdlxvrumud6ncv9cn9sgf_d">
         <w:r>
           <w:rPr>
             <w:color w:val="1155CC"/>
@@ -3145,7 +3161,7 @@
               <w:bottom w:val="single" w:color="CFE3DF" w:sz="4"/>
               <w:right w:val="single" w:color="CFE3DF" w:sz="4"/>
             </w:tcBorders>
-            <w:shd w:fill="FCFBF7" w:val="clear"/>
+            <w:shd w:fill="F2ECDC" w:val="clear"/>
             <w:tcMar>
               <w:top w:type="dxa" w:w="70"/>
               <w:left w:type="dxa" w:w="110"/>
@@ -3197,7 +3213,7 @@
         </w:rPr>
         <w:t xml:space="preserve">Keep a small journal with you throughout the day. Make 1 to 5 entries per day that include an act or words spoken by someone and what need(s) you imagine they were trying to meet. Remember, it's VERY helpful to limit the words you use to those on the </w:t>
       </w:r>
-      <w:hyperlink w:history="1" r:id="rIdaawiwc7_25ppsidblj1im">
+      <w:hyperlink w:history="1" r:id="rId80gopphywreouwt_hue15">
         <w:r>
           <w:rPr>
             <w:color w:val="1155CC"/>
@@ -3287,7 +3303,7 @@
               <w:bottom w:val="single" w:color="CFE3DF" w:sz="4"/>
               <w:right w:val="single" w:color="CFE3DF" w:sz="4"/>
             </w:tcBorders>
-            <w:shd w:fill="FCFBF7" w:val="clear"/>
+            <w:shd w:fill="F2ECDC" w:val="clear"/>
             <w:tcMar>
               <w:top w:type="dxa" w:w="70"/>
               <w:left w:type="dxa" w:w="110"/>
@@ -3339,7 +3355,7 @@
         </w:rPr>
         <w:t xml:space="preserve">Think of someone that you think is preventing you from getting a need(s) met. Write down the need(s) from the </w:t>
       </w:r>
-      <w:hyperlink w:history="1" r:id="rIdwjnjjtth-dsekcs-jiqls">
+      <w:hyperlink w:history="1" r:id="rIdmld4gvovnuclge8hw3ywf">
         <w:r>
           <w:rPr>
             <w:color w:val="1155CC"/>
@@ -3429,7 +3445,7 @@
               <w:bottom w:val="single" w:color="CFE3DF" w:sz="4"/>
               <w:right w:val="single" w:color="CFE3DF" w:sz="4"/>
             </w:tcBorders>
-            <w:shd w:fill="FCFBF7" w:val="clear"/>
+            <w:shd w:fill="F2ECDC" w:val="clear"/>
             <w:tcMar>
               <w:top w:type="dxa" w:w="70"/>
               <w:left w:type="dxa" w:w="110"/>
@@ -3599,7 +3615,7 @@
               <w:bottom w:val="single" w:color="CFE3DF" w:sz="4"/>
               <w:right w:val="single" w:color="CFE3DF" w:sz="4"/>
             </w:tcBorders>
-            <w:shd w:fill="FCFBF7" w:val="clear"/>
+            <w:shd w:fill="F2ECDC" w:val="clear"/>
             <w:tcMar>
               <w:top w:type="dxa" w:w="70"/>
               <w:left w:type="dxa" w:w="110"/>
@@ -3630,7 +3646,7 @@
               <w:bottom w:val="single" w:color="CFE3DF" w:sz="4"/>
               <w:right w:val="single" w:color="CFE3DF" w:sz="4"/>
             </w:tcBorders>
-            <w:shd w:fill="FCFBF7" w:val="clear"/>
+            <w:shd w:fill="F2ECDC" w:val="clear"/>
             <w:tcMar>
               <w:top w:type="dxa" w:w="70"/>
               <w:left w:type="dxa" w:w="110"/>
@@ -3661,7 +3677,7 @@
               <w:bottom w:val="single" w:color="CFE3DF" w:sz="4"/>
               <w:right w:val="single" w:color="CFE3DF" w:sz="4"/>
             </w:tcBorders>
-            <w:shd w:fill="FCFBF7" w:val="clear"/>
+            <w:shd w:fill="F2ECDC" w:val="clear"/>
             <w:tcMar>
               <w:top w:type="dxa" w:w="70"/>
               <w:left w:type="dxa" w:w="110"/>
@@ -3741,7 +3757,7 @@
         </w:rPr>
         <w:t xml:space="preserve">Visit: http://</w:t>
       </w:r>
-      <w:hyperlink w:history="1" r:id="rIddhcyqokquz4xjbmdgkk-h">
+      <w:hyperlink w:history="1" r:id="rId48rkyrrob1tpgmitgy5iv">
         <w:r>
           <w:rPr>
             <w:color w:val="1155CC"/>
@@ -3831,7 +3847,7 @@
               <w:bottom w:val="single" w:color="CFE3DF" w:sz="4"/>
               <w:right w:val="single" w:color="CFE3DF" w:sz="4"/>
             </w:tcBorders>
-            <w:shd w:fill="FCFBF7" w:val="clear"/>
+            <w:shd w:fill="F2ECDC" w:val="clear"/>
             <w:tcMar>
               <w:top w:type="dxa" w:w="70"/>
               <w:left w:type="dxa" w:w="110"/>
@@ -4017,7 +4033,7 @@
         <w:keepLines/>
         <w:spacing w:after="60" w:before="0" w:line="276" w:lineRule="auto"/>
       </w:pPr>
-      <w:hyperlink w:history="1" r:id="rIdhrzqwn4-yq3u5gq9qf8d7">
+      <w:hyperlink w:history="1" r:id="rIdwzn4yggy0tww1hj4nmu37">
         <w:r>
           <w:rPr>
             <w:color w:val="1155CC"/>
@@ -4097,7 +4113,7 @@
               <w:bottom w:val="single" w:color="CFE3DF" w:sz="4"/>
               <w:right w:val="single" w:color="CFE3DF" w:sz="4"/>
             </w:tcBorders>
-            <w:shd w:fill="FCFBF7" w:val="clear"/>
+            <w:shd w:fill="F2ECDC" w:val="clear"/>
             <w:tcMar>
               <w:top w:type="dxa" w:w="70"/>
               <w:left w:type="dxa" w:w="110"/>
@@ -4267,7 +4283,7 @@
               <w:bottom w:val="single" w:color="CFE3DF" w:sz="4"/>
               <w:right w:val="single" w:color="CFE3DF" w:sz="4"/>
             </w:tcBorders>
-            <w:shd w:fill="FCFBF7" w:val="clear"/>
+            <w:shd w:fill="F2ECDC" w:val="clear"/>
             <w:tcMar>
               <w:top w:type="dxa" w:w="70"/>
               <w:left w:type="dxa" w:w="110"/>
@@ -4298,7 +4314,7 @@
               <w:bottom w:val="single" w:color="CFE3DF" w:sz="4"/>
               <w:right w:val="single" w:color="CFE3DF" w:sz="4"/>
             </w:tcBorders>
-            <w:shd w:fill="FCFBF7" w:val="clear"/>
+            <w:shd w:fill="F2ECDC" w:val="clear"/>
             <w:tcMar>
               <w:top w:type="dxa" w:w="70"/>
               <w:left w:type="dxa" w:w="110"/>
@@ -4329,7 +4345,7 @@
               <w:bottom w:val="single" w:color="CFE3DF" w:sz="4"/>
               <w:right w:val="single" w:color="CFE3DF" w:sz="4"/>
             </w:tcBorders>
-            <w:shd w:fill="FCFBF7" w:val="clear"/>
+            <w:shd w:fill="F2ECDC" w:val="clear"/>
             <w:tcMar>
               <w:top w:type="dxa" w:w="70"/>
               <w:left w:type="dxa" w:w="110"/>
@@ -4409,7 +4425,7 @@
         </w:rPr>
         <w:t xml:space="preserve">Continue working with this exercise (</w:t>
       </w:r>
-      <w:hyperlink w:history="1" r:id="rIdl-1n-kwbcygzkvtl0bxhh">
+      <w:hyperlink w:history="1" r:id="rIda1fcn740d6kzd8ncp8wmt">
         <w:r>
           <w:rPr>
             <w:color w:val="1155CC"/>
@@ -4459,7 +4475,7 @@
               <w:bottom w:val="single" w:color="CFE3DF" w:sz="4"/>
               <w:right w:val="single" w:color="CFE3DF" w:sz="4"/>
             </w:tcBorders>
-            <w:shd w:fill="FCFBF7" w:val="clear"/>
+            <w:shd w:fill="F2ECDC" w:val="clear"/>
             <w:tcMar>
               <w:top w:type="dxa" w:w="100"/>
               <w:left w:type="dxa" w:w="130"/>
@@ -4628,7 +4644,7 @@
               <w:bottom w:val="single" w:color="CFE3DF" w:sz="4"/>
               <w:right w:val="single" w:color="CFE3DF" w:sz="4"/>
             </w:tcBorders>
-            <w:shd w:fill="FCFBF7" w:val="clear"/>
+            <w:shd w:fill="F2ECDC" w:val="clear"/>
             <w:tcMar>
               <w:top w:type="dxa" w:w="70"/>
               <w:left w:type="dxa" w:w="110"/>
@@ -4720,7 +4736,7 @@
         </w:rPr>
         <w:t xml:space="preserve"> - take your time). Next, view or print a copy of the </w:t>
       </w:r>
-      <w:hyperlink w:history="1" r:id="rIdrqqcuf3md5v4m59xd41dn">
+      <w:hyperlink w:history="1" r:id="rId7ibxzkt_mt8iql73zvnsi">
         <w:r>
           <w:rPr>
             <w:color w:val="1155CC"/>
@@ -4830,7 +4846,7 @@
               <w:bottom w:val="single" w:color="CFE3DF" w:sz="4"/>
               <w:right w:val="single" w:color="CFE3DF" w:sz="4"/>
             </w:tcBorders>
-            <w:shd w:fill="FCFBF7" w:val="clear"/>
+            <w:shd w:fill="F2ECDC" w:val="clear"/>
             <w:tcMar>
               <w:top w:type="dxa" w:w="70"/>
               <w:left w:type="dxa" w:w="110"/>
@@ -5011,7 +5027,7 @@
               <w:bottom w:val="single" w:color="CFE3DF" w:sz="4"/>
               <w:right w:val="single" w:color="CFE3DF" w:sz="4"/>
             </w:tcBorders>
-            <w:shd w:fill="FCFBF7" w:val="clear"/>
+            <w:shd w:fill="F2ECDC" w:val="clear"/>
             <w:tcMar>
               <w:top w:type="dxa" w:w="70"/>
               <w:left w:type="dxa" w:w="110"/>
@@ -5253,7 +5269,7 @@
         <w:keepLines/>
         <w:spacing w:after="60" w:before="0" w:line="276" w:lineRule="auto"/>
       </w:pPr>
-      <w:hyperlink w:history="1" r:id="rIdnobqa7s8kx_oj2br1iiuy">
+      <w:hyperlink w:history="1" r:id="rIdxhcnw_nhav0tbjatzfozu">
         <w:r>
           <w:rPr>
             <w:color w:val="1155CC"/>
@@ -5333,7 +5349,7 @@
               <w:bottom w:val="single" w:color="CFE3DF" w:sz="4"/>
               <w:right w:val="single" w:color="CFE3DF" w:sz="4"/>
             </w:tcBorders>
-            <w:shd w:fill="FCFBF7" w:val="clear"/>
+            <w:shd w:fill="F2ECDC" w:val="clear"/>
             <w:tcMar>
               <w:top w:type="dxa" w:w="70"/>
               <w:left w:type="dxa" w:w="110"/>
@@ -5503,7 +5519,7 @@
               <w:bottom w:val="single" w:color="CFE3DF" w:sz="4"/>
               <w:right w:val="single" w:color="CFE3DF" w:sz="4"/>
             </w:tcBorders>
-            <w:shd w:fill="FCFBF7" w:val="clear"/>
+            <w:shd w:fill="F2ECDC" w:val="clear"/>
             <w:tcMar>
               <w:top w:type="dxa" w:w="70"/>
               <w:left w:type="dxa" w:w="110"/>
@@ -5534,7 +5550,7 @@
               <w:bottom w:val="single" w:color="CFE3DF" w:sz="4"/>
               <w:right w:val="single" w:color="CFE3DF" w:sz="4"/>
             </w:tcBorders>
-            <w:shd w:fill="FCFBF7" w:val="clear"/>
+            <w:shd w:fill="F2ECDC" w:val="clear"/>
             <w:tcMar>
               <w:top w:type="dxa" w:w="70"/>
               <w:left w:type="dxa" w:w="110"/>
@@ -5565,7 +5581,7 @@
               <w:bottom w:val="single" w:color="CFE3DF" w:sz="4"/>
               <w:right w:val="single" w:color="CFE3DF" w:sz="4"/>
             </w:tcBorders>
-            <w:shd w:fill="FCFBF7" w:val="clear"/>
+            <w:shd w:fill="F2ECDC" w:val="clear"/>
             <w:tcMar>
               <w:top w:type="dxa" w:w="70"/>
               <w:left w:type="dxa" w:w="110"/>
@@ -5746,7 +5762,7 @@
               <w:bottom w:val="single" w:color="CFE3DF" w:sz="4"/>
               <w:right w:val="single" w:color="CFE3DF" w:sz="4"/>
             </w:tcBorders>
-            <w:shd w:fill="FCFBF7" w:val="clear"/>
+            <w:shd w:fill="F2ECDC" w:val="clear"/>
             <w:tcMar>
               <w:top w:type="dxa" w:w="70"/>
               <w:left w:type="dxa" w:w="110"/>
@@ -5955,7 +5971,7 @@
               <w:bottom w:val="single" w:color="CFE3DF" w:sz="4"/>
               <w:right w:val="single" w:color="CFE3DF" w:sz="4"/>
             </w:tcBorders>
-            <w:shd w:fill="FCFBF7" w:val="clear"/>
+            <w:shd w:fill="F2ECDC" w:val="clear"/>
             <w:tcMar>
               <w:top w:type="dxa" w:w="70"/>
               <w:left w:type="dxa" w:w="110"/>
@@ -6125,7 +6141,7 @@
               <w:bottom w:val="single" w:color="CFE3DF" w:sz="4"/>
               <w:right w:val="single" w:color="CFE3DF" w:sz="4"/>
             </w:tcBorders>
-            <w:shd w:fill="FCFBF7" w:val="clear"/>
+            <w:shd w:fill="F2ECDC" w:val="clear"/>
             <w:tcMar>
               <w:top w:type="dxa" w:w="70"/>
               <w:left w:type="dxa" w:w="110"/>
@@ -6156,7 +6172,7 @@
               <w:bottom w:val="single" w:color="CFE3DF" w:sz="4"/>
               <w:right w:val="single" w:color="CFE3DF" w:sz="4"/>
             </w:tcBorders>
-            <w:shd w:fill="FCFBF7" w:val="clear"/>
+            <w:shd w:fill="F2ECDC" w:val="clear"/>
             <w:tcMar>
               <w:top w:type="dxa" w:w="70"/>
               <w:left w:type="dxa" w:w="110"/>
@@ -6187,7 +6203,7 @@
               <w:bottom w:val="single" w:color="CFE3DF" w:sz="4"/>
               <w:right w:val="single" w:color="CFE3DF" w:sz="4"/>
             </w:tcBorders>
-            <w:shd w:fill="FCFBF7" w:val="clear"/>
+            <w:shd w:fill="F2ECDC" w:val="clear"/>
             <w:tcMar>
               <w:top w:type="dxa" w:w="70"/>
               <w:left w:type="dxa" w:w="110"/>
@@ -6379,7 +6395,7 @@
         </w:rPr>
         <w:t xml:space="preserve">Then look at the </w:t>
       </w:r>
-      <w:hyperlink w:history="1" r:id="rId-k5uspqtgfcy7_4x2sgml">
+      <w:hyperlink w:history="1" r:id="rId-5pfuynmzkn3x6i1ndxcw">
         <w:r>
           <w:rPr>
             <w:color w:val="1155CC"/>
@@ -6469,7 +6485,7 @@
               <w:bottom w:val="single" w:color="CFE3DF" w:sz="4"/>
               <w:right w:val="single" w:color="CFE3DF" w:sz="4"/>
             </w:tcBorders>
-            <w:shd w:fill="FCFBF7" w:val="clear"/>
+            <w:shd w:fill="F2ECDC" w:val="clear"/>
             <w:tcMar>
               <w:top w:type="dxa" w:w="70"/>
               <w:left w:type="dxa" w:w="110"/>
@@ -6639,7 +6655,7 @@
               <w:bottom w:val="single" w:color="CFE3DF" w:sz="4"/>
               <w:right w:val="single" w:color="CFE3DF" w:sz="4"/>
             </w:tcBorders>
-            <w:shd w:fill="FCFBF7" w:val="clear"/>
+            <w:shd w:fill="F2ECDC" w:val="clear"/>
             <w:tcMar>
               <w:top w:type="dxa" w:w="70"/>
               <w:left w:type="dxa" w:w="110"/>
@@ -6670,7 +6686,7 @@
               <w:bottom w:val="single" w:color="CFE3DF" w:sz="4"/>
               <w:right w:val="single" w:color="CFE3DF" w:sz="4"/>
             </w:tcBorders>
-            <w:shd w:fill="FCFBF7" w:val="clear"/>
+            <w:shd w:fill="F2ECDC" w:val="clear"/>
             <w:tcMar>
               <w:top w:type="dxa" w:w="70"/>
               <w:left w:type="dxa" w:w="110"/>
@@ -6701,7 +6717,7 @@
               <w:bottom w:val="single" w:color="CFE3DF" w:sz="4"/>
               <w:right w:val="single" w:color="CFE3DF" w:sz="4"/>
             </w:tcBorders>
-            <w:shd w:fill="FCFBF7" w:val="clear"/>
+            <w:shd w:fill="F2ECDC" w:val="clear"/>
             <w:tcMar>
               <w:top w:type="dxa" w:w="70"/>
               <w:left w:type="dxa" w:w="110"/>
@@ -7026,7 +7042,7 @@
               <w:bottom w:val="single" w:color="CFE3DF" w:sz="4"/>
               <w:right w:val="single" w:color="CFE3DF" w:sz="4"/>
             </w:tcBorders>
-            <w:shd w:fill="FCFBF7" w:val="clear"/>
+            <w:shd w:fill="F2ECDC" w:val="clear"/>
             <w:tcMar>
               <w:top w:type="dxa" w:w="70"/>
               <w:left w:type="dxa" w:w="110"/>
@@ -7094,7 +7110,7 @@
         </w:rPr>
         <w:t xml:space="preserve">Later on, when you have time, read over your journal for the day. Next, check in with yourself about how you feel as you think about those thoughts. Then look at the </w:t>
       </w:r>
-      <w:hyperlink w:history="1" r:id="rId67s7mwuvzkq7lpttmi7cw">
+      <w:hyperlink w:history="1" r:id="rIdfnuvufscbxj8zubv9yv8r">
         <w:r>
           <w:rPr>
             <w:color w:val="1155CC"/>
@@ -7200,7 +7216,7 @@
               <w:bottom w:val="single" w:color="CFE3DF" w:sz="4"/>
               <w:right w:val="single" w:color="CFE3DF" w:sz="4"/>
             </w:tcBorders>
-            <w:shd w:fill="FCFBF7" w:val="clear"/>
+            <w:shd w:fill="F2ECDC" w:val="clear"/>
             <w:tcMar>
               <w:top w:type="dxa" w:w="70"/>
               <w:left w:type="dxa" w:w="110"/>
@@ -7370,7 +7386,7 @@
               <w:bottom w:val="single" w:color="CFE3DF" w:sz="4"/>
               <w:right w:val="single" w:color="CFE3DF" w:sz="4"/>
             </w:tcBorders>
-            <w:shd w:fill="FCFBF7" w:val="clear"/>
+            <w:shd w:fill="F2ECDC" w:val="clear"/>
             <w:tcMar>
               <w:top w:type="dxa" w:w="70"/>
               <w:left w:type="dxa" w:w="110"/>
@@ -7401,7 +7417,7 @@
               <w:bottom w:val="single" w:color="CFE3DF" w:sz="4"/>
               <w:right w:val="single" w:color="CFE3DF" w:sz="4"/>
             </w:tcBorders>
-            <w:shd w:fill="FCFBF7" w:val="clear"/>
+            <w:shd w:fill="F2ECDC" w:val="clear"/>
             <w:tcMar>
               <w:top w:type="dxa" w:w="70"/>
               <w:left w:type="dxa" w:w="110"/>
@@ -7432,7 +7448,7 @@
               <w:bottom w:val="single" w:color="CFE3DF" w:sz="4"/>
               <w:right w:val="single" w:color="CFE3DF" w:sz="4"/>
             </w:tcBorders>
-            <w:shd w:fill="FCFBF7" w:val="clear"/>
+            <w:shd w:fill="F2ECDC" w:val="clear"/>
             <w:tcMar>
               <w:top w:type="dxa" w:w="70"/>
               <w:left w:type="dxa" w:w="110"/>
@@ -7552,7 +7568,7 @@
         </w:rPr>
         <w:t xml:space="preserve"> response would be. What was that person feeling? What was that person needing, wanting to have more of, or yearning to experience? Check the </w:t>
       </w:r>
-      <w:hyperlink w:history="1" r:id="rIds1j6kosi6psm4jrpp_osr">
+      <w:hyperlink w:history="1" r:id="rIde8azg67iot__kp52lz0mi">
         <w:r>
           <w:rPr>
             <w:color w:val="1155CC"/>
@@ -7573,7 +7589,7 @@
         </w:rPr>
         <w:t xml:space="preserve"> and the </w:t>
       </w:r>
-      <w:hyperlink w:history="1" r:id="rIdlvi4v7kp_eee_ymdpcald">
+      <w:hyperlink w:history="1" r:id="rId1hyedhe6puogzgsr0dtee">
         <w:r>
           <w:rPr>
             <w:color w:val="1155CC"/>
@@ -7663,7 +7679,7 @@
               <w:bottom w:val="single" w:color="CFE3DF" w:sz="4"/>
               <w:right w:val="single" w:color="CFE3DF" w:sz="4"/>
             </w:tcBorders>
-            <w:shd w:fill="FCFBF7" w:val="clear"/>
+            <w:shd w:fill="F2ECDC" w:val="clear"/>
             <w:tcMar>
               <w:top w:type="dxa" w:w="70"/>
               <w:left w:type="dxa" w:w="110"/>
@@ -7964,7 +7980,7 @@
               <w:bottom w:val="single" w:color="CFE3DF" w:sz="4"/>
               <w:right w:val="single" w:color="CFE3DF" w:sz="4"/>
             </w:tcBorders>
-            <w:shd w:fill="FCFBF7" w:val="clear"/>
+            <w:shd w:fill="F2ECDC" w:val="clear"/>
             <w:tcMar>
               <w:top w:type="dxa" w:w="100"/>
               <w:left w:type="dxa" w:w="130"/>
@@ -8025,7 +8041,7 @@
               </w:rPr>
               <w:t xml:space="preserve"> (feeling from the </w:t>
             </w:r>
-            <w:hyperlink w:history="1" r:id="rIdu5tmb0sithjablzngsvgq">
+            <w:hyperlink w:history="1" r:id="rIdclnwzaetyiarbar1wvt2j">
               <w:r>
                 <w:rPr>
                   <w:color w:val="1155CC"/>
@@ -8066,7 +8082,7 @@
               </w:rPr>
               <w:t xml:space="preserve"> (need from the </w:t>
             </w:r>
-            <w:hyperlink w:history="1" r:id="rId7zt31rm8u0khlnpfjtjvw">
+            <w:hyperlink w:history="1" r:id="rIdeek9n2qyakgg9jnvfkhc5">
               <w:r>
                 <w:rPr>
                   <w:color w:val="1155CC"/>
@@ -8169,7 +8185,7 @@
               <w:bottom w:val="single" w:color="CFE3DF" w:sz="4"/>
               <w:right w:val="single" w:color="CFE3DF" w:sz="4"/>
             </w:tcBorders>
-            <w:shd w:fill="FCFBF7" w:val="clear"/>
+            <w:shd w:fill="F2ECDC" w:val="clear"/>
             <w:tcMar>
               <w:top w:type="dxa" w:w="70"/>
               <w:left w:type="dxa" w:w="110"/>
@@ -8339,7 +8355,7 @@
               <w:bottom w:val="single" w:color="CFE3DF" w:sz="4"/>
               <w:right w:val="single" w:color="CFE3DF" w:sz="4"/>
             </w:tcBorders>
-            <w:shd w:fill="FCFBF7" w:val="clear"/>
+            <w:shd w:fill="F2ECDC" w:val="clear"/>
             <w:tcMar>
               <w:top w:type="dxa" w:w="70"/>
               <w:left w:type="dxa" w:w="110"/>
@@ -8370,7 +8386,7 @@
               <w:bottom w:val="single" w:color="CFE3DF" w:sz="4"/>
               <w:right w:val="single" w:color="CFE3DF" w:sz="4"/>
             </w:tcBorders>
-            <w:shd w:fill="FCFBF7" w:val="clear"/>
+            <w:shd w:fill="F2ECDC" w:val="clear"/>
             <w:tcMar>
               <w:top w:type="dxa" w:w="70"/>
               <w:left w:type="dxa" w:w="110"/>
@@ -8401,7 +8417,7 @@
               <w:bottom w:val="single" w:color="CFE3DF" w:sz="4"/>
               <w:right w:val="single" w:color="CFE3DF" w:sz="4"/>
             </w:tcBorders>
-            <w:shd w:fill="FCFBF7" w:val="clear"/>
+            <w:shd w:fill="F2ECDC" w:val="clear"/>
             <w:tcMar>
               <w:top w:type="dxa" w:w="70"/>
               <w:left w:type="dxa" w:w="110"/>
@@ -8550,7 +8566,7 @@
               <w:bottom w:val="single" w:color="CFE3DF" w:sz="4"/>
               <w:right w:val="single" w:color="CFE3DF" w:sz="4"/>
             </w:tcBorders>
-            <w:shd w:fill="FCFBF7" w:val="clear"/>
+            <w:shd w:fill="F2ECDC" w:val="clear"/>
             <w:tcMar>
               <w:top w:type="dxa" w:w="70"/>
               <w:left w:type="dxa" w:w="110"/>
@@ -8671,7 +8687,7 @@
               <w:bottom w:val="single" w:color="CFE3DF" w:sz="4"/>
               <w:right w:val="single" w:color="CFE3DF" w:sz="4"/>
             </w:tcBorders>
-            <w:shd w:fill="FCFBF7" w:val="clear"/>
+            <w:shd w:fill="F2ECDC" w:val="clear"/>
             <w:tcMar>
               <w:top w:type="dxa" w:w="70"/>
               <w:left w:type="dxa" w:w="110"/>
@@ -8792,7 +8808,7 @@
               <w:bottom w:val="single" w:color="CFE3DF" w:sz="4"/>
               <w:right w:val="single" w:color="CFE3DF" w:sz="4"/>
             </w:tcBorders>
-            <w:shd w:fill="FCFBF7" w:val="clear"/>
+            <w:shd w:fill="F2ECDC" w:val="clear"/>
             <w:tcMar>
               <w:top w:type="dxa" w:w="70"/>
               <w:left w:type="dxa" w:w="110"/>
@@ -8923,7 +8939,7 @@
               <w:bottom w:val="single" w:color="CFE3DF" w:sz="4"/>
               <w:right w:val="single" w:color="CFE3DF" w:sz="4"/>
             </w:tcBorders>
-            <w:shd w:fill="FCFBF7" w:val="clear"/>
+            <w:shd w:fill="F2ECDC" w:val="clear"/>
             <w:tcMar>
               <w:top w:type="dxa" w:w="70"/>
               <w:left w:type="dxa" w:w="110"/>
@@ -9050,7 +9066,7 @@
               <w:bottom w:val="single" w:color="CFE3DF" w:sz="4"/>
               <w:right w:val="single" w:color="CFE3DF" w:sz="4"/>
             </w:tcBorders>
-            <w:shd w:fill="FCFBF7" w:val="clear"/>
+            <w:shd w:fill="F2ECDC" w:val="clear"/>
             <w:tcMar>
               <w:top w:type="dxa" w:w="45"/>
               <w:left w:type="dxa" w:w="90"/>
@@ -9215,7 +9231,7 @@
               <w:bottom w:val="single" w:color="CFE3DF" w:sz="4"/>
               <w:right w:val="single" w:color="CFE3DF" w:sz="4"/>
             </w:tcBorders>
-            <w:shd w:fill="FCFBF7" w:val="clear"/>
+            <w:shd w:fill="F2ECDC" w:val="clear"/>
             <w:tcMar>
               <w:top w:type="dxa" w:w="70"/>
               <w:left w:type="dxa" w:w="110"/>
@@ -9246,7 +9262,7 @@
               <w:bottom w:val="single" w:color="CFE3DF" w:sz="4"/>
               <w:right w:val="single" w:color="CFE3DF" w:sz="4"/>
             </w:tcBorders>
-            <w:shd w:fill="FCFBF7" w:val="clear"/>
+            <w:shd w:fill="F2ECDC" w:val="clear"/>
             <w:tcMar>
               <w:top w:type="dxa" w:w="70"/>
               <w:left w:type="dxa" w:w="110"/>
@@ -9277,7 +9293,7 @@
               <w:bottom w:val="single" w:color="CFE3DF" w:sz="4"/>
               <w:right w:val="single" w:color="CFE3DF" w:sz="4"/>
             </w:tcBorders>
-            <w:shd w:fill="FCFBF7" w:val="clear"/>
+            <w:shd w:fill="F2ECDC" w:val="clear"/>
             <w:tcMar>
               <w:top w:type="dxa" w:w="70"/>
               <w:left w:type="dxa" w:w="110"/>
@@ -9578,7 +9594,7 @@
               <w:bottom w:val="single" w:color="CFE3DF" w:sz="4"/>
               <w:right w:val="single" w:color="CFE3DF" w:sz="4"/>
             </w:tcBorders>
-            <w:shd w:fill="FCFBF7" w:val="clear"/>
+            <w:shd w:fill="F2ECDC" w:val="clear"/>
             <w:tcMar>
               <w:top w:type="dxa" w:w="70"/>
               <w:left w:type="dxa" w:w="110"/>
@@ -9867,7 +9883,7 @@
               <w:bottom w:val="single" w:color="CFE3DF" w:sz="4"/>
               <w:right w:val="single" w:color="CFE3DF" w:sz="4"/>
             </w:tcBorders>
-            <w:shd w:fill="FCFBF7" w:val="clear"/>
+            <w:shd w:fill="F2ECDC" w:val="clear"/>
             <w:tcMar>
               <w:top w:type="dxa" w:w="70"/>
               <w:left w:type="dxa" w:w="110"/>
@@ -9994,7 +10010,7 @@
               <w:bottom w:val="single" w:color="CFE3DF" w:sz="4"/>
               <w:right w:val="single" w:color="CFE3DF" w:sz="4"/>
             </w:tcBorders>
-            <w:shd w:fill="FCFBF7" w:val="clear"/>
+            <w:shd w:fill="F2ECDC" w:val="clear"/>
             <w:tcMar>
               <w:top w:type="dxa" w:w="45"/>
               <w:left w:type="dxa" w:w="90"/>
@@ -10159,7 +10175,7 @@
               <w:bottom w:val="single" w:color="CFE3DF" w:sz="4"/>
               <w:right w:val="single" w:color="CFE3DF" w:sz="4"/>
             </w:tcBorders>
-            <w:shd w:fill="FCFBF7" w:val="clear"/>
+            <w:shd w:fill="F2ECDC" w:val="clear"/>
             <w:tcMar>
               <w:top w:type="dxa" w:w="70"/>
               <w:left w:type="dxa" w:w="110"/>
@@ -10190,7 +10206,7 @@
               <w:bottom w:val="single" w:color="CFE3DF" w:sz="4"/>
               <w:right w:val="single" w:color="CFE3DF" w:sz="4"/>
             </w:tcBorders>
-            <w:shd w:fill="FCFBF7" w:val="clear"/>
+            <w:shd w:fill="F2ECDC" w:val="clear"/>
             <w:tcMar>
               <w:top w:type="dxa" w:w="70"/>
               <w:left w:type="dxa" w:w="110"/>
@@ -10221,7 +10237,7 @@
               <w:bottom w:val="single" w:color="CFE3DF" w:sz="4"/>
               <w:right w:val="single" w:color="CFE3DF" w:sz="4"/>
             </w:tcBorders>
-            <w:shd w:fill="FCFBF7" w:val="clear"/>
+            <w:shd w:fill="F2ECDC" w:val="clear"/>
             <w:tcMar>
               <w:top w:type="dxa" w:w="70"/>
               <w:left w:type="dxa" w:w="110"/>
@@ -10370,7 +10386,7 @@
               <w:bottom w:val="single" w:color="CFE3DF" w:sz="4"/>
               <w:right w:val="single" w:color="CFE3DF" w:sz="4"/>
             </w:tcBorders>
-            <w:shd w:fill="FCFBF7" w:val="clear"/>
+            <w:shd w:fill="F2ECDC" w:val="clear"/>
             <w:tcMar>
               <w:top w:type="dxa" w:w="70"/>
               <w:left w:type="dxa" w:w="110"/>
@@ -10583,7 +10599,7 @@
               <w:bottom w:val="single" w:color="CFE3DF" w:sz="4"/>
               <w:right w:val="single" w:color="CFE3DF" w:sz="4"/>
             </w:tcBorders>
-            <w:shd w:fill="FCFBF7" w:val="clear"/>
+            <w:shd w:fill="F2ECDC" w:val="clear"/>
             <w:tcMar>
               <w:top w:type="dxa" w:w="70"/>
               <w:left w:type="dxa" w:w="110"/>
@@ -10744,7 +10760,7 @@
               <w:bottom w:val="single" w:color="CFE3DF" w:sz="4"/>
               <w:right w:val="single" w:color="CFE3DF" w:sz="4"/>
             </w:tcBorders>
-            <w:shd w:fill="FCFBF7" w:val="clear"/>
+            <w:shd w:fill="F2ECDC" w:val="clear"/>
             <w:tcMar>
               <w:top w:type="dxa" w:w="70"/>
               <w:left w:type="dxa" w:w="110"/>
@@ -10871,7 +10887,7 @@
               <w:bottom w:val="single" w:color="CFE3DF" w:sz="4"/>
               <w:right w:val="single" w:color="CFE3DF" w:sz="4"/>
             </w:tcBorders>
-            <w:shd w:fill="FCFBF7" w:val="clear"/>
+            <w:shd w:fill="F2ECDC" w:val="clear"/>
             <w:tcMar>
               <w:top w:type="dxa" w:w="45"/>
               <w:left w:type="dxa" w:w="90"/>
@@ -11036,7 +11052,7 @@
               <w:bottom w:val="single" w:color="CFE3DF" w:sz="4"/>
               <w:right w:val="single" w:color="CFE3DF" w:sz="4"/>
             </w:tcBorders>
-            <w:shd w:fill="FCFBF7" w:val="clear"/>
+            <w:shd w:fill="F2ECDC" w:val="clear"/>
             <w:tcMar>
               <w:top w:type="dxa" w:w="70"/>
               <w:left w:type="dxa" w:w="110"/>
@@ -11067,7 +11083,7 @@
               <w:bottom w:val="single" w:color="CFE3DF" w:sz="4"/>
               <w:right w:val="single" w:color="CFE3DF" w:sz="4"/>
             </w:tcBorders>
-            <w:shd w:fill="FCFBF7" w:val="clear"/>
+            <w:shd w:fill="F2ECDC" w:val="clear"/>
             <w:tcMar>
               <w:top w:type="dxa" w:w="70"/>
               <w:left w:type="dxa" w:w="110"/>
@@ -11098,7 +11114,7 @@
               <w:bottom w:val="single" w:color="CFE3DF" w:sz="4"/>
               <w:right w:val="single" w:color="CFE3DF" w:sz="4"/>
             </w:tcBorders>
-            <w:shd w:fill="FCFBF7" w:val="clear"/>
+            <w:shd w:fill="F2ECDC" w:val="clear"/>
             <w:tcMar>
               <w:top w:type="dxa" w:w="70"/>
               <w:left w:type="dxa" w:w="110"/>
@@ -11247,7 +11263,7 @@
               <w:bottom w:val="single" w:color="CFE3DF" w:sz="4"/>
               <w:right w:val="single" w:color="CFE3DF" w:sz="4"/>
             </w:tcBorders>
-            <w:shd w:fill="FCFBF7" w:val="clear"/>
+            <w:shd w:fill="F2ECDC" w:val="clear"/>
             <w:tcMar>
               <w:top w:type="dxa" w:w="70"/>
               <w:left w:type="dxa" w:w="110"/>
@@ -11468,7 +11484,7 @@
               <w:bottom w:val="single" w:color="CFE3DF" w:sz="4"/>
               <w:right w:val="single" w:color="CFE3DF" w:sz="4"/>
             </w:tcBorders>
-            <w:shd w:fill="FCFBF7" w:val="clear"/>
+            <w:shd w:fill="F2ECDC" w:val="clear"/>
             <w:tcMar>
               <w:top w:type="dxa" w:w="70"/>
               <w:left w:type="dxa" w:w="110"/>
@@ -11829,7 +11845,7 @@
               <w:bottom w:val="single" w:color="CFE3DF" w:sz="4"/>
               <w:right w:val="single" w:color="CFE3DF" w:sz="4"/>
             </w:tcBorders>
-            <w:shd w:fill="FCFBF7" w:val="clear"/>
+            <w:shd w:fill="F2ECDC" w:val="clear"/>
             <w:tcMar>
               <w:top w:type="dxa" w:w="70"/>
               <w:left w:type="dxa" w:w="110"/>
@@ -11956,7 +11972,7 @@
               <w:bottom w:val="single" w:color="CFE3DF" w:sz="4"/>
               <w:right w:val="single" w:color="CFE3DF" w:sz="4"/>
             </w:tcBorders>
-            <w:shd w:fill="FCFBF7" w:val="clear"/>
+            <w:shd w:fill="F2ECDC" w:val="clear"/>
             <w:tcMar>
               <w:top w:type="dxa" w:w="45"/>
               <w:left w:type="dxa" w:w="90"/>
@@ -12121,7 +12137,7 @@
               <w:bottom w:val="single" w:color="CFE3DF" w:sz="4"/>
               <w:right w:val="single" w:color="CFE3DF" w:sz="4"/>
             </w:tcBorders>
-            <w:shd w:fill="FCFBF7" w:val="clear"/>
+            <w:shd w:fill="F2ECDC" w:val="clear"/>
             <w:tcMar>
               <w:top w:type="dxa" w:w="70"/>
               <w:left w:type="dxa" w:w="110"/>
@@ -12152,7 +12168,7 @@
               <w:bottom w:val="single" w:color="CFE3DF" w:sz="4"/>
               <w:right w:val="single" w:color="CFE3DF" w:sz="4"/>
             </w:tcBorders>
-            <w:shd w:fill="FCFBF7" w:val="clear"/>
+            <w:shd w:fill="F2ECDC" w:val="clear"/>
             <w:tcMar>
               <w:top w:type="dxa" w:w="70"/>
               <w:left w:type="dxa" w:w="110"/>
@@ -12183,7 +12199,7 @@
               <w:bottom w:val="single" w:color="CFE3DF" w:sz="4"/>
               <w:right w:val="single" w:color="CFE3DF" w:sz="4"/>
             </w:tcBorders>
-            <w:shd w:fill="FCFBF7" w:val="clear"/>
+            <w:shd w:fill="F2ECDC" w:val="clear"/>
             <w:tcMar>
               <w:top w:type="dxa" w:w="70"/>
               <w:left w:type="dxa" w:w="110"/>
@@ -12580,7 +12596,7 @@
               <w:bottom w:val="single" w:color="CFE3DF" w:sz="4"/>
               <w:right w:val="single" w:color="CFE3DF" w:sz="4"/>
             </w:tcBorders>
-            <w:shd w:fill="FCFBF7" w:val="clear"/>
+            <w:shd w:fill="F2ECDC" w:val="clear"/>
             <w:tcMar>
               <w:top w:type="dxa" w:w="70"/>
               <w:left w:type="dxa" w:w="110"/>
@@ -12701,7 +12717,7 @@
               <w:bottom w:val="single" w:color="CFE3DF" w:sz="4"/>
               <w:right w:val="single" w:color="CFE3DF" w:sz="4"/>
             </w:tcBorders>
-            <w:shd w:fill="FCFBF7" w:val="clear"/>
+            <w:shd w:fill="F2ECDC" w:val="clear"/>
             <w:tcMar>
               <w:top w:type="dxa" w:w="70"/>
               <w:left w:type="dxa" w:w="110"/>
@@ -12862,7 +12878,7 @@
               <w:bottom w:val="single" w:color="CFE3DF" w:sz="4"/>
               <w:right w:val="single" w:color="CFE3DF" w:sz="4"/>
             </w:tcBorders>
-            <w:shd w:fill="FCFBF7" w:val="clear"/>
+            <w:shd w:fill="F2ECDC" w:val="clear"/>
             <w:tcMar>
               <w:top w:type="dxa" w:w="70"/>
               <w:left w:type="dxa" w:w="110"/>
@@ -12989,7 +13005,7 @@
               <w:bottom w:val="single" w:color="CFE3DF" w:sz="4"/>
               <w:right w:val="single" w:color="CFE3DF" w:sz="4"/>
             </w:tcBorders>
-            <w:shd w:fill="FCFBF7" w:val="clear"/>
+            <w:shd w:fill="F2ECDC" w:val="clear"/>
             <w:tcMar>
               <w:top w:type="dxa" w:w="45"/>
               <w:left w:type="dxa" w:w="90"/>
@@ -13154,7 +13170,7 @@
               <w:bottom w:val="single" w:color="CFE3DF" w:sz="4"/>
               <w:right w:val="single" w:color="CFE3DF" w:sz="4"/>
             </w:tcBorders>
-            <w:shd w:fill="FCFBF7" w:val="clear"/>
+            <w:shd w:fill="F2ECDC" w:val="clear"/>
             <w:tcMar>
               <w:top w:type="dxa" w:w="70"/>
               <w:left w:type="dxa" w:w="110"/>
@@ -13185,7 +13201,7 @@
               <w:bottom w:val="single" w:color="CFE3DF" w:sz="4"/>
               <w:right w:val="single" w:color="CFE3DF" w:sz="4"/>
             </w:tcBorders>
-            <w:shd w:fill="FCFBF7" w:val="clear"/>
+            <w:shd w:fill="F2ECDC" w:val="clear"/>
             <w:tcMar>
               <w:top w:type="dxa" w:w="70"/>
               <w:left w:type="dxa" w:w="110"/>
@@ -13216,7 +13232,7 @@
               <w:bottom w:val="single" w:color="CFE3DF" w:sz="4"/>
               <w:right w:val="single" w:color="CFE3DF" w:sz="4"/>
             </w:tcBorders>
-            <w:shd w:fill="FCFBF7" w:val="clear"/>
+            <w:shd w:fill="F2ECDC" w:val="clear"/>
             <w:tcMar>
               <w:top w:type="dxa" w:w="70"/>
               <w:left w:type="dxa" w:w="110"/>
@@ -13457,7 +13473,7 @@
               <w:bottom w:val="single" w:color="CFE3DF" w:sz="4"/>
               <w:right w:val="single" w:color="CFE3DF" w:sz="4"/>
             </w:tcBorders>
-            <w:shd w:fill="FCFBF7" w:val="clear"/>
+            <w:shd w:fill="F2ECDC" w:val="clear"/>
             <w:tcMar>
               <w:top w:type="dxa" w:w="70"/>
               <w:left w:type="dxa" w:w="110"/>
@@ -13638,7 +13654,7 @@
               <w:bottom w:val="single" w:color="CFE3DF" w:sz="4"/>
               <w:right w:val="single" w:color="CFE3DF" w:sz="4"/>
             </w:tcBorders>
-            <w:shd w:fill="FCFBF7" w:val="clear"/>
+            <w:shd w:fill="F2ECDC" w:val="clear"/>
             <w:tcMar>
               <w:top w:type="dxa" w:w="70"/>
               <w:left w:type="dxa" w:w="110"/>
@@ -13759,7 +13775,7 @@
               <w:bottom w:val="single" w:color="CFE3DF" w:sz="4"/>
               <w:right w:val="single" w:color="CFE3DF" w:sz="4"/>
             </w:tcBorders>
-            <w:shd w:fill="FCFBF7" w:val="clear"/>
+            <w:shd w:fill="F2ECDC" w:val="clear"/>
             <w:tcMar>
               <w:top w:type="dxa" w:w="70"/>
               <w:left w:type="dxa" w:w="110"/>
@@ -13886,7 +13902,7 @@
               <w:bottom w:val="single" w:color="CFE3DF" w:sz="4"/>
               <w:right w:val="single" w:color="CFE3DF" w:sz="4"/>
             </w:tcBorders>
-            <w:shd w:fill="FCFBF7" w:val="clear"/>
+            <w:shd w:fill="F2ECDC" w:val="clear"/>
             <w:tcMar>
               <w:top w:type="dxa" w:w="45"/>
               <w:left w:type="dxa" w:w="90"/>
@@ -14051,7 +14067,7 @@
               <w:bottom w:val="single" w:color="CFE3DF" w:sz="4"/>
               <w:right w:val="single" w:color="CFE3DF" w:sz="4"/>
             </w:tcBorders>
-            <w:shd w:fill="FCFBF7" w:val="clear"/>
+            <w:shd w:fill="F2ECDC" w:val="clear"/>
             <w:tcMar>
               <w:top w:type="dxa" w:w="70"/>
               <w:left w:type="dxa" w:w="110"/>
@@ -14082,7 +14098,7 @@
               <w:bottom w:val="single" w:color="CFE3DF" w:sz="4"/>
               <w:right w:val="single" w:color="CFE3DF" w:sz="4"/>
             </w:tcBorders>
-            <w:shd w:fill="FCFBF7" w:val="clear"/>
+            <w:shd w:fill="F2ECDC" w:val="clear"/>
             <w:tcMar>
               <w:top w:type="dxa" w:w="70"/>
               <w:left w:type="dxa" w:w="110"/>
@@ -14113,7 +14129,7 @@
               <w:bottom w:val="single" w:color="CFE3DF" w:sz="4"/>
               <w:right w:val="single" w:color="CFE3DF" w:sz="4"/>
             </w:tcBorders>
-            <w:shd w:fill="FCFBF7" w:val="clear"/>
+            <w:shd w:fill="F2ECDC" w:val="clear"/>
             <w:tcMar>
               <w:top w:type="dxa" w:w="70"/>
               <w:left w:type="dxa" w:w="110"/>
@@ -14282,7 +14298,7 @@
               <w:bottom w:val="single" w:color="CFE3DF" w:sz="4"/>
               <w:right w:val="single" w:color="CFE3DF" w:sz="4"/>
             </w:tcBorders>
-            <w:shd w:fill="FCFBF7" w:val="clear"/>
+            <w:shd w:fill="F2ECDC" w:val="clear"/>
             <w:tcMar>
               <w:top w:type="dxa" w:w="70"/>
               <w:left w:type="dxa" w:w="110"/>
@@ -14423,7 +14439,7 @@
               <w:bottom w:val="single" w:color="CFE3DF" w:sz="4"/>
               <w:right w:val="single" w:color="CFE3DF" w:sz="4"/>
             </w:tcBorders>
-            <w:shd w:fill="FCFBF7" w:val="clear"/>
+            <w:shd w:fill="F2ECDC" w:val="clear"/>
             <w:tcMar>
               <w:top w:type="dxa" w:w="70"/>
               <w:left w:type="dxa" w:w="110"/>
@@ -14550,7 +14566,7 @@
               <w:bottom w:val="single" w:color="CFE3DF" w:sz="4"/>
               <w:right w:val="single" w:color="CFE3DF" w:sz="4"/>
             </w:tcBorders>
-            <w:shd w:fill="FCFBF7" w:val="clear"/>
+            <w:shd w:fill="F2ECDC" w:val="clear"/>
             <w:tcMar>
               <w:top w:type="dxa" w:w="45"/>
               <w:left w:type="dxa" w:w="90"/>
@@ -14715,7 +14731,7 @@
               <w:bottom w:val="single" w:color="CFE3DF" w:sz="4"/>
               <w:right w:val="single" w:color="CFE3DF" w:sz="4"/>
             </w:tcBorders>
-            <w:shd w:fill="FCFBF7" w:val="clear"/>
+            <w:shd w:fill="F2ECDC" w:val="clear"/>
             <w:tcMar>
               <w:top w:type="dxa" w:w="70"/>
               <w:left w:type="dxa" w:w="110"/>
@@ -14746,7 +14762,7 @@
               <w:bottom w:val="single" w:color="CFE3DF" w:sz="4"/>
               <w:right w:val="single" w:color="CFE3DF" w:sz="4"/>
             </w:tcBorders>
-            <w:shd w:fill="FCFBF7" w:val="clear"/>
+            <w:shd w:fill="F2ECDC" w:val="clear"/>
             <w:tcMar>
               <w:top w:type="dxa" w:w="70"/>
               <w:left w:type="dxa" w:w="110"/>
@@ -14777,7 +14793,7 @@
               <w:bottom w:val="single" w:color="CFE3DF" w:sz="4"/>
               <w:right w:val="single" w:color="CFE3DF" w:sz="4"/>
             </w:tcBorders>
-            <w:shd w:fill="FCFBF7" w:val="clear"/>
+            <w:shd w:fill="F2ECDC" w:val="clear"/>
             <w:tcMar>
               <w:top w:type="dxa" w:w="70"/>
               <w:left w:type="dxa" w:w="110"/>
@@ -14942,7 +14958,7 @@
               <w:bottom w:val="single" w:color="CFE3DF" w:sz="4"/>
               <w:right w:val="single" w:color="CFE3DF" w:sz="4"/>
             </w:tcBorders>
-            <w:shd w:fill="FCFBF7" w:val="clear"/>
+            <w:shd w:fill="F2ECDC" w:val="clear"/>
             <w:tcMar>
               <w:top w:type="dxa" w:w="70"/>
               <w:left w:type="dxa" w:w="110"/>
@@ -15079,7 +15095,7 @@
               <w:bottom w:val="single" w:color="CFE3DF" w:sz="4"/>
               <w:right w:val="single" w:color="CFE3DF" w:sz="4"/>
             </w:tcBorders>
-            <w:shd w:fill="FCFBF7" w:val="clear"/>
+            <w:shd w:fill="F2ECDC" w:val="clear"/>
             <w:tcMar>
               <w:top w:type="dxa" w:w="70"/>
               <w:left w:type="dxa" w:w="110"/>
@@ -15206,7 +15222,7 @@
               <w:bottom w:val="single" w:color="CFE3DF" w:sz="4"/>
               <w:right w:val="single" w:color="CFE3DF" w:sz="4"/>
             </w:tcBorders>
-            <w:shd w:fill="FCFBF7" w:val="clear"/>
+            <w:shd w:fill="F2ECDC" w:val="clear"/>
             <w:tcMar>
               <w:top w:type="dxa" w:w="45"/>
               <w:left w:type="dxa" w:w="90"/>
@@ -15371,7 +15387,7 @@
               <w:bottom w:val="single" w:color="CFE3DF" w:sz="4"/>
               <w:right w:val="single" w:color="CFE3DF" w:sz="4"/>
             </w:tcBorders>
-            <w:shd w:fill="FCFBF7" w:val="clear"/>
+            <w:shd w:fill="F2ECDC" w:val="clear"/>
             <w:tcMar>
               <w:top w:type="dxa" w:w="70"/>
               <w:left w:type="dxa" w:w="110"/>
@@ -15402,7 +15418,7 @@
               <w:bottom w:val="single" w:color="CFE3DF" w:sz="4"/>
               <w:right w:val="single" w:color="CFE3DF" w:sz="4"/>
             </w:tcBorders>
-            <w:shd w:fill="FCFBF7" w:val="clear"/>
+            <w:shd w:fill="F2ECDC" w:val="clear"/>
             <w:tcMar>
               <w:top w:type="dxa" w:w="70"/>
               <w:left w:type="dxa" w:w="110"/>
@@ -15433,7 +15449,7 @@
               <w:bottom w:val="single" w:color="CFE3DF" w:sz="4"/>
               <w:right w:val="single" w:color="CFE3DF" w:sz="4"/>
             </w:tcBorders>
-            <w:shd w:fill="FCFBF7" w:val="clear"/>
+            <w:shd w:fill="F2ECDC" w:val="clear"/>
             <w:tcMar>
               <w:top w:type="dxa" w:w="70"/>
               <w:left w:type="dxa" w:w="110"/>
@@ -15582,7 +15598,7 @@
               <w:bottom w:val="single" w:color="CFE3DF" w:sz="4"/>
               <w:right w:val="single" w:color="CFE3DF" w:sz="4"/>
             </w:tcBorders>
-            <w:shd w:fill="FCFBF7" w:val="clear"/>
+            <w:shd w:fill="F2ECDC" w:val="clear"/>
             <w:tcMar>
               <w:top w:type="dxa" w:w="70"/>
               <w:left w:type="dxa" w:w="110"/>
@@ -15743,7 +15759,7 @@
               <w:bottom w:val="single" w:color="CFE3DF" w:sz="4"/>
               <w:right w:val="single" w:color="CFE3DF" w:sz="4"/>
             </w:tcBorders>
-            <w:shd w:fill="FCFBF7" w:val="clear"/>
+            <w:shd w:fill="F2ECDC" w:val="clear"/>
             <w:tcMar>
               <w:top w:type="dxa" w:w="70"/>
               <w:left w:type="dxa" w:w="110"/>
@@ -15870,7 +15886,7 @@
               <w:bottom w:val="single" w:color="CFE3DF" w:sz="4"/>
               <w:right w:val="single" w:color="CFE3DF" w:sz="4"/>
             </w:tcBorders>
-            <w:shd w:fill="FCFBF7" w:val="clear"/>
+            <w:shd w:fill="F2ECDC" w:val="clear"/>
             <w:tcMar>
               <w:top w:type="dxa" w:w="45"/>
               <w:left w:type="dxa" w:w="90"/>
@@ -16035,7 +16051,7 @@
               <w:bottom w:val="single" w:color="CFE3DF" w:sz="4"/>
               <w:right w:val="single" w:color="CFE3DF" w:sz="4"/>
             </w:tcBorders>
-            <w:shd w:fill="FCFBF7" w:val="clear"/>
+            <w:shd w:fill="F2ECDC" w:val="clear"/>
             <w:tcMar>
               <w:top w:type="dxa" w:w="70"/>
               <w:left w:type="dxa" w:w="110"/>
@@ -16066,7 +16082,7 @@
               <w:bottom w:val="single" w:color="CFE3DF" w:sz="4"/>
               <w:right w:val="single" w:color="CFE3DF" w:sz="4"/>
             </w:tcBorders>
-            <w:shd w:fill="FCFBF7" w:val="clear"/>
+            <w:shd w:fill="F2ECDC" w:val="clear"/>
             <w:tcMar>
               <w:top w:type="dxa" w:w="70"/>
               <w:left w:type="dxa" w:w="110"/>
@@ -16097,7 +16113,7 @@
               <w:bottom w:val="single" w:color="CFE3DF" w:sz="4"/>
               <w:right w:val="single" w:color="CFE3DF" w:sz="4"/>
             </w:tcBorders>
-            <w:shd w:fill="FCFBF7" w:val="clear"/>
+            <w:shd w:fill="F2ECDC" w:val="clear"/>
             <w:tcMar>
               <w:top w:type="dxa" w:w="70"/>
               <w:left w:type="dxa" w:w="110"/>
@@ -16246,7 +16262,7 @@
               <w:bottom w:val="single" w:color="CFE3DF" w:sz="4"/>
               <w:right w:val="single" w:color="CFE3DF" w:sz="4"/>
             </w:tcBorders>
-            <w:shd w:fill="FCFBF7" w:val="clear"/>
+            <w:shd w:fill="F2ECDC" w:val="clear"/>
             <w:tcMar>
               <w:top w:type="dxa" w:w="70"/>
               <w:left w:type="dxa" w:w="110"/>
@@ -16373,7 +16389,7 @@
               <w:bottom w:val="single" w:color="CFE3DF" w:sz="4"/>
               <w:right w:val="single" w:color="CFE3DF" w:sz="4"/>
             </w:tcBorders>
-            <w:shd w:fill="FCFBF7" w:val="clear"/>
+            <w:shd w:fill="F2ECDC" w:val="clear"/>
             <w:tcMar>
               <w:top w:type="dxa" w:w="45"/>
               <w:left w:type="dxa" w:w="90"/>
@@ -16538,7 +16554,7 @@
               <w:bottom w:val="single" w:color="CFE3DF" w:sz="4"/>
               <w:right w:val="single" w:color="CFE3DF" w:sz="4"/>
             </w:tcBorders>
-            <w:shd w:fill="FCFBF7" w:val="clear"/>
+            <w:shd w:fill="F2ECDC" w:val="clear"/>
             <w:tcMar>
               <w:top w:type="dxa" w:w="70"/>
               <w:left w:type="dxa" w:w="110"/>
@@ -16569,7 +16585,7 @@
               <w:bottom w:val="single" w:color="CFE3DF" w:sz="4"/>
               <w:right w:val="single" w:color="CFE3DF" w:sz="4"/>
             </w:tcBorders>
-            <w:shd w:fill="FCFBF7" w:val="clear"/>
+            <w:shd w:fill="F2ECDC" w:val="clear"/>
             <w:tcMar>
               <w:top w:type="dxa" w:w="70"/>
               <w:left w:type="dxa" w:w="110"/>
@@ -16600,7 +16616,7 @@
               <w:bottom w:val="single" w:color="CFE3DF" w:sz="4"/>
               <w:right w:val="single" w:color="CFE3DF" w:sz="4"/>
             </w:tcBorders>
-            <w:shd w:fill="FCFBF7" w:val="clear"/>
+            <w:shd w:fill="F2ECDC" w:val="clear"/>
             <w:tcMar>
               <w:top w:type="dxa" w:w="70"/>
               <w:left w:type="dxa" w:w="110"/>
@@ -16765,7 +16781,7 @@
               <w:bottom w:val="single" w:color="CFE3DF" w:sz="4"/>
               <w:right w:val="single" w:color="CFE3DF" w:sz="4"/>
             </w:tcBorders>
-            <w:shd w:fill="FCFBF7" w:val="clear"/>
+            <w:shd w:fill="F2ECDC" w:val="clear"/>
             <w:tcMar>
               <w:top w:type="dxa" w:w="70"/>
               <w:left w:type="dxa" w:w="110"/>
@@ -16922,7 +16938,7 @@
               <w:bottom w:val="single" w:color="CFE3DF" w:sz="4"/>
               <w:right w:val="single" w:color="CFE3DF" w:sz="4"/>
             </w:tcBorders>
-            <w:shd w:fill="FCFBF7" w:val="clear"/>
+            <w:shd w:fill="F2ECDC" w:val="clear"/>
             <w:tcMar>
               <w:top w:type="dxa" w:w="70"/>
               <w:left w:type="dxa" w:w="110"/>
@@ -17049,7 +17065,7 @@
               <w:bottom w:val="single" w:color="CFE3DF" w:sz="4"/>
               <w:right w:val="single" w:color="CFE3DF" w:sz="4"/>
             </w:tcBorders>
-            <w:shd w:fill="FCFBF7" w:val="clear"/>
+            <w:shd w:fill="F2ECDC" w:val="clear"/>
             <w:tcMar>
               <w:top w:type="dxa" w:w="45"/>
               <w:left w:type="dxa" w:w="90"/>
@@ -17214,7 +17230,7 @@
               <w:bottom w:val="single" w:color="CFE3DF" w:sz="4"/>
               <w:right w:val="single" w:color="CFE3DF" w:sz="4"/>
             </w:tcBorders>
-            <w:shd w:fill="FCFBF7" w:val="clear"/>
+            <w:shd w:fill="F2ECDC" w:val="clear"/>
             <w:tcMar>
               <w:top w:type="dxa" w:w="70"/>
               <w:left w:type="dxa" w:w="110"/>
@@ -17245,7 +17261,7 @@
               <w:bottom w:val="single" w:color="CFE3DF" w:sz="4"/>
               <w:right w:val="single" w:color="CFE3DF" w:sz="4"/>
             </w:tcBorders>
-            <w:shd w:fill="FCFBF7" w:val="clear"/>
+            <w:shd w:fill="F2ECDC" w:val="clear"/>
             <w:tcMar>
               <w:top w:type="dxa" w:w="70"/>
               <w:left w:type="dxa" w:w="110"/>
@@ -17276,7 +17292,7 @@
               <w:bottom w:val="single" w:color="CFE3DF" w:sz="4"/>
               <w:right w:val="single" w:color="CFE3DF" w:sz="4"/>
             </w:tcBorders>
-            <w:shd w:fill="FCFBF7" w:val="clear"/>
+            <w:shd w:fill="F2ECDC" w:val="clear"/>
             <w:tcMar>
               <w:top w:type="dxa" w:w="70"/>
               <w:left w:type="dxa" w:w="110"/>
@@ -17425,7 +17441,7 @@
               <w:bottom w:val="single" w:color="CFE3DF" w:sz="4"/>
               <w:right w:val="single" w:color="CFE3DF" w:sz="4"/>
             </w:tcBorders>
-            <w:shd w:fill="FCFBF7" w:val="clear"/>
+            <w:shd w:fill="F2ECDC" w:val="clear"/>
             <w:tcMar>
               <w:top w:type="dxa" w:w="70"/>
               <w:left w:type="dxa" w:w="110"/>
@@ -17572,7 +17588,7 @@
               <w:bottom w:val="single" w:color="CFE3DF" w:sz="4"/>
               <w:right w:val="single" w:color="CFE3DF" w:sz="4"/>
             </w:tcBorders>
-            <w:shd w:fill="FCFBF7" w:val="clear"/>
+            <w:shd w:fill="F2ECDC" w:val="clear"/>
             <w:tcMar>
               <w:top w:type="dxa" w:w="70"/>
               <w:left w:type="dxa" w:w="110"/>
@@ -17741,7 +17757,7 @@
               <w:bottom w:val="single" w:color="CFE3DF" w:sz="4"/>
               <w:right w:val="single" w:color="CFE3DF" w:sz="4"/>
             </w:tcBorders>
-            <w:shd w:fill="FCFBF7" w:val="clear"/>
+            <w:shd w:fill="F2ECDC" w:val="clear"/>
             <w:tcMar>
               <w:top w:type="dxa" w:w="70"/>
               <w:left w:type="dxa" w:w="110"/>
@@ -17868,7 +17884,7 @@
               <w:bottom w:val="single" w:color="CFE3DF" w:sz="4"/>
               <w:right w:val="single" w:color="CFE3DF" w:sz="4"/>
             </w:tcBorders>
-            <w:shd w:fill="FCFBF7" w:val="clear"/>
+            <w:shd w:fill="F2ECDC" w:val="clear"/>
             <w:tcMar>
               <w:top w:type="dxa" w:w="45"/>
               <w:left w:type="dxa" w:w="90"/>
@@ -18033,7 +18049,7 @@
               <w:bottom w:val="single" w:color="CFE3DF" w:sz="4"/>
               <w:right w:val="single" w:color="CFE3DF" w:sz="4"/>
             </w:tcBorders>
-            <w:shd w:fill="FCFBF7" w:val="clear"/>
+            <w:shd w:fill="F2ECDC" w:val="clear"/>
             <w:tcMar>
               <w:top w:type="dxa" w:w="70"/>
               <w:left w:type="dxa" w:w="110"/>
@@ -18064,7 +18080,7 @@
               <w:bottom w:val="single" w:color="CFE3DF" w:sz="4"/>
               <w:right w:val="single" w:color="CFE3DF" w:sz="4"/>
             </w:tcBorders>
-            <w:shd w:fill="FCFBF7" w:val="clear"/>
+            <w:shd w:fill="F2ECDC" w:val="clear"/>
             <w:tcMar>
               <w:top w:type="dxa" w:w="70"/>
               <w:left w:type="dxa" w:w="110"/>
@@ -18095,7 +18111,7 @@
               <w:bottom w:val="single" w:color="CFE3DF" w:sz="4"/>
               <w:right w:val="single" w:color="CFE3DF" w:sz="4"/>
             </w:tcBorders>
-            <w:shd w:fill="FCFBF7" w:val="clear"/>
+            <w:shd w:fill="F2ECDC" w:val="clear"/>
             <w:tcMar>
               <w:top w:type="dxa" w:w="70"/>
               <w:left w:type="dxa" w:w="110"/>
@@ -18420,7 +18436,7 @@
               <w:bottom w:val="single" w:color="CFE3DF" w:sz="4"/>
               <w:right w:val="single" w:color="CFE3DF" w:sz="4"/>
             </w:tcBorders>
-            <w:shd w:fill="FCFBF7" w:val="clear"/>
+            <w:shd w:fill="F2ECDC" w:val="clear"/>
             <w:tcMar>
               <w:top w:type="dxa" w:w="100"/>
               <w:left w:type="dxa" w:w="130"/>
@@ -18599,7 +18615,7 @@
               <w:bottom w:val="single" w:color="CFE3DF" w:sz="4"/>
               <w:right w:val="single" w:color="CFE3DF" w:sz="4"/>
             </w:tcBorders>
-            <w:shd w:fill="FCFBF7" w:val="clear"/>
+            <w:shd w:fill="F2ECDC" w:val="clear"/>
             <w:tcMar>
               <w:top w:type="dxa" w:w="70"/>
               <w:left w:type="dxa" w:w="110"/>
@@ -18768,7 +18784,7 @@
               <w:bottom w:val="single" w:color="CFE3DF" w:sz="4"/>
               <w:right w:val="single" w:color="CFE3DF" w:sz="4"/>
             </w:tcBorders>
-            <w:shd w:fill="FCFBF7" w:val="clear"/>
+            <w:shd w:fill="F2ECDC" w:val="clear"/>
             <w:tcMar>
               <w:top w:type="dxa" w:w="70"/>
               <w:left w:type="dxa" w:w="110"/>
@@ -18895,7 +18911,7 @@
               <w:bottom w:val="single" w:color="CFE3DF" w:sz="4"/>
               <w:right w:val="single" w:color="CFE3DF" w:sz="4"/>
             </w:tcBorders>
-            <w:shd w:fill="FCFBF7" w:val="clear"/>
+            <w:shd w:fill="F2ECDC" w:val="clear"/>
             <w:tcMar>
               <w:top w:type="dxa" w:w="45"/>
               <w:left w:type="dxa" w:w="90"/>
@@ -19060,7 +19076,7 @@
               <w:bottom w:val="single" w:color="CFE3DF" w:sz="4"/>
               <w:right w:val="single" w:color="CFE3DF" w:sz="4"/>
             </w:tcBorders>
-            <w:shd w:fill="FCFBF7" w:val="clear"/>
+            <w:shd w:fill="F2ECDC" w:val="clear"/>
             <w:tcMar>
               <w:top w:type="dxa" w:w="70"/>
               <w:left w:type="dxa" w:w="110"/>
@@ -19091,7 +19107,7 @@
               <w:bottom w:val="single" w:color="CFE3DF" w:sz="4"/>
               <w:right w:val="single" w:color="CFE3DF" w:sz="4"/>
             </w:tcBorders>
-            <w:shd w:fill="FCFBF7" w:val="clear"/>
+            <w:shd w:fill="F2ECDC" w:val="clear"/>
             <w:tcMar>
               <w:top w:type="dxa" w:w="70"/>
               <w:left w:type="dxa" w:w="110"/>
@@ -19122,7 +19138,7 @@
               <w:bottom w:val="single" w:color="CFE3DF" w:sz="4"/>
               <w:right w:val="single" w:color="CFE3DF" w:sz="4"/>
             </w:tcBorders>
-            <w:shd w:fill="FCFBF7" w:val="clear"/>
+            <w:shd w:fill="F2ECDC" w:val="clear"/>
             <w:tcMar>
               <w:top w:type="dxa" w:w="70"/>
               <w:left w:type="dxa" w:w="110"/>
@@ -19463,7 +19479,7 @@
               <w:bottom w:val="single" w:color="CFE3DF" w:sz="4"/>
               <w:right w:val="single" w:color="CFE3DF" w:sz="4"/>
             </w:tcBorders>
-            <w:shd w:fill="FCFBF7" w:val="clear"/>
+            <w:shd w:fill="F2ECDC" w:val="clear"/>
             <w:tcMar>
               <w:top w:type="dxa" w:w="70"/>
               <w:left w:type="dxa" w:w="110"/>
@@ -19636,7 +19652,7 @@
               <w:bottom w:val="single" w:color="CFE3DF" w:sz="4"/>
               <w:right w:val="single" w:color="CFE3DF" w:sz="4"/>
             </w:tcBorders>
-            <w:shd w:fill="FCFBF7" w:val="clear"/>
+            <w:shd w:fill="F2ECDC" w:val="clear"/>
             <w:tcMar>
               <w:top w:type="dxa" w:w="70"/>
               <w:left w:type="dxa" w:w="110"/>
@@ -19797,7 +19813,7 @@
               <w:bottom w:val="single" w:color="CFE3DF" w:sz="4"/>
               <w:right w:val="single" w:color="CFE3DF" w:sz="4"/>
             </w:tcBorders>
-            <w:shd w:fill="FCFBF7" w:val="clear"/>
+            <w:shd w:fill="F2ECDC" w:val="clear"/>
             <w:tcMar>
               <w:top w:type="dxa" w:w="70"/>
               <w:left w:type="dxa" w:w="110"/>
@@ -20020,7 +20036,7 @@
               <w:bottom w:val="single" w:color="CFE3DF" w:sz="4"/>
               <w:right w:val="single" w:color="CFE3DF" w:sz="4"/>
             </w:tcBorders>
-            <w:shd w:fill="FCFBF7" w:val="clear"/>
+            <w:shd w:fill="F2ECDC" w:val="clear"/>
             <w:tcMar>
               <w:top w:type="dxa" w:w="70"/>
               <w:left w:type="dxa" w:w="110"/>
@@ -20147,7 +20163,7 @@
               <w:bottom w:val="single" w:color="CFE3DF" w:sz="4"/>
               <w:right w:val="single" w:color="CFE3DF" w:sz="4"/>
             </w:tcBorders>
-            <w:shd w:fill="FCFBF7" w:val="clear"/>
+            <w:shd w:fill="F2ECDC" w:val="clear"/>
             <w:tcMar>
               <w:top w:type="dxa" w:w="45"/>
               <w:left w:type="dxa" w:w="90"/>
@@ -20312,7 +20328,7 @@
               <w:bottom w:val="single" w:color="CFE3DF" w:sz="4"/>
               <w:right w:val="single" w:color="CFE3DF" w:sz="4"/>
             </w:tcBorders>
-            <w:shd w:fill="FCFBF7" w:val="clear"/>
+            <w:shd w:fill="F2ECDC" w:val="clear"/>
             <w:tcMar>
               <w:top w:type="dxa" w:w="70"/>
               <w:left w:type="dxa" w:w="110"/>
@@ -20343,7 +20359,7 @@
               <w:bottom w:val="single" w:color="CFE3DF" w:sz="4"/>
               <w:right w:val="single" w:color="CFE3DF" w:sz="4"/>
             </w:tcBorders>
-            <w:shd w:fill="FCFBF7" w:val="clear"/>
+            <w:shd w:fill="F2ECDC" w:val="clear"/>
             <w:tcMar>
               <w:top w:type="dxa" w:w="70"/>
               <w:left w:type="dxa" w:w="110"/>
@@ -20374,7 +20390,7 @@
               <w:bottom w:val="single" w:color="CFE3DF" w:sz="4"/>
               <w:right w:val="single" w:color="CFE3DF" w:sz="4"/>
             </w:tcBorders>
-            <w:shd w:fill="FCFBF7" w:val="clear"/>
+            <w:shd w:fill="F2ECDC" w:val="clear"/>
             <w:tcMar>
               <w:top w:type="dxa" w:w="70"/>
               <w:left w:type="dxa" w:w="110"/>
@@ -20587,7 +20603,7 @@
               <w:bottom w:val="single" w:color="CFE3DF" w:sz="4"/>
               <w:right w:val="single" w:color="CFE3DF" w:sz="4"/>
             </w:tcBorders>
-            <w:shd w:fill="FCFBF7" w:val="clear"/>
+            <w:shd w:fill="F2ECDC" w:val="clear"/>
             <w:tcMar>
               <w:top w:type="dxa" w:w="70"/>
               <w:left w:type="dxa" w:w="110"/>
@@ -20708,7 +20724,7 @@
               <w:bottom w:val="single" w:color="CFE3DF" w:sz="4"/>
               <w:right w:val="single" w:color="CFE3DF" w:sz="4"/>
             </w:tcBorders>
-            <w:shd w:fill="FCFBF7" w:val="clear"/>
+            <w:shd w:fill="F2ECDC" w:val="clear"/>
             <w:tcMar>
               <w:top w:type="dxa" w:w="70"/>
               <w:left w:type="dxa" w:w="110"/>
@@ -20835,7 +20851,7 @@
               <w:bottom w:val="single" w:color="CFE3DF" w:sz="4"/>
               <w:right w:val="single" w:color="CFE3DF" w:sz="4"/>
             </w:tcBorders>
-            <w:shd w:fill="FCFBF7" w:val="clear"/>
+            <w:shd w:fill="F2ECDC" w:val="clear"/>
             <w:tcMar>
               <w:top w:type="dxa" w:w="45"/>
               <w:left w:type="dxa" w:w="90"/>
@@ -21000,7 +21016,7 @@
               <w:bottom w:val="single" w:color="CFE3DF" w:sz="4"/>
               <w:right w:val="single" w:color="CFE3DF" w:sz="4"/>
             </w:tcBorders>
-            <w:shd w:fill="FCFBF7" w:val="clear"/>
+            <w:shd w:fill="F2ECDC" w:val="clear"/>
             <w:tcMar>
               <w:top w:type="dxa" w:w="70"/>
               <w:left w:type="dxa" w:w="110"/>
@@ -21031,7 +21047,7 @@
               <w:bottom w:val="single" w:color="CFE3DF" w:sz="4"/>
               <w:right w:val="single" w:color="CFE3DF" w:sz="4"/>
             </w:tcBorders>
-            <w:shd w:fill="FCFBF7" w:val="clear"/>
+            <w:shd w:fill="F2ECDC" w:val="clear"/>
             <w:tcMar>
               <w:top w:type="dxa" w:w="70"/>
               <w:left w:type="dxa" w:w="110"/>
@@ -21062,7 +21078,7 @@
               <w:bottom w:val="single" w:color="CFE3DF" w:sz="4"/>
               <w:right w:val="single" w:color="CFE3DF" w:sz="4"/>
             </w:tcBorders>
-            <w:shd w:fill="FCFBF7" w:val="clear"/>
+            <w:shd w:fill="F2ECDC" w:val="clear"/>
             <w:tcMar>
               <w:top w:type="dxa" w:w="70"/>
               <w:left w:type="dxa" w:w="110"/>
@@ -21211,7 +21227,7 @@
               <w:bottom w:val="single" w:color="CFE3DF" w:sz="4"/>
               <w:right w:val="single" w:color="CFE3DF" w:sz="4"/>
             </w:tcBorders>
-            <w:shd w:fill="FCFBF7" w:val="clear"/>
+            <w:shd w:fill="F2ECDC" w:val="clear"/>
             <w:tcMar>
               <w:top w:type="dxa" w:w="70"/>
               <w:left w:type="dxa" w:w="110"/>
@@ -21380,7 +21396,7 @@
               <w:bottom w:val="single" w:color="CFE3DF" w:sz="4"/>
               <w:right w:val="single" w:color="CFE3DF" w:sz="4"/>
             </w:tcBorders>
-            <w:shd w:fill="FCFBF7" w:val="clear"/>
+            <w:shd w:fill="F2ECDC" w:val="clear"/>
             <w:tcMar>
               <w:top w:type="dxa" w:w="70"/>
               <w:left w:type="dxa" w:w="110"/>
@@ -21517,7 +21533,7 @@
               <w:bottom w:val="single" w:color="CFE3DF" w:sz="4"/>
               <w:right w:val="single" w:color="CFE3DF" w:sz="4"/>
             </w:tcBorders>
-            <w:shd w:fill="FCFBF7" w:val="clear"/>
+            <w:shd w:fill="F2ECDC" w:val="clear"/>
             <w:tcMar>
               <w:top w:type="dxa" w:w="70"/>
               <w:left w:type="dxa" w:w="110"/>
@@ -21644,7 +21660,7 @@
               <w:bottom w:val="single" w:color="CFE3DF" w:sz="4"/>
               <w:right w:val="single" w:color="CFE3DF" w:sz="4"/>
             </w:tcBorders>
-            <w:shd w:fill="FCFBF7" w:val="clear"/>
+            <w:shd w:fill="F2ECDC" w:val="clear"/>
             <w:tcMar>
               <w:top w:type="dxa" w:w="45"/>
               <w:left w:type="dxa" w:w="90"/>
@@ -21809,7 +21825,7 @@
               <w:bottom w:val="single" w:color="CFE3DF" w:sz="4"/>
               <w:right w:val="single" w:color="CFE3DF" w:sz="4"/>
             </w:tcBorders>
-            <w:shd w:fill="FCFBF7" w:val="clear"/>
+            <w:shd w:fill="F2ECDC" w:val="clear"/>
             <w:tcMar>
               <w:top w:type="dxa" w:w="70"/>
               <w:left w:type="dxa" w:w="110"/>
@@ -21840,7 +21856,7 @@
               <w:bottom w:val="single" w:color="CFE3DF" w:sz="4"/>
               <w:right w:val="single" w:color="CFE3DF" w:sz="4"/>
             </w:tcBorders>
-            <w:shd w:fill="FCFBF7" w:val="clear"/>
+            <w:shd w:fill="F2ECDC" w:val="clear"/>
             <w:tcMar>
               <w:top w:type="dxa" w:w="70"/>
               <w:left w:type="dxa" w:w="110"/>
@@ -21871,7 +21887,7 @@
               <w:bottom w:val="single" w:color="CFE3DF" w:sz="4"/>
               <w:right w:val="single" w:color="CFE3DF" w:sz="4"/>
             </w:tcBorders>
-            <w:shd w:fill="FCFBF7" w:val="clear"/>
+            <w:shd w:fill="F2ECDC" w:val="clear"/>
             <w:tcMar>
               <w:top w:type="dxa" w:w="70"/>
               <w:left w:type="dxa" w:w="110"/>
@@ -22020,7 +22036,7 @@
               <w:bottom w:val="single" w:color="CFE3DF" w:sz="4"/>
               <w:right w:val="single" w:color="CFE3DF" w:sz="4"/>
             </w:tcBorders>
-            <w:shd w:fill="FCFBF7" w:val="clear"/>
+            <w:shd w:fill="F2ECDC" w:val="clear"/>
             <w:tcMar>
               <w:top w:type="dxa" w:w="70"/>
               <w:left w:type="dxa" w:w="110"/>
@@ -22173,7 +22189,7 @@
               <w:bottom w:val="single" w:color="CFE3DF" w:sz="4"/>
               <w:right w:val="single" w:color="CFE3DF" w:sz="4"/>
             </w:tcBorders>
-            <w:shd w:fill="FCFBF7" w:val="clear"/>
+            <w:shd w:fill="F2ECDC" w:val="clear"/>
             <w:tcMar>
               <w:top w:type="dxa" w:w="70"/>
               <w:left w:type="dxa" w:w="110"/>
@@ -22225,7 +22241,7 @@
         </w:rPr>
         <w:t xml:space="preserve">You may want to find some quiet space and time for this exercise. Start by going to the </w:t>
       </w:r>
-      <w:hyperlink w:history="1" r:id="rIdty9k9unn0_gpzyvgrdat2">
+      <w:hyperlink w:history="1" r:id="rIdcg1lz4gjvtl86fld2jiyh">
         <w:r>
           <w:rPr>
             <w:color w:val="1155CC"/>
@@ -22455,7 +22471,7 @@
               <w:bottom w:val="single" w:color="CFE3DF" w:sz="4"/>
               <w:right w:val="single" w:color="CFE3DF" w:sz="4"/>
             </w:tcBorders>
-            <w:shd w:fill="FCFBF7" w:val="clear"/>
+            <w:shd w:fill="F2ECDC" w:val="clear"/>
             <w:tcMar>
               <w:top w:type="dxa" w:w="70"/>
               <w:left w:type="dxa" w:w="110"/>
@@ -22582,7 +22598,7 @@
               <w:bottom w:val="single" w:color="CFE3DF" w:sz="4"/>
               <w:right w:val="single" w:color="CFE3DF" w:sz="4"/>
             </w:tcBorders>
-            <w:shd w:fill="FCFBF7" w:val="clear"/>
+            <w:shd w:fill="F2ECDC" w:val="clear"/>
             <w:tcMar>
               <w:top w:type="dxa" w:w="45"/>
               <w:left w:type="dxa" w:w="90"/>
@@ -22747,7 +22763,7 @@
               <w:bottom w:val="single" w:color="CFE3DF" w:sz="4"/>
               <w:right w:val="single" w:color="CFE3DF" w:sz="4"/>
             </w:tcBorders>
-            <w:shd w:fill="FCFBF7" w:val="clear"/>
+            <w:shd w:fill="F2ECDC" w:val="clear"/>
             <w:tcMar>
               <w:top w:type="dxa" w:w="70"/>
               <w:left w:type="dxa" w:w="110"/>
@@ -22778,7 +22794,7 @@
               <w:bottom w:val="single" w:color="CFE3DF" w:sz="4"/>
               <w:right w:val="single" w:color="CFE3DF" w:sz="4"/>
             </w:tcBorders>
-            <w:shd w:fill="FCFBF7" w:val="clear"/>
+            <w:shd w:fill="F2ECDC" w:val="clear"/>
             <w:tcMar>
               <w:top w:type="dxa" w:w="70"/>
               <w:left w:type="dxa" w:w="110"/>
@@ -22809,7 +22825,7 @@
               <w:bottom w:val="single" w:color="CFE3DF" w:sz="4"/>
               <w:right w:val="single" w:color="CFE3DF" w:sz="4"/>
             </w:tcBorders>
-            <w:shd w:fill="FCFBF7" w:val="clear"/>
+            <w:shd w:fill="F2ECDC" w:val="clear"/>
             <w:tcMar>
               <w:top w:type="dxa" w:w="70"/>
               <w:left w:type="dxa" w:w="110"/>
@@ -22909,7 +22925,7 @@
         </w:rPr>
         <w:t xml:space="preserve"> exercise at: http://</w:t>
       </w:r>
-      <w:hyperlink w:history="1" r:id="rId2uqss-8-qi71y8ruy1aab">
+      <w:hyperlink w:history="1" r:id="rIdntrkbovg8agp6apfu4zve">
         <w:r>
           <w:rPr>
             <w:color w:val="1155CC"/>
@@ -23163,7 +23179,7 @@
               <w:bottom w:val="single" w:color="CFE3DF" w:sz="4"/>
               <w:right w:val="single" w:color="CFE3DF" w:sz="4"/>
             </w:tcBorders>
-            <w:shd w:fill="FCFBF7" w:val="clear"/>
+            <w:shd w:fill="F2ECDC" w:val="clear"/>
             <w:tcMar>
               <w:top w:type="dxa" w:w="70"/>
               <w:left w:type="dxa" w:w="110"/>
@@ -23284,7 +23300,7 @@
               <w:bottom w:val="single" w:color="CFE3DF" w:sz="4"/>
               <w:right w:val="single" w:color="CFE3DF" w:sz="4"/>
             </w:tcBorders>
-            <w:shd w:fill="FCFBF7" w:val="clear"/>
+            <w:shd w:fill="F2ECDC" w:val="clear"/>
             <w:tcMar>
               <w:top w:type="dxa" w:w="70"/>
               <w:left w:type="dxa" w:w="110"/>
@@ -23411,7 +23427,7 @@
               <w:bottom w:val="single" w:color="CFE3DF" w:sz="4"/>
               <w:right w:val="single" w:color="CFE3DF" w:sz="4"/>
             </w:tcBorders>
-            <w:shd w:fill="FCFBF7" w:val="clear"/>
+            <w:shd w:fill="F2ECDC" w:val="clear"/>
             <w:tcMar>
               <w:top w:type="dxa" w:w="45"/>
               <w:left w:type="dxa" w:w="90"/>
@@ -23576,7 +23592,7 @@
               <w:bottom w:val="single" w:color="CFE3DF" w:sz="4"/>
               <w:right w:val="single" w:color="CFE3DF" w:sz="4"/>
             </w:tcBorders>
-            <w:shd w:fill="FCFBF7" w:val="clear"/>
+            <w:shd w:fill="F2ECDC" w:val="clear"/>
             <w:tcMar>
               <w:top w:type="dxa" w:w="70"/>
               <w:left w:type="dxa" w:w="110"/>
@@ -23607,7 +23623,7 @@
               <w:bottom w:val="single" w:color="CFE3DF" w:sz="4"/>
               <w:right w:val="single" w:color="CFE3DF" w:sz="4"/>
             </w:tcBorders>
-            <w:shd w:fill="FCFBF7" w:val="clear"/>
+            <w:shd w:fill="F2ECDC" w:val="clear"/>
             <w:tcMar>
               <w:top w:type="dxa" w:w="70"/>
               <w:left w:type="dxa" w:w="110"/>
@@ -23638,7 +23654,7 @@
               <w:bottom w:val="single" w:color="CFE3DF" w:sz="4"/>
               <w:right w:val="single" w:color="CFE3DF" w:sz="4"/>
             </w:tcBorders>
-            <w:shd w:fill="FCFBF7" w:val="clear"/>
+            <w:shd w:fill="F2ECDC" w:val="clear"/>
             <w:tcMar>
               <w:top w:type="dxa" w:w="70"/>
               <w:left w:type="dxa" w:w="110"/>
@@ -23770,7 +23786,7 @@
         </w:rPr>
         <w:t xml:space="preserve">Either at that time, or later on, write down a word (or words) from the </w:t>
       </w:r>
-      <w:hyperlink w:history="1" r:id="rIdiselblm1a_uyjxhjaagwx">
+      <w:hyperlink w:history="1" r:id="rIdtmhhajbrqxren9w5u1vze">
         <w:r>
           <w:rPr>
             <w:color w:val="1155CC"/>
@@ -23807,7 +23823,7 @@
         </w:rPr>
         <w:t xml:space="preserve">Then look at the </w:t>
       </w:r>
-      <w:hyperlink w:history="1" r:id="rIdn73qb8kpkq-kth6rmv6rn">
+      <w:hyperlink w:history="1" r:id="rIddk8y0pkwhmctjd3hk3o2c">
         <w:r>
           <w:rPr>
             <w:color w:val="1155CC"/>
@@ -23945,7 +23961,7 @@
               <w:bottom w:val="single" w:color="CFE3DF" w:sz="4"/>
               <w:right w:val="single" w:color="CFE3DF" w:sz="4"/>
             </w:tcBorders>
-            <w:shd w:fill="FCFBF7" w:val="clear"/>
+            <w:shd w:fill="F2ECDC" w:val="clear"/>
             <w:tcMar>
               <w:top w:type="dxa" w:w="70"/>
               <w:left w:type="dxa" w:w="110"/>
@@ -24082,7 +24098,7 @@
               <w:bottom w:val="single" w:color="CFE3DF" w:sz="4"/>
               <w:right w:val="single" w:color="CFE3DF" w:sz="4"/>
             </w:tcBorders>
-            <w:shd w:fill="FCFBF7" w:val="clear"/>
+            <w:shd w:fill="F2ECDC" w:val="clear"/>
             <w:tcMar>
               <w:top w:type="dxa" w:w="70"/>
               <w:left w:type="dxa" w:w="110"/>
@@ -24283,7 +24299,7 @@
               <w:bottom w:val="single" w:color="CFE3DF" w:sz="4"/>
               <w:right w:val="single" w:color="CFE3DF" w:sz="4"/>
             </w:tcBorders>
-            <w:shd w:fill="FCFBF7" w:val="clear"/>
+            <w:shd w:fill="F2ECDC" w:val="clear"/>
             <w:tcMar>
               <w:top w:type="dxa" w:w="70"/>
               <w:left w:type="dxa" w:w="110"/>
@@ -24410,7 +24426,7 @@
               <w:bottom w:val="single" w:color="CFE3DF" w:sz="4"/>
               <w:right w:val="single" w:color="CFE3DF" w:sz="4"/>
             </w:tcBorders>
-            <w:shd w:fill="FCFBF7" w:val="clear"/>
+            <w:shd w:fill="F2ECDC" w:val="clear"/>
             <w:tcMar>
               <w:top w:type="dxa" w:w="45"/>
               <w:left w:type="dxa" w:w="90"/>
@@ -24575,7 +24591,7 @@
               <w:bottom w:val="single" w:color="CFE3DF" w:sz="4"/>
               <w:right w:val="single" w:color="CFE3DF" w:sz="4"/>
             </w:tcBorders>
-            <w:shd w:fill="FCFBF7" w:val="clear"/>
+            <w:shd w:fill="F2ECDC" w:val="clear"/>
             <w:tcMar>
               <w:top w:type="dxa" w:w="70"/>
               <w:left w:type="dxa" w:w="110"/>
@@ -24606,7 +24622,7 @@
               <w:bottom w:val="single" w:color="CFE3DF" w:sz="4"/>
               <w:right w:val="single" w:color="CFE3DF" w:sz="4"/>
             </w:tcBorders>
-            <w:shd w:fill="FCFBF7" w:val="clear"/>
+            <w:shd w:fill="F2ECDC" w:val="clear"/>
             <w:tcMar>
               <w:top w:type="dxa" w:w="70"/>
               <w:left w:type="dxa" w:w="110"/>
@@ -24637,7 +24653,7 @@
               <w:bottom w:val="single" w:color="CFE3DF" w:sz="4"/>
               <w:right w:val="single" w:color="CFE3DF" w:sz="4"/>
             </w:tcBorders>
-            <w:shd w:fill="FCFBF7" w:val="clear"/>
+            <w:shd w:fill="F2ECDC" w:val="clear"/>
             <w:tcMar>
               <w:top w:type="dxa" w:w="70"/>
               <w:left w:type="dxa" w:w="110"/>
@@ -24870,7 +24886,7 @@
               <w:bottom w:val="single" w:color="CFE3DF" w:sz="4"/>
               <w:right w:val="single" w:color="CFE3DF" w:sz="4"/>
             </w:tcBorders>
-            <w:shd w:fill="FCFBF7" w:val="clear"/>
+            <w:shd w:fill="F2ECDC" w:val="clear"/>
             <w:tcMar>
               <w:top w:type="dxa" w:w="70"/>
               <w:left w:type="dxa" w:w="110"/>
@@ -24991,7 +25007,7 @@
               <w:bottom w:val="single" w:color="CFE3DF" w:sz="4"/>
               <w:right w:val="single" w:color="CFE3DF" w:sz="4"/>
             </w:tcBorders>
-            <w:shd w:fill="FCFBF7" w:val="clear"/>
+            <w:shd w:fill="F2ECDC" w:val="clear"/>
             <w:tcMar>
               <w:top w:type="dxa" w:w="70"/>
               <w:left w:type="dxa" w:w="110"/>
@@ -25118,7 +25134,7 @@
               <w:bottom w:val="single" w:color="CFE3DF" w:sz="4"/>
               <w:right w:val="single" w:color="CFE3DF" w:sz="4"/>
             </w:tcBorders>
-            <w:shd w:fill="FCFBF7" w:val="clear"/>
+            <w:shd w:fill="F2ECDC" w:val="clear"/>
             <w:tcMar>
               <w:top w:type="dxa" w:w="45"/>
               <w:left w:type="dxa" w:w="90"/>
@@ -25283,7 +25299,7 @@
               <w:bottom w:val="single" w:color="CFE3DF" w:sz="4"/>
               <w:right w:val="single" w:color="CFE3DF" w:sz="4"/>
             </w:tcBorders>
-            <w:shd w:fill="FCFBF7" w:val="clear"/>
+            <w:shd w:fill="F2ECDC" w:val="clear"/>
             <w:tcMar>
               <w:top w:type="dxa" w:w="70"/>
               <w:left w:type="dxa" w:w="110"/>
@@ -25314,7 +25330,7 @@
               <w:bottom w:val="single" w:color="CFE3DF" w:sz="4"/>
               <w:right w:val="single" w:color="CFE3DF" w:sz="4"/>
             </w:tcBorders>
-            <w:shd w:fill="FCFBF7" w:val="clear"/>
+            <w:shd w:fill="F2ECDC" w:val="clear"/>
             <w:tcMar>
               <w:top w:type="dxa" w:w="70"/>
               <w:left w:type="dxa" w:w="110"/>
@@ -25345,7 +25361,7 @@
               <w:bottom w:val="single" w:color="CFE3DF" w:sz="4"/>
               <w:right w:val="single" w:color="CFE3DF" w:sz="4"/>
             </w:tcBorders>
-            <w:shd w:fill="FCFBF7" w:val="clear"/>
+            <w:shd w:fill="F2ECDC" w:val="clear"/>
             <w:tcMar>
               <w:top w:type="dxa" w:w="70"/>
               <w:left w:type="dxa" w:w="110"/>
@@ -25461,7 +25477,7 @@
         </w:rPr>
         <w:t xml:space="preserve"> at http://</w:t>
       </w:r>
-      <w:hyperlink w:history="1" r:id="rIdujnhtb4syjlebplqjbonc">
+      <w:hyperlink w:history="1" r:id="rIdamrk8bzfbanoou2gmo-az">
         <w:r>
           <w:rPr>
             <w:color w:val="1155CC"/>
@@ -25607,7 +25623,7 @@
               <w:bottom w:val="single" w:color="CFE3DF" w:sz="4"/>
               <w:right w:val="single" w:color="CFE3DF" w:sz="4"/>
             </w:tcBorders>
-            <w:shd w:fill="FCFBF7" w:val="clear"/>
+            <w:shd w:fill="F2ECDC" w:val="clear"/>
             <w:tcMar>
               <w:top w:type="dxa" w:w="70"/>
               <w:left w:type="dxa" w:w="110"/>
@@ -25796,7 +25812,7 @@
               <w:bottom w:val="single" w:color="CFE3DF" w:sz="4"/>
               <w:right w:val="single" w:color="CFE3DF" w:sz="4"/>
             </w:tcBorders>
-            <w:shd w:fill="FCFBF7" w:val="clear"/>
+            <w:shd w:fill="F2ECDC" w:val="clear"/>
             <w:tcMar>
               <w:top w:type="dxa" w:w="70"/>
               <w:left w:type="dxa" w:w="110"/>
@@ -25923,7 +25939,7 @@
               <w:bottom w:val="single" w:color="CFE3DF" w:sz="4"/>
               <w:right w:val="single" w:color="CFE3DF" w:sz="4"/>
             </w:tcBorders>
-            <w:shd w:fill="FCFBF7" w:val="clear"/>
+            <w:shd w:fill="F2ECDC" w:val="clear"/>
             <w:tcMar>
               <w:top w:type="dxa" w:w="45"/>
               <w:left w:type="dxa" w:w="90"/>
@@ -26088,7 +26104,7 @@
               <w:bottom w:val="single" w:color="CFE3DF" w:sz="4"/>
               <w:right w:val="single" w:color="CFE3DF" w:sz="4"/>
             </w:tcBorders>
-            <w:shd w:fill="FCFBF7" w:val="clear"/>
+            <w:shd w:fill="F2ECDC" w:val="clear"/>
             <w:tcMar>
               <w:top w:type="dxa" w:w="70"/>
               <w:left w:type="dxa" w:w="110"/>
@@ -26119,7 +26135,7 @@
               <w:bottom w:val="single" w:color="CFE3DF" w:sz="4"/>
               <w:right w:val="single" w:color="CFE3DF" w:sz="4"/>
             </w:tcBorders>
-            <w:shd w:fill="FCFBF7" w:val="clear"/>
+            <w:shd w:fill="F2ECDC" w:val="clear"/>
             <w:tcMar>
               <w:top w:type="dxa" w:w="70"/>
               <w:left w:type="dxa" w:w="110"/>
@@ -26150,7 +26166,7 @@
               <w:bottom w:val="single" w:color="CFE3DF" w:sz="4"/>
               <w:right w:val="single" w:color="CFE3DF" w:sz="4"/>
             </w:tcBorders>
-            <w:shd w:fill="FCFBF7" w:val="clear"/>
+            <w:shd w:fill="F2ECDC" w:val="clear"/>
             <w:tcMar>
               <w:top w:type="dxa" w:w="70"/>
               <w:left w:type="dxa" w:w="110"/>
@@ -26335,7 +26351,7 @@
               <w:bottom w:val="single" w:color="CFE3DF" w:sz="4"/>
               <w:right w:val="single" w:color="CFE3DF" w:sz="4"/>
             </w:tcBorders>
-            <w:shd w:fill="FCFBF7" w:val="clear"/>
+            <w:shd w:fill="F2ECDC" w:val="clear"/>
             <w:tcMar>
               <w:top w:type="dxa" w:w="70"/>
               <w:left w:type="dxa" w:w="110"/>
@@ -26492,7 +26508,7 @@
               <w:bottom w:val="single" w:color="CFE3DF" w:sz="4"/>
               <w:right w:val="single" w:color="CFE3DF" w:sz="4"/>
             </w:tcBorders>
-            <w:shd w:fill="FCFBF7" w:val="clear"/>
+            <w:shd w:fill="F2ECDC" w:val="clear"/>
             <w:tcMar>
               <w:top w:type="dxa" w:w="70"/>
               <w:left w:type="dxa" w:w="110"/>
@@ -26619,7 +26635,7 @@
               <w:bottom w:val="single" w:color="CFE3DF" w:sz="4"/>
               <w:right w:val="single" w:color="CFE3DF" w:sz="4"/>
             </w:tcBorders>
-            <w:shd w:fill="FCFBF7" w:val="clear"/>
+            <w:shd w:fill="F2ECDC" w:val="clear"/>
             <w:tcMar>
               <w:top w:type="dxa" w:w="45"/>
               <w:left w:type="dxa" w:w="90"/>
@@ -26784,7 +26800,7 @@
               <w:bottom w:val="single" w:color="CFE3DF" w:sz="4"/>
               <w:right w:val="single" w:color="CFE3DF" w:sz="4"/>
             </w:tcBorders>
-            <w:shd w:fill="FCFBF7" w:val="clear"/>
+            <w:shd w:fill="F2ECDC" w:val="clear"/>
             <w:tcMar>
               <w:top w:type="dxa" w:w="70"/>
               <w:left w:type="dxa" w:w="110"/>
@@ -26815,7 +26831,7 @@
               <w:bottom w:val="single" w:color="CFE3DF" w:sz="4"/>
               <w:right w:val="single" w:color="CFE3DF" w:sz="4"/>
             </w:tcBorders>
-            <w:shd w:fill="FCFBF7" w:val="clear"/>
+            <w:shd w:fill="F2ECDC" w:val="clear"/>
             <w:tcMar>
               <w:top w:type="dxa" w:w="70"/>
               <w:left w:type="dxa" w:w="110"/>
@@ -26846,7 +26862,7 @@
               <w:bottom w:val="single" w:color="CFE3DF" w:sz="4"/>
               <w:right w:val="single" w:color="CFE3DF" w:sz="4"/>
             </w:tcBorders>
-            <w:shd w:fill="FCFBF7" w:val="clear"/>
+            <w:shd w:fill="F2ECDC" w:val="clear"/>
             <w:tcMar>
               <w:top w:type="dxa" w:w="70"/>
               <w:left w:type="dxa" w:w="110"/>
@@ -27095,7 +27111,7 @@
               <w:bottom w:val="single" w:color="CFE3DF" w:sz="4"/>
               <w:right w:val="single" w:color="CFE3DF" w:sz="4"/>
             </w:tcBorders>
-            <w:shd w:fill="FCFBF7" w:val="clear"/>
+            <w:shd w:fill="F2ECDC" w:val="clear"/>
             <w:tcMar>
               <w:top w:type="dxa" w:w="70"/>
               <w:left w:type="dxa" w:w="110"/>
@@ -27308,7 +27324,7 @@
               <w:bottom w:val="single" w:color="CFE3DF" w:sz="4"/>
               <w:right w:val="single" w:color="CFE3DF" w:sz="4"/>
             </w:tcBorders>
-            <w:shd w:fill="FCFBF7" w:val="clear"/>
+            <w:shd w:fill="F2ECDC" w:val="clear"/>
             <w:tcMar>
               <w:top w:type="dxa" w:w="70"/>
               <w:left w:type="dxa" w:w="110"/>
@@ -27435,7 +27451,7 @@
               <w:bottom w:val="single" w:color="CFE3DF" w:sz="4"/>
               <w:right w:val="single" w:color="CFE3DF" w:sz="4"/>
             </w:tcBorders>
-            <w:shd w:fill="FCFBF7" w:val="clear"/>
+            <w:shd w:fill="F2ECDC" w:val="clear"/>
             <w:tcMar>
               <w:top w:type="dxa" w:w="45"/>
               <w:left w:type="dxa" w:w="90"/>
@@ -27600,7 +27616,7 @@
               <w:bottom w:val="single" w:color="CFE3DF" w:sz="4"/>
               <w:right w:val="single" w:color="CFE3DF" w:sz="4"/>
             </w:tcBorders>
-            <w:shd w:fill="FCFBF7" w:val="clear"/>
+            <w:shd w:fill="F2ECDC" w:val="clear"/>
             <w:tcMar>
               <w:top w:type="dxa" w:w="70"/>
               <w:left w:type="dxa" w:w="110"/>
@@ -27631,7 +27647,7 @@
               <w:bottom w:val="single" w:color="CFE3DF" w:sz="4"/>
               <w:right w:val="single" w:color="CFE3DF" w:sz="4"/>
             </w:tcBorders>
-            <w:shd w:fill="FCFBF7" w:val="clear"/>
+            <w:shd w:fill="F2ECDC" w:val="clear"/>
             <w:tcMar>
               <w:top w:type="dxa" w:w="70"/>
               <w:left w:type="dxa" w:w="110"/>
@@ -27662,7 +27678,7 @@
               <w:bottom w:val="single" w:color="CFE3DF" w:sz="4"/>
               <w:right w:val="single" w:color="CFE3DF" w:sz="4"/>
             </w:tcBorders>
-            <w:shd w:fill="FCFBF7" w:val="clear"/>
+            <w:shd w:fill="F2ECDC" w:val="clear"/>
             <w:tcMar>
               <w:top w:type="dxa" w:w="70"/>
               <w:left w:type="dxa" w:w="110"/>
@@ -27931,7 +27947,7 @@
               <w:bottom w:val="single" w:color="CFE3DF" w:sz="4"/>
               <w:right w:val="single" w:color="CFE3DF" w:sz="4"/>
             </w:tcBorders>
-            <w:shd w:fill="FCFBF7" w:val="clear"/>
+            <w:shd w:fill="F2ECDC" w:val="clear"/>
             <w:tcMar>
               <w:top w:type="dxa" w:w="70"/>
               <w:left w:type="dxa" w:w="110"/>
@@ -28058,7 +28074,7 @@
               <w:bottom w:val="single" w:color="CFE3DF" w:sz="4"/>
               <w:right w:val="single" w:color="CFE3DF" w:sz="4"/>
             </w:tcBorders>
-            <w:shd w:fill="FCFBF7" w:val="clear"/>
+            <w:shd w:fill="F2ECDC" w:val="clear"/>
             <w:tcMar>
               <w:top w:type="dxa" w:w="45"/>
               <w:left w:type="dxa" w:w="90"/>
@@ -28223,7 +28239,7 @@
               <w:bottom w:val="single" w:color="CFE3DF" w:sz="4"/>
               <w:right w:val="single" w:color="CFE3DF" w:sz="4"/>
             </w:tcBorders>
-            <w:shd w:fill="FCFBF7" w:val="clear"/>
+            <w:shd w:fill="F2ECDC" w:val="clear"/>
             <w:tcMar>
               <w:top w:type="dxa" w:w="70"/>
               <w:left w:type="dxa" w:w="110"/>
@@ -28254,7 +28270,7 @@
               <w:bottom w:val="single" w:color="CFE3DF" w:sz="4"/>
               <w:right w:val="single" w:color="CFE3DF" w:sz="4"/>
             </w:tcBorders>
-            <w:shd w:fill="FCFBF7" w:val="clear"/>
+            <w:shd w:fill="F2ECDC" w:val="clear"/>
             <w:tcMar>
               <w:top w:type="dxa" w:w="70"/>
               <w:left w:type="dxa" w:w="110"/>
@@ -28285,7 +28301,7 @@
               <w:bottom w:val="single" w:color="CFE3DF" w:sz="4"/>
               <w:right w:val="single" w:color="CFE3DF" w:sz="4"/>
             </w:tcBorders>
-            <w:shd w:fill="FCFBF7" w:val="clear"/>
+            <w:shd w:fill="F2ECDC" w:val="clear"/>
             <w:tcMar>
               <w:top w:type="dxa" w:w="70"/>
               <w:left w:type="dxa" w:w="110"/>
@@ -28454,7 +28470,7 @@
               <w:bottom w:val="single" w:color="CFE3DF" w:sz="4"/>
               <w:right w:val="single" w:color="CFE3DF" w:sz="4"/>
             </w:tcBorders>
-            <w:shd w:fill="FCFBF7" w:val="clear"/>
+            <w:shd w:fill="F2ECDC" w:val="clear"/>
             <w:tcMar>
               <w:top w:type="dxa" w:w="70"/>
               <w:left w:type="dxa" w:w="110"/>
@@ -28506,7 +28522,7 @@
         </w:rPr>
         <w:t xml:space="preserve">Later on, when you have time, sit down with the </w:t>
       </w:r>
-      <w:hyperlink w:history="1" r:id="rIdvw9r_ush8irkkcmuhl9qu">
+      <w:hyperlink w:history="1" r:id="rId4ht2jitc48x6suwylvpws">
         <w:r>
           <w:rPr>
             <w:color w:val="1155CC"/>
@@ -28527,7 +28543,7 @@
         </w:rPr>
         <w:t xml:space="preserve"> and see if you can figure out what need(s) you were in pain about. Translate your judgment words into need words. As usual, I suggest that you limit the words you use to those on the </w:t>
       </w:r>
-      <w:hyperlink w:history="1" r:id="rId6-pproc0vzulr7nnyamfd">
+      <w:hyperlink w:history="1" r:id="rIdv6lahd4t4roxr-vysxf1u">
         <w:r>
           <w:rPr>
             <w:color w:val="1155CC"/>
@@ -28665,7 +28681,7 @@
               <w:bottom w:val="single" w:color="CFE3DF" w:sz="4"/>
               <w:right w:val="single" w:color="CFE3DF" w:sz="4"/>
             </w:tcBorders>
-            <w:shd w:fill="FCFBF7" w:val="clear"/>
+            <w:shd w:fill="F2ECDC" w:val="clear"/>
             <w:tcMar>
               <w:top w:type="dxa" w:w="70"/>
               <w:left w:type="dxa" w:w="110"/>
@@ -28786,7 +28802,7 @@
               <w:bottom w:val="single" w:color="CFE3DF" w:sz="4"/>
               <w:right w:val="single" w:color="CFE3DF" w:sz="4"/>
             </w:tcBorders>
-            <w:shd w:fill="FCFBF7" w:val="clear"/>
+            <w:shd w:fill="F2ECDC" w:val="clear"/>
             <w:tcMar>
               <w:top w:type="dxa" w:w="70"/>
               <w:left w:type="dxa" w:w="110"/>
@@ -28913,7 +28929,7 @@
               <w:bottom w:val="single" w:color="CFE3DF" w:sz="4"/>
               <w:right w:val="single" w:color="CFE3DF" w:sz="4"/>
             </w:tcBorders>
-            <w:shd w:fill="FCFBF7" w:val="clear"/>
+            <w:shd w:fill="F2ECDC" w:val="clear"/>
             <w:tcMar>
               <w:top w:type="dxa" w:w="45"/>
               <w:left w:type="dxa" w:w="90"/>
@@ -29078,7 +29094,7 @@
               <w:bottom w:val="single" w:color="CFE3DF" w:sz="4"/>
               <w:right w:val="single" w:color="CFE3DF" w:sz="4"/>
             </w:tcBorders>
-            <w:shd w:fill="FCFBF7" w:val="clear"/>
+            <w:shd w:fill="F2ECDC" w:val="clear"/>
             <w:tcMar>
               <w:top w:type="dxa" w:w="70"/>
               <w:left w:type="dxa" w:w="110"/>
@@ -29109,7 +29125,7 @@
               <w:bottom w:val="single" w:color="CFE3DF" w:sz="4"/>
               <w:right w:val="single" w:color="CFE3DF" w:sz="4"/>
             </w:tcBorders>
-            <w:shd w:fill="FCFBF7" w:val="clear"/>
+            <w:shd w:fill="F2ECDC" w:val="clear"/>
             <w:tcMar>
               <w:top w:type="dxa" w:w="70"/>
               <w:left w:type="dxa" w:w="110"/>
@@ -29140,7 +29156,7 @@
               <w:bottom w:val="single" w:color="CFE3DF" w:sz="4"/>
               <w:right w:val="single" w:color="CFE3DF" w:sz="4"/>
             </w:tcBorders>
-            <w:shd w:fill="FCFBF7" w:val="clear"/>
+            <w:shd w:fill="F2ECDC" w:val="clear"/>
             <w:tcMar>
               <w:top w:type="dxa" w:w="70"/>
               <w:left w:type="dxa" w:w="110"/>
@@ -29369,7 +29385,7 @@
               <w:bottom w:val="single" w:color="CFE3DF" w:sz="4"/>
               <w:right w:val="single" w:color="CFE3DF" w:sz="4"/>
             </w:tcBorders>
-            <w:shd w:fill="FCFBF7" w:val="clear"/>
+            <w:shd w:fill="F2ECDC" w:val="clear"/>
             <w:tcMar>
               <w:top w:type="dxa" w:w="70"/>
               <w:left w:type="dxa" w:w="110"/>
@@ -29586,7 +29602,7 @@
               <w:bottom w:val="single" w:color="CFE3DF" w:sz="4"/>
               <w:right w:val="single" w:color="CFE3DF" w:sz="4"/>
             </w:tcBorders>
-            <w:shd w:fill="FCFBF7" w:val="clear"/>
+            <w:shd w:fill="F2ECDC" w:val="clear"/>
             <w:tcMar>
               <w:top w:type="dxa" w:w="70"/>
               <w:left w:type="dxa" w:w="110"/>
@@ -29713,7 +29729,7 @@
               <w:bottom w:val="single" w:color="CFE3DF" w:sz="4"/>
               <w:right w:val="single" w:color="CFE3DF" w:sz="4"/>
             </w:tcBorders>
-            <w:shd w:fill="FCFBF7" w:val="clear"/>
+            <w:shd w:fill="F2ECDC" w:val="clear"/>
             <w:tcMar>
               <w:top w:type="dxa" w:w="45"/>
               <w:left w:type="dxa" w:w="90"/>
@@ -29878,7 +29894,7 @@
               <w:bottom w:val="single" w:color="CFE3DF" w:sz="4"/>
               <w:right w:val="single" w:color="CFE3DF" w:sz="4"/>
             </w:tcBorders>
-            <w:shd w:fill="FCFBF7" w:val="clear"/>
+            <w:shd w:fill="F2ECDC" w:val="clear"/>
             <w:tcMar>
               <w:top w:type="dxa" w:w="70"/>
               <w:left w:type="dxa" w:w="110"/>
@@ -29909,7 +29925,7 @@
               <w:bottom w:val="single" w:color="CFE3DF" w:sz="4"/>
               <w:right w:val="single" w:color="CFE3DF" w:sz="4"/>
             </w:tcBorders>
-            <w:shd w:fill="FCFBF7" w:val="clear"/>
+            <w:shd w:fill="F2ECDC" w:val="clear"/>
             <w:tcMar>
               <w:top w:type="dxa" w:w="70"/>
               <w:left w:type="dxa" w:w="110"/>
@@ -29940,7 +29956,7 @@
               <w:bottom w:val="single" w:color="CFE3DF" w:sz="4"/>
               <w:right w:val="single" w:color="CFE3DF" w:sz="4"/>
             </w:tcBorders>
-            <w:shd w:fill="FCFBF7" w:val="clear"/>
+            <w:shd w:fill="F2ECDC" w:val="clear"/>
             <w:tcMar>
               <w:top w:type="dxa" w:w="70"/>
               <w:left w:type="dxa" w:w="110"/>
@@ -30221,7 +30237,7 @@
               <w:bottom w:val="single" w:color="CFE3DF" w:sz="4"/>
               <w:right w:val="single" w:color="CFE3DF" w:sz="4"/>
             </w:tcBorders>
-            <w:shd w:fill="FCFBF7" w:val="clear"/>
+            <w:shd w:fill="F2ECDC" w:val="clear"/>
             <w:tcMar>
               <w:top w:type="dxa" w:w="70"/>
               <w:left w:type="dxa" w:w="110"/>
@@ -30378,7 +30394,7 @@
               <w:bottom w:val="single" w:color="CFE3DF" w:sz="4"/>
               <w:right w:val="single" w:color="CFE3DF" w:sz="4"/>
             </w:tcBorders>
-            <w:shd w:fill="FCFBF7" w:val="clear"/>
+            <w:shd w:fill="F2ECDC" w:val="clear"/>
             <w:tcMar>
               <w:top w:type="dxa" w:w="70"/>
               <w:left w:type="dxa" w:w="110"/>
@@ -30505,7 +30521,7 @@
               <w:bottom w:val="single" w:color="CFE3DF" w:sz="4"/>
               <w:right w:val="single" w:color="CFE3DF" w:sz="4"/>
             </w:tcBorders>
-            <w:shd w:fill="FCFBF7" w:val="clear"/>
+            <w:shd w:fill="F2ECDC" w:val="clear"/>
             <w:tcMar>
               <w:top w:type="dxa" w:w="45"/>
               <w:left w:type="dxa" w:w="90"/>
@@ -30670,7 +30686,7 @@
               <w:bottom w:val="single" w:color="CFE3DF" w:sz="4"/>
               <w:right w:val="single" w:color="CFE3DF" w:sz="4"/>
             </w:tcBorders>
-            <w:shd w:fill="FCFBF7" w:val="clear"/>
+            <w:shd w:fill="F2ECDC" w:val="clear"/>
             <w:tcMar>
               <w:top w:type="dxa" w:w="70"/>
               <w:left w:type="dxa" w:w="110"/>
@@ -30701,7 +30717,7 @@
               <w:bottom w:val="single" w:color="CFE3DF" w:sz="4"/>
               <w:right w:val="single" w:color="CFE3DF" w:sz="4"/>
             </w:tcBorders>
-            <w:shd w:fill="FCFBF7" w:val="clear"/>
+            <w:shd w:fill="F2ECDC" w:val="clear"/>
             <w:tcMar>
               <w:top w:type="dxa" w:w="70"/>
               <w:left w:type="dxa" w:w="110"/>
@@ -30732,7 +30748,7 @@
               <w:bottom w:val="single" w:color="CFE3DF" w:sz="4"/>
               <w:right w:val="single" w:color="CFE3DF" w:sz="4"/>
             </w:tcBorders>
-            <w:shd w:fill="FCFBF7" w:val="clear"/>
+            <w:shd w:fill="F2ECDC" w:val="clear"/>
             <w:tcMar>
               <w:top w:type="dxa" w:w="70"/>
               <w:left w:type="dxa" w:w="110"/>
@@ -31005,7 +31021,7 @@
               <w:bottom w:val="single" w:color="CFE3DF" w:sz="4"/>
               <w:right w:val="single" w:color="CFE3DF" w:sz="4"/>
             </w:tcBorders>
-            <w:shd w:fill="FCFBF7" w:val="clear"/>
+            <w:shd w:fill="F2ECDC" w:val="clear"/>
             <w:tcMar>
               <w:top w:type="dxa" w:w="70"/>
               <w:left w:type="dxa" w:w="110"/>
@@ -31132,7 +31148,7 @@
               <w:bottom w:val="single" w:color="CFE3DF" w:sz="4"/>
               <w:right w:val="single" w:color="CFE3DF" w:sz="4"/>
             </w:tcBorders>
-            <w:shd w:fill="FCFBF7" w:val="clear"/>
+            <w:shd w:fill="F2ECDC" w:val="clear"/>
             <w:tcMar>
               <w:top w:type="dxa" w:w="45"/>
               <w:left w:type="dxa" w:w="90"/>
@@ -31297,7 +31313,7 @@
               <w:bottom w:val="single" w:color="CFE3DF" w:sz="4"/>
               <w:right w:val="single" w:color="CFE3DF" w:sz="4"/>
             </w:tcBorders>
-            <w:shd w:fill="FCFBF7" w:val="clear"/>
+            <w:shd w:fill="F2ECDC" w:val="clear"/>
             <w:tcMar>
               <w:top w:type="dxa" w:w="70"/>
               <w:left w:type="dxa" w:w="110"/>
@@ -31328,7 +31344,7 @@
               <w:bottom w:val="single" w:color="CFE3DF" w:sz="4"/>
               <w:right w:val="single" w:color="CFE3DF" w:sz="4"/>
             </w:tcBorders>
-            <w:shd w:fill="FCFBF7" w:val="clear"/>
+            <w:shd w:fill="F2ECDC" w:val="clear"/>
             <w:tcMar>
               <w:top w:type="dxa" w:w="70"/>
               <w:left w:type="dxa" w:w="110"/>
@@ -31359,7 +31375,7 @@
               <w:bottom w:val="single" w:color="CFE3DF" w:sz="4"/>
               <w:right w:val="single" w:color="CFE3DF" w:sz="4"/>
             </w:tcBorders>
-            <w:shd w:fill="FCFBF7" w:val="clear"/>
+            <w:shd w:fill="F2ECDC" w:val="clear"/>
             <w:tcMar>
               <w:top w:type="dxa" w:w="70"/>
               <w:left w:type="dxa" w:w="110"/>
@@ -31556,7 +31572,7 @@
               <w:bottom w:val="single" w:color="CFE3DF" w:sz="4"/>
               <w:right w:val="single" w:color="CFE3DF" w:sz="4"/>
             </w:tcBorders>
-            <w:shd w:fill="FCFBF7" w:val="clear"/>
+            <w:shd w:fill="F2ECDC" w:val="clear"/>
             <w:tcMar>
               <w:top w:type="dxa" w:w="70"/>
               <w:left w:type="dxa" w:w="110"/>
@@ -31757,7 +31773,7 @@
               <w:bottom w:val="single" w:color="CFE3DF" w:sz="4"/>
               <w:right w:val="single" w:color="CFE3DF" w:sz="4"/>
             </w:tcBorders>
-            <w:shd w:fill="FCFBF7" w:val="clear"/>
+            <w:shd w:fill="F2ECDC" w:val="clear"/>
             <w:tcMar>
               <w:top w:type="dxa" w:w="70"/>
               <w:left w:type="dxa" w:w="110"/>
@@ -31884,7 +31900,7 @@
               <w:bottom w:val="single" w:color="CFE3DF" w:sz="4"/>
               <w:right w:val="single" w:color="CFE3DF" w:sz="4"/>
             </w:tcBorders>
-            <w:shd w:fill="FCFBF7" w:val="clear"/>
+            <w:shd w:fill="F2ECDC" w:val="clear"/>
             <w:tcMar>
               <w:top w:type="dxa" w:w="45"/>
               <w:left w:type="dxa" w:w="90"/>
@@ -32049,7 +32065,7 @@
               <w:bottom w:val="single" w:color="CFE3DF" w:sz="4"/>
               <w:right w:val="single" w:color="CFE3DF" w:sz="4"/>
             </w:tcBorders>
-            <w:shd w:fill="FCFBF7" w:val="clear"/>
+            <w:shd w:fill="F2ECDC" w:val="clear"/>
             <w:tcMar>
               <w:top w:type="dxa" w:w="70"/>
               <w:left w:type="dxa" w:w="110"/>
@@ -32080,7 +32096,7 @@
               <w:bottom w:val="single" w:color="CFE3DF" w:sz="4"/>
               <w:right w:val="single" w:color="CFE3DF" w:sz="4"/>
             </w:tcBorders>
-            <w:shd w:fill="FCFBF7" w:val="clear"/>
+            <w:shd w:fill="F2ECDC" w:val="clear"/>
             <w:tcMar>
               <w:top w:type="dxa" w:w="70"/>
               <w:left w:type="dxa" w:w="110"/>
@@ -32111,7 +32127,7 @@
               <w:bottom w:val="single" w:color="CFE3DF" w:sz="4"/>
               <w:right w:val="single" w:color="CFE3DF" w:sz="4"/>
             </w:tcBorders>
-            <w:shd w:fill="FCFBF7" w:val="clear"/>
+            <w:shd w:fill="F2ECDC" w:val="clear"/>
             <w:tcMar>
               <w:top w:type="dxa" w:w="70"/>
               <w:left w:type="dxa" w:w="110"/>
@@ -32324,7 +32340,7 @@
               <w:bottom w:val="single" w:color="CFE3DF" w:sz="4"/>
               <w:right w:val="single" w:color="CFE3DF" w:sz="4"/>
             </w:tcBorders>
-            <w:shd w:fill="FCFBF7" w:val="clear"/>
+            <w:shd w:fill="F2ECDC" w:val="clear"/>
             <w:tcMar>
               <w:top w:type="dxa" w:w="70"/>
               <w:left w:type="dxa" w:w="110"/>
@@ -32633,7 +32649,7 @@
               <w:bottom w:val="single" w:color="CFE3DF" w:sz="4"/>
               <w:right w:val="single" w:color="CFE3DF" w:sz="4"/>
             </w:tcBorders>
-            <w:shd w:fill="FCFBF7" w:val="clear"/>
+            <w:shd w:fill="F2ECDC" w:val="clear"/>
             <w:tcMar>
               <w:top w:type="dxa" w:w="70"/>
               <w:left w:type="dxa" w:w="110"/>
@@ -32760,7 +32776,7 @@
               <w:bottom w:val="single" w:color="CFE3DF" w:sz="4"/>
               <w:right w:val="single" w:color="CFE3DF" w:sz="4"/>
             </w:tcBorders>
-            <w:shd w:fill="FCFBF7" w:val="clear"/>
+            <w:shd w:fill="F2ECDC" w:val="clear"/>
             <w:tcMar>
               <w:top w:type="dxa" w:w="45"/>
               <w:left w:type="dxa" w:w="90"/>
@@ -32925,7 +32941,7 @@
               <w:bottom w:val="single" w:color="CFE3DF" w:sz="4"/>
               <w:right w:val="single" w:color="CFE3DF" w:sz="4"/>
             </w:tcBorders>
-            <w:shd w:fill="FCFBF7" w:val="clear"/>
+            <w:shd w:fill="F2ECDC" w:val="clear"/>
             <w:tcMar>
               <w:top w:type="dxa" w:w="70"/>
               <w:left w:type="dxa" w:w="110"/>
@@ -32956,7 +32972,7 @@
               <w:bottom w:val="single" w:color="CFE3DF" w:sz="4"/>
               <w:right w:val="single" w:color="CFE3DF" w:sz="4"/>
             </w:tcBorders>
-            <w:shd w:fill="FCFBF7" w:val="clear"/>
+            <w:shd w:fill="F2ECDC" w:val="clear"/>
             <w:tcMar>
               <w:top w:type="dxa" w:w="70"/>
               <w:left w:type="dxa" w:w="110"/>
@@ -32987,7 +33003,7 @@
               <w:bottom w:val="single" w:color="CFE3DF" w:sz="4"/>
               <w:right w:val="single" w:color="CFE3DF" w:sz="4"/>
             </w:tcBorders>
-            <w:shd w:fill="FCFBF7" w:val="clear"/>
+            <w:shd w:fill="F2ECDC" w:val="clear"/>
             <w:tcMar>
               <w:top w:type="dxa" w:w="70"/>
               <w:left w:type="dxa" w:w="110"/>
@@ -33152,7 +33168,7 @@
               <w:bottom w:val="single" w:color="CFE3DF" w:sz="4"/>
               <w:right w:val="single" w:color="CFE3DF" w:sz="4"/>
             </w:tcBorders>
-            <w:shd w:fill="FCFBF7" w:val="clear"/>
+            <w:shd w:fill="F2ECDC" w:val="clear"/>
             <w:tcMar>
               <w:top w:type="dxa" w:w="70"/>
               <w:left w:type="dxa" w:w="110"/>
@@ -33429,7 +33445,7 @@
               <w:bottom w:val="single" w:color="CFE3DF" w:sz="4"/>
               <w:right w:val="single" w:color="CFE3DF" w:sz="4"/>
             </w:tcBorders>
-            <w:shd w:fill="FCFBF7" w:val="clear"/>
+            <w:shd w:fill="F2ECDC" w:val="clear"/>
             <w:tcMar>
               <w:top w:type="dxa" w:w="70"/>
               <w:left w:type="dxa" w:w="110"/>
@@ -33550,7 +33566,7 @@
               <w:bottom w:val="single" w:color="CFE3DF" w:sz="4"/>
               <w:right w:val="single" w:color="CFE3DF" w:sz="4"/>
             </w:tcBorders>
-            <w:shd w:fill="FCFBF7" w:val="clear"/>
+            <w:shd w:fill="F2ECDC" w:val="clear"/>
             <w:tcMar>
               <w:top w:type="dxa" w:w="70"/>
               <w:left w:type="dxa" w:w="110"/>
@@ -33677,7 +33693,7 @@
               <w:bottom w:val="single" w:color="CFE3DF" w:sz="4"/>
               <w:right w:val="single" w:color="CFE3DF" w:sz="4"/>
             </w:tcBorders>
-            <w:shd w:fill="FCFBF7" w:val="clear"/>
+            <w:shd w:fill="F2ECDC" w:val="clear"/>
             <w:tcMar>
               <w:top w:type="dxa" w:w="45"/>
               <w:left w:type="dxa" w:w="90"/>
@@ -33842,7 +33858,7 @@
               <w:bottom w:val="single" w:color="CFE3DF" w:sz="4"/>
               <w:right w:val="single" w:color="CFE3DF" w:sz="4"/>
             </w:tcBorders>
-            <w:shd w:fill="FCFBF7" w:val="clear"/>
+            <w:shd w:fill="F2ECDC" w:val="clear"/>
             <w:tcMar>
               <w:top w:type="dxa" w:w="70"/>
               <w:left w:type="dxa" w:w="110"/>
@@ -33873,7 +33889,7 @@
               <w:bottom w:val="single" w:color="CFE3DF" w:sz="4"/>
               <w:right w:val="single" w:color="CFE3DF" w:sz="4"/>
             </w:tcBorders>
-            <w:shd w:fill="FCFBF7" w:val="clear"/>
+            <w:shd w:fill="F2ECDC" w:val="clear"/>
             <w:tcMar>
               <w:top w:type="dxa" w:w="70"/>
               <w:left w:type="dxa" w:w="110"/>
@@ -33904,7 +33920,7 @@
               <w:bottom w:val="single" w:color="CFE3DF" w:sz="4"/>
               <w:right w:val="single" w:color="CFE3DF" w:sz="4"/>
             </w:tcBorders>
-            <w:shd w:fill="FCFBF7" w:val="clear"/>
+            <w:shd w:fill="F2ECDC" w:val="clear"/>
             <w:tcMar>
               <w:top w:type="dxa" w:w="70"/>
               <w:left w:type="dxa" w:w="110"/>
@@ -34101,7 +34117,7 @@
               <w:bottom w:val="single" w:color="CFE3DF" w:sz="4"/>
               <w:right w:val="single" w:color="CFE3DF" w:sz="4"/>
             </w:tcBorders>
-            <w:shd w:fill="FCFBF7" w:val="clear"/>
+            <w:shd w:fill="F2ECDC" w:val="clear"/>
             <w:tcMar>
               <w:top w:type="dxa" w:w="70"/>
               <w:left w:type="dxa" w:w="110"/>
@@ -34270,7 +34286,7 @@
               <w:bottom w:val="single" w:color="CFE3DF" w:sz="4"/>
               <w:right w:val="single" w:color="CFE3DF" w:sz="4"/>
             </w:tcBorders>
-            <w:shd w:fill="FCFBF7" w:val="clear"/>
+            <w:shd w:fill="F2ECDC" w:val="clear"/>
             <w:tcMar>
               <w:top w:type="dxa" w:w="70"/>
               <w:left w:type="dxa" w:w="110"/>
@@ -34397,7 +34413,7 @@
               <w:bottom w:val="single" w:color="CFE3DF" w:sz="4"/>
               <w:right w:val="single" w:color="CFE3DF" w:sz="4"/>
             </w:tcBorders>
-            <w:shd w:fill="FCFBF7" w:val="clear"/>
+            <w:shd w:fill="F2ECDC" w:val="clear"/>
             <w:tcMar>
               <w:top w:type="dxa" w:w="45"/>
               <w:left w:type="dxa" w:w="90"/>
@@ -34562,7 +34578,7 @@
               <w:bottom w:val="single" w:color="CFE3DF" w:sz="4"/>
               <w:right w:val="single" w:color="CFE3DF" w:sz="4"/>
             </w:tcBorders>
-            <w:shd w:fill="FCFBF7" w:val="clear"/>
+            <w:shd w:fill="F2ECDC" w:val="clear"/>
             <w:tcMar>
               <w:top w:type="dxa" w:w="70"/>
               <w:left w:type="dxa" w:w="110"/>
@@ -34593,7 +34609,7 @@
               <w:bottom w:val="single" w:color="CFE3DF" w:sz="4"/>
               <w:right w:val="single" w:color="CFE3DF" w:sz="4"/>
             </w:tcBorders>
-            <w:shd w:fill="FCFBF7" w:val="clear"/>
+            <w:shd w:fill="F2ECDC" w:val="clear"/>
             <w:tcMar>
               <w:top w:type="dxa" w:w="70"/>
               <w:left w:type="dxa" w:w="110"/>
@@ -34624,7 +34640,7 @@
               <w:bottom w:val="single" w:color="CFE3DF" w:sz="4"/>
               <w:right w:val="single" w:color="CFE3DF" w:sz="4"/>
             </w:tcBorders>
-            <w:shd w:fill="FCFBF7" w:val="clear"/>
+            <w:shd w:fill="F2ECDC" w:val="clear"/>
             <w:tcMar>
               <w:top w:type="dxa" w:w="70"/>
               <w:left w:type="dxa" w:w="110"/>
@@ -34945,7 +34961,7 @@
               <w:bottom w:val="single" w:color="CFE3DF" w:sz="4"/>
               <w:right w:val="single" w:color="CFE3DF" w:sz="4"/>
             </w:tcBorders>
-            <w:shd w:fill="FCFBF7" w:val="clear"/>
+            <w:shd w:fill="F2ECDC" w:val="clear"/>
             <w:tcMar>
               <w:top w:type="dxa" w:w="70"/>
               <w:left w:type="dxa" w:w="110"/>
@@ -35072,7 +35088,7 @@
               <w:bottom w:val="single" w:color="CFE3DF" w:sz="4"/>
               <w:right w:val="single" w:color="CFE3DF" w:sz="4"/>
             </w:tcBorders>
-            <w:shd w:fill="FCFBF7" w:val="clear"/>
+            <w:shd w:fill="F2ECDC" w:val="clear"/>
             <w:tcMar>
               <w:top w:type="dxa" w:w="45"/>
               <w:left w:type="dxa" w:w="90"/>
@@ -35237,7 +35253,7 @@
               <w:bottom w:val="single" w:color="CFE3DF" w:sz="4"/>
               <w:right w:val="single" w:color="CFE3DF" w:sz="4"/>
             </w:tcBorders>
-            <w:shd w:fill="FCFBF7" w:val="clear"/>
+            <w:shd w:fill="F2ECDC" w:val="clear"/>
             <w:tcMar>
               <w:top w:type="dxa" w:w="70"/>
               <w:left w:type="dxa" w:w="110"/>
@@ -35268,7 +35284,7 @@
               <w:bottom w:val="single" w:color="CFE3DF" w:sz="4"/>
               <w:right w:val="single" w:color="CFE3DF" w:sz="4"/>
             </w:tcBorders>
-            <w:shd w:fill="FCFBF7" w:val="clear"/>
+            <w:shd w:fill="F2ECDC" w:val="clear"/>
             <w:tcMar>
               <w:top w:type="dxa" w:w="70"/>
               <w:left w:type="dxa" w:w="110"/>
@@ -35299,7 +35315,7 @@
               <w:bottom w:val="single" w:color="CFE3DF" w:sz="4"/>
               <w:right w:val="single" w:color="CFE3DF" w:sz="4"/>
             </w:tcBorders>
-            <w:shd w:fill="FCFBF7" w:val="clear"/>
+            <w:shd w:fill="F2ECDC" w:val="clear"/>
             <w:tcMar>
               <w:top w:type="dxa" w:w="70"/>
               <w:left w:type="dxa" w:w="110"/>
@@ -35688,7 +35704,7 @@
               <w:bottom w:val="single" w:color="CFE3DF" w:sz="4"/>
               <w:right w:val="single" w:color="CFE3DF" w:sz="4"/>
             </w:tcBorders>
-            <w:shd w:fill="FCFBF7" w:val="clear"/>
+            <w:shd w:fill="F2ECDC" w:val="clear"/>
             <w:tcMar>
               <w:top w:type="dxa" w:w="70"/>
               <w:left w:type="dxa" w:w="110"/>
@@ -35815,7 +35831,7 @@
               <w:bottom w:val="single" w:color="CFE3DF" w:sz="4"/>
               <w:right w:val="single" w:color="CFE3DF" w:sz="4"/>
             </w:tcBorders>
-            <w:shd w:fill="FCFBF7" w:val="clear"/>
+            <w:shd w:fill="F2ECDC" w:val="clear"/>
             <w:tcMar>
               <w:top w:type="dxa" w:w="45"/>
               <w:left w:type="dxa" w:w="90"/>
@@ -35980,7 +35996,7 @@
               <w:bottom w:val="single" w:color="CFE3DF" w:sz="4"/>
               <w:right w:val="single" w:color="CFE3DF" w:sz="4"/>
             </w:tcBorders>
-            <w:shd w:fill="FCFBF7" w:val="clear"/>
+            <w:shd w:fill="F2ECDC" w:val="clear"/>
             <w:tcMar>
               <w:top w:type="dxa" w:w="70"/>
               <w:left w:type="dxa" w:w="110"/>
@@ -36011,7 +36027,7 @@
               <w:bottom w:val="single" w:color="CFE3DF" w:sz="4"/>
               <w:right w:val="single" w:color="CFE3DF" w:sz="4"/>
             </w:tcBorders>
-            <w:shd w:fill="FCFBF7" w:val="clear"/>
+            <w:shd w:fill="F2ECDC" w:val="clear"/>
             <w:tcMar>
               <w:top w:type="dxa" w:w="70"/>
               <w:left w:type="dxa" w:w="110"/>
@@ -36042,7 +36058,7 @@
               <w:bottom w:val="single" w:color="CFE3DF" w:sz="4"/>
               <w:right w:val="single" w:color="CFE3DF" w:sz="4"/>
             </w:tcBorders>
-            <w:shd w:fill="FCFBF7" w:val="clear"/>
+            <w:shd w:fill="F2ECDC" w:val="clear"/>
             <w:tcMar>
               <w:top w:type="dxa" w:w="70"/>
               <w:left w:type="dxa" w:w="110"/>
@@ -36463,7 +36479,7 @@
               <w:bottom w:val="single" w:color="CFE3DF" w:sz="4"/>
               <w:right w:val="single" w:color="CFE3DF" w:sz="4"/>
             </w:tcBorders>
-            <w:shd w:fill="FCFBF7" w:val="clear"/>
+            <w:shd w:fill="F2ECDC" w:val="clear"/>
             <w:tcMar>
               <w:top w:type="dxa" w:w="100"/>
               <w:left w:type="dxa" w:w="130"/>
@@ -36714,7 +36730,7 @@
               <w:bottom w:val="single" w:color="CFE3DF" w:sz="4"/>
               <w:right w:val="single" w:color="CFE3DF" w:sz="4"/>
             </w:tcBorders>
-            <w:shd w:fill="FCFBF7" w:val="clear"/>
+            <w:shd w:fill="F2ECDC" w:val="clear"/>
             <w:tcMar>
               <w:top w:type="dxa" w:w="100"/>
               <w:left w:type="dxa" w:w="130"/>
@@ -36913,7 +36929,7 @@
               <w:bottom w:val="single" w:color="CFE3DF" w:sz="4"/>
               <w:right w:val="single" w:color="CFE3DF" w:sz="4"/>
             </w:tcBorders>
-            <w:shd w:fill="FCFBF7" w:val="clear"/>
+            <w:shd w:fill="F2ECDC" w:val="clear"/>
             <w:tcMar>
               <w:top w:type="dxa" w:w="70"/>
               <w:left w:type="dxa" w:w="110"/>
@@ -37040,7 +37056,7 @@
               <w:bottom w:val="single" w:color="CFE3DF" w:sz="4"/>
               <w:right w:val="single" w:color="CFE3DF" w:sz="4"/>
             </w:tcBorders>
-            <w:shd w:fill="FCFBF7" w:val="clear"/>
+            <w:shd w:fill="F2ECDC" w:val="clear"/>
             <w:tcMar>
               <w:top w:type="dxa" w:w="45"/>
               <w:left w:type="dxa" w:w="90"/>
@@ -37205,7 +37221,7 @@
               <w:bottom w:val="single" w:color="CFE3DF" w:sz="4"/>
               <w:right w:val="single" w:color="CFE3DF" w:sz="4"/>
             </w:tcBorders>
-            <w:shd w:fill="FCFBF7" w:val="clear"/>
+            <w:shd w:fill="F2ECDC" w:val="clear"/>
             <w:tcMar>
               <w:top w:type="dxa" w:w="70"/>
               <w:left w:type="dxa" w:w="110"/>
@@ -37236,7 +37252,7 @@
               <w:bottom w:val="single" w:color="CFE3DF" w:sz="4"/>
               <w:right w:val="single" w:color="CFE3DF" w:sz="4"/>
             </w:tcBorders>
-            <w:shd w:fill="FCFBF7" w:val="clear"/>
+            <w:shd w:fill="F2ECDC" w:val="clear"/>
             <w:tcMar>
               <w:top w:type="dxa" w:w="70"/>
               <w:left w:type="dxa" w:w="110"/>
@@ -37267,7 +37283,7 @@
               <w:bottom w:val="single" w:color="CFE3DF" w:sz="4"/>
               <w:right w:val="single" w:color="CFE3DF" w:sz="4"/>
             </w:tcBorders>
-            <w:shd w:fill="FCFBF7" w:val="clear"/>
+            <w:shd w:fill="F2ECDC" w:val="clear"/>
             <w:tcMar>
               <w:top w:type="dxa" w:w="70"/>
               <w:left w:type="dxa" w:w="110"/>
@@ -37508,7 +37524,7 @@
               <w:bottom w:val="single" w:color="CFE3DF" w:sz="4"/>
               <w:right w:val="single" w:color="CFE3DF" w:sz="4"/>
             </w:tcBorders>
-            <w:shd w:fill="FCFBF7" w:val="clear"/>
+            <w:shd w:fill="F2ECDC" w:val="clear"/>
             <w:tcMar>
               <w:top w:type="dxa" w:w="70"/>
               <w:left w:type="dxa" w:w="110"/>
@@ -37701,7 +37717,7 @@
               <w:bottom w:val="single" w:color="CFE3DF" w:sz="4"/>
               <w:right w:val="single" w:color="CFE3DF" w:sz="4"/>
             </w:tcBorders>
-            <w:shd w:fill="FCFBF7" w:val="clear"/>
+            <w:shd w:fill="F2ECDC" w:val="clear"/>
             <w:tcMar>
               <w:top w:type="dxa" w:w="70"/>
               <w:left w:type="dxa" w:w="110"/>
@@ -37828,7 +37844,7 @@
               <w:bottom w:val="single" w:color="CFE3DF" w:sz="4"/>
               <w:right w:val="single" w:color="CFE3DF" w:sz="4"/>
             </w:tcBorders>
-            <w:shd w:fill="FCFBF7" w:val="clear"/>
+            <w:shd w:fill="F2ECDC" w:val="clear"/>
             <w:tcMar>
               <w:top w:type="dxa" w:w="45"/>
               <w:left w:type="dxa" w:w="90"/>
@@ -37993,7 +38009,7 @@
               <w:bottom w:val="single" w:color="CFE3DF" w:sz="4"/>
               <w:right w:val="single" w:color="CFE3DF" w:sz="4"/>
             </w:tcBorders>
-            <w:shd w:fill="FCFBF7" w:val="clear"/>
+            <w:shd w:fill="F2ECDC" w:val="clear"/>
             <w:tcMar>
               <w:top w:type="dxa" w:w="70"/>
               <w:left w:type="dxa" w:w="110"/>
@@ -38024,7 +38040,7 @@
               <w:bottom w:val="single" w:color="CFE3DF" w:sz="4"/>
               <w:right w:val="single" w:color="CFE3DF" w:sz="4"/>
             </w:tcBorders>
-            <w:shd w:fill="FCFBF7" w:val="clear"/>
+            <w:shd w:fill="F2ECDC" w:val="clear"/>
             <w:tcMar>
               <w:top w:type="dxa" w:w="70"/>
               <w:left w:type="dxa" w:w="110"/>
@@ -38055,7 +38071,7 @@
               <w:bottom w:val="single" w:color="CFE3DF" w:sz="4"/>
               <w:right w:val="single" w:color="CFE3DF" w:sz="4"/>
             </w:tcBorders>
-            <w:shd w:fill="FCFBF7" w:val="clear"/>
+            <w:shd w:fill="F2ECDC" w:val="clear"/>
             <w:tcMar>
               <w:top w:type="dxa" w:w="70"/>
               <w:left w:type="dxa" w:w="110"/>
@@ -38284,7 +38300,7 @@
               <w:bottom w:val="single" w:color="CFE3DF" w:sz="4"/>
               <w:right w:val="single" w:color="CFE3DF" w:sz="4"/>
             </w:tcBorders>
-            <w:shd w:fill="FCFBF7" w:val="clear"/>
+            <w:shd w:fill="F2ECDC" w:val="clear"/>
             <w:tcMar>
               <w:top w:type="dxa" w:w="70"/>
               <w:left w:type="dxa" w:w="110"/>
@@ -38569,7 +38585,7 @@
               <w:bottom w:val="single" w:color="CFE3DF" w:sz="4"/>
               <w:right w:val="single" w:color="CFE3DF" w:sz="4"/>
             </w:tcBorders>
-            <w:shd w:fill="FCFBF7" w:val="clear"/>
+            <w:shd w:fill="F2ECDC" w:val="clear"/>
             <w:tcMar>
               <w:top w:type="dxa" w:w="70"/>
               <w:left w:type="dxa" w:w="110"/>
@@ -38696,7 +38712,7 @@
               <w:bottom w:val="single" w:color="CFE3DF" w:sz="4"/>
               <w:right w:val="single" w:color="CFE3DF" w:sz="4"/>
             </w:tcBorders>
-            <w:shd w:fill="FCFBF7" w:val="clear"/>
+            <w:shd w:fill="F2ECDC" w:val="clear"/>
             <w:tcMar>
               <w:top w:type="dxa" w:w="45"/>
               <w:left w:type="dxa" w:w="90"/>
@@ -38861,7 +38877,7 @@
               <w:bottom w:val="single" w:color="CFE3DF" w:sz="4"/>
               <w:right w:val="single" w:color="CFE3DF" w:sz="4"/>
             </w:tcBorders>
-            <w:shd w:fill="FCFBF7" w:val="clear"/>
+            <w:shd w:fill="F2ECDC" w:val="clear"/>
             <w:tcMar>
               <w:top w:type="dxa" w:w="70"/>
               <w:left w:type="dxa" w:w="110"/>
@@ -38892,7 +38908,7 @@
               <w:bottom w:val="single" w:color="CFE3DF" w:sz="4"/>
               <w:right w:val="single" w:color="CFE3DF" w:sz="4"/>
             </w:tcBorders>
-            <w:shd w:fill="FCFBF7" w:val="clear"/>
+            <w:shd w:fill="F2ECDC" w:val="clear"/>
             <w:tcMar>
               <w:top w:type="dxa" w:w="70"/>
               <w:left w:type="dxa" w:w="110"/>
@@ -38923,7 +38939,7 @@
               <w:bottom w:val="single" w:color="CFE3DF" w:sz="4"/>
               <w:right w:val="single" w:color="CFE3DF" w:sz="4"/>
             </w:tcBorders>
-            <w:shd w:fill="FCFBF7" w:val="clear"/>
+            <w:shd w:fill="F2ECDC" w:val="clear"/>
             <w:tcMar>
               <w:top w:type="dxa" w:w="70"/>
               <w:left w:type="dxa" w:w="110"/>
@@ -39188,7 +39204,7 @@
               <w:bottom w:val="single" w:color="CFE3DF" w:sz="4"/>
               <w:right w:val="single" w:color="CFE3DF" w:sz="4"/>
             </w:tcBorders>
-            <w:shd w:fill="FCFBF7" w:val="clear"/>
+            <w:shd w:fill="F2ECDC" w:val="clear"/>
             <w:tcMar>
               <w:top w:type="dxa" w:w="70"/>
               <w:left w:type="dxa" w:w="110"/>
@@ -39341,7 +39357,7 @@
               <w:bottom w:val="single" w:color="CFE3DF" w:sz="4"/>
               <w:right w:val="single" w:color="CFE3DF" w:sz="4"/>
             </w:tcBorders>
-            <w:shd w:fill="FCFBF7" w:val="clear"/>
+            <w:shd w:fill="F2ECDC" w:val="clear"/>
             <w:tcMar>
               <w:top w:type="dxa" w:w="70"/>
               <w:left w:type="dxa" w:w="110"/>
@@ -39468,7 +39484,7 @@
               <w:bottom w:val="single" w:color="CFE3DF" w:sz="4"/>
               <w:right w:val="single" w:color="CFE3DF" w:sz="4"/>
             </w:tcBorders>
-            <w:shd w:fill="FCFBF7" w:val="clear"/>
+            <w:shd w:fill="F2ECDC" w:val="clear"/>
             <w:tcMar>
               <w:top w:type="dxa" w:w="45"/>
               <w:left w:type="dxa" w:w="90"/>
@@ -39633,7 +39649,7 @@
               <w:bottom w:val="single" w:color="CFE3DF" w:sz="4"/>
               <w:right w:val="single" w:color="CFE3DF" w:sz="4"/>
             </w:tcBorders>
-            <w:shd w:fill="FCFBF7" w:val="clear"/>
+            <w:shd w:fill="F2ECDC" w:val="clear"/>
             <w:tcMar>
               <w:top w:type="dxa" w:w="70"/>
               <w:left w:type="dxa" w:w="110"/>
@@ -39664,7 +39680,7 @@
               <w:bottom w:val="single" w:color="CFE3DF" w:sz="4"/>
               <w:right w:val="single" w:color="CFE3DF" w:sz="4"/>
             </w:tcBorders>
-            <w:shd w:fill="FCFBF7" w:val="clear"/>
+            <w:shd w:fill="F2ECDC" w:val="clear"/>
             <w:tcMar>
               <w:top w:type="dxa" w:w="70"/>
               <w:left w:type="dxa" w:w="110"/>
@@ -39695,7 +39711,7 @@
               <w:bottom w:val="single" w:color="CFE3DF" w:sz="4"/>
               <w:right w:val="single" w:color="CFE3DF" w:sz="4"/>
             </w:tcBorders>
-            <w:shd w:fill="FCFBF7" w:val="clear"/>
+            <w:shd w:fill="F2ECDC" w:val="clear"/>
             <w:tcMar>
               <w:top w:type="dxa" w:w="70"/>
               <w:left w:type="dxa" w:w="110"/>
@@ -39936,7 +39952,7 @@
               <w:bottom w:val="single" w:color="CFE3DF" w:sz="4"/>
               <w:right w:val="single" w:color="CFE3DF" w:sz="4"/>
             </w:tcBorders>
-            <w:shd w:fill="FCFBF7" w:val="clear"/>
+            <w:shd w:fill="F2ECDC" w:val="clear"/>
             <w:tcMar>
               <w:top w:type="dxa" w:w="70"/>
               <w:left w:type="dxa" w:w="110"/>
@@ -40073,7 +40089,7 @@
               <w:bottom w:val="single" w:color="CFE3DF" w:sz="4"/>
               <w:right w:val="single" w:color="CFE3DF" w:sz="4"/>
             </w:tcBorders>
-            <w:shd w:fill="FCFBF7" w:val="clear"/>
+            <w:shd w:fill="F2ECDC" w:val="clear"/>
             <w:tcMar>
               <w:top w:type="dxa" w:w="70"/>
               <w:left w:type="dxa" w:w="110"/>
@@ -40200,7 +40216,7 @@
               <w:bottom w:val="single" w:color="CFE3DF" w:sz="4"/>
               <w:right w:val="single" w:color="CFE3DF" w:sz="4"/>
             </w:tcBorders>
-            <w:shd w:fill="FCFBF7" w:val="clear"/>
+            <w:shd w:fill="F2ECDC" w:val="clear"/>
             <w:tcMar>
               <w:top w:type="dxa" w:w="45"/>
               <w:left w:type="dxa" w:w="90"/>
@@ -40365,7 +40381,7 @@
               <w:bottom w:val="single" w:color="CFE3DF" w:sz="4"/>
               <w:right w:val="single" w:color="CFE3DF" w:sz="4"/>
             </w:tcBorders>
-            <w:shd w:fill="FCFBF7" w:val="clear"/>
+            <w:shd w:fill="F2ECDC" w:val="clear"/>
             <w:tcMar>
               <w:top w:type="dxa" w:w="70"/>
               <w:left w:type="dxa" w:w="110"/>
@@ -40396,7 +40412,7 @@
               <w:bottom w:val="single" w:color="CFE3DF" w:sz="4"/>
               <w:right w:val="single" w:color="CFE3DF" w:sz="4"/>
             </w:tcBorders>
-            <w:shd w:fill="FCFBF7" w:val="clear"/>
+            <w:shd w:fill="F2ECDC" w:val="clear"/>
             <w:tcMar>
               <w:top w:type="dxa" w:w="70"/>
               <w:left w:type="dxa" w:w="110"/>
@@ -40427,7 +40443,7 @@
               <w:bottom w:val="single" w:color="CFE3DF" w:sz="4"/>
               <w:right w:val="single" w:color="CFE3DF" w:sz="4"/>
             </w:tcBorders>
-            <w:shd w:fill="FCFBF7" w:val="clear"/>
+            <w:shd w:fill="F2ECDC" w:val="clear"/>
             <w:tcMar>
               <w:top w:type="dxa" w:w="70"/>
               <w:left w:type="dxa" w:w="110"/>
@@ -40664,7 +40680,7 @@
               <w:bottom w:val="single" w:color="CFE3DF" w:sz="4"/>
               <w:right w:val="single" w:color="CFE3DF" w:sz="4"/>
             </w:tcBorders>
-            <w:shd w:fill="FCFBF7" w:val="clear"/>
+            <w:shd w:fill="F2ECDC" w:val="clear"/>
             <w:tcMar>
               <w:top w:type="dxa" w:w="70"/>
               <w:left w:type="dxa" w:w="110"/>
@@ -40909,7 +40925,7 @@
               <w:bottom w:val="single" w:color="CFE3DF" w:sz="4"/>
               <w:right w:val="single" w:color="CFE3DF" w:sz="4"/>
             </w:tcBorders>
-            <w:shd w:fill="FCFBF7" w:val="clear"/>
+            <w:shd w:fill="F2ECDC" w:val="clear"/>
             <w:tcMar>
               <w:top w:type="dxa" w:w="70"/>
               <w:left w:type="dxa" w:w="110"/>
@@ -41082,7 +41098,7 @@
               <w:bottom w:val="single" w:color="CFE3DF" w:sz="4"/>
               <w:right w:val="single" w:color="CFE3DF" w:sz="4"/>
             </w:tcBorders>
-            <w:shd w:fill="FCFBF7" w:val="clear"/>
+            <w:shd w:fill="F2ECDC" w:val="clear"/>
             <w:tcMar>
               <w:top w:type="dxa" w:w="70"/>
               <w:left w:type="dxa" w:w="110"/>
@@ -41209,7 +41225,7 @@
               <w:bottom w:val="single" w:color="CFE3DF" w:sz="4"/>
               <w:right w:val="single" w:color="CFE3DF" w:sz="4"/>
             </w:tcBorders>
-            <w:shd w:fill="FCFBF7" w:val="clear"/>
+            <w:shd w:fill="F2ECDC" w:val="clear"/>
             <w:tcMar>
               <w:top w:type="dxa" w:w="45"/>
               <w:left w:type="dxa" w:w="90"/>
@@ -41374,7 +41390,7 @@
               <w:bottom w:val="single" w:color="CFE3DF" w:sz="4"/>
               <w:right w:val="single" w:color="CFE3DF" w:sz="4"/>
             </w:tcBorders>
-            <w:shd w:fill="FCFBF7" w:val="clear"/>
+            <w:shd w:fill="F2ECDC" w:val="clear"/>
             <w:tcMar>
               <w:top w:type="dxa" w:w="70"/>
               <w:left w:type="dxa" w:w="110"/>
@@ -41405,7 +41421,7 @@
               <w:bottom w:val="single" w:color="CFE3DF" w:sz="4"/>
               <w:right w:val="single" w:color="CFE3DF" w:sz="4"/>
             </w:tcBorders>
-            <w:shd w:fill="FCFBF7" w:val="clear"/>
+            <w:shd w:fill="F2ECDC" w:val="clear"/>
             <w:tcMar>
               <w:top w:type="dxa" w:w="70"/>
               <w:left w:type="dxa" w:w="110"/>
@@ -41436,7 +41452,7 @@
               <w:bottom w:val="single" w:color="CFE3DF" w:sz="4"/>
               <w:right w:val="single" w:color="CFE3DF" w:sz="4"/>
             </w:tcBorders>
-            <w:shd w:fill="FCFBF7" w:val="clear"/>
+            <w:shd w:fill="F2ECDC" w:val="clear"/>
             <w:tcMar>
               <w:top w:type="dxa" w:w="70"/>
               <w:left w:type="dxa" w:w="110"/>
@@ -41653,7 +41669,7 @@
               <w:bottom w:val="single" w:color="CFE3DF" w:sz="4"/>
               <w:right w:val="single" w:color="CFE3DF" w:sz="4"/>
             </w:tcBorders>
-            <w:shd w:fill="FCFBF7" w:val="clear"/>
+            <w:shd w:fill="F2ECDC" w:val="clear"/>
             <w:tcMar>
               <w:top w:type="dxa" w:w="70"/>
               <w:left w:type="dxa" w:w="110"/>
@@ -41826,7 +41842,7 @@
               <w:bottom w:val="single" w:color="CFE3DF" w:sz="4"/>
               <w:right w:val="single" w:color="CFE3DF" w:sz="4"/>
             </w:tcBorders>
-            <w:shd w:fill="FCFBF7" w:val="clear"/>
+            <w:shd w:fill="F2ECDC" w:val="clear"/>
             <w:tcMar>
               <w:top w:type="dxa" w:w="70"/>
               <w:left w:type="dxa" w:w="110"/>
@@ -41953,7 +41969,7 @@
               <w:bottom w:val="single" w:color="CFE3DF" w:sz="4"/>
               <w:right w:val="single" w:color="CFE3DF" w:sz="4"/>
             </w:tcBorders>
-            <w:shd w:fill="FCFBF7" w:val="clear"/>
+            <w:shd w:fill="F2ECDC" w:val="clear"/>
             <w:tcMar>
               <w:top w:type="dxa" w:w="45"/>
               <w:left w:type="dxa" w:w="90"/>
@@ -42118,7 +42134,7 @@
               <w:bottom w:val="single" w:color="CFE3DF" w:sz="4"/>
               <w:right w:val="single" w:color="CFE3DF" w:sz="4"/>
             </w:tcBorders>
-            <w:shd w:fill="FCFBF7" w:val="clear"/>
+            <w:shd w:fill="F2ECDC" w:val="clear"/>
             <w:tcMar>
               <w:top w:type="dxa" w:w="70"/>
               <w:left w:type="dxa" w:w="110"/>
@@ -42149,7 +42165,7 @@
               <w:bottom w:val="single" w:color="CFE3DF" w:sz="4"/>
               <w:right w:val="single" w:color="CFE3DF" w:sz="4"/>
             </w:tcBorders>
-            <w:shd w:fill="FCFBF7" w:val="clear"/>
+            <w:shd w:fill="F2ECDC" w:val="clear"/>
             <w:tcMar>
               <w:top w:type="dxa" w:w="70"/>
               <w:left w:type="dxa" w:w="110"/>
@@ -42180,7 +42196,7 @@
               <w:bottom w:val="single" w:color="CFE3DF" w:sz="4"/>
               <w:right w:val="single" w:color="CFE3DF" w:sz="4"/>
             </w:tcBorders>
-            <w:shd w:fill="FCFBF7" w:val="clear"/>
+            <w:shd w:fill="F2ECDC" w:val="clear"/>
             <w:tcMar>
               <w:top w:type="dxa" w:w="70"/>
               <w:left w:type="dxa" w:w="110"/>
@@ -42329,7 +42345,7 @@
               <w:bottom w:val="single" w:color="CFE3DF" w:sz="4"/>
               <w:right w:val="single" w:color="CFE3DF" w:sz="4"/>
             </w:tcBorders>
-            <w:shd w:fill="FCFBF7" w:val="clear"/>
+            <w:shd w:fill="F2ECDC" w:val="clear"/>
             <w:tcMar>
               <w:top w:type="dxa" w:w="70"/>
               <w:left w:type="dxa" w:w="110"/>
@@ -42450,7 +42466,7 @@
               <w:bottom w:val="single" w:color="CFE3DF" w:sz="4"/>
               <w:right w:val="single" w:color="CFE3DF" w:sz="4"/>
             </w:tcBorders>
-            <w:shd w:fill="FCFBF7" w:val="clear"/>
+            <w:shd w:fill="F2ECDC" w:val="clear"/>
             <w:tcMar>
               <w:top w:type="dxa" w:w="70"/>
               <w:left w:type="dxa" w:w="110"/>
@@ -42555,7 +42571,7 @@
               <w:bottom w:val="single" w:color="CFE3DF" w:sz="4"/>
               <w:right w:val="single" w:color="CFE3DF" w:sz="4"/>
             </w:tcBorders>
-            <w:shd w:fill="FCFBF7" w:val="clear"/>
+            <w:shd w:fill="F2ECDC" w:val="clear"/>
             <w:tcMar>
               <w:top w:type="dxa" w:w="70"/>
               <w:left w:type="dxa" w:w="110"/>
@@ -42682,7 +42698,7 @@
               <w:bottom w:val="single" w:color="CFE3DF" w:sz="4"/>
               <w:right w:val="single" w:color="CFE3DF" w:sz="4"/>
             </w:tcBorders>
-            <w:shd w:fill="FCFBF7" w:val="clear"/>
+            <w:shd w:fill="F2ECDC" w:val="clear"/>
             <w:tcMar>
               <w:top w:type="dxa" w:w="45"/>
               <w:left w:type="dxa" w:w="90"/>
@@ -42847,7 +42863,7 @@
               <w:bottom w:val="single" w:color="CFE3DF" w:sz="4"/>
               <w:right w:val="single" w:color="CFE3DF" w:sz="4"/>
             </w:tcBorders>
-            <w:shd w:fill="FCFBF7" w:val="clear"/>
+            <w:shd w:fill="F2ECDC" w:val="clear"/>
             <w:tcMar>
               <w:top w:type="dxa" w:w="70"/>
               <w:left w:type="dxa" w:w="110"/>
@@ -42878,7 +42894,7 @@
               <w:bottom w:val="single" w:color="CFE3DF" w:sz="4"/>
               <w:right w:val="single" w:color="CFE3DF" w:sz="4"/>
             </w:tcBorders>
-            <w:shd w:fill="FCFBF7" w:val="clear"/>
+            <w:shd w:fill="F2ECDC" w:val="clear"/>
             <w:tcMar>
               <w:top w:type="dxa" w:w="70"/>
               <w:left w:type="dxa" w:w="110"/>
@@ -42909,7 +42925,7 @@
               <w:bottom w:val="single" w:color="CFE3DF" w:sz="4"/>
               <w:right w:val="single" w:color="CFE3DF" w:sz="4"/>
             </w:tcBorders>
-            <w:shd w:fill="FCFBF7" w:val="clear"/>
+            <w:shd w:fill="F2ECDC" w:val="clear"/>
             <w:tcMar>
               <w:top w:type="dxa" w:w="70"/>
               <w:left w:type="dxa" w:w="110"/>

</xml_diff>

<commit_message>
Workbook: footer gap (Workbook/Page) + single merged Reflections box
- Footer: insert non-breaking spaces so 'Workbook' and 'Page N' don't touch
  (the right-tab collapses in some renderers); tab kept for right-alignment.
- Reflections & Notes: keep the 3-column header row but merge the body into a
  single full-width answer box (columnSpan) — the labels are guides, not three
  separate required answers (per Thom's feedback).

Co-Authored-By: Claude Opus 4.8 (1M context) <noreply@anthropic.com>
</commit_message>
<xml_diff>
--- a/.local-workbook/The Compassion Course 2026-2027 Workbook.docx
+++ b/.local-workbook/The Compassion Course 2026-2027 Workbook.docx
@@ -595,7 +595,7 @@
         </w:rPr>
         <w:t xml:space="preserve">Keep a small journal with you throughout the day. Make 1 to 5 entries per day that include the description of an act or words spoken by someone and what need you imagine they were trying to meet. It is SUPER important to limit the words you use to those on the </w:t>
       </w:r>
-      <w:hyperlink w:history="1" r:id="rIdjjviwinqc-bngzcp_fzhh">
+      <w:hyperlink w:history="1" r:id="rIdpixswuje4zetx_u3-bkdu">
         <w:r>
           <w:rPr>
             <w:color w:val="1155CC"/>
@@ -737,7 +737,7 @@
         </w:rPr>
         <w:t xml:space="preserve">Think of someone who is close to you who is doing or saying something you don't like. See if you can figure out what need they are attempting to fulfill. Again, it is really important to limit the words you use to those on the </w:t>
       </w:r>
-      <w:hyperlink w:history="1" r:id="rIddctavoef4kryzx4vthm6s">
+      <w:hyperlink w:history="1" r:id="rIdnthcz0l42lvykrrjo-qqm">
         <w:r>
           <w:rPr>
             <w:color w:val="1155CC"/>
@@ -1032,7 +1032,7 @@
         </w:rPr>
         <w:t xml:space="preserve">Extended registration lasts for one week. To let someone know about the course you can use the following link: </w:t>
       </w:r>
-      <w:hyperlink w:history="1" r:id="rIdmynrnvug6oioy4bni1-7i">
+      <w:hyperlink w:history="1" r:id="rIdpkakou3g8wirflpfpbsga">
         <w:r>
           <w:rPr>
             <w:color w:val="1155CC"/>
@@ -1285,69 +1285,8 @@
         </w:trPr>
         <w:tc>
           <w:tcPr>
-            <w:tcW w:type="dxa" w:w="2000"/>
-            <w:tcBorders>
-              <w:top w:val="single" w:color="CFE3DF" w:sz="4"/>
-              <w:left w:val="single" w:color="CFE3DF" w:sz="4"/>
-              <w:bottom w:val="single" w:color="CFE3DF" w:sz="4"/>
-              <w:right w:val="single" w:color="CFE3DF" w:sz="4"/>
-            </w:tcBorders>
-            <w:shd w:fill="F2ECDC" w:val="clear"/>
-            <w:tcMar>
-              <w:top w:type="dxa" w:w="70"/>
-              <w:left w:type="dxa" w:w="110"/>
-              <w:bottom w:type="dxa" w:w="70"/>
-              <w:right w:type="dxa" w:w="110"/>
-            </w:tcMar>
-            <w:vAlign w:val="top"/>
-          </w:tcPr>
-          <w:p>
-            <w:pPr>
-              <w:spacing w:after="0" w:before="0"/>
-            </w:pPr>
-            <w:r>
-              <w:rPr>
-                <w:sz w:val="20"/>
-                <w:szCs w:val="20"/>
-              </w:rPr>
-              <w:t xml:space="preserve"/>
-            </w:r>
-          </w:p>
-        </w:tc>
-        <w:tc>
-          <w:tcPr>
-            <w:tcW w:type="dxa" w:w="4660"/>
-            <w:tcBorders>
-              <w:top w:val="single" w:color="CFE3DF" w:sz="4"/>
-              <w:left w:val="single" w:color="CFE3DF" w:sz="4"/>
-              <w:bottom w:val="single" w:color="CFE3DF" w:sz="4"/>
-              <w:right w:val="single" w:color="CFE3DF" w:sz="4"/>
-            </w:tcBorders>
-            <w:shd w:fill="F2ECDC" w:val="clear"/>
-            <w:tcMar>
-              <w:top w:type="dxa" w:w="70"/>
-              <w:left w:type="dxa" w:w="110"/>
-              <w:bottom w:type="dxa" w:w="70"/>
-              <w:right w:type="dxa" w:w="110"/>
-            </w:tcMar>
-            <w:vAlign w:val="top"/>
-          </w:tcPr>
-          <w:p>
-            <w:pPr>
-              <w:spacing w:after="0" w:before="0"/>
-            </w:pPr>
-            <w:r>
-              <w:rPr>
-                <w:sz w:val="20"/>
-                <w:szCs w:val="20"/>
-              </w:rPr>
-              <w:t xml:space="preserve"/>
-            </w:r>
-          </w:p>
-        </w:tc>
-        <w:tc>
-          <w:tcPr>
-            <w:tcW w:type="dxa" w:w="2700"/>
+            <w:tcW w:type="dxa" w:w="9360"/>
+            <w:gridSpan w:val="3"/>
             <w:tcBorders>
               <w:top w:val="single" w:color="CFE3DF" w:sz="4"/>
               <w:left w:val="single" w:color="CFE3DF" w:sz="4"/>
@@ -1434,7 +1373,7 @@
         </w:rPr>
         <w:t xml:space="preserve">Keep a small journal with you throughout the day. Make 1 to 5 entries per day that include judgment words you said or were thinking of saying. Later on, when you have time, sit down with the </w:t>
       </w:r>
-      <w:hyperlink w:history="1" r:id="rIdo40z2djquu14vjf6zv9qi">
+      <w:hyperlink w:history="1" r:id="rIdkg4is0hpmnc_1rwoykrat">
         <w:r>
           <w:rPr>
             <w:color w:val="1155CC"/>
@@ -1455,7 +1394,7 @@
         </w:rPr>
         <w:t xml:space="preserve"> and see if you can figure out what need of yours the judgment was (or is) related to. Remember, to successfully complete this exercise, limit the words you use to those on the </w:t>
       </w:r>
-      <w:hyperlink w:history="1" r:id="rIdwlqw8eyxudhckti6edsld">
+      <w:hyperlink w:history="1" r:id="rId9bjjgvjevz7incscfpjml">
         <w:r>
           <w:rPr>
             <w:color w:val="1155CC"/>
@@ -1597,7 +1536,7 @@
         </w:rPr>
         <w:t xml:space="preserve">Keep a small journal with you throughout the day. It could be a little book, a folded piece of paper or a napkin -anything you can write on. Make 1 to 5 entries per day that include judgment words spoken by someone. Later on, when you have time, sit down with the </w:t>
       </w:r>
-      <w:hyperlink w:history="1" r:id="rIdlotrbjwnctpsax5a4zgvk">
+      <w:hyperlink w:history="1" r:id="rIdpnowlni6s0j8oyd5i3nx7">
         <w:r>
           <w:rPr>
             <w:color w:val="1155CC"/>
@@ -1618,7 +1557,7 @@
         </w:rPr>
         <w:t xml:space="preserve"> and see if you can figure out what need was unmet for them. Remember to limit the words you use to those on the </w:t>
       </w:r>
-      <w:hyperlink w:history="1" r:id="rIdw4mvdo213dn3lrckxfjnu">
+      <w:hyperlink w:history="1" r:id="rIdrarjswbadnssahyiwewia">
         <w:r>
           <w:rPr>
             <w:color w:val="1155CC"/>
@@ -1992,69 +1931,8 @@
         </w:trPr>
         <w:tc>
           <w:tcPr>
-            <w:tcW w:type="dxa" w:w="2000"/>
-            <w:tcBorders>
-              <w:top w:val="single" w:color="CFE3DF" w:sz="4"/>
-              <w:left w:val="single" w:color="CFE3DF" w:sz="4"/>
-              <w:bottom w:val="single" w:color="CFE3DF" w:sz="4"/>
-              <w:right w:val="single" w:color="CFE3DF" w:sz="4"/>
-            </w:tcBorders>
-            <w:shd w:fill="F2ECDC" w:val="clear"/>
-            <w:tcMar>
-              <w:top w:type="dxa" w:w="70"/>
-              <w:left w:type="dxa" w:w="110"/>
-              <w:bottom w:type="dxa" w:w="70"/>
-              <w:right w:type="dxa" w:w="110"/>
-            </w:tcMar>
-            <w:vAlign w:val="top"/>
-          </w:tcPr>
-          <w:p>
-            <w:pPr>
-              <w:spacing w:after="0" w:before="0"/>
-            </w:pPr>
-            <w:r>
-              <w:rPr>
-                <w:sz w:val="20"/>
-                <w:szCs w:val="20"/>
-              </w:rPr>
-              <w:t xml:space="preserve"/>
-            </w:r>
-          </w:p>
-        </w:tc>
-        <w:tc>
-          <w:tcPr>
-            <w:tcW w:type="dxa" w:w="4660"/>
-            <w:tcBorders>
-              <w:top w:val="single" w:color="CFE3DF" w:sz="4"/>
-              <w:left w:val="single" w:color="CFE3DF" w:sz="4"/>
-              <w:bottom w:val="single" w:color="CFE3DF" w:sz="4"/>
-              <w:right w:val="single" w:color="CFE3DF" w:sz="4"/>
-            </w:tcBorders>
-            <w:shd w:fill="F2ECDC" w:val="clear"/>
-            <w:tcMar>
-              <w:top w:type="dxa" w:w="70"/>
-              <w:left w:type="dxa" w:w="110"/>
-              <w:bottom w:type="dxa" w:w="70"/>
-              <w:right w:type="dxa" w:w="110"/>
-            </w:tcMar>
-            <w:vAlign w:val="top"/>
-          </w:tcPr>
-          <w:p>
-            <w:pPr>
-              <w:spacing w:after="0" w:before="0"/>
-            </w:pPr>
-            <w:r>
-              <w:rPr>
-                <w:sz w:val="20"/>
-                <w:szCs w:val="20"/>
-              </w:rPr>
-              <w:t xml:space="preserve"/>
-            </w:r>
-          </w:p>
-        </w:tc>
-        <w:tc>
-          <w:tcPr>
-            <w:tcW w:type="dxa" w:w="2700"/>
+            <w:tcW w:type="dxa" w:w="9360"/>
+            <w:gridSpan w:val="3"/>
             <w:tcBorders>
               <w:top w:val="single" w:color="CFE3DF" w:sz="4"/>
               <w:left w:val="single" w:color="CFE3DF" w:sz="4"/>
@@ -2157,7 +2035,7 @@
         </w:rPr>
         <w:t xml:space="preserve">Later on, when you have time, sit down with the </w:t>
       </w:r>
-      <w:hyperlink w:history="1" r:id="rIdqwb29boick7gvinvxv7ie">
+      <w:hyperlink w:history="1" r:id="rIdn8y_ismgsoz1wd9llkyv9">
         <w:r>
           <w:rPr>
             <w:color w:val="1155CC"/>
@@ -2214,7 +2092,7 @@
         </w:rPr>
         <w:t xml:space="preserve"> at the top of the </w:t>
       </w:r>
-      <w:hyperlink w:history="1" r:id="rId4p7kzamjtylfgrrt6uczk">
+      <w:hyperlink w:history="1" r:id="rIdc0c4uonlns3roo3a4l9zt">
         <w:r>
           <w:rPr>
             <w:color w:val="1155CC"/>
@@ -2251,7 +2129,7 @@
         </w:rPr>
         <w:t xml:space="preserve">Then look at the </w:t>
       </w:r>
-      <w:hyperlink w:history="1" r:id="rIdg2-dkblxy0hde85h9bn80">
+      <w:hyperlink w:history="1" r:id="rIdc1tgeyunrklkihvqpu6ij">
         <w:r>
           <w:rPr>
             <w:color w:val="1155CC"/>
@@ -2272,7 +2150,7 @@
         </w:rPr>
         <w:t xml:space="preserve"> and see if you can figure out what need your feeling was about. Remember, it's VERY helpful to limit the words you use to those on the </w:t>
       </w:r>
-      <w:hyperlink w:history="1" r:id="rIdf3miwvo5qvx7pze1sp1tk">
+      <w:hyperlink w:history="1" r:id="rIdixjvyqxi4r9d0mxxzkphj">
         <w:r>
           <w:rPr>
             <w:color w:val="1155CC"/>
@@ -2414,7 +2292,7 @@
         </w:rPr>
         <w:t xml:space="preserve">Keep a small journal with you throughout the day. Make 2 to 4 entries per day that include something you did, said or were thinking of saying and the feeling (or feelings) you experienced at that moment. Again, later on, when you have time, sit down with the </w:t>
       </w:r>
-      <w:hyperlink w:history="1" r:id="rId9edtihwatyvedg6rl4jxr">
+      <w:hyperlink w:history="1" r:id="rIdowcwwusnjbxghkartezzr">
         <w:r>
           <w:rPr>
             <w:color w:val="1155CC"/>
@@ -2471,7 +2349,7 @@
         </w:rPr>
         <w:t xml:space="preserve"> at the top of the </w:t>
       </w:r>
-      <w:hyperlink w:history="1" r:id="rIdzsg5uefd9ddjt-szuf2nb">
+      <w:hyperlink w:history="1" r:id="rId63lnsmxqx_k6fbisz-lea">
         <w:r>
           <w:rPr>
             <w:color w:val="1155CC"/>
@@ -2508,7 +2386,7 @@
         </w:rPr>
         <w:t xml:space="preserve">Then look at the </w:t>
       </w:r>
-      <w:hyperlink w:history="1" r:id="rIdaissebohgbnjy_zgc92ra">
+      <w:hyperlink w:history="1" r:id="rId2i6bku1kp4kuqy70fbxpb">
         <w:r>
           <w:rPr>
             <w:color w:val="1155CC"/>
@@ -2529,7 +2407,7 @@
         </w:rPr>
         <w:t xml:space="preserve"> and see if you can figure out what need your feeling was about. Remember, here too, it's VERY important to limit the words you use to those on the </w:t>
       </w:r>
-      <w:hyperlink w:history="1" r:id="rIdlavutcexeipgu-dzpfk6i">
+      <w:hyperlink w:history="1" r:id="rIdd-vxma36ppbwlzjmug0zu">
         <w:r>
           <w:rPr>
             <w:color w:val="1155CC"/>
@@ -2782,69 +2660,8 @@
         </w:trPr>
         <w:tc>
           <w:tcPr>
-            <w:tcW w:type="dxa" w:w="2000"/>
-            <w:tcBorders>
-              <w:top w:val="single" w:color="CFE3DF" w:sz="4"/>
-              <w:left w:val="single" w:color="CFE3DF" w:sz="4"/>
-              <w:bottom w:val="single" w:color="CFE3DF" w:sz="4"/>
-              <w:right w:val="single" w:color="CFE3DF" w:sz="4"/>
-            </w:tcBorders>
-            <w:shd w:fill="F2ECDC" w:val="clear"/>
-            <w:tcMar>
-              <w:top w:type="dxa" w:w="70"/>
-              <w:left w:type="dxa" w:w="110"/>
-              <w:bottom w:type="dxa" w:w="70"/>
-              <w:right w:type="dxa" w:w="110"/>
-            </w:tcMar>
-            <w:vAlign w:val="top"/>
-          </w:tcPr>
-          <w:p>
-            <w:pPr>
-              <w:spacing w:after="0" w:before="0"/>
-            </w:pPr>
-            <w:r>
-              <w:rPr>
-                <w:sz w:val="20"/>
-                <w:szCs w:val="20"/>
-              </w:rPr>
-              <w:t xml:space="preserve"/>
-            </w:r>
-          </w:p>
-        </w:tc>
-        <w:tc>
-          <w:tcPr>
-            <w:tcW w:type="dxa" w:w="4660"/>
-            <w:tcBorders>
-              <w:top w:val="single" w:color="CFE3DF" w:sz="4"/>
-              <w:left w:val="single" w:color="CFE3DF" w:sz="4"/>
-              <w:bottom w:val="single" w:color="CFE3DF" w:sz="4"/>
-              <w:right w:val="single" w:color="CFE3DF" w:sz="4"/>
-            </w:tcBorders>
-            <w:shd w:fill="F2ECDC" w:val="clear"/>
-            <w:tcMar>
-              <w:top w:type="dxa" w:w="70"/>
-              <w:left w:type="dxa" w:w="110"/>
-              <w:bottom w:type="dxa" w:w="70"/>
-              <w:right w:type="dxa" w:w="110"/>
-            </w:tcMar>
-            <w:vAlign w:val="top"/>
-          </w:tcPr>
-          <w:p>
-            <w:pPr>
-              <w:spacing w:after="0" w:before="0"/>
-            </w:pPr>
-            <w:r>
-              <w:rPr>
-                <w:sz w:val="20"/>
-                <w:szCs w:val="20"/>
-              </w:rPr>
-              <w:t xml:space="preserve"/>
-            </w:r>
-          </w:p>
-        </w:tc>
-        <w:tc>
-          <w:tcPr>
-            <w:tcW w:type="dxa" w:w="2700"/>
+            <w:tcW w:type="dxa" w:w="9360"/>
+            <w:gridSpan w:val="3"/>
             <w:tcBorders>
               <w:top w:val="single" w:color="CFE3DF" w:sz="4"/>
               <w:left w:val="single" w:color="CFE3DF" w:sz="4"/>
@@ -2915,7 +2732,7 @@
       <w:r>
         <w:t xml:space="preserve">Read the </w:t>
       </w:r>
-      <w:hyperlink w:history="1" r:id="rIdcnoxj6ip02ivtp8mr4tzh">
+      <w:hyperlink w:history="1" r:id="rIdppwtcgt9padqakskci30w">
         <w:r>
           <w:rPr>
             <w:color w:val="1155CC"/>
@@ -3048,7 +2865,7 @@
       <w:r>
         <w:t xml:space="preserve">Print a copy of the </w:t>
       </w:r>
-      <w:hyperlink w:history="1" r:id="rIdlxvrumud6ncv9cn9sgf_d">
+      <w:hyperlink w:history="1" r:id="rIdziiazlmlptdr6kj5tam41">
         <w:r>
           <w:rPr>
             <w:color w:val="1155CC"/>
@@ -3213,7 +3030,7 @@
         </w:rPr>
         <w:t xml:space="preserve">Keep a small journal with you throughout the day. Make 1 to 5 entries per day that include an act or words spoken by someone and what need(s) you imagine they were trying to meet. Remember, it's VERY helpful to limit the words you use to those on the </w:t>
       </w:r>
-      <w:hyperlink w:history="1" r:id="rId80gopphywreouwt_hue15">
+      <w:hyperlink w:history="1" r:id="rIdn1kaxkpnw_khac650oxwd">
         <w:r>
           <w:rPr>
             <w:color w:val="1155CC"/>
@@ -3355,7 +3172,7 @@
         </w:rPr>
         <w:t xml:space="preserve">Think of someone that you think is preventing you from getting a need(s) met. Write down the need(s) from the </w:t>
       </w:r>
-      <w:hyperlink w:history="1" r:id="rIdmld4gvovnuclge8hw3ywf">
+      <w:hyperlink w:history="1" r:id="rIdw8zbhhyjsw-o-4sit3xlb">
         <w:r>
           <w:rPr>
             <w:color w:val="1155CC"/>
@@ -3608,69 +3425,8 @@
         </w:trPr>
         <w:tc>
           <w:tcPr>
-            <w:tcW w:type="dxa" w:w="2000"/>
-            <w:tcBorders>
-              <w:top w:val="single" w:color="CFE3DF" w:sz="4"/>
-              <w:left w:val="single" w:color="CFE3DF" w:sz="4"/>
-              <w:bottom w:val="single" w:color="CFE3DF" w:sz="4"/>
-              <w:right w:val="single" w:color="CFE3DF" w:sz="4"/>
-            </w:tcBorders>
-            <w:shd w:fill="F2ECDC" w:val="clear"/>
-            <w:tcMar>
-              <w:top w:type="dxa" w:w="70"/>
-              <w:left w:type="dxa" w:w="110"/>
-              <w:bottom w:type="dxa" w:w="70"/>
-              <w:right w:type="dxa" w:w="110"/>
-            </w:tcMar>
-            <w:vAlign w:val="top"/>
-          </w:tcPr>
-          <w:p>
-            <w:pPr>
-              <w:spacing w:after="0" w:before="0"/>
-            </w:pPr>
-            <w:r>
-              <w:rPr>
-                <w:sz w:val="20"/>
-                <w:szCs w:val="20"/>
-              </w:rPr>
-              <w:t xml:space="preserve"/>
-            </w:r>
-          </w:p>
-        </w:tc>
-        <w:tc>
-          <w:tcPr>
-            <w:tcW w:type="dxa" w:w="4660"/>
-            <w:tcBorders>
-              <w:top w:val="single" w:color="CFE3DF" w:sz="4"/>
-              <w:left w:val="single" w:color="CFE3DF" w:sz="4"/>
-              <w:bottom w:val="single" w:color="CFE3DF" w:sz="4"/>
-              <w:right w:val="single" w:color="CFE3DF" w:sz="4"/>
-            </w:tcBorders>
-            <w:shd w:fill="F2ECDC" w:val="clear"/>
-            <w:tcMar>
-              <w:top w:type="dxa" w:w="70"/>
-              <w:left w:type="dxa" w:w="110"/>
-              <w:bottom w:type="dxa" w:w="70"/>
-              <w:right w:type="dxa" w:w="110"/>
-            </w:tcMar>
-            <w:vAlign w:val="top"/>
-          </w:tcPr>
-          <w:p>
-            <w:pPr>
-              <w:spacing w:after="0" w:before="0"/>
-            </w:pPr>
-            <w:r>
-              <w:rPr>
-                <w:sz w:val="20"/>
-                <w:szCs w:val="20"/>
-              </w:rPr>
-              <w:t xml:space="preserve"/>
-            </w:r>
-          </w:p>
-        </w:tc>
-        <w:tc>
-          <w:tcPr>
-            <w:tcW w:type="dxa" w:w="2700"/>
+            <w:tcW w:type="dxa" w:w="9360"/>
+            <w:gridSpan w:val="3"/>
             <w:tcBorders>
               <w:top w:val="single" w:color="CFE3DF" w:sz="4"/>
               <w:left w:val="single" w:color="CFE3DF" w:sz="4"/>
@@ -3757,7 +3513,7 @@
         </w:rPr>
         <w:t xml:space="preserve">Visit: http://</w:t>
       </w:r>
-      <w:hyperlink w:history="1" r:id="rId48rkyrrob1tpgmitgy5iv">
+      <w:hyperlink w:history="1" r:id="rIdbsfqe26pdsv5uathg8bzi">
         <w:r>
           <w:rPr>
             <w:color w:val="1155CC"/>
@@ -4033,7 +3789,7 @@
         <w:keepLines/>
         <w:spacing w:after="60" w:before="0" w:line="276" w:lineRule="auto"/>
       </w:pPr>
-      <w:hyperlink w:history="1" r:id="rIdwzn4yggy0tww1hj4nmu37">
+      <w:hyperlink w:history="1" r:id="rIdmi_jzlro5tvvgypab5wji">
         <w:r>
           <w:rPr>
             <w:color w:val="1155CC"/>
@@ -4276,69 +4032,8 @@
         </w:trPr>
         <w:tc>
           <w:tcPr>
-            <w:tcW w:type="dxa" w:w="2000"/>
-            <w:tcBorders>
-              <w:top w:val="single" w:color="CFE3DF" w:sz="4"/>
-              <w:left w:val="single" w:color="CFE3DF" w:sz="4"/>
-              <w:bottom w:val="single" w:color="CFE3DF" w:sz="4"/>
-              <w:right w:val="single" w:color="CFE3DF" w:sz="4"/>
-            </w:tcBorders>
-            <w:shd w:fill="F2ECDC" w:val="clear"/>
-            <w:tcMar>
-              <w:top w:type="dxa" w:w="70"/>
-              <w:left w:type="dxa" w:w="110"/>
-              <w:bottom w:type="dxa" w:w="70"/>
-              <w:right w:type="dxa" w:w="110"/>
-            </w:tcMar>
-            <w:vAlign w:val="top"/>
-          </w:tcPr>
-          <w:p>
-            <w:pPr>
-              <w:spacing w:after="0" w:before="0"/>
-            </w:pPr>
-            <w:r>
-              <w:rPr>
-                <w:sz w:val="20"/>
-                <w:szCs w:val="20"/>
-              </w:rPr>
-              <w:t xml:space="preserve"/>
-            </w:r>
-          </w:p>
-        </w:tc>
-        <w:tc>
-          <w:tcPr>
-            <w:tcW w:type="dxa" w:w="4660"/>
-            <w:tcBorders>
-              <w:top w:val="single" w:color="CFE3DF" w:sz="4"/>
-              <w:left w:val="single" w:color="CFE3DF" w:sz="4"/>
-              <w:bottom w:val="single" w:color="CFE3DF" w:sz="4"/>
-              <w:right w:val="single" w:color="CFE3DF" w:sz="4"/>
-            </w:tcBorders>
-            <w:shd w:fill="F2ECDC" w:val="clear"/>
-            <w:tcMar>
-              <w:top w:type="dxa" w:w="70"/>
-              <w:left w:type="dxa" w:w="110"/>
-              <w:bottom w:type="dxa" w:w="70"/>
-              <w:right w:type="dxa" w:w="110"/>
-            </w:tcMar>
-            <w:vAlign w:val="top"/>
-          </w:tcPr>
-          <w:p>
-            <w:pPr>
-              <w:spacing w:after="0" w:before="0"/>
-            </w:pPr>
-            <w:r>
-              <w:rPr>
-                <w:sz w:val="20"/>
-                <w:szCs w:val="20"/>
-              </w:rPr>
-              <w:t xml:space="preserve"/>
-            </w:r>
-          </w:p>
-        </w:tc>
-        <w:tc>
-          <w:tcPr>
-            <w:tcW w:type="dxa" w:w="2700"/>
+            <w:tcW w:type="dxa" w:w="9360"/>
+            <w:gridSpan w:val="3"/>
             <w:tcBorders>
               <w:top w:val="single" w:color="CFE3DF" w:sz="4"/>
               <w:left w:val="single" w:color="CFE3DF" w:sz="4"/>
@@ -4425,7 +4120,7 @@
         </w:rPr>
         <w:t xml:space="preserve">Continue working with this exercise (</w:t>
       </w:r>
-      <w:hyperlink w:history="1" r:id="rIda1fcn740d6kzd8ncp8wmt">
+      <w:hyperlink w:history="1" r:id="rIdtefn0mnohwe4l_jwcy7um">
         <w:r>
           <w:rPr>
             <w:color w:val="1155CC"/>
@@ -4736,7 +4431,7 @@
         </w:rPr>
         <w:t xml:space="preserve"> - take your time). Next, view or print a copy of the </w:t>
       </w:r>
-      <w:hyperlink w:history="1" r:id="rId7ibxzkt_mt8iql73zvnsi">
+      <w:hyperlink w:history="1" r:id="rIdf03sucpmayotyor6_gwez">
         <w:r>
           <w:rPr>
             <w:color w:val="1155CC"/>
@@ -5269,7 +4964,7 @@
         <w:keepLines/>
         <w:spacing w:after="60" w:before="0" w:line="276" w:lineRule="auto"/>
       </w:pPr>
-      <w:hyperlink w:history="1" r:id="rIdxhcnw_nhav0tbjatzfozu">
+      <w:hyperlink w:history="1" r:id="rId1xqaeplu5ldjsgaxxklmn">
         <w:r>
           <w:rPr>
             <w:color w:val="1155CC"/>
@@ -5512,69 +5207,8 @@
         </w:trPr>
         <w:tc>
           <w:tcPr>
-            <w:tcW w:type="dxa" w:w="2000"/>
-            <w:tcBorders>
-              <w:top w:val="single" w:color="CFE3DF" w:sz="4"/>
-              <w:left w:val="single" w:color="CFE3DF" w:sz="4"/>
-              <w:bottom w:val="single" w:color="CFE3DF" w:sz="4"/>
-              <w:right w:val="single" w:color="CFE3DF" w:sz="4"/>
-            </w:tcBorders>
-            <w:shd w:fill="F2ECDC" w:val="clear"/>
-            <w:tcMar>
-              <w:top w:type="dxa" w:w="70"/>
-              <w:left w:type="dxa" w:w="110"/>
-              <w:bottom w:type="dxa" w:w="70"/>
-              <w:right w:type="dxa" w:w="110"/>
-            </w:tcMar>
-            <w:vAlign w:val="top"/>
-          </w:tcPr>
-          <w:p>
-            <w:pPr>
-              <w:spacing w:after="0" w:before="0"/>
-            </w:pPr>
-            <w:r>
-              <w:rPr>
-                <w:sz w:val="20"/>
-                <w:szCs w:val="20"/>
-              </w:rPr>
-              <w:t xml:space="preserve"/>
-            </w:r>
-          </w:p>
-        </w:tc>
-        <w:tc>
-          <w:tcPr>
-            <w:tcW w:type="dxa" w:w="4660"/>
-            <w:tcBorders>
-              <w:top w:val="single" w:color="CFE3DF" w:sz="4"/>
-              <w:left w:val="single" w:color="CFE3DF" w:sz="4"/>
-              <w:bottom w:val="single" w:color="CFE3DF" w:sz="4"/>
-              <w:right w:val="single" w:color="CFE3DF" w:sz="4"/>
-            </w:tcBorders>
-            <w:shd w:fill="F2ECDC" w:val="clear"/>
-            <w:tcMar>
-              <w:top w:type="dxa" w:w="70"/>
-              <w:left w:type="dxa" w:w="110"/>
-              <w:bottom w:type="dxa" w:w="70"/>
-              <w:right w:type="dxa" w:w="110"/>
-            </w:tcMar>
-            <w:vAlign w:val="top"/>
-          </w:tcPr>
-          <w:p>
-            <w:pPr>
-              <w:spacing w:after="0" w:before="0"/>
-            </w:pPr>
-            <w:r>
-              <w:rPr>
-                <w:sz w:val="20"/>
-                <w:szCs w:val="20"/>
-              </w:rPr>
-              <w:t xml:space="preserve"/>
-            </w:r>
-          </w:p>
-        </w:tc>
-        <w:tc>
-          <w:tcPr>
-            <w:tcW w:type="dxa" w:w="2700"/>
+            <w:tcW w:type="dxa" w:w="9360"/>
+            <w:gridSpan w:val="3"/>
             <w:tcBorders>
               <w:top w:val="single" w:color="CFE3DF" w:sz="4"/>
               <w:left w:val="single" w:color="CFE3DF" w:sz="4"/>
@@ -6134,69 +5768,8 @@
         </w:trPr>
         <w:tc>
           <w:tcPr>
-            <w:tcW w:type="dxa" w:w="2000"/>
-            <w:tcBorders>
-              <w:top w:val="single" w:color="CFE3DF" w:sz="4"/>
-              <w:left w:val="single" w:color="CFE3DF" w:sz="4"/>
-              <w:bottom w:val="single" w:color="CFE3DF" w:sz="4"/>
-              <w:right w:val="single" w:color="CFE3DF" w:sz="4"/>
-            </w:tcBorders>
-            <w:shd w:fill="F2ECDC" w:val="clear"/>
-            <w:tcMar>
-              <w:top w:type="dxa" w:w="70"/>
-              <w:left w:type="dxa" w:w="110"/>
-              <w:bottom w:type="dxa" w:w="70"/>
-              <w:right w:type="dxa" w:w="110"/>
-            </w:tcMar>
-            <w:vAlign w:val="top"/>
-          </w:tcPr>
-          <w:p>
-            <w:pPr>
-              <w:spacing w:after="0" w:before="0"/>
-            </w:pPr>
-            <w:r>
-              <w:rPr>
-                <w:sz w:val="20"/>
-                <w:szCs w:val="20"/>
-              </w:rPr>
-              <w:t xml:space="preserve"/>
-            </w:r>
-          </w:p>
-        </w:tc>
-        <w:tc>
-          <w:tcPr>
-            <w:tcW w:type="dxa" w:w="4660"/>
-            <w:tcBorders>
-              <w:top w:val="single" w:color="CFE3DF" w:sz="4"/>
-              <w:left w:val="single" w:color="CFE3DF" w:sz="4"/>
-              <w:bottom w:val="single" w:color="CFE3DF" w:sz="4"/>
-              <w:right w:val="single" w:color="CFE3DF" w:sz="4"/>
-            </w:tcBorders>
-            <w:shd w:fill="F2ECDC" w:val="clear"/>
-            <w:tcMar>
-              <w:top w:type="dxa" w:w="70"/>
-              <w:left w:type="dxa" w:w="110"/>
-              <w:bottom w:type="dxa" w:w="70"/>
-              <w:right w:type="dxa" w:w="110"/>
-            </w:tcMar>
-            <w:vAlign w:val="top"/>
-          </w:tcPr>
-          <w:p>
-            <w:pPr>
-              <w:spacing w:after="0" w:before="0"/>
-            </w:pPr>
-            <w:r>
-              <w:rPr>
-                <w:sz w:val="20"/>
-                <w:szCs w:val="20"/>
-              </w:rPr>
-              <w:t xml:space="preserve"/>
-            </w:r>
-          </w:p>
-        </w:tc>
-        <w:tc>
-          <w:tcPr>
-            <w:tcW w:type="dxa" w:w="2700"/>
+            <w:tcW w:type="dxa" w:w="9360"/>
+            <w:gridSpan w:val="3"/>
             <w:tcBorders>
               <w:top w:val="single" w:color="CFE3DF" w:sz="4"/>
               <w:left w:val="single" w:color="CFE3DF" w:sz="4"/>
@@ -6395,7 +5968,7 @@
         </w:rPr>
         <w:t xml:space="preserve">Then look at the </w:t>
       </w:r>
-      <w:hyperlink w:history="1" r:id="rId-5pfuynmzkn3x6i1ndxcw">
+      <w:hyperlink w:history="1" r:id="rId3p68zn2jsfdv4r7stdzug">
         <w:r>
           <w:rPr>
             <w:color w:val="1155CC"/>
@@ -6648,69 +6221,8 @@
         </w:trPr>
         <w:tc>
           <w:tcPr>
-            <w:tcW w:type="dxa" w:w="2000"/>
-            <w:tcBorders>
-              <w:top w:val="single" w:color="CFE3DF" w:sz="4"/>
-              <w:left w:val="single" w:color="CFE3DF" w:sz="4"/>
-              <w:bottom w:val="single" w:color="CFE3DF" w:sz="4"/>
-              <w:right w:val="single" w:color="CFE3DF" w:sz="4"/>
-            </w:tcBorders>
-            <w:shd w:fill="F2ECDC" w:val="clear"/>
-            <w:tcMar>
-              <w:top w:type="dxa" w:w="70"/>
-              <w:left w:type="dxa" w:w="110"/>
-              <w:bottom w:type="dxa" w:w="70"/>
-              <w:right w:type="dxa" w:w="110"/>
-            </w:tcMar>
-            <w:vAlign w:val="top"/>
-          </w:tcPr>
-          <w:p>
-            <w:pPr>
-              <w:spacing w:after="0" w:before="0"/>
-            </w:pPr>
-            <w:r>
-              <w:rPr>
-                <w:sz w:val="20"/>
-                <w:szCs w:val="20"/>
-              </w:rPr>
-              <w:t xml:space="preserve"/>
-            </w:r>
-          </w:p>
-        </w:tc>
-        <w:tc>
-          <w:tcPr>
-            <w:tcW w:type="dxa" w:w="4660"/>
-            <w:tcBorders>
-              <w:top w:val="single" w:color="CFE3DF" w:sz="4"/>
-              <w:left w:val="single" w:color="CFE3DF" w:sz="4"/>
-              <w:bottom w:val="single" w:color="CFE3DF" w:sz="4"/>
-              <w:right w:val="single" w:color="CFE3DF" w:sz="4"/>
-            </w:tcBorders>
-            <w:shd w:fill="F2ECDC" w:val="clear"/>
-            <w:tcMar>
-              <w:top w:type="dxa" w:w="70"/>
-              <w:left w:type="dxa" w:w="110"/>
-              <w:bottom w:type="dxa" w:w="70"/>
-              <w:right w:type="dxa" w:w="110"/>
-            </w:tcMar>
-            <w:vAlign w:val="top"/>
-          </w:tcPr>
-          <w:p>
-            <w:pPr>
-              <w:spacing w:after="0" w:before="0"/>
-            </w:pPr>
-            <w:r>
-              <w:rPr>
-                <w:sz w:val="20"/>
-                <w:szCs w:val="20"/>
-              </w:rPr>
-              <w:t xml:space="preserve"/>
-            </w:r>
-          </w:p>
-        </w:tc>
-        <w:tc>
-          <w:tcPr>
-            <w:tcW w:type="dxa" w:w="2700"/>
+            <w:tcW w:type="dxa" w:w="9360"/>
+            <w:gridSpan w:val="3"/>
             <w:tcBorders>
               <w:top w:val="single" w:color="CFE3DF" w:sz="4"/>
               <w:left w:val="single" w:color="CFE3DF" w:sz="4"/>
@@ -7110,7 +6622,7 @@
         </w:rPr>
         <w:t xml:space="preserve">Later on, when you have time, read over your journal for the day. Next, check in with yourself about how you feel as you think about those thoughts. Then look at the </w:t>
       </w:r>
-      <w:hyperlink w:history="1" r:id="rIdfnuvufscbxj8zubv9yv8r">
+      <w:hyperlink w:history="1" r:id="rIdi48faobthq9urg1965qk_">
         <w:r>
           <w:rPr>
             <w:color w:val="1155CC"/>
@@ -7379,69 +6891,8 @@
         </w:trPr>
         <w:tc>
           <w:tcPr>
-            <w:tcW w:type="dxa" w:w="2000"/>
-            <w:tcBorders>
-              <w:top w:val="single" w:color="CFE3DF" w:sz="4"/>
-              <w:left w:val="single" w:color="CFE3DF" w:sz="4"/>
-              <w:bottom w:val="single" w:color="CFE3DF" w:sz="4"/>
-              <w:right w:val="single" w:color="CFE3DF" w:sz="4"/>
-            </w:tcBorders>
-            <w:shd w:fill="F2ECDC" w:val="clear"/>
-            <w:tcMar>
-              <w:top w:type="dxa" w:w="70"/>
-              <w:left w:type="dxa" w:w="110"/>
-              <w:bottom w:type="dxa" w:w="70"/>
-              <w:right w:type="dxa" w:w="110"/>
-            </w:tcMar>
-            <w:vAlign w:val="top"/>
-          </w:tcPr>
-          <w:p>
-            <w:pPr>
-              <w:spacing w:after="0" w:before="0"/>
-            </w:pPr>
-            <w:r>
-              <w:rPr>
-                <w:sz w:val="20"/>
-                <w:szCs w:val="20"/>
-              </w:rPr>
-              <w:t xml:space="preserve"/>
-            </w:r>
-          </w:p>
-        </w:tc>
-        <w:tc>
-          <w:tcPr>
-            <w:tcW w:type="dxa" w:w="4660"/>
-            <w:tcBorders>
-              <w:top w:val="single" w:color="CFE3DF" w:sz="4"/>
-              <w:left w:val="single" w:color="CFE3DF" w:sz="4"/>
-              <w:bottom w:val="single" w:color="CFE3DF" w:sz="4"/>
-              <w:right w:val="single" w:color="CFE3DF" w:sz="4"/>
-            </w:tcBorders>
-            <w:shd w:fill="F2ECDC" w:val="clear"/>
-            <w:tcMar>
-              <w:top w:type="dxa" w:w="70"/>
-              <w:left w:type="dxa" w:w="110"/>
-              <w:bottom w:type="dxa" w:w="70"/>
-              <w:right w:type="dxa" w:w="110"/>
-            </w:tcMar>
-            <w:vAlign w:val="top"/>
-          </w:tcPr>
-          <w:p>
-            <w:pPr>
-              <w:spacing w:after="0" w:before="0"/>
-            </w:pPr>
-            <w:r>
-              <w:rPr>
-                <w:sz w:val="20"/>
-                <w:szCs w:val="20"/>
-              </w:rPr>
-              <w:t xml:space="preserve"/>
-            </w:r>
-          </w:p>
-        </w:tc>
-        <w:tc>
-          <w:tcPr>
-            <w:tcW w:type="dxa" w:w="2700"/>
+            <w:tcW w:type="dxa" w:w="9360"/>
+            <w:gridSpan w:val="3"/>
             <w:tcBorders>
               <w:top w:val="single" w:color="CFE3DF" w:sz="4"/>
               <w:left w:val="single" w:color="CFE3DF" w:sz="4"/>
@@ -7568,7 +7019,7 @@
         </w:rPr>
         <w:t xml:space="preserve"> response would be. What was that person feeling? What was that person needing, wanting to have more of, or yearning to experience? Check the </w:t>
       </w:r>
-      <w:hyperlink w:history="1" r:id="rIde8azg67iot__kp52lz0mi">
+      <w:hyperlink w:history="1" r:id="rId4pf5psyqpyxudohpf4lzr">
         <w:r>
           <w:rPr>
             <w:color w:val="1155CC"/>
@@ -7589,7 +7040,7 @@
         </w:rPr>
         <w:t xml:space="preserve"> and the </w:t>
       </w:r>
-      <w:hyperlink w:history="1" r:id="rId1hyedhe6puogzgsr0dtee">
+      <w:hyperlink w:history="1" r:id="rId8p6ncznnckj-mrgvjp7zr">
         <w:r>
           <w:rPr>
             <w:color w:val="1155CC"/>
@@ -8041,7 +7492,7 @@
               </w:rPr>
               <w:t xml:space="preserve"> (feeling from the </w:t>
             </w:r>
-            <w:hyperlink w:history="1" r:id="rIdclnwzaetyiarbar1wvt2j">
+            <w:hyperlink w:history="1" r:id="rIdlbsqga6mz85z0yd8unqt0">
               <w:r>
                 <w:rPr>
                   <w:color w:val="1155CC"/>
@@ -8082,7 +7533,7 @@
               </w:rPr>
               <w:t xml:space="preserve"> (need from the </w:t>
             </w:r>
-            <w:hyperlink w:history="1" r:id="rIdeek9n2qyakgg9jnvfkhc5">
+            <w:hyperlink w:history="1" r:id="rIdu-iedd1gbv6co2eytqq93">
               <w:r>
                 <w:rPr>
                   <w:color w:val="1155CC"/>
@@ -8348,69 +7799,8 @@
         </w:trPr>
         <w:tc>
           <w:tcPr>
-            <w:tcW w:type="dxa" w:w="2000"/>
-            <w:tcBorders>
-              <w:top w:val="single" w:color="CFE3DF" w:sz="4"/>
-              <w:left w:val="single" w:color="CFE3DF" w:sz="4"/>
-              <w:bottom w:val="single" w:color="CFE3DF" w:sz="4"/>
-              <w:right w:val="single" w:color="CFE3DF" w:sz="4"/>
-            </w:tcBorders>
-            <w:shd w:fill="F2ECDC" w:val="clear"/>
-            <w:tcMar>
-              <w:top w:type="dxa" w:w="70"/>
-              <w:left w:type="dxa" w:w="110"/>
-              <w:bottom w:type="dxa" w:w="70"/>
-              <w:right w:type="dxa" w:w="110"/>
-            </w:tcMar>
-            <w:vAlign w:val="top"/>
-          </w:tcPr>
-          <w:p>
-            <w:pPr>
-              <w:spacing w:after="0" w:before="0"/>
-            </w:pPr>
-            <w:r>
-              <w:rPr>
-                <w:sz w:val="20"/>
-                <w:szCs w:val="20"/>
-              </w:rPr>
-              <w:t xml:space="preserve"/>
-            </w:r>
-          </w:p>
-        </w:tc>
-        <w:tc>
-          <w:tcPr>
-            <w:tcW w:type="dxa" w:w="4660"/>
-            <w:tcBorders>
-              <w:top w:val="single" w:color="CFE3DF" w:sz="4"/>
-              <w:left w:val="single" w:color="CFE3DF" w:sz="4"/>
-              <w:bottom w:val="single" w:color="CFE3DF" w:sz="4"/>
-              <w:right w:val="single" w:color="CFE3DF" w:sz="4"/>
-            </w:tcBorders>
-            <w:shd w:fill="F2ECDC" w:val="clear"/>
-            <w:tcMar>
-              <w:top w:type="dxa" w:w="70"/>
-              <w:left w:type="dxa" w:w="110"/>
-              <w:bottom w:type="dxa" w:w="70"/>
-              <w:right w:type="dxa" w:w="110"/>
-            </w:tcMar>
-            <w:vAlign w:val="top"/>
-          </w:tcPr>
-          <w:p>
-            <w:pPr>
-              <w:spacing w:after="0" w:before="0"/>
-            </w:pPr>
-            <w:r>
-              <w:rPr>
-                <w:sz w:val="20"/>
-                <w:szCs w:val="20"/>
-              </w:rPr>
-              <w:t xml:space="preserve"/>
-            </w:r>
-          </w:p>
-        </w:tc>
-        <w:tc>
-          <w:tcPr>
-            <w:tcW w:type="dxa" w:w="2700"/>
+            <w:tcW w:type="dxa" w:w="9360"/>
+            <w:gridSpan w:val="3"/>
             <w:tcBorders>
               <w:top w:val="single" w:color="CFE3DF" w:sz="4"/>
               <w:left w:val="single" w:color="CFE3DF" w:sz="4"/>
@@ -9224,69 +8614,8 @@
         </w:trPr>
         <w:tc>
           <w:tcPr>
-            <w:tcW w:type="dxa" w:w="2000"/>
-            <w:tcBorders>
-              <w:top w:val="single" w:color="CFE3DF" w:sz="4"/>
-              <w:left w:val="single" w:color="CFE3DF" w:sz="4"/>
-              <w:bottom w:val="single" w:color="CFE3DF" w:sz="4"/>
-              <w:right w:val="single" w:color="CFE3DF" w:sz="4"/>
-            </w:tcBorders>
-            <w:shd w:fill="F2ECDC" w:val="clear"/>
-            <w:tcMar>
-              <w:top w:type="dxa" w:w="70"/>
-              <w:left w:type="dxa" w:w="110"/>
-              <w:bottom w:type="dxa" w:w="70"/>
-              <w:right w:type="dxa" w:w="110"/>
-            </w:tcMar>
-            <w:vAlign w:val="top"/>
-          </w:tcPr>
-          <w:p>
-            <w:pPr>
-              <w:spacing w:after="0" w:before="0"/>
-            </w:pPr>
-            <w:r>
-              <w:rPr>
-                <w:sz w:val="20"/>
-                <w:szCs w:val="20"/>
-              </w:rPr>
-              <w:t xml:space="preserve"/>
-            </w:r>
-          </w:p>
-        </w:tc>
-        <w:tc>
-          <w:tcPr>
-            <w:tcW w:type="dxa" w:w="4660"/>
-            <w:tcBorders>
-              <w:top w:val="single" w:color="CFE3DF" w:sz="4"/>
-              <w:left w:val="single" w:color="CFE3DF" w:sz="4"/>
-              <w:bottom w:val="single" w:color="CFE3DF" w:sz="4"/>
-              <w:right w:val="single" w:color="CFE3DF" w:sz="4"/>
-            </w:tcBorders>
-            <w:shd w:fill="F2ECDC" w:val="clear"/>
-            <w:tcMar>
-              <w:top w:type="dxa" w:w="70"/>
-              <w:left w:type="dxa" w:w="110"/>
-              <w:bottom w:type="dxa" w:w="70"/>
-              <w:right w:type="dxa" w:w="110"/>
-            </w:tcMar>
-            <w:vAlign w:val="top"/>
-          </w:tcPr>
-          <w:p>
-            <w:pPr>
-              <w:spacing w:after="0" w:before="0"/>
-            </w:pPr>
-            <w:r>
-              <w:rPr>
-                <w:sz w:val="20"/>
-                <w:szCs w:val="20"/>
-              </w:rPr>
-              <w:t xml:space="preserve"/>
-            </w:r>
-          </w:p>
-        </w:tc>
-        <w:tc>
-          <w:tcPr>
-            <w:tcW w:type="dxa" w:w="2700"/>
+            <w:tcW w:type="dxa" w:w="9360"/>
+            <w:gridSpan w:val="3"/>
             <w:tcBorders>
               <w:top w:val="single" w:color="CFE3DF" w:sz="4"/>
               <w:left w:val="single" w:color="CFE3DF" w:sz="4"/>
@@ -10168,69 +9497,8 @@
         </w:trPr>
         <w:tc>
           <w:tcPr>
-            <w:tcW w:type="dxa" w:w="2000"/>
-            <w:tcBorders>
-              <w:top w:val="single" w:color="CFE3DF" w:sz="4"/>
-              <w:left w:val="single" w:color="CFE3DF" w:sz="4"/>
-              <w:bottom w:val="single" w:color="CFE3DF" w:sz="4"/>
-              <w:right w:val="single" w:color="CFE3DF" w:sz="4"/>
-            </w:tcBorders>
-            <w:shd w:fill="F2ECDC" w:val="clear"/>
-            <w:tcMar>
-              <w:top w:type="dxa" w:w="70"/>
-              <w:left w:type="dxa" w:w="110"/>
-              <w:bottom w:type="dxa" w:w="70"/>
-              <w:right w:type="dxa" w:w="110"/>
-            </w:tcMar>
-            <w:vAlign w:val="top"/>
-          </w:tcPr>
-          <w:p>
-            <w:pPr>
-              <w:spacing w:after="0" w:before="0"/>
-            </w:pPr>
-            <w:r>
-              <w:rPr>
-                <w:sz w:val="20"/>
-                <w:szCs w:val="20"/>
-              </w:rPr>
-              <w:t xml:space="preserve"/>
-            </w:r>
-          </w:p>
-        </w:tc>
-        <w:tc>
-          <w:tcPr>
-            <w:tcW w:type="dxa" w:w="4660"/>
-            <w:tcBorders>
-              <w:top w:val="single" w:color="CFE3DF" w:sz="4"/>
-              <w:left w:val="single" w:color="CFE3DF" w:sz="4"/>
-              <w:bottom w:val="single" w:color="CFE3DF" w:sz="4"/>
-              <w:right w:val="single" w:color="CFE3DF" w:sz="4"/>
-            </w:tcBorders>
-            <w:shd w:fill="F2ECDC" w:val="clear"/>
-            <w:tcMar>
-              <w:top w:type="dxa" w:w="70"/>
-              <w:left w:type="dxa" w:w="110"/>
-              <w:bottom w:type="dxa" w:w="70"/>
-              <w:right w:type="dxa" w:w="110"/>
-            </w:tcMar>
-            <w:vAlign w:val="top"/>
-          </w:tcPr>
-          <w:p>
-            <w:pPr>
-              <w:spacing w:after="0" w:before="0"/>
-            </w:pPr>
-            <w:r>
-              <w:rPr>
-                <w:sz w:val="20"/>
-                <w:szCs w:val="20"/>
-              </w:rPr>
-              <w:t xml:space="preserve"/>
-            </w:r>
-          </w:p>
-        </w:tc>
-        <w:tc>
-          <w:tcPr>
-            <w:tcW w:type="dxa" w:w="2700"/>
+            <w:tcW w:type="dxa" w:w="9360"/>
+            <w:gridSpan w:val="3"/>
             <w:tcBorders>
               <w:top w:val="single" w:color="CFE3DF" w:sz="4"/>
               <w:left w:val="single" w:color="CFE3DF" w:sz="4"/>
@@ -11045,69 +10313,8 @@
         </w:trPr>
         <w:tc>
           <w:tcPr>
-            <w:tcW w:type="dxa" w:w="2000"/>
-            <w:tcBorders>
-              <w:top w:val="single" w:color="CFE3DF" w:sz="4"/>
-              <w:left w:val="single" w:color="CFE3DF" w:sz="4"/>
-              <w:bottom w:val="single" w:color="CFE3DF" w:sz="4"/>
-              <w:right w:val="single" w:color="CFE3DF" w:sz="4"/>
-            </w:tcBorders>
-            <w:shd w:fill="F2ECDC" w:val="clear"/>
-            <w:tcMar>
-              <w:top w:type="dxa" w:w="70"/>
-              <w:left w:type="dxa" w:w="110"/>
-              <w:bottom w:type="dxa" w:w="70"/>
-              <w:right w:type="dxa" w:w="110"/>
-            </w:tcMar>
-            <w:vAlign w:val="top"/>
-          </w:tcPr>
-          <w:p>
-            <w:pPr>
-              <w:spacing w:after="0" w:before="0"/>
-            </w:pPr>
-            <w:r>
-              <w:rPr>
-                <w:sz w:val="20"/>
-                <w:szCs w:val="20"/>
-              </w:rPr>
-              <w:t xml:space="preserve"/>
-            </w:r>
-          </w:p>
-        </w:tc>
-        <w:tc>
-          <w:tcPr>
-            <w:tcW w:type="dxa" w:w="4660"/>
-            <w:tcBorders>
-              <w:top w:val="single" w:color="CFE3DF" w:sz="4"/>
-              <w:left w:val="single" w:color="CFE3DF" w:sz="4"/>
-              <w:bottom w:val="single" w:color="CFE3DF" w:sz="4"/>
-              <w:right w:val="single" w:color="CFE3DF" w:sz="4"/>
-            </w:tcBorders>
-            <w:shd w:fill="F2ECDC" w:val="clear"/>
-            <w:tcMar>
-              <w:top w:type="dxa" w:w="70"/>
-              <w:left w:type="dxa" w:w="110"/>
-              <w:bottom w:type="dxa" w:w="70"/>
-              <w:right w:type="dxa" w:w="110"/>
-            </w:tcMar>
-            <w:vAlign w:val="top"/>
-          </w:tcPr>
-          <w:p>
-            <w:pPr>
-              <w:spacing w:after="0" w:before="0"/>
-            </w:pPr>
-            <w:r>
-              <w:rPr>
-                <w:sz w:val="20"/>
-                <w:szCs w:val="20"/>
-              </w:rPr>
-              <w:t xml:space="preserve"/>
-            </w:r>
-          </w:p>
-        </w:tc>
-        <w:tc>
-          <w:tcPr>
-            <w:tcW w:type="dxa" w:w="2700"/>
+            <w:tcW w:type="dxa" w:w="9360"/>
+            <w:gridSpan w:val="3"/>
             <w:tcBorders>
               <w:top w:val="single" w:color="CFE3DF" w:sz="4"/>
               <w:left w:val="single" w:color="CFE3DF" w:sz="4"/>
@@ -12130,69 +11337,8 @@
         </w:trPr>
         <w:tc>
           <w:tcPr>
-            <w:tcW w:type="dxa" w:w="2000"/>
-            <w:tcBorders>
-              <w:top w:val="single" w:color="CFE3DF" w:sz="4"/>
-              <w:left w:val="single" w:color="CFE3DF" w:sz="4"/>
-              <w:bottom w:val="single" w:color="CFE3DF" w:sz="4"/>
-              <w:right w:val="single" w:color="CFE3DF" w:sz="4"/>
-            </w:tcBorders>
-            <w:shd w:fill="F2ECDC" w:val="clear"/>
-            <w:tcMar>
-              <w:top w:type="dxa" w:w="70"/>
-              <w:left w:type="dxa" w:w="110"/>
-              <w:bottom w:type="dxa" w:w="70"/>
-              <w:right w:type="dxa" w:w="110"/>
-            </w:tcMar>
-            <w:vAlign w:val="top"/>
-          </w:tcPr>
-          <w:p>
-            <w:pPr>
-              <w:spacing w:after="0" w:before="0"/>
-            </w:pPr>
-            <w:r>
-              <w:rPr>
-                <w:sz w:val="20"/>
-                <w:szCs w:val="20"/>
-              </w:rPr>
-              <w:t xml:space="preserve"/>
-            </w:r>
-          </w:p>
-        </w:tc>
-        <w:tc>
-          <w:tcPr>
-            <w:tcW w:type="dxa" w:w="4660"/>
-            <w:tcBorders>
-              <w:top w:val="single" w:color="CFE3DF" w:sz="4"/>
-              <w:left w:val="single" w:color="CFE3DF" w:sz="4"/>
-              <w:bottom w:val="single" w:color="CFE3DF" w:sz="4"/>
-              <w:right w:val="single" w:color="CFE3DF" w:sz="4"/>
-            </w:tcBorders>
-            <w:shd w:fill="F2ECDC" w:val="clear"/>
-            <w:tcMar>
-              <w:top w:type="dxa" w:w="70"/>
-              <w:left w:type="dxa" w:w="110"/>
-              <w:bottom w:type="dxa" w:w="70"/>
-              <w:right w:type="dxa" w:w="110"/>
-            </w:tcMar>
-            <w:vAlign w:val="top"/>
-          </w:tcPr>
-          <w:p>
-            <w:pPr>
-              <w:spacing w:after="0" w:before="0"/>
-            </w:pPr>
-            <w:r>
-              <w:rPr>
-                <w:sz w:val="20"/>
-                <w:szCs w:val="20"/>
-              </w:rPr>
-              <w:t xml:space="preserve"/>
-            </w:r>
-          </w:p>
-        </w:tc>
-        <w:tc>
-          <w:tcPr>
-            <w:tcW w:type="dxa" w:w="2700"/>
+            <w:tcW w:type="dxa" w:w="9360"/>
+            <w:gridSpan w:val="3"/>
             <w:tcBorders>
               <w:top w:val="single" w:color="CFE3DF" w:sz="4"/>
               <w:left w:val="single" w:color="CFE3DF" w:sz="4"/>
@@ -13163,69 +12309,8 @@
         </w:trPr>
         <w:tc>
           <w:tcPr>
-            <w:tcW w:type="dxa" w:w="2000"/>
-            <w:tcBorders>
-              <w:top w:val="single" w:color="CFE3DF" w:sz="4"/>
-              <w:left w:val="single" w:color="CFE3DF" w:sz="4"/>
-              <w:bottom w:val="single" w:color="CFE3DF" w:sz="4"/>
-              <w:right w:val="single" w:color="CFE3DF" w:sz="4"/>
-            </w:tcBorders>
-            <w:shd w:fill="F2ECDC" w:val="clear"/>
-            <w:tcMar>
-              <w:top w:type="dxa" w:w="70"/>
-              <w:left w:type="dxa" w:w="110"/>
-              <w:bottom w:type="dxa" w:w="70"/>
-              <w:right w:type="dxa" w:w="110"/>
-            </w:tcMar>
-            <w:vAlign w:val="top"/>
-          </w:tcPr>
-          <w:p>
-            <w:pPr>
-              <w:spacing w:after="0" w:before="0"/>
-            </w:pPr>
-            <w:r>
-              <w:rPr>
-                <w:sz w:val="20"/>
-                <w:szCs w:val="20"/>
-              </w:rPr>
-              <w:t xml:space="preserve"/>
-            </w:r>
-          </w:p>
-        </w:tc>
-        <w:tc>
-          <w:tcPr>
-            <w:tcW w:type="dxa" w:w="4660"/>
-            <w:tcBorders>
-              <w:top w:val="single" w:color="CFE3DF" w:sz="4"/>
-              <w:left w:val="single" w:color="CFE3DF" w:sz="4"/>
-              <w:bottom w:val="single" w:color="CFE3DF" w:sz="4"/>
-              <w:right w:val="single" w:color="CFE3DF" w:sz="4"/>
-            </w:tcBorders>
-            <w:shd w:fill="F2ECDC" w:val="clear"/>
-            <w:tcMar>
-              <w:top w:type="dxa" w:w="70"/>
-              <w:left w:type="dxa" w:w="110"/>
-              <w:bottom w:type="dxa" w:w="70"/>
-              <w:right w:type="dxa" w:w="110"/>
-            </w:tcMar>
-            <w:vAlign w:val="top"/>
-          </w:tcPr>
-          <w:p>
-            <w:pPr>
-              <w:spacing w:after="0" w:before="0"/>
-            </w:pPr>
-            <w:r>
-              <w:rPr>
-                <w:sz w:val="20"/>
-                <w:szCs w:val="20"/>
-              </w:rPr>
-              <w:t xml:space="preserve"/>
-            </w:r>
-          </w:p>
-        </w:tc>
-        <w:tc>
-          <w:tcPr>
-            <w:tcW w:type="dxa" w:w="2700"/>
+            <w:tcW w:type="dxa" w:w="9360"/>
+            <w:gridSpan w:val="3"/>
             <w:tcBorders>
               <w:top w:val="single" w:color="CFE3DF" w:sz="4"/>
               <w:left w:val="single" w:color="CFE3DF" w:sz="4"/>
@@ -14060,69 +13145,8 @@
         </w:trPr>
         <w:tc>
           <w:tcPr>
-            <w:tcW w:type="dxa" w:w="2000"/>
-            <w:tcBorders>
-              <w:top w:val="single" w:color="CFE3DF" w:sz="4"/>
-              <w:left w:val="single" w:color="CFE3DF" w:sz="4"/>
-              <w:bottom w:val="single" w:color="CFE3DF" w:sz="4"/>
-              <w:right w:val="single" w:color="CFE3DF" w:sz="4"/>
-            </w:tcBorders>
-            <w:shd w:fill="F2ECDC" w:val="clear"/>
-            <w:tcMar>
-              <w:top w:type="dxa" w:w="70"/>
-              <w:left w:type="dxa" w:w="110"/>
-              <w:bottom w:type="dxa" w:w="70"/>
-              <w:right w:type="dxa" w:w="110"/>
-            </w:tcMar>
-            <w:vAlign w:val="top"/>
-          </w:tcPr>
-          <w:p>
-            <w:pPr>
-              <w:spacing w:after="0" w:before="0"/>
-            </w:pPr>
-            <w:r>
-              <w:rPr>
-                <w:sz w:val="20"/>
-                <w:szCs w:val="20"/>
-              </w:rPr>
-              <w:t xml:space="preserve"/>
-            </w:r>
-          </w:p>
-        </w:tc>
-        <w:tc>
-          <w:tcPr>
-            <w:tcW w:type="dxa" w:w="4660"/>
-            <w:tcBorders>
-              <w:top w:val="single" w:color="CFE3DF" w:sz="4"/>
-              <w:left w:val="single" w:color="CFE3DF" w:sz="4"/>
-              <w:bottom w:val="single" w:color="CFE3DF" w:sz="4"/>
-              <w:right w:val="single" w:color="CFE3DF" w:sz="4"/>
-            </w:tcBorders>
-            <w:shd w:fill="F2ECDC" w:val="clear"/>
-            <w:tcMar>
-              <w:top w:type="dxa" w:w="70"/>
-              <w:left w:type="dxa" w:w="110"/>
-              <w:bottom w:type="dxa" w:w="70"/>
-              <w:right w:type="dxa" w:w="110"/>
-            </w:tcMar>
-            <w:vAlign w:val="top"/>
-          </w:tcPr>
-          <w:p>
-            <w:pPr>
-              <w:spacing w:after="0" w:before="0"/>
-            </w:pPr>
-            <w:r>
-              <w:rPr>
-                <w:sz w:val="20"/>
-                <w:szCs w:val="20"/>
-              </w:rPr>
-              <w:t xml:space="preserve"/>
-            </w:r>
-          </w:p>
-        </w:tc>
-        <w:tc>
-          <w:tcPr>
-            <w:tcW w:type="dxa" w:w="2700"/>
+            <w:tcW w:type="dxa" w:w="9360"/>
+            <w:gridSpan w:val="3"/>
             <w:tcBorders>
               <w:top w:val="single" w:color="CFE3DF" w:sz="4"/>
               <w:left w:val="single" w:color="CFE3DF" w:sz="4"/>
@@ -14724,69 +13748,8 @@
         </w:trPr>
         <w:tc>
           <w:tcPr>
-            <w:tcW w:type="dxa" w:w="2000"/>
-            <w:tcBorders>
-              <w:top w:val="single" w:color="CFE3DF" w:sz="4"/>
-              <w:left w:val="single" w:color="CFE3DF" w:sz="4"/>
-              <w:bottom w:val="single" w:color="CFE3DF" w:sz="4"/>
-              <w:right w:val="single" w:color="CFE3DF" w:sz="4"/>
-            </w:tcBorders>
-            <w:shd w:fill="F2ECDC" w:val="clear"/>
-            <w:tcMar>
-              <w:top w:type="dxa" w:w="70"/>
-              <w:left w:type="dxa" w:w="110"/>
-              <w:bottom w:type="dxa" w:w="70"/>
-              <w:right w:type="dxa" w:w="110"/>
-            </w:tcMar>
-            <w:vAlign w:val="top"/>
-          </w:tcPr>
-          <w:p>
-            <w:pPr>
-              <w:spacing w:after="0" w:before="0"/>
-            </w:pPr>
-            <w:r>
-              <w:rPr>
-                <w:sz w:val="20"/>
-                <w:szCs w:val="20"/>
-              </w:rPr>
-              <w:t xml:space="preserve"/>
-            </w:r>
-          </w:p>
-        </w:tc>
-        <w:tc>
-          <w:tcPr>
-            <w:tcW w:type="dxa" w:w="4660"/>
-            <w:tcBorders>
-              <w:top w:val="single" w:color="CFE3DF" w:sz="4"/>
-              <w:left w:val="single" w:color="CFE3DF" w:sz="4"/>
-              <w:bottom w:val="single" w:color="CFE3DF" w:sz="4"/>
-              <w:right w:val="single" w:color="CFE3DF" w:sz="4"/>
-            </w:tcBorders>
-            <w:shd w:fill="F2ECDC" w:val="clear"/>
-            <w:tcMar>
-              <w:top w:type="dxa" w:w="70"/>
-              <w:left w:type="dxa" w:w="110"/>
-              <w:bottom w:type="dxa" w:w="70"/>
-              <w:right w:type="dxa" w:w="110"/>
-            </w:tcMar>
-            <w:vAlign w:val="top"/>
-          </w:tcPr>
-          <w:p>
-            <w:pPr>
-              <w:spacing w:after="0" w:before="0"/>
-            </w:pPr>
-            <w:r>
-              <w:rPr>
-                <w:sz w:val="20"/>
-                <w:szCs w:val="20"/>
-              </w:rPr>
-              <w:t xml:space="preserve"/>
-            </w:r>
-          </w:p>
-        </w:tc>
-        <w:tc>
-          <w:tcPr>
-            <w:tcW w:type="dxa" w:w="2700"/>
+            <w:tcW w:type="dxa" w:w="9360"/>
+            <w:gridSpan w:val="3"/>
             <w:tcBorders>
               <w:top w:val="single" w:color="CFE3DF" w:sz="4"/>
               <w:left w:val="single" w:color="CFE3DF" w:sz="4"/>
@@ -15380,69 +14343,8 @@
         </w:trPr>
         <w:tc>
           <w:tcPr>
-            <w:tcW w:type="dxa" w:w="2000"/>
-            <w:tcBorders>
-              <w:top w:val="single" w:color="CFE3DF" w:sz="4"/>
-              <w:left w:val="single" w:color="CFE3DF" w:sz="4"/>
-              <w:bottom w:val="single" w:color="CFE3DF" w:sz="4"/>
-              <w:right w:val="single" w:color="CFE3DF" w:sz="4"/>
-            </w:tcBorders>
-            <w:shd w:fill="F2ECDC" w:val="clear"/>
-            <w:tcMar>
-              <w:top w:type="dxa" w:w="70"/>
-              <w:left w:type="dxa" w:w="110"/>
-              <w:bottom w:type="dxa" w:w="70"/>
-              <w:right w:type="dxa" w:w="110"/>
-            </w:tcMar>
-            <w:vAlign w:val="top"/>
-          </w:tcPr>
-          <w:p>
-            <w:pPr>
-              <w:spacing w:after="0" w:before="0"/>
-            </w:pPr>
-            <w:r>
-              <w:rPr>
-                <w:sz w:val="20"/>
-                <w:szCs w:val="20"/>
-              </w:rPr>
-              <w:t xml:space="preserve"/>
-            </w:r>
-          </w:p>
-        </w:tc>
-        <w:tc>
-          <w:tcPr>
-            <w:tcW w:type="dxa" w:w="4660"/>
-            <w:tcBorders>
-              <w:top w:val="single" w:color="CFE3DF" w:sz="4"/>
-              <w:left w:val="single" w:color="CFE3DF" w:sz="4"/>
-              <w:bottom w:val="single" w:color="CFE3DF" w:sz="4"/>
-              <w:right w:val="single" w:color="CFE3DF" w:sz="4"/>
-            </w:tcBorders>
-            <w:shd w:fill="F2ECDC" w:val="clear"/>
-            <w:tcMar>
-              <w:top w:type="dxa" w:w="70"/>
-              <w:left w:type="dxa" w:w="110"/>
-              <w:bottom w:type="dxa" w:w="70"/>
-              <w:right w:type="dxa" w:w="110"/>
-            </w:tcMar>
-            <w:vAlign w:val="top"/>
-          </w:tcPr>
-          <w:p>
-            <w:pPr>
-              <w:spacing w:after="0" w:before="0"/>
-            </w:pPr>
-            <w:r>
-              <w:rPr>
-                <w:sz w:val="20"/>
-                <w:szCs w:val="20"/>
-              </w:rPr>
-              <w:t xml:space="preserve"/>
-            </w:r>
-          </w:p>
-        </w:tc>
-        <w:tc>
-          <w:tcPr>
-            <w:tcW w:type="dxa" w:w="2700"/>
+            <w:tcW w:type="dxa" w:w="9360"/>
+            <w:gridSpan w:val="3"/>
             <w:tcBorders>
               <w:top w:val="single" w:color="CFE3DF" w:sz="4"/>
               <w:left w:val="single" w:color="CFE3DF" w:sz="4"/>
@@ -16044,69 +14946,8 @@
         </w:trPr>
         <w:tc>
           <w:tcPr>
-            <w:tcW w:type="dxa" w:w="2000"/>
-            <w:tcBorders>
-              <w:top w:val="single" w:color="CFE3DF" w:sz="4"/>
-              <w:left w:val="single" w:color="CFE3DF" w:sz="4"/>
-              <w:bottom w:val="single" w:color="CFE3DF" w:sz="4"/>
-              <w:right w:val="single" w:color="CFE3DF" w:sz="4"/>
-            </w:tcBorders>
-            <w:shd w:fill="F2ECDC" w:val="clear"/>
-            <w:tcMar>
-              <w:top w:type="dxa" w:w="70"/>
-              <w:left w:type="dxa" w:w="110"/>
-              <w:bottom w:type="dxa" w:w="70"/>
-              <w:right w:type="dxa" w:w="110"/>
-            </w:tcMar>
-            <w:vAlign w:val="top"/>
-          </w:tcPr>
-          <w:p>
-            <w:pPr>
-              <w:spacing w:after="0" w:before="0"/>
-            </w:pPr>
-            <w:r>
-              <w:rPr>
-                <w:sz w:val="20"/>
-                <w:szCs w:val="20"/>
-              </w:rPr>
-              <w:t xml:space="preserve"/>
-            </w:r>
-          </w:p>
-        </w:tc>
-        <w:tc>
-          <w:tcPr>
-            <w:tcW w:type="dxa" w:w="4660"/>
-            <w:tcBorders>
-              <w:top w:val="single" w:color="CFE3DF" w:sz="4"/>
-              <w:left w:val="single" w:color="CFE3DF" w:sz="4"/>
-              <w:bottom w:val="single" w:color="CFE3DF" w:sz="4"/>
-              <w:right w:val="single" w:color="CFE3DF" w:sz="4"/>
-            </w:tcBorders>
-            <w:shd w:fill="F2ECDC" w:val="clear"/>
-            <w:tcMar>
-              <w:top w:type="dxa" w:w="70"/>
-              <w:left w:type="dxa" w:w="110"/>
-              <w:bottom w:type="dxa" w:w="70"/>
-              <w:right w:type="dxa" w:w="110"/>
-            </w:tcMar>
-            <w:vAlign w:val="top"/>
-          </w:tcPr>
-          <w:p>
-            <w:pPr>
-              <w:spacing w:after="0" w:before="0"/>
-            </w:pPr>
-            <w:r>
-              <w:rPr>
-                <w:sz w:val="20"/>
-                <w:szCs w:val="20"/>
-              </w:rPr>
-              <w:t xml:space="preserve"/>
-            </w:r>
-          </w:p>
-        </w:tc>
-        <w:tc>
-          <w:tcPr>
-            <w:tcW w:type="dxa" w:w="2700"/>
+            <w:tcW w:type="dxa" w:w="9360"/>
+            <w:gridSpan w:val="3"/>
             <w:tcBorders>
               <w:top w:val="single" w:color="CFE3DF" w:sz="4"/>
               <w:left w:val="single" w:color="CFE3DF" w:sz="4"/>
@@ -16547,69 +15388,8 @@
         </w:trPr>
         <w:tc>
           <w:tcPr>
-            <w:tcW w:type="dxa" w:w="2000"/>
-            <w:tcBorders>
-              <w:top w:val="single" w:color="CFE3DF" w:sz="4"/>
-              <w:left w:val="single" w:color="CFE3DF" w:sz="4"/>
-              <w:bottom w:val="single" w:color="CFE3DF" w:sz="4"/>
-              <w:right w:val="single" w:color="CFE3DF" w:sz="4"/>
-            </w:tcBorders>
-            <w:shd w:fill="F2ECDC" w:val="clear"/>
-            <w:tcMar>
-              <w:top w:type="dxa" w:w="70"/>
-              <w:left w:type="dxa" w:w="110"/>
-              <w:bottom w:type="dxa" w:w="70"/>
-              <w:right w:type="dxa" w:w="110"/>
-            </w:tcMar>
-            <w:vAlign w:val="top"/>
-          </w:tcPr>
-          <w:p>
-            <w:pPr>
-              <w:spacing w:after="0" w:before="0"/>
-            </w:pPr>
-            <w:r>
-              <w:rPr>
-                <w:sz w:val="20"/>
-                <w:szCs w:val="20"/>
-              </w:rPr>
-              <w:t xml:space="preserve"/>
-            </w:r>
-          </w:p>
-        </w:tc>
-        <w:tc>
-          <w:tcPr>
-            <w:tcW w:type="dxa" w:w="4660"/>
-            <w:tcBorders>
-              <w:top w:val="single" w:color="CFE3DF" w:sz="4"/>
-              <w:left w:val="single" w:color="CFE3DF" w:sz="4"/>
-              <w:bottom w:val="single" w:color="CFE3DF" w:sz="4"/>
-              <w:right w:val="single" w:color="CFE3DF" w:sz="4"/>
-            </w:tcBorders>
-            <w:shd w:fill="F2ECDC" w:val="clear"/>
-            <w:tcMar>
-              <w:top w:type="dxa" w:w="70"/>
-              <w:left w:type="dxa" w:w="110"/>
-              <w:bottom w:type="dxa" w:w="70"/>
-              <w:right w:type="dxa" w:w="110"/>
-            </w:tcMar>
-            <w:vAlign w:val="top"/>
-          </w:tcPr>
-          <w:p>
-            <w:pPr>
-              <w:spacing w:after="0" w:before="0"/>
-            </w:pPr>
-            <w:r>
-              <w:rPr>
-                <w:sz w:val="20"/>
-                <w:szCs w:val="20"/>
-              </w:rPr>
-              <w:t xml:space="preserve"/>
-            </w:r>
-          </w:p>
-        </w:tc>
-        <w:tc>
-          <w:tcPr>
-            <w:tcW w:type="dxa" w:w="2700"/>
+            <w:tcW w:type="dxa" w:w="9360"/>
+            <w:gridSpan w:val="3"/>
             <w:tcBorders>
               <w:top w:val="single" w:color="CFE3DF" w:sz="4"/>
               <w:left w:val="single" w:color="CFE3DF" w:sz="4"/>
@@ -17223,69 +16003,8 @@
         </w:trPr>
         <w:tc>
           <w:tcPr>
-            <w:tcW w:type="dxa" w:w="2000"/>
-            <w:tcBorders>
-              <w:top w:val="single" w:color="CFE3DF" w:sz="4"/>
-              <w:left w:val="single" w:color="CFE3DF" w:sz="4"/>
-              <w:bottom w:val="single" w:color="CFE3DF" w:sz="4"/>
-              <w:right w:val="single" w:color="CFE3DF" w:sz="4"/>
-            </w:tcBorders>
-            <w:shd w:fill="F2ECDC" w:val="clear"/>
-            <w:tcMar>
-              <w:top w:type="dxa" w:w="70"/>
-              <w:left w:type="dxa" w:w="110"/>
-              <w:bottom w:type="dxa" w:w="70"/>
-              <w:right w:type="dxa" w:w="110"/>
-            </w:tcMar>
-            <w:vAlign w:val="top"/>
-          </w:tcPr>
-          <w:p>
-            <w:pPr>
-              <w:spacing w:after="0" w:before="0"/>
-            </w:pPr>
-            <w:r>
-              <w:rPr>
-                <w:sz w:val="20"/>
-                <w:szCs w:val="20"/>
-              </w:rPr>
-              <w:t xml:space="preserve"/>
-            </w:r>
-          </w:p>
-        </w:tc>
-        <w:tc>
-          <w:tcPr>
-            <w:tcW w:type="dxa" w:w="4660"/>
-            <w:tcBorders>
-              <w:top w:val="single" w:color="CFE3DF" w:sz="4"/>
-              <w:left w:val="single" w:color="CFE3DF" w:sz="4"/>
-              <w:bottom w:val="single" w:color="CFE3DF" w:sz="4"/>
-              <w:right w:val="single" w:color="CFE3DF" w:sz="4"/>
-            </w:tcBorders>
-            <w:shd w:fill="F2ECDC" w:val="clear"/>
-            <w:tcMar>
-              <w:top w:type="dxa" w:w="70"/>
-              <w:left w:type="dxa" w:w="110"/>
-              <w:bottom w:type="dxa" w:w="70"/>
-              <w:right w:type="dxa" w:w="110"/>
-            </w:tcMar>
-            <w:vAlign w:val="top"/>
-          </w:tcPr>
-          <w:p>
-            <w:pPr>
-              <w:spacing w:after="0" w:before="0"/>
-            </w:pPr>
-            <w:r>
-              <w:rPr>
-                <w:sz w:val="20"/>
-                <w:szCs w:val="20"/>
-              </w:rPr>
-              <w:t xml:space="preserve"/>
-            </w:r>
-          </w:p>
-        </w:tc>
-        <w:tc>
-          <w:tcPr>
-            <w:tcW w:type="dxa" w:w="2700"/>
+            <w:tcW w:type="dxa" w:w="9360"/>
+            <w:gridSpan w:val="3"/>
             <w:tcBorders>
               <w:top w:val="single" w:color="CFE3DF" w:sz="4"/>
               <w:left w:val="single" w:color="CFE3DF" w:sz="4"/>
@@ -18042,69 +16761,8 @@
         </w:trPr>
         <w:tc>
           <w:tcPr>
-            <w:tcW w:type="dxa" w:w="2000"/>
-            <w:tcBorders>
-              <w:top w:val="single" w:color="CFE3DF" w:sz="4"/>
-              <w:left w:val="single" w:color="CFE3DF" w:sz="4"/>
-              <w:bottom w:val="single" w:color="CFE3DF" w:sz="4"/>
-              <w:right w:val="single" w:color="CFE3DF" w:sz="4"/>
-            </w:tcBorders>
-            <w:shd w:fill="F2ECDC" w:val="clear"/>
-            <w:tcMar>
-              <w:top w:type="dxa" w:w="70"/>
-              <w:left w:type="dxa" w:w="110"/>
-              <w:bottom w:type="dxa" w:w="70"/>
-              <w:right w:type="dxa" w:w="110"/>
-            </w:tcMar>
-            <w:vAlign w:val="top"/>
-          </w:tcPr>
-          <w:p>
-            <w:pPr>
-              <w:spacing w:after="0" w:before="0"/>
-            </w:pPr>
-            <w:r>
-              <w:rPr>
-                <w:sz w:val="20"/>
-                <w:szCs w:val="20"/>
-              </w:rPr>
-              <w:t xml:space="preserve"/>
-            </w:r>
-          </w:p>
-        </w:tc>
-        <w:tc>
-          <w:tcPr>
-            <w:tcW w:type="dxa" w:w="4660"/>
-            <w:tcBorders>
-              <w:top w:val="single" w:color="CFE3DF" w:sz="4"/>
-              <w:left w:val="single" w:color="CFE3DF" w:sz="4"/>
-              <w:bottom w:val="single" w:color="CFE3DF" w:sz="4"/>
-              <w:right w:val="single" w:color="CFE3DF" w:sz="4"/>
-            </w:tcBorders>
-            <w:shd w:fill="F2ECDC" w:val="clear"/>
-            <w:tcMar>
-              <w:top w:type="dxa" w:w="70"/>
-              <w:left w:type="dxa" w:w="110"/>
-              <w:bottom w:type="dxa" w:w="70"/>
-              <w:right w:type="dxa" w:w="110"/>
-            </w:tcMar>
-            <w:vAlign w:val="top"/>
-          </w:tcPr>
-          <w:p>
-            <w:pPr>
-              <w:spacing w:after="0" w:before="0"/>
-            </w:pPr>
-            <w:r>
-              <w:rPr>
-                <w:sz w:val="20"/>
-                <w:szCs w:val="20"/>
-              </w:rPr>
-              <w:t xml:space="preserve"/>
-            </w:r>
-          </w:p>
-        </w:tc>
-        <w:tc>
-          <w:tcPr>
-            <w:tcW w:type="dxa" w:w="2700"/>
+            <w:tcW w:type="dxa" w:w="9360"/>
+            <w:gridSpan w:val="3"/>
             <w:tcBorders>
               <w:top w:val="single" w:color="CFE3DF" w:sz="4"/>
               <w:left w:val="single" w:color="CFE3DF" w:sz="4"/>
@@ -19069,69 +17727,8 @@
         </w:trPr>
         <w:tc>
           <w:tcPr>
-            <w:tcW w:type="dxa" w:w="2000"/>
-            <w:tcBorders>
-              <w:top w:val="single" w:color="CFE3DF" w:sz="4"/>
-              <w:left w:val="single" w:color="CFE3DF" w:sz="4"/>
-              <w:bottom w:val="single" w:color="CFE3DF" w:sz="4"/>
-              <w:right w:val="single" w:color="CFE3DF" w:sz="4"/>
-            </w:tcBorders>
-            <w:shd w:fill="F2ECDC" w:val="clear"/>
-            <w:tcMar>
-              <w:top w:type="dxa" w:w="70"/>
-              <w:left w:type="dxa" w:w="110"/>
-              <w:bottom w:type="dxa" w:w="70"/>
-              <w:right w:type="dxa" w:w="110"/>
-            </w:tcMar>
-            <w:vAlign w:val="top"/>
-          </w:tcPr>
-          <w:p>
-            <w:pPr>
-              <w:spacing w:after="0" w:before="0"/>
-            </w:pPr>
-            <w:r>
-              <w:rPr>
-                <w:sz w:val="20"/>
-                <w:szCs w:val="20"/>
-              </w:rPr>
-              <w:t xml:space="preserve"/>
-            </w:r>
-          </w:p>
-        </w:tc>
-        <w:tc>
-          <w:tcPr>
-            <w:tcW w:type="dxa" w:w="4660"/>
-            <w:tcBorders>
-              <w:top w:val="single" w:color="CFE3DF" w:sz="4"/>
-              <w:left w:val="single" w:color="CFE3DF" w:sz="4"/>
-              <w:bottom w:val="single" w:color="CFE3DF" w:sz="4"/>
-              <w:right w:val="single" w:color="CFE3DF" w:sz="4"/>
-            </w:tcBorders>
-            <w:shd w:fill="F2ECDC" w:val="clear"/>
-            <w:tcMar>
-              <w:top w:type="dxa" w:w="70"/>
-              <w:left w:type="dxa" w:w="110"/>
-              <w:bottom w:type="dxa" w:w="70"/>
-              <w:right w:type="dxa" w:w="110"/>
-            </w:tcMar>
-            <w:vAlign w:val="top"/>
-          </w:tcPr>
-          <w:p>
-            <w:pPr>
-              <w:spacing w:after="0" w:before="0"/>
-            </w:pPr>
-            <w:r>
-              <w:rPr>
-                <w:sz w:val="20"/>
-                <w:szCs w:val="20"/>
-              </w:rPr>
-              <w:t xml:space="preserve"/>
-            </w:r>
-          </w:p>
-        </w:tc>
-        <w:tc>
-          <w:tcPr>
-            <w:tcW w:type="dxa" w:w="2700"/>
+            <w:tcW w:type="dxa" w:w="9360"/>
+            <w:gridSpan w:val="3"/>
             <w:tcBorders>
               <w:top w:val="single" w:color="CFE3DF" w:sz="4"/>
               <w:left w:val="single" w:color="CFE3DF" w:sz="4"/>
@@ -20321,69 +18918,8 @@
         </w:trPr>
         <w:tc>
           <w:tcPr>
-            <w:tcW w:type="dxa" w:w="2000"/>
-            <w:tcBorders>
-              <w:top w:val="single" w:color="CFE3DF" w:sz="4"/>
-              <w:left w:val="single" w:color="CFE3DF" w:sz="4"/>
-              <w:bottom w:val="single" w:color="CFE3DF" w:sz="4"/>
-              <w:right w:val="single" w:color="CFE3DF" w:sz="4"/>
-            </w:tcBorders>
-            <w:shd w:fill="F2ECDC" w:val="clear"/>
-            <w:tcMar>
-              <w:top w:type="dxa" w:w="70"/>
-              <w:left w:type="dxa" w:w="110"/>
-              <w:bottom w:type="dxa" w:w="70"/>
-              <w:right w:type="dxa" w:w="110"/>
-            </w:tcMar>
-            <w:vAlign w:val="top"/>
-          </w:tcPr>
-          <w:p>
-            <w:pPr>
-              <w:spacing w:after="0" w:before="0"/>
-            </w:pPr>
-            <w:r>
-              <w:rPr>
-                <w:sz w:val="20"/>
-                <w:szCs w:val="20"/>
-              </w:rPr>
-              <w:t xml:space="preserve"/>
-            </w:r>
-          </w:p>
-        </w:tc>
-        <w:tc>
-          <w:tcPr>
-            <w:tcW w:type="dxa" w:w="4660"/>
-            <w:tcBorders>
-              <w:top w:val="single" w:color="CFE3DF" w:sz="4"/>
-              <w:left w:val="single" w:color="CFE3DF" w:sz="4"/>
-              <w:bottom w:val="single" w:color="CFE3DF" w:sz="4"/>
-              <w:right w:val="single" w:color="CFE3DF" w:sz="4"/>
-            </w:tcBorders>
-            <w:shd w:fill="F2ECDC" w:val="clear"/>
-            <w:tcMar>
-              <w:top w:type="dxa" w:w="70"/>
-              <w:left w:type="dxa" w:w="110"/>
-              <w:bottom w:type="dxa" w:w="70"/>
-              <w:right w:type="dxa" w:w="110"/>
-            </w:tcMar>
-            <w:vAlign w:val="top"/>
-          </w:tcPr>
-          <w:p>
-            <w:pPr>
-              <w:spacing w:after="0" w:before="0"/>
-            </w:pPr>
-            <w:r>
-              <w:rPr>
-                <w:sz w:val="20"/>
-                <w:szCs w:val="20"/>
-              </w:rPr>
-              <w:t xml:space="preserve"/>
-            </w:r>
-          </w:p>
-        </w:tc>
-        <w:tc>
-          <w:tcPr>
-            <w:tcW w:type="dxa" w:w="2700"/>
+            <w:tcW w:type="dxa" w:w="9360"/>
+            <w:gridSpan w:val="3"/>
             <w:tcBorders>
               <w:top w:val="single" w:color="CFE3DF" w:sz="4"/>
               <w:left w:val="single" w:color="CFE3DF" w:sz="4"/>
@@ -21009,69 +19545,8 @@
         </w:trPr>
         <w:tc>
           <w:tcPr>
-            <w:tcW w:type="dxa" w:w="2000"/>
-            <w:tcBorders>
-              <w:top w:val="single" w:color="CFE3DF" w:sz="4"/>
-              <w:left w:val="single" w:color="CFE3DF" w:sz="4"/>
-              <w:bottom w:val="single" w:color="CFE3DF" w:sz="4"/>
-              <w:right w:val="single" w:color="CFE3DF" w:sz="4"/>
-            </w:tcBorders>
-            <w:shd w:fill="F2ECDC" w:val="clear"/>
-            <w:tcMar>
-              <w:top w:type="dxa" w:w="70"/>
-              <w:left w:type="dxa" w:w="110"/>
-              <w:bottom w:type="dxa" w:w="70"/>
-              <w:right w:type="dxa" w:w="110"/>
-            </w:tcMar>
-            <w:vAlign w:val="top"/>
-          </w:tcPr>
-          <w:p>
-            <w:pPr>
-              <w:spacing w:after="0" w:before="0"/>
-            </w:pPr>
-            <w:r>
-              <w:rPr>
-                <w:sz w:val="20"/>
-                <w:szCs w:val="20"/>
-              </w:rPr>
-              <w:t xml:space="preserve"/>
-            </w:r>
-          </w:p>
-        </w:tc>
-        <w:tc>
-          <w:tcPr>
-            <w:tcW w:type="dxa" w:w="4660"/>
-            <w:tcBorders>
-              <w:top w:val="single" w:color="CFE3DF" w:sz="4"/>
-              <w:left w:val="single" w:color="CFE3DF" w:sz="4"/>
-              <w:bottom w:val="single" w:color="CFE3DF" w:sz="4"/>
-              <w:right w:val="single" w:color="CFE3DF" w:sz="4"/>
-            </w:tcBorders>
-            <w:shd w:fill="F2ECDC" w:val="clear"/>
-            <w:tcMar>
-              <w:top w:type="dxa" w:w="70"/>
-              <w:left w:type="dxa" w:w="110"/>
-              <w:bottom w:type="dxa" w:w="70"/>
-              <w:right w:type="dxa" w:w="110"/>
-            </w:tcMar>
-            <w:vAlign w:val="top"/>
-          </w:tcPr>
-          <w:p>
-            <w:pPr>
-              <w:spacing w:after="0" w:before="0"/>
-            </w:pPr>
-            <w:r>
-              <w:rPr>
-                <w:sz w:val="20"/>
-                <w:szCs w:val="20"/>
-              </w:rPr>
-              <w:t xml:space="preserve"/>
-            </w:r>
-          </w:p>
-        </w:tc>
-        <w:tc>
-          <w:tcPr>
-            <w:tcW w:type="dxa" w:w="2700"/>
+            <w:tcW w:type="dxa" w:w="9360"/>
+            <w:gridSpan w:val="3"/>
             <w:tcBorders>
               <w:top w:val="single" w:color="CFE3DF" w:sz="4"/>
               <w:left w:val="single" w:color="CFE3DF" w:sz="4"/>
@@ -21818,69 +20293,8 @@
         </w:trPr>
         <w:tc>
           <w:tcPr>
-            <w:tcW w:type="dxa" w:w="2000"/>
-            <w:tcBorders>
-              <w:top w:val="single" w:color="CFE3DF" w:sz="4"/>
-              <w:left w:val="single" w:color="CFE3DF" w:sz="4"/>
-              <w:bottom w:val="single" w:color="CFE3DF" w:sz="4"/>
-              <w:right w:val="single" w:color="CFE3DF" w:sz="4"/>
-            </w:tcBorders>
-            <w:shd w:fill="F2ECDC" w:val="clear"/>
-            <w:tcMar>
-              <w:top w:type="dxa" w:w="70"/>
-              <w:left w:type="dxa" w:w="110"/>
-              <w:bottom w:type="dxa" w:w="70"/>
-              <w:right w:type="dxa" w:w="110"/>
-            </w:tcMar>
-            <w:vAlign w:val="top"/>
-          </w:tcPr>
-          <w:p>
-            <w:pPr>
-              <w:spacing w:after="0" w:before="0"/>
-            </w:pPr>
-            <w:r>
-              <w:rPr>
-                <w:sz w:val="20"/>
-                <w:szCs w:val="20"/>
-              </w:rPr>
-              <w:t xml:space="preserve"/>
-            </w:r>
-          </w:p>
-        </w:tc>
-        <w:tc>
-          <w:tcPr>
-            <w:tcW w:type="dxa" w:w="4660"/>
-            <w:tcBorders>
-              <w:top w:val="single" w:color="CFE3DF" w:sz="4"/>
-              <w:left w:val="single" w:color="CFE3DF" w:sz="4"/>
-              <w:bottom w:val="single" w:color="CFE3DF" w:sz="4"/>
-              <w:right w:val="single" w:color="CFE3DF" w:sz="4"/>
-            </w:tcBorders>
-            <w:shd w:fill="F2ECDC" w:val="clear"/>
-            <w:tcMar>
-              <w:top w:type="dxa" w:w="70"/>
-              <w:left w:type="dxa" w:w="110"/>
-              <w:bottom w:type="dxa" w:w="70"/>
-              <w:right w:type="dxa" w:w="110"/>
-            </w:tcMar>
-            <w:vAlign w:val="top"/>
-          </w:tcPr>
-          <w:p>
-            <w:pPr>
-              <w:spacing w:after="0" w:before="0"/>
-            </w:pPr>
-            <w:r>
-              <w:rPr>
-                <w:sz w:val="20"/>
-                <w:szCs w:val="20"/>
-              </w:rPr>
-              <w:t xml:space="preserve"/>
-            </w:r>
-          </w:p>
-        </w:tc>
-        <w:tc>
-          <w:tcPr>
-            <w:tcW w:type="dxa" w:w="2700"/>
+            <w:tcW w:type="dxa" w:w="9360"/>
+            <w:gridSpan w:val="3"/>
             <w:tcBorders>
               <w:top w:val="single" w:color="CFE3DF" w:sz="4"/>
               <w:left w:val="single" w:color="CFE3DF" w:sz="4"/>
@@ -22241,7 +20655,7 @@
         </w:rPr>
         <w:t xml:space="preserve">You may want to find some quiet space and time for this exercise. Start by going to the </w:t>
       </w:r>
-      <w:hyperlink w:history="1" r:id="rIdcg1lz4gjvtl86fld2jiyh">
+      <w:hyperlink w:history="1" r:id="rIdpg_pqt4yn_tiaukc0nq7o">
         <w:r>
           <w:rPr>
             <w:color w:val="1155CC"/>
@@ -22756,69 +21170,8 @@
         </w:trPr>
         <w:tc>
           <w:tcPr>
-            <w:tcW w:type="dxa" w:w="2000"/>
-            <w:tcBorders>
-              <w:top w:val="single" w:color="CFE3DF" w:sz="4"/>
-              <w:left w:val="single" w:color="CFE3DF" w:sz="4"/>
-              <w:bottom w:val="single" w:color="CFE3DF" w:sz="4"/>
-              <w:right w:val="single" w:color="CFE3DF" w:sz="4"/>
-            </w:tcBorders>
-            <w:shd w:fill="F2ECDC" w:val="clear"/>
-            <w:tcMar>
-              <w:top w:type="dxa" w:w="70"/>
-              <w:left w:type="dxa" w:w="110"/>
-              <w:bottom w:type="dxa" w:w="70"/>
-              <w:right w:type="dxa" w:w="110"/>
-            </w:tcMar>
-            <w:vAlign w:val="top"/>
-          </w:tcPr>
-          <w:p>
-            <w:pPr>
-              <w:spacing w:after="0" w:before="0"/>
-            </w:pPr>
-            <w:r>
-              <w:rPr>
-                <w:sz w:val="20"/>
-                <w:szCs w:val="20"/>
-              </w:rPr>
-              <w:t xml:space="preserve"/>
-            </w:r>
-          </w:p>
-        </w:tc>
-        <w:tc>
-          <w:tcPr>
-            <w:tcW w:type="dxa" w:w="4660"/>
-            <w:tcBorders>
-              <w:top w:val="single" w:color="CFE3DF" w:sz="4"/>
-              <w:left w:val="single" w:color="CFE3DF" w:sz="4"/>
-              <w:bottom w:val="single" w:color="CFE3DF" w:sz="4"/>
-              <w:right w:val="single" w:color="CFE3DF" w:sz="4"/>
-            </w:tcBorders>
-            <w:shd w:fill="F2ECDC" w:val="clear"/>
-            <w:tcMar>
-              <w:top w:type="dxa" w:w="70"/>
-              <w:left w:type="dxa" w:w="110"/>
-              <w:bottom w:type="dxa" w:w="70"/>
-              <w:right w:type="dxa" w:w="110"/>
-            </w:tcMar>
-            <w:vAlign w:val="top"/>
-          </w:tcPr>
-          <w:p>
-            <w:pPr>
-              <w:spacing w:after="0" w:before="0"/>
-            </w:pPr>
-            <w:r>
-              <w:rPr>
-                <w:sz w:val="20"/>
-                <w:szCs w:val="20"/>
-              </w:rPr>
-              <w:t xml:space="preserve"/>
-            </w:r>
-          </w:p>
-        </w:tc>
-        <w:tc>
-          <w:tcPr>
-            <w:tcW w:type="dxa" w:w="2700"/>
+            <w:tcW w:type="dxa" w:w="9360"/>
+            <w:gridSpan w:val="3"/>
             <w:tcBorders>
               <w:top w:val="single" w:color="CFE3DF" w:sz="4"/>
               <w:left w:val="single" w:color="CFE3DF" w:sz="4"/>
@@ -22925,7 +21278,7 @@
         </w:rPr>
         <w:t xml:space="preserve"> exercise at: http://</w:t>
       </w:r>
-      <w:hyperlink w:history="1" r:id="rIdntrkbovg8agp6apfu4zve">
+      <w:hyperlink w:history="1" r:id="rIdp0xbqdfeiy5cf4etbloxw">
         <w:r>
           <w:rPr>
             <w:color w:val="1155CC"/>
@@ -23585,69 +21938,8 @@
         </w:trPr>
         <w:tc>
           <w:tcPr>
-            <w:tcW w:type="dxa" w:w="2000"/>
-            <w:tcBorders>
-              <w:top w:val="single" w:color="CFE3DF" w:sz="4"/>
-              <w:left w:val="single" w:color="CFE3DF" w:sz="4"/>
-              <w:bottom w:val="single" w:color="CFE3DF" w:sz="4"/>
-              <w:right w:val="single" w:color="CFE3DF" w:sz="4"/>
-            </w:tcBorders>
-            <w:shd w:fill="F2ECDC" w:val="clear"/>
-            <w:tcMar>
-              <w:top w:type="dxa" w:w="70"/>
-              <w:left w:type="dxa" w:w="110"/>
-              <w:bottom w:type="dxa" w:w="70"/>
-              <w:right w:type="dxa" w:w="110"/>
-            </w:tcMar>
-            <w:vAlign w:val="top"/>
-          </w:tcPr>
-          <w:p>
-            <w:pPr>
-              <w:spacing w:after="0" w:before="0"/>
-            </w:pPr>
-            <w:r>
-              <w:rPr>
-                <w:sz w:val="20"/>
-                <w:szCs w:val="20"/>
-              </w:rPr>
-              <w:t xml:space="preserve"/>
-            </w:r>
-          </w:p>
-        </w:tc>
-        <w:tc>
-          <w:tcPr>
-            <w:tcW w:type="dxa" w:w="4660"/>
-            <w:tcBorders>
-              <w:top w:val="single" w:color="CFE3DF" w:sz="4"/>
-              <w:left w:val="single" w:color="CFE3DF" w:sz="4"/>
-              <w:bottom w:val="single" w:color="CFE3DF" w:sz="4"/>
-              <w:right w:val="single" w:color="CFE3DF" w:sz="4"/>
-            </w:tcBorders>
-            <w:shd w:fill="F2ECDC" w:val="clear"/>
-            <w:tcMar>
-              <w:top w:type="dxa" w:w="70"/>
-              <w:left w:type="dxa" w:w="110"/>
-              <w:bottom w:type="dxa" w:w="70"/>
-              <w:right w:type="dxa" w:w="110"/>
-            </w:tcMar>
-            <w:vAlign w:val="top"/>
-          </w:tcPr>
-          <w:p>
-            <w:pPr>
-              <w:spacing w:after="0" w:before="0"/>
-            </w:pPr>
-            <w:r>
-              <w:rPr>
-                <w:sz w:val="20"/>
-                <w:szCs w:val="20"/>
-              </w:rPr>
-              <w:t xml:space="preserve"/>
-            </w:r>
-          </w:p>
-        </w:tc>
-        <w:tc>
-          <w:tcPr>
-            <w:tcW w:type="dxa" w:w="2700"/>
+            <w:tcW w:type="dxa" w:w="9360"/>
+            <w:gridSpan w:val="3"/>
             <w:tcBorders>
               <w:top w:val="single" w:color="CFE3DF" w:sz="4"/>
               <w:left w:val="single" w:color="CFE3DF" w:sz="4"/>
@@ -23786,7 +22078,7 @@
         </w:rPr>
         <w:t xml:space="preserve">Either at that time, or later on, write down a word (or words) from the </w:t>
       </w:r>
-      <w:hyperlink w:history="1" r:id="rIdtmhhajbrqxren9w5u1vze">
+      <w:hyperlink w:history="1" r:id="rIdwpnhvhrwcbgva58pferx2">
         <w:r>
           <w:rPr>
             <w:color w:val="1155CC"/>
@@ -23823,7 +22115,7 @@
         </w:rPr>
         <w:t xml:space="preserve">Then look at the </w:t>
       </w:r>
-      <w:hyperlink w:history="1" r:id="rIddk8y0pkwhmctjd3hk3o2c">
+      <w:hyperlink w:history="1" r:id="rIdsi8f5umac0vwrzwvc3l22">
         <w:r>
           <w:rPr>
             <w:color w:val="1155CC"/>
@@ -24584,69 +22876,8 @@
         </w:trPr>
         <w:tc>
           <w:tcPr>
-            <w:tcW w:type="dxa" w:w="2000"/>
-            <w:tcBorders>
-              <w:top w:val="single" w:color="CFE3DF" w:sz="4"/>
-              <w:left w:val="single" w:color="CFE3DF" w:sz="4"/>
-              <w:bottom w:val="single" w:color="CFE3DF" w:sz="4"/>
-              <w:right w:val="single" w:color="CFE3DF" w:sz="4"/>
-            </w:tcBorders>
-            <w:shd w:fill="F2ECDC" w:val="clear"/>
-            <w:tcMar>
-              <w:top w:type="dxa" w:w="70"/>
-              <w:left w:type="dxa" w:w="110"/>
-              <w:bottom w:type="dxa" w:w="70"/>
-              <w:right w:type="dxa" w:w="110"/>
-            </w:tcMar>
-            <w:vAlign w:val="top"/>
-          </w:tcPr>
-          <w:p>
-            <w:pPr>
-              <w:spacing w:after="0" w:before="0"/>
-            </w:pPr>
-            <w:r>
-              <w:rPr>
-                <w:sz w:val="20"/>
-                <w:szCs w:val="20"/>
-              </w:rPr>
-              <w:t xml:space="preserve"/>
-            </w:r>
-          </w:p>
-        </w:tc>
-        <w:tc>
-          <w:tcPr>
-            <w:tcW w:type="dxa" w:w="4660"/>
-            <w:tcBorders>
-              <w:top w:val="single" w:color="CFE3DF" w:sz="4"/>
-              <w:left w:val="single" w:color="CFE3DF" w:sz="4"/>
-              <w:bottom w:val="single" w:color="CFE3DF" w:sz="4"/>
-              <w:right w:val="single" w:color="CFE3DF" w:sz="4"/>
-            </w:tcBorders>
-            <w:shd w:fill="F2ECDC" w:val="clear"/>
-            <w:tcMar>
-              <w:top w:type="dxa" w:w="70"/>
-              <w:left w:type="dxa" w:w="110"/>
-              <w:bottom w:type="dxa" w:w="70"/>
-              <w:right w:type="dxa" w:w="110"/>
-            </w:tcMar>
-            <w:vAlign w:val="top"/>
-          </w:tcPr>
-          <w:p>
-            <w:pPr>
-              <w:spacing w:after="0" w:before="0"/>
-            </w:pPr>
-            <w:r>
-              <w:rPr>
-                <w:sz w:val="20"/>
-                <w:szCs w:val="20"/>
-              </w:rPr>
-              <w:t xml:space="preserve"/>
-            </w:r>
-          </w:p>
-        </w:tc>
-        <w:tc>
-          <w:tcPr>
-            <w:tcW w:type="dxa" w:w="2700"/>
+            <w:tcW w:type="dxa" w:w="9360"/>
+            <w:gridSpan w:val="3"/>
             <w:tcBorders>
               <w:top w:val="single" w:color="CFE3DF" w:sz="4"/>
               <w:left w:val="single" w:color="CFE3DF" w:sz="4"/>
@@ -25292,69 +23523,8 @@
         </w:trPr>
         <w:tc>
           <w:tcPr>
-            <w:tcW w:type="dxa" w:w="2000"/>
-            <w:tcBorders>
-              <w:top w:val="single" w:color="CFE3DF" w:sz="4"/>
-              <w:left w:val="single" w:color="CFE3DF" w:sz="4"/>
-              <w:bottom w:val="single" w:color="CFE3DF" w:sz="4"/>
-              <w:right w:val="single" w:color="CFE3DF" w:sz="4"/>
-            </w:tcBorders>
-            <w:shd w:fill="F2ECDC" w:val="clear"/>
-            <w:tcMar>
-              <w:top w:type="dxa" w:w="70"/>
-              <w:left w:type="dxa" w:w="110"/>
-              <w:bottom w:type="dxa" w:w="70"/>
-              <w:right w:type="dxa" w:w="110"/>
-            </w:tcMar>
-            <w:vAlign w:val="top"/>
-          </w:tcPr>
-          <w:p>
-            <w:pPr>
-              <w:spacing w:after="0" w:before="0"/>
-            </w:pPr>
-            <w:r>
-              <w:rPr>
-                <w:sz w:val="20"/>
-                <w:szCs w:val="20"/>
-              </w:rPr>
-              <w:t xml:space="preserve"/>
-            </w:r>
-          </w:p>
-        </w:tc>
-        <w:tc>
-          <w:tcPr>
-            <w:tcW w:type="dxa" w:w="4660"/>
-            <w:tcBorders>
-              <w:top w:val="single" w:color="CFE3DF" w:sz="4"/>
-              <w:left w:val="single" w:color="CFE3DF" w:sz="4"/>
-              <w:bottom w:val="single" w:color="CFE3DF" w:sz="4"/>
-              <w:right w:val="single" w:color="CFE3DF" w:sz="4"/>
-            </w:tcBorders>
-            <w:shd w:fill="F2ECDC" w:val="clear"/>
-            <w:tcMar>
-              <w:top w:type="dxa" w:w="70"/>
-              <w:left w:type="dxa" w:w="110"/>
-              <w:bottom w:type="dxa" w:w="70"/>
-              <w:right w:type="dxa" w:w="110"/>
-            </w:tcMar>
-            <w:vAlign w:val="top"/>
-          </w:tcPr>
-          <w:p>
-            <w:pPr>
-              <w:spacing w:after="0" w:before="0"/>
-            </w:pPr>
-            <w:r>
-              <w:rPr>
-                <w:sz w:val="20"/>
-                <w:szCs w:val="20"/>
-              </w:rPr>
-              <w:t xml:space="preserve"/>
-            </w:r>
-          </w:p>
-        </w:tc>
-        <w:tc>
-          <w:tcPr>
-            <w:tcW w:type="dxa" w:w="2700"/>
+            <w:tcW w:type="dxa" w:w="9360"/>
+            <w:gridSpan w:val="3"/>
             <w:tcBorders>
               <w:top w:val="single" w:color="CFE3DF" w:sz="4"/>
               <w:left w:val="single" w:color="CFE3DF" w:sz="4"/>
@@ -25477,7 +23647,7 @@
         </w:rPr>
         <w:t xml:space="preserve"> at http://</w:t>
       </w:r>
-      <w:hyperlink w:history="1" r:id="rIdamrk8bzfbanoou2gmo-az">
+      <w:hyperlink w:history="1" r:id="rIdgs9arycerh-dpuh_k4amg">
         <w:r>
           <w:rPr>
             <w:color w:val="1155CC"/>
@@ -26097,69 +24267,8 @@
         </w:trPr>
         <w:tc>
           <w:tcPr>
-            <w:tcW w:type="dxa" w:w="2000"/>
-            <w:tcBorders>
-              <w:top w:val="single" w:color="CFE3DF" w:sz="4"/>
-              <w:left w:val="single" w:color="CFE3DF" w:sz="4"/>
-              <w:bottom w:val="single" w:color="CFE3DF" w:sz="4"/>
-              <w:right w:val="single" w:color="CFE3DF" w:sz="4"/>
-            </w:tcBorders>
-            <w:shd w:fill="F2ECDC" w:val="clear"/>
-            <w:tcMar>
-              <w:top w:type="dxa" w:w="70"/>
-              <w:left w:type="dxa" w:w="110"/>
-              <w:bottom w:type="dxa" w:w="70"/>
-              <w:right w:type="dxa" w:w="110"/>
-            </w:tcMar>
-            <w:vAlign w:val="top"/>
-          </w:tcPr>
-          <w:p>
-            <w:pPr>
-              <w:spacing w:after="0" w:before="0"/>
-            </w:pPr>
-            <w:r>
-              <w:rPr>
-                <w:sz w:val="20"/>
-                <w:szCs w:val="20"/>
-              </w:rPr>
-              <w:t xml:space="preserve"/>
-            </w:r>
-          </w:p>
-        </w:tc>
-        <w:tc>
-          <w:tcPr>
-            <w:tcW w:type="dxa" w:w="4660"/>
-            <w:tcBorders>
-              <w:top w:val="single" w:color="CFE3DF" w:sz="4"/>
-              <w:left w:val="single" w:color="CFE3DF" w:sz="4"/>
-              <w:bottom w:val="single" w:color="CFE3DF" w:sz="4"/>
-              <w:right w:val="single" w:color="CFE3DF" w:sz="4"/>
-            </w:tcBorders>
-            <w:shd w:fill="F2ECDC" w:val="clear"/>
-            <w:tcMar>
-              <w:top w:type="dxa" w:w="70"/>
-              <w:left w:type="dxa" w:w="110"/>
-              <w:bottom w:type="dxa" w:w="70"/>
-              <w:right w:type="dxa" w:w="110"/>
-            </w:tcMar>
-            <w:vAlign w:val="top"/>
-          </w:tcPr>
-          <w:p>
-            <w:pPr>
-              <w:spacing w:after="0" w:before="0"/>
-            </w:pPr>
-            <w:r>
-              <w:rPr>
-                <w:sz w:val="20"/>
-                <w:szCs w:val="20"/>
-              </w:rPr>
-              <w:t xml:space="preserve"/>
-            </w:r>
-          </w:p>
-        </w:tc>
-        <w:tc>
-          <w:tcPr>
-            <w:tcW w:type="dxa" w:w="2700"/>
+            <w:tcW w:type="dxa" w:w="9360"/>
+            <w:gridSpan w:val="3"/>
             <w:tcBorders>
               <w:top w:val="single" w:color="CFE3DF" w:sz="4"/>
               <w:left w:val="single" w:color="CFE3DF" w:sz="4"/>
@@ -26793,69 +24902,8 @@
         </w:trPr>
         <w:tc>
           <w:tcPr>
-            <w:tcW w:type="dxa" w:w="2000"/>
-            <w:tcBorders>
-              <w:top w:val="single" w:color="CFE3DF" w:sz="4"/>
-              <w:left w:val="single" w:color="CFE3DF" w:sz="4"/>
-              <w:bottom w:val="single" w:color="CFE3DF" w:sz="4"/>
-              <w:right w:val="single" w:color="CFE3DF" w:sz="4"/>
-            </w:tcBorders>
-            <w:shd w:fill="F2ECDC" w:val="clear"/>
-            <w:tcMar>
-              <w:top w:type="dxa" w:w="70"/>
-              <w:left w:type="dxa" w:w="110"/>
-              <w:bottom w:type="dxa" w:w="70"/>
-              <w:right w:type="dxa" w:w="110"/>
-            </w:tcMar>
-            <w:vAlign w:val="top"/>
-          </w:tcPr>
-          <w:p>
-            <w:pPr>
-              <w:spacing w:after="0" w:before="0"/>
-            </w:pPr>
-            <w:r>
-              <w:rPr>
-                <w:sz w:val="20"/>
-                <w:szCs w:val="20"/>
-              </w:rPr>
-              <w:t xml:space="preserve"/>
-            </w:r>
-          </w:p>
-        </w:tc>
-        <w:tc>
-          <w:tcPr>
-            <w:tcW w:type="dxa" w:w="4660"/>
-            <w:tcBorders>
-              <w:top w:val="single" w:color="CFE3DF" w:sz="4"/>
-              <w:left w:val="single" w:color="CFE3DF" w:sz="4"/>
-              <w:bottom w:val="single" w:color="CFE3DF" w:sz="4"/>
-              <w:right w:val="single" w:color="CFE3DF" w:sz="4"/>
-            </w:tcBorders>
-            <w:shd w:fill="F2ECDC" w:val="clear"/>
-            <w:tcMar>
-              <w:top w:type="dxa" w:w="70"/>
-              <w:left w:type="dxa" w:w="110"/>
-              <w:bottom w:type="dxa" w:w="70"/>
-              <w:right w:type="dxa" w:w="110"/>
-            </w:tcMar>
-            <w:vAlign w:val="top"/>
-          </w:tcPr>
-          <w:p>
-            <w:pPr>
-              <w:spacing w:after="0" w:before="0"/>
-            </w:pPr>
-            <w:r>
-              <w:rPr>
-                <w:sz w:val="20"/>
-                <w:szCs w:val="20"/>
-              </w:rPr>
-              <w:t xml:space="preserve"/>
-            </w:r>
-          </w:p>
-        </w:tc>
-        <w:tc>
-          <w:tcPr>
-            <w:tcW w:type="dxa" w:w="2700"/>
+            <w:tcW w:type="dxa" w:w="9360"/>
+            <w:gridSpan w:val="3"/>
             <w:tcBorders>
               <w:top w:val="single" w:color="CFE3DF" w:sz="4"/>
               <w:left w:val="single" w:color="CFE3DF" w:sz="4"/>
@@ -27609,69 +25657,8 @@
         </w:trPr>
         <w:tc>
           <w:tcPr>
-            <w:tcW w:type="dxa" w:w="2000"/>
-            <w:tcBorders>
-              <w:top w:val="single" w:color="CFE3DF" w:sz="4"/>
-              <w:left w:val="single" w:color="CFE3DF" w:sz="4"/>
-              <w:bottom w:val="single" w:color="CFE3DF" w:sz="4"/>
-              <w:right w:val="single" w:color="CFE3DF" w:sz="4"/>
-            </w:tcBorders>
-            <w:shd w:fill="F2ECDC" w:val="clear"/>
-            <w:tcMar>
-              <w:top w:type="dxa" w:w="70"/>
-              <w:left w:type="dxa" w:w="110"/>
-              <w:bottom w:type="dxa" w:w="70"/>
-              <w:right w:type="dxa" w:w="110"/>
-            </w:tcMar>
-            <w:vAlign w:val="top"/>
-          </w:tcPr>
-          <w:p>
-            <w:pPr>
-              <w:spacing w:after="0" w:before="0"/>
-            </w:pPr>
-            <w:r>
-              <w:rPr>
-                <w:sz w:val="20"/>
-                <w:szCs w:val="20"/>
-              </w:rPr>
-              <w:t xml:space="preserve"/>
-            </w:r>
-          </w:p>
-        </w:tc>
-        <w:tc>
-          <w:tcPr>
-            <w:tcW w:type="dxa" w:w="4660"/>
-            <w:tcBorders>
-              <w:top w:val="single" w:color="CFE3DF" w:sz="4"/>
-              <w:left w:val="single" w:color="CFE3DF" w:sz="4"/>
-              <w:bottom w:val="single" w:color="CFE3DF" w:sz="4"/>
-              <w:right w:val="single" w:color="CFE3DF" w:sz="4"/>
-            </w:tcBorders>
-            <w:shd w:fill="F2ECDC" w:val="clear"/>
-            <w:tcMar>
-              <w:top w:type="dxa" w:w="70"/>
-              <w:left w:type="dxa" w:w="110"/>
-              <w:bottom w:type="dxa" w:w="70"/>
-              <w:right w:type="dxa" w:w="110"/>
-            </w:tcMar>
-            <w:vAlign w:val="top"/>
-          </w:tcPr>
-          <w:p>
-            <w:pPr>
-              <w:spacing w:after="0" w:before="0"/>
-            </w:pPr>
-            <w:r>
-              <w:rPr>
-                <w:sz w:val="20"/>
-                <w:szCs w:val="20"/>
-              </w:rPr>
-              <w:t xml:space="preserve"/>
-            </w:r>
-          </w:p>
-        </w:tc>
-        <w:tc>
-          <w:tcPr>
-            <w:tcW w:type="dxa" w:w="2700"/>
+            <w:tcW w:type="dxa" w:w="9360"/>
+            <w:gridSpan w:val="3"/>
             <w:tcBorders>
               <w:top w:val="single" w:color="CFE3DF" w:sz="4"/>
               <w:left w:val="single" w:color="CFE3DF" w:sz="4"/>
@@ -28232,69 +26219,8 @@
         </w:trPr>
         <w:tc>
           <w:tcPr>
-            <w:tcW w:type="dxa" w:w="2000"/>
-            <w:tcBorders>
-              <w:top w:val="single" w:color="CFE3DF" w:sz="4"/>
-              <w:left w:val="single" w:color="CFE3DF" w:sz="4"/>
-              <w:bottom w:val="single" w:color="CFE3DF" w:sz="4"/>
-              <w:right w:val="single" w:color="CFE3DF" w:sz="4"/>
-            </w:tcBorders>
-            <w:shd w:fill="F2ECDC" w:val="clear"/>
-            <w:tcMar>
-              <w:top w:type="dxa" w:w="70"/>
-              <w:left w:type="dxa" w:w="110"/>
-              <w:bottom w:type="dxa" w:w="70"/>
-              <w:right w:type="dxa" w:w="110"/>
-            </w:tcMar>
-            <w:vAlign w:val="top"/>
-          </w:tcPr>
-          <w:p>
-            <w:pPr>
-              <w:spacing w:after="0" w:before="0"/>
-            </w:pPr>
-            <w:r>
-              <w:rPr>
-                <w:sz w:val="20"/>
-                <w:szCs w:val="20"/>
-              </w:rPr>
-              <w:t xml:space="preserve"/>
-            </w:r>
-          </w:p>
-        </w:tc>
-        <w:tc>
-          <w:tcPr>
-            <w:tcW w:type="dxa" w:w="4660"/>
-            <w:tcBorders>
-              <w:top w:val="single" w:color="CFE3DF" w:sz="4"/>
-              <w:left w:val="single" w:color="CFE3DF" w:sz="4"/>
-              <w:bottom w:val="single" w:color="CFE3DF" w:sz="4"/>
-              <w:right w:val="single" w:color="CFE3DF" w:sz="4"/>
-            </w:tcBorders>
-            <w:shd w:fill="F2ECDC" w:val="clear"/>
-            <w:tcMar>
-              <w:top w:type="dxa" w:w="70"/>
-              <w:left w:type="dxa" w:w="110"/>
-              <w:bottom w:type="dxa" w:w="70"/>
-              <w:right w:type="dxa" w:w="110"/>
-            </w:tcMar>
-            <w:vAlign w:val="top"/>
-          </w:tcPr>
-          <w:p>
-            <w:pPr>
-              <w:spacing w:after="0" w:before="0"/>
-            </w:pPr>
-            <w:r>
-              <w:rPr>
-                <w:sz w:val="20"/>
-                <w:szCs w:val="20"/>
-              </w:rPr>
-              <w:t xml:space="preserve"/>
-            </w:r>
-          </w:p>
-        </w:tc>
-        <w:tc>
-          <w:tcPr>
-            <w:tcW w:type="dxa" w:w="2700"/>
+            <w:tcW w:type="dxa" w:w="9360"/>
+            <w:gridSpan w:val="3"/>
             <w:tcBorders>
               <w:top w:val="single" w:color="CFE3DF" w:sz="4"/>
               <w:left w:val="single" w:color="CFE3DF" w:sz="4"/>
@@ -28522,7 +26448,7 @@
         </w:rPr>
         <w:t xml:space="preserve">Later on, when you have time, sit down with the </w:t>
       </w:r>
-      <w:hyperlink w:history="1" r:id="rId4ht2jitc48x6suwylvpws">
+      <w:hyperlink w:history="1" r:id="rIdxa0zjaknayxha57xkamzp">
         <w:r>
           <w:rPr>
             <w:color w:val="1155CC"/>
@@ -28543,7 +26469,7 @@
         </w:rPr>
         <w:t xml:space="preserve"> and see if you can figure out what need(s) you were in pain about. Translate your judgment words into need words. As usual, I suggest that you limit the words you use to those on the </w:t>
       </w:r>
-      <w:hyperlink w:history="1" r:id="rIdv6lahd4t4roxr-vysxf1u">
+      <w:hyperlink w:history="1" r:id="rId25n7vwg_hacxzfclqfmyd">
         <w:r>
           <w:rPr>
             <w:color w:val="1155CC"/>
@@ -29087,69 +27013,8 @@
         </w:trPr>
         <w:tc>
           <w:tcPr>
-            <w:tcW w:type="dxa" w:w="2000"/>
-            <w:tcBorders>
-              <w:top w:val="single" w:color="CFE3DF" w:sz="4"/>
-              <w:left w:val="single" w:color="CFE3DF" w:sz="4"/>
-              <w:bottom w:val="single" w:color="CFE3DF" w:sz="4"/>
-              <w:right w:val="single" w:color="CFE3DF" w:sz="4"/>
-            </w:tcBorders>
-            <w:shd w:fill="F2ECDC" w:val="clear"/>
-            <w:tcMar>
-              <w:top w:type="dxa" w:w="70"/>
-              <w:left w:type="dxa" w:w="110"/>
-              <w:bottom w:type="dxa" w:w="70"/>
-              <w:right w:type="dxa" w:w="110"/>
-            </w:tcMar>
-            <w:vAlign w:val="top"/>
-          </w:tcPr>
-          <w:p>
-            <w:pPr>
-              <w:spacing w:after="0" w:before="0"/>
-            </w:pPr>
-            <w:r>
-              <w:rPr>
-                <w:sz w:val="20"/>
-                <w:szCs w:val="20"/>
-              </w:rPr>
-              <w:t xml:space="preserve"/>
-            </w:r>
-          </w:p>
-        </w:tc>
-        <w:tc>
-          <w:tcPr>
-            <w:tcW w:type="dxa" w:w="4660"/>
-            <w:tcBorders>
-              <w:top w:val="single" w:color="CFE3DF" w:sz="4"/>
-              <w:left w:val="single" w:color="CFE3DF" w:sz="4"/>
-              <w:bottom w:val="single" w:color="CFE3DF" w:sz="4"/>
-              <w:right w:val="single" w:color="CFE3DF" w:sz="4"/>
-            </w:tcBorders>
-            <w:shd w:fill="F2ECDC" w:val="clear"/>
-            <w:tcMar>
-              <w:top w:type="dxa" w:w="70"/>
-              <w:left w:type="dxa" w:w="110"/>
-              <w:bottom w:type="dxa" w:w="70"/>
-              <w:right w:type="dxa" w:w="110"/>
-            </w:tcMar>
-            <w:vAlign w:val="top"/>
-          </w:tcPr>
-          <w:p>
-            <w:pPr>
-              <w:spacing w:after="0" w:before="0"/>
-            </w:pPr>
-            <w:r>
-              <w:rPr>
-                <w:sz w:val="20"/>
-                <w:szCs w:val="20"/>
-              </w:rPr>
-              <w:t xml:space="preserve"/>
-            </w:r>
-          </w:p>
-        </w:tc>
-        <w:tc>
-          <w:tcPr>
-            <w:tcW w:type="dxa" w:w="2700"/>
+            <w:tcW w:type="dxa" w:w="9360"/>
+            <w:gridSpan w:val="3"/>
             <w:tcBorders>
               <w:top w:val="single" w:color="CFE3DF" w:sz="4"/>
               <w:left w:val="single" w:color="CFE3DF" w:sz="4"/>
@@ -29887,69 +27752,8 @@
         </w:trPr>
         <w:tc>
           <w:tcPr>
-            <w:tcW w:type="dxa" w:w="2000"/>
-            <w:tcBorders>
-              <w:top w:val="single" w:color="CFE3DF" w:sz="4"/>
-              <w:left w:val="single" w:color="CFE3DF" w:sz="4"/>
-              <w:bottom w:val="single" w:color="CFE3DF" w:sz="4"/>
-              <w:right w:val="single" w:color="CFE3DF" w:sz="4"/>
-            </w:tcBorders>
-            <w:shd w:fill="F2ECDC" w:val="clear"/>
-            <w:tcMar>
-              <w:top w:type="dxa" w:w="70"/>
-              <w:left w:type="dxa" w:w="110"/>
-              <w:bottom w:type="dxa" w:w="70"/>
-              <w:right w:type="dxa" w:w="110"/>
-            </w:tcMar>
-            <w:vAlign w:val="top"/>
-          </w:tcPr>
-          <w:p>
-            <w:pPr>
-              <w:spacing w:after="0" w:before="0"/>
-            </w:pPr>
-            <w:r>
-              <w:rPr>
-                <w:sz w:val="20"/>
-                <w:szCs w:val="20"/>
-              </w:rPr>
-              <w:t xml:space="preserve"/>
-            </w:r>
-          </w:p>
-        </w:tc>
-        <w:tc>
-          <w:tcPr>
-            <w:tcW w:type="dxa" w:w="4660"/>
-            <w:tcBorders>
-              <w:top w:val="single" w:color="CFE3DF" w:sz="4"/>
-              <w:left w:val="single" w:color="CFE3DF" w:sz="4"/>
-              <w:bottom w:val="single" w:color="CFE3DF" w:sz="4"/>
-              <w:right w:val="single" w:color="CFE3DF" w:sz="4"/>
-            </w:tcBorders>
-            <w:shd w:fill="F2ECDC" w:val="clear"/>
-            <w:tcMar>
-              <w:top w:type="dxa" w:w="70"/>
-              <w:left w:type="dxa" w:w="110"/>
-              <w:bottom w:type="dxa" w:w="70"/>
-              <w:right w:type="dxa" w:w="110"/>
-            </w:tcMar>
-            <w:vAlign w:val="top"/>
-          </w:tcPr>
-          <w:p>
-            <w:pPr>
-              <w:spacing w:after="0" w:before="0"/>
-            </w:pPr>
-            <w:r>
-              <w:rPr>
-                <w:sz w:val="20"/>
-                <w:szCs w:val="20"/>
-              </w:rPr>
-              <w:t xml:space="preserve"/>
-            </w:r>
-          </w:p>
-        </w:tc>
-        <w:tc>
-          <w:tcPr>
-            <w:tcW w:type="dxa" w:w="2700"/>
+            <w:tcW w:type="dxa" w:w="9360"/>
+            <w:gridSpan w:val="3"/>
             <w:tcBorders>
               <w:top w:val="single" w:color="CFE3DF" w:sz="4"/>
               <w:left w:val="single" w:color="CFE3DF" w:sz="4"/>
@@ -30679,69 +28483,8 @@
         </w:trPr>
         <w:tc>
           <w:tcPr>
-            <w:tcW w:type="dxa" w:w="2000"/>
-            <w:tcBorders>
-              <w:top w:val="single" w:color="CFE3DF" w:sz="4"/>
-              <w:left w:val="single" w:color="CFE3DF" w:sz="4"/>
-              <w:bottom w:val="single" w:color="CFE3DF" w:sz="4"/>
-              <w:right w:val="single" w:color="CFE3DF" w:sz="4"/>
-            </w:tcBorders>
-            <w:shd w:fill="F2ECDC" w:val="clear"/>
-            <w:tcMar>
-              <w:top w:type="dxa" w:w="70"/>
-              <w:left w:type="dxa" w:w="110"/>
-              <w:bottom w:type="dxa" w:w="70"/>
-              <w:right w:type="dxa" w:w="110"/>
-            </w:tcMar>
-            <w:vAlign w:val="top"/>
-          </w:tcPr>
-          <w:p>
-            <w:pPr>
-              <w:spacing w:after="0" w:before="0"/>
-            </w:pPr>
-            <w:r>
-              <w:rPr>
-                <w:sz w:val="20"/>
-                <w:szCs w:val="20"/>
-              </w:rPr>
-              <w:t xml:space="preserve"/>
-            </w:r>
-          </w:p>
-        </w:tc>
-        <w:tc>
-          <w:tcPr>
-            <w:tcW w:type="dxa" w:w="4660"/>
-            <w:tcBorders>
-              <w:top w:val="single" w:color="CFE3DF" w:sz="4"/>
-              <w:left w:val="single" w:color="CFE3DF" w:sz="4"/>
-              <w:bottom w:val="single" w:color="CFE3DF" w:sz="4"/>
-              <w:right w:val="single" w:color="CFE3DF" w:sz="4"/>
-            </w:tcBorders>
-            <w:shd w:fill="F2ECDC" w:val="clear"/>
-            <w:tcMar>
-              <w:top w:type="dxa" w:w="70"/>
-              <w:left w:type="dxa" w:w="110"/>
-              <w:bottom w:type="dxa" w:w="70"/>
-              <w:right w:type="dxa" w:w="110"/>
-            </w:tcMar>
-            <w:vAlign w:val="top"/>
-          </w:tcPr>
-          <w:p>
-            <w:pPr>
-              <w:spacing w:after="0" w:before="0"/>
-            </w:pPr>
-            <w:r>
-              <w:rPr>
-                <w:sz w:val="20"/>
-                <w:szCs w:val="20"/>
-              </w:rPr>
-              <w:t xml:space="preserve"/>
-            </w:r>
-          </w:p>
-        </w:tc>
-        <w:tc>
-          <w:tcPr>
-            <w:tcW w:type="dxa" w:w="2700"/>
+            <w:tcW w:type="dxa" w:w="9360"/>
+            <w:gridSpan w:val="3"/>
             <w:tcBorders>
               <w:top w:val="single" w:color="CFE3DF" w:sz="4"/>
               <w:left w:val="single" w:color="CFE3DF" w:sz="4"/>
@@ -31306,69 +29049,8 @@
         </w:trPr>
         <w:tc>
           <w:tcPr>
-            <w:tcW w:type="dxa" w:w="2000"/>
-            <w:tcBorders>
-              <w:top w:val="single" w:color="CFE3DF" w:sz="4"/>
-              <w:left w:val="single" w:color="CFE3DF" w:sz="4"/>
-              <w:bottom w:val="single" w:color="CFE3DF" w:sz="4"/>
-              <w:right w:val="single" w:color="CFE3DF" w:sz="4"/>
-            </w:tcBorders>
-            <w:shd w:fill="F2ECDC" w:val="clear"/>
-            <w:tcMar>
-              <w:top w:type="dxa" w:w="70"/>
-              <w:left w:type="dxa" w:w="110"/>
-              <w:bottom w:type="dxa" w:w="70"/>
-              <w:right w:type="dxa" w:w="110"/>
-            </w:tcMar>
-            <w:vAlign w:val="top"/>
-          </w:tcPr>
-          <w:p>
-            <w:pPr>
-              <w:spacing w:after="0" w:before="0"/>
-            </w:pPr>
-            <w:r>
-              <w:rPr>
-                <w:sz w:val="20"/>
-                <w:szCs w:val="20"/>
-              </w:rPr>
-              <w:t xml:space="preserve"/>
-            </w:r>
-          </w:p>
-        </w:tc>
-        <w:tc>
-          <w:tcPr>
-            <w:tcW w:type="dxa" w:w="4660"/>
-            <w:tcBorders>
-              <w:top w:val="single" w:color="CFE3DF" w:sz="4"/>
-              <w:left w:val="single" w:color="CFE3DF" w:sz="4"/>
-              <w:bottom w:val="single" w:color="CFE3DF" w:sz="4"/>
-              <w:right w:val="single" w:color="CFE3DF" w:sz="4"/>
-            </w:tcBorders>
-            <w:shd w:fill="F2ECDC" w:val="clear"/>
-            <w:tcMar>
-              <w:top w:type="dxa" w:w="70"/>
-              <w:left w:type="dxa" w:w="110"/>
-              <w:bottom w:type="dxa" w:w="70"/>
-              <w:right w:type="dxa" w:w="110"/>
-            </w:tcMar>
-            <w:vAlign w:val="top"/>
-          </w:tcPr>
-          <w:p>
-            <w:pPr>
-              <w:spacing w:after="0" w:before="0"/>
-            </w:pPr>
-            <w:r>
-              <w:rPr>
-                <w:sz w:val="20"/>
-                <w:szCs w:val="20"/>
-              </w:rPr>
-              <w:t xml:space="preserve"/>
-            </w:r>
-          </w:p>
-        </w:tc>
-        <w:tc>
-          <w:tcPr>
-            <w:tcW w:type="dxa" w:w="2700"/>
+            <w:tcW w:type="dxa" w:w="9360"/>
+            <w:gridSpan w:val="3"/>
             <w:tcBorders>
               <w:top w:val="single" w:color="CFE3DF" w:sz="4"/>
               <w:left w:val="single" w:color="CFE3DF" w:sz="4"/>
@@ -32058,69 +29740,8 @@
         </w:trPr>
         <w:tc>
           <w:tcPr>
-            <w:tcW w:type="dxa" w:w="2000"/>
-            <w:tcBorders>
-              <w:top w:val="single" w:color="CFE3DF" w:sz="4"/>
-              <w:left w:val="single" w:color="CFE3DF" w:sz="4"/>
-              <w:bottom w:val="single" w:color="CFE3DF" w:sz="4"/>
-              <w:right w:val="single" w:color="CFE3DF" w:sz="4"/>
-            </w:tcBorders>
-            <w:shd w:fill="F2ECDC" w:val="clear"/>
-            <w:tcMar>
-              <w:top w:type="dxa" w:w="70"/>
-              <w:left w:type="dxa" w:w="110"/>
-              <w:bottom w:type="dxa" w:w="70"/>
-              <w:right w:type="dxa" w:w="110"/>
-            </w:tcMar>
-            <w:vAlign w:val="top"/>
-          </w:tcPr>
-          <w:p>
-            <w:pPr>
-              <w:spacing w:after="0" w:before="0"/>
-            </w:pPr>
-            <w:r>
-              <w:rPr>
-                <w:sz w:val="20"/>
-                <w:szCs w:val="20"/>
-              </w:rPr>
-              <w:t xml:space="preserve"/>
-            </w:r>
-          </w:p>
-        </w:tc>
-        <w:tc>
-          <w:tcPr>
-            <w:tcW w:type="dxa" w:w="4660"/>
-            <w:tcBorders>
-              <w:top w:val="single" w:color="CFE3DF" w:sz="4"/>
-              <w:left w:val="single" w:color="CFE3DF" w:sz="4"/>
-              <w:bottom w:val="single" w:color="CFE3DF" w:sz="4"/>
-              <w:right w:val="single" w:color="CFE3DF" w:sz="4"/>
-            </w:tcBorders>
-            <w:shd w:fill="F2ECDC" w:val="clear"/>
-            <w:tcMar>
-              <w:top w:type="dxa" w:w="70"/>
-              <w:left w:type="dxa" w:w="110"/>
-              <w:bottom w:type="dxa" w:w="70"/>
-              <w:right w:type="dxa" w:w="110"/>
-            </w:tcMar>
-            <w:vAlign w:val="top"/>
-          </w:tcPr>
-          <w:p>
-            <w:pPr>
-              <w:spacing w:after="0" w:before="0"/>
-            </w:pPr>
-            <w:r>
-              <w:rPr>
-                <w:sz w:val="20"/>
-                <w:szCs w:val="20"/>
-              </w:rPr>
-              <w:t xml:space="preserve"/>
-            </w:r>
-          </w:p>
-        </w:tc>
-        <w:tc>
-          <w:tcPr>
-            <w:tcW w:type="dxa" w:w="2700"/>
+            <w:tcW w:type="dxa" w:w="9360"/>
+            <w:gridSpan w:val="3"/>
             <w:tcBorders>
               <w:top w:val="single" w:color="CFE3DF" w:sz="4"/>
               <w:left w:val="single" w:color="CFE3DF" w:sz="4"/>
@@ -32934,69 +30555,8 @@
         </w:trPr>
         <w:tc>
           <w:tcPr>
-            <w:tcW w:type="dxa" w:w="2000"/>
-            <w:tcBorders>
-              <w:top w:val="single" w:color="CFE3DF" w:sz="4"/>
-              <w:left w:val="single" w:color="CFE3DF" w:sz="4"/>
-              <w:bottom w:val="single" w:color="CFE3DF" w:sz="4"/>
-              <w:right w:val="single" w:color="CFE3DF" w:sz="4"/>
-            </w:tcBorders>
-            <w:shd w:fill="F2ECDC" w:val="clear"/>
-            <w:tcMar>
-              <w:top w:type="dxa" w:w="70"/>
-              <w:left w:type="dxa" w:w="110"/>
-              <w:bottom w:type="dxa" w:w="70"/>
-              <w:right w:type="dxa" w:w="110"/>
-            </w:tcMar>
-            <w:vAlign w:val="top"/>
-          </w:tcPr>
-          <w:p>
-            <w:pPr>
-              <w:spacing w:after="0" w:before="0"/>
-            </w:pPr>
-            <w:r>
-              <w:rPr>
-                <w:sz w:val="20"/>
-                <w:szCs w:val="20"/>
-              </w:rPr>
-              <w:t xml:space="preserve"/>
-            </w:r>
-          </w:p>
-        </w:tc>
-        <w:tc>
-          <w:tcPr>
-            <w:tcW w:type="dxa" w:w="4660"/>
-            <w:tcBorders>
-              <w:top w:val="single" w:color="CFE3DF" w:sz="4"/>
-              <w:left w:val="single" w:color="CFE3DF" w:sz="4"/>
-              <w:bottom w:val="single" w:color="CFE3DF" w:sz="4"/>
-              <w:right w:val="single" w:color="CFE3DF" w:sz="4"/>
-            </w:tcBorders>
-            <w:shd w:fill="F2ECDC" w:val="clear"/>
-            <w:tcMar>
-              <w:top w:type="dxa" w:w="70"/>
-              <w:left w:type="dxa" w:w="110"/>
-              <w:bottom w:type="dxa" w:w="70"/>
-              <w:right w:type="dxa" w:w="110"/>
-            </w:tcMar>
-            <w:vAlign w:val="top"/>
-          </w:tcPr>
-          <w:p>
-            <w:pPr>
-              <w:spacing w:after="0" w:before="0"/>
-            </w:pPr>
-            <w:r>
-              <w:rPr>
-                <w:sz w:val="20"/>
-                <w:szCs w:val="20"/>
-              </w:rPr>
-              <w:t xml:space="preserve"/>
-            </w:r>
-          </w:p>
-        </w:tc>
-        <w:tc>
-          <w:tcPr>
-            <w:tcW w:type="dxa" w:w="2700"/>
+            <w:tcW w:type="dxa" w:w="9360"/>
+            <w:gridSpan w:val="3"/>
             <w:tcBorders>
               <w:top w:val="single" w:color="CFE3DF" w:sz="4"/>
               <w:left w:val="single" w:color="CFE3DF" w:sz="4"/>
@@ -33851,69 +31411,8 @@
         </w:trPr>
         <w:tc>
           <w:tcPr>
-            <w:tcW w:type="dxa" w:w="2000"/>
-            <w:tcBorders>
-              <w:top w:val="single" w:color="CFE3DF" w:sz="4"/>
-              <w:left w:val="single" w:color="CFE3DF" w:sz="4"/>
-              <w:bottom w:val="single" w:color="CFE3DF" w:sz="4"/>
-              <w:right w:val="single" w:color="CFE3DF" w:sz="4"/>
-            </w:tcBorders>
-            <w:shd w:fill="F2ECDC" w:val="clear"/>
-            <w:tcMar>
-              <w:top w:type="dxa" w:w="70"/>
-              <w:left w:type="dxa" w:w="110"/>
-              <w:bottom w:type="dxa" w:w="70"/>
-              <w:right w:type="dxa" w:w="110"/>
-            </w:tcMar>
-            <w:vAlign w:val="top"/>
-          </w:tcPr>
-          <w:p>
-            <w:pPr>
-              <w:spacing w:after="0" w:before="0"/>
-            </w:pPr>
-            <w:r>
-              <w:rPr>
-                <w:sz w:val="20"/>
-                <w:szCs w:val="20"/>
-              </w:rPr>
-              <w:t xml:space="preserve"/>
-            </w:r>
-          </w:p>
-        </w:tc>
-        <w:tc>
-          <w:tcPr>
-            <w:tcW w:type="dxa" w:w="4660"/>
-            <w:tcBorders>
-              <w:top w:val="single" w:color="CFE3DF" w:sz="4"/>
-              <w:left w:val="single" w:color="CFE3DF" w:sz="4"/>
-              <w:bottom w:val="single" w:color="CFE3DF" w:sz="4"/>
-              <w:right w:val="single" w:color="CFE3DF" w:sz="4"/>
-            </w:tcBorders>
-            <w:shd w:fill="F2ECDC" w:val="clear"/>
-            <w:tcMar>
-              <w:top w:type="dxa" w:w="70"/>
-              <w:left w:type="dxa" w:w="110"/>
-              <w:bottom w:type="dxa" w:w="70"/>
-              <w:right w:type="dxa" w:w="110"/>
-            </w:tcMar>
-            <w:vAlign w:val="top"/>
-          </w:tcPr>
-          <w:p>
-            <w:pPr>
-              <w:spacing w:after="0" w:before="0"/>
-            </w:pPr>
-            <w:r>
-              <w:rPr>
-                <w:sz w:val="20"/>
-                <w:szCs w:val="20"/>
-              </w:rPr>
-              <w:t xml:space="preserve"/>
-            </w:r>
-          </w:p>
-        </w:tc>
-        <w:tc>
-          <w:tcPr>
-            <w:tcW w:type="dxa" w:w="2700"/>
+            <w:tcW w:type="dxa" w:w="9360"/>
+            <w:gridSpan w:val="3"/>
             <w:tcBorders>
               <w:top w:val="single" w:color="CFE3DF" w:sz="4"/>
               <w:left w:val="single" w:color="CFE3DF" w:sz="4"/>
@@ -34571,69 +32070,8 @@
         </w:trPr>
         <w:tc>
           <w:tcPr>
-            <w:tcW w:type="dxa" w:w="2000"/>
-            <w:tcBorders>
-              <w:top w:val="single" w:color="CFE3DF" w:sz="4"/>
-              <w:left w:val="single" w:color="CFE3DF" w:sz="4"/>
-              <w:bottom w:val="single" w:color="CFE3DF" w:sz="4"/>
-              <w:right w:val="single" w:color="CFE3DF" w:sz="4"/>
-            </w:tcBorders>
-            <w:shd w:fill="F2ECDC" w:val="clear"/>
-            <w:tcMar>
-              <w:top w:type="dxa" w:w="70"/>
-              <w:left w:type="dxa" w:w="110"/>
-              <w:bottom w:type="dxa" w:w="70"/>
-              <w:right w:type="dxa" w:w="110"/>
-            </w:tcMar>
-            <w:vAlign w:val="top"/>
-          </w:tcPr>
-          <w:p>
-            <w:pPr>
-              <w:spacing w:after="0" w:before="0"/>
-            </w:pPr>
-            <w:r>
-              <w:rPr>
-                <w:sz w:val="20"/>
-                <w:szCs w:val="20"/>
-              </w:rPr>
-              <w:t xml:space="preserve"/>
-            </w:r>
-          </w:p>
-        </w:tc>
-        <w:tc>
-          <w:tcPr>
-            <w:tcW w:type="dxa" w:w="4660"/>
-            <w:tcBorders>
-              <w:top w:val="single" w:color="CFE3DF" w:sz="4"/>
-              <w:left w:val="single" w:color="CFE3DF" w:sz="4"/>
-              <w:bottom w:val="single" w:color="CFE3DF" w:sz="4"/>
-              <w:right w:val="single" w:color="CFE3DF" w:sz="4"/>
-            </w:tcBorders>
-            <w:shd w:fill="F2ECDC" w:val="clear"/>
-            <w:tcMar>
-              <w:top w:type="dxa" w:w="70"/>
-              <w:left w:type="dxa" w:w="110"/>
-              <w:bottom w:type="dxa" w:w="70"/>
-              <w:right w:type="dxa" w:w="110"/>
-            </w:tcMar>
-            <w:vAlign w:val="top"/>
-          </w:tcPr>
-          <w:p>
-            <w:pPr>
-              <w:spacing w:after="0" w:before="0"/>
-            </w:pPr>
-            <w:r>
-              <w:rPr>
-                <w:sz w:val="20"/>
-                <w:szCs w:val="20"/>
-              </w:rPr>
-              <w:t xml:space="preserve"/>
-            </w:r>
-          </w:p>
-        </w:tc>
-        <w:tc>
-          <w:tcPr>
-            <w:tcW w:type="dxa" w:w="2700"/>
+            <w:tcW w:type="dxa" w:w="9360"/>
+            <w:gridSpan w:val="3"/>
             <w:tcBorders>
               <w:top w:val="single" w:color="CFE3DF" w:sz="4"/>
               <w:left w:val="single" w:color="CFE3DF" w:sz="4"/>
@@ -35246,69 +32684,8 @@
         </w:trPr>
         <w:tc>
           <w:tcPr>
-            <w:tcW w:type="dxa" w:w="2000"/>
-            <w:tcBorders>
-              <w:top w:val="single" w:color="CFE3DF" w:sz="4"/>
-              <w:left w:val="single" w:color="CFE3DF" w:sz="4"/>
-              <w:bottom w:val="single" w:color="CFE3DF" w:sz="4"/>
-              <w:right w:val="single" w:color="CFE3DF" w:sz="4"/>
-            </w:tcBorders>
-            <w:shd w:fill="F2ECDC" w:val="clear"/>
-            <w:tcMar>
-              <w:top w:type="dxa" w:w="70"/>
-              <w:left w:type="dxa" w:w="110"/>
-              <w:bottom w:type="dxa" w:w="70"/>
-              <w:right w:type="dxa" w:w="110"/>
-            </w:tcMar>
-            <w:vAlign w:val="top"/>
-          </w:tcPr>
-          <w:p>
-            <w:pPr>
-              <w:spacing w:after="0" w:before="0"/>
-            </w:pPr>
-            <w:r>
-              <w:rPr>
-                <w:sz w:val="20"/>
-                <w:szCs w:val="20"/>
-              </w:rPr>
-              <w:t xml:space="preserve"/>
-            </w:r>
-          </w:p>
-        </w:tc>
-        <w:tc>
-          <w:tcPr>
-            <w:tcW w:type="dxa" w:w="4660"/>
-            <w:tcBorders>
-              <w:top w:val="single" w:color="CFE3DF" w:sz="4"/>
-              <w:left w:val="single" w:color="CFE3DF" w:sz="4"/>
-              <w:bottom w:val="single" w:color="CFE3DF" w:sz="4"/>
-              <w:right w:val="single" w:color="CFE3DF" w:sz="4"/>
-            </w:tcBorders>
-            <w:shd w:fill="F2ECDC" w:val="clear"/>
-            <w:tcMar>
-              <w:top w:type="dxa" w:w="70"/>
-              <w:left w:type="dxa" w:w="110"/>
-              <w:bottom w:type="dxa" w:w="70"/>
-              <w:right w:type="dxa" w:w="110"/>
-            </w:tcMar>
-            <w:vAlign w:val="top"/>
-          </w:tcPr>
-          <w:p>
-            <w:pPr>
-              <w:spacing w:after="0" w:before="0"/>
-            </w:pPr>
-            <w:r>
-              <w:rPr>
-                <w:sz w:val="20"/>
-                <w:szCs w:val="20"/>
-              </w:rPr>
-              <w:t xml:space="preserve"/>
-            </w:r>
-          </w:p>
-        </w:tc>
-        <w:tc>
-          <w:tcPr>
-            <w:tcW w:type="dxa" w:w="2700"/>
+            <w:tcW w:type="dxa" w:w="9360"/>
+            <w:gridSpan w:val="3"/>
             <w:tcBorders>
               <w:top w:val="single" w:color="CFE3DF" w:sz="4"/>
               <w:left w:val="single" w:color="CFE3DF" w:sz="4"/>
@@ -35989,69 +33366,8 @@
         </w:trPr>
         <w:tc>
           <w:tcPr>
-            <w:tcW w:type="dxa" w:w="2000"/>
-            <w:tcBorders>
-              <w:top w:val="single" w:color="CFE3DF" w:sz="4"/>
-              <w:left w:val="single" w:color="CFE3DF" w:sz="4"/>
-              <w:bottom w:val="single" w:color="CFE3DF" w:sz="4"/>
-              <w:right w:val="single" w:color="CFE3DF" w:sz="4"/>
-            </w:tcBorders>
-            <w:shd w:fill="F2ECDC" w:val="clear"/>
-            <w:tcMar>
-              <w:top w:type="dxa" w:w="70"/>
-              <w:left w:type="dxa" w:w="110"/>
-              <w:bottom w:type="dxa" w:w="70"/>
-              <w:right w:type="dxa" w:w="110"/>
-            </w:tcMar>
-            <w:vAlign w:val="top"/>
-          </w:tcPr>
-          <w:p>
-            <w:pPr>
-              <w:spacing w:after="0" w:before="0"/>
-            </w:pPr>
-            <w:r>
-              <w:rPr>
-                <w:sz w:val="20"/>
-                <w:szCs w:val="20"/>
-              </w:rPr>
-              <w:t xml:space="preserve"/>
-            </w:r>
-          </w:p>
-        </w:tc>
-        <w:tc>
-          <w:tcPr>
-            <w:tcW w:type="dxa" w:w="4660"/>
-            <w:tcBorders>
-              <w:top w:val="single" w:color="CFE3DF" w:sz="4"/>
-              <w:left w:val="single" w:color="CFE3DF" w:sz="4"/>
-              <w:bottom w:val="single" w:color="CFE3DF" w:sz="4"/>
-              <w:right w:val="single" w:color="CFE3DF" w:sz="4"/>
-            </w:tcBorders>
-            <w:shd w:fill="F2ECDC" w:val="clear"/>
-            <w:tcMar>
-              <w:top w:type="dxa" w:w="70"/>
-              <w:left w:type="dxa" w:w="110"/>
-              <w:bottom w:type="dxa" w:w="70"/>
-              <w:right w:type="dxa" w:w="110"/>
-            </w:tcMar>
-            <w:vAlign w:val="top"/>
-          </w:tcPr>
-          <w:p>
-            <w:pPr>
-              <w:spacing w:after="0" w:before="0"/>
-            </w:pPr>
-            <w:r>
-              <w:rPr>
-                <w:sz w:val="20"/>
-                <w:szCs w:val="20"/>
-              </w:rPr>
-              <w:t xml:space="preserve"/>
-            </w:r>
-          </w:p>
-        </w:tc>
-        <w:tc>
-          <w:tcPr>
-            <w:tcW w:type="dxa" w:w="2700"/>
+            <w:tcW w:type="dxa" w:w="9360"/>
+            <w:gridSpan w:val="3"/>
             <w:tcBorders>
               <w:top w:val="single" w:color="CFE3DF" w:sz="4"/>
               <w:left w:val="single" w:color="CFE3DF" w:sz="4"/>
@@ -37214,69 +34530,8 @@
         </w:trPr>
         <w:tc>
           <w:tcPr>
-            <w:tcW w:type="dxa" w:w="2000"/>
-            <w:tcBorders>
-              <w:top w:val="single" w:color="CFE3DF" w:sz="4"/>
-              <w:left w:val="single" w:color="CFE3DF" w:sz="4"/>
-              <w:bottom w:val="single" w:color="CFE3DF" w:sz="4"/>
-              <w:right w:val="single" w:color="CFE3DF" w:sz="4"/>
-            </w:tcBorders>
-            <w:shd w:fill="F2ECDC" w:val="clear"/>
-            <w:tcMar>
-              <w:top w:type="dxa" w:w="70"/>
-              <w:left w:type="dxa" w:w="110"/>
-              <w:bottom w:type="dxa" w:w="70"/>
-              <w:right w:type="dxa" w:w="110"/>
-            </w:tcMar>
-            <w:vAlign w:val="top"/>
-          </w:tcPr>
-          <w:p>
-            <w:pPr>
-              <w:spacing w:after="0" w:before="0"/>
-            </w:pPr>
-            <w:r>
-              <w:rPr>
-                <w:sz w:val="20"/>
-                <w:szCs w:val="20"/>
-              </w:rPr>
-              <w:t xml:space="preserve"/>
-            </w:r>
-          </w:p>
-        </w:tc>
-        <w:tc>
-          <w:tcPr>
-            <w:tcW w:type="dxa" w:w="4660"/>
-            <w:tcBorders>
-              <w:top w:val="single" w:color="CFE3DF" w:sz="4"/>
-              <w:left w:val="single" w:color="CFE3DF" w:sz="4"/>
-              <w:bottom w:val="single" w:color="CFE3DF" w:sz="4"/>
-              <w:right w:val="single" w:color="CFE3DF" w:sz="4"/>
-            </w:tcBorders>
-            <w:shd w:fill="F2ECDC" w:val="clear"/>
-            <w:tcMar>
-              <w:top w:type="dxa" w:w="70"/>
-              <w:left w:type="dxa" w:w="110"/>
-              <w:bottom w:type="dxa" w:w="70"/>
-              <w:right w:type="dxa" w:w="110"/>
-            </w:tcMar>
-            <w:vAlign w:val="top"/>
-          </w:tcPr>
-          <w:p>
-            <w:pPr>
-              <w:spacing w:after="0" w:before="0"/>
-            </w:pPr>
-            <w:r>
-              <w:rPr>
-                <w:sz w:val="20"/>
-                <w:szCs w:val="20"/>
-              </w:rPr>
-              <w:t xml:space="preserve"/>
-            </w:r>
-          </w:p>
-        </w:tc>
-        <w:tc>
-          <w:tcPr>
-            <w:tcW w:type="dxa" w:w="2700"/>
+            <w:tcW w:type="dxa" w:w="9360"/>
+            <w:gridSpan w:val="3"/>
             <w:tcBorders>
               <w:top w:val="single" w:color="CFE3DF" w:sz="4"/>
               <w:left w:val="single" w:color="CFE3DF" w:sz="4"/>
@@ -38002,69 +35257,8 @@
         </w:trPr>
         <w:tc>
           <w:tcPr>
-            <w:tcW w:type="dxa" w:w="2000"/>
-            <w:tcBorders>
-              <w:top w:val="single" w:color="CFE3DF" w:sz="4"/>
-              <w:left w:val="single" w:color="CFE3DF" w:sz="4"/>
-              <w:bottom w:val="single" w:color="CFE3DF" w:sz="4"/>
-              <w:right w:val="single" w:color="CFE3DF" w:sz="4"/>
-            </w:tcBorders>
-            <w:shd w:fill="F2ECDC" w:val="clear"/>
-            <w:tcMar>
-              <w:top w:type="dxa" w:w="70"/>
-              <w:left w:type="dxa" w:w="110"/>
-              <w:bottom w:type="dxa" w:w="70"/>
-              <w:right w:type="dxa" w:w="110"/>
-            </w:tcMar>
-            <w:vAlign w:val="top"/>
-          </w:tcPr>
-          <w:p>
-            <w:pPr>
-              <w:spacing w:after="0" w:before="0"/>
-            </w:pPr>
-            <w:r>
-              <w:rPr>
-                <w:sz w:val="20"/>
-                <w:szCs w:val="20"/>
-              </w:rPr>
-              <w:t xml:space="preserve"/>
-            </w:r>
-          </w:p>
-        </w:tc>
-        <w:tc>
-          <w:tcPr>
-            <w:tcW w:type="dxa" w:w="4660"/>
-            <w:tcBorders>
-              <w:top w:val="single" w:color="CFE3DF" w:sz="4"/>
-              <w:left w:val="single" w:color="CFE3DF" w:sz="4"/>
-              <w:bottom w:val="single" w:color="CFE3DF" w:sz="4"/>
-              <w:right w:val="single" w:color="CFE3DF" w:sz="4"/>
-            </w:tcBorders>
-            <w:shd w:fill="F2ECDC" w:val="clear"/>
-            <w:tcMar>
-              <w:top w:type="dxa" w:w="70"/>
-              <w:left w:type="dxa" w:w="110"/>
-              <w:bottom w:type="dxa" w:w="70"/>
-              <w:right w:type="dxa" w:w="110"/>
-            </w:tcMar>
-            <w:vAlign w:val="top"/>
-          </w:tcPr>
-          <w:p>
-            <w:pPr>
-              <w:spacing w:after="0" w:before="0"/>
-            </w:pPr>
-            <w:r>
-              <w:rPr>
-                <w:sz w:val="20"/>
-                <w:szCs w:val="20"/>
-              </w:rPr>
-              <w:t xml:space="preserve"/>
-            </w:r>
-          </w:p>
-        </w:tc>
-        <w:tc>
-          <w:tcPr>
-            <w:tcW w:type="dxa" w:w="2700"/>
+            <w:tcW w:type="dxa" w:w="9360"/>
+            <w:gridSpan w:val="3"/>
             <w:tcBorders>
               <w:top w:val="single" w:color="CFE3DF" w:sz="4"/>
               <w:left w:val="single" w:color="CFE3DF" w:sz="4"/>
@@ -38870,69 +36064,8 @@
         </w:trPr>
         <w:tc>
           <w:tcPr>
-            <w:tcW w:type="dxa" w:w="2000"/>
-            <w:tcBorders>
-              <w:top w:val="single" w:color="CFE3DF" w:sz="4"/>
-              <w:left w:val="single" w:color="CFE3DF" w:sz="4"/>
-              <w:bottom w:val="single" w:color="CFE3DF" w:sz="4"/>
-              <w:right w:val="single" w:color="CFE3DF" w:sz="4"/>
-            </w:tcBorders>
-            <w:shd w:fill="F2ECDC" w:val="clear"/>
-            <w:tcMar>
-              <w:top w:type="dxa" w:w="70"/>
-              <w:left w:type="dxa" w:w="110"/>
-              <w:bottom w:type="dxa" w:w="70"/>
-              <w:right w:type="dxa" w:w="110"/>
-            </w:tcMar>
-            <w:vAlign w:val="top"/>
-          </w:tcPr>
-          <w:p>
-            <w:pPr>
-              <w:spacing w:after="0" w:before="0"/>
-            </w:pPr>
-            <w:r>
-              <w:rPr>
-                <w:sz w:val="20"/>
-                <w:szCs w:val="20"/>
-              </w:rPr>
-              <w:t xml:space="preserve"/>
-            </w:r>
-          </w:p>
-        </w:tc>
-        <w:tc>
-          <w:tcPr>
-            <w:tcW w:type="dxa" w:w="4660"/>
-            <w:tcBorders>
-              <w:top w:val="single" w:color="CFE3DF" w:sz="4"/>
-              <w:left w:val="single" w:color="CFE3DF" w:sz="4"/>
-              <w:bottom w:val="single" w:color="CFE3DF" w:sz="4"/>
-              <w:right w:val="single" w:color="CFE3DF" w:sz="4"/>
-            </w:tcBorders>
-            <w:shd w:fill="F2ECDC" w:val="clear"/>
-            <w:tcMar>
-              <w:top w:type="dxa" w:w="70"/>
-              <w:left w:type="dxa" w:w="110"/>
-              <w:bottom w:type="dxa" w:w="70"/>
-              <w:right w:type="dxa" w:w="110"/>
-            </w:tcMar>
-            <w:vAlign w:val="top"/>
-          </w:tcPr>
-          <w:p>
-            <w:pPr>
-              <w:spacing w:after="0" w:before="0"/>
-            </w:pPr>
-            <w:r>
-              <w:rPr>
-                <w:sz w:val="20"/>
-                <w:szCs w:val="20"/>
-              </w:rPr>
-              <w:t xml:space="preserve"/>
-            </w:r>
-          </w:p>
-        </w:tc>
-        <w:tc>
-          <w:tcPr>
-            <w:tcW w:type="dxa" w:w="2700"/>
+            <w:tcW w:type="dxa" w:w="9360"/>
+            <w:gridSpan w:val="3"/>
             <w:tcBorders>
               <w:top w:val="single" w:color="CFE3DF" w:sz="4"/>
               <w:left w:val="single" w:color="CFE3DF" w:sz="4"/>
@@ -39642,69 +36775,8 @@
         </w:trPr>
         <w:tc>
           <w:tcPr>
-            <w:tcW w:type="dxa" w:w="2000"/>
-            <w:tcBorders>
-              <w:top w:val="single" w:color="CFE3DF" w:sz="4"/>
-              <w:left w:val="single" w:color="CFE3DF" w:sz="4"/>
-              <w:bottom w:val="single" w:color="CFE3DF" w:sz="4"/>
-              <w:right w:val="single" w:color="CFE3DF" w:sz="4"/>
-            </w:tcBorders>
-            <w:shd w:fill="F2ECDC" w:val="clear"/>
-            <w:tcMar>
-              <w:top w:type="dxa" w:w="70"/>
-              <w:left w:type="dxa" w:w="110"/>
-              <w:bottom w:type="dxa" w:w="70"/>
-              <w:right w:type="dxa" w:w="110"/>
-            </w:tcMar>
-            <w:vAlign w:val="top"/>
-          </w:tcPr>
-          <w:p>
-            <w:pPr>
-              <w:spacing w:after="0" w:before="0"/>
-            </w:pPr>
-            <w:r>
-              <w:rPr>
-                <w:sz w:val="20"/>
-                <w:szCs w:val="20"/>
-              </w:rPr>
-              <w:t xml:space="preserve"/>
-            </w:r>
-          </w:p>
-        </w:tc>
-        <w:tc>
-          <w:tcPr>
-            <w:tcW w:type="dxa" w:w="4660"/>
-            <w:tcBorders>
-              <w:top w:val="single" w:color="CFE3DF" w:sz="4"/>
-              <w:left w:val="single" w:color="CFE3DF" w:sz="4"/>
-              <w:bottom w:val="single" w:color="CFE3DF" w:sz="4"/>
-              <w:right w:val="single" w:color="CFE3DF" w:sz="4"/>
-            </w:tcBorders>
-            <w:shd w:fill="F2ECDC" w:val="clear"/>
-            <w:tcMar>
-              <w:top w:type="dxa" w:w="70"/>
-              <w:left w:type="dxa" w:w="110"/>
-              <w:bottom w:type="dxa" w:w="70"/>
-              <w:right w:type="dxa" w:w="110"/>
-            </w:tcMar>
-            <w:vAlign w:val="top"/>
-          </w:tcPr>
-          <w:p>
-            <w:pPr>
-              <w:spacing w:after="0" w:before="0"/>
-            </w:pPr>
-            <w:r>
-              <w:rPr>
-                <w:sz w:val="20"/>
-                <w:szCs w:val="20"/>
-              </w:rPr>
-              <w:t xml:space="preserve"/>
-            </w:r>
-          </w:p>
-        </w:tc>
-        <w:tc>
-          <w:tcPr>
-            <w:tcW w:type="dxa" w:w="2700"/>
+            <w:tcW w:type="dxa" w:w="9360"/>
+            <w:gridSpan w:val="3"/>
             <w:tcBorders>
               <w:top w:val="single" w:color="CFE3DF" w:sz="4"/>
               <w:left w:val="single" w:color="CFE3DF" w:sz="4"/>
@@ -40374,69 +37446,8 @@
         </w:trPr>
         <w:tc>
           <w:tcPr>
-            <w:tcW w:type="dxa" w:w="2000"/>
-            <w:tcBorders>
-              <w:top w:val="single" w:color="CFE3DF" w:sz="4"/>
-              <w:left w:val="single" w:color="CFE3DF" w:sz="4"/>
-              <w:bottom w:val="single" w:color="CFE3DF" w:sz="4"/>
-              <w:right w:val="single" w:color="CFE3DF" w:sz="4"/>
-            </w:tcBorders>
-            <w:shd w:fill="F2ECDC" w:val="clear"/>
-            <w:tcMar>
-              <w:top w:type="dxa" w:w="70"/>
-              <w:left w:type="dxa" w:w="110"/>
-              <w:bottom w:type="dxa" w:w="70"/>
-              <w:right w:type="dxa" w:w="110"/>
-            </w:tcMar>
-            <w:vAlign w:val="top"/>
-          </w:tcPr>
-          <w:p>
-            <w:pPr>
-              <w:spacing w:after="0" w:before="0"/>
-            </w:pPr>
-            <w:r>
-              <w:rPr>
-                <w:sz w:val="20"/>
-                <w:szCs w:val="20"/>
-              </w:rPr>
-              <w:t xml:space="preserve"/>
-            </w:r>
-          </w:p>
-        </w:tc>
-        <w:tc>
-          <w:tcPr>
-            <w:tcW w:type="dxa" w:w="4660"/>
-            <w:tcBorders>
-              <w:top w:val="single" w:color="CFE3DF" w:sz="4"/>
-              <w:left w:val="single" w:color="CFE3DF" w:sz="4"/>
-              <w:bottom w:val="single" w:color="CFE3DF" w:sz="4"/>
-              <w:right w:val="single" w:color="CFE3DF" w:sz="4"/>
-            </w:tcBorders>
-            <w:shd w:fill="F2ECDC" w:val="clear"/>
-            <w:tcMar>
-              <w:top w:type="dxa" w:w="70"/>
-              <w:left w:type="dxa" w:w="110"/>
-              <w:bottom w:type="dxa" w:w="70"/>
-              <w:right w:type="dxa" w:w="110"/>
-            </w:tcMar>
-            <w:vAlign w:val="top"/>
-          </w:tcPr>
-          <w:p>
-            <w:pPr>
-              <w:spacing w:after="0" w:before="0"/>
-            </w:pPr>
-            <w:r>
-              <w:rPr>
-                <w:sz w:val="20"/>
-                <w:szCs w:val="20"/>
-              </w:rPr>
-              <w:t xml:space="preserve"/>
-            </w:r>
-          </w:p>
-        </w:tc>
-        <w:tc>
-          <w:tcPr>
-            <w:tcW w:type="dxa" w:w="2700"/>
+            <w:tcW w:type="dxa" w:w="9360"/>
+            <w:gridSpan w:val="3"/>
             <w:tcBorders>
               <w:top w:val="single" w:color="CFE3DF" w:sz="4"/>
               <w:left w:val="single" w:color="CFE3DF" w:sz="4"/>
@@ -41383,69 +38394,8 @@
         </w:trPr>
         <w:tc>
           <w:tcPr>
-            <w:tcW w:type="dxa" w:w="2000"/>
-            <w:tcBorders>
-              <w:top w:val="single" w:color="CFE3DF" w:sz="4"/>
-              <w:left w:val="single" w:color="CFE3DF" w:sz="4"/>
-              <w:bottom w:val="single" w:color="CFE3DF" w:sz="4"/>
-              <w:right w:val="single" w:color="CFE3DF" w:sz="4"/>
-            </w:tcBorders>
-            <w:shd w:fill="F2ECDC" w:val="clear"/>
-            <w:tcMar>
-              <w:top w:type="dxa" w:w="70"/>
-              <w:left w:type="dxa" w:w="110"/>
-              <w:bottom w:type="dxa" w:w="70"/>
-              <w:right w:type="dxa" w:w="110"/>
-            </w:tcMar>
-            <w:vAlign w:val="top"/>
-          </w:tcPr>
-          <w:p>
-            <w:pPr>
-              <w:spacing w:after="0" w:before="0"/>
-            </w:pPr>
-            <w:r>
-              <w:rPr>
-                <w:sz w:val="20"/>
-                <w:szCs w:val="20"/>
-              </w:rPr>
-              <w:t xml:space="preserve"/>
-            </w:r>
-          </w:p>
-        </w:tc>
-        <w:tc>
-          <w:tcPr>
-            <w:tcW w:type="dxa" w:w="4660"/>
-            <w:tcBorders>
-              <w:top w:val="single" w:color="CFE3DF" w:sz="4"/>
-              <w:left w:val="single" w:color="CFE3DF" w:sz="4"/>
-              <w:bottom w:val="single" w:color="CFE3DF" w:sz="4"/>
-              <w:right w:val="single" w:color="CFE3DF" w:sz="4"/>
-            </w:tcBorders>
-            <w:shd w:fill="F2ECDC" w:val="clear"/>
-            <w:tcMar>
-              <w:top w:type="dxa" w:w="70"/>
-              <w:left w:type="dxa" w:w="110"/>
-              <w:bottom w:type="dxa" w:w="70"/>
-              <w:right w:type="dxa" w:w="110"/>
-            </w:tcMar>
-            <w:vAlign w:val="top"/>
-          </w:tcPr>
-          <w:p>
-            <w:pPr>
-              <w:spacing w:after="0" w:before="0"/>
-            </w:pPr>
-            <w:r>
-              <w:rPr>
-                <w:sz w:val="20"/>
-                <w:szCs w:val="20"/>
-              </w:rPr>
-              <w:t xml:space="preserve"/>
-            </w:r>
-          </w:p>
-        </w:tc>
-        <w:tc>
-          <w:tcPr>
-            <w:tcW w:type="dxa" w:w="2700"/>
+            <w:tcW w:type="dxa" w:w="9360"/>
+            <w:gridSpan w:val="3"/>
             <w:tcBorders>
               <w:top w:val="single" w:color="CFE3DF" w:sz="4"/>
               <w:left w:val="single" w:color="CFE3DF" w:sz="4"/>
@@ -42127,69 +39077,8 @@
         </w:trPr>
         <w:tc>
           <w:tcPr>
-            <w:tcW w:type="dxa" w:w="2000"/>
-            <w:tcBorders>
-              <w:top w:val="single" w:color="CFE3DF" w:sz="4"/>
-              <w:left w:val="single" w:color="CFE3DF" w:sz="4"/>
-              <w:bottom w:val="single" w:color="CFE3DF" w:sz="4"/>
-              <w:right w:val="single" w:color="CFE3DF" w:sz="4"/>
-            </w:tcBorders>
-            <w:shd w:fill="F2ECDC" w:val="clear"/>
-            <w:tcMar>
-              <w:top w:type="dxa" w:w="70"/>
-              <w:left w:type="dxa" w:w="110"/>
-              <w:bottom w:type="dxa" w:w="70"/>
-              <w:right w:type="dxa" w:w="110"/>
-            </w:tcMar>
-            <w:vAlign w:val="top"/>
-          </w:tcPr>
-          <w:p>
-            <w:pPr>
-              <w:spacing w:after="0" w:before="0"/>
-            </w:pPr>
-            <w:r>
-              <w:rPr>
-                <w:sz w:val="20"/>
-                <w:szCs w:val="20"/>
-              </w:rPr>
-              <w:t xml:space="preserve"/>
-            </w:r>
-          </w:p>
-        </w:tc>
-        <w:tc>
-          <w:tcPr>
-            <w:tcW w:type="dxa" w:w="4660"/>
-            <w:tcBorders>
-              <w:top w:val="single" w:color="CFE3DF" w:sz="4"/>
-              <w:left w:val="single" w:color="CFE3DF" w:sz="4"/>
-              <w:bottom w:val="single" w:color="CFE3DF" w:sz="4"/>
-              <w:right w:val="single" w:color="CFE3DF" w:sz="4"/>
-            </w:tcBorders>
-            <w:shd w:fill="F2ECDC" w:val="clear"/>
-            <w:tcMar>
-              <w:top w:type="dxa" w:w="70"/>
-              <w:left w:type="dxa" w:w="110"/>
-              <w:bottom w:type="dxa" w:w="70"/>
-              <w:right w:type="dxa" w:w="110"/>
-            </w:tcMar>
-            <w:vAlign w:val="top"/>
-          </w:tcPr>
-          <w:p>
-            <w:pPr>
-              <w:spacing w:after="0" w:before="0"/>
-            </w:pPr>
-            <w:r>
-              <w:rPr>
-                <w:sz w:val="20"/>
-                <w:szCs w:val="20"/>
-              </w:rPr>
-              <w:t xml:space="preserve"/>
-            </w:r>
-          </w:p>
-        </w:tc>
-        <w:tc>
-          <w:tcPr>
-            <w:tcW w:type="dxa" w:w="2700"/>
+            <w:tcW w:type="dxa" w:w="9360"/>
+            <w:gridSpan w:val="3"/>
             <w:tcBorders>
               <w:top w:val="single" w:color="CFE3DF" w:sz="4"/>
               <w:left w:val="single" w:color="CFE3DF" w:sz="4"/>
@@ -42856,69 +39745,8 @@
         </w:trPr>
         <w:tc>
           <w:tcPr>
-            <w:tcW w:type="dxa" w:w="2000"/>
-            <w:tcBorders>
-              <w:top w:val="single" w:color="CFE3DF" w:sz="4"/>
-              <w:left w:val="single" w:color="CFE3DF" w:sz="4"/>
-              <w:bottom w:val="single" w:color="CFE3DF" w:sz="4"/>
-              <w:right w:val="single" w:color="CFE3DF" w:sz="4"/>
-            </w:tcBorders>
-            <w:shd w:fill="F2ECDC" w:val="clear"/>
-            <w:tcMar>
-              <w:top w:type="dxa" w:w="70"/>
-              <w:left w:type="dxa" w:w="110"/>
-              <w:bottom w:type="dxa" w:w="70"/>
-              <w:right w:type="dxa" w:w="110"/>
-            </w:tcMar>
-            <w:vAlign w:val="top"/>
-          </w:tcPr>
-          <w:p>
-            <w:pPr>
-              <w:spacing w:after="0" w:before="0"/>
-            </w:pPr>
-            <w:r>
-              <w:rPr>
-                <w:sz w:val="20"/>
-                <w:szCs w:val="20"/>
-              </w:rPr>
-              <w:t xml:space="preserve"/>
-            </w:r>
-          </w:p>
-        </w:tc>
-        <w:tc>
-          <w:tcPr>
-            <w:tcW w:type="dxa" w:w="4660"/>
-            <w:tcBorders>
-              <w:top w:val="single" w:color="CFE3DF" w:sz="4"/>
-              <w:left w:val="single" w:color="CFE3DF" w:sz="4"/>
-              <w:bottom w:val="single" w:color="CFE3DF" w:sz="4"/>
-              <w:right w:val="single" w:color="CFE3DF" w:sz="4"/>
-            </w:tcBorders>
-            <w:shd w:fill="F2ECDC" w:val="clear"/>
-            <w:tcMar>
-              <w:top w:type="dxa" w:w="70"/>
-              <w:left w:type="dxa" w:w="110"/>
-              <w:bottom w:type="dxa" w:w="70"/>
-              <w:right w:type="dxa" w:w="110"/>
-            </w:tcMar>
-            <w:vAlign w:val="top"/>
-          </w:tcPr>
-          <w:p>
-            <w:pPr>
-              <w:spacing w:after="0" w:before="0"/>
-            </w:pPr>
-            <w:r>
-              <w:rPr>
-                <w:sz w:val="20"/>
-                <w:szCs w:val="20"/>
-              </w:rPr>
-              <w:t xml:space="preserve"/>
-            </w:r>
-          </w:p>
-        </w:tc>
-        <w:tc>
-          <w:tcPr>
-            <w:tcW w:type="dxa" w:w="2700"/>
+            <w:tcW w:type="dxa" w:w="9360"/>
+            <w:gridSpan w:val="3"/>
             <w:tcBorders>
               <w:top w:val="single" w:color="CFE3DF" w:sz="4"/>
               <w:left w:val="single" w:color="CFE3DF" w:sz="4"/>
@@ -43025,7 +39853,7 @@
         <w:sz w:val="16"/>
         <w:szCs w:val="16"/>
       </w:rPr>
-      <w:t xml:space="preserve">	</w:t>
+      <w:t xml:space="preserve">      	</w:t>
     </w:r>
     <w:r>
       <w:rPr>

</xml_diff>

<commit_message>
Workbook footer: attach the Workbook/Page gap to the Page run
The gap was a standalone whitespace-only run (nbsp + tab), which Google Docs
trims on import — so 'Workbook' and 'Page N' ended up touching after conversion.
Move the non-breaking spaces into the text-bearing 'Page' run so they survive.

Co-Authored-By: Claude Opus 4.8 (1M context) <noreply@anthropic.com>
</commit_message>
<xml_diff>
--- a/.local-workbook/The Compassion Course 2026-2027 Workbook.docx
+++ b/.local-workbook/The Compassion Course 2026-2027 Workbook.docx
@@ -595,7 +595,7 @@
         </w:rPr>
         <w:t xml:space="preserve">Keep a small journal with you throughout the day. Make 1 to 5 entries per day that include the description of an act or words spoken by someone and what need you imagine they were trying to meet. It is SUPER important to limit the words you use to those on the </w:t>
       </w:r>
-      <w:hyperlink w:history="1" r:id="rIdpixswuje4zetx_u3-bkdu">
+      <w:hyperlink w:history="1" r:id="rId8hqwl7zixetl4kvvkjxzy">
         <w:r>
           <w:rPr>
             <w:color w:val="1155CC"/>
@@ -737,7 +737,7 @@
         </w:rPr>
         <w:t xml:space="preserve">Think of someone who is close to you who is doing or saying something you don't like. See if you can figure out what need they are attempting to fulfill. Again, it is really important to limit the words you use to those on the </w:t>
       </w:r>
-      <w:hyperlink w:history="1" r:id="rIdnthcz0l42lvykrrjo-qqm">
+      <w:hyperlink w:history="1" r:id="rIdapymxwn_pjdgxwk1btssz">
         <w:r>
           <w:rPr>
             <w:color w:val="1155CC"/>
@@ -1032,7 +1032,7 @@
         </w:rPr>
         <w:t xml:space="preserve">Extended registration lasts for one week. To let someone know about the course you can use the following link: </w:t>
       </w:r>
-      <w:hyperlink w:history="1" r:id="rIdpkakou3g8wirflpfpbsga">
+      <w:hyperlink w:history="1" r:id="rIdt4s_e6xpzultjhkvuci9i">
         <w:r>
           <w:rPr>
             <w:color w:val="1155CC"/>
@@ -1373,7 +1373,7 @@
         </w:rPr>
         <w:t xml:space="preserve">Keep a small journal with you throughout the day. Make 1 to 5 entries per day that include judgment words you said or were thinking of saying. Later on, when you have time, sit down with the </w:t>
       </w:r>
-      <w:hyperlink w:history="1" r:id="rIdkg4is0hpmnc_1rwoykrat">
+      <w:hyperlink w:history="1" r:id="rId93hx0qy5xfvq6o6cuphjl">
         <w:r>
           <w:rPr>
             <w:color w:val="1155CC"/>
@@ -1394,7 +1394,7 @@
         </w:rPr>
         <w:t xml:space="preserve"> and see if you can figure out what need of yours the judgment was (or is) related to. Remember, to successfully complete this exercise, limit the words you use to those on the </w:t>
       </w:r>
-      <w:hyperlink w:history="1" r:id="rId9bjjgvjevz7incscfpjml">
+      <w:hyperlink w:history="1" r:id="rIdb7gdbmo1ozgevmjgv9-y2">
         <w:r>
           <w:rPr>
             <w:color w:val="1155CC"/>
@@ -1536,7 +1536,7 @@
         </w:rPr>
         <w:t xml:space="preserve">Keep a small journal with you throughout the day. It could be a little book, a folded piece of paper or a napkin -anything you can write on. Make 1 to 5 entries per day that include judgment words spoken by someone. Later on, when you have time, sit down with the </w:t>
       </w:r>
-      <w:hyperlink w:history="1" r:id="rIdpnowlni6s0j8oyd5i3nx7">
+      <w:hyperlink w:history="1" r:id="rIdcoqxshwnywzy2eax5xw1a">
         <w:r>
           <w:rPr>
             <w:color w:val="1155CC"/>
@@ -1557,7 +1557,7 @@
         </w:rPr>
         <w:t xml:space="preserve"> and see if you can figure out what need was unmet for them. Remember to limit the words you use to those on the </w:t>
       </w:r>
-      <w:hyperlink w:history="1" r:id="rIdrarjswbadnssahyiwewia">
+      <w:hyperlink w:history="1" r:id="rIdwuyddco8qjbn3utulvqz5">
         <w:r>
           <w:rPr>
             <w:color w:val="1155CC"/>
@@ -2035,7 +2035,7 @@
         </w:rPr>
         <w:t xml:space="preserve">Later on, when you have time, sit down with the </w:t>
       </w:r>
-      <w:hyperlink w:history="1" r:id="rIdn8y_ismgsoz1wd9llkyv9">
+      <w:hyperlink w:history="1" r:id="rIddckq-8gzrkcmasppfibn1">
         <w:r>
           <w:rPr>
             <w:color w:val="1155CC"/>
@@ -2092,7 +2092,7 @@
         </w:rPr>
         <w:t xml:space="preserve"> at the top of the </w:t>
       </w:r>
-      <w:hyperlink w:history="1" r:id="rIdc0c4uonlns3roo3a4l9zt">
+      <w:hyperlink w:history="1" r:id="rIdzhtbsx0w2vfyzp8ogzkcm">
         <w:r>
           <w:rPr>
             <w:color w:val="1155CC"/>
@@ -2129,7 +2129,7 @@
         </w:rPr>
         <w:t xml:space="preserve">Then look at the </w:t>
       </w:r>
-      <w:hyperlink w:history="1" r:id="rIdc1tgeyunrklkihvqpu6ij">
+      <w:hyperlink w:history="1" r:id="rIdtu27svzb9p9vy4szd3ucf">
         <w:r>
           <w:rPr>
             <w:color w:val="1155CC"/>
@@ -2150,7 +2150,7 @@
         </w:rPr>
         <w:t xml:space="preserve"> and see if you can figure out what need your feeling was about. Remember, it's VERY helpful to limit the words you use to those on the </w:t>
       </w:r>
-      <w:hyperlink w:history="1" r:id="rIdixjvyqxi4r9d0mxxzkphj">
+      <w:hyperlink w:history="1" r:id="rIdtiicirg_q3jc6cuzzs6sx">
         <w:r>
           <w:rPr>
             <w:color w:val="1155CC"/>
@@ -2292,7 +2292,7 @@
         </w:rPr>
         <w:t xml:space="preserve">Keep a small journal with you throughout the day. Make 2 to 4 entries per day that include something you did, said or were thinking of saying and the feeling (or feelings) you experienced at that moment. Again, later on, when you have time, sit down with the </w:t>
       </w:r>
-      <w:hyperlink w:history="1" r:id="rIdowcwwusnjbxghkartezzr">
+      <w:hyperlink w:history="1" r:id="rIdtb3jyut9b7tdmlsvihksq">
         <w:r>
           <w:rPr>
             <w:color w:val="1155CC"/>
@@ -2349,7 +2349,7 @@
         </w:rPr>
         <w:t xml:space="preserve"> at the top of the </w:t>
       </w:r>
-      <w:hyperlink w:history="1" r:id="rId63lnsmxqx_k6fbisz-lea">
+      <w:hyperlink w:history="1" r:id="rIdh0mgind-yn0exckmkn5kr">
         <w:r>
           <w:rPr>
             <w:color w:val="1155CC"/>
@@ -2386,7 +2386,7 @@
         </w:rPr>
         <w:t xml:space="preserve">Then look at the </w:t>
       </w:r>
-      <w:hyperlink w:history="1" r:id="rId2i6bku1kp4kuqy70fbxpb">
+      <w:hyperlink w:history="1" r:id="rIdj7ciq8cbeyienyd510l4h">
         <w:r>
           <w:rPr>
             <w:color w:val="1155CC"/>
@@ -2407,7 +2407,7 @@
         </w:rPr>
         <w:t xml:space="preserve"> and see if you can figure out what need your feeling was about. Remember, here too, it's VERY important to limit the words you use to those on the </w:t>
       </w:r>
-      <w:hyperlink w:history="1" r:id="rIdd-vxma36ppbwlzjmug0zu">
+      <w:hyperlink w:history="1" r:id="rIdhywaf1_k7fn22lfgdqc6h">
         <w:r>
           <w:rPr>
             <w:color w:val="1155CC"/>
@@ -2732,7 +2732,7 @@
       <w:r>
         <w:t xml:space="preserve">Read the </w:t>
       </w:r>
-      <w:hyperlink w:history="1" r:id="rIdppwtcgt9padqakskci30w">
+      <w:hyperlink w:history="1" r:id="rIdpisvs2zinm7-wa0-sv51x">
         <w:r>
           <w:rPr>
             <w:color w:val="1155CC"/>
@@ -2865,7 +2865,7 @@
       <w:r>
         <w:t xml:space="preserve">Print a copy of the </w:t>
       </w:r>
-      <w:hyperlink w:history="1" r:id="rIdziiazlmlptdr6kj5tam41">
+      <w:hyperlink w:history="1" r:id="rIdw2eudhwa-cojzrtmyzohp">
         <w:r>
           <w:rPr>
             <w:color w:val="1155CC"/>
@@ -3030,7 +3030,7 @@
         </w:rPr>
         <w:t xml:space="preserve">Keep a small journal with you throughout the day. Make 1 to 5 entries per day that include an act or words spoken by someone and what need(s) you imagine they were trying to meet. Remember, it's VERY helpful to limit the words you use to those on the </w:t>
       </w:r>
-      <w:hyperlink w:history="1" r:id="rIdn1kaxkpnw_khac650oxwd">
+      <w:hyperlink w:history="1" r:id="rIdsl4igmgltp8r6kbxmyfyt">
         <w:r>
           <w:rPr>
             <w:color w:val="1155CC"/>
@@ -3172,7 +3172,7 @@
         </w:rPr>
         <w:t xml:space="preserve">Think of someone that you think is preventing you from getting a need(s) met. Write down the need(s) from the </w:t>
       </w:r>
-      <w:hyperlink w:history="1" r:id="rIdw8zbhhyjsw-o-4sit3xlb">
+      <w:hyperlink w:history="1" r:id="rIdtxbpm9d9mcdly0_mw1dej">
         <w:r>
           <w:rPr>
             <w:color w:val="1155CC"/>
@@ -3513,7 +3513,7 @@
         </w:rPr>
         <w:t xml:space="preserve">Visit: http://</w:t>
       </w:r>
-      <w:hyperlink w:history="1" r:id="rIdbsfqe26pdsv5uathg8bzi">
+      <w:hyperlink w:history="1" r:id="rIduwd10c_fukep--3qsaj5r">
         <w:r>
           <w:rPr>
             <w:color w:val="1155CC"/>
@@ -3789,7 +3789,7 @@
         <w:keepLines/>
         <w:spacing w:after="60" w:before="0" w:line="276" w:lineRule="auto"/>
       </w:pPr>
-      <w:hyperlink w:history="1" r:id="rIdmi_jzlro5tvvgypab5wji">
+      <w:hyperlink w:history="1" r:id="rIdwugkl4zswtldbtu-9t1j5">
         <w:r>
           <w:rPr>
             <w:color w:val="1155CC"/>
@@ -4120,7 +4120,7 @@
         </w:rPr>
         <w:t xml:space="preserve">Continue working with this exercise (</w:t>
       </w:r>
-      <w:hyperlink w:history="1" r:id="rIdtefn0mnohwe4l_jwcy7um">
+      <w:hyperlink w:history="1" r:id="rIddp8l_kymngqdi0ubwklpx">
         <w:r>
           <w:rPr>
             <w:color w:val="1155CC"/>
@@ -4431,7 +4431,7 @@
         </w:rPr>
         <w:t xml:space="preserve"> - take your time). Next, view or print a copy of the </w:t>
       </w:r>
-      <w:hyperlink w:history="1" r:id="rIdf03sucpmayotyor6_gwez">
+      <w:hyperlink w:history="1" r:id="rIdmzdcl8wt6mdunqnsrkjvq">
         <w:r>
           <w:rPr>
             <w:color w:val="1155CC"/>
@@ -4964,7 +4964,7 @@
         <w:keepLines/>
         <w:spacing w:after="60" w:before="0" w:line="276" w:lineRule="auto"/>
       </w:pPr>
-      <w:hyperlink w:history="1" r:id="rId1xqaeplu5ldjsgaxxklmn">
+      <w:hyperlink w:history="1" r:id="rIdxudvsgpstw4xhfi_lpjy3">
         <w:r>
           <w:rPr>
             <w:color w:val="1155CC"/>
@@ -5968,7 +5968,7 @@
         </w:rPr>
         <w:t xml:space="preserve">Then look at the </w:t>
       </w:r>
-      <w:hyperlink w:history="1" r:id="rId3p68zn2jsfdv4r7stdzug">
+      <w:hyperlink w:history="1" r:id="rIdz3v25ptiwipdpihamjdec">
         <w:r>
           <w:rPr>
             <w:color w:val="1155CC"/>
@@ -6622,7 +6622,7 @@
         </w:rPr>
         <w:t xml:space="preserve">Later on, when you have time, read over your journal for the day. Next, check in with yourself about how you feel as you think about those thoughts. Then look at the </w:t>
       </w:r>
-      <w:hyperlink w:history="1" r:id="rIdi48faobthq9urg1965qk_">
+      <w:hyperlink w:history="1" r:id="rIdfhumn-fwh7nm3tenjxjux">
         <w:r>
           <w:rPr>
             <w:color w:val="1155CC"/>
@@ -7019,7 +7019,7 @@
         </w:rPr>
         <w:t xml:space="preserve"> response would be. What was that person feeling? What was that person needing, wanting to have more of, or yearning to experience? Check the </w:t>
       </w:r>
-      <w:hyperlink w:history="1" r:id="rId4pf5psyqpyxudohpf4lzr">
+      <w:hyperlink w:history="1" r:id="rIdb6kkecql5s8r2z34ncwoz">
         <w:r>
           <w:rPr>
             <w:color w:val="1155CC"/>
@@ -7040,7 +7040,7 @@
         </w:rPr>
         <w:t xml:space="preserve"> and the </w:t>
       </w:r>
-      <w:hyperlink w:history="1" r:id="rId8p6ncznnckj-mrgvjp7zr">
+      <w:hyperlink w:history="1" r:id="rIdukub6d1ueuweufc0h5ewi">
         <w:r>
           <w:rPr>
             <w:color w:val="1155CC"/>
@@ -7492,7 +7492,7 @@
               </w:rPr>
               <w:t xml:space="preserve"> (feeling from the </w:t>
             </w:r>
-            <w:hyperlink w:history="1" r:id="rIdlbsqga6mz85z0yd8unqt0">
+            <w:hyperlink w:history="1" r:id="rIdlf8uhtcwevwbaenxs5uej">
               <w:r>
                 <w:rPr>
                   <w:color w:val="1155CC"/>
@@ -7533,7 +7533,7 @@
               </w:rPr>
               <w:t xml:space="preserve"> (need from the </w:t>
             </w:r>
-            <w:hyperlink w:history="1" r:id="rIdu-iedd1gbv6co2eytqq93">
+            <w:hyperlink w:history="1" r:id="rIdd_gf3_dxxqq5rqptkjdjl">
               <w:r>
                 <w:rPr>
                   <w:color w:val="1155CC"/>
@@ -20655,7 +20655,7 @@
         </w:rPr>
         <w:t xml:space="preserve">You may want to find some quiet space and time for this exercise. Start by going to the </w:t>
       </w:r>
-      <w:hyperlink w:history="1" r:id="rIdpg_pqt4yn_tiaukc0nq7o">
+      <w:hyperlink w:history="1" r:id="rIddu-wubbmokk7e0midq3_0">
         <w:r>
           <w:rPr>
             <w:color w:val="1155CC"/>
@@ -21278,7 +21278,7 @@
         </w:rPr>
         <w:t xml:space="preserve"> exercise at: http://</w:t>
       </w:r>
-      <w:hyperlink w:history="1" r:id="rIdp0xbqdfeiy5cf4etbloxw">
+      <w:hyperlink w:history="1" r:id="rIdg_telxjiy7mp7ko9_ya-n">
         <w:r>
           <w:rPr>
             <w:color w:val="1155CC"/>
@@ -22078,7 +22078,7 @@
         </w:rPr>
         <w:t xml:space="preserve">Either at that time, or later on, write down a word (or words) from the </w:t>
       </w:r>
-      <w:hyperlink w:history="1" r:id="rIdwpnhvhrwcbgva58pferx2">
+      <w:hyperlink w:history="1" r:id="rIdgbxfjgvktph20trpoi3ga">
         <w:r>
           <w:rPr>
             <w:color w:val="1155CC"/>
@@ -22115,7 +22115,7 @@
         </w:rPr>
         <w:t xml:space="preserve">Then look at the </w:t>
       </w:r>
-      <w:hyperlink w:history="1" r:id="rIdsi8f5umac0vwrzwvc3l22">
+      <w:hyperlink w:history="1" r:id="rId1asyfs745anai_wojcme2">
         <w:r>
           <w:rPr>
             <w:color w:val="1155CC"/>
@@ -23647,7 +23647,7 @@
         </w:rPr>
         <w:t xml:space="preserve"> at http://</w:t>
       </w:r>
-      <w:hyperlink w:history="1" r:id="rIdgs9arycerh-dpuh_k4amg">
+      <w:hyperlink w:history="1" r:id="rIdve8s1hylppfcdye7csnzd">
         <w:r>
           <w:rPr>
             <w:color w:val="1155CC"/>
@@ -26448,7 +26448,7 @@
         </w:rPr>
         <w:t xml:space="preserve">Later on, when you have time, sit down with the </w:t>
       </w:r>
-      <w:hyperlink w:history="1" r:id="rIdxa0zjaknayxha57xkamzp">
+      <w:hyperlink w:history="1" r:id="rIdbmw0rv3pvmkmpr1n6ecfe">
         <w:r>
           <w:rPr>
             <w:color w:val="1155CC"/>
@@ -26469,7 +26469,7 @@
         </w:rPr>
         <w:t xml:space="preserve"> and see if you can figure out what need(s) you were in pain about. Translate your judgment words into need words. As usual, I suggest that you limit the words you use to those on the </w:t>
       </w:r>
-      <w:hyperlink w:history="1" r:id="rId25n7vwg_hacxzfclqfmyd">
+      <w:hyperlink w:history="1" r:id="rIdrbv_agsqaz-wyzpc4mf1h">
         <w:r>
           <w:rPr>
             <w:color w:val="1155CC"/>
@@ -39850,18 +39850,11 @@
     </w:r>
     <w:r>
       <w:rPr>
-        <w:sz w:val="16"/>
-        <w:szCs w:val="16"/>
-      </w:rPr>
-      <w:t xml:space="preserve">      	</w:t>
-    </w:r>
-    <w:r>
-      <w:rPr>
         <w:color w:val="6B6B6B"/>
         <w:sz w:val="16"/>
         <w:szCs w:val="16"/>
       </w:rPr>
-      <w:t xml:space="preserve">Page </w:t>
+      <w:t xml:space="preserve">      Page </w:t>
       <w:fldChar w:fldCharType="begin"/>
       <w:instrText xml:space="preserve">PAGE</w:instrText>
       <w:fldChar w:fldCharType="separate"/>

</xml_diff>

<commit_message>
Workbook footer: right-align page number via 2-cell table
Replace the right-tab + nbsp hack (which collapses on Google Docs import)
with a borderless 2-cell footer table: title hugs the left margin, page
number is hard right-aligned in its own cell. Survives docx->Google Docs.

Co-Authored-By: Claude Opus 4.8 (1M context) <noreply@anthropic.com>
</commit_message>
<xml_diff>
--- a/.local-workbook/The Compassion Course 2026-2027 Workbook.docx
+++ b/.local-workbook/The Compassion Course 2026-2027 Workbook.docx
@@ -595,7 +595,7 @@
         </w:rPr>
         <w:t xml:space="preserve">Keep a small journal with you throughout the day. Make 1 to 5 entries per day that include the description of an act or words spoken by someone and what need you imagine they were trying to meet. It is SUPER important to limit the words you use to those on the </w:t>
       </w:r>
-      <w:hyperlink w:history="1" r:id="rId8hqwl7zixetl4kvvkjxzy">
+      <w:hyperlink w:history="1" r:id="rIdi0gjslflthgd4bct1x88v">
         <w:r>
           <w:rPr>
             <w:color w:val="1155CC"/>
@@ -737,7 +737,7 @@
         </w:rPr>
         <w:t xml:space="preserve">Think of someone who is close to you who is doing or saying something you don't like. See if you can figure out what need they are attempting to fulfill. Again, it is really important to limit the words you use to those on the </w:t>
       </w:r>
-      <w:hyperlink w:history="1" r:id="rIdapymxwn_pjdgxwk1btssz">
+      <w:hyperlink w:history="1" r:id="rIdmbt4tn0gwf0s5j5hnq55e">
         <w:r>
           <w:rPr>
             <w:color w:val="1155CC"/>
@@ -1032,7 +1032,7 @@
         </w:rPr>
         <w:t xml:space="preserve">Extended registration lasts for one week. To let someone know about the course you can use the following link: </w:t>
       </w:r>
-      <w:hyperlink w:history="1" r:id="rIdt4s_e6xpzultjhkvuci9i">
+      <w:hyperlink w:history="1" r:id="rId8dezwu9k3buvvg6cstpiv">
         <w:r>
           <w:rPr>
             <w:color w:val="1155CC"/>
@@ -1373,7 +1373,7 @@
         </w:rPr>
         <w:t xml:space="preserve">Keep a small journal with you throughout the day. Make 1 to 5 entries per day that include judgment words you said or were thinking of saying. Later on, when you have time, sit down with the </w:t>
       </w:r>
-      <w:hyperlink w:history="1" r:id="rId93hx0qy5xfvq6o6cuphjl">
+      <w:hyperlink w:history="1" r:id="rIdoumvloerw9veqvsligjop">
         <w:r>
           <w:rPr>
             <w:color w:val="1155CC"/>
@@ -1394,7 +1394,7 @@
         </w:rPr>
         <w:t xml:space="preserve"> and see if you can figure out what need of yours the judgment was (or is) related to. Remember, to successfully complete this exercise, limit the words you use to those on the </w:t>
       </w:r>
-      <w:hyperlink w:history="1" r:id="rIdb7gdbmo1ozgevmjgv9-y2">
+      <w:hyperlink w:history="1" r:id="rId2vhdlo9huqwyielfuxh1g">
         <w:r>
           <w:rPr>
             <w:color w:val="1155CC"/>
@@ -1536,7 +1536,7 @@
         </w:rPr>
         <w:t xml:space="preserve">Keep a small journal with you throughout the day. It could be a little book, a folded piece of paper or a napkin -anything you can write on. Make 1 to 5 entries per day that include judgment words spoken by someone. Later on, when you have time, sit down with the </w:t>
       </w:r>
-      <w:hyperlink w:history="1" r:id="rIdcoqxshwnywzy2eax5xw1a">
+      <w:hyperlink w:history="1" r:id="rIdzm2pxzooli9rvs_9nejaa">
         <w:r>
           <w:rPr>
             <w:color w:val="1155CC"/>
@@ -1557,7 +1557,7 @@
         </w:rPr>
         <w:t xml:space="preserve"> and see if you can figure out what need was unmet for them. Remember to limit the words you use to those on the </w:t>
       </w:r>
-      <w:hyperlink w:history="1" r:id="rIdwuyddco8qjbn3utulvqz5">
+      <w:hyperlink w:history="1" r:id="rId7hkv8gn6fd41hcyyuzvuc">
         <w:r>
           <w:rPr>
             <w:color w:val="1155CC"/>
@@ -2035,7 +2035,7 @@
         </w:rPr>
         <w:t xml:space="preserve">Later on, when you have time, sit down with the </w:t>
       </w:r>
-      <w:hyperlink w:history="1" r:id="rIddckq-8gzrkcmasppfibn1">
+      <w:hyperlink w:history="1" r:id="rIdl8gklr7xoky8janft9kux">
         <w:r>
           <w:rPr>
             <w:color w:val="1155CC"/>
@@ -2092,7 +2092,7 @@
         </w:rPr>
         <w:t xml:space="preserve"> at the top of the </w:t>
       </w:r>
-      <w:hyperlink w:history="1" r:id="rIdzhtbsx0w2vfyzp8ogzkcm">
+      <w:hyperlink w:history="1" r:id="rIduxvedu2gzghr5aehjhcil">
         <w:r>
           <w:rPr>
             <w:color w:val="1155CC"/>
@@ -2129,7 +2129,7 @@
         </w:rPr>
         <w:t xml:space="preserve">Then look at the </w:t>
       </w:r>
-      <w:hyperlink w:history="1" r:id="rIdtu27svzb9p9vy4szd3ucf">
+      <w:hyperlink w:history="1" r:id="rIdqm4yyc2g6dsft352yvxvh">
         <w:r>
           <w:rPr>
             <w:color w:val="1155CC"/>
@@ -2150,7 +2150,7 @@
         </w:rPr>
         <w:t xml:space="preserve"> and see if you can figure out what need your feeling was about. Remember, it's VERY helpful to limit the words you use to those on the </w:t>
       </w:r>
-      <w:hyperlink w:history="1" r:id="rIdtiicirg_q3jc6cuzzs6sx">
+      <w:hyperlink w:history="1" r:id="rIdygtijyavzynaehe7klvep">
         <w:r>
           <w:rPr>
             <w:color w:val="1155CC"/>
@@ -2292,7 +2292,7 @@
         </w:rPr>
         <w:t xml:space="preserve">Keep a small journal with you throughout the day. Make 2 to 4 entries per day that include something you did, said or were thinking of saying and the feeling (or feelings) you experienced at that moment. Again, later on, when you have time, sit down with the </w:t>
       </w:r>
-      <w:hyperlink w:history="1" r:id="rIdtb3jyut9b7tdmlsvihksq">
+      <w:hyperlink w:history="1" r:id="rIdrxoyenl2s0hufb7_nvmi6">
         <w:r>
           <w:rPr>
             <w:color w:val="1155CC"/>
@@ -2349,7 +2349,7 @@
         </w:rPr>
         <w:t xml:space="preserve"> at the top of the </w:t>
       </w:r>
-      <w:hyperlink w:history="1" r:id="rIdh0mgind-yn0exckmkn5kr">
+      <w:hyperlink w:history="1" r:id="rIdw_ufpjzo12iip_5v-cuol">
         <w:r>
           <w:rPr>
             <w:color w:val="1155CC"/>
@@ -2386,7 +2386,7 @@
         </w:rPr>
         <w:t xml:space="preserve">Then look at the </w:t>
       </w:r>
-      <w:hyperlink w:history="1" r:id="rIdj7ciq8cbeyienyd510l4h">
+      <w:hyperlink w:history="1" r:id="rIdufndlhyb1disrr8agx0ls">
         <w:r>
           <w:rPr>
             <w:color w:val="1155CC"/>
@@ -2407,7 +2407,7 @@
         </w:rPr>
         <w:t xml:space="preserve"> and see if you can figure out what need your feeling was about. Remember, here too, it's VERY important to limit the words you use to those on the </w:t>
       </w:r>
-      <w:hyperlink w:history="1" r:id="rIdhywaf1_k7fn22lfgdqc6h">
+      <w:hyperlink w:history="1" r:id="rIdl4x94jrawif2vhhn4jnt9">
         <w:r>
           <w:rPr>
             <w:color w:val="1155CC"/>
@@ -2732,7 +2732,7 @@
       <w:r>
         <w:t xml:space="preserve">Read the </w:t>
       </w:r>
-      <w:hyperlink w:history="1" r:id="rIdpisvs2zinm7-wa0-sv51x">
+      <w:hyperlink w:history="1" r:id="rIda6jxpv5kqm9f5aih4tnls">
         <w:r>
           <w:rPr>
             <w:color w:val="1155CC"/>
@@ -2865,7 +2865,7 @@
       <w:r>
         <w:t xml:space="preserve">Print a copy of the </w:t>
       </w:r>
-      <w:hyperlink w:history="1" r:id="rIdw2eudhwa-cojzrtmyzohp">
+      <w:hyperlink w:history="1" r:id="rIde73d8dyjyxu5z5ihn50rj">
         <w:r>
           <w:rPr>
             <w:color w:val="1155CC"/>
@@ -3030,7 +3030,7 @@
         </w:rPr>
         <w:t xml:space="preserve">Keep a small journal with you throughout the day. Make 1 to 5 entries per day that include an act or words spoken by someone and what need(s) you imagine they were trying to meet. Remember, it's VERY helpful to limit the words you use to those on the </w:t>
       </w:r>
-      <w:hyperlink w:history="1" r:id="rIdsl4igmgltp8r6kbxmyfyt">
+      <w:hyperlink w:history="1" r:id="rIdp5p6khhsokhrc42wwkqgw">
         <w:r>
           <w:rPr>
             <w:color w:val="1155CC"/>
@@ -3172,7 +3172,7 @@
         </w:rPr>
         <w:t xml:space="preserve">Think of someone that you think is preventing you from getting a need(s) met. Write down the need(s) from the </w:t>
       </w:r>
-      <w:hyperlink w:history="1" r:id="rIdtxbpm9d9mcdly0_mw1dej">
+      <w:hyperlink w:history="1" r:id="rIdmmbznstmu_6uml8-1vqtg">
         <w:r>
           <w:rPr>
             <w:color w:val="1155CC"/>
@@ -3513,7 +3513,7 @@
         </w:rPr>
         <w:t xml:space="preserve">Visit: http://</w:t>
       </w:r>
-      <w:hyperlink w:history="1" r:id="rIduwd10c_fukep--3qsaj5r">
+      <w:hyperlink w:history="1" r:id="rIdv6nh7ld0y7r1ywf-bylx6">
         <w:r>
           <w:rPr>
             <w:color w:val="1155CC"/>
@@ -3789,7 +3789,7 @@
         <w:keepLines/>
         <w:spacing w:after="60" w:before="0" w:line="276" w:lineRule="auto"/>
       </w:pPr>
-      <w:hyperlink w:history="1" r:id="rIdwugkl4zswtldbtu-9t1j5">
+      <w:hyperlink w:history="1" r:id="rIdouo0bbonosnyde-zh4n4d">
         <w:r>
           <w:rPr>
             <w:color w:val="1155CC"/>
@@ -4120,7 +4120,7 @@
         </w:rPr>
         <w:t xml:space="preserve">Continue working with this exercise (</w:t>
       </w:r>
-      <w:hyperlink w:history="1" r:id="rIddp8l_kymngqdi0ubwklpx">
+      <w:hyperlink w:history="1" r:id="rIdvoixdwrv8yjzmak836mjf">
         <w:r>
           <w:rPr>
             <w:color w:val="1155CC"/>
@@ -4431,7 +4431,7 @@
         </w:rPr>
         <w:t xml:space="preserve"> - take your time). Next, view or print a copy of the </w:t>
       </w:r>
-      <w:hyperlink w:history="1" r:id="rIdmzdcl8wt6mdunqnsrkjvq">
+      <w:hyperlink w:history="1" r:id="rIdggaxalgfqb0s5vjy3gidg">
         <w:r>
           <w:rPr>
             <w:color w:val="1155CC"/>
@@ -4964,7 +4964,7 @@
         <w:keepLines/>
         <w:spacing w:after="60" w:before="0" w:line="276" w:lineRule="auto"/>
       </w:pPr>
-      <w:hyperlink w:history="1" r:id="rIdxudvsgpstw4xhfi_lpjy3">
+      <w:hyperlink w:history="1" r:id="rId-rexb2-li2bivxl1icsu0">
         <w:r>
           <w:rPr>
             <w:color w:val="1155CC"/>
@@ -5968,7 +5968,7 @@
         </w:rPr>
         <w:t xml:space="preserve">Then look at the </w:t>
       </w:r>
-      <w:hyperlink w:history="1" r:id="rIdz3v25ptiwipdpihamjdec">
+      <w:hyperlink w:history="1" r:id="rId4r5gnrn6mjf4lztfzaxza">
         <w:r>
           <w:rPr>
             <w:color w:val="1155CC"/>
@@ -6622,7 +6622,7 @@
         </w:rPr>
         <w:t xml:space="preserve">Later on, when you have time, read over your journal for the day. Next, check in with yourself about how you feel as you think about those thoughts. Then look at the </w:t>
       </w:r>
-      <w:hyperlink w:history="1" r:id="rIdfhumn-fwh7nm3tenjxjux">
+      <w:hyperlink w:history="1" r:id="rIdm_3g_qcoi2cuzkcn_sjtl">
         <w:r>
           <w:rPr>
             <w:color w:val="1155CC"/>
@@ -7019,7 +7019,7 @@
         </w:rPr>
         <w:t xml:space="preserve"> response would be. What was that person feeling? What was that person needing, wanting to have more of, or yearning to experience? Check the </w:t>
       </w:r>
-      <w:hyperlink w:history="1" r:id="rIdb6kkecql5s8r2z34ncwoz">
+      <w:hyperlink w:history="1" r:id="rIdb285kecw_oxa9huyfkmnr">
         <w:r>
           <w:rPr>
             <w:color w:val="1155CC"/>
@@ -7040,7 +7040,7 @@
         </w:rPr>
         <w:t xml:space="preserve"> and the </w:t>
       </w:r>
-      <w:hyperlink w:history="1" r:id="rIdukub6d1ueuweufc0h5ewi">
+      <w:hyperlink w:history="1" r:id="rIdgbg0xs3xdvp_q3hxpgxpu">
         <w:r>
           <w:rPr>
             <w:color w:val="1155CC"/>
@@ -7492,7 +7492,7 @@
               </w:rPr>
               <w:t xml:space="preserve"> (feeling from the </w:t>
             </w:r>
-            <w:hyperlink w:history="1" r:id="rIdlf8uhtcwevwbaenxs5uej">
+            <w:hyperlink w:history="1" r:id="rIdj6zz6cv4puppnuyfiapjg">
               <w:r>
                 <w:rPr>
                   <w:color w:val="1155CC"/>
@@ -7533,7 +7533,7 @@
               </w:rPr>
               <w:t xml:space="preserve"> (need from the </w:t>
             </w:r>
-            <w:hyperlink w:history="1" r:id="rIdd_gf3_dxxqq5rqptkjdjl">
+            <w:hyperlink w:history="1" r:id="rIdnz7wq6wox-n7pokduj2i_">
               <w:r>
                 <w:rPr>
                   <w:color w:val="1155CC"/>
@@ -20655,7 +20655,7 @@
         </w:rPr>
         <w:t xml:space="preserve">You may want to find some quiet space and time for this exercise. Start by going to the </w:t>
       </w:r>
-      <w:hyperlink w:history="1" r:id="rIddu-wubbmokk7e0midq3_0">
+      <w:hyperlink w:history="1" r:id="rIdtvxffohqrflte20be7ixh">
         <w:r>
           <w:rPr>
             <w:color w:val="1155CC"/>
@@ -21278,7 +21278,7 @@
         </w:rPr>
         <w:t xml:space="preserve"> exercise at: http://</w:t>
       </w:r>
-      <w:hyperlink w:history="1" r:id="rIdg_telxjiy7mp7ko9_ya-n">
+      <w:hyperlink w:history="1" r:id="rId-szkue4akkmedccfagnnn">
         <w:r>
           <w:rPr>
             <w:color w:val="1155CC"/>
@@ -22078,7 +22078,7 @@
         </w:rPr>
         <w:t xml:space="preserve">Either at that time, or later on, write down a word (or words) from the </w:t>
       </w:r>
-      <w:hyperlink w:history="1" r:id="rIdgbxfjgvktph20trpoi3ga">
+      <w:hyperlink w:history="1" r:id="rId6or9nebf3qsrk0ehfgels">
         <w:r>
           <w:rPr>
             <w:color w:val="1155CC"/>
@@ -22115,7 +22115,7 @@
         </w:rPr>
         <w:t xml:space="preserve">Then look at the </w:t>
       </w:r>
-      <w:hyperlink w:history="1" r:id="rId1asyfs745anai_wojcme2">
+      <w:hyperlink w:history="1" r:id="rIdavqf8vlwvqpem9uylbkzx">
         <w:r>
           <w:rPr>
             <w:color w:val="1155CC"/>
@@ -23647,7 +23647,7 @@
         </w:rPr>
         <w:t xml:space="preserve"> at http://</w:t>
       </w:r>
-      <w:hyperlink w:history="1" r:id="rIdve8s1hylppfcdye7csnzd">
+      <w:hyperlink w:history="1" r:id="rIdy0f7vixwjojirsm0xivgs">
         <w:r>
           <w:rPr>
             <w:color w:val="1155CC"/>
@@ -26448,7 +26448,7 @@
         </w:rPr>
         <w:t xml:space="preserve">Later on, when you have time, sit down with the </w:t>
       </w:r>
-      <w:hyperlink w:history="1" r:id="rIdbmw0rv3pvmkmpr1n6ecfe">
+      <w:hyperlink w:history="1" r:id="rIdv45mchkd6y75cwdng-o9v">
         <w:r>
           <w:rPr>
             <w:color w:val="1155CC"/>
@@ -26469,7 +26469,7 @@
         </w:rPr>
         <w:t xml:space="preserve"> and see if you can figure out what need(s) you were in pain about. Translate your judgment words into need words. As usual, I suggest that you limit the words you use to those on the </w:t>
       </w:r>
-      <w:hyperlink w:history="1" r:id="rIdrbv_agsqaz-wyzpc4mf1h">
+      <w:hyperlink w:history="1" r:id="rIdsp0b0qu1u8datgrfmyeer">
         <w:r>
           <w:rPr>
             <w:color w:val="1155CC"/>
@@ -39831,36 +39831,86 @@
 
 <file path=word/footer1.xml><?xml version="1.0" encoding="utf-8"?>
 <w:ftr xmlns:wpc="http://schemas.microsoft.com/office/word/2010/wordprocessingCanvas" xmlns:mc="http://schemas.openxmlformats.org/markup-compatibility/2006" xmlns:o="urn:schemas-microsoft-com:office:office" xmlns:r="http://schemas.openxmlformats.org/officeDocument/2006/relationships" xmlns:m="http://schemas.openxmlformats.org/officeDocument/2006/math" xmlns:v="urn:schemas-microsoft-com:vml" xmlns:wp14="http://schemas.microsoft.com/office/word/2010/wordprocessingDrawing" xmlns:wp="http://schemas.openxmlformats.org/drawingml/2006/wordprocessingDrawing" xmlns:w10="urn:schemas-microsoft-com:office:word" xmlns:w="http://schemas.openxmlformats.org/wordprocessingml/2006/main" xmlns:w14="http://schemas.microsoft.com/office/word/2010/wordml" xmlns:w15="http://schemas.microsoft.com/office/word/2012/wordml" xmlns:wpg="http://schemas.microsoft.com/office/word/2010/wordprocessingGroup" xmlns:wpi="http://schemas.microsoft.com/office/word/2010/wordprocessingInk" xmlns:wne="http://schemas.microsoft.com/office/word/2006/wordml" xmlns:wps="http://schemas.microsoft.com/office/word/2010/wordprocessingShape">
-  <w:p>
-    <w:pPr>
-      <w:pBdr>
-        <w:top w:val="single" w:color="CFE3DF" w:sz="4" w:space="6"/>
-      </w:pBdr>
-      <w:tabs>
-        <w:tab w:val="right" w:pos="9360"/>
-      </w:tabs>
-    </w:pPr>
-    <w:r>
-      <w:rPr>
-        <w:color w:val="6B6B6B"/>
-        <w:sz w:val="16"/>
-        <w:szCs w:val="16"/>
-      </w:rPr>
-      <w:t xml:space="preserve">The Compassion Course 2026-27 Workbook</w:t>
-    </w:r>
-    <w:r>
-      <w:rPr>
-        <w:color w:val="6B6B6B"/>
-        <w:sz w:val="16"/>
-        <w:szCs w:val="16"/>
-      </w:rPr>
-      <w:t xml:space="preserve">      Page </w:t>
-      <w:fldChar w:fldCharType="begin"/>
-      <w:instrText xml:space="preserve">PAGE</w:instrText>
-      <w:fldChar w:fldCharType="separate"/>
-      <w:fldChar w:fldCharType="end"/>
-    </w:r>
-  </w:p>
+  <w:tbl>
+    <w:tblPr>
+      <w:tblW w:type="dxa" w:w="9360"/>
+      <w:tblBorders>
+        <w:top w:val="none"/>
+        <w:left w:val="none"/>
+        <w:bottom w:val="none"/>
+        <w:right w:val="none"/>
+        <w:insideH w:val="none"/>
+        <w:insideV w:val="none"/>
+      </w:tblBorders>
+    </w:tblPr>
+    <w:tblGrid>
+      <w:gridCol w:w="6000"/>
+      <w:gridCol w:w="3360"/>
+    </w:tblGrid>
+    <w:tr>
+      <w:tc>
+        <w:tcPr>
+          <w:tcW w:type="dxa" w:w="6000"/>
+          <w:tcBorders>
+            <w:top w:val="single" w:color="CFE3DF" w:sz="4"/>
+            <w:left w:val="none"/>
+            <w:bottom w:val="none"/>
+            <w:right w:val="none"/>
+          </w:tcBorders>
+          <w:tcMar>
+            <w:top w:type="dxa" w:w="60"/>
+            <w:left w:type="dxa" w:w="0"/>
+            <w:bottom w:type="dxa" w:w="0"/>
+            <w:right w:type="dxa" w:w="0"/>
+          </w:tcMar>
+        </w:tcPr>
+        <w:p>
+          <w:r>
+            <w:rPr>
+              <w:color w:val="6B6B6B"/>
+              <w:sz w:val="16"/>
+              <w:szCs w:val="16"/>
+            </w:rPr>
+            <w:t xml:space="preserve">The Compassion Course 2026-27 Workbook</w:t>
+          </w:r>
+        </w:p>
+      </w:tc>
+      <w:tc>
+        <w:tcPr>
+          <w:tcW w:type="dxa" w:w="3360"/>
+          <w:tcBorders>
+            <w:top w:val="single" w:color="CFE3DF" w:sz="4"/>
+            <w:left w:val="none"/>
+            <w:bottom w:val="none"/>
+            <w:right w:val="none"/>
+          </w:tcBorders>
+          <w:tcMar>
+            <w:top w:type="dxa" w:w="60"/>
+            <w:left w:type="dxa" w:w="0"/>
+            <w:bottom w:type="dxa" w:w="0"/>
+            <w:right w:type="dxa" w:w="0"/>
+          </w:tcMar>
+        </w:tcPr>
+        <w:p>
+          <w:pPr>
+            <w:jc w:val="right"/>
+          </w:pPr>
+          <w:r>
+            <w:rPr>
+              <w:color w:val="6B6B6B"/>
+              <w:sz w:val="16"/>
+              <w:szCs w:val="16"/>
+            </w:rPr>
+            <w:t xml:space="preserve">Page </w:t>
+            <w:fldChar w:fldCharType="begin"/>
+            <w:instrText xml:space="preserve">PAGE</w:instrText>
+            <w:fldChar w:fldCharType="separate"/>
+            <w:fldChar w:fldCharType="end"/>
+          </w:r>
+        </w:p>
+      </w:tc>
+    </w:tr>
+  </w:tbl>
 </w:ftr>
 </file>
 

</xml_diff>

<commit_message>
Workbook: repoint The Exercise -> nycnvc.org/the-exercise + COC branding
- content.json: visible exercise URLs (theexercise.org) -> nycnvc.org/the-exercise
- link rule + EXERCISE_URL now target https://www.nycnvc.org/the-exercise
- cover: add 'CERTIFICATE OF COMPLETION (COC)' line above 'PARTICIPANT WORKBOOK'
- doc title property + running footer now carry COC branding

Co-Authored-By: Claude Opus 4.8 (1M context) <noreply@anthropic.com>
</commit_message>
<xml_diff>
--- a/.local-workbook/The Compassion Course 2026-2027 Workbook.docx
+++ b/.local-workbook/The Compassion Course 2026-2027 Workbook.docx
@@ -108,9 +108,27 @@
           <w:b/>
           <w:bCs/>
           <w:color w:val="1E5C53"/>
+          <w:spacing w:val="90"/>
+          <w:sz w:val="18"/>
+          <w:szCs w:val="18"/>
+        </w:rPr>
+        <w:t xml:space="preserve">CERTIFICATE OF COMPLETION (COC)</w:t>
+      </w:r>
+    </w:p>
+    <w:p>
+      <w:pPr>
+        <w:spacing w:after="0" w:before="28"/>
+        <w:jc w:val="center"/>
+      </w:pPr>
+      <w:r>
+        <w:rPr>
+          <w:rFonts w:ascii="Georgia" w:cs="Georgia" w:eastAsia="Georgia" w:hAnsi="Georgia"/>
+          <w:b/>
+          <w:bCs/>
+          <w:color w:val="1E5C53"/>
           <w:spacing w:val="130"/>
-          <w:sz w:val="19"/>
-          <w:szCs w:val="19"/>
+          <w:sz w:val="18"/>
+          <w:szCs w:val="18"/>
         </w:rPr>
         <w:t xml:space="preserve">PARTICIPANT WORKBOOK</w:t>
       </w:r>
@@ -595,7 +613,7 @@
         </w:rPr>
         <w:t xml:space="preserve">Keep a small journal with you throughout the day. Make 1 to 5 entries per day that include the description of an act or words spoken by someone and what need you imagine they were trying to meet. It is SUPER important to limit the words you use to those on the </w:t>
       </w:r>
-      <w:hyperlink w:history="1" r:id="rIdi0gjslflthgd4bct1x88v">
+      <w:hyperlink w:history="1" r:id="rId27jgnznusf2hek5s-sjyh">
         <w:r>
           <w:rPr>
             <w:color w:val="1155CC"/>
@@ -737,7 +755,7 @@
         </w:rPr>
         <w:t xml:space="preserve">Think of someone who is close to you who is doing or saying something you don't like. See if you can figure out what need they are attempting to fulfill. Again, it is really important to limit the words you use to those on the </w:t>
       </w:r>
-      <w:hyperlink w:history="1" r:id="rIdmbt4tn0gwf0s5j5hnq55e">
+      <w:hyperlink w:history="1" r:id="rIdt610tqmhm4ve4dxljk0bs">
         <w:r>
           <w:rPr>
             <w:color w:val="1155CC"/>
@@ -1032,7 +1050,7 @@
         </w:rPr>
         <w:t xml:space="preserve">Extended registration lasts for one week. To let someone know about the course you can use the following link: </w:t>
       </w:r>
-      <w:hyperlink w:history="1" r:id="rId8dezwu9k3buvvg6cstpiv">
+      <w:hyperlink w:history="1" r:id="rIdf41ayu-e56rl43ydoxqr9">
         <w:r>
           <w:rPr>
             <w:color w:val="1155CC"/>
@@ -1373,7 +1391,7 @@
         </w:rPr>
         <w:t xml:space="preserve">Keep a small journal with you throughout the day. Make 1 to 5 entries per day that include judgment words you said or were thinking of saying. Later on, when you have time, sit down with the </w:t>
       </w:r>
-      <w:hyperlink w:history="1" r:id="rIdoumvloerw9veqvsligjop">
+      <w:hyperlink w:history="1" r:id="rIdhbuzfmlheu6kpmk-z66sa">
         <w:r>
           <w:rPr>
             <w:color w:val="1155CC"/>
@@ -1394,7 +1412,7 @@
         </w:rPr>
         <w:t xml:space="preserve"> and see if you can figure out what need of yours the judgment was (or is) related to. Remember, to successfully complete this exercise, limit the words you use to those on the </w:t>
       </w:r>
-      <w:hyperlink w:history="1" r:id="rId2vhdlo9huqwyielfuxh1g">
+      <w:hyperlink w:history="1" r:id="rIdexrbrg-8dxjq10ibpjwlm">
         <w:r>
           <w:rPr>
             <w:color w:val="1155CC"/>
@@ -1536,7 +1554,7 @@
         </w:rPr>
         <w:t xml:space="preserve">Keep a small journal with you throughout the day. It could be a little book, a folded piece of paper or a napkin -anything you can write on. Make 1 to 5 entries per day that include judgment words spoken by someone. Later on, when you have time, sit down with the </w:t>
       </w:r>
-      <w:hyperlink w:history="1" r:id="rIdzm2pxzooli9rvs_9nejaa">
+      <w:hyperlink w:history="1" r:id="rId7m3zezzmuj7-v7phkjnvj">
         <w:r>
           <w:rPr>
             <w:color w:val="1155CC"/>
@@ -1557,7 +1575,7 @@
         </w:rPr>
         <w:t xml:space="preserve"> and see if you can figure out what need was unmet for them. Remember to limit the words you use to those on the </w:t>
       </w:r>
-      <w:hyperlink w:history="1" r:id="rId7hkv8gn6fd41hcyyuzvuc">
+      <w:hyperlink w:history="1" r:id="rIdoghsjotzvqtepfyxo3pm3">
         <w:r>
           <w:rPr>
             <w:color w:val="1155CC"/>
@@ -2035,7 +2053,7 @@
         </w:rPr>
         <w:t xml:space="preserve">Later on, when you have time, sit down with the </w:t>
       </w:r>
-      <w:hyperlink w:history="1" r:id="rIdl8gklr7xoky8janft9kux">
+      <w:hyperlink w:history="1" r:id="rIdazfdreqodddfgj25q0wic">
         <w:r>
           <w:rPr>
             <w:color w:val="1155CC"/>
@@ -2092,7 +2110,7 @@
         </w:rPr>
         <w:t xml:space="preserve"> at the top of the </w:t>
       </w:r>
-      <w:hyperlink w:history="1" r:id="rIduxvedu2gzghr5aehjhcil">
+      <w:hyperlink w:history="1" r:id="rIdek5_keepznnpxluhanaph">
         <w:r>
           <w:rPr>
             <w:color w:val="1155CC"/>
@@ -2129,7 +2147,7 @@
         </w:rPr>
         <w:t xml:space="preserve">Then look at the </w:t>
       </w:r>
-      <w:hyperlink w:history="1" r:id="rIdqm4yyc2g6dsft352yvxvh">
+      <w:hyperlink w:history="1" r:id="rIdbcqyz-0t3jduh0y1clbmk">
         <w:r>
           <w:rPr>
             <w:color w:val="1155CC"/>
@@ -2150,7 +2168,7 @@
         </w:rPr>
         <w:t xml:space="preserve"> and see if you can figure out what need your feeling was about. Remember, it's VERY helpful to limit the words you use to those on the </w:t>
       </w:r>
-      <w:hyperlink w:history="1" r:id="rIdygtijyavzynaehe7klvep">
+      <w:hyperlink w:history="1" r:id="rId7xswnbgk_tuwfdcbj5yj0">
         <w:r>
           <w:rPr>
             <w:color w:val="1155CC"/>
@@ -2292,7 +2310,7 @@
         </w:rPr>
         <w:t xml:space="preserve">Keep a small journal with you throughout the day. Make 2 to 4 entries per day that include something you did, said or were thinking of saying and the feeling (or feelings) you experienced at that moment. Again, later on, when you have time, sit down with the </w:t>
       </w:r>
-      <w:hyperlink w:history="1" r:id="rIdrxoyenl2s0hufb7_nvmi6">
+      <w:hyperlink w:history="1" r:id="rIdd3ku78mf_wi3kg7rmaerh">
         <w:r>
           <w:rPr>
             <w:color w:val="1155CC"/>
@@ -2349,7 +2367,7 @@
         </w:rPr>
         <w:t xml:space="preserve"> at the top of the </w:t>
       </w:r>
-      <w:hyperlink w:history="1" r:id="rIdw_ufpjzo12iip_5v-cuol">
+      <w:hyperlink w:history="1" r:id="rIdyfkmqn-qgah13zysn_v9r">
         <w:r>
           <w:rPr>
             <w:color w:val="1155CC"/>
@@ -2386,7 +2404,7 @@
         </w:rPr>
         <w:t xml:space="preserve">Then look at the </w:t>
       </w:r>
-      <w:hyperlink w:history="1" r:id="rIdufndlhyb1disrr8agx0ls">
+      <w:hyperlink w:history="1" r:id="rIdwjt_92iqbl061gubqmcuv">
         <w:r>
           <w:rPr>
             <w:color w:val="1155CC"/>
@@ -2407,7 +2425,7 @@
         </w:rPr>
         <w:t xml:space="preserve"> and see if you can figure out what need your feeling was about. Remember, here too, it's VERY important to limit the words you use to those on the </w:t>
       </w:r>
-      <w:hyperlink w:history="1" r:id="rIdl4x94jrawif2vhhn4jnt9">
+      <w:hyperlink w:history="1" r:id="rIdvn3xsodz8g1iwajxmfd1a">
         <w:r>
           <w:rPr>
             <w:color w:val="1155CC"/>
@@ -2732,7 +2750,7 @@
       <w:r>
         <w:t xml:space="preserve">Read the </w:t>
       </w:r>
-      <w:hyperlink w:history="1" r:id="rIda6jxpv5kqm9f5aih4tnls">
+      <w:hyperlink w:history="1" r:id="rIdxldmfqbsr9qxskwfst3re">
         <w:r>
           <w:rPr>
             <w:color w:val="1155CC"/>
@@ -2865,7 +2883,7 @@
       <w:r>
         <w:t xml:space="preserve">Print a copy of the </w:t>
       </w:r>
-      <w:hyperlink w:history="1" r:id="rIde73d8dyjyxu5z5ihn50rj">
+      <w:hyperlink w:history="1" r:id="rIdkifdch90y5utrko4ihs4d">
         <w:r>
           <w:rPr>
             <w:color w:val="1155CC"/>
@@ -3030,7 +3048,7 @@
         </w:rPr>
         <w:t xml:space="preserve">Keep a small journal with you throughout the day. Make 1 to 5 entries per day that include an act or words spoken by someone and what need(s) you imagine they were trying to meet. Remember, it's VERY helpful to limit the words you use to those on the </w:t>
       </w:r>
-      <w:hyperlink w:history="1" r:id="rIdp5p6khhsokhrc42wwkqgw">
+      <w:hyperlink w:history="1" r:id="rIdx_0rfdz3claywwofzdbqw">
         <w:r>
           <w:rPr>
             <w:color w:val="1155CC"/>
@@ -3172,7 +3190,7 @@
         </w:rPr>
         <w:t xml:space="preserve">Think of someone that you think is preventing you from getting a need(s) met. Write down the need(s) from the </w:t>
       </w:r>
-      <w:hyperlink w:history="1" r:id="rIdmmbznstmu_6uml8-1vqtg">
+      <w:hyperlink w:history="1" r:id="rIdd4pku02m93hpohmbowqpk">
         <w:r>
           <w:rPr>
             <w:color w:val="1155CC"/>
@@ -3511,9 +3529,9 @@
           <w:sz w:val="20"/>
           <w:szCs w:val="20"/>
         </w:rPr>
-        <w:t xml:space="preserve">Visit: http://</w:t>
-      </w:r>
-      <w:hyperlink w:history="1" r:id="rIdv6nh7ld0y7r1ywf-bylx6">
+        <w:t xml:space="preserve">Visit: </w:t>
+      </w:r>
+      <w:hyperlink w:history="1" r:id="rIdpiag_htdsyhpknqd4kk0o">
         <w:r>
           <w:rPr>
             <w:color w:val="1155CC"/>
@@ -3521,7 +3539,7 @@
             <w:szCs w:val="20"/>
             <w:u w:val="single"/>
           </w:rPr>
-          <w:t xml:space="preserve">theexercise.org</w:t>
+          <w:t xml:space="preserve">nycnvc.org/the-exercise</w:t>
         </w:r>
       </w:hyperlink>
       <w:r>
@@ -3789,7 +3807,7 @@
         <w:keepLines/>
         <w:spacing w:after="60" w:before="0" w:line="276" w:lineRule="auto"/>
       </w:pPr>
-      <w:hyperlink w:history="1" r:id="rIdouo0bbonosnyde-zh4n4d">
+      <w:hyperlink w:history="1" r:id="rIds46mewp6fkg4ksu-hm6s5">
         <w:r>
           <w:rPr>
             <w:color w:val="1155CC"/>
@@ -4120,7 +4138,7 @@
         </w:rPr>
         <w:t xml:space="preserve">Continue working with this exercise (</w:t>
       </w:r>
-      <w:hyperlink w:history="1" r:id="rIdvoixdwrv8yjzmak836mjf">
+      <w:hyperlink w:history="1" r:id="rIdb5bs5gwwvghoyfq25wtl2">
         <w:r>
           <w:rPr>
             <w:color w:val="1155CC"/>
@@ -4128,7 +4146,7 @@
             <w:szCs w:val="20"/>
             <w:u w:val="single"/>
           </w:rPr>
-          <w:t xml:space="preserve">www.theexercise.org</w:t>
+          <w:t xml:space="preserve">nycnvc.org/the-exercise</w:t>
         </w:r>
       </w:hyperlink>
       <w:r>
@@ -4431,7 +4449,7 @@
         </w:rPr>
         <w:t xml:space="preserve"> - take your time). Next, view or print a copy of the </w:t>
       </w:r>
-      <w:hyperlink w:history="1" r:id="rIdggaxalgfqb0s5vjy3gidg">
+      <w:hyperlink w:history="1" r:id="rId_zfdf3y-nx8ruskdjid-l">
         <w:r>
           <w:rPr>
             <w:color w:val="1155CC"/>
@@ -4964,7 +4982,7 @@
         <w:keepLines/>
         <w:spacing w:after="60" w:before="0" w:line="276" w:lineRule="auto"/>
       </w:pPr>
-      <w:hyperlink w:history="1" r:id="rId-rexb2-li2bivxl1icsu0">
+      <w:hyperlink w:history="1" r:id="rIdtsbz168zhmrreahflwwgp">
         <w:r>
           <w:rPr>
             <w:color w:val="1155CC"/>
@@ -5968,7 +5986,7 @@
         </w:rPr>
         <w:t xml:space="preserve">Then look at the </w:t>
       </w:r>
-      <w:hyperlink w:history="1" r:id="rId4r5gnrn6mjf4lztfzaxza">
+      <w:hyperlink w:history="1" r:id="rIdi1xihn5wmvajglgef6ybc">
         <w:r>
           <w:rPr>
             <w:color w:val="1155CC"/>
@@ -6622,7 +6640,7 @@
         </w:rPr>
         <w:t xml:space="preserve">Later on, when you have time, read over your journal for the day. Next, check in with yourself about how you feel as you think about those thoughts. Then look at the </w:t>
       </w:r>
-      <w:hyperlink w:history="1" r:id="rIdm_3g_qcoi2cuzkcn_sjtl">
+      <w:hyperlink w:history="1" r:id="rIduccgdzu4vxzr4q1nhgjac">
         <w:r>
           <w:rPr>
             <w:color w:val="1155CC"/>
@@ -7019,7 +7037,7 @@
         </w:rPr>
         <w:t xml:space="preserve"> response would be. What was that person feeling? What was that person needing, wanting to have more of, or yearning to experience? Check the </w:t>
       </w:r>
-      <w:hyperlink w:history="1" r:id="rIdb285kecw_oxa9huyfkmnr">
+      <w:hyperlink w:history="1" r:id="rIdrzibxhnej3buxlqsytdpf">
         <w:r>
           <w:rPr>
             <w:color w:val="1155CC"/>
@@ -7040,7 +7058,7 @@
         </w:rPr>
         <w:t xml:space="preserve"> and the </w:t>
       </w:r>
-      <w:hyperlink w:history="1" r:id="rIdgbg0xs3xdvp_q3hxpgxpu">
+      <w:hyperlink w:history="1" r:id="rIdqqcajau04vojytqc5ecos">
         <w:r>
           <w:rPr>
             <w:color w:val="1155CC"/>
@@ -7492,7 +7510,7 @@
               </w:rPr>
               <w:t xml:space="preserve"> (feeling from the </w:t>
             </w:r>
-            <w:hyperlink w:history="1" r:id="rIdj6zz6cv4puppnuyfiapjg">
+            <w:hyperlink w:history="1" r:id="rIdsenwg4i2fmn6sva7fm5tc">
               <w:r>
                 <w:rPr>
                   <w:color w:val="1155CC"/>
@@ -7533,7 +7551,7 @@
               </w:rPr>
               <w:t xml:space="preserve"> (need from the </w:t>
             </w:r>
-            <w:hyperlink w:history="1" r:id="rIdnz7wq6wox-n7pokduj2i_">
+            <w:hyperlink w:history="1" r:id="rIdsksona_r-jngj1peymszm">
               <w:r>
                 <w:rPr>
                   <w:color w:val="1155CC"/>
@@ -20655,7 +20673,7 @@
         </w:rPr>
         <w:t xml:space="preserve">You may want to find some quiet space and time for this exercise. Start by going to the </w:t>
       </w:r>
-      <w:hyperlink w:history="1" r:id="rIdtvxffohqrflte20be7ixh">
+      <w:hyperlink w:history="1" r:id="rIdtys-o_3oey1kbkeftcv5l">
         <w:r>
           <w:rPr>
             <w:color w:val="1155CC"/>
@@ -21276,9 +21294,9 @@
           <w:sz w:val="20"/>
           <w:szCs w:val="20"/>
         </w:rPr>
-        <w:t xml:space="preserve"> exercise at: http://</w:t>
-      </w:r>
-      <w:hyperlink w:history="1" r:id="rId-szkue4akkmedccfagnnn">
+        <w:t xml:space="preserve"> exercise at: </w:t>
+      </w:r>
+      <w:hyperlink w:history="1" r:id="rId7c5b4hur0mgvffaqsfzqy">
         <w:r>
           <w:rPr>
             <w:color w:val="1155CC"/>
@@ -21286,7 +21304,7 @@
             <w:szCs w:val="20"/>
             <w:u w:val="single"/>
           </w:rPr>
-          <w:t xml:space="preserve">theexercise.org</w:t>
+          <w:t xml:space="preserve">nycnvc.org/the-exercise</w:t>
         </w:r>
       </w:hyperlink>
       <w:r>
@@ -22078,7 +22096,7 @@
         </w:rPr>
         <w:t xml:space="preserve">Either at that time, or later on, write down a word (or words) from the </w:t>
       </w:r>
-      <w:hyperlink w:history="1" r:id="rId6or9nebf3qsrk0ehfgels">
+      <w:hyperlink w:history="1" r:id="rIdl2-kvzj-_2ctagmy-77l8">
         <w:r>
           <w:rPr>
             <w:color w:val="1155CC"/>
@@ -22115,7 +22133,7 @@
         </w:rPr>
         <w:t xml:space="preserve">Then look at the </w:t>
       </w:r>
-      <w:hyperlink w:history="1" r:id="rIdavqf8vlwvqpem9uylbkzx">
+      <w:hyperlink w:history="1" r:id="rIdo4iooiyymok3k5h5eshe8">
         <w:r>
           <w:rPr>
             <w:color w:val="1155CC"/>
@@ -23645,9 +23663,9 @@
           <w:sz w:val="20"/>
           <w:szCs w:val="20"/>
         </w:rPr>
-        <w:t xml:space="preserve"> at http://</w:t>
-      </w:r>
-      <w:hyperlink w:history="1" r:id="rIdy0f7vixwjojirsm0xivgs">
+        <w:t xml:space="preserve"> at </w:t>
+      </w:r>
+      <w:hyperlink w:history="1" r:id="rIdnhncujq7hb9zbixp0rdqv">
         <w:r>
           <w:rPr>
             <w:color w:val="1155CC"/>
@@ -23655,7 +23673,7 @@
             <w:szCs w:val="20"/>
             <w:u w:val="single"/>
           </w:rPr>
-          <w:t xml:space="preserve">theexercise.org</w:t>
+          <w:t xml:space="preserve">nycnvc.org/the-exercise</w:t>
         </w:r>
       </w:hyperlink>
       <w:r>
@@ -26448,7 +26466,7 @@
         </w:rPr>
         <w:t xml:space="preserve">Later on, when you have time, sit down with the </w:t>
       </w:r>
-      <w:hyperlink w:history="1" r:id="rIdv45mchkd6y75cwdng-o9v">
+      <w:hyperlink w:history="1" r:id="rIddkaeo1ebnmrwzzho-olc4">
         <w:r>
           <w:rPr>
             <w:color w:val="1155CC"/>
@@ -26469,7 +26487,7 @@
         </w:rPr>
         <w:t xml:space="preserve"> and see if you can figure out what need(s) you were in pain about. Translate your judgment words into need words. As usual, I suggest that you limit the words you use to those on the </w:t>
       </w:r>
-      <w:hyperlink w:history="1" r:id="rIdsp0b0qu1u8datgrfmyeer">
+      <w:hyperlink w:history="1" r:id="rIdfhamhytmkj3ra9qz-dfnb">
         <w:r>
           <w:rPr>
             <w:color w:val="1155CC"/>
@@ -39871,7 +39889,7 @@
               <w:sz w:val="16"/>
               <w:szCs w:val="16"/>
             </w:rPr>
-            <w:t xml:space="preserve">The Compassion Course 2026-27 Workbook</w:t>
+            <w:t xml:space="preserve">The Compassion Course 2026-27 COC Workbook</w:t>
           </w:r>
         </w:p>
       </w:tc>

</xml_diff>